<commit_message>
Generate first River Remembers scene batch
Co-authored-by: arena-agent <297053741+arena-agent@users.noreply.github.com>
</commit_message>
<xml_diff>
--- a/the_river_remembers/MASTER_DOCUMENT.docx
+++ b/the_river_remembers/MASTER_DOCUMENT.docx
@@ -61,7 +61,7 @@
     </w:p>
     <w:p>
       <w:r>
-        <w:t>Grounded cinematic West African magical realism; contemporary Ghanaian coastal life; human-scale performances; saturated indigo, lagoon teal, clay red and warm amber palette; natural skin texture; tactile fabric and weathered wood; 2.39:1 widescreen composition; subtle film grain; expressive realistic lighting. No written words, no logos, no watermark, no distorted hands, no duplicate people.</w:t>
+        <w:t>Grounded cinematic West African magical realism; contemporary Ghanaian coastal life; human-scale performances; saturated indigo, lagoon teal, clay red and warm amber palette; natural skin texture; tactile fabric and weathered wood; 16:9 landscape widescreen composition; subtle film grain; expressive realistic lighting. No written words, no logos, no watermark, no distorted hands, no duplicate people.</w:t>
       </w:r>
     </w:p>
     <w:p>
@@ -109,7 +109,7 @@
         <w:pStyle w:val="ListBullet"/>
       </w:pPr>
       <w:r>
-        <w:t>Maintain 2.39:1 compositions and avoid readable text, logos, watermarks or generic tourism imagery.</w:t>
+        <w:t>Maintain 16:9 landscape compositions for every scene image and avoid readable text, logos, watermarks or generic tourism imagery.</w:t>
       </w:r>
     </w:p>
     <w:p>
@@ -1719,9 +1719,9 @@
         <w:br/>
         <w:t xml:space="preserve">  ],</w:t>
         <w:br/>
-        <w:t xml:space="preserve">  "prompt": "Grounded cinematic West African magical realism; contemporary Ghanaian coastal life; human-scale performances; saturated indigo, lagoon teal, clay red and warm amber palette; natural skin texture; tactile fabric and weathered wood; 2.39:1 widescreen composition; subtle film grain; expressive realistic lighting. No written words, no logos, no watermark, no distorted hands, no duplicate people. Scene S01 — The Roof That Hums. WIDE shot, high establishing angle. Characters in frame: @KOSI_MENSAH (indigo utility jumpsuit with rolled sleeves, sand-coloured work boots and a narrow woven kente belt, small gold Adinkra-disc earrings). Kosi crosses the orderly solar roof with her tool case as Accra spreads beneath her. Mood: restless possibility. Lighting: hard white midday sun softened by coastal haze. Environment = Location Registry id 'ACCRA_SOLAR_ROOF': A broad, sun-whitened corrugated-roof solar workshop above a dense Accra neighbourhood: neat blue-black photovoltaic panels, coiled orange cables, water tanks, hazy low-rise buildings and a vast humid sky.",</w:t>
-        <w:br/>
-        <w:t xml:space="preserve">  "status": "⬜",</w:t>
+        <w:t xml:space="preserve">  "prompt": "Grounded cinematic West African magical realism; contemporary Ghanaian coastal life; human-scale performances; saturated indigo, lagoon teal, clay red and warm amber palette; natural skin texture; tactile fabric and weathered wood; 16:9 landscape widescreen composition; subtle film grain; expressive realistic lighting. No written words, no logos, no watermark, no distorted hands, no duplicate people. Scene S01 — The Roof That Hums. WIDE shot, high establishing angle. Characters in frame: @KOSI_MENSAH (indigo utility jumpsuit with rolled sleeves, sand-coloured work boots and a narrow woven kente belt, small gold Adinkra-disc earrings). Kosi crosses the orderly solar roof with her tool case as Accra spreads beneath her. Mood: restless possibility. Lighting: hard white midday sun softened by coastal haze. Environment = Location Registry id 'ACCRA_SOLAR_ROOF': A broad, sun-whitened corrugated-roof solar workshop above a dense Accra neighbourhood: neat blue-black photovoltaic panels, coiled orange cables, water tanks, hazy low-rise buildings and a vast humid sky.",</w:t>
+        <w:br/>
+        <w:t xml:space="preserve">  "status": "✅",</w:t>
         <w:br/>
         <w:t xml:space="preserve">  "file": "images/act1/S01_Step01_accra_roof_arrival.png"</w:t>
         <w:br/>
@@ -1770,9 +1770,9 @@
         <w:br/>
         <w:t xml:space="preserve">  ],</w:t>
         <w:br/>
-        <w:t xml:space="preserve">  "prompt": "Grounded cinematic West African magical realism; contemporary Ghanaian coastal life; human-scale performances; saturated indigo, lagoon teal, clay red and warm amber palette; natural skin texture; tactile fabric and weathered wood; 2.39:1 widescreen composition; subtle film grain; expressive realistic lighting. No written words, no logos, no watermark, no distorted hands, no duplicate people. Scene S01 — The Roof That Hums. MEDIUM shot, eye-level. Characters in frame: @KOSI_MENSAH (indigo utility jumpsuit with rolled sleeves, sand-coloured work boots and a narrow woven kente belt, small gold Adinkra-disc earrings). Kosi kneels beside a silent panel string and checks its junction box. Mood: restless possibility. Lighting: hard white midday sun softened by coastal haze. Environment = Location Registry id 'ACCRA_SOLAR_ROOF': A broad, sun-whitened corrugated-roof solar workshop above a dense Accra neighbourhood: neat blue-black photovoltaic panels, coiled orange cables, water tanks, hazy low-rise buildings and a vast humid sky.",</w:t>
-        <w:br/>
-        <w:t xml:space="preserve">  "status": "⬜",</w:t>
+        <w:t xml:space="preserve">  "prompt": "Grounded cinematic West African magical realism; contemporary Ghanaian coastal life; human-scale performances; saturated indigo, lagoon teal, clay red and warm amber palette; natural skin texture; tactile fabric and weathered wood; 16:9 landscape widescreen composition; subtle film grain; expressive realistic lighting. No written words, no logos, no watermark, no distorted hands, no duplicate people. Scene S01 — The Roof That Hums. MEDIUM shot, eye-level. Characters in frame: @KOSI_MENSAH (indigo utility jumpsuit with rolled sleeves, sand-coloured work boots and a narrow woven kente belt, small gold Adinkra-disc earrings). Kosi kneels beside a silent panel string and checks its junction box. Mood: restless possibility. Lighting: hard white midday sun softened by coastal haze. Environment = Location Registry id 'ACCRA_SOLAR_ROOF': A broad, sun-whitened corrugated-roof solar workshop above a dense Accra neighbourhood: neat blue-black photovoltaic panels, coiled orange cables, water tanks, hazy low-rise buildings and a vast humid sky.",</w:t>
+        <w:br/>
+        <w:t xml:space="preserve">  "status": "✅",</w:t>
         <w:br/>
         <w:t xml:space="preserve">  "file": "images/act1/S01_Step02_panel_diagnosis.png"</w:t>
         <w:br/>
@@ -1821,9 +1821,9 @@
         <w:br/>
         <w:t xml:space="preserve">  ],</w:t>
         <w:br/>
-        <w:t xml:space="preserve">  "prompt": "Grounded cinematic West African magical realism; contemporary Ghanaian coastal life; human-scale performances; saturated indigo, lagoon teal, clay red and warm amber palette; natural skin texture; tactile fabric and weathered wood; 2.39:1 widescreen composition; subtle film grain; expressive realistic lighting. No written words, no logos, no watermark, no distorted hands, no duplicate people. Scene S01 — The Roof That Hums. CLOSE shot, three-quarter profile. Characters in frame: @KOSI_MENSAH (indigo utility jumpsuit with rolled sleeves, sand-coloured work boots and a narrow woven kente belt, small gold Adinkra-disc earrings). Kosi concentrates on the meter reading, sweat and resolve visible in her face. Mood: restless possibility. Lighting: hard white midday sun softened by coastal haze. Environment = Location Registry id 'ACCRA_SOLAR_ROOF': A broad, sun-whitened corrugated-roof solar workshop above a dense Accra neighbourhood: neat blue-black photovoltaic panels, coiled orange cables, water tanks, hazy low-rise buildings and a vast humid sky.",</w:t>
-        <w:br/>
-        <w:t xml:space="preserve">  "status": "⬜",</w:t>
+        <w:t xml:space="preserve">  "prompt": "Grounded cinematic West African magical realism; contemporary Ghanaian coastal life; human-scale performances; saturated indigo, lagoon teal, clay red and warm amber palette; natural skin texture; tactile fabric and weathered wood; 16:9 landscape widescreen composition; subtle film grain; expressive realistic lighting. No written words, no logos, no watermark, no distorted hands, no duplicate people. Scene S01 — The Roof That Hums. CLOSE shot, three-quarter profile. Characters in frame: @KOSI_MENSAH (indigo utility jumpsuit with rolled sleeves, sand-coloured work boots and a narrow woven kente belt, small gold Adinkra-disc earrings). Kosi concentrates on the meter reading, sweat and resolve visible in her face. Mood: restless possibility. Lighting: hard white midday sun softened by coastal haze. Environment = Location Registry id 'ACCRA_SOLAR_ROOF': A broad, sun-whitened corrugated-roof solar workshop above a dense Accra neighbourhood: neat blue-black photovoltaic panels, coiled orange cables, water tanks, hazy low-rise buildings and a vast humid sky.",</w:t>
+        <w:br/>
+        <w:t xml:space="preserve">  "status": "✅",</w:t>
         <w:br/>
         <w:t xml:space="preserve">  "file": "images/act1/S01_Step03_focused_engineer.png"</w:t>
         <w:br/>
@@ -1872,9 +1872,9 @@
         <w:br/>
         <w:t xml:space="preserve">  ],</w:t>
         <w:br/>
-        <w:t xml:space="preserve">  "prompt": "Grounded cinematic West African magical realism; contemporary Ghanaian coastal life; human-scale performances; saturated indigo, lagoon teal, clay red and warm amber palette; natural skin texture; tactile fabric and weathered wood; 2.39:1 widescreen composition; subtle film grain; expressive realistic lighting. No written words, no logos, no watermark, no distorted hands, no duplicate people. Scene S01 — The Roof That Hums. INSERT shot, top-down detail. Characters in frame: @KOSI_MENSAH (indigo utility jumpsuit with rolled sleeves, sand-coloured work boots and a narrow woven kente belt, small gold Adinkra-disc earrings). A gloved hand holds a tester against a sunlit cable connection. Mood: restless possibility. Lighting: hard white midday sun softened by coastal haze. Environment = Location Registry id 'ACCRA_SOLAR_ROOF': A broad, sun-whitened corrugated-roof solar workshop above a dense Accra neighbourhood: neat blue-black photovoltaic panels, coiled orange cables, water tanks, hazy low-rise buildings and a vast humid sky.",</w:t>
-        <w:br/>
-        <w:t xml:space="preserve">  "status": "⬜",</w:t>
+        <w:t xml:space="preserve">  "prompt": "Grounded cinematic West African magical realism; contemporary Ghanaian coastal life; human-scale performances; saturated indigo, lagoon teal, clay red and warm amber palette; natural skin texture; tactile fabric and weathered wood; 16:9 landscape widescreen composition; subtle film grain; expressive realistic lighting. No written words, no logos, no watermark, no distorted hands, no duplicate people. Scene S01 — The Roof That Hums. INSERT shot, top-down detail. Characters in frame: @KOSI_MENSAH (indigo utility jumpsuit with rolled sleeves, sand-coloured work boots and a narrow woven kente belt, small gold Adinkra-disc earrings). A gloved hand holds a tester against a sunlit cable connection. Mood: restless possibility. Lighting: hard white midday sun softened by coastal haze. Environment = Location Registry id 'ACCRA_SOLAR_ROOF': A broad, sun-whitened corrugated-roof solar workshop above a dense Accra neighbourhood: neat blue-black photovoltaic panels, coiled orange cables, water tanks, hazy low-rise buildings and a vast humid sky.",</w:t>
+        <w:br/>
+        <w:t xml:space="preserve">  "status": "✅",</w:t>
         <w:br/>
         <w:t xml:space="preserve">  "file": "images/act1/S01_Step04_tester_display.png"</w:t>
         <w:br/>
@@ -1923,9 +1923,9 @@
         <w:br/>
         <w:t xml:space="preserve">  ],</w:t>
         <w:br/>
-        <w:t xml:space="preserve">  "prompt": "Grounded cinematic West African magical realism; contemporary Ghanaian coastal life; human-scale performances; saturated indigo, lagoon teal, clay red and warm amber palette; natural skin texture; tactile fabric and weathered wood; 2.39:1 widescreen composition; subtle film grain; expressive realistic lighting. No written words, no logos, no watermark, no distorted hands, no duplicate people. Scene S01 — The Roof That Hums. TWO-SHOT shot, eye-level. Characters in frame: @KOSI_MENSAH (indigo utility jumpsuit with rolled sleeves, sand-coloured work boots and a narrow woven kente belt, small gold Adinkra-disc earrings). Kosi listens to Ama's voice message, city glare behind her. Mood: restless possibility. Lighting: hard white midday sun softened by coastal haze. Environment = Location Registry id 'ACCRA_SOLAR_ROOF': A broad, sun-whitened corrugated-roof solar workshop above a dense Accra neighbourhood: neat blue-black photovoltaic panels, coiled orange cables, water tanks, hazy low-rise buildings and a vast humid sky.",</w:t>
-        <w:br/>
-        <w:t xml:space="preserve">  "status": "⬜",</w:t>
+        <w:t xml:space="preserve">  "prompt": "Grounded cinematic West African magical realism; contemporary Ghanaian coastal life; human-scale performances; saturated indigo, lagoon teal, clay red and warm amber palette; natural skin texture; tactile fabric and weathered wood; 16:9 landscape widescreen composition; subtle film grain; expressive realistic lighting. No written words, no logos, no watermark, no distorted hands, no duplicate people. Scene S01 — The Roof That Hums. TWO-SHOT shot, eye-level. Characters in frame: @KOSI_MENSAH (indigo utility jumpsuit with rolled sleeves, sand-coloured work boots and a narrow woven kente belt, small gold Adinkra-disc earrings). Kosi listens to Ama's voice message, city glare behind her. Mood: restless possibility. Lighting: hard white midday sun softened by coastal haze. Environment = Location Registry id 'ACCRA_SOLAR_ROOF': A broad, sun-whitened corrugated-roof solar workshop above a dense Accra neighbourhood: neat blue-black photovoltaic panels, coiled orange cables, water tanks, hazy low-rise buildings and a vast humid sky.",</w:t>
+        <w:br/>
+        <w:t xml:space="preserve">  "status": "✅",</w:t>
         <w:br/>
         <w:t xml:space="preserve">  "file": "images/act1/S01_Step05_phone_message.png"</w:t>
         <w:br/>
@@ -1974,9 +1974,9 @@
         <w:br/>
         <w:t xml:space="preserve">  ],</w:t>
         <w:br/>
-        <w:t xml:space="preserve">  "prompt": "Grounded cinematic West African magical realism; contemporary Ghanaian coastal life; human-scale performances; saturated indigo, lagoon teal, clay red and warm amber palette; natural skin texture; tactile fabric and weathered wood; 2.39:1 widescreen composition; subtle film grain; expressive realistic lighting. No written words, no logos, no watermark, no distorted hands, no duplicate people. Scene S01 — The Roof That Hums. OVER-SHOULDER shot, over the lead character's shoulder. Characters in frame: @KOSI_MENSAH (indigo utility jumpsuit with rolled sleeves, sand-coloured work boots and a narrow woven kente belt, small gold Adinkra-disc earrings). Over Kosi's shoulder, the phone waveform plays while she looks toward the horizon. Mood: restless possibility. Lighting: hard white midday sun softened by coastal haze. Environment = Location Registry id 'ACCRA_SOLAR_ROOF': A broad, sun-whitened corrugated-roof solar workshop above a dense Accra neighbourhood: neat blue-black photovoltaic panels, coiled orange cables, water tanks, hazy low-rise buildings and a vast humid sky.",</w:t>
-        <w:br/>
-        <w:t xml:space="preserve">  "status": "⬜",</w:t>
+        <w:t xml:space="preserve">  "prompt": "Grounded cinematic West African magical realism; contemporary Ghanaian coastal life; human-scale performances; saturated indigo, lagoon teal, clay red and warm amber palette; natural skin texture; tactile fabric and weathered wood; 16:9 landscape widescreen composition; subtle film grain; expressive realistic lighting. No written words, no logos, no watermark, no distorted hands, no duplicate people. Scene S01 — The Roof That Hums. OVER-SHOULDER shot, over the lead character's shoulder. Characters in frame: @KOSI_MENSAH (indigo utility jumpsuit with rolled sleeves, sand-coloured work boots and a narrow woven kente belt, small gold Adinkra-disc earrings). Over Kosi's shoulder, the phone waveform plays while she looks toward the horizon. Mood: restless possibility. Lighting: hard white midday sun softened by coastal haze. Environment = Location Registry id 'ACCRA_SOLAR_ROOF': A broad, sun-whitened corrugated-roof solar workshop above a dense Accra neighbourhood: neat blue-black photovoltaic panels, coiled orange cables, water tanks, hazy low-rise buildings and a vast humid sky.",</w:t>
+        <w:br/>
+        <w:t xml:space="preserve">  "status": "✅",</w:t>
         <w:br/>
         <w:t xml:space="preserve">  "file": "images/act1/S01_Step06_voice_from_home.png"</w:t>
         <w:br/>
@@ -2025,9 +2025,9 @@
         <w:br/>
         <w:t xml:space="preserve">  ],</w:t>
         <w:br/>
-        <w:t xml:space="preserve">  "prompt": "Grounded cinematic West African magical realism; contemporary Ghanaian coastal life; human-scale performances; saturated indigo, lagoon teal, clay red and warm amber palette; natural skin texture; tactile fabric and weathered wood; 2.39:1 widescreen composition; subtle film grain; expressive realistic lighting. No written words, no logos, no watermark, no distorted hands, no duplicate people. Scene S01 — The Roof That Hums. EXTREME CLOSE shot, intimate frontal angle. Characters in frame: @KOSI_MENSAH (indigo utility jumpsuit with rolled sleeves, sand-coloured work boots and a narrow woven kente belt, small gold Adinkra-disc earrings). Kosi's eyes harden as she decides to return home. Mood: restless possibility. Lighting: hard white midday sun softened by coastal haze. Environment = Location Registry id 'ACCRA_SOLAR_ROOF': A broad, sun-whitened corrugated-roof solar workshop above a dense Accra neighbourhood: neat blue-black photovoltaic panels, coiled orange cables, water tanks, hazy low-rise buildings and a vast humid sky.",</w:t>
-        <w:br/>
-        <w:t xml:space="preserve">  "status": "⬜",</w:t>
+        <w:t xml:space="preserve">  "prompt": "Grounded cinematic West African magical realism; contemporary Ghanaian coastal life; human-scale performances; saturated indigo, lagoon teal, clay red and warm amber palette; natural skin texture; tactile fabric and weathered wood; 16:9 landscape widescreen composition; subtle film grain; expressive realistic lighting. No written words, no logos, no watermark, no distorted hands, no duplicate people. Scene S01 — The Roof That Hums. EXTREME CLOSE shot, intimate frontal angle. Characters in frame: @KOSI_MENSAH (indigo utility jumpsuit with rolled sleeves, sand-coloured work boots and a narrow woven kente belt, small gold Adinkra-disc earrings). Kosi's eyes harden as she decides to return home. Mood: restless possibility. Lighting: hard white midday sun softened by coastal haze. Environment = Location Registry id 'ACCRA_SOLAR_ROOF': A broad, sun-whitened corrugated-roof solar workshop above a dense Accra neighbourhood: neat blue-black photovoltaic panels, coiled orange cables, water tanks, hazy low-rise buildings and a vast humid sky.",</w:t>
+        <w:br/>
+        <w:t xml:space="preserve">  "status": "✅",</w:t>
         <w:br/>
         <w:t xml:space="preserve">  "file": "images/act1/S01_Step07_decision_in_eyes.png"</w:t>
         <w:br/>
@@ -2076,9 +2076,9 @@
         <w:br/>
         <w:t xml:space="preserve">  ],</w:t>
         <w:br/>
-        <w:t xml:space="preserve">  "prompt": "Grounded cinematic West African magical realism; contemporary Ghanaian coastal life; human-scale performances; saturated indigo, lagoon teal, clay red and warm amber palette; natural skin texture; tactile fabric and weathered wood; 2.39:1 widescreen composition; subtle film grain; expressive realistic lighting. No written words, no logos, no watermark, no distorted hands, no duplicate people. Scene S01 — The Roof That Hums. WIDE shot, low observational angle. Characters in frame: @KOSI_MENSAH (indigo utility jumpsuit with rolled sleeves, sand-coloured work boots and a narrow woven kente belt, small gold Adinkra-disc earrings). The repaired panels gleam in rows as Kosi stands among them. Mood: restless possibility. Lighting: hard white midday sun softened by coastal haze. Environment = Location Registry id 'ACCRA_SOLAR_ROOF': A broad, sun-whitened corrugated-roof solar workshop above a dense Accra neighbourhood: neat blue-black photovoltaic panels, coiled orange cables, water tanks, hazy low-rise buildings and a vast humid sky.",</w:t>
-        <w:br/>
-        <w:t xml:space="preserve">  "status": "⬜",</w:t>
+        <w:t xml:space="preserve">  "prompt": "Grounded cinematic West African magical realism; contemporary Ghanaian coastal life; human-scale performances; saturated indigo, lagoon teal, clay red and warm amber palette; natural skin texture; tactile fabric and weathered wood; 16:9 landscape widescreen composition; subtle film grain; expressive realistic lighting. No written words, no logos, no watermark, no distorted hands, no duplicate people. Scene S01 — The Roof That Hums. WIDE shot, low observational angle. Characters in frame: @KOSI_MENSAH (indigo utility jumpsuit with rolled sleeves, sand-coloured work boots and a narrow woven kente belt, small gold Adinkra-disc earrings). The repaired panels gleam in rows as Kosi stands among them. Mood: restless possibility. Lighting: hard white midday sun softened by coastal haze. Environment = Location Registry id 'ACCRA_SOLAR_ROOF': A broad, sun-whitened corrugated-roof solar workshop above a dense Accra neighbourhood: neat blue-black photovoltaic panels, coiled orange cables, water tanks, hazy low-rise buildings and a vast humid sky.",</w:t>
+        <w:br/>
+        <w:t xml:space="preserve">  "status": "✅",</w:t>
         <w:br/>
         <w:t xml:space="preserve">  "file": "images/act1/S01_Step08_panels_awake.png"</w:t>
         <w:br/>
@@ -2127,9 +2127,9 @@
         <w:br/>
         <w:t xml:space="preserve">  ],</w:t>
         <w:br/>
-        <w:t xml:space="preserve">  "prompt": "Grounded cinematic West African magical realism; contemporary Ghanaian coastal life; human-scale performances; saturated indigo, lagoon teal, clay red and warm amber palette; natural skin texture; tactile fabric and weathered wood; 2.39:1 widescreen composition; subtle film grain; expressive realistic lighting. No written words, no logos, no watermark, no distorted hands, no duplicate people. Scene S01 — The Roof That Hums. MEDIUM shot, handheld eye-level. Characters in frame: @KOSI_MENSAH (indigo utility jumpsuit with rolled sleeves, sand-coloured work boots and a narrow woven kente belt, small gold Adinkra-disc earrings). Kosi packs a wrench, tester and cables into her battered case. Mood: restless possibility. Lighting: hard white midday sun softened by coastal haze. Environment = Location Registry id 'ACCRA_SOLAR_ROOF': A broad, sun-whitened corrugated-roof solar workshop above a dense Accra neighbourhood: neat blue-black photovoltaic panels, coiled orange cables, water tanks, hazy low-rise buildings and a vast humid sky.",</w:t>
-        <w:br/>
-        <w:t xml:space="preserve">  "status": "⬜",</w:t>
+        <w:t xml:space="preserve">  "prompt": "Grounded cinematic West African magical realism; contemporary Ghanaian coastal life; human-scale performances; saturated indigo, lagoon teal, clay red and warm amber palette; natural skin texture; tactile fabric and weathered wood; 16:9 landscape widescreen composition; subtle film grain; expressive realistic lighting. No written words, no logos, no watermark, no distorted hands, no duplicate people. Scene S01 — The Roof That Hums. MEDIUM shot, handheld eye-level. Characters in frame: @KOSI_MENSAH (indigo utility jumpsuit with rolled sleeves, sand-coloured work boots and a narrow woven kente belt, small gold Adinkra-disc earrings). Kosi packs a wrench, tester and cables into her battered case. Mood: restless possibility. Lighting: hard white midday sun softened by coastal haze. Environment = Location Registry id 'ACCRA_SOLAR_ROOF': A broad, sun-whitened corrugated-roof solar workshop above a dense Accra neighbourhood: neat blue-black photovoltaic panels, coiled orange cables, water tanks, hazy low-rise buildings and a vast humid sky.",</w:t>
+        <w:br/>
+        <w:t xml:space="preserve">  "status": "✅",</w:t>
         <w:br/>
         <w:t xml:space="preserve">  "file": "images/act1/S01_Step09_packing_tools.png"</w:t>
         <w:br/>
@@ -2178,9 +2178,9 @@
         <w:br/>
         <w:t xml:space="preserve">  ],</w:t>
         <w:br/>
-        <w:t xml:space="preserve">  "prompt": "Grounded cinematic West African magical realism; contemporary Ghanaian coastal life; human-scale performances; saturated indigo, lagoon teal, clay red and warm amber palette; natural skin texture; tactile fabric and weathered wood; 2.39:1 widescreen composition; subtle film grain; expressive realistic lighting. No written words, no logos, no watermark, no distorted hands, no duplicate people. Scene S01 — The Roof That Hums. WIDE shot, rear closing tableau. Characters in frame: @KOSI_MENSAH (indigo utility jumpsuit with rolled sleeves, sand-coloured work boots and a narrow woven kente belt, small gold Adinkra-disc earrings). Kosi walks toward the roof exit with her case as the panels hum behind her. Mood: restless possibility. Lighting: hard white midday sun softened by coastal haze. Environment = Location Registry id 'ACCRA_SOLAR_ROOF': A broad, sun-whitened corrugated-roof solar workshop above a dense Accra neighbourhood: neat blue-black photovoltaic panels, coiled orange cables, water tanks, hazy low-rise buildings and a vast humid sky.",</w:t>
-        <w:br/>
-        <w:t xml:space="preserve">  "status": "⬜",</w:t>
+        <w:t xml:space="preserve">  "prompt": "Grounded cinematic West African magical realism; contemporary Ghanaian coastal life; human-scale performances; saturated indigo, lagoon teal, clay red and warm amber palette; natural skin texture; tactile fabric and weathered wood; 16:9 landscape widescreen composition; subtle film grain; expressive realistic lighting. No written words, no logos, no watermark, no distorted hands, no duplicate people. Scene S01 — The Roof That Hums. WIDE shot, rear closing tableau. Characters in frame: @KOSI_MENSAH (indigo utility jumpsuit with rolled sleeves, sand-coloured work boots and a narrow woven kente belt, small gold Adinkra-disc earrings). Kosi walks toward the roof exit with her case as the panels hum behind her. Mood: restless possibility. Lighting: hard white midday sun softened by coastal haze. Environment = Location Registry id 'ACCRA_SOLAR_ROOF': A broad, sun-whitened corrugated-roof solar workshop above a dense Accra neighbourhood: neat blue-black photovoltaic panels, coiled orange cables, water tanks, hazy low-rise buildings and a vast humid sky.",</w:t>
+        <w:br/>
+        <w:t xml:space="preserve">  "status": "✅",</w:t>
         <w:br/>
         <w:t xml:space="preserve">  "file": "images/act1/S01_Step10_leaving_roof.png"</w:t>
         <w:br/>
@@ -2237,7 +2237,7 @@
         <w:br/>
         <w:t xml:space="preserve">  ],</w:t>
         <w:br/>
-        <w:t xml:space="preserve">  "prompt": "Grounded cinematic West African magical realism; contemporary Ghanaian coastal life; human-scale performances; saturated indigo, lagoon teal, clay red and warm amber palette; natural skin texture; tactile fabric and weathered wood; 2.39:1 widescreen composition; subtle film grain; expressive realistic lighting. No written words, no logos, no watermark, no distorted hands, no duplicate people. Scene S02 — Road to Afenyo. WIDE shot, high establishing angle. Characters in frame: @KOSI_MENSAH (indigo utility jumpsuit with rolled sleeves, sand-coloured work boots and a narrow woven kente belt, small gold Adinkra-disc earrings). A tro-tro pulls away from the red-earth stop, leaving Kosi in the sea wind. Mood: uneasy homecoming. Lighting: late gold filtering through bus dust. Environment = Location Registry id 'AFENYO_BUS_STOP': Afenyo's small red-earth bus stop at the lagoon edge: a faded blue shelter, cassava vendors under striped umbrellas, old tro-tro vans, palm trees bent by sea wind and distant silver water.",</w:t>
+        <w:t xml:space="preserve">  "prompt": "Grounded cinematic West African magical realism; contemporary Ghanaian coastal life; human-scale performances; saturated indigo, lagoon teal, clay red and warm amber palette; natural skin texture; tactile fabric and weathered wood; 16:9 landscape widescreen composition; subtle film grain; expressive realistic lighting. No written words, no logos, no watermark, no distorted hands, no duplicate people. Scene S02 — Road to Afenyo. WIDE shot, high establishing angle. Characters in frame: @KOSI_MENSAH (indigo utility jumpsuit with rolled sleeves, sand-coloured work boots and a narrow woven kente belt, small gold Adinkra-disc earrings). A tro-tro pulls away from the red-earth stop, leaving Kosi in the sea wind. Mood: uneasy homecoming. Lighting: late gold filtering through bus dust. Environment = Location Registry id 'AFENYO_BUS_STOP': Afenyo's small red-earth bus stop at the lagoon edge: a faded blue shelter, cassava vendors under striped umbrellas, old tro-tro vans, palm trees bent by sea wind and distant silver water.",</w:t>
         <w:br/>
         <w:t xml:space="preserve">  "status": "⬜",</w:t>
         <w:br/>
@@ -2288,7 +2288,7 @@
         <w:br/>
         <w:t xml:space="preserve">  ],</w:t>
         <w:br/>
-        <w:t xml:space="preserve">  "prompt": "Grounded cinematic West African magical realism; contemporary Ghanaian coastal life; human-scale performances; saturated indigo, lagoon teal, clay red and warm amber palette; natural skin texture; tactile fabric and weathered wood; 2.39:1 widescreen composition; subtle film grain; expressive realistic lighting. No written words, no logos, no watermark, no distorted hands, no duplicate people. Scene S02 — Road to Afenyo. MEDIUM shot, eye-level. Characters in frame: @KOSI_MENSAH (indigo utility jumpsuit with rolled sleeves, sand-coloured work boots and a narrow woven kente belt, small gold Adinkra-disc earrings). Kosi steadies her tool case beside cassava baskets and looks toward the lagoon. Mood: uneasy homecoming. Lighting: late gold filtering through bus dust. Environment = Location Registry id 'AFENYO_BUS_STOP': Afenyo's small red-earth bus stop at the lagoon edge: a faded blue shelter, cassava vendors under striped umbrellas, old tro-tro vans, palm trees bent by sea wind and distant silver water.",</w:t>
+        <w:t xml:space="preserve">  "prompt": "Grounded cinematic West African magical realism; contemporary Ghanaian coastal life; human-scale performances; saturated indigo, lagoon teal, clay red and warm amber palette; natural skin texture; tactile fabric and weathered wood; 16:9 landscape widescreen composition; subtle film grain; expressive realistic lighting. No written words, no logos, no watermark, no distorted hands, no duplicate people. Scene S02 — Road to Afenyo. MEDIUM shot, eye-level. Characters in frame: @KOSI_MENSAH (indigo utility jumpsuit with rolled sleeves, sand-coloured work boots and a narrow woven kente belt, small gold Adinkra-disc earrings). Kosi steadies her tool case beside cassava baskets and looks toward the lagoon. Mood: uneasy homecoming. Lighting: late gold filtering through bus dust. Environment = Location Registry id 'AFENYO_BUS_STOP': Afenyo's small red-earth bus stop at the lagoon edge: a faded blue shelter, cassava vendors under striped umbrellas, old tro-tro vans, palm trees bent by sea wind and distant silver water.",</w:t>
         <w:br/>
         <w:t xml:space="preserve">  "status": "⬜",</w:t>
         <w:br/>
@@ -2339,7 +2339,7 @@
         <w:br/>
         <w:t xml:space="preserve">  ],</w:t>
         <w:br/>
-        <w:t xml:space="preserve">  "prompt": "Grounded cinematic West African magical realism; contemporary Ghanaian coastal life; human-scale performances; saturated indigo, lagoon teal, clay red and warm amber palette; natural skin texture; tactile fabric and weathered wood; 2.39:1 widescreen composition; subtle film grain; expressive realistic lighting. No written words, no logos, no watermark, no distorted hands, no duplicate people. Scene S02 — Road to Afenyo. CLOSE shot, three-quarter profile. Characters in frame: @SENA_ADJOVI (mustard oversized hoodie, blue-and-white printed ankle skirt and worn white canvas trainers, turquoise over-ear radio headphones). Sena grins beneath turquoise headphones as she spots Kosi. Mood: uneasy homecoming. Lighting: late gold filtering through bus dust. Environment = Location Registry id 'AFENYO_BUS_STOP': Afenyo's small red-earth bus stop at the lagoon edge: a faded blue shelter, cassava vendors under striped umbrellas, old tro-tro vans, palm trees bent by sea wind and distant silver water.",</w:t>
+        <w:t xml:space="preserve">  "prompt": "Grounded cinematic West African magical realism; contemporary Ghanaian coastal life; human-scale performances; saturated indigo, lagoon teal, clay red and warm amber palette; natural skin texture; tactile fabric and weathered wood; 16:9 landscape widescreen composition; subtle film grain; expressive realistic lighting. No written words, no logos, no watermark, no distorted hands, no duplicate people. Scene S02 — Road to Afenyo. CLOSE shot, three-quarter profile. Characters in frame: @SENA_ADJOVI (mustard oversized hoodie, blue-and-white printed ankle skirt and worn white canvas trainers, turquoise over-ear radio headphones). Sena grins beneath turquoise headphones as she spots Kosi. Mood: uneasy homecoming. Lighting: late gold filtering through bus dust. Environment = Location Registry id 'AFENYO_BUS_STOP': Afenyo's small red-earth bus stop at the lagoon edge: a faded blue shelter, cassava vendors under striped umbrellas, old tro-tro vans, palm trees bent by sea wind and distant silver water.",</w:t>
         <w:br/>
         <w:t xml:space="preserve">  "status": "⬜",</w:t>
         <w:br/>
@@ -2390,7 +2390,7 @@
         <w:br/>
         <w:t xml:space="preserve">  ],</w:t>
         <w:br/>
-        <w:t xml:space="preserve">  "prompt": "Grounded cinematic West African magical realism; contemporary Ghanaian coastal life; human-scale performances; saturated indigo, lagoon teal, clay red and warm amber palette; natural skin texture; tactile fabric and weathered wood; 2.39:1 widescreen composition; subtle film grain; expressive realistic lighting. No written words, no logos, no watermark, no distorted hands, no duplicate people. Scene S02 — Road to Afenyo. INSERT shot, top-down detail. Characters in frame: @SENA_ADJOVI (mustard oversized hoodie, blue-and-white printed ankle skirt and worn white canvas trainers, turquoise over-ear radio headphones). Sena's small microphone and turquoise headphone cable rest against her mustard hoodie. Mood: uneasy homecoming. Lighting: late gold filtering through bus dust. Environment = Location Registry id 'AFENYO_BUS_STOP': Afenyo's small red-earth bus stop at the lagoon edge: a faded blue shelter, cassava vendors under striped umbrellas, old tro-tro vans, palm trees bent by sea wind and distant silver water.",</w:t>
+        <w:t xml:space="preserve">  "prompt": "Grounded cinematic West African magical realism; contemporary Ghanaian coastal life; human-scale performances; saturated indigo, lagoon teal, clay red and warm amber palette; natural skin texture; tactile fabric and weathered wood; 16:9 landscape widescreen composition; subtle film grain; expressive realistic lighting. No written words, no logos, no watermark, no distorted hands, no duplicate people. Scene S02 — Road to Afenyo. INSERT shot, top-down detail. Characters in frame: @SENA_ADJOVI (mustard oversized hoodie, blue-and-white printed ankle skirt and worn white canvas trainers, turquoise over-ear radio headphones). Sena's small microphone and turquoise headphone cable rest against her mustard hoodie. Mood: uneasy homecoming. Lighting: late gold filtering through bus dust. Environment = Location Registry id 'AFENYO_BUS_STOP': Afenyo's small red-earth bus stop at the lagoon edge: a faded blue shelter, cassava vendors under striped umbrellas, old tro-tro vans, palm trees bent by sea wind and distant silver water.",</w:t>
         <w:br/>
         <w:t xml:space="preserve">  "status": "⬜",</w:t>
         <w:br/>
@@ -2445,7 +2445,7 @@
         <w:br/>
         <w:t xml:space="preserve">  ],</w:t>
         <w:br/>
-        <w:t xml:space="preserve">  "prompt": "Grounded cinematic West African magical realism; contemporary Ghanaian coastal life; human-scale performances; saturated indigo, lagoon teal, clay red and warm amber palette; natural skin texture; tactile fabric and weathered wood; 2.39:1 widescreen composition; subtle film grain; expressive realistic lighting. No written words, no logos, no watermark, no distorted hands, no duplicate people. Scene S02 — Road to Afenyo. TWO-SHOT shot, eye-level. Characters in frame: @KOSI_MENSAH (indigo utility jumpsuit with rolled sleeves, sand-coloured work boots and a narrow woven kente belt, small gold Adinkra-disc earrings); @SENA_ADJOVI (mustard oversized hoodie, blue-and-white printed ankle skirt and worn white canvas trainers, turquoise over-ear radio headphones). Sena reaches for Kosi's case rather than a hug; Kosi laughs despite herself. Mood: uneasy homecoming. Lighting: late gold filtering through bus dust. Environment = Location Registry id 'AFENYO_BUS_STOP': Afenyo's small red-earth bus stop at the lagoon edge: a faded blue shelter, cassava vendors under striped umbrellas, old tro-tro vans, palm trees bent by sea wind and distant silver water.",</w:t>
+        <w:t xml:space="preserve">  "prompt": "Grounded cinematic West African magical realism; contemporary Ghanaian coastal life; human-scale performances; saturated indigo, lagoon teal, clay red and warm amber palette; natural skin texture; tactile fabric and weathered wood; 16:9 landscape widescreen composition; subtle film grain; expressive realistic lighting. No written words, no logos, no watermark, no distorted hands, no duplicate people. Scene S02 — Road to Afenyo. TWO-SHOT shot, eye-level. Characters in frame: @KOSI_MENSAH (indigo utility jumpsuit with rolled sleeves, sand-coloured work boots and a narrow woven kente belt, small gold Adinkra-disc earrings); @SENA_ADJOVI (mustard oversized hoodie, blue-and-white printed ankle skirt and worn white canvas trainers, turquoise over-ear radio headphones). Sena reaches for Kosi's case rather than a hug; Kosi laughs despite herself. Mood: uneasy homecoming. Lighting: late gold filtering through bus dust. Environment = Location Registry id 'AFENYO_BUS_STOP': Afenyo's small red-earth bus stop at the lagoon edge: a faded blue shelter, cassava vendors under striped umbrellas, old tro-tro vans, palm trees bent by sea wind and distant silver water.",</w:t>
         <w:br/>
         <w:t xml:space="preserve">  "status": "⬜",</w:t>
         <w:br/>
@@ -2500,7 +2500,7 @@
         <w:br/>
         <w:t xml:space="preserve">  ],</w:t>
         <w:br/>
-        <w:t xml:space="preserve">  "prompt": "Grounded cinematic West African magical realism; contemporary Ghanaian coastal life; human-scale performances; saturated indigo, lagoon teal, clay red and warm amber palette; natural skin texture; tactile fabric and weathered wood; 2.39:1 widescreen composition; subtle film grain; expressive realistic lighting. No written words, no logos, no watermark, no distorted hands, no duplicate people. Scene S02 — Road to Afenyo. OVER-SHOULDER shot, over the lead character's shoulder. Characters in frame: @KOSI_MENSAH (indigo utility jumpsuit with rolled sleeves, sand-coloured work boots and a narrow woven kente belt, small gold Adinkra-disc earrings); @SENA_ADJOVI (mustard oversized hoodie, blue-and-white printed ankle skirt and worn white canvas trainers, turquoise over-ear radio headphones). Over Sena's shoulder, Kosi hears that Ama is afraid. Mood: uneasy homecoming. Lighting: late gold filtering through bus dust. Environment = Location Registry id 'AFENYO_BUS_STOP': Afenyo's small red-earth bus stop at the lagoon edge: a faded blue shelter, cassava vendors under striped umbrellas, old tro-tro vans, palm trees bent by sea wind and distant silver water.",</w:t>
+        <w:t xml:space="preserve">  "prompt": "Grounded cinematic West African magical realism; contemporary Ghanaian coastal life; human-scale performances; saturated indigo, lagoon teal, clay red and warm amber palette; natural skin texture; tactile fabric and weathered wood; 16:9 landscape widescreen composition; subtle film grain; expressive realistic lighting. No written words, no logos, no watermark, no distorted hands, no duplicate people. Scene S02 — Road to Afenyo. OVER-SHOULDER shot, over the lead character's shoulder. Characters in frame: @KOSI_MENSAH (indigo utility jumpsuit with rolled sleeves, sand-coloured work boots and a narrow woven kente belt, small gold Adinkra-disc earrings); @SENA_ADJOVI (mustard oversized hoodie, blue-and-white printed ankle skirt and worn white canvas trainers, turquoise over-ear radio headphones). Over Sena's shoulder, Kosi hears that Ama is afraid. Mood: uneasy homecoming. Lighting: late gold filtering through bus dust. Environment = Location Registry id 'AFENYO_BUS_STOP': Afenyo's small red-earth bus stop at the lagoon edge: a faded blue shelter, cassava vendors under striped umbrellas, old tro-tro vans, palm trees bent by sea wind and distant silver water.",</w:t>
         <w:br/>
         <w:t xml:space="preserve">  "status": "⬜",</w:t>
         <w:br/>
@@ -2551,7 +2551,7 @@
         <w:br/>
         <w:t xml:space="preserve">  ],</w:t>
         <w:br/>
-        <w:t xml:space="preserve">  "prompt": "Grounded cinematic West African magical realism; contemporary Ghanaian coastal life; human-scale performances; saturated indigo, lagoon teal, clay red and warm amber palette; natural skin texture; tactile fabric and weathered wood; 2.39:1 widescreen composition; subtle film grain; expressive realistic lighting. No written words, no logos, no watermark, no distorted hands, no duplicate people. Scene S02 — Road to Afenyo. EXTREME CLOSE shot, intimate frontal angle. Characters in frame: @SENA_ADJOVI (mustard oversized hoodie, blue-and-white printed ankle skirt and worn white canvas trainers, turquoise over-ear radio headphones). Sena's brave face falters for one honest second. Mood: uneasy homecoming. Lighting: late gold filtering through bus dust. Environment = Location Registry id 'AFENYO_BUS_STOP': Afenyo's small red-earth bus stop at the lagoon edge: a faded blue shelter, cassava vendors under striped umbrellas, old tro-tro vans, palm trees bent by sea wind and distant silver water.",</w:t>
+        <w:t xml:space="preserve">  "prompt": "Grounded cinematic West African magical realism; contemporary Ghanaian coastal life; human-scale performances; saturated indigo, lagoon teal, clay red and warm amber palette; natural skin texture; tactile fabric and weathered wood; 16:9 landscape widescreen composition; subtle film grain; expressive realistic lighting. No written words, no logos, no watermark, no distorted hands, no duplicate people. Scene S02 — Road to Afenyo. EXTREME CLOSE shot, intimate frontal angle. Characters in frame: @SENA_ADJOVI (mustard oversized hoodie, blue-and-white printed ankle skirt and worn white canvas trainers, turquoise over-ear radio headphones). Sena's brave face falters for one honest second. Mood: uneasy homecoming. Lighting: late gold filtering through bus dust. Environment = Location Registry id 'AFENYO_BUS_STOP': Afenyo's small red-earth bus stop at the lagoon edge: a faded blue shelter, cassava vendors under striped umbrellas, old tro-tro vans, palm trees bent by sea wind and distant silver water.",</w:t>
         <w:br/>
         <w:t xml:space="preserve">  "status": "⬜",</w:t>
         <w:br/>
@@ -2606,7 +2606,7 @@
         <w:br/>
         <w:t xml:space="preserve">  ],</w:t>
         <w:br/>
-        <w:t xml:space="preserve">  "prompt": "Grounded cinematic West African magical realism; contemporary Ghanaian coastal life; human-scale performances; saturated indigo, lagoon teal, clay red and warm amber palette; natural skin texture; tactile fabric and weathered wood; 2.39:1 widescreen composition; subtle film grain; expressive realistic lighting. No written words, no logos, no watermark, no distorted hands, no duplicate people. Scene S02 — Road to Afenyo. WIDE shot, low observational angle. Characters in frame: @KOSI_MENSAH (indigo utility jumpsuit with rolled sleeves, sand-coloured work boots and a narrow woven kente belt, small gold Adinkra-disc earrings); @SENA_ADJOVI (mustard oversized hoodie, blue-and-white printed ankle skirt and worn white canvas trainers, turquoise over-ear radio headphones). Wind lifts striped umbrellas around the two cousins amid the busy stop. Mood: uneasy homecoming. Lighting: late gold filtering through bus dust. Environment = Location Registry id 'AFENYO_BUS_STOP': Afenyo's small red-earth bus stop at the lagoon edge: a faded blue shelter, cassava vendors under striped umbrellas, old tro-tro vans, palm trees bent by sea wind and distant silver water.",</w:t>
+        <w:t xml:space="preserve">  "prompt": "Grounded cinematic West African magical realism; contemporary Ghanaian coastal life; human-scale performances; saturated indigo, lagoon teal, clay red and warm amber palette; natural skin texture; tactile fabric and weathered wood; 16:9 landscape widescreen composition; subtle film grain; expressive realistic lighting. No written words, no logos, no watermark, no distorted hands, no duplicate people. Scene S02 — Road to Afenyo. WIDE shot, low observational angle. Characters in frame: @KOSI_MENSAH (indigo utility jumpsuit with rolled sleeves, sand-coloured work boots and a narrow woven kente belt, small gold Adinkra-disc earrings); @SENA_ADJOVI (mustard oversized hoodie, blue-and-white printed ankle skirt and worn white canvas trainers, turquoise over-ear radio headphones). Wind lifts striped umbrellas around the two cousins amid the busy stop. Mood: uneasy homecoming. Lighting: late gold filtering through bus dust. Environment = Location Registry id 'AFENYO_BUS_STOP': Afenyo's small red-earth bus stop at the lagoon edge: a faded blue shelter, cassava vendors under striped umbrellas, old tro-tro vans, palm trees bent by sea wind and distant silver water.",</w:t>
         <w:br/>
         <w:t xml:space="preserve">  "status": "⬜",</w:t>
         <w:br/>
@@ -2661,7 +2661,7 @@
         <w:br/>
         <w:t xml:space="preserve">  ],</w:t>
         <w:br/>
-        <w:t xml:space="preserve">  "prompt": "Grounded cinematic West African magical realism; contemporary Ghanaian coastal life; human-scale performances; saturated indigo, lagoon teal, clay red and warm amber palette; natural skin texture; tactile fabric and weathered wood; 2.39:1 widescreen composition; subtle film grain; expressive realistic lighting. No written words, no logos, no watermark, no distorted hands, no duplicate people. Scene S02 — Road to Afenyo. MEDIUM shot, handheld eye-level. Characters in frame: @KOSI_MENSAH (indigo utility jumpsuit with rolled sleeves, sand-coloured work boots and a narrow woven kente belt, small gold Adinkra-disc earrings); @SENA_ADJOVI (mustard oversized hoodie, blue-and-white printed ankle skirt and worn white canvas trainers, turquoise over-ear radio headphones). Kosi and Sena walk along the lagoon road, one carrying tools and one recording sound. Mood: uneasy homecoming. Lighting: late gold filtering through bus dust. Environment = Location Registry id 'AFENYO_BUS_STOP': Afenyo's small red-earth bus stop at the lagoon edge: a faded blue shelter, cassava vendors under striped umbrellas, old tro-tro vans, palm trees bent by sea wind and distant silver water.",</w:t>
+        <w:t xml:space="preserve">  "prompt": "Grounded cinematic West African magical realism; contemporary Ghanaian coastal life; human-scale performances; saturated indigo, lagoon teal, clay red and warm amber palette; natural skin texture; tactile fabric and weathered wood; 16:9 landscape widescreen composition; subtle film grain; expressive realistic lighting. No written words, no logos, no watermark, no distorted hands, no duplicate people. Scene S02 — Road to Afenyo. MEDIUM shot, handheld eye-level. Characters in frame: @KOSI_MENSAH (indigo utility jumpsuit with rolled sleeves, sand-coloured work boots and a narrow woven kente belt, small gold Adinkra-disc earrings); @SENA_ADJOVI (mustard oversized hoodie, blue-and-white printed ankle skirt and worn white canvas trainers, turquoise over-ear radio headphones). Kosi and Sena walk along the lagoon road, one carrying tools and one recording sound. Mood: uneasy homecoming. Lighting: late gold filtering through bus dust. Environment = Location Registry id 'AFENYO_BUS_STOP': Afenyo's small red-earth bus stop at the lagoon edge: a faded blue shelter, cassava vendors under striped umbrellas, old tro-tro vans, palm trees bent by sea wind and distant silver water.",</w:t>
         <w:br/>
         <w:t xml:space="preserve">  "status": "⬜",</w:t>
         <w:br/>
@@ -2716,7 +2716,7 @@
         <w:br/>
         <w:t xml:space="preserve">  ],</w:t>
         <w:br/>
-        <w:t xml:space="preserve">  "prompt": "Grounded cinematic West African magical realism; contemporary Ghanaian coastal life; human-scale performances; saturated indigo, lagoon teal, clay red and warm amber palette; natural skin texture; tactile fabric and weathered wood; 2.39:1 widescreen composition; subtle film grain; expressive realistic lighting. No written words, no logos, no watermark, no distorted hands, no duplicate people. Scene S02 — Road to Afenyo. WIDE shot, rear closing tableau. Characters in frame: @KOSI_MENSAH (indigo utility jumpsuit with rolled sleeves, sand-coloured work boots and a narrow woven kente belt, small gold Adinkra-disc earrings); @SENA_ADJOVI (mustard oversized hoodie, blue-and-white printed ankle skirt and worn white canvas trainers, turquoise over-ear radio headphones). Their small figures head toward Afenyo's palms and blue water. Mood: uneasy homecoming. Lighting: late gold filtering through bus dust. Environment = Location Registry id 'AFENYO_BUS_STOP': Afenyo's small red-earth bus stop at the lagoon edge: a faded blue shelter, cassava vendors under striped umbrellas, old tro-tro vans, palm trees bent by sea wind and distant silver water.",</w:t>
+        <w:t xml:space="preserve">  "prompt": "Grounded cinematic West African magical realism; contemporary Ghanaian coastal life; human-scale performances; saturated indigo, lagoon teal, clay red and warm amber palette; natural skin texture; tactile fabric and weathered wood; 16:9 landscape widescreen composition; subtle film grain; expressive realistic lighting. No written words, no logos, no watermark, no distorted hands, no duplicate people. Scene S02 — Road to Afenyo. WIDE shot, rear closing tableau. Characters in frame: @KOSI_MENSAH (indigo utility jumpsuit with rolled sleeves, sand-coloured work boots and a narrow woven kente belt, small gold Adinkra-disc earrings); @SENA_ADJOVI (mustard oversized hoodie, blue-and-white printed ankle skirt and worn white canvas trainers, turquoise over-ear radio headphones). Their small figures head toward Afenyo's palms and blue water. Mood: uneasy homecoming. Lighting: late gold filtering through bus dust. Environment = Location Registry id 'AFENYO_BUS_STOP': Afenyo's small red-earth bus stop at the lagoon edge: a faded blue shelter, cassava vendors under striped umbrellas, old tro-tro vans, palm trees bent by sea wind and distant silver water.",</w:t>
         <w:br/>
         <w:t xml:space="preserve">  "status": "⬜",</w:t>
         <w:br/>
@@ -2775,7 +2775,7 @@
         <w:br/>
         <w:t xml:space="preserve">  ],</w:t>
         <w:br/>
-        <w:t xml:space="preserve">  "prompt": "Grounded cinematic West African magical realism; contemporary Ghanaian coastal life; human-scale performances; saturated indigo, lagoon teal, clay red and warm amber palette; natural skin texture; tactile fabric and weathered wood; 2.39:1 widescreen composition; subtle film grain; expressive realistic lighting. No written words, no logos, no watermark, no distorted hands, no duplicate people. Scene S03 — A Lantern Left Dark. WIDE shot, high establishing angle. Characters in frame: @AMA_ADJOVI (deep navy kaba blouse, hand-dyed indigo wrapper with tiny white wave motifs and flat leather sandals, three-strand amber bead necklace). Ama waits beneath the mango tree in the courtyard beside an unlit blue-glass lantern. Mood: warm reunion with a hidden wound. Lighting: low amber sunset and first cool blue shadows. Environment = Location Registry id 'COMPOUND_COURTYARD': Ama's lived-in family compound courtyard in Afenyo: ochre plaster walls, a weathered blue wooden door, clay pots of basil, woven stools, a mango tree, laundry lines and a low view toward the lagoon.",</w:t>
+        <w:t xml:space="preserve">  "prompt": "Grounded cinematic West African magical realism; contemporary Ghanaian coastal life; human-scale performances; saturated indigo, lagoon teal, clay red and warm amber palette; natural skin texture; tactile fabric and weathered wood; 16:9 landscape widescreen composition; subtle film grain; expressive realistic lighting. No written words, no logos, no watermark, no distorted hands, no duplicate people. Scene S03 — A Lantern Left Dark. WIDE shot, high establishing angle. Characters in frame: @AMA_ADJOVI (deep navy kaba blouse, hand-dyed indigo wrapper with tiny white wave motifs and flat leather sandals, three-strand amber bead necklace). Ama waits beneath the mango tree in the courtyard beside an unlit blue-glass lantern. Mood: warm reunion with a hidden wound. Lighting: low amber sunset and first cool blue shadows. Environment = Location Registry id 'COMPOUND_COURTYARD': Ama's lived-in family compound courtyard in Afenyo: ochre plaster walls, a weathered blue wooden door, clay pots of basil, woven stools, a mango tree, laundry lines and a low view toward the lagoon.",</w:t>
         <w:br/>
         <w:t xml:space="preserve">  "status": "⬜",</w:t>
         <w:br/>
@@ -2826,7 +2826,7 @@
         <w:br/>
         <w:t xml:space="preserve">  ],</w:t>
         <w:br/>
-        <w:t xml:space="preserve">  "prompt": "Grounded cinematic West African magical realism; contemporary Ghanaian coastal life; human-scale performances; saturated indigo, lagoon teal, clay red and warm amber palette; natural skin texture; tactile fabric and weathered wood; 2.39:1 widescreen composition; subtle film grain; expressive realistic lighting. No written words, no logos, no watermark, no distorted hands, no duplicate people. Scene S03 — A Lantern Left Dark. MEDIUM shot, eye-level. Characters in frame: @KOSI_MENSAH (indigo utility jumpsuit with rolled sleeves, sand-coloured work boots and a narrow woven kente belt, small gold Adinkra-disc earrings). Kosi steps through the weathered blue door and scans her childhood courtyard. Mood: warm reunion with a hidden wound. Lighting: low amber sunset and first cool blue shadows. Environment = Location Registry id 'COMPOUND_COURTYARD': Ama's lived-in family compound courtyard in Afenyo: ochre plaster walls, a weathered blue wooden door, clay pots of basil, woven stools, a mango tree, laundry lines and a low view toward the lagoon.",</w:t>
+        <w:t xml:space="preserve">  "prompt": "Grounded cinematic West African magical realism; contemporary Ghanaian coastal life; human-scale performances; saturated indigo, lagoon teal, clay red and warm amber palette; natural skin texture; tactile fabric and weathered wood; 16:9 landscape widescreen composition; subtle film grain; expressive realistic lighting. No written words, no logos, no watermark, no distorted hands, no duplicate people. Scene S03 — A Lantern Left Dark. MEDIUM shot, eye-level. Characters in frame: @KOSI_MENSAH (indigo utility jumpsuit with rolled sleeves, sand-coloured work boots and a narrow woven kente belt, small gold Adinkra-disc earrings). Kosi steps through the weathered blue door and scans her childhood courtyard. Mood: warm reunion with a hidden wound. Lighting: low amber sunset and first cool blue shadows. Environment = Location Registry id 'COMPOUND_COURTYARD': Ama's lived-in family compound courtyard in Afenyo: ochre plaster walls, a weathered blue wooden door, clay pots of basil, woven stools, a mango tree, laundry lines and a low view toward the lagoon.",</w:t>
         <w:br/>
         <w:t xml:space="preserve">  "status": "⬜",</w:t>
         <w:br/>
@@ -2877,7 +2877,7 @@
         <w:br/>
         <w:t xml:space="preserve">  ],</w:t>
         <w:br/>
-        <w:t xml:space="preserve">  "prompt": "Grounded cinematic West African magical realism; contemporary Ghanaian coastal life; human-scale performances; saturated indigo, lagoon teal, clay red and warm amber palette; natural skin texture; tactile fabric and weathered wood; 2.39:1 widescreen composition; subtle film grain; expressive realistic lighting. No written words, no logos, no watermark, no distorted hands, no duplicate people. Scene S03 — A Lantern Left Dark. CLOSE shot, three-quarter profile. Characters in frame: @AMA_ADJOVI (deep navy kaba blouse, hand-dyed indigo wrapper with tiny white wave motifs and flat leather sandals, three-strand amber bead necklace). Ama hides a tremor with a warm, teasing smile. Mood: warm reunion with a hidden wound. Lighting: low amber sunset and first cool blue shadows. Environment = Location Registry id 'COMPOUND_COURTYARD': Ama's lived-in family compound courtyard in Afenyo: ochre plaster walls, a weathered blue wooden door, clay pots of basil, woven stools, a mango tree, laundry lines and a low view toward the lagoon.",</w:t>
+        <w:t xml:space="preserve">  "prompt": "Grounded cinematic West African magical realism; contemporary Ghanaian coastal life; human-scale performances; saturated indigo, lagoon teal, clay red and warm amber palette; natural skin texture; tactile fabric and weathered wood; 16:9 landscape widescreen composition; subtle film grain; expressive realistic lighting. No written words, no logos, no watermark, no distorted hands, no duplicate people. Scene S03 — A Lantern Left Dark. CLOSE shot, three-quarter profile. Characters in frame: @AMA_ADJOVI (deep navy kaba blouse, hand-dyed indigo wrapper with tiny white wave motifs and flat leather sandals, three-strand amber bead necklace). Ama hides a tremor with a warm, teasing smile. Mood: warm reunion with a hidden wound. Lighting: low amber sunset and first cool blue shadows. Environment = Location Registry id 'COMPOUND_COURTYARD': Ama's lived-in family compound courtyard in Afenyo: ochre plaster walls, a weathered blue wooden door, clay pots of basil, woven stools, a mango tree, laundry lines and a low view toward the lagoon.",</w:t>
         <w:br/>
         <w:t xml:space="preserve">  "status": "⬜",</w:t>
         <w:br/>
@@ -2928,7 +2928,7 @@
         <w:br/>
         <w:t xml:space="preserve">  ],</w:t>
         <w:br/>
-        <w:t xml:space="preserve">  "prompt": "Grounded cinematic West African magical realism; contemporary Ghanaian coastal life; human-scale performances; saturated indigo, lagoon teal, clay red and warm amber palette; natural skin texture; tactile fabric and weathered wood; 2.39:1 widescreen composition; subtle film grain; expressive realistic lighting. No written words, no logos, no watermark, no distorted hands, no duplicate people. Scene S03 — A Lantern Left Dark. INSERT shot, top-down detail. Characters in frame: @AMA_ADJOVI (deep navy kaba blouse, hand-dyed indigo wrapper with tiny white wave motifs and flat leather sandals, three-strand amber bead necklace). The dusty blue-glass courtyard lantern hangs dark against sunset. Mood: warm reunion with a hidden wound. Lighting: low amber sunset and first cool blue shadows. Environment = Location Registry id 'COMPOUND_COURTYARD': Ama's lived-in family compound courtyard in Afenyo: ochre plaster walls, a weathered blue wooden door, clay pots of basil, woven stools, a mango tree, laundry lines and a low view toward the lagoon.",</w:t>
+        <w:t xml:space="preserve">  "prompt": "Grounded cinematic West African magical realism; contemporary Ghanaian coastal life; human-scale performances; saturated indigo, lagoon teal, clay red and warm amber palette; natural skin texture; tactile fabric and weathered wood; 16:9 landscape widescreen composition; subtle film grain; expressive realistic lighting. No written words, no logos, no watermark, no distorted hands, no duplicate people. Scene S03 — A Lantern Left Dark. INSERT shot, top-down detail. Characters in frame: @AMA_ADJOVI (deep navy kaba blouse, hand-dyed indigo wrapper with tiny white wave motifs and flat leather sandals, three-strand amber bead necklace). The dusty blue-glass courtyard lantern hangs dark against sunset. Mood: warm reunion with a hidden wound. Lighting: low amber sunset and first cool blue shadows. Environment = Location Registry id 'COMPOUND_COURTYARD': Ama's lived-in family compound courtyard in Afenyo: ochre plaster walls, a weathered blue wooden door, clay pots of basil, woven stools, a mango tree, laundry lines and a low view toward the lagoon.",</w:t>
         <w:br/>
         <w:t xml:space="preserve">  "status": "⬜",</w:t>
         <w:br/>
@@ -2983,7 +2983,7 @@
         <w:br/>
         <w:t xml:space="preserve">  ],</w:t>
         <w:br/>
-        <w:t xml:space="preserve">  "prompt": "Grounded cinematic West African magical realism; contemporary Ghanaian coastal life; human-scale performances; saturated indigo, lagoon teal, clay red and warm amber palette; natural skin texture; tactile fabric and weathered wood; 2.39:1 widescreen composition; subtle film grain; expressive realistic lighting. No written words, no logos, no watermark, no distorted hands, no duplicate people. Scene S03 — A Lantern Left Dark. TWO-SHOT shot, eye-level. Characters in frame: @KOSI_MENSAH (indigo utility jumpsuit with rolled sleeves, sand-coloured work boots and a narrow woven kente belt, small gold Adinkra-disc earrings); @AMA_ADJOVI (deep navy kaba blouse, hand-dyed indigo wrapper with tiny white wave motifs and flat leather sandals, three-strand amber bead necklace). Kosi hugs Ama tightly while Sena watches from a woven stool. Mood: warm reunion with a hidden wound. Lighting: low amber sunset and first cool blue shadows. Environment = Location Registry id 'COMPOUND_COURTYARD': Ama's lived-in family compound courtyard in Afenyo: ochre plaster walls, a weathered blue wooden door, clay pots of basil, woven stools, a mango tree, laundry lines and a low view toward the lagoon.",</w:t>
+        <w:t xml:space="preserve">  "prompt": "Grounded cinematic West African magical realism; contemporary Ghanaian coastal life; human-scale performances; saturated indigo, lagoon teal, clay red and warm amber palette; natural skin texture; tactile fabric and weathered wood; 16:9 landscape widescreen composition; subtle film grain; expressive realistic lighting. No written words, no logos, no watermark, no distorted hands, no duplicate people. Scene S03 — A Lantern Left Dark. TWO-SHOT shot, eye-level. Characters in frame: @KOSI_MENSAH (indigo utility jumpsuit with rolled sleeves, sand-coloured work boots and a narrow woven kente belt, small gold Adinkra-disc earrings); @AMA_ADJOVI (deep navy kaba blouse, hand-dyed indigo wrapper with tiny white wave motifs and flat leather sandals, three-strand amber bead necklace). Kosi hugs Ama tightly while Sena watches from a woven stool. Mood: warm reunion with a hidden wound. Lighting: low amber sunset and first cool blue shadows. Environment = Location Registry id 'COMPOUND_COURTYARD': Ama's lived-in family compound courtyard in Afenyo: ochre plaster walls, a weathered blue wooden door, clay pots of basil, woven stools, a mango tree, laundry lines and a low view toward the lagoon.",</w:t>
         <w:br/>
         <w:t xml:space="preserve">  "status": "⬜",</w:t>
         <w:br/>
@@ -3038,7 +3038,7 @@
         <w:br/>
         <w:t xml:space="preserve">  ],</w:t>
         <w:br/>
-        <w:t xml:space="preserve">  "prompt": "Grounded cinematic West African magical realism; contemporary Ghanaian coastal life; human-scale performances; saturated indigo, lagoon teal, clay red and warm amber palette; natural skin texture; tactile fabric and weathered wood; 2.39:1 widescreen composition; subtle film grain; expressive realistic lighting. No written words, no logos, no watermark, no distorted hands, no duplicate people. Scene S03 — A Lantern Left Dark. OVER-SHOULDER shot, over the lead character's shoulder. Characters in frame: @KOSI_MENSAH (indigo utility jumpsuit with rolled sleeves, sand-coloured work boots and a narrow woven kente belt, small gold Adinkra-disc earrings); @AMA_ADJOVI (deep navy kaba blouse, hand-dyed indigo wrapper with tiny white wave motifs and flat leather sandals, three-strand amber bead necklace). Over Kosi's shoulder, Ama's hand trembles against the indigo jumpsuit. Mood: warm reunion with a hidden wound. Lighting: low amber sunset and first cool blue shadows. Environment = Location Registry id 'COMPOUND_COURTYARD': Ama's lived-in family compound courtyard in Afenyo: ochre plaster walls, a weathered blue wooden door, clay pots of basil, woven stools, a mango tree, laundry lines and a low view toward the lagoon.",</w:t>
+        <w:t xml:space="preserve">  "prompt": "Grounded cinematic West African magical realism; contemporary Ghanaian coastal life; human-scale performances; saturated indigo, lagoon teal, clay red and warm amber palette; natural skin texture; tactile fabric and weathered wood; 16:9 landscape widescreen composition; subtle film grain; expressive realistic lighting. No written words, no logos, no watermark, no distorted hands, no duplicate people. Scene S03 — A Lantern Left Dark. OVER-SHOULDER shot, over the lead character's shoulder. Characters in frame: @KOSI_MENSAH (indigo utility jumpsuit with rolled sleeves, sand-coloured work boots and a narrow woven kente belt, small gold Adinkra-disc earrings); @AMA_ADJOVI (deep navy kaba blouse, hand-dyed indigo wrapper with tiny white wave motifs and flat leather sandals, three-strand amber bead necklace). Over Kosi's shoulder, Ama's hand trembles against the indigo jumpsuit. Mood: warm reunion with a hidden wound. Lighting: low amber sunset and first cool blue shadows. Environment = Location Registry id 'COMPOUND_COURTYARD': Ama's lived-in family compound courtyard in Afenyo: ochre plaster walls, a weathered blue wooden door, clay pots of basil, woven stools, a mango tree, laundry lines and a low view toward the lagoon.",</w:t>
         <w:br/>
         <w:t xml:space="preserve">  "status": "⬜",</w:t>
         <w:br/>
@@ -3089,7 +3089,7 @@
         <w:br/>
         <w:t xml:space="preserve">  ],</w:t>
         <w:br/>
-        <w:t xml:space="preserve">  "prompt": "Grounded cinematic West African magical realism; contemporary Ghanaian coastal life; human-scale performances; saturated indigo, lagoon teal, clay red and warm amber palette; natural skin texture; tactile fabric and weathered wood; 2.39:1 widescreen composition; subtle film grain; expressive realistic lighting. No written words, no logos, no watermark, no distorted hands, no duplicate people. Scene S03 — A Lantern Left Dark. EXTREME CLOSE shot, intimate frontal angle. Characters in frame: @AMA_ADJOVI (deep navy kaba blouse, hand-dyed indigo wrapper with tiny white wave motifs and flat leather sandals, three-strand amber bead necklace). Ama explains the meaning of a dark lantern with quiet gravity. Mood: warm reunion with a hidden wound. Lighting: low amber sunset and first cool blue shadows. Environment = Location Registry id 'COMPOUND_COURTYARD': Ama's lived-in family compound courtyard in Afenyo: ochre plaster walls, a weathered blue wooden door, clay pots of basil, woven stools, a mango tree, laundry lines and a low view toward the lagoon.",</w:t>
+        <w:t xml:space="preserve">  "prompt": "Grounded cinematic West African magical realism; contemporary Ghanaian coastal life; human-scale performances; saturated indigo, lagoon teal, clay red and warm amber palette; natural skin texture; tactile fabric and weathered wood; 16:9 landscape widescreen composition; subtle film grain; expressive realistic lighting. No written words, no logos, no watermark, no distorted hands, no duplicate people. Scene S03 — A Lantern Left Dark. EXTREME CLOSE shot, intimate frontal angle. Characters in frame: @AMA_ADJOVI (deep navy kaba blouse, hand-dyed indigo wrapper with tiny white wave motifs and flat leather sandals, three-strand amber bead necklace). Ama explains the meaning of a dark lantern with quiet gravity. Mood: warm reunion with a hidden wound. Lighting: low amber sunset and first cool blue shadows. Environment = Location Registry id 'COMPOUND_COURTYARD': Ama's lived-in family compound courtyard in Afenyo: ochre plaster walls, a weathered blue wooden door, clay pots of basil, woven stools, a mango tree, laundry lines and a low view toward the lagoon.",</w:t>
         <w:br/>
         <w:t xml:space="preserve">  "status": "⬜",</w:t>
         <w:br/>
@@ -3140,7 +3140,7 @@
         <w:br/>
         <w:t xml:space="preserve">  ],</w:t>
         <w:br/>
-        <w:t xml:space="preserve">  "prompt": "Grounded cinematic West African magical realism; contemporary Ghanaian coastal life; human-scale performances; saturated indigo, lagoon teal, clay red and warm amber palette; natural skin texture; tactile fabric and weathered wood; 2.39:1 widescreen composition; subtle film grain; expressive realistic lighting. No written words, no logos, no watermark, no distorted hands, no duplicate people. Scene S03 — A Lantern Left Dark. WIDE shot, low observational angle. Characters in frame: @SENA_ADJOVI (mustard oversized hoodie, blue-and-white printed ankle skirt and worn white canvas trainers, turquoise over-ear radio headphones). Sena strings blue glass scraps into the mango branches. Mood: warm reunion with a hidden wound. Lighting: low amber sunset and first cool blue shadows. Environment = Location Registry id 'COMPOUND_COURTYARD': Ama's lived-in family compound courtyard in Afenyo: ochre plaster walls, a weathered blue wooden door, clay pots of basil, woven stools, a mango tree, laundry lines and a low view toward the lagoon.",</w:t>
+        <w:t xml:space="preserve">  "prompt": "Grounded cinematic West African magical realism; contemporary Ghanaian coastal life; human-scale performances; saturated indigo, lagoon teal, clay red and warm amber palette; natural skin texture; tactile fabric and weathered wood; 16:9 landscape widescreen composition; subtle film grain; expressive realistic lighting. No written words, no logos, no watermark, no distorted hands, no duplicate people. Scene S03 — A Lantern Left Dark. WIDE shot, low observational angle. Characters in frame: @SENA_ADJOVI (mustard oversized hoodie, blue-and-white printed ankle skirt and worn white canvas trainers, turquoise over-ear radio headphones). Sena strings blue glass scraps into the mango branches. Mood: warm reunion with a hidden wound. Lighting: low amber sunset and first cool blue shadows. Environment = Location Registry id 'COMPOUND_COURTYARD': Ama's lived-in family compound courtyard in Afenyo: ochre plaster walls, a weathered blue wooden door, clay pots of basil, woven stools, a mango tree, laundry lines and a low view toward the lagoon.",</w:t>
         <w:br/>
         <w:t xml:space="preserve">  "status": "⬜",</w:t>
         <w:br/>
@@ -3199,7 +3199,7 @@
         <w:br/>
         <w:t xml:space="preserve">  ],</w:t>
         <w:br/>
-        <w:t xml:space="preserve">  "prompt": "Grounded cinematic West African magical realism; contemporary Ghanaian coastal life; human-scale performances; saturated indigo, lagoon teal, clay red and warm amber palette; natural skin texture; tactile fabric and weathered wood; 2.39:1 widescreen composition; subtle film grain; expressive realistic lighting. No written words, no logos, no watermark, no distorted hands, no duplicate people. Scene S03 — A Lantern Left Dark. MEDIUM shot, handheld eye-level. Characters in frame: @KOSI_MENSAH (indigo utility jumpsuit with rolled sleeves, sand-coloured work boots and a narrow woven kente belt, small gold Adinkra-disc earrings); @AMA_ADJOVI (deep navy kaba blouse, hand-dyed indigo wrapper with tiny white wave motifs and flat leather sandals, three-strand amber bead necklace); @SENA_ADJOVI (mustard oversized hoodie, blue-and-white printed ankle skirt and worn white canvas trainers, turquoise over-ear radio headphones). The three sit near untouched pepper soup as sunset turns the courtyard amber. Mood: warm reunion with a hidden wound. Lighting: low amber sunset and first cool blue shadows. Environment = Location Registry id 'COMPOUND_COURTYARD': Ama's lived-in family compound courtyard in Afenyo: ochre plaster walls, a weathered blue wooden door, clay pots of basil, woven stools, a mango tree, laundry lines and a low view toward the lagoon.",</w:t>
+        <w:t xml:space="preserve">  "prompt": "Grounded cinematic West African magical realism; contemporary Ghanaian coastal life; human-scale performances; saturated indigo, lagoon teal, clay red and warm amber palette; natural skin texture; tactile fabric and weathered wood; 16:9 landscape widescreen composition; subtle film grain; expressive realistic lighting. No written words, no logos, no watermark, no distorted hands, no duplicate people. Scene S03 — A Lantern Left Dark. MEDIUM shot, handheld eye-level. Characters in frame: @KOSI_MENSAH (indigo utility jumpsuit with rolled sleeves, sand-coloured work boots and a narrow woven kente belt, small gold Adinkra-disc earrings); @AMA_ADJOVI (deep navy kaba blouse, hand-dyed indigo wrapper with tiny white wave motifs and flat leather sandals, three-strand amber bead necklace); @SENA_ADJOVI (mustard oversized hoodie, blue-and-white printed ankle skirt and worn white canvas trainers, turquoise over-ear radio headphones). The three sit near untouched pepper soup as sunset turns the courtyard amber. Mood: warm reunion with a hidden wound. Lighting: low amber sunset and first cool blue shadows. Environment = Location Registry id 'COMPOUND_COURTYARD': Ama's lived-in family compound courtyard in Afenyo: ochre plaster walls, a weathered blue wooden door, clay pots of basil, woven stools, a mango tree, laundry lines and a low view toward the lagoon.",</w:t>
         <w:br/>
         <w:t xml:space="preserve">  "status": "⬜",</w:t>
         <w:br/>
@@ -3254,7 +3254,7 @@
         <w:br/>
         <w:t xml:space="preserve">  ],</w:t>
         <w:br/>
-        <w:t xml:space="preserve">  "prompt": "Grounded cinematic West African magical realism; contemporary Ghanaian coastal life; human-scale performances; saturated indigo, lagoon teal, clay red and warm amber palette; natural skin texture; tactile fabric and weathered wood; 2.39:1 widescreen composition; subtle film grain; expressive realistic lighting. No written words, no logos, no watermark, no distorted hands, no duplicate people. Scene S03 — A Lantern Left Dark. WIDE shot, rear closing tableau. Characters in frame: @KOSI_MENSAH (indigo utility jumpsuit with rolled sleeves, sand-coloured work boots and a narrow woven kente belt, small gold Adinkra-disc earrings); @AMA_ADJOVI (deep navy kaba blouse, hand-dyed indigo wrapper with tiny white wave motifs and flat leather sandals, three-strand amber bead necklace). Kosi faces the dark lantern while Ama watches her understand. Mood: warm reunion with a hidden wound. Lighting: low amber sunset and first cool blue shadows. Environment = Location Registry id 'COMPOUND_COURTYARD': Ama's lived-in family compound courtyard in Afenyo: ochre plaster walls, a weathered blue wooden door, clay pots of basil, woven stools, a mango tree, laundry lines and a low view toward the lagoon.",</w:t>
+        <w:t xml:space="preserve">  "prompt": "Grounded cinematic West African magical realism; contemporary Ghanaian coastal life; human-scale performances; saturated indigo, lagoon teal, clay red and warm amber palette; natural skin texture; tactile fabric and weathered wood; 16:9 landscape widescreen composition; subtle film grain; expressive realistic lighting. No written words, no logos, no watermark, no distorted hands, no duplicate people. Scene S03 — A Lantern Left Dark. WIDE shot, rear closing tableau. Characters in frame: @KOSI_MENSAH (indigo utility jumpsuit with rolled sleeves, sand-coloured work boots and a narrow woven kente belt, small gold Adinkra-disc earrings); @AMA_ADJOVI (deep navy kaba blouse, hand-dyed indigo wrapper with tiny white wave motifs and flat leather sandals, three-strand amber bead necklace). Kosi faces the dark lantern while Ama watches her understand. Mood: warm reunion with a hidden wound. Lighting: low amber sunset and first cool blue shadows. Environment = Location Registry id 'COMPOUND_COURTYARD': Ama's lived-in family compound courtyard in Afenyo: ochre plaster walls, a weathered blue wooden door, clay pots of basil, woven stools, a mango tree, laundry lines and a low view toward the lagoon.",</w:t>
         <w:br/>
         <w:t xml:space="preserve">  "status": "⬜",</w:t>
         <w:br/>
@@ -3317,7 +3317,7 @@
         <w:br/>
         <w:t xml:space="preserve">  ],</w:t>
         <w:br/>
-        <w:t xml:space="preserve">  "prompt": "Grounded cinematic West African magical realism; contemporary Ghanaian coastal life; human-scale performances; saturated indigo, lagoon teal, clay red and warm amber palette; natural skin texture; tactile fabric and weathered wood; 2.39:1 widescreen composition; subtle film grain; expressive realistic lighting. No written words, no logos, no watermark, no distorted hands, no duplicate people. Scene S04 — Price of the Water. WIDE shot, high establishing angle. Characters in frame: @ESI_TETTEH (brick-red wax-print dress beneath a soot-black oilskin apron, patterned headwrap and sturdy black sandals, smooth charred-wood smoking paddle); @SENA_ADJOVI (mustard oversized hoodie, blue-and-white printed ankle skirt and worn white canvas trainers, turquoise over-ear radio headphones). The market wakes around fish baskets, bright canopies and a restless lagoon. Mood: busy, simmering anger. Lighting: bright tropical morning broken by striped canopies. Environment = Location Registry id 'AFENYO_MARKET': Afenyo's open lagoon market: timber stalls, bright wax-print canopies, baskets of smoked fish and tomatoes, colourful basins, sandy paths, bicycles and the blue-green lagoon visible beyond mangroves.",</w:t>
+        <w:t xml:space="preserve">  "prompt": "Grounded cinematic West African magical realism; contemporary Ghanaian coastal life; human-scale performances; saturated indigo, lagoon teal, clay red and warm amber palette; natural skin texture; tactile fabric and weathered wood; 16:9 landscape widescreen composition; subtle film grain; expressive realistic lighting. No written words, no logos, no watermark, no distorted hands, no duplicate people. Scene S04 — Price of the Water. WIDE shot, high establishing angle. Characters in frame: @ESI_TETTEH (brick-red wax-print dress beneath a soot-black oilskin apron, patterned headwrap and sturdy black sandals, smooth charred-wood smoking paddle); @SENA_ADJOVI (mustard oversized hoodie, blue-and-white printed ankle skirt and worn white canvas trainers, turquoise over-ear radio headphones). The market wakes around fish baskets, bright canopies and a restless lagoon. Mood: busy, simmering anger. Lighting: bright tropical morning broken by striped canopies. Environment = Location Registry id 'AFENYO_MARKET': Afenyo's open lagoon market: timber stalls, bright wax-print canopies, baskets of smoked fish and tomatoes, colourful basins, sandy paths, bicycles and the blue-green lagoon visible beyond mangroves.",</w:t>
         <w:br/>
         <w:t xml:space="preserve">  "status": "⬜",</w:t>
         <w:br/>
@@ -3368,7 +3368,7 @@
         <w:br/>
         <w:t xml:space="preserve">  ],</w:t>
         <w:br/>
-        <w:t xml:space="preserve">  "prompt": "Grounded cinematic West African magical realism; contemporary Ghanaian coastal life; human-scale performances; saturated indigo, lagoon teal, clay red and warm amber palette; natural skin texture; tactile fabric and weathered wood; 2.39:1 widescreen composition; subtle film grain; expressive realistic lighting. No written words, no logos, no watermark, no distorted hands, no duplicate people. Scene S04 — Price of the Water. MEDIUM shot, eye-level. Characters in frame: @ESI_TETTEH (brick-red wax-print dress beneath a soot-black oilskin apron, patterned headwrap and sturdy black sandals, smooth charred-wood smoking paddle). Esi slaps a wet survey notice onto a fish tray with her charred paddle. Mood: busy, simmering anger. Lighting: bright tropical morning broken by striped canopies. Environment = Location Registry id 'AFENYO_MARKET': Afenyo's open lagoon market: timber stalls, bright wax-print canopies, baskets of smoked fish and tomatoes, colourful basins, sandy paths, bicycles and the blue-green lagoon visible beyond mangroves.",</w:t>
+        <w:t xml:space="preserve">  "prompt": "Grounded cinematic West African magical realism; contemporary Ghanaian coastal life; human-scale performances; saturated indigo, lagoon teal, clay red and warm amber palette; natural skin texture; tactile fabric and weathered wood; 16:9 landscape widescreen composition; subtle film grain; expressive realistic lighting. No written words, no logos, no watermark, no distorted hands, no duplicate people. Scene S04 — Price of the Water. MEDIUM shot, eye-level. Characters in frame: @ESI_TETTEH (brick-red wax-print dress beneath a soot-black oilskin apron, patterned headwrap and sturdy black sandals, smooth charred-wood smoking paddle). Esi slaps a wet survey notice onto a fish tray with her charred paddle. Mood: busy, simmering anger. Lighting: bright tropical morning broken by striped canopies. Environment = Location Registry id 'AFENYO_MARKET': Afenyo's open lagoon market: timber stalls, bright wax-print canopies, baskets of smoked fish and tomatoes, colourful basins, sandy paths, bicycles and the blue-green lagoon visible beyond mangroves.",</w:t>
         <w:br/>
         <w:t xml:space="preserve">  "status": "⬜",</w:t>
         <w:br/>
@@ -3419,7 +3419,7 @@
         <w:br/>
         <w:t xml:space="preserve">  ],</w:t>
         <w:br/>
-        <w:t xml:space="preserve">  "prompt": "Grounded cinematic West African magical realism; contemporary Ghanaian coastal life; human-scale performances; saturated indigo, lagoon teal, clay red and warm amber palette; natural skin texture; tactile fabric and weathered wood; 2.39:1 widescreen composition; subtle film grain; expressive realistic lighting. No written words, no logos, no watermark, no distorted hands, no duplicate people. Scene S04 — Price of the Water. CLOSE shot, three-quarter profile. Characters in frame: @KOJO_DANSO (faded forest-green canvas jacket over a blue-and-cream striped shirt, charcoal trousers and rubber deck boots, weathered brass compass on a cord). Kojo looks toward the water, naming the metallic smell in the current. Mood: busy, simmering anger. Lighting: bright tropical morning broken by striped canopies. Environment = Location Registry id 'AFENYO_MARKET': Afenyo's open lagoon market: timber stalls, bright wax-print canopies, baskets of smoked fish and tomatoes, colourful basins, sandy paths, bicycles and the blue-green lagoon visible beyond mangroves.",</w:t>
+        <w:t xml:space="preserve">  "prompt": "Grounded cinematic West African magical realism; contemporary Ghanaian coastal life; human-scale performances; saturated indigo, lagoon teal, clay red and warm amber palette; natural skin texture; tactile fabric and weathered wood; 16:9 landscape widescreen composition; subtle film grain; expressive realistic lighting. No written words, no logos, no watermark, no distorted hands, no duplicate people. Scene S04 — Price of the Water. CLOSE shot, three-quarter profile. Characters in frame: @KOJO_DANSO (faded forest-green canvas jacket over a blue-and-cream striped shirt, charcoal trousers and rubber deck boots, weathered brass compass on a cord). Kojo looks toward the water, naming the metallic smell in the current. Mood: busy, simmering anger. Lighting: bright tropical morning broken by striped canopies. Environment = Location Registry id 'AFENYO_MARKET': Afenyo's open lagoon market: timber stalls, bright wax-print canopies, baskets of smoked fish and tomatoes, colourful basins, sandy paths, bicycles and the blue-green lagoon visible beyond mangroves.",</w:t>
         <w:br/>
         <w:t xml:space="preserve">  "status": "⬜",</w:t>
         <w:br/>
@@ -3470,7 +3470,7 @@
         <w:br/>
         <w:t xml:space="preserve">  ],</w:t>
         <w:br/>
-        <w:t xml:space="preserve">  "prompt": "Grounded cinematic West African magical realism; contemporary Ghanaian coastal life; human-scale performances; saturated indigo, lagoon teal, clay red and warm amber palette; natural skin texture; tactile fabric and weathered wood; 2.39:1 widescreen composition; subtle film grain; expressive realistic lighting. No written words, no logos, no watermark, no distorted hands, no duplicate people. Scene S04 — Price of the Water. INSERT shot, top-down detail. Characters in frame: @KOSI_MENSAH (indigo utility jumpsuit with rolled sleeves, sand-coloured work boots and a narrow woven kente belt, small gold Adinkra-disc earrings). Kosi's finger tracks an unfamiliar utility line on the crumpled notice. Mood: busy, simmering anger. Lighting: bright tropical morning broken by striped canopies. Environment = Location Registry id 'AFENYO_MARKET': Afenyo's open lagoon market: timber stalls, bright wax-print canopies, baskets of smoked fish and tomatoes, colourful basins, sandy paths, bicycles and the blue-green lagoon visible beyond mangroves.",</w:t>
+        <w:t xml:space="preserve">  "prompt": "Grounded cinematic West African magical realism; contemporary Ghanaian coastal life; human-scale performances; saturated indigo, lagoon teal, clay red and warm amber palette; natural skin texture; tactile fabric and weathered wood; 16:9 landscape widescreen composition; subtle film grain; expressive realistic lighting. No written words, no logos, no watermark, no distorted hands, no duplicate people. Scene S04 — Price of the Water. INSERT shot, top-down detail. Characters in frame: @KOSI_MENSAH (indigo utility jumpsuit with rolled sleeves, sand-coloured work boots and a narrow woven kente belt, small gold Adinkra-disc earrings). Kosi's finger tracks an unfamiliar utility line on the crumpled notice. Mood: busy, simmering anger. Lighting: bright tropical morning broken by striped canopies. Environment = Location Registry id 'AFENYO_MARKET': Afenyo's open lagoon market: timber stalls, bright wax-print canopies, baskets of smoked fish and tomatoes, colourful basins, sandy paths, bicycles and the blue-green lagoon visible beyond mangroves.",</w:t>
         <w:br/>
         <w:t xml:space="preserve">  "status": "⬜",</w:t>
         <w:br/>
@@ -3533,7 +3533,7 @@
         <w:br/>
         <w:t xml:space="preserve">  ],</w:t>
         <w:br/>
-        <w:t xml:space="preserve">  "prompt": "Grounded cinematic West African magical realism; contemporary Ghanaian coastal life; human-scale performances; saturated indigo, lagoon teal, clay red and warm amber palette; natural skin texture; tactile fabric and weathered wood; 2.39:1 widescreen composition; subtle film grain; expressive realistic lighting. No written words, no logos, no watermark, no distorted hands, no duplicate people. Scene S04 — Price of the Water. TWO-SHOT shot, eye-level. Characters in frame: @KOSI_MENSAH (indigo utility jumpsuit with rolled sleeves, sand-coloured work boots and a narrow woven kente belt, small gold Adinkra-disc earrings); @SENA_ADJOVI (mustard oversized hoodie, blue-and-white printed ankle skirt and worn white canvas trainers, turquoise over-ear radio headphones); @ESI_TETTEH (brick-red wax-print dress beneath a soot-black oilskin apron, patterned headwrap and sturdy black sandals, smooth charred-wood smoking paddle); @KOJO_DANSO (faded forest-green canvas jacket over a blue-and-cream striped shirt, charcoal trousers and rubber deck boots, weathered brass compass on a cord). Esi, Kojo, Kosi and Sena circle the notice amid the crowded market. Mood: busy, simmering anger. Lighting: bright tropical morning broken by striped canopies. Environment = Location Registry id 'AFENYO_MARKET': Afenyo's open lagoon market: timber stalls, bright wax-print canopies, baskets of smoked fish and tomatoes, colourful basins, sandy paths, bicycles and the blue-green lagoon visible beyond mangroves.",</w:t>
+        <w:t xml:space="preserve">  "prompt": "Grounded cinematic West African magical realism; contemporary Ghanaian coastal life; human-scale performances; saturated indigo, lagoon teal, clay red and warm amber palette; natural skin texture; tactile fabric and weathered wood; 16:9 landscape widescreen composition; subtle film grain; expressive realistic lighting. No written words, no logos, no watermark, no distorted hands, no duplicate people. Scene S04 — Price of the Water. TWO-SHOT shot, eye-level. Characters in frame: @KOSI_MENSAH (indigo utility jumpsuit with rolled sleeves, sand-coloured work boots and a narrow woven kente belt, small gold Adinkra-disc earrings); @SENA_ADJOVI (mustard oversized hoodie, blue-and-white printed ankle skirt and worn white canvas trainers, turquoise over-ear radio headphones); @ESI_TETTEH (brick-red wax-print dress beneath a soot-black oilskin apron, patterned headwrap and sturdy black sandals, smooth charred-wood smoking paddle); @KOJO_DANSO (faded forest-green canvas jacket over a blue-and-cream striped shirt, charcoal trousers and rubber deck boots, weathered brass compass on a cord). Esi, Kojo, Kosi and Sena circle the notice amid the crowded market. Mood: busy, simmering anger. Lighting: bright tropical morning broken by striped canopies. Environment = Location Registry id 'AFENYO_MARKET': Afenyo's open lagoon market: timber stalls, bright wax-print canopies, baskets of smoked fish and tomatoes, colourful basins, sandy paths, bicycles and the blue-green lagoon visible beyond mangroves.",</w:t>
         <w:br/>
         <w:t xml:space="preserve">  "status": "⬜",</w:t>
         <w:br/>
@@ -3588,7 +3588,7 @@
         <w:br/>
         <w:t xml:space="preserve">  ],</w:t>
         <w:br/>
-        <w:t xml:space="preserve">  "prompt": "Grounded cinematic West African magical realism; contemporary Ghanaian coastal life; human-scale performances; saturated indigo, lagoon teal, clay red and warm amber palette; natural skin texture; tactile fabric and weathered wood; 2.39:1 widescreen composition; subtle film grain; expressive realistic lighting. No written words, no logos, no watermark, no distorted hands, no duplicate people. Scene S04 — Price of the Water. OVER-SHOULDER shot, over the lead character's shoulder. Characters in frame: @KOSI_MENSAH (indigo utility jumpsuit with rolled sleeves, sand-coloured work boots and a narrow woven kente belt, small gold Adinkra-disc earrings); @ESI_TETTEH (brick-red wax-print dress beneath a soot-black oilskin apron, patterned headwrap and sturdy black sandals, smooth charred-wood smoking paddle). Over Kosi's shoulder, the diagram points toward the navigation buoy. Mood: busy, simmering anger. Lighting: bright tropical morning broken by striped canopies. Environment = Location Registry id 'AFENYO_MARKET': Afenyo's open lagoon market: timber stalls, bright wax-print canopies, baskets of smoked fish and tomatoes, colourful basins, sandy paths, bicycles and the blue-green lagoon visible beyond mangroves.",</w:t>
+        <w:t xml:space="preserve">  "prompt": "Grounded cinematic West African magical realism; contemporary Ghanaian coastal life; human-scale performances; saturated indigo, lagoon teal, clay red and warm amber palette; natural skin texture; tactile fabric and weathered wood; 16:9 landscape widescreen composition; subtle film grain; expressive realistic lighting. No written words, no logos, no watermark, no distorted hands, no duplicate people. Scene S04 — Price of the Water. OVER-SHOULDER shot, over the lead character's shoulder. Characters in frame: @KOSI_MENSAH (indigo utility jumpsuit with rolled sleeves, sand-coloured work boots and a narrow woven kente belt, small gold Adinkra-disc earrings); @ESI_TETTEH (brick-red wax-print dress beneath a soot-black oilskin apron, patterned headwrap and sturdy black sandals, smooth charred-wood smoking paddle). Over Kosi's shoulder, the diagram points toward the navigation buoy. Mood: busy, simmering anger. Lighting: bright tropical morning broken by striped canopies. Environment = Location Registry id 'AFENYO_MARKET': Afenyo's open lagoon market: timber stalls, bright wax-print canopies, baskets of smoked fish and tomatoes, colourful basins, sandy paths, bicycles and the blue-green lagoon visible beyond mangroves.",</w:t>
         <w:br/>
         <w:t xml:space="preserve">  "status": "⬜",</w:t>
         <w:br/>
@@ -3639,7 +3639,7 @@
         <w:br/>
         <w:t xml:space="preserve">  ],</w:t>
         <w:br/>
-        <w:t xml:space="preserve">  "prompt": "Grounded cinematic West African magical realism; contemporary Ghanaian coastal life; human-scale performances; saturated indigo, lagoon teal, clay red and warm amber palette; natural skin texture; tactile fabric and weathered wood; 2.39:1 widescreen composition; subtle film grain; expressive realistic lighting. No written words, no logos, no watermark, no distorted hands, no duplicate people. Scene S04 — Price of the Water. EXTREME CLOSE shot, intimate frontal angle. Characters in frame: @ESI_TETTEH (brick-red wax-print dress beneath a soot-black oilskin apron, patterned headwrap and sturdy black sandals, smooth charred-wood smoking paddle). Esi refuses the promise of access behind a locked gate. Mood: busy, simmering anger. Lighting: bright tropical morning broken by striped canopies. Environment = Location Registry id 'AFENYO_MARKET': Afenyo's open lagoon market: timber stalls, bright wax-print canopies, baskets of smoked fish and tomatoes, colourful basins, sandy paths, bicycles and the blue-green lagoon visible beyond mangroves.",</w:t>
+        <w:t xml:space="preserve">  "prompt": "Grounded cinematic West African magical realism; contemporary Ghanaian coastal life; human-scale performances; saturated indigo, lagoon teal, clay red and warm amber palette; natural skin texture; tactile fabric and weathered wood; 16:9 landscape widescreen composition; subtle film grain; expressive realistic lighting. No written words, no logos, no watermark, no distorted hands, no duplicate people. Scene S04 — Price of the Water. EXTREME CLOSE shot, intimate frontal angle. Characters in frame: @ESI_TETTEH (brick-red wax-print dress beneath a soot-black oilskin apron, patterned headwrap and sturdy black sandals, smooth charred-wood smoking paddle). Esi refuses the promise of access behind a locked gate. Mood: busy, simmering anger. Lighting: bright tropical morning broken by striped canopies. Environment = Location Registry id 'AFENYO_MARKET': Afenyo's open lagoon market: timber stalls, bright wax-print canopies, baskets of smoked fish and tomatoes, colourful basins, sandy paths, bicycles and the blue-green lagoon visible beyond mangroves.",</w:t>
         <w:br/>
         <w:t xml:space="preserve">  "status": "⬜",</w:t>
         <w:br/>
@@ -3698,7 +3698,7 @@
         <w:br/>
         <w:t xml:space="preserve">  ],</w:t>
         <w:br/>
-        <w:t xml:space="preserve">  "prompt": "Grounded cinematic West African magical realism; contemporary Ghanaian coastal life; human-scale performances; saturated indigo, lagoon teal, clay red and warm amber palette; natural skin texture; tactile fabric and weathered wood; 2.39:1 widescreen composition; subtle film grain; expressive realistic lighting. No written words, no logos, no watermark, no distorted hands, no duplicate people. Scene S04 — Price of the Water. WIDE shot, low observational angle. Characters in frame: @ESI_TETTEH (brick-red wax-print dress beneath a soot-black oilskin apron, patterned headwrap and sturdy black sandals, smooth charred-wood smoking paddle); @KOSI_MENSAH (indigo utility jumpsuit with rolled sleeves, sand-coloured work boots and a narrow woven kente belt, small gold Adinkra-disc earrings); @SENA_ADJOVI (mustard oversized hoodie, blue-and-white printed ankle skirt and worn white canvas trainers, turquoise over-ear radio headphones). Nearby sellers pause to listen as Sena records voices. Mood: busy, simmering anger. Lighting: bright tropical morning broken by striped canopies. Environment = Location Registry id 'AFENYO_MARKET': Afenyo's open lagoon market: timber stalls, bright wax-print canopies, baskets of smoked fish and tomatoes, colourful basins, sandy paths, bicycles and the blue-green lagoon visible beyond mangroves.",</w:t>
+        <w:t xml:space="preserve">  "prompt": "Grounded cinematic West African magical realism; contemporary Ghanaian coastal life; human-scale performances; saturated indigo, lagoon teal, clay red and warm amber palette; natural skin texture; tactile fabric and weathered wood; 16:9 landscape widescreen composition; subtle film grain; expressive realistic lighting. No written words, no logos, no watermark, no distorted hands, no duplicate people. Scene S04 — Price of the Water. WIDE shot, low observational angle. Characters in frame: @ESI_TETTEH (brick-red wax-print dress beneath a soot-black oilskin apron, patterned headwrap and sturdy black sandals, smooth charred-wood smoking paddle); @KOSI_MENSAH (indigo utility jumpsuit with rolled sleeves, sand-coloured work boots and a narrow woven kente belt, small gold Adinkra-disc earrings); @SENA_ADJOVI (mustard oversized hoodie, blue-and-white printed ankle skirt and worn white canvas trainers, turquoise over-ear radio headphones). Nearby sellers pause to listen as Sena records voices. Mood: busy, simmering anger. Lighting: bright tropical morning broken by striped canopies. Environment = Location Registry id 'AFENYO_MARKET': Afenyo's open lagoon market: timber stalls, bright wax-print canopies, baskets of smoked fish and tomatoes, colourful basins, sandy paths, bicycles and the blue-green lagoon visible beyond mangroves.",</w:t>
         <w:br/>
         <w:t xml:space="preserve">  "status": "⬜",</w:t>
         <w:br/>
@@ -3753,7 +3753,7 @@
         <w:br/>
         <w:t xml:space="preserve">  ],</w:t>
         <w:br/>
-        <w:t xml:space="preserve">  "prompt": "Grounded cinematic West African magical realism; contemporary Ghanaian coastal life; human-scale performances; saturated indigo, lagoon teal, clay red and warm amber palette; natural skin texture; tactile fabric and weathered wood; 2.39:1 widescreen composition; subtle film grain; expressive realistic lighting. No written words, no logos, no watermark, no distorted hands, no duplicate people. Scene S04 — Price of the Water. MEDIUM shot, handheld eye-level. Characters in frame: @KOSI_MENSAH (indigo utility jumpsuit with rolled sleeves, sand-coloured work boots and a narrow woven kente belt, small gold Adinkra-disc earrings); @KOJO_DANSO (faded forest-green canvas jacket over a blue-and-cream striped shirt, charcoal trousers and rubber deck boots, weathered brass compass on a cord). Kosi asks Kojo to show her where the cables entered the shore. Mood: busy, simmering anger. Lighting: bright tropical morning broken by striped canopies. Environment = Location Registry id 'AFENYO_MARKET': Afenyo's open lagoon market: timber stalls, bright wax-print canopies, baskets of smoked fish and tomatoes, colourful basins, sandy paths, bicycles and the blue-green lagoon visible beyond mangroves.",</w:t>
+        <w:t xml:space="preserve">  "prompt": "Grounded cinematic West African magical realism; contemporary Ghanaian coastal life; human-scale performances; saturated indigo, lagoon teal, clay red and warm amber palette; natural skin texture; tactile fabric and weathered wood; 16:9 landscape widescreen composition; subtle film grain; expressive realistic lighting. No written words, no logos, no watermark, no distorted hands, no duplicate people. Scene S04 — Price of the Water. MEDIUM shot, handheld eye-level. Characters in frame: @KOSI_MENSAH (indigo utility jumpsuit with rolled sleeves, sand-coloured work boots and a narrow woven kente belt, small gold Adinkra-disc earrings); @KOJO_DANSO (faded forest-green canvas jacket over a blue-and-cream striped shirt, charcoal trousers and rubber deck boots, weathered brass compass on a cord). Kosi asks Kojo to show her where the cables entered the shore. Mood: busy, simmering anger. Lighting: bright tropical morning broken by striped canopies. Environment = Location Registry id 'AFENYO_MARKET': Afenyo's open lagoon market: timber stalls, bright wax-print canopies, baskets of smoked fish and tomatoes, colourful basins, sandy paths, bicycles and the blue-green lagoon visible beyond mangroves.",</w:t>
         <w:br/>
         <w:t xml:space="preserve">  "status": "⬜",</w:t>
         <w:br/>
@@ -3812,7 +3812,7 @@
         <w:br/>
         <w:t xml:space="preserve">  ],</w:t>
         <w:br/>
-        <w:t xml:space="preserve">  "prompt": "Grounded cinematic West African magical realism; contemporary Ghanaian coastal life; human-scale performances; saturated indigo, lagoon teal, clay red and warm amber palette; natural skin texture; tactile fabric and weathered wood; 2.39:1 widescreen composition; subtle film grain; expressive realistic lighting. No written words, no logos, no watermark, no distorted hands, no duplicate people. Scene S04 — Price of the Water. WIDE shot, rear closing tableau. Characters in frame: @KOSI_MENSAH (indigo utility jumpsuit with rolled sleeves, sand-coloured work boots and a narrow woven kente belt, small gold Adinkra-disc earrings); @KOJO_DANSO (faded forest-green canvas jacket over a blue-and-cream striped shirt, charcoal trousers and rubber deck boots, weathered brass compass on a cord); @SENA_ADJOVI (mustard oversized hoodie, blue-and-white printed ankle skirt and worn white canvas trainers, turquoise over-ear radio headphones). Kosi, Kojo and Sena leave the market toward the blue-green lagoon. Mood: busy, simmering anger. Lighting: bright tropical morning broken by striped canopies. Environment = Location Registry id 'AFENYO_MARKET': Afenyo's open lagoon market: timber stalls, bright wax-print canopies, baskets of smoked fish and tomatoes, colourful basins, sandy paths, bicycles and the blue-green lagoon visible beyond mangroves.",</w:t>
+        <w:t xml:space="preserve">  "prompt": "Grounded cinematic West African magical realism; contemporary Ghanaian coastal life; human-scale performances; saturated indigo, lagoon teal, clay red and warm amber palette; natural skin texture; tactile fabric and weathered wood; 16:9 landscape widescreen composition; subtle film grain; expressive realistic lighting. No written words, no logos, no watermark, no distorted hands, no duplicate people. Scene S04 — Price of the Water. WIDE shot, rear closing tableau. Characters in frame: @KOSI_MENSAH (indigo utility jumpsuit with rolled sleeves, sand-coloured work boots and a narrow woven kente belt, small gold Adinkra-disc earrings); @KOJO_DANSO (faded forest-green canvas jacket over a blue-and-cream striped shirt, charcoal trousers and rubber deck boots, weathered brass compass on a cord); @SENA_ADJOVI (mustard oversized hoodie, blue-and-white printed ankle skirt and worn white canvas trainers, turquoise over-ear radio headphones). Kosi, Kojo and Sena leave the market toward the blue-green lagoon. Mood: busy, simmering anger. Lighting: bright tropical morning broken by striped canopies. Environment = Location Registry id 'AFENYO_MARKET': Afenyo's open lagoon market: timber stalls, bright wax-print canopies, baskets of smoked fish and tomatoes, colourful basins, sandy paths, bicycles and the blue-green lagoon visible beyond mangroves.",</w:t>
         <w:br/>
         <w:t xml:space="preserve">  "status": "⬜",</w:t>
         <w:br/>
@@ -3875,7 +3875,7 @@
         <w:br/>
         <w:t xml:space="preserve">  ],</w:t>
         <w:br/>
-        <w:t xml:space="preserve">  "prompt": "Grounded cinematic West African magical realism; contemporary Ghanaian coastal life; human-scale performances; saturated indigo, lagoon teal, clay red and warm amber palette; natural skin texture; tactile fabric and weathered wood; 2.39:1 widescreen composition; subtle film grain; expressive realistic lighting. No written words, no logos, no watermark, no distorted hands, no duplicate people. Scene S05 — The Polite Hearing. WIDE shot, high establishing angle. Characters in frame: @NII_LAMPTEY (tailored charcoal caftan with a subtle black geometric weave, polished black shoes and a silver wristwatch, black ebony walking cane with a carved heron handle); @KWAME_AGYEMAN (white linen shirt under a caramel lightweight field jacket, dark tailored trousers and brown loafers, antique bronze lapel pin shaped like a compass rose). The assembly hall fills slowly beneath ceiling fans while Nii and Kwame wait at the dais. Mood: civil language hiding violence. Lighting: stale fan-cooled daylight through louvre windows. Environment = Location Registry id 'DISTRICT_ASSEMBLY_HALL': A modest district assembly hall in Afenyo: cream concrete walls, tall louvre windows, stacked plastic chairs, a raised wood dais, ceiling fans and late-afternoon lagoon light.",</w:t>
+        <w:t xml:space="preserve">  "prompt": "Grounded cinematic West African magical realism; contemporary Ghanaian coastal life; human-scale performances; saturated indigo, lagoon teal, clay red and warm amber palette; natural skin texture; tactile fabric and weathered wood; 16:9 landscape widescreen composition; subtle film grain; expressive realistic lighting. No written words, no logos, no watermark, no distorted hands, no duplicate people. Scene S05 — The Polite Hearing. WIDE shot, high establishing angle. Characters in frame: @NII_LAMPTEY (tailored charcoal caftan with a subtle black geometric weave, polished black shoes and a silver wristwatch, black ebony walking cane with a carved heron handle); @KWAME_AGYEMAN (white linen shirt under a caramel lightweight field jacket, dark tailored trousers and brown loafers, antique bronze lapel pin shaped like a compass rose). The assembly hall fills slowly beneath ceiling fans while Nii and Kwame wait at the dais. Mood: civil language hiding violence. Lighting: stale fan-cooled daylight through louvre windows. Environment = Location Registry id 'DISTRICT_ASSEMBLY_HALL': A modest district assembly hall in Afenyo: cream concrete walls, tall louvre windows, stacked plastic chairs, a raised wood dais, ceiling fans and late-afternoon lagoon light.",</w:t>
         <w:br/>
         <w:t xml:space="preserve">  "status": "⬜",</w:t>
         <w:br/>
@@ -3926,7 +3926,7 @@
         <w:br/>
         <w:t xml:space="preserve">  ],</w:t>
         <w:br/>
-        <w:t xml:space="preserve">  "prompt": "Grounded cinematic West African magical realism; contemporary Ghanaian coastal life; human-scale performances; saturated indigo, lagoon teal, clay red and warm amber palette; natural skin texture; tactile fabric and weathered wood; 2.39:1 widescreen composition; subtle film grain; expressive realistic lighting. No written words, no logos, no watermark, no distorted hands, no duplicate people. Scene S05 — The Polite Hearing. MEDIUM shot, eye-level. Characters in frame: @NII_LAMPTEY (tailored charcoal caftan with a subtle black geometric weave, polished black shoes and a silver wristwatch, black ebony walking cane with a carved heron handle). Nii presents the resort as a polished future of jobs and clean power. Mood: civil language hiding violence. Lighting: stale fan-cooled daylight through louvre windows. Environment = Location Registry id 'DISTRICT_ASSEMBLY_HALL': A modest district assembly hall in Afenyo: cream concrete walls, tall louvre windows, stacked plastic chairs, a raised wood dais, ceiling fans and late-afternoon lagoon light.",</w:t>
+        <w:t xml:space="preserve">  "prompt": "Grounded cinematic West African magical realism; contemporary Ghanaian coastal life; human-scale performances; saturated indigo, lagoon teal, clay red and warm amber palette; natural skin texture; tactile fabric and weathered wood; 16:9 landscape widescreen composition; subtle film grain; expressive realistic lighting. No written words, no logos, no watermark, no distorted hands, no duplicate people. Scene S05 — The Polite Hearing. MEDIUM shot, eye-level. Characters in frame: @NII_LAMPTEY (tailored charcoal caftan with a subtle black geometric weave, polished black shoes and a silver wristwatch, black ebony walking cane with a carved heron handle). Nii presents the resort as a polished future of jobs and clean power. Mood: civil language hiding violence. Lighting: stale fan-cooled daylight through louvre windows. Environment = Location Registry id 'DISTRICT_ASSEMBLY_HALL': A modest district assembly hall in Afenyo: cream concrete walls, tall louvre windows, stacked plastic chairs, a raised wood dais, ceiling fans and late-afternoon lagoon light.",</w:t>
         <w:br/>
         <w:t xml:space="preserve">  "status": "⬜",</w:t>
         <w:br/>
@@ -3977,7 +3977,7 @@
         <w:br/>
         <w:t xml:space="preserve">  ],</w:t>
         <w:br/>
-        <w:t xml:space="preserve">  "prompt": "Grounded cinematic West African magical realism; contemporary Ghanaian coastal life; human-scale performances; saturated indigo, lagoon teal, clay red and warm amber palette; natural skin texture; tactile fabric and weathered wood; 2.39:1 widescreen composition; subtle film grain; expressive realistic lighting. No written words, no logos, no watermark, no distorted hands, no duplicate people. Scene S05 — The Polite Hearing. CLOSE shot, three-quarter profile. Characters in frame: @KWAME_AGYEMAN (white linen shirt under a caramel lightweight field jacket, dark tailored trousers and brown loafers, antique bronze lapel pin shaped like a compass rose). Kwame catches sight of Kosi among the public and his rehearsed smile slips. Mood: civil language hiding violence. Lighting: stale fan-cooled daylight through louvre windows. Environment = Location Registry id 'DISTRICT_ASSEMBLY_HALL': A modest district assembly hall in Afenyo: cream concrete walls, tall louvre windows, stacked plastic chairs, a raised wood dais, ceiling fans and late-afternoon lagoon light.",</w:t>
+        <w:t xml:space="preserve">  "prompt": "Grounded cinematic West African magical realism; contemporary Ghanaian coastal life; human-scale performances; saturated indigo, lagoon teal, clay red and warm amber palette; natural skin texture; tactile fabric and weathered wood; 16:9 landscape widescreen composition; subtle film grain; expressive realistic lighting. No written words, no logos, no watermark, no distorted hands, no duplicate people. Scene S05 — The Polite Hearing. CLOSE shot, three-quarter profile. Characters in frame: @KWAME_AGYEMAN (white linen shirt under a caramel lightweight field jacket, dark tailored trousers and brown loafers, antique bronze lapel pin shaped like a compass rose). Kwame catches sight of Kosi among the public and his rehearsed smile slips. Mood: civil language hiding violence. Lighting: stale fan-cooled daylight through louvre windows. Environment = Location Registry id 'DISTRICT_ASSEMBLY_HALL': A modest district assembly hall in Afenyo: cream concrete walls, tall louvre windows, stacked plastic chairs, a raised wood dais, ceiling fans and late-afternoon lagoon light.",</w:t>
         <w:br/>
         <w:t xml:space="preserve">  "status": "⬜",</w:t>
         <w:br/>
@@ -4028,7 +4028,7 @@
         <w:br/>
         <w:t xml:space="preserve">  ],</w:t>
         <w:br/>
-        <w:t xml:space="preserve">  "prompt": "Grounded cinematic West African magical realism; contemporary Ghanaian coastal life; human-scale performances; saturated indigo, lagoon teal, clay red and warm amber palette; natural skin texture; tactile fabric and weathered wood; 2.39:1 widescreen composition; subtle film grain; expressive realistic lighting. No written words, no logos, no watermark, no distorted hands, no duplicate people. Scene S05 — The Polite Hearing. INSERT shot, top-down detail. Characters in frame: @NII_LAMPTEY (tailored charcoal caftan with a subtle black geometric weave, polished black shoes and a silver wristwatch, black ebony walking cane with a carved heron handle). An empty wall beside the dais makes the missing public map conspicuous. Mood: civil language hiding violence. Lighting: stale fan-cooled daylight through louvre windows. Environment = Location Registry id 'DISTRICT_ASSEMBLY_HALL': A modest district assembly hall in Afenyo: cream concrete walls, tall louvre windows, stacked plastic chairs, a raised wood dais, ceiling fans and late-afternoon lagoon light.",</w:t>
+        <w:t xml:space="preserve">  "prompt": "Grounded cinematic West African magical realism; contemporary Ghanaian coastal life; human-scale performances; saturated indigo, lagoon teal, clay red and warm amber palette; natural skin texture; tactile fabric and weathered wood; 16:9 landscape widescreen composition; subtle film grain; expressive realistic lighting. No written words, no logos, no watermark, no distorted hands, no duplicate people. Scene S05 — The Polite Hearing. INSERT shot, top-down detail. Characters in frame: @NII_LAMPTEY (tailored charcoal caftan with a subtle black geometric weave, polished black shoes and a silver wristwatch, black ebony walking cane with a carved heron handle). An empty wall beside the dais makes the missing public map conspicuous. Mood: civil language hiding violence. Lighting: stale fan-cooled daylight through louvre windows. Environment = Location Registry id 'DISTRICT_ASSEMBLY_HALL': A modest district assembly hall in Afenyo: cream concrete walls, tall louvre windows, stacked plastic chairs, a raised wood dais, ceiling fans and late-afternoon lagoon light.",</w:t>
         <w:br/>
         <w:t xml:space="preserve">  "status": "⬜",</w:t>
         <w:br/>
@@ -4083,7 +4083,7 @@
         <w:br/>
         <w:t xml:space="preserve">  ],</w:t>
         <w:br/>
-        <w:t xml:space="preserve">  "prompt": "Grounded cinematic West African magical realism; contemporary Ghanaian coastal life; human-scale performances; saturated indigo, lagoon teal, clay red and warm amber palette; natural skin texture; tactile fabric and weathered wood; 2.39:1 widescreen composition; subtle film grain; expressive realistic lighting. No written words, no logos, no watermark, no distorted hands, no duplicate people. Scene S05 — The Polite Hearing. TWO-SHOT shot, eye-level. Characters in frame: @ESI_TETTEH (brick-red wax-print dress beneath a soot-black oilskin apron, patterned headwrap and sturdy black sandals, smooth charred-wood smoking paddle); @NII_LAMPTEY (tailored charcoal caftan with a subtle black geometric weave, polished black shoes and a silver wristwatch, black ebony walking cane with a carved heron handle). Esi stands to demand a public copy of the lagoon agreement. Mood: civil language hiding violence. Lighting: stale fan-cooled daylight through louvre windows. Environment = Location Registry id 'DISTRICT_ASSEMBLY_HALL': A modest district assembly hall in Afenyo: cream concrete walls, tall louvre windows, stacked plastic chairs, a raised wood dais, ceiling fans and late-afternoon lagoon light.",</w:t>
+        <w:t xml:space="preserve">  "prompt": "Grounded cinematic West African magical realism; contemporary Ghanaian coastal life; human-scale performances; saturated indigo, lagoon teal, clay red and warm amber palette; natural skin texture; tactile fabric and weathered wood; 16:9 landscape widescreen composition; subtle film grain; expressive realistic lighting. No written words, no logos, no watermark, no distorted hands, no duplicate people. Scene S05 — The Polite Hearing. TWO-SHOT shot, eye-level. Characters in frame: @ESI_TETTEH (brick-red wax-print dress beneath a soot-black oilskin apron, patterned headwrap and sturdy black sandals, smooth charred-wood smoking paddle); @NII_LAMPTEY (tailored charcoal caftan with a subtle black geometric weave, polished black shoes and a silver wristwatch, black ebony walking cane with a carved heron handle). Esi stands to demand a public copy of the lagoon agreement. Mood: civil language hiding violence. Lighting: stale fan-cooled daylight through louvre windows. Environment = Location Registry id 'DISTRICT_ASSEMBLY_HALL': A modest district assembly hall in Afenyo: cream concrete walls, tall louvre windows, stacked plastic chairs, a raised wood dais, ceiling fans and late-afternoon lagoon light.",</w:t>
         <w:br/>
         <w:t xml:space="preserve">  "status": "⬜",</w:t>
         <w:br/>
@@ -4138,7 +4138,7 @@
         <w:br/>
         <w:t xml:space="preserve">  ],</w:t>
         <w:br/>
-        <w:t xml:space="preserve">  "prompt": "Grounded cinematic West African magical realism; contemporary Ghanaian coastal life; human-scale performances; saturated indigo, lagoon teal, clay red and warm amber palette; natural skin texture; tactile fabric and weathered wood; 2.39:1 widescreen composition; subtle film grain; expressive realistic lighting. No written words, no logos, no watermark, no distorted hands, no duplicate people. Scene S05 — The Polite Hearing. OVER-SHOULDER shot, over the lead character's shoulder. Characters in frame: @KOSI_MENSAH (indigo utility jumpsuit with rolled sleeves, sand-coloured work boots and a narrow woven kente belt, small gold Adinkra-disc earrings); @NII_LAMPTEY (tailored charcoal caftan with a subtle black geometric weave, polished black shoes and a silver wristwatch, black ebony walking cane with a carved heron handle). Over Kosi's shoulder, Nii answers her question about why no map is displayed. Mood: civil language hiding violence. Lighting: stale fan-cooled daylight through louvre windows. Environment = Location Registry id 'DISTRICT_ASSEMBLY_HALL': A modest district assembly hall in Afenyo: cream concrete walls, tall louvre windows, stacked plastic chairs, a raised wood dais, ceiling fans and late-afternoon lagoon light.",</w:t>
+        <w:t xml:space="preserve">  "prompt": "Grounded cinematic West African magical realism; contemporary Ghanaian coastal life; human-scale performances; saturated indigo, lagoon teal, clay red and warm amber palette; natural skin texture; tactile fabric and weathered wood; 16:9 landscape widescreen composition; subtle film grain; expressive realistic lighting. No written words, no logos, no watermark, no distorted hands, no duplicate people. Scene S05 — The Polite Hearing. OVER-SHOULDER shot, over the lead character's shoulder. Characters in frame: @KOSI_MENSAH (indigo utility jumpsuit with rolled sleeves, sand-coloured work boots and a narrow woven kente belt, small gold Adinkra-disc earrings); @NII_LAMPTEY (tailored charcoal caftan with a subtle black geometric weave, polished black shoes and a silver wristwatch, black ebony walking cane with a carved heron handle). Over Kosi's shoulder, Nii answers her question about why no map is displayed. Mood: civil language hiding violence. Lighting: stale fan-cooled daylight through louvre windows. Environment = Location Registry id 'DISTRICT_ASSEMBLY_HALL': A modest district assembly hall in Afenyo: cream concrete walls, tall louvre windows, stacked plastic chairs, a raised wood dais, ceiling fans and late-afternoon lagoon light.",</w:t>
         <w:br/>
         <w:t xml:space="preserve">  "status": "⬜",</w:t>
         <w:br/>
@@ -4189,7 +4189,7 @@
         <w:br/>
         <w:t xml:space="preserve">  ],</w:t>
         <w:br/>
-        <w:t xml:space="preserve">  "prompt": "Grounded cinematic West African magical realism; contemporary Ghanaian coastal life; human-scale performances; saturated indigo, lagoon teal, clay red and warm amber palette; natural skin texture; tactile fabric and weathered wood; 2.39:1 widescreen composition; subtle film grain; expressive realistic lighting. No written words, no logos, no watermark, no distorted hands, no duplicate people. Scene S05 — The Polite Hearing. EXTREME CLOSE shot, intimate frontal angle. Characters in frame: @SENA_ADJOVI (mustard oversized hoodie, blue-and-white printed ankle skirt and worn white canvas trainers, turquoise over-ear radio headphones). Sena silently presses record beneath turquoise headphones. Mood: civil language hiding violence. Lighting: stale fan-cooled daylight through louvre windows. Environment = Location Registry id 'DISTRICT_ASSEMBLY_HALL': A modest district assembly hall in Afenyo: cream concrete walls, tall louvre windows, stacked plastic chairs, a raised wood dais, ceiling fans and late-afternoon lagoon light.",</w:t>
+        <w:t xml:space="preserve">  "prompt": "Grounded cinematic West African magical realism; contemporary Ghanaian coastal life; human-scale performances; saturated indigo, lagoon teal, clay red and warm amber palette; natural skin texture; tactile fabric and weathered wood; 16:9 landscape widescreen composition; subtle film grain; expressive realistic lighting. No written words, no logos, no watermark, no distorted hands, no duplicate people. Scene S05 — The Polite Hearing. EXTREME CLOSE shot, intimate frontal angle. Characters in frame: @SENA_ADJOVI (mustard oversized hoodie, blue-and-white printed ankle skirt and worn white canvas trainers, turquoise over-ear radio headphones). Sena silently presses record beneath turquoise headphones. Mood: civil language hiding violence. Lighting: stale fan-cooled daylight through louvre windows. Environment = Location Registry id 'DISTRICT_ASSEMBLY_HALL': A modest district assembly hall in Afenyo: cream concrete walls, tall louvre windows, stacked plastic chairs, a raised wood dais, ceiling fans and late-afternoon lagoon light.",</w:t>
         <w:br/>
         <w:t xml:space="preserve">  "status": "⬜",</w:t>
         <w:br/>
@@ -4252,7 +4252,7 @@
         <w:br/>
         <w:t xml:space="preserve">  ],</w:t>
         <w:br/>
-        <w:t xml:space="preserve">  "prompt": "Grounded cinematic West African magical realism; contemporary Ghanaian coastal life; human-scale performances; saturated indigo, lagoon teal, clay red and warm amber palette; natural skin texture; tactile fabric and weathered wood; 2.39:1 widescreen composition; subtle film grain; expressive realistic lighting. No written words, no logos, no watermark, no distorted hands, no duplicate people. Scene S05 — The Polite Hearing. WIDE shot, low observational angle. Characters in frame: @KOSI_MENSAH (indigo utility jumpsuit with rolled sleeves, sand-coloured work boots and a narrow woven kente belt, small gold Adinkra-disc earrings); @ESI_TETTEH (brick-red wax-print dress beneath a soot-black oilskin apron, patterned headwrap and sturdy black sandals, smooth charred-wood smoking paddle); @KWAME_AGYEMAN (white linen shirt under a caramel lightweight field jacket, dark tailored trousers and brown loafers, antique bronze lapel pin shaped like a compass rose); @NII_LAMPTEY (tailored charcoal caftan with a subtle black geometric weave, polished black shoes and a silver wristwatch, black ebony walking cane with a carved heron handle). The public hall divides between concerned residents and officials at the dais. Mood: civil language hiding violence. Lighting: stale fan-cooled daylight through louvre windows. Environment = Location Registry id 'DISTRICT_ASSEMBLY_HALL': A modest district assembly hall in Afenyo: cream concrete walls, tall louvre windows, stacked plastic chairs, a raised wood dais, ceiling fans and late-afternoon lagoon light.",</w:t>
+        <w:t xml:space="preserve">  "prompt": "Grounded cinematic West African magical realism; contemporary Ghanaian coastal life; human-scale performances; saturated indigo, lagoon teal, clay red and warm amber palette; natural skin texture; tactile fabric and weathered wood; 16:9 landscape widescreen composition; subtle film grain; expressive realistic lighting. No written words, no logos, no watermark, no distorted hands, no duplicate people. Scene S05 — The Polite Hearing. WIDE shot, low observational angle. Characters in frame: @KOSI_MENSAH (indigo utility jumpsuit with rolled sleeves, sand-coloured work boots and a narrow woven kente belt, small gold Adinkra-disc earrings); @ESI_TETTEH (brick-red wax-print dress beneath a soot-black oilskin apron, patterned headwrap and sturdy black sandals, smooth charred-wood smoking paddle); @KWAME_AGYEMAN (white linen shirt under a caramel lightweight field jacket, dark tailored trousers and brown loafers, antique bronze lapel pin shaped like a compass rose); @NII_LAMPTEY (tailored charcoal caftan with a subtle black geometric weave, polished black shoes and a silver wristwatch, black ebony walking cane with a carved heron handle). The public hall divides between concerned residents and officials at the dais. Mood: civil language hiding violence. Lighting: stale fan-cooled daylight through louvre windows. Environment = Location Registry id 'DISTRICT_ASSEMBLY_HALL': A modest district assembly hall in Afenyo: cream concrete walls, tall louvre windows, stacked plastic chairs, a raised wood dais, ceiling fans and late-afternoon lagoon light.",</w:t>
         <w:br/>
         <w:t xml:space="preserve">  "status": "⬜",</w:t>
         <w:br/>
@@ -4303,7 +4303,7 @@
         <w:br/>
         <w:t xml:space="preserve">  ],</w:t>
         <w:br/>
-        <w:t xml:space="preserve">  "prompt": "Grounded cinematic West African magical realism; contemporary Ghanaian coastal life; human-scale performances; saturated indigo, lagoon teal, clay red and warm amber palette; natural skin texture; tactile fabric and weathered wood; 2.39:1 widescreen composition; subtle film grain; expressive realistic lighting. No written words, no logos, no watermark, no distorted hands, no duplicate people. Scene S05 — The Polite Hearing. MEDIUM shot, handheld eye-level. Characters in frame: @KWAME_AGYEMAN (white linen shirt under a caramel lightweight field jacket, dark tailored trousers and brown loafers, antique bronze lapel pin shaped like a compass rose). Kwame adjusts his bronze compass pin, visibly uneasy. Mood: civil language hiding violence. Lighting: stale fan-cooled daylight through louvre windows. Environment = Location Registry id 'DISTRICT_ASSEMBLY_HALL': A modest district assembly hall in Afenyo: cream concrete walls, tall louvre windows, stacked plastic chairs, a raised wood dais, ceiling fans and late-afternoon lagoon light.",</w:t>
+        <w:t xml:space="preserve">  "prompt": "Grounded cinematic West African magical realism; contemporary Ghanaian coastal life; human-scale performances; saturated indigo, lagoon teal, clay red and warm amber palette; natural skin texture; tactile fabric and weathered wood; 16:9 landscape widescreen composition; subtle film grain; expressive realistic lighting. No written words, no logos, no watermark, no distorted hands, no duplicate people. Scene S05 — The Polite Hearing. MEDIUM shot, handheld eye-level. Characters in frame: @KWAME_AGYEMAN (white linen shirt under a caramel lightweight field jacket, dark tailored trousers and brown loafers, antique bronze lapel pin shaped like a compass rose). Kwame adjusts his bronze compass pin, visibly uneasy. Mood: civil language hiding violence. Lighting: stale fan-cooled daylight through louvre windows. Environment = Location Registry id 'DISTRICT_ASSEMBLY_HALL': A modest district assembly hall in Afenyo: cream concrete walls, tall louvre windows, stacked plastic chairs, a raised wood dais, ceiling fans and late-afternoon lagoon light.",</w:t>
         <w:br/>
         <w:t xml:space="preserve">  "status": "⬜",</w:t>
         <w:br/>
@@ -4362,7 +4362,7 @@
         <w:br/>
         <w:t xml:space="preserve">  ],</w:t>
         <w:br/>
-        <w:t xml:space="preserve">  "prompt": "Grounded cinematic West African magical realism; contemporary Ghanaian coastal life; human-scale performances; saturated indigo, lagoon teal, clay red and warm amber palette; natural skin texture; tactile fabric and weathered wood; 2.39:1 widescreen composition; subtle film grain; expressive realistic lighting. No written words, no logos, no watermark, no distorted hands, no duplicate people. Scene S05 — The Polite Hearing. WIDE shot, rear closing tableau. Characters in frame: @KOSI_MENSAH (indigo utility jumpsuit with rolled sleeves, sand-coloured work boots and a narrow woven kente belt, small gold Adinkra-disc earrings); @SENA_ADJOVI (mustard oversized hoodie, blue-and-white printed ankle skirt and worn white canvas trainers, turquoise over-ear radio headphones); @ESI_TETTEH (brick-red wax-print dress beneath a soot-black oilskin apron, patterned headwrap and sturdy black sandals, smooth charred-wood smoking paddle). Kosi leaves with Sena and Esi as the polite hearing closes behind them. Mood: civil language hiding violence. Lighting: stale fan-cooled daylight through louvre windows. Environment = Location Registry id 'DISTRICT_ASSEMBLY_HALL': A modest district assembly hall in Afenyo: cream concrete walls, tall louvre windows, stacked plastic chairs, a raised wood dais, ceiling fans and late-afternoon lagoon light.",</w:t>
+        <w:t xml:space="preserve">  "prompt": "Grounded cinematic West African magical realism; contemporary Ghanaian coastal life; human-scale performances; saturated indigo, lagoon teal, clay red and warm amber palette; natural skin texture; tactile fabric and weathered wood; 16:9 landscape widescreen composition; subtle film grain; expressive realistic lighting. No written words, no logos, no watermark, no distorted hands, no duplicate people. Scene S05 — The Polite Hearing. WIDE shot, rear closing tableau. Characters in frame: @KOSI_MENSAH (indigo utility jumpsuit with rolled sleeves, sand-coloured work boots and a narrow woven kente belt, small gold Adinkra-disc earrings); @SENA_ADJOVI (mustard oversized hoodie, blue-and-white printed ankle skirt and worn white canvas trainers, turquoise over-ear radio headphones); @ESI_TETTEH (brick-red wax-print dress beneath a soot-black oilskin apron, patterned headwrap and sturdy black sandals, smooth charred-wood smoking paddle). Kosi leaves with Sena and Esi as the polite hearing closes behind them. Mood: civil language hiding violence. Lighting: stale fan-cooled daylight through louvre windows. Environment = Location Registry id 'DISTRICT_ASSEMBLY_HALL': A modest district assembly hall in Afenyo: cream concrete walls, tall louvre windows, stacked plastic chairs, a raised wood dais, ceiling fans and late-afternoon lagoon light.",</w:t>
         <w:br/>
         <w:t xml:space="preserve">  "status": "⬜",</w:t>
         <w:br/>
@@ -4421,7 +4421,7 @@
         <w:br/>
         <w:t xml:space="preserve">  ],</w:t>
         <w:br/>
-        <w:t xml:space="preserve">  "prompt": "Grounded cinematic West African magical realism; contemporary Ghanaian coastal life; human-scale performances; saturated indigo, lagoon teal, clay red and warm amber palette; natural skin texture; tactile fabric and weathered wood; 2.39:1 widescreen composition; subtle film grain; expressive realistic lighting. No written words, no logos, no watermark, no distorted hands, no duplicate people. Scene S06 — The Black Buoy. WIDE shot, high establishing angle. Characters in frame: @KOJO_DANSO (faded forest-green canvas jacket over a blue-and-cream striped shirt, charcoal trousers and rubber deck boots, weathered brass compass on a cord). Kojo's narrow canoe glides into the violet channel toward the dark navigation buoy. Mood: intimate investigation. Lighting: violet dusk, reflected teal water and a dead lantern silhouette. Environment = Location Registry id 'LAGOON_CHANNEL': A narrow Afenyo lagoon channel: glassy teal water, low mangrove roots, weathered fishing canoes, stilted homes, a rusted solar navigation buoy and a wide pale sky.",</w:t>
+        <w:t xml:space="preserve">  "prompt": "Grounded cinematic West African magical realism; contemporary Ghanaian coastal life; human-scale performances; saturated indigo, lagoon teal, clay red and warm amber palette; natural skin texture; tactile fabric and weathered wood; 16:9 landscape widescreen composition; subtle film grain; expressive realistic lighting. No written words, no logos, no watermark, no distorted hands, no duplicate people. Scene S06 — The Black Buoy. WIDE shot, high establishing angle. Characters in frame: @KOJO_DANSO (faded forest-green canvas jacket over a blue-and-cream striped shirt, charcoal trousers and rubber deck boots, weathered brass compass on a cord). Kojo's narrow canoe glides into the violet channel toward the dark navigation buoy. Mood: intimate investigation. Lighting: violet dusk, reflected teal water and a dead lantern silhouette. Environment = Location Registry id 'LAGOON_CHANNEL': A narrow Afenyo lagoon channel: glassy teal water, low mangrove roots, weathered fishing canoes, stilted homes, a rusted solar navigation buoy and a wide pale sky.",</w:t>
         <w:br/>
         <w:t xml:space="preserve">  "status": "⬜",</w:t>
         <w:br/>
@@ -4472,7 +4472,7 @@
         <w:br/>
         <w:t xml:space="preserve">  ],</w:t>
         <w:br/>
-        <w:t xml:space="preserve">  "prompt": "Grounded cinematic West African magical realism; contemporary Ghanaian coastal life; human-scale performances; saturated indigo, lagoon teal, clay red and warm amber palette; natural skin texture; tactile fabric and weathered wood; 2.39:1 widescreen composition; subtle film grain; expressive realistic lighting. No written words, no logos, no watermark, no distorted hands, no duplicate people. Scene S06 — The Black Buoy. MEDIUM shot, eye-level. Characters in frame: @KOJO_DANSO (faded forest-green canvas jacket over a blue-and-cream striped shirt, charcoal trousers and rubber deck boots, weathered brass compass on a cord). Kojo rows steadily, brass compass moving against his striped shirt. Mood: intimate investigation. Lighting: violet dusk, reflected teal water and a dead lantern silhouette. Environment = Location Registry id 'LAGOON_CHANNEL': A narrow Afenyo lagoon channel: glassy teal water, low mangrove roots, weathered fishing canoes, stilted homes, a rusted solar navigation buoy and a wide pale sky.",</w:t>
+        <w:t xml:space="preserve">  "prompt": "Grounded cinematic West African magical realism; contemporary Ghanaian coastal life; human-scale performances; saturated indigo, lagoon teal, clay red and warm amber palette; natural skin texture; tactile fabric and weathered wood; 16:9 landscape widescreen composition; subtle film grain; expressive realistic lighting. No written words, no logos, no watermark, no distorted hands, no duplicate people. Scene S06 — The Black Buoy. MEDIUM shot, eye-level. Characters in frame: @KOJO_DANSO (faded forest-green canvas jacket over a blue-and-cream striped shirt, charcoal trousers and rubber deck boots, weathered brass compass on a cord). Kojo rows steadily, brass compass moving against his striped shirt. Mood: intimate investigation. Lighting: violet dusk, reflected teal water and a dead lantern silhouette. Environment = Location Registry id 'LAGOON_CHANNEL': A narrow Afenyo lagoon channel: glassy teal water, low mangrove roots, weathered fishing canoes, stilted homes, a rusted solar navigation buoy and a wide pale sky.",</w:t>
         <w:br/>
         <w:t xml:space="preserve">  "status": "⬜",</w:t>
         <w:br/>
@@ -4523,7 +4523,7 @@
         <w:br/>
         <w:t xml:space="preserve">  ],</w:t>
         <w:br/>
-        <w:t xml:space="preserve">  "prompt": "Grounded cinematic West African magical realism; contemporary Ghanaian coastal life; human-scale performances; saturated indigo, lagoon teal, clay red and warm amber palette; natural skin texture; tactile fabric and weathered wood; 2.39:1 widescreen composition; subtle film grain; expressive realistic lighting. No written words, no logos, no watermark, no distorted hands, no duplicate people. Scene S06 — The Black Buoy. CLOSE shot, three-quarter profile. Characters in frame: @KOSI_MENSAH (indigo utility jumpsuit with rolled sleeves, sand-coloured work boots and a narrow woven kente belt, small gold Adinkra-disc earrings). Kosi kneels in the canoe and tests the buoy's dead solar housing. Mood: intimate investigation. Lighting: violet dusk, reflected teal water and a dead lantern silhouette. Environment = Location Registry id 'LAGOON_CHANNEL': A narrow Afenyo lagoon channel: glassy teal water, low mangrove roots, weathered fishing canoes, stilted homes, a rusted solar navigation buoy and a wide pale sky.",</w:t>
+        <w:t xml:space="preserve">  "prompt": "Grounded cinematic West African magical realism; contemporary Ghanaian coastal life; human-scale performances; saturated indigo, lagoon teal, clay red and warm amber palette; natural skin texture; tactile fabric and weathered wood; 16:9 landscape widescreen composition; subtle film grain; expressive realistic lighting. No written words, no logos, no watermark, no distorted hands, no duplicate people. Scene S06 — The Black Buoy. CLOSE shot, three-quarter profile. Characters in frame: @KOSI_MENSAH (indigo utility jumpsuit with rolled sleeves, sand-coloured work boots and a narrow woven kente belt, small gold Adinkra-disc earrings). Kosi kneels in the canoe and tests the buoy's dead solar housing. Mood: intimate investigation. Lighting: violet dusk, reflected teal water and a dead lantern silhouette. Environment = Location Registry id 'LAGOON_CHANNEL': A narrow Afenyo lagoon channel: glassy teal water, low mangrove roots, weathered fishing canoes, stilted homes, a rusted solar navigation buoy and a wide pale sky.",</w:t>
         <w:br/>
         <w:t xml:space="preserve">  "status": "⬜",</w:t>
         <w:br/>
@@ -4574,7 +4574,7 @@
         <w:br/>
         <w:t xml:space="preserve">  ],</w:t>
         <w:br/>
-        <w:t xml:space="preserve">  "prompt": "Grounded cinematic West African magical realism; contemporary Ghanaian coastal life; human-scale performances; saturated indigo, lagoon teal, clay red and warm amber palette; natural skin texture; tactile fabric and weathered wood; 2.39:1 widescreen composition; subtle film grain; expressive realistic lighting. No written words, no logos, no watermark, no distorted hands, no duplicate people. Scene S06 — The Black Buoy. INSERT shot, top-down detail. Characters in frame: @KOSI_MENSAH (indigo utility jumpsuit with rolled sleeves, sand-coloured work boots and a narrow woven kente belt, small gold Adinkra-disc earrings). A severed solar connection and newer buried cable meet beneath the buoy casing. Mood: intimate investigation. Lighting: violet dusk, reflected teal water and a dead lantern silhouette. Environment = Location Registry id 'LAGOON_CHANNEL': A narrow Afenyo lagoon channel: glassy teal water, low mangrove roots, weathered fishing canoes, stilted homes, a rusted solar navigation buoy and a wide pale sky.",</w:t>
+        <w:t xml:space="preserve">  "prompt": "Grounded cinematic West African magical realism; contemporary Ghanaian coastal life; human-scale performances; saturated indigo, lagoon teal, clay red and warm amber palette; natural skin texture; tactile fabric and weathered wood; 16:9 landscape widescreen composition; subtle film grain; expressive realistic lighting. No written words, no logos, no watermark, no distorted hands, no duplicate people. Scene S06 — The Black Buoy. INSERT shot, top-down detail. Characters in frame: @KOSI_MENSAH (indigo utility jumpsuit with rolled sleeves, sand-coloured work boots and a narrow woven kente belt, small gold Adinkra-disc earrings). A severed solar connection and newer buried cable meet beneath the buoy casing. Mood: intimate investigation. Lighting: violet dusk, reflected teal water and a dead lantern silhouette. Environment = Location Registry id 'LAGOON_CHANNEL': A narrow Afenyo lagoon channel: glassy teal water, low mangrove roots, weathered fishing canoes, stilted homes, a rusted solar navigation buoy and a wide pale sky.",</w:t>
         <w:br/>
         <w:t xml:space="preserve">  "status": "⬜",</w:t>
         <w:br/>
@@ -4629,7 +4629,7 @@
         <w:br/>
         <w:t xml:space="preserve">  ],</w:t>
         <w:br/>
-        <w:t xml:space="preserve">  "prompt": "Grounded cinematic West African magical realism; contemporary Ghanaian coastal life; human-scale performances; saturated indigo, lagoon teal, clay red and warm amber palette; natural skin texture; tactile fabric and weathered wood; 2.39:1 widescreen composition; subtle film grain; expressive realistic lighting. No written words, no logos, no watermark, no distorted hands, no duplicate people. Scene S06 — The Black Buoy. TWO-SHOT shot, eye-level. Characters in frame: @KOSI_MENSAH (indigo utility jumpsuit with rolled sleeves, sand-coloured work boots and a narrow woven kente belt, small gold Adinkra-disc earrings); @KOJO_DANSO (faded forest-green canvas jacket over a blue-and-cream striped shirt, charcoal trousers and rubber deck boots, weathered brass compass on a cord). Kosi and Kojo balance beside the rusted buoy as resort lights glow far away. Mood: intimate investigation. Lighting: violet dusk, reflected teal water and a dead lantern silhouette. Environment = Location Registry id 'LAGOON_CHANNEL': A narrow Afenyo lagoon channel: glassy teal water, low mangrove roots, weathered fishing canoes, stilted homes, a rusted solar navigation buoy and a wide pale sky.",</w:t>
+        <w:t xml:space="preserve">  "prompt": "Grounded cinematic West African magical realism; contemporary Ghanaian coastal life; human-scale performances; saturated indigo, lagoon teal, clay red and warm amber palette; natural skin texture; tactile fabric and weathered wood; 16:9 landscape widescreen composition; subtle film grain; expressive realistic lighting. No written words, no logos, no watermark, no distorted hands, no duplicate people. Scene S06 — The Black Buoy. TWO-SHOT shot, eye-level. Characters in frame: @KOSI_MENSAH (indigo utility jumpsuit with rolled sleeves, sand-coloured work boots and a narrow woven kente belt, small gold Adinkra-disc earrings); @KOJO_DANSO (faded forest-green canvas jacket over a blue-and-cream striped shirt, charcoal trousers and rubber deck boots, weathered brass compass on a cord). Kosi and Kojo balance beside the rusted buoy as resort lights glow far away. Mood: intimate investigation. Lighting: violet dusk, reflected teal water and a dead lantern silhouette. Environment = Location Registry id 'LAGOON_CHANNEL': A narrow Afenyo lagoon channel: glassy teal water, low mangrove roots, weathered fishing canoes, stilted homes, a rusted solar navigation buoy and a wide pale sky.",</w:t>
         <w:br/>
         <w:t xml:space="preserve">  "status": "⬜",</w:t>
         <w:br/>
@@ -4680,7 +4680,7 @@
         <w:br/>
         <w:t xml:space="preserve">  ],</w:t>
         <w:br/>
-        <w:t xml:space="preserve">  "prompt": "Grounded cinematic West African magical realism; contemporary Ghanaian coastal life; human-scale performances; saturated indigo, lagoon teal, clay red and warm amber palette; natural skin texture; tactile fabric and weathered wood; 2.39:1 widescreen composition; subtle film grain; expressive realistic lighting. No written words, no logos, no watermark, no distorted hands, no duplicate people. Scene S06 — The Black Buoy. OVER-SHOULDER shot, over the lead character's shoulder. Characters in frame: @KOSI_MENSAH (indigo utility jumpsuit with rolled sleeves, sand-coloured work boots and a narrow woven kente belt, small gold Adinkra-disc earrings). Over Kosi's shoulder, a thin oily slick shivers across teal water. Mood: intimate investigation. Lighting: violet dusk, reflected teal water and a dead lantern silhouette. Environment = Location Registry id 'LAGOON_CHANNEL': A narrow Afenyo lagoon channel: glassy teal water, low mangrove roots, weathered fishing canoes, stilted homes, a rusted solar navigation buoy and a wide pale sky.",</w:t>
+        <w:t xml:space="preserve">  "prompt": "Grounded cinematic West African magical realism; contemporary Ghanaian coastal life; human-scale performances; saturated indigo, lagoon teal, clay red and warm amber palette; natural skin texture; tactile fabric and weathered wood; 16:9 landscape widescreen composition; subtle film grain; expressive realistic lighting. No written words, no logos, no watermark, no distorted hands, no duplicate people. Scene S06 — The Black Buoy. OVER-SHOULDER shot, over the lead character's shoulder. Characters in frame: @KOSI_MENSAH (indigo utility jumpsuit with rolled sleeves, sand-coloured work boots and a narrow woven kente belt, small gold Adinkra-disc earrings). Over Kosi's shoulder, a thin oily slick shivers across teal water. Mood: intimate investigation. Lighting: violet dusk, reflected teal water and a dead lantern silhouette. Environment = Location Registry id 'LAGOON_CHANNEL': A narrow Afenyo lagoon channel: glassy teal water, low mangrove roots, weathered fishing canoes, stilted homes, a rusted solar navigation buoy and a wide pale sky.",</w:t>
         <w:br/>
         <w:t xml:space="preserve">  "status": "⬜",</w:t>
         <w:br/>
@@ -4731,7 +4731,7 @@
         <w:br/>
         <w:t xml:space="preserve">  ],</w:t>
         <w:br/>
-        <w:t xml:space="preserve">  "prompt": "Grounded cinematic West African magical realism; contemporary Ghanaian coastal life; human-scale performances; saturated indigo, lagoon teal, clay red and warm amber palette; natural skin texture; tactile fabric and weathered wood; 2.39:1 widescreen composition; subtle film grain; expressive realistic lighting. No written words, no logos, no watermark, no distorted hands, no duplicate people. Scene S06 — The Black Buoy. EXTREME CLOSE shot, intimate frontal angle. Characters in frame: @KOJO_DANSO (faded forest-green canvas jacket over a blue-and-cream striped shirt, charcoal trousers and rubber deck boots, weathered brass compass on a cord). Kojo speaks of the channel that has always carried the town outward. Mood: intimate investigation. Lighting: violet dusk, reflected teal water and a dead lantern silhouette. Environment = Location Registry id 'LAGOON_CHANNEL': A narrow Afenyo lagoon channel: glassy teal water, low mangrove roots, weathered fishing canoes, stilted homes, a rusted solar navigation buoy and a wide pale sky.",</w:t>
+        <w:t xml:space="preserve">  "prompt": "Grounded cinematic West African magical realism; contemporary Ghanaian coastal life; human-scale performances; saturated indigo, lagoon teal, clay red and warm amber palette; natural skin texture; tactile fabric and weathered wood; 16:9 landscape widescreen composition; subtle film grain; expressive realistic lighting. No written words, no logos, no watermark, no distorted hands, no duplicate people. Scene S06 — The Black Buoy. EXTREME CLOSE shot, intimate frontal angle. Characters in frame: @KOJO_DANSO (faded forest-green canvas jacket over a blue-and-cream striped shirt, charcoal trousers and rubber deck boots, weathered brass compass on a cord). Kojo speaks of the channel that has always carried the town outward. Mood: intimate investigation. Lighting: violet dusk, reflected teal water and a dead lantern silhouette. Environment = Location Registry id 'LAGOON_CHANNEL': A narrow Afenyo lagoon channel: glassy teal water, low mangrove roots, weathered fishing canoes, stilted homes, a rusted solar navigation buoy and a wide pale sky.",</w:t>
         <w:br/>
         <w:t xml:space="preserve">  "status": "⬜",</w:t>
         <w:br/>
@@ -4786,7 +4786,7 @@
         <w:br/>
         <w:t xml:space="preserve">  ],</w:t>
         <w:br/>
-        <w:t xml:space="preserve">  "prompt": "Grounded cinematic West African magical realism; contemporary Ghanaian coastal life; human-scale performances; saturated indigo, lagoon teal, clay red and warm amber palette; natural skin texture; tactile fabric and weathered wood; 2.39:1 widescreen composition; subtle film grain; expressive realistic lighting. No written words, no logos, no watermark, no distorted hands, no duplicate people. Scene S06 — The Black Buoy. WIDE shot, low observational angle. Characters in frame: @KOSI_MENSAH (indigo utility jumpsuit with rolled sleeves, sand-coloured work boots and a narrow woven kente belt, small gold Adinkra-disc earrings); @KOJO_DANSO (faded forest-green canvas jacket over a blue-and-cream striped shirt, charcoal trousers and rubber deck boots, weathered brass compass on a cord). The unlit lantern crown silhouettes against the dusk sky. Mood: intimate investigation. Lighting: violet dusk, reflected teal water and a dead lantern silhouette. Environment = Location Registry id 'LAGOON_CHANNEL': A narrow Afenyo lagoon channel: glassy teal water, low mangrove roots, weathered fishing canoes, stilted homes, a rusted solar navigation buoy and a wide pale sky.",</w:t>
+        <w:t xml:space="preserve">  "prompt": "Grounded cinematic West African magical realism; contemporary Ghanaian coastal life; human-scale performances; saturated indigo, lagoon teal, clay red and warm amber palette; natural skin texture; tactile fabric and weathered wood; 16:9 landscape widescreen composition; subtle film grain; expressive realistic lighting. No written words, no logos, no watermark, no distorted hands, no duplicate people. Scene S06 — The Black Buoy. WIDE shot, low observational angle. Characters in frame: @KOSI_MENSAH (indigo utility jumpsuit with rolled sleeves, sand-coloured work boots and a narrow woven kente belt, small gold Adinkra-disc earrings); @KOJO_DANSO (faded forest-green canvas jacket over a blue-and-cream striped shirt, charcoal trousers and rubber deck boots, weathered brass compass on a cord). The unlit lantern crown silhouettes against the dusk sky. Mood: intimate investigation. Lighting: violet dusk, reflected teal water and a dead lantern silhouette. Environment = Location Registry id 'LAGOON_CHANNEL': A narrow Afenyo lagoon channel: glassy teal water, low mangrove roots, weathered fishing canoes, stilted homes, a rusted solar navigation buoy and a wide pale sky.",</w:t>
         <w:br/>
         <w:t xml:space="preserve">  "status": "⬜",</w:t>
         <w:br/>
@@ -4837,7 +4837,7 @@
         <w:br/>
         <w:t xml:space="preserve">  ],</w:t>
         <w:br/>
-        <w:t xml:space="preserve">  "prompt": "Grounded cinematic West African magical realism; contemporary Ghanaian coastal life; human-scale performances; saturated indigo, lagoon teal, clay red and warm amber palette; natural skin texture; tactile fabric and weathered wood; 2.39:1 widescreen composition; subtle film grain; expressive realistic lighting. No written words, no logos, no watermark, no distorted hands, no duplicate people. Scene S06 — The Black Buoy. MEDIUM shot, handheld eye-level. Characters in frame: @KOSI_MENSAH (indigo utility jumpsuit with rolled sleeves, sand-coloured work boots and a narrow woven kente belt, small gold Adinkra-disc earrings). Kosi photographs the severed connection with steady hands. Mood: intimate investigation. Lighting: violet dusk, reflected teal water and a dead lantern silhouette. Environment = Location Registry id 'LAGOON_CHANNEL': A narrow Afenyo lagoon channel: glassy teal water, low mangrove roots, weathered fishing canoes, stilted homes, a rusted solar navigation buoy and a wide pale sky.",</w:t>
+        <w:t xml:space="preserve">  "prompt": "Grounded cinematic West African magical realism; contemporary Ghanaian coastal life; human-scale performances; saturated indigo, lagoon teal, clay red and warm amber palette; natural skin texture; tactile fabric and weathered wood; 16:9 landscape widescreen composition; subtle film grain; expressive realistic lighting. No written words, no logos, no watermark, no distorted hands, no duplicate people. Scene S06 — The Black Buoy. MEDIUM shot, handheld eye-level. Characters in frame: @KOSI_MENSAH (indigo utility jumpsuit with rolled sleeves, sand-coloured work boots and a narrow woven kente belt, small gold Adinkra-disc earrings). Kosi photographs the severed connection with steady hands. Mood: intimate investigation. Lighting: violet dusk, reflected teal water and a dead lantern silhouette. Environment = Location Registry id 'LAGOON_CHANNEL': A narrow Afenyo lagoon channel: glassy teal water, low mangrove roots, weathered fishing canoes, stilted homes, a rusted solar navigation buoy and a wide pale sky.",</w:t>
         <w:br/>
         <w:t xml:space="preserve">  "status": "⬜",</w:t>
         <w:br/>
@@ -4892,7 +4892,7 @@
         <w:br/>
         <w:t xml:space="preserve">  ],</w:t>
         <w:br/>
-        <w:t xml:space="preserve">  "prompt": "Grounded cinematic West African magical realism; contemporary Ghanaian coastal life; human-scale performances; saturated indigo, lagoon teal, clay red and warm amber palette; natural skin texture; tactile fabric and weathered wood; 2.39:1 widescreen composition; subtle film grain; expressive realistic lighting. No written words, no logos, no watermark, no distorted hands, no duplicate people. Scene S06 — The Black Buoy. WIDE shot, rear closing tableau. Characters in frame: @KOSI_MENSAH (indigo utility jumpsuit with rolled sleeves, sand-coloured work boots and a narrow woven kente belt, small gold Adinkra-disc earrings); @KOJO_DANSO (faded forest-green canvas jacket over a blue-and-cream striped shirt, charcoal trousers and rubber deck boots, weathered brass compass on a cord). The canoe turns home as Kosi's decision settles over the dark water. Mood: intimate investigation. Lighting: violet dusk, reflected teal water and a dead lantern silhouette. Environment = Location Registry id 'LAGOON_CHANNEL': A narrow Afenyo lagoon channel: glassy teal water, low mangrove roots, weathered fishing canoes, stilted homes, a rusted solar navigation buoy and a wide pale sky.",</w:t>
+        <w:t xml:space="preserve">  "prompt": "Grounded cinematic West African magical realism; contemporary Ghanaian coastal life; human-scale performances; saturated indigo, lagoon teal, clay red and warm amber palette; natural skin texture; tactile fabric and weathered wood; 16:9 landscape widescreen composition; subtle film grain; expressive realistic lighting. No written words, no logos, no watermark, no distorted hands, no duplicate people. Scene S06 — The Black Buoy. WIDE shot, rear closing tableau. Characters in frame: @KOSI_MENSAH (indigo utility jumpsuit with rolled sleeves, sand-coloured work boots and a narrow woven kente belt, small gold Adinkra-disc earrings); @KOJO_DANSO (faded forest-green canvas jacket over a blue-and-cream striped shirt, charcoal trousers and rubber deck boots, weathered brass compass on a cord). The canoe turns home as Kosi's decision settles over the dark water. Mood: intimate investigation. Lighting: violet dusk, reflected teal water and a dead lantern silhouette. Environment = Location Registry id 'LAGOON_CHANNEL': A narrow Afenyo lagoon channel: glassy teal water, low mangrove roots, weathered fishing canoes, stilted homes, a rusted solar navigation buoy and a wide pale sky.",</w:t>
         <w:br/>
         <w:t xml:space="preserve">  "status": "⬜",</w:t>
         <w:br/>
@@ -4955,7 +4955,7 @@
         <w:br/>
         <w:t xml:space="preserve">  ],</w:t>
         <w:br/>
-        <w:t xml:space="preserve">  "prompt": "Grounded cinematic West African magical realism; contemporary Ghanaian coastal life; human-scale performances; saturated indigo, lagoon teal, clay red and warm amber palette; natural skin texture; tactile fabric and weathered wood; 2.39:1 widescreen composition; subtle film grain; expressive realistic lighting. No written words, no logos, no watermark, no distorted hands, no duplicate people. Scene S07 — The Ledger in the Lantern. WIDE shot, high establishing angle. Characters in frame: @AMA_ADJOVI (deep navy kaba blouse, hand-dyed indigo wrapper with tiny white wave motifs and flat leather sandals, three-strand amber bead necklace); @KOSI_MENSAH (indigo utility jumpsuit with rolled sleeves, sand-coloured work boots and a narrow woven kente belt, small gold Adinkra-disc earrings). Ama's workshop glows with brass lanterns while Kosi opens a damaged frame. Mood: discovery and inheritance. Lighting: warm brass lantern light against deep blue night. Environment = Location Registry id 'AMA_LANTERN_WORKSHOP': Ama's lantern workshop off the compound courtyard: clay-red floor, crowded wooden workbench, brass lantern frames, blue glass panes, hand tools, coils of copper wire, indigo cloth and shafts of warm window light.",</w:t>
+        <w:t xml:space="preserve">  "prompt": "Grounded cinematic West African magical realism; contemporary Ghanaian coastal life; human-scale performances; saturated indigo, lagoon teal, clay red and warm amber palette; natural skin texture; tactile fabric and weathered wood; 16:9 landscape widescreen composition; subtle film grain; expressive realistic lighting. No written words, no logos, no watermark, no distorted hands, no duplicate people. Scene S07 — The Ledger in the Lantern. WIDE shot, high establishing angle. Characters in frame: @AMA_ADJOVI (deep navy kaba blouse, hand-dyed indigo wrapper with tiny white wave motifs and flat leather sandals, three-strand amber bead necklace); @KOSI_MENSAH (indigo utility jumpsuit with rolled sleeves, sand-coloured work boots and a narrow woven kente belt, small gold Adinkra-disc earrings). Ama's workshop glows with brass lanterns while Kosi opens a damaged frame. Mood: discovery and inheritance. Lighting: warm brass lantern light against deep blue night. Environment = Location Registry id 'AMA_LANTERN_WORKSHOP': Ama's lantern workshop off the compound courtyard: clay-red floor, crowded wooden workbench, brass lantern frames, blue glass panes, hand tools, coils of copper wire, indigo cloth and shafts of warm window light.",</w:t>
         <w:br/>
         <w:t xml:space="preserve">  "status": "⬜",</w:t>
         <w:br/>
@@ -5006,7 +5006,7 @@
         <w:br/>
         <w:t xml:space="preserve">  ],</w:t>
         <w:br/>
-        <w:t xml:space="preserve">  "prompt": "Grounded cinematic West African magical realism; contemporary Ghanaian coastal life; human-scale performances; saturated indigo, lagoon teal, clay red and warm amber palette; natural skin texture; tactile fabric and weathered wood; 2.39:1 widescreen composition; subtle film grain; expressive realistic lighting. No written words, no logos, no watermark, no distorted hands, no duplicate people. Scene S07 — The Ledger in the Lantern. MEDIUM shot, eye-level. Characters in frame: @KOSI_MENSAH (indigo utility jumpsuit with rolled sleeves, sand-coloured work boots and a narrow woven kente belt, small gold Adinkra-disc earrings). Kosi uses a small tool to reconnect a lantern wire at the workbench. Mood: discovery and inheritance. Lighting: warm brass lantern light against deep blue night. Environment = Location Registry id 'AMA_LANTERN_WORKSHOP': Ama's lantern workshop off the compound courtyard: clay-red floor, crowded wooden workbench, brass lantern frames, blue glass panes, hand tools, coils of copper wire, indigo cloth and shafts of warm window light.",</w:t>
+        <w:t xml:space="preserve">  "prompt": "Grounded cinematic West African magical realism; contemporary Ghanaian coastal life; human-scale performances; saturated indigo, lagoon teal, clay red and warm amber palette; natural skin texture; tactile fabric and weathered wood; 16:9 landscape widescreen composition; subtle film grain; expressive realistic lighting. No written words, no logos, no watermark, no distorted hands, no duplicate people. Scene S07 — The Ledger in the Lantern. MEDIUM shot, eye-level. Characters in frame: @KOSI_MENSAH (indigo utility jumpsuit with rolled sleeves, sand-coloured work boots and a narrow woven kente belt, small gold Adinkra-disc earrings). Kosi uses a small tool to reconnect a lantern wire at the workbench. Mood: discovery and inheritance. Lighting: warm brass lantern light against deep blue night. Environment = Location Registry id 'AMA_LANTERN_WORKSHOP': Ama's lantern workshop off the compound courtyard: clay-red floor, crowded wooden workbench, brass lantern frames, blue glass panes, hand tools, coils of copper wire, indigo cloth and shafts of warm window light.",</w:t>
         <w:br/>
         <w:t xml:space="preserve">  "status": "⬜",</w:t>
         <w:br/>
@@ -5057,7 +5057,7 @@
         <w:br/>
         <w:t xml:space="preserve">  ],</w:t>
         <w:br/>
-        <w:t xml:space="preserve">  "prompt": "Grounded cinematic West African magical realism; contemporary Ghanaian coastal life; human-scale performances; saturated indigo, lagoon teal, clay red and warm amber palette; natural skin texture; tactile fabric and weathered wood; 2.39:1 widescreen composition; subtle film grain; expressive realistic lighting. No written words, no logos, no watermark, no distorted hands, no duplicate people. Scene S07 — The Ledger in the Lantern. CLOSE shot, three-quarter profile. Characters in frame: @AMA_ADJOVI (deep navy kaba blouse, hand-dyed indigo wrapper with tiny white wave motifs and flat leather sandals, three-strand amber bead necklace). Ama watches Kosi work with pride and guarded concern. Mood: discovery and inheritance. Lighting: warm brass lantern light against deep blue night. Environment = Location Registry id 'AMA_LANTERN_WORKSHOP': Ama's lantern workshop off the compound courtyard: clay-red floor, crowded wooden workbench, brass lantern frames, blue glass panes, hand tools, coils of copper wire, indigo cloth and shafts of warm window light.",</w:t>
+        <w:t xml:space="preserve">  "prompt": "Grounded cinematic West African magical realism; contemporary Ghanaian coastal life; human-scale performances; saturated indigo, lagoon teal, clay red and warm amber palette; natural skin texture; tactile fabric and weathered wood; 16:9 landscape widescreen composition; subtle film grain; expressive realistic lighting. No written words, no logos, no watermark, no distorted hands, no duplicate people. Scene S07 — The Ledger in the Lantern. CLOSE shot, three-quarter profile. Characters in frame: @AMA_ADJOVI (deep navy kaba blouse, hand-dyed indigo wrapper with tiny white wave motifs and flat leather sandals, three-strand amber bead necklace). Ama watches Kosi work with pride and guarded concern. Mood: discovery and inheritance. Lighting: warm brass lantern light against deep blue night. Environment = Location Registry id 'AMA_LANTERN_WORKSHOP': Ama's lantern workshop off the compound courtyard: clay-red floor, crowded wooden workbench, brass lantern frames, blue glass panes, hand tools, coils of copper wire, indigo cloth and shafts of warm window light.",</w:t>
         <w:br/>
         <w:t xml:space="preserve">  "status": "⬜",</w:t>
         <w:br/>
@@ -5108,7 +5108,7 @@
         <w:br/>
         <w:t xml:space="preserve">  ],</w:t>
         <w:br/>
-        <w:t xml:space="preserve">  "prompt": "Grounded cinematic West African magical realism; contemporary Ghanaian coastal life; human-scale performances; saturated indigo, lagoon teal, clay red and warm amber palette; natural skin texture; tactile fabric and weathered wood; 2.39:1 widescreen composition; subtle film grain; expressive realistic lighting. No written words, no logos, no watermark, no distorted hands, no duplicate people. Scene S07 — The Ledger in the Lantern. INSERT shot, top-down detail. Characters in frame: @KOSI_MENSAH (indigo utility jumpsuit with rolled sleeves, sand-coloured work boots and a narrow woven kente belt, small gold Adinkra-disc earrings). A rolled water-stained ledger page slides from behind a loose blue glass pane. Mood: discovery and inheritance. Lighting: warm brass lantern light against deep blue night. Environment = Location Registry id 'AMA_LANTERN_WORKSHOP': Ama's lantern workshop off the compound courtyard: clay-red floor, crowded wooden workbench, brass lantern frames, blue glass panes, hand tools, coils of copper wire, indigo cloth and shafts of warm window light.",</w:t>
+        <w:t xml:space="preserve">  "prompt": "Grounded cinematic West African magical realism; contemporary Ghanaian coastal life; human-scale performances; saturated indigo, lagoon teal, clay red and warm amber palette; natural skin texture; tactile fabric and weathered wood; 16:9 landscape widescreen composition; subtle film grain; expressive realistic lighting. No written words, no logos, no watermark, no distorted hands, no duplicate people. Scene S07 — The Ledger in the Lantern. INSERT shot, top-down detail. Characters in frame: @KOSI_MENSAH (indigo utility jumpsuit with rolled sleeves, sand-coloured work boots and a narrow woven kente belt, small gold Adinkra-disc earrings). A rolled water-stained ledger page slides from behind a loose blue glass pane. Mood: discovery and inheritance. Lighting: warm brass lantern light against deep blue night. Environment = Location Registry id 'AMA_LANTERN_WORKSHOP': Ama's lantern workshop off the compound courtyard: clay-red floor, crowded wooden workbench, brass lantern frames, blue glass panes, hand tools, coils of copper wire, indigo cloth and shafts of warm window light.",</w:t>
         <w:br/>
         <w:t xml:space="preserve">  "status": "⬜",</w:t>
         <w:br/>
@@ -5159,7 +5159,7 @@
         <w:br/>
         <w:t xml:space="preserve">  ],</w:t>
         <w:br/>
-        <w:t xml:space="preserve">  "prompt": "Grounded cinematic West African magical realism; contemporary Ghanaian coastal life; human-scale performances; saturated indigo, lagoon teal, clay red and warm amber palette; natural skin texture; tactile fabric and weathered wood; 2.39:1 widescreen composition; subtle film grain; expressive realistic lighting. No written words, no logos, no watermark, no distorted hands, no duplicate people. Scene S07 — The Ledger in the Lantern. TWO-SHOT shot, eye-level. Characters in frame: @SENA_ADJOVI (mustard oversized hoodie, blue-and-white printed ankle skirt and worn white canvas trainers, turquoise over-ear radio headphones). Sena recognizes a repeating code in the page's hand-drawn wave marks. Mood: discovery and inheritance. Lighting: warm brass lantern light against deep blue night. Environment = Location Registry id 'AMA_LANTERN_WORKSHOP': Ama's lantern workshop off the compound courtyard: clay-red floor, crowded wooden workbench, brass lantern frames, blue glass panes, hand tools, coils of copper wire, indigo cloth and shafts of warm window light.",</w:t>
+        <w:t xml:space="preserve">  "prompt": "Grounded cinematic West African magical realism; contemporary Ghanaian coastal life; human-scale performances; saturated indigo, lagoon teal, clay red and warm amber palette; natural skin texture; tactile fabric and weathered wood; 16:9 landscape widescreen composition; subtle film grain; expressive realistic lighting. No written words, no logos, no watermark, no distorted hands, no duplicate people. Scene S07 — The Ledger in the Lantern. TWO-SHOT shot, eye-level. Characters in frame: @SENA_ADJOVI (mustard oversized hoodie, blue-and-white printed ankle skirt and worn white canvas trainers, turquoise over-ear radio headphones). Sena recognizes a repeating code in the page's hand-drawn wave marks. Mood: discovery and inheritance. Lighting: warm brass lantern light against deep blue night. Environment = Location Registry id 'AMA_LANTERN_WORKSHOP': Ama's lantern workshop off the compound courtyard: clay-red floor, crowded wooden workbench, brass lantern frames, blue glass panes, hand tools, coils of copper wire, indigo cloth and shafts of warm window light.",</w:t>
         <w:br/>
         <w:t xml:space="preserve">  "status": "⬜",</w:t>
         <w:br/>
@@ -5214,7 +5214,7 @@
         <w:br/>
         <w:t xml:space="preserve">  ],</w:t>
         <w:br/>
-        <w:t xml:space="preserve">  "prompt": "Grounded cinematic West African magical realism; contemporary Ghanaian coastal life; human-scale performances; saturated indigo, lagoon teal, clay red and warm amber palette; natural skin texture; tactile fabric and weathered wood; 2.39:1 widescreen composition; subtle film grain; expressive realistic lighting. No written words, no logos, no watermark, no distorted hands, no duplicate people. Scene S07 — The Ledger in the Lantern. OVER-SHOULDER shot, over the lead character's shoulder. Characters in frame: @KOSI_MENSAH (indigo utility jumpsuit with rolled sleeves, sand-coloured work boots and a narrow woven kente belt, small gold Adinkra-disc earrings); @AMA_ADJOVI (deep navy kaba blouse, hand-dyed indigo wrapper with tiny white wave motifs and flat leather sandals, three-strand amber bead necklace). Over Kosi's shoulder, Ama closes Kosi's hand around the recovered page. Mood: discovery and inheritance. Lighting: warm brass lantern light against deep blue night. Environment = Location Registry id 'AMA_LANTERN_WORKSHOP': Ama's lantern workshop off the compound courtyard: clay-red floor, crowded wooden workbench, brass lantern frames, blue glass panes, hand tools, coils of copper wire, indigo cloth and shafts of warm window light.",</w:t>
+        <w:t xml:space="preserve">  "prompt": "Grounded cinematic West African magical realism; contemporary Ghanaian coastal life; human-scale performances; saturated indigo, lagoon teal, clay red and warm amber palette; natural skin texture; tactile fabric and weathered wood; 16:9 landscape widescreen composition; subtle film grain; expressive realistic lighting. No written words, no logos, no watermark, no distorted hands, no duplicate people. Scene S07 — The Ledger in the Lantern. OVER-SHOULDER shot, over the lead character's shoulder. Characters in frame: @KOSI_MENSAH (indigo utility jumpsuit with rolled sleeves, sand-coloured work boots and a narrow woven kente belt, small gold Adinkra-disc earrings); @AMA_ADJOVI (deep navy kaba blouse, hand-dyed indigo wrapper with tiny white wave motifs and flat leather sandals, three-strand amber bead necklace). Over Kosi's shoulder, Ama closes Kosi's hand around the recovered page. Mood: discovery and inheritance. Lighting: warm brass lantern light against deep blue night. Environment = Location Registry id 'AMA_LANTERN_WORKSHOP': Ama's lantern workshop off the compound courtyard: clay-red floor, crowded wooden workbench, brass lantern frames, blue glass panes, hand tools, coils of copper wire, indigo cloth and shafts of warm window light.",</w:t>
         <w:br/>
         <w:t xml:space="preserve">  "status": "⬜",</w:t>
         <w:br/>
@@ -5265,7 +5265,7 @@
         <w:br/>
         <w:t xml:space="preserve">  ],</w:t>
         <w:br/>
-        <w:t xml:space="preserve">  "prompt": "Grounded cinematic West African magical realism; contemporary Ghanaian coastal life; human-scale performances; saturated indigo, lagoon teal, clay red and warm amber palette; natural skin texture; tactile fabric and weathered wood; 2.39:1 widescreen composition; subtle film grain; expressive realistic lighting. No written words, no logos, no watermark, no distorted hands, no duplicate people. Scene S07 — The Ledger in the Lantern. EXTREME CLOSE shot, intimate frontal angle. Characters in frame: @AMA_ADJOVI (deep navy kaba blouse, hand-dyed indigo wrapper with tiny white wave motifs and flat leather sandals, three-strand amber bead necklace). Ama explains that elders hid papers inside what kept people safe. Mood: discovery and inheritance. Lighting: warm brass lantern light against deep blue night. Environment = Location Registry id 'AMA_LANTERN_WORKSHOP': Ama's lantern workshop off the compound courtyard: clay-red floor, crowded wooden workbench, brass lantern frames, blue glass panes, hand tools, coils of copper wire, indigo cloth and shafts of warm window light.",</w:t>
+        <w:t xml:space="preserve">  "prompt": "Grounded cinematic West African magical realism; contemporary Ghanaian coastal life; human-scale performances; saturated indigo, lagoon teal, clay red and warm amber palette; natural skin texture; tactile fabric and weathered wood; 16:9 landscape widescreen composition; subtle film grain; expressive realistic lighting. No written words, no logos, no watermark, no distorted hands, no duplicate people. Scene S07 — The Ledger in the Lantern. EXTREME CLOSE shot, intimate frontal angle. Characters in frame: @AMA_ADJOVI (deep navy kaba blouse, hand-dyed indigo wrapper with tiny white wave motifs and flat leather sandals, three-strand amber bead necklace). Ama explains that elders hid papers inside what kept people safe. Mood: discovery and inheritance. Lighting: warm brass lantern light against deep blue night. Environment = Location Registry id 'AMA_LANTERN_WORKSHOP': Ama's lantern workshop off the compound courtyard: clay-red floor, crowded wooden workbench, brass lantern frames, blue glass panes, hand tools, coils of copper wire, indigo cloth and shafts of warm window light.",</w:t>
         <w:br/>
         <w:t xml:space="preserve">  "status": "⬜",</w:t>
         <w:br/>
@@ -5324,7 +5324,7 @@
         <w:br/>
         <w:t xml:space="preserve">  ],</w:t>
         <w:br/>
-        <w:t xml:space="preserve">  "prompt": "Grounded cinematic West African magical realism; contemporary Ghanaian coastal life; human-scale performances; saturated indigo, lagoon teal, clay red and warm amber palette; natural skin texture; tactile fabric and weathered wood; 2.39:1 widescreen composition; subtle film grain; expressive realistic lighting. No written words, no logos, no watermark, no distorted hands, no duplicate people. Scene S07 — The Ledger in the Lantern. WIDE shot, low observational angle. Characters in frame: @KOSI_MENSAH (indigo utility jumpsuit with rolled sleeves, sand-coloured work boots and a narrow woven kente belt, small gold Adinkra-disc earrings); @AMA_ADJOVI (deep navy kaba blouse, hand-dyed indigo wrapper with tiny white wave motifs and flat leather sandals, three-strand amber bead necklace); @SENA_ADJOVI (mustard oversized hoodie, blue-and-white printed ankle skirt and worn white canvas trainers, turquoise over-ear radio headphones). Three generations stand among crowded lantern frames and copper wire. Mood: discovery and inheritance. Lighting: warm brass lantern light against deep blue night. Environment = Location Registry id 'AMA_LANTERN_WORKSHOP': Ama's lantern workshop off the compound courtyard: clay-red floor, crowded wooden workbench, brass lantern frames, blue glass panes, hand tools, coils of copper wire, indigo cloth and shafts of warm window light.",</w:t>
+        <w:t xml:space="preserve">  "prompt": "Grounded cinematic West African magical realism; contemporary Ghanaian coastal life; human-scale performances; saturated indigo, lagoon teal, clay red and warm amber palette; natural skin texture; tactile fabric and weathered wood; 16:9 landscape widescreen composition; subtle film grain; expressive realistic lighting. No written words, no logos, no watermark, no distorted hands, no duplicate people. Scene S07 — The Ledger in the Lantern. WIDE shot, low observational angle. Characters in frame: @KOSI_MENSAH (indigo utility jumpsuit with rolled sleeves, sand-coloured work boots and a narrow woven kente belt, small gold Adinkra-disc earrings); @AMA_ADJOVI (deep navy kaba blouse, hand-dyed indigo wrapper with tiny white wave motifs and flat leather sandals, three-strand amber bead necklace); @SENA_ADJOVI (mustard oversized hoodie, blue-and-white printed ankle skirt and worn white canvas trainers, turquoise over-ear radio headphones). Three generations stand among crowded lantern frames and copper wire. Mood: discovery and inheritance. Lighting: warm brass lantern light against deep blue night. Environment = Location Registry id 'AMA_LANTERN_WORKSHOP': Ama's lantern workshop off the compound courtyard: clay-red floor, crowded wooden workbench, brass lantern frames, blue glass panes, hand tools, coils of copper wire, indigo cloth and shafts of warm window light.",</w:t>
         <w:br/>
         <w:t xml:space="preserve">  "status": "⬜",</w:t>
         <w:br/>
@@ -5379,7 +5379,7 @@
         <w:br/>
         <w:t xml:space="preserve">  ],</w:t>
         <w:br/>
-        <w:t xml:space="preserve">  "prompt": "Grounded cinematic West African magical realism; contemporary Ghanaian coastal life; human-scale performances; saturated indigo, lagoon teal, clay red and warm amber palette; natural skin texture; tactile fabric and weathered wood; 2.39:1 widescreen composition; subtle film grain; expressive realistic lighting. No written words, no logos, no watermark, no distorted hands, no duplicate people. Scene S07 — The Ledger in the Lantern. MEDIUM shot, handheld eye-level. Characters in frame: @SENA_ADJOVI (mustard oversized hoodie, blue-and-white printed ankle skirt and worn white canvas trainers, turquoise over-ear radio headphones); @KOSI_MENSAH (indigo utility jumpsuit with rolled sleeves, sand-coloured work boots and a narrow woven kente belt, small gold Adinkra-disc earrings). Sena points from the coded waves to an old radio frequency in the ledger. Mood: discovery and inheritance. Lighting: warm brass lantern light against deep blue night. Environment = Location Registry id 'AMA_LANTERN_WORKSHOP': Ama's lantern workshop off the compound courtyard: clay-red floor, crowded wooden workbench, brass lantern frames, blue glass panes, hand tools, coils of copper wire, indigo cloth and shafts of warm window light.",</w:t>
+        <w:t xml:space="preserve">  "prompt": "Grounded cinematic West African magical realism; contemporary Ghanaian coastal life; human-scale performances; saturated indigo, lagoon teal, clay red and warm amber palette; natural skin texture; tactile fabric and weathered wood; 16:9 landscape widescreen composition; subtle film grain; expressive realistic lighting. No written words, no logos, no watermark, no distorted hands, no duplicate people. Scene S07 — The Ledger in the Lantern. MEDIUM shot, handheld eye-level. Characters in frame: @SENA_ADJOVI (mustard oversized hoodie, blue-and-white printed ankle skirt and worn white canvas trainers, turquoise over-ear radio headphones); @KOSI_MENSAH (indigo utility jumpsuit with rolled sleeves, sand-coloured work boots and a narrow woven kente belt, small gold Adinkra-disc earrings). Sena points from the coded waves to an old radio frequency in the ledger. Mood: discovery and inheritance. Lighting: warm brass lantern light against deep blue night. Environment = Location Registry id 'AMA_LANTERN_WORKSHOP': Ama's lantern workshop off the compound courtyard: clay-red floor, crowded wooden workbench, brass lantern frames, blue glass panes, hand tools, coils of copper wire, indigo cloth and shafts of warm window light.",</w:t>
         <w:br/>
         <w:t xml:space="preserve">  "status": "⬜",</w:t>
         <w:br/>
@@ -5438,7 +5438,7 @@
         <w:br/>
         <w:t xml:space="preserve">  ],</w:t>
         <w:br/>
-        <w:t xml:space="preserve">  "prompt": "Grounded cinematic West African magical realism; contemporary Ghanaian coastal life; human-scale performances; saturated indigo, lagoon teal, clay red and warm amber palette; natural skin texture; tactile fabric and weathered wood; 2.39:1 widescreen composition; subtle film grain; expressive realistic lighting. No written words, no logos, no watermark, no distorted hands, no duplicate people. Scene S07 — The Ledger in the Lantern. WIDE shot, rear closing tableau. Characters in frame: @KOSI_MENSAH (indigo utility jumpsuit with rolled sleeves, sand-coloured work boots and a narrow woven kente belt, small gold Adinkra-disc earrings); @AMA_ADJOVI (deep navy kaba blouse, hand-dyed indigo wrapper with tiny white wave motifs and flat leather sandals, three-strand amber bead necklace); @SENA_ADJOVI (mustard oversized hoodie, blue-and-white printed ankle skirt and worn white canvas trainers, turquoise over-ear radio headphones). The group makes a quiet pact beneath warm lantern light. Mood: discovery and inheritance. Lighting: warm brass lantern light against deep blue night. Environment = Location Registry id 'AMA_LANTERN_WORKSHOP': Ama's lantern workshop off the compound courtyard: clay-red floor, crowded wooden workbench, brass lantern frames, blue glass panes, hand tools, coils of copper wire, indigo cloth and shafts of warm window light.",</w:t>
+        <w:t xml:space="preserve">  "prompt": "Grounded cinematic West African magical realism; contemporary Ghanaian coastal life; human-scale performances; saturated indigo, lagoon teal, clay red and warm amber palette; natural skin texture; tactile fabric and weathered wood; 16:9 landscape widescreen composition; subtle film grain; expressive realistic lighting. No written words, no logos, no watermark, no distorted hands, no duplicate people. Scene S07 — The Ledger in the Lantern. WIDE shot, rear closing tableau. Characters in frame: @KOSI_MENSAH (indigo utility jumpsuit with rolled sleeves, sand-coloured work boots and a narrow woven kente belt, small gold Adinkra-disc earrings); @AMA_ADJOVI (deep navy kaba blouse, hand-dyed indigo wrapper with tiny white wave motifs and flat leather sandals, three-strand amber bead necklace); @SENA_ADJOVI (mustard oversized hoodie, blue-and-white printed ankle skirt and worn white canvas trainers, turquoise over-ear radio headphones). The group makes a quiet pact beneath warm lantern light. Mood: discovery and inheritance. Lighting: warm brass lantern light against deep blue night. Environment = Location Registry id 'AMA_LANTERN_WORKSHOP': Ama's lantern workshop off the compound courtyard: clay-red floor, crowded wooden workbench, brass lantern frames, blue glass panes, hand tools, coils of copper wire, indigo cloth and shafts of warm window light.",</w:t>
         <w:br/>
         <w:t xml:space="preserve">  "status": "⬜",</w:t>
         <w:br/>
@@ -5497,7 +5497,7 @@
         <w:br/>
         <w:t xml:space="preserve">  ],</w:t>
         <w:br/>
-        <w:t xml:space="preserve">  "prompt": "Grounded cinematic West African magical realism; contemporary Ghanaian coastal life; human-scale performances; saturated indigo, lagoon teal, clay red and warm amber palette; natural skin texture; tactile fabric and weathered wood; 2.39:1 widescreen composition; subtle film grain; expressive realistic lighting. No written words, no logos, no watermark, no distorted hands, no duplicate people. Scene S08 — Open Frequency. WIDE shot, high establishing angle. Characters in frame: @SENA_ADJOVI (mustard oversized hoodie, blue-and-white printed ankle skirt and worn white canvas trainers, turquoise over-ear radio headphones). Sena unlocks the tiny radio shack while morning brightens the market outside. Mood: improvised courage. Lighting: clean morning sun and small red recording lights. Environment = Location Registry id 'SENA_RADIO_SHACK': Sena's tiny community-radio shack beside the market: a patched corrugated roof, foam-lined timber walls, a second-hand mixing board, a battered microphone, tangled cables, a solar battery and one open window to the lagoon.",</w:t>
+        <w:t xml:space="preserve">  "prompt": "Grounded cinematic West African magical realism; contemporary Ghanaian coastal life; human-scale performances; saturated indigo, lagoon teal, clay red and warm amber palette; natural skin texture; tactile fabric and weathered wood; 16:9 landscape widescreen composition; subtle film grain; expressive realistic lighting. No written words, no logos, no watermark, no distorted hands, no duplicate people. Scene S08 — Open Frequency. WIDE shot, high establishing angle. Characters in frame: @SENA_ADJOVI (mustard oversized hoodie, blue-and-white printed ankle skirt and worn white canvas trainers, turquoise over-ear radio headphones). Sena unlocks the tiny radio shack while morning brightens the market outside. Mood: improvised courage. Lighting: clean morning sun and small red recording lights. Environment = Location Registry id 'SENA_RADIO_SHACK': Sena's tiny community-radio shack beside the market: a patched corrugated roof, foam-lined timber walls, a second-hand mixing board, a battered microphone, tangled cables, a solar battery and one open window to the lagoon.",</w:t>
         <w:br/>
         <w:t xml:space="preserve">  "status": "⬜",</w:t>
         <w:br/>
@@ -5548,7 +5548,7 @@
         <w:br/>
         <w:t xml:space="preserve">  ],</w:t>
         <w:br/>
-        <w:t xml:space="preserve">  "prompt": "Grounded cinematic West African magical realism; contemporary Ghanaian coastal life; human-scale performances; saturated indigo, lagoon teal, clay red and warm amber palette; natural skin texture; tactile fabric and weathered wood; 2.39:1 widescreen composition; subtle film grain; expressive realistic lighting. No written words, no logos, no watermark, no distorted hands, no duplicate people. Scene S08 — Open Frequency. MEDIUM shot, eye-level. Characters in frame: @KOSI_MENSAH (indigo utility jumpsuit with rolled sleeves, sand-coloured work boots and a narrow woven kente belt, small gold Adinkra-disc earrings). Kosi connects a temporary solar battery to the old mixing board. Mood: improvised courage. Lighting: clean morning sun and small red recording lights. Environment = Location Registry id 'SENA_RADIO_SHACK': Sena's tiny community-radio shack beside the market: a patched corrugated roof, foam-lined timber walls, a second-hand mixing board, a battered microphone, tangled cables, a solar battery and one open window to the lagoon.",</w:t>
+        <w:t xml:space="preserve">  "prompt": "Grounded cinematic West African magical realism; contemporary Ghanaian coastal life; human-scale performances; saturated indigo, lagoon teal, clay red and warm amber palette; natural skin texture; tactile fabric and weathered wood; 16:9 landscape widescreen composition; subtle film grain; expressive realistic lighting. No written words, no logos, no watermark, no distorted hands, no duplicate people. Scene S08 — Open Frequency. MEDIUM shot, eye-level. Characters in frame: @KOSI_MENSAH (indigo utility jumpsuit with rolled sleeves, sand-coloured work boots and a narrow woven kente belt, small gold Adinkra-disc earrings). Kosi connects a temporary solar battery to the old mixing board. Mood: improvised courage. Lighting: clean morning sun and small red recording lights. Environment = Location Registry id 'SENA_RADIO_SHACK': Sena's tiny community-radio shack beside the market: a patched corrugated roof, foam-lined timber walls, a second-hand mixing board, a battered microphone, tangled cables, a solar battery and one open window to the lagoon.",</w:t>
         <w:br/>
         <w:t xml:space="preserve">  "status": "⬜",</w:t>
         <w:br/>
@@ -5599,7 +5599,7 @@
         <w:br/>
         <w:t xml:space="preserve">  ],</w:t>
         <w:br/>
-        <w:t xml:space="preserve">  "prompt": "Grounded cinematic West African magical realism; contemporary Ghanaian coastal life; human-scale performances; saturated indigo, lagoon teal, clay red and warm amber palette; natural skin texture; tactile fabric and weathered wood; 2.39:1 widescreen composition; subtle film grain; expressive realistic lighting. No written words, no logos, no watermark, no distorted hands, no duplicate people. Scene S08 — Open Frequency. CLOSE shot, three-quarter profile. Characters in frame: @SENA_ADJOVI (mustard oversized hoodie, blue-and-white printed ankle skirt and worn white canvas trainers, turquoise over-ear radio headphones). Sena leans into the battered microphone for the station's first clear broadcast. Mood: improvised courage. Lighting: clean morning sun and small red recording lights. Environment = Location Registry id 'SENA_RADIO_SHACK': Sena's tiny community-radio shack beside the market: a patched corrugated roof, foam-lined timber walls, a second-hand mixing board, a battered microphone, tangled cables, a solar battery and one open window to the lagoon.",</w:t>
+        <w:t xml:space="preserve">  "prompt": "Grounded cinematic West African magical realism; contemporary Ghanaian coastal life; human-scale performances; saturated indigo, lagoon teal, clay red and warm amber palette; natural skin texture; tactile fabric and weathered wood; 16:9 landscape widescreen composition; subtle film grain; expressive realistic lighting. No written words, no logos, no watermark, no distorted hands, no duplicate people. Scene S08 — Open Frequency. CLOSE shot, three-quarter profile. Characters in frame: @SENA_ADJOVI (mustard oversized hoodie, blue-and-white printed ankle skirt and worn white canvas trainers, turquoise over-ear radio headphones). Sena leans into the battered microphone for the station's first clear broadcast. Mood: improvised courage. Lighting: clean morning sun and small red recording lights. Environment = Location Registry id 'SENA_RADIO_SHACK': Sena's tiny community-radio shack beside the market: a patched corrugated roof, foam-lined timber walls, a second-hand mixing board, a battered microphone, tangled cables, a solar battery and one open window to the lagoon.",</w:t>
         <w:br/>
         <w:t xml:space="preserve">  "status": "⬜",</w:t>
         <w:br/>
@@ -5650,7 +5650,7 @@
         <w:br/>
         <w:t xml:space="preserve">  ],</w:t>
         <w:br/>
-        <w:t xml:space="preserve">  "prompt": "Grounded cinematic West African magical realism; contemporary Ghanaian coastal life; human-scale performances; saturated indigo, lagoon teal, clay red and warm amber palette; natural skin texture; tactile fabric and weathered wood; 2.39:1 widescreen composition; subtle film grain; expressive realistic lighting. No written words, no logos, no watermark, no distorted hands, no duplicate people. Scene S08 — Open Frequency. INSERT shot, top-down detail. Characters in frame: @SENA_ADJOVI (mustard oversized hoodie, blue-and-white printed ankle skirt and worn white canvas trainers, turquoise over-ear radio headphones). Tiny red recording lights and moving level meters glow on the mixing board. Mood: improvised courage. Lighting: clean morning sun and small red recording lights. Environment = Location Registry id 'SENA_RADIO_SHACK': Sena's tiny community-radio shack beside the market: a patched corrugated roof, foam-lined timber walls, a second-hand mixing board, a battered microphone, tangled cables, a solar battery and one open window to the lagoon.",</w:t>
+        <w:t xml:space="preserve">  "prompt": "Grounded cinematic West African magical realism; contemporary Ghanaian coastal life; human-scale performances; saturated indigo, lagoon teal, clay red and warm amber palette; natural skin texture; tactile fabric and weathered wood; 16:9 landscape widescreen composition; subtle film grain; expressive realistic lighting. No written words, no logos, no watermark, no distorted hands, no duplicate people. Scene S08 — Open Frequency. INSERT shot, top-down detail. Characters in frame: @SENA_ADJOVI (mustard oversized hoodie, blue-and-white printed ankle skirt and worn white canvas trainers, turquoise over-ear radio headphones). Tiny red recording lights and moving level meters glow on the mixing board. Mood: improvised courage. Lighting: clean morning sun and small red recording lights. Environment = Location Registry id 'SENA_RADIO_SHACK': Sena's tiny community-radio shack beside the market: a patched corrugated roof, foam-lined timber walls, a second-hand mixing board, a battered microphone, tangled cables, a solar battery and one open window to the lagoon.",</w:t>
         <w:br/>
         <w:t xml:space="preserve">  "status": "⬜",</w:t>
         <w:br/>
@@ -5705,7 +5705,7 @@
         <w:br/>
         <w:t xml:space="preserve">  ],</w:t>
         <w:br/>
-        <w:t xml:space="preserve">  "prompt": "Grounded cinematic West African magical realism; contemporary Ghanaian coastal life; human-scale performances; saturated indigo, lagoon teal, clay red and warm amber palette; natural skin texture; tactile fabric and weathered wood; 2.39:1 widescreen composition; subtle film grain; expressive realistic lighting. No written words, no logos, no watermark, no distorted hands, no duplicate people. Scene S08 — Open Frequency. TWO-SHOT shot, eye-level. Characters in frame: @ESI_TETTEH (brick-red wax-print dress beneath a soot-black oilskin apron, patterned headwrap and sturdy black sandals, smooth charred-wood smoking paddle); @SENA_ADJOVI (mustard oversized hoodie, blue-and-white printed ankle skirt and worn white canvas trainers, turquoise over-ear radio headphones). Esi gives a fierce testimony into the microphone as Sena listens. Mood: improvised courage. Lighting: clean morning sun and small red recording lights. Environment = Location Registry id 'SENA_RADIO_SHACK': Sena's tiny community-radio shack beside the market: a patched corrugated roof, foam-lined timber walls, a second-hand mixing board, a battered microphone, tangled cables, a solar battery and one open window to the lagoon.",</w:t>
+        <w:t xml:space="preserve">  "prompt": "Grounded cinematic West African magical realism; contemporary Ghanaian coastal life; human-scale performances; saturated indigo, lagoon teal, clay red and warm amber palette; natural skin texture; tactile fabric and weathered wood; 16:9 landscape widescreen composition; subtle film grain; expressive realistic lighting. No written words, no logos, no watermark, no distorted hands, no duplicate people. Scene S08 — Open Frequency. TWO-SHOT shot, eye-level. Characters in frame: @ESI_TETTEH (brick-red wax-print dress beneath a soot-black oilskin apron, patterned headwrap and sturdy black sandals, smooth charred-wood smoking paddle); @SENA_ADJOVI (mustard oversized hoodie, blue-and-white printed ankle skirt and worn white canvas trainers, turquoise over-ear radio headphones). Esi gives a fierce testimony into the microphone as Sena listens. Mood: improvised courage. Lighting: clean morning sun and small red recording lights. Environment = Location Registry id 'SENA_RADIO_SHACK': Sena's tiny community-radio shack beside the market: a patched corrugated roof, foam-lined timber walls, a second-hand mixing board, a battered microphone, tangled cables, a solar battery and one open window to the lagoon.",</w:t>
         <w:br/>
         <w:t xml:space="preserve">  "status": "⬜",</w:t>
         <w:br/>
@@ -5760,7 +5760,7 @@
         <w:br/>
         <w:t xml:space="preserve">  ],</w:t>
         <w:br/>
-        <w:t xml:space="preserve">  "prompt": "Grounded cinematic West African magical realism; contemporary Ghanaian coastal life; human-scale performances; saturated indigo, lagoon teal, clay red and warm amber palette; natural skin texture; tactile fabric and weathered wood; 2.39:1 widescreen composition; subtle film grain; expressive realistic lighting. No written words, no logos, no watermark, no distorted hands, no duplicate people. Scene S08 — Open Frequency. OVER-SHOULDER shot, over the lead character's shoulder. Characters in frame: @KOSI_MENSAH (indigo utility jumpsuit with rolled sleeves, sand-coloured work boots and a narrow woven kente belt, small gold Adinkra-disc earrings); @SENA_ADJOVI (mustard oversized hoodie, blue-and-white printed ankle skirt and worn white canvas trainers, turquoise over-ear radio headphones). Over Sena's shoulder, Kosi urges caution until they have proof. Mood: improvised courage. Lighting: clean morning sun and small red recording lights. Environment = Location Registry id 'SENA_RADIO_SHACK': Sena's tiny community-radio shack beside the market: a patched corrugated roof, foam-lined timber walls, a second-hand mixing board, a battered microphone, tangled cables, a solar battery and one open window to the lagoon.",</w:t>
+        <w:t xml:space="preserve">  "prompt": "Grounded cinematic West African magical realism; contemporary Ghanaian coastal life; human-scale performances; saturated indigo, lagoon teal, clay red and warm amber palette; natural skin texture; tactile fabric and weathered wood; 16:9 landscape widescreen composition; subtle film grain; expressive realistic lighting. No written words, no logos, no watermark, no distorted hands, no duplicate people. Scene S08 — Open Frequency. OVER-SHOULDER shot, over the lead character's shoulder. Characters in frame: @KOSI_MENSAH (indigo utility jumpsuit with rolled sleeves, sand-coloured work boots and a narrow woven kente belt, small gold Adinkra-disc earrings); @SENA_ADJOVI (mustard oversized hoodie, blue-and-white printed ankle skirt and worn white canvas trainers, turquoise over-ear radio headphones). Over Sena's shoulder, Kosi urges caution until they have proof. Mood: improvised courage. Lighting: clean morning sun and small red recording lights. Environment = Location Registry id 'SENA_RADIO_SHACK': Sena's tiny community-radio shack beside the market: a patched corrugated roof, foam-lined timber walls, a second-hand mixing board, a battered microphone, tangled cables, a solar battery and one open window to the lagoon.",</w:t>
         <w:br/>
         <w:t xml:space="preserve">  "status": "⬜",</w:t>
         <w:br/>
@@ -5811,7 +5811,7 @@
         <w:br/>
         <w:t xml:space="preserve">  ],</w:t>
         <w:br/>
-        <w:t xml:space="preserve">  "prompt": "Grounded cinematic West African magical realism; contemporary Ghanaian coastal life; human-scale performances; saturated indigo, lagoon teal, clay red and warm amber palette; natural skin texture; tactile fabric and weathered wood; 2.39:1 widescreen composition; subtle film grain; expressive realistic lighting. No written words, no logos, no watermark, no distorted hands, no duplicate people. Scene S08 — Open Frequency. EXTREME CLOSE shot, intimate frontal angle. Characters in frame: @SENA_ADJOVI (mustard oversized hoodie, blue-and-white printed ankle skirt and worn white canvas trainers, turquoise over-ear radio headphones). Sena answers that fear itself has a voice that deserves air. Mood: improvised courage. Lighting: clean morning sun and small red recording lights. Environment = Location Registry id 'SENA_RADIO_SHACK': Sena's tiny community-radio shack beside the market: a patched corrugated roof, foam-lined timber walls, a second-hand mixing board, a battered microphone, tangled cables, a solar battery and one open window to the lagoon.",</w:t>
+        <w:t xml:space="preserve">  "prompt": "Grounded cinematic West African magical realism; contemporary Ghanaian coastal life; human-scale performances; saturated indigo, lagoon teal, clay red and warm amber palette; natural skin texture; tactile fabric and weathered wood; 16:9 landscape widescreen composition; subtle film grain; expressive realistic lighting. No written words, no logos, no watermark, no distorted hands, no duplicate people. Scene S08 — Open Frequency. EXTREME CLOSE shot, intimate frontal angle. Characters in frame: @SENA_ADJOVI (mustard oversized hoodie, blue-and-white printed ankle skirt and worn white canvas trainers, turquoise over-ear radio headphones). Sena answers that fear itself has a voice that deserves air. Mood: improvised courage. Lighting: clean morning sun and small red recording lights. Environment = Location Registry id 'SENA_RADIO_SHACK': Sena's tiny community-radio shack beside the market: a patched corrugated roof, foam-lined timber walls, a second-hand mixing board, a battered microphone, tangled cables, a solar battery and one open window to the lagoon.",</w:t>
         <w:br/>
         <w:t xml:space="preserve">  "status": "⬜",</w:t>
         <w:br/>
@@ -5870,7 +5870,7 @@
         <w:br/>
         <w:t xml:space="preserve">  ],</w:t>
         <w:br/>
-        <w:t xml:space="preserve">  "prompt": "Grounded cinematic West African magical realism; contemporary Ghanaian coastal life; human-scale performances; saturated indigo, lagoon teal, clay red and warm amber palette; natural skin texture; tactile fabric and weathered wood; 2.39:1 widescreen composition; subtle film grain; expressive realistic lighting. No written words, no logos, no watermark, no distorted hands, no duplicate people. Scene S08 — Open Frequency. WIDE shot, low observational angle. Characters in frame: @SENA_ADJOVI (mustard oversized hoodie, blue-and-white printed ankle skirt and worn white canvas trainers, turquoise over-ear radio headphones); @KOSI_MENSAH (indigo utility jumpsuit with rolled sleeves, sand-coloured work boots and a narrow woven kente belt, small gold Adinkra-disc earrings); @ESI_TETTEH (brick-red wax-print dress beneath a soot-black oilskin apron, patterned headwrap and sturdy black sandals, smooth charred-wood smoking paddle). The cramped shack fills with ringing phones and a growing sense of listeners. Mood: improvised courage. Lighting: clean morning sun and small red recording lights. Environment = Location Registry id 'SENA_RADIO_SHACK': Sena's tiny community-radio shack beside the market: a patched corrugated roof, foam-lined timber walls, a second-hand mixing board, a battered microphone, tangled cables, a solar battery and one open window to the lagoon.",</w:t>
+        <w:t xml:space="preserve">  "prompt": "Grounded cinematic West African magical realism; contemporary Ghanaian coastal life; human-scale performances; saturated indigo, lagoon teal, clay red and warm amber palette; natural skin texture; tactile fabric and weathered wood; 16:9 landscape widescreen composition; subtle film grain; expressive realistic lighting. No written words, no logos, no watermark, no distorted hands, no duplicate people. Scene S08 — Open Frequency. WIDE shot, low observational angle. Characters in frame: @SENA_ADJOVI (mustard oversized hoodie, blue-and-white printed ankle skirt and worn white canvas trainers, turquoise over-ear radio headphones); @KOSI_MENSAH (indigo utility jumpsuit with rolled sleeves, sand-coloured work boots and a narrow woven kente belt, small gold Adinkra-disc earrings); @ESI_TETTEH (brick-red wax-print dress beneath a soot-black oilskin apron, patterned headwrap and sturdy black sandals, smooth charred-wood smoking paddle). The cramped shack fills with ringing phones and a growing sense of listeners. Mood: improvised courage. Lighting: clean morning sun and small red recording lights. Environment = Location Registry id 'SENA_RADIO_SHACK': Sena's tiny community-radio shack beside the market: a patched corrugated roof, foam-lined timber walls, a second-hand mixing board, a battered microphone, tangled cables, a solar battery and one open window to the lagoon.",</w:t>
         <w:br/>
         <w:t xml:space="preserve">  "status": "⬜",</w:t>
         <w:br/>
@@ -5925,7 +5925,7 @@
         <w:br/>
         <w:t xml:space="preserve">  ],</w:t>
         <w:br/>
-        <w:t xml:space="preserve">  "prompt": "Grounded cinematic West African magical realism; contemporary Ghanaian coastal life; human-scale performances; saturated indigo, lagoon teal, clay red and warm amber palette; natural skin texture; tactile fabric and weathered wood; 2.39:1 widescreen composition; subtle film grain; expressive realistic lighting. No written words, no logos, no watermark, no distorted hands, no duplicate people. Scene S08 — Open Frequency. MEDIUM shot, handheld eye-level. Characters in frame: @KOSI_MENSAH (indigo utility jumpsuit with rolled sleeves, sand-coloured work boots and a narrow woven kente belt, small gold Adinkra-disc earrings); @SENA_ADJOVI (mustard oversized hoodie, blue-and-white printed ankle skirt and worn white canvas trainers, turquoise over-ear radio headphones). Sena places the microphone between herself and Kosi. Mood: improvised courage. Lighting: clean morning sun and small red recording lights. Environment = Location Registry id 'SENA_RADIO_SHACK': Sena's tiny community-radio shack beside the market: a patched corrugated roof, foam-lined timber walls, a second-hand mixing board, a battered microphone, tangled cables, a solar battery and one open window to the lagoon.",</w:t>
+        <w:t xml:space="preserve">  "prompt": "Grounded cinematic West African magical realism; contemporary Ghanaian coastal life; human-scale performances; saturated indigo, lagoon teal, clay red and warm amber palette; natural skin texture; tactile fabric and weathered wood; 16:9 landscape widescreen composition; subtle film grain; expressive realistic lighting. No written words, no logos, no watermark, no distorted hands, no duplicate people. Scene S08 — Open Frequency. MEDIUM shot, handheld eye-level. Characters in frame: @KOSI_MENSAH (indigo utility jumpsuit with rolled sleeves, sand-coloured work boots and a narrow woven kente belt, small gold Adinkra-disc earrings); @SENA_ADJOVI (mustard oversized hoodie, blue-and-white printed ankle skirt and worn white canvas trainers, turquoise over-ear radio headphones). Sena places the microphone between herself and Kosi. Mood: improvised courage. Lighting: clean morning sun and small red recording lights. Environment = Location Registry id 'SENA_RADIO_SHACK': Sena's tiny community-radio shack beside the market: a patched corrugated roof, foam-lined timber walls, a second-hand mixing board, a battered microphone, tangled cables, a solar battery and one open window to the lagoon.",</w:t>
         <w:br/>
         <w:t xml:space="preserve">  "status": "⬜",</w:t>
         <w:br/>
@@ -5976,7 +5976,7 @@
         <w:br/>
         <w:t xml:space="preserve">  ],</w:t>
         <w:br/>
-        <w:t xml:space="preserve">  "prompt": "Grounded cinematic West African magical realism; contemporary Ghanaian coastal life; human-scale performances; saturated indigo, lagoon teal, clay red and warm amber palette; natural skin texture; tactile fabric and weathered wood; 2.39:1 widescreen composition; subtle film grain; expressive realistic lighting. No written words, no logos, no watermark, no distorted hands, no duplicate people. Scene S08 — Open Frequency. WIDE shot, rear closing tableau. Characters in frame: @SENA_ADJOVI (mustard oversized hoodie, blue-and-white printed ankle skirt and worn white canvas trainers, turquoise over-ear radio headphones). The radio antenna points through the open window toward bright lagoon water. Mood: improvised courage. Lighting: clean morning sun and small red recording lights. Environment = Location Registry id 'SENA_RADIO_SHACK': Sena's tiny community-radio shack beside the market: a patched corrugated roof, foam-lined timber walls, a second-hand mixing board, a battered microphone, tangled cables, a solar battery and one open window to the lagoon.",</w:t>
+        <w:t xml:space="preserve">  "prompt": "Grounded cinematic West African magical realism; contemporary Ghanaian coastal life; human-scale performances; saturated indigo, lagoon teal, clay red and warm amber palette; natural skin texture; tactile fabric and weathered wood; 16:9 landscape widescreen composition; subtle film grain; expressive realistic lighting. No written words, no logos, no watermark, no distorted hands, no duplicate people. Scene S08 — Open Frequency. WIDE shot, rear closing tableau. Characters in frame: @SENA_ADJOVI (mustard oversized hoodie, blue-and-white printed ankle skirt and worn white canvas trainers, turquoise over-ear radio headphones). The radio antenna points through the open window toward bright lagoon water. Mood: improvised courage. Lighting: clean morning sun and small red recording lights. Environment = Location Registry id 'SENA_RADIO_SHACK': Sena's tiny community-radio shack beside the market: a patched corrugated roof, foam-lined timber walls, a second-hand mixing board, a battered microphone, tangled cables, a solar battery and one open window to the lagoon.",</w:t>
         <w:br/>
         <w:t xml:space="preserve">  "status": "⬜",</w:t>
         <w:br/>
@@ -6035,7 +6035,7 @@
         <w:br/>
         <w:t xml:space="preserve">  ],</w:t>
         <w:br/>
-        <w:t xml:space="preserve">  "prompt": "Grounded cinematic West African magical realism; contemporary Ghanaian coastal life; human-scale performances; saturated indigo, lagoon teal, clay red and warm amber palette; natural skin texture; tactile fabric and weathered wood; 2.39:1 widescreen composition; subtle film grain; expressive realistic lighting. No written words, no logos, no watermark, no distorted hands, no duplicate people. Scene S09 — Map with a Missing Line. WIDE shot, high establishing angle. Characters in frame: @KWAME_AGYEMAN (white linen shirt under a caramel lightweight field jacket, dark tailored trousers and brown loafers, antique bronze lapel pin shaped like a compass rose). Kwame waits alone at the chained resort gate in punishing afternoon heat. Mood: charged old friendship. Lighting: bleached afternoon heat and hard fence shadows. Environment = Location Registry id 'RESORT_FENCE': The unfinished resort perimeter at Afenyo's lagoon shore: pale concrete columns, tall corrugated-metal fence panels, orange survey flags, a locked chain gate, scraped sand and mangroves pressed tightly behind it.",</w:t>
+        <w:t xml:space="preserve">  "prompt": "Grounded cinematic West African magical realism; contemporary Ghanaian coastal life; human-scale performances; saturated indigo, lagoon teal, clay red and warm amber palette; natural skin texture; tactile fabric and weathered wood; 16:9 landscape widescreen composition; subtle film grain; expressive realistic lighting. No written words, no logos, no watermark, no distorted hands, no duplicate people. Scene S09 — Map with a Missing Line. WIDE shot, high establishing angle. Characters in frame: @KWAME_AGYEMAN (white linen shirt under a caramel lightweight field jacket, dark tailored trousers and brown loafers, antique bronze lapel pin shaped like a compass rose). Kwame waits alone at the chained resort gate in punishing afternoon heat. Mood: charged old friendship. Lighting: bleached afternoon heat and hard fence shadows. Environment = Location Registry id 'RESORT_FENCE': The unfinished resort perimeter at Afenyo's lagoon shore: pale concrete columns, tall corrugated-metal fence panels, orange survey flags, a locked chain gate, scraped sand and mangroves pressed tightly behind it.",</w:t>
         <w:br/>
         <w:t xml:space="preserve">  "status": "⬜",</w:t>
         <w:br/>
@@ -6086,7 +6086,7 @@
         <w:br/>
         <w:t xml:space="preserve">  ],</w:t>
         <w:br/>
-        <w:t xml:space="preserve">  "prompt": "Grounded cinematic West African magical realism; contemporary Ghanaian coastal life; human-scale performances; saturated indigo, lagoon teal, clay red and warm amber palette; natural skin texture; tactile fabric and weathered wood; 2.39:1 widescreen composition; subtle film grain; expressive realistic lighting. No written words, no logos, no watermark, no distorted hands, no duplicate people. Scene S09 — Map with a Missing Line. MEDIUM shot, eye-level. Characters in frame: @KOSI_MENSAH (indigo utility jumpsuit with rolled sleeves, sand-coloured work boots and a narrow woven kente belt, small gold Adinkra-disc earrings). Kosi approaches the fence with her tool case and an unblinking stare. Mood: charged old friendship. Lighting: bleached afternoon heat and hard fence shadows. Environment = Location Registry id 'RESORT_FENCE': The unfinished resort perimeter at Afenyo's lagoon shore: pale concrete columns, tall corrugated-metal fence panels, orange survey flags, a locked chain gate, scraped sand and mangroves pressed tightly behind it.",</w:t>
+        <w:t xml:space="preserve">  "prompt": "Grounded cinematic West African magical realism; contemporary Ghanaian coastal life; human-scale performances; saturated indigo, lagoon teal, clay red and warm amber palette; natural skin texture; tactile fabric and weathered wood; 16:9 landscape widescreen composition; subtle film grain; expressive realistic lighting. No written words, no logos, no watermark, no distorted hands, no duplicate people. Scene S09 — Map with a Missing Line. MEDIUM shot, eye-level. Characters in frame: @KOSI_MENSAH (indigo utility jumpsuit with rolled sleeves, sand-coloured work boots and a narrow woven kente belt, small gold Adinkra-disc earrings). Kosi approaches the fence with her tool case and an unblinking stare. Mood: charged old friendship. Lighting: bleached afternoon heat and hard fence shadows. Environment = Location Registry id 'RESORT_FENCE': The unfinished resort perimeter at Afenyo's lagoon shore: pale concrete columns, tall corrugated-metal fence panels, orange survey flags, a locked chain gate, scraped sand and mangroves pressed tightly behind it.",</w:t>
         <w:br/>
         <w:t xml:space="preserve">  "status": "⬜",</w:t>
         <w:br/>
@@ -6137,7 +6137,7 @@
         <w:br/>
         <w:t xml:space="preserve">  ],</w:t>
         <w:br/>
-        <w:t xml:space="preserve">  "prompt": "Grounded cinematic West African magical realism; contemporary Ghanaian coastal life; human-scale performances; saturated indigo, lagoon teal, clay red and warm amber palette; natural skin texture; tactile fabric and weathered wood; 2.39:1 widescreen composition; subtle film grain; expressive realistic lighting. No written words, no logos, no watermark, no distorted hands, no duplicate people. Scene S09 — Map with a Missing Line. CLOSE shot, three-quarter profile. Characters in frame: @KWAME_AGYEMAN (white linen shirt under a caramel lightweight field jacket, dark tailored trousers and brown loafers, antique bronze lapel pin shaped like a compass rose). Kwame unfolds an approved site plan against a corrugated fence panel. Mood: charged old friendship. Lighting: bleached afternoon heat and hard fence shadows. Environment = Location Registry id 'RESORT_FENCE': The unfinished resort perimeter at Afenyo's lagoon shore: pale concrete columns, tall corrugated-metal fence panels, orange survey flags, a locked chain gate, scraped sand and mangroves pressed tightly behind it.",</w:t>
+        <w:t xml:space="preserve">  "prompt": "Grounded cinematic West African magical realism; contemporary Ghanaian coastal life; human-scale performances; saturated indigo, lagoon teal, clay red and warm amber palette; natural skin texture; tactile fabric and weathered wood; 16:9 landscape widescreen composition; subtle film grain; expressive realistic lighting. No written words, no logos, no watermark, no distorted hands, no duplicate people. Scene S09 — Map with a Missing Line. CLOSE shot, three-quarter profile. Characters in frame: @KWAME_AGYEMAN (white linen shirt under a caramel lightweight field jacket, dark tailored trousers and brown loafers, antique bronze lapel pin shaped like a compass rose). Kwame unfolds an approved site plan against a corrugated fence panel. Mood: charged old friendship. Lighting: bleached afternoon heat and hard fence shadows. Environment = Location Registry id 'RESORT_FENCE': The unfinished resort perimeter at Afenyo's lagoon shore: pale concrete columns, tall corrugated-metal fence panels, orange survey flags, a locked chain gate, scraped sand and mangroves pressed tightly behind it.",</w:t>
         <w:br/>
         <w:t xml:space="preserve">  "status": "⬜",</w:t>
         <w:br/>
@@ -6188,7 +6188,7 @@
         <w:br/>
         <w:t xml:space="preserve">  ],</w:t>
         <w:br/>
-        <w:t xml:space="preserve">  "prompt": "Grounded cinematic West African magical realism; contemporary Ghanaian coastal life; human-scale performances; saturated indigo, lagoon teal, clay red and warm amber palette; natural skin texture; tactile fabric and weathered wood; 2.39:1 widescreen composition; subtle film grain; expressive realistic lighting. No written words, no logos, no watermark, no distorted hands, no duplicate people. Scene S09 — Map with a Missing Line. INSERT shot, top-down detail. Characters in frame: @KWAME_AGYEMAN (white linen shirt under a caramel lightweight field jacket, dark tailored trousers and brown loafers, antique bronze lapel pin shaped like a compass rose). A utility route disappears under a stark black redaction on the plan. Mood: charged old friendship. Lighting: bleached afternoon heat and hard fence shadows. Environment = Location Registry id 'RESORT_FENCE': The unfinished resort perimeter at Afenyo's lagoon shore: pale concrete columns, tall corrugated-metal fence panels, orange survey flags, a locked chain gate, scraped sand and mangroves pressed tightly behind it.",</w:t>
+        <w:t xml:space="preserve">  "prompt": "Grounded cinematic West African magical realism; contemporary Ghanaian coastal life; human-scale performances; saturated indigo, lagoon teal, clay red and warm amber palette; natural skin texture; tactile fabric and weathered wood; 16:9 landscape widescreen composition; subtle film grain; expressive realistic lighting. No written words, no logos, no watermark, no distorted hands, no duplicate people. Scene S09 — Map with a Missing Line. INSERT shot, top-down detail. Characters in frame: @KWAME_AGYEMAN (white linen shirt under a caramel lightweight field jacket, dark tailored trousers and brown loafers, antique bronze lapel pin shaped like a compass rose). A utility route disappears under a stark black redaction on the plan. Mood: charged old friendship. Lighting: bleached afternoon heat and hard fence shadows. Environment = Location Registry id 'RESORT_FENCE': The unfinished resort perimeter at Afenyo's lagoon shore: pale concrete columns, tall corrugated-metal fence panels, orange survey flags, a locked chain gate, scraped sand and mangroves pressed tightly behind it.",</w:t>
         <w:br/>
         <w:t xml:space="preserve">  "status": "⬜",</w:t>
         <w:br/>
@@ -6243,7 +6243,7 @@
         <w:br/>
         <w:t xml:space="preserve">  ],</w:t>
         <w:br/>
-        <w:t xml:space="preserve">  "prompt": "Grounded cinematic West African magical realism; contemporary Ghanaian coastal life; human-scale performances; saturated indigo, lagoon teal, clay red and warm amber palette; natural skin texture; tactile fabric and weathered wood; 2.39:1 widescreen composition; subtle film grain; expressive realistic lighting. No written words, no logos, no watermark, no distorted hands, no duplicate people. Scene S09 — Map with a Missing Line. TWO-SHOT shot, eye-level. Characters in frame: @KOSI_MENSAH (indigo utility jumpsuit with rolled sleeves, sand-coloured work boots and a narrow woven kente belt, small gold Adinkra-disc earrings); @KWAME_AGYEMAN (white linen shirt under a caramel lightweight field jacket, dark tailored trousers and brown loafers, antique bronze lapel pin shaped like a compass rose). Kosi and Kwame face each other with the locked gate between them. Mood: charged old friendship. Lighting: bleached afternoon heat and hard fence shadows. Environment = Location Registry id 'RESORT_FENCE': The unfinished resort perimeter at Afenyo's lagoon shore: pale concrete columns, tall corrugated-metal fence panels, orange survey flags, a locked chain gate, scraped sand and mangroves pressed tightly behind it.",</w:t>
+        <w:t xml:space="preserve">  "prompt": "Grounded cinematic West African magical realism; contemporary Ghanaian coastal life; human-scale performances; saturated indigo, lagoon teal, clay red and warm amber palette; natural skin texture; tactile fabric and weathered wood; 16:9 landscape widescreen composition; subtle film grain; expressive realistic lighting. No written words, no logos, no watermark, no distorted hands, no duplicate people. Scene S09 — Map with a Missing Line. TWO-SHOT shot, eye-level. Characters in frame: @KOSI_MENSAH (indigo utility jumpsuit with rolled sleeves, sand-coloured work boots and a narrow woven kente belt, small gold Adinkra-disc earrings); @KWAME_AGYEMAN (white linen shirt under a caramel lightweight field jacket, dark tailored trousers and brown loafers, antique bronze lapel pin shaped like a compass rose). Kosi and Kwame face each other with the locked gate between them. Mood: charged old friendship. Lighting: bleached afternoon heat and hard fence shadows. Environment = Location Registry id 'RESORT_FENCE': The unfinished resort perimeter at Afenyo's lagoon shore: pale concrete columns, tall corrugated-metal fence panels, orange survey flags, a locked chain gate, scraped sand and mangroves pressed tightly behind it.",</w:t>
         <w:br/>
         <w:t xml:space="preserve">  "status": "⬜",</w:t>
         <w:br/>
@@ -6298,7 +6298,7 @@
         <w:br/>
         <w:t xml:space="preserve">  ],</w:t>
         <w:br/>
-        <w:t xml:space="preserve">  "prompt": "Grounded cinematic West African magical realism; contemporary Ghanaian coastal life; human-scale performances; saturated indigo, lagoon teal, clay red and warm amber palette; natural skin texture; tactile fabric and weathered wood; 2.39:1 widescreen composition; subtle film grain; expressive realistic lighting. No written words, no logos, no watermark, no distorted hands, no duplicate people. Scene S09 — Map with a Missing Line. OVER-SHOULDER shot, over the lead character's shoulder. Characters in frame: @KOSI_MENSAH (indigo utility jumpsuit with rolled sleeves, sand-coloured work boots and a narrow woven kente belt, small gold Adinkra-disc earrings); @KWAME_AGYEMAN (white linen shirt under a caramel lightweight field jacket, dark tailored trousers and brown loafers, antique bronze lapel pin shaped like a compass rose). Over Kosi's shoulder, Kwame admits he is excluded from the discharge route. Mood: charged old friendship. Lighting: bleached afternoon heat and hard fence shadows. Environment = Location Registry id 'RESORT_FENCE': The unfinished resort perimeter at Afenyo's lagoon shore: pale concrete columns, tall corrugated-metal fence panels, orange survey flags, a locked chain gate, scraped sand and mangroves pressed tightly behind it.",</w:t>
+        <w:t xml:space="preserve">  "prompt": "Grounded cinematic West African magical realism; contemporary Ghanaian coastal life; human-scale performances; saturated indigo, lagoon teal, clay red and warm amber palette; natural skin texture; tactile fabric and weathered wood; 16:9 landscape widescreen composition; subtle film grain; expressive realistic lighting. No written words, no logos, no watermark, no distorted hands, no duplicate people. Scene S09 — Map with a Missing Line. OVER-SHOULDER shot, over the lead character's shoulder. Characters in frame: @KOSI_MENSAH (indigo utility jumpsuit with rolled sleeves, sand-coloured work boots and a narrow woven kente belt, small gold Adinkra-disc earrings); @KWAME_AGYEMAN (white linen shirt under a caramel lightweight field jacket, dark tailored trousers and brown loafers, antique bronze lapel pin shaped like a compass rose). Over Kosi's shoulder, Kwame admits he is excluded from the discharge route. Mood: charged old friendship. Lighting: bleached afternoon heat and hard fence shadows. Environment = Location Registry id 'RESORT_FENCE': The unfinished resort perimeter at Afenyo's lagoon shore: pale concrete columns, tall corrugated-metal fence panels, orange survey flags, a locked chain gate, scraped sand and mangroves pressed tightly behind it.",</w:t>
         <w:br/>
         <w:t xml:space="preserve">  "status": "⬜",</w:t>
         <w:br/>
@@ -6349,7 +6349,7 @@
         <w:br/>
         <w:t xml:space="preserve">  ],</w:t>
         <w:br/>
-        <w:t xml:space="preserve">  "prompt": "Grounded cinematic West African magical realism; contemporary Ghanaian coastal life; human-scale performances; saturated indigo, lagoon teal, clay red and warm amber palette; natural skin texture; tactile fabric and weathered wood; 2.39:1 widescreen composition; subtle film grain; expressive realistic lighting. No written words, no logos, no watermark, no distorted hands, no duplicate people. Scene S09 — Map with a Missing Line. EXTREME CLOSE shot, intimate frontal angle. Characters in frame: @KWAME_AGYEMAN (white linen shirt under a caramel lightweight field jacket, dark tailored trousers and brown loafers, antique bronze lapel pin shaped like a compass rose). Kwame's eyes drop behind rimless spectacles as Kosi names his compromise. Mood: charged old friendship. Lighting: bleached afternoon heat and hard fence shadows. Environment = Location Registry id 'RESORT_FENCE': The unfinished resort perimeter at Afenyo's lagoon shore: pale concrete columns, tall corrugated-metal fence panels, orange survey flags, a locked chain gate, scraped sand and mangroves pressed tightly behind it.",</w:t>
+        <w:t xml:space="preserve">  "prompt": "Grounded cinematic West African magical realism; contemporary Ghanaian coastal life; human-scale performances; saturated indigo, lagoon teal, clay red and warm amber palette; natural skin texture; tactile fabric and weathered wood; 16:9 landscape widescreen composition; subtle film grain; expressive realistic lighting. No written words, no logos, no watermark, no distorted hands, no duplicate people. Scene S09 — Map with a Missing Line. EXTREME CLOSE shot, intimate frontal angle. Characters in frame: @KWAME_AGYEMAN (white linen shirt under a caramel lightweight field jacket, dark tailored trousers and brown loafers, antique bronze lapel pin shaped like a compass rose). Kwame's eyes drop behind rimless spectacles as Kosi names his compromise. Mood: charged old friendship. Lighting: bleached afternoon heat and hard fence shadows. Environment = Location Registry id 'RESORT_FENCE': The unfinished resort perimeter at Afenyo's lagoon shore: pale concrete columns, tall corrugated-metal fence panels, orange survey flags, a locked chain gate, scraped sand and mangroves pressed tightly behind it.",</w:t>
         <w:br/>
         <w:t xml:space="preserve">  "status": "⬜",</w:t>
         <w:br/>
@@ -6404,7 +6404,7 @@
         <w:br/>
         <w:t xml:space="preserve">  ],</w:t>
         <w:br/>
-        <w:t xml:space="preserve">  "prompt": "Grounded cinematic West African magical realism; contemporary Ghanaian coastal life; human-scale performances; saturated indigo, lagoon teal, clay red and warm amber palette; natural skin texture; tactile fabric and weathered wood; 2.39:1 widescreen composition; subtle film grain; expressive realistic lighting. No written words, no logos, no watermark, no distorted hands, no duplicate people. Scene S09 — Map with a Missing Line. WIDE shot, low observational angle. Characters in frame: @KOSI_MENSAH (indigo utility jumpsuit with rolled sleeves, sand-coloured work boots and a narrow woven kente belt, small gold Adinkra-disc earrings); @KWAME_AGYEMAN (white linen shirt under a caramel lightweight field jacket, dark tailored trousers and brown loafers, antique bronze lapel pin shaped like a compass rose). Hard shadows of the fence divide the two former friends. Mood: charged old friendship. Lighting: bleached afternoon heat and hard fence shadows. Environment = Location Registry id 'RESORT_FENCE': The unfinished resort perimeter at Afenyo's lagoon shore: pale concrete columns, tall corrugated-metal fence panels, orange survey flags, a locked chain gate, scraped sand and mangroves pressed tightly behind it.",</w:t>
+        <w:t xml:space="preserve">  "prompt": "Grounded cinematic West African magical realism; contemporary Ghanaian coastal life; human-scale performances; saturated indigo, lagoon teal, clay red and warm amber palette; natural skin texture; tactile fabric and weathered wood; 16:9 landscape widescreen composition; subtle film grain; expressive realistic lighting. No written words, no logos, no watermark, no distorted hands, no duplicate people. Scene S09 — Map with a Missing Line. WIDE shot, low observational angle. Characters in frame: @KOSI_MENSAH (indigo utility jumpsuit with rolled sleeves, sand-coloured work boots and a narrow woven kente belt, small gold Adinkra-disc earrings); @KWAME_AGYEMAN (white linen shirt under a caramel lightweight field jacket, dark tailored trousers and brown loafers, antique bronze lapel pin shaped like a compass rose). Hard shadows of the fence divide the two former friends. Mood: charged old friendship. Lighting: bleached afternoon heat and hard fence shadows. Environment = Location Registry id 'RESORT_FENCE': The unfinished resort perimeter at Afenyo's lagoon shore: pale concrete columns, tall corrugated-metal fence panels, orange survey flags, a locked chain gate, scraped sand and mangroves pressed tightly behind it.",</w:t>
         <w:br/>
         <w:t xml:space="preserve">  "status": "⬜",</w:t>
         <w:br/>
@@ -6459,7 +6459,7 @@
         <w:br/>
         <w:t xml:space="preserve">  ],</w:t>
         <w:br/>
-        <w:t xml:space="preserve">  "prompt": "Grounded cinematic West African magical realism; contemporary Ghanaian coastal life; human-scale performances; saturated indigo, lagoon teal, clay red and warm amber palette; natural skin texture; tactile fabric and weathered wood; 2.39:1 widescreen composition; subtle film grain; expressive realistic lighting. No written words, no logos, no watermark, no distorted hands, no duplicate people. Scene S09 — Map with a Missing Line. MEDIUM shot, handheld eye-level. Characters in frame: @KOSI_MENSAH (indigo utility jumpsuit with rolled sleeves, sand-coloured work boots and a narrow woven kente belt, small gold Adinkra-disc earrings); @KWAME_AGYEMAN (white linen shirt under a caramel lightweight field jacket, dark tailored trousers and brown loafers, antique bronze lapel pin shaped like a compass rose). Kosi photographs the survey number Kwame leaves visible on the plan. Mood: charged old friendship. Lighting: bleached afternoon heat and hard fence shadows. Environment = Location Registry id 'RESORT_FENCE': The unfinished resort perimeter at Afenyo's lagoon shore: pale concrete columns, tall corrugated-metal fence panels, orange survey flags, a locked chain gate, scraped sand and mangroves pressed tightly behind it.",</w:t>
+        <w:t xml:space="preserve">  "prompt": "Grounded cinematic West African magical realism; contemporary Ghanaian coastal life; human-scale performances; saturated indigo, lagoon teal, clay red and warm amber palette; natural skin texture; tactile fabric and weathered wood; 16:9 landscape widescreen composition; subtle film grain; expressive realistic lighting. No written words, no logos, no watermark, no distorted hands, no duplicate people. Scene S09 — Map with a Missing Line. MEDIUM shot, handheld eye-level. Characters in frame: @KOSI_MENSAH (indigo utility jumpsuit with rolled sleeves, sand-coloured work boots and a narrow woven kente belt, small gold Adinkra-disc earrings); @KWAME_AGYEMAN (white linen shirt under a caramel lightweight field jacket, dark tailored trousers and brown loafers, antique bronze lapel pin shaped like a compass rose). Kosi photographs the survey number Kwame leaves visible on the plan. Mood: charged old friendship. Lighting: bleached afternoon heat and hard fence shadows. Environment = Location Registry id 'RESORT_FENCE': The unfinished resort perimeter at Afenyo's lagoon shore: pale concrete columns, tall corrugated-metal fence panels, orange survey flags, a locked chain gate, scraped sand and mangroves pressed tightly behind it.",</w:t>
         <w:br/>
         <w:t xml:space="preserve">  "status": "⬜",</w:t>
         <w:br/>
@@ -6514,7 +6514,7 @@
         <w:br/>
         <w:t xml:space="preserve">  ],</w:t>
         <w:br/>
-        <w:t xml:space="preserve">  "prompt": "Grounded cinematic West African magical realism; contemporary Ghanaian coastal life; human-scale performances; saturated indigo, lagoon teal, clay red and warm amber palette; natural skin texture; tactile fabric and weathered wood; 2.39:1 widescreen composition; subtle film grain; expressive realistic lighting. No written words, no logos, no watermark, no distorted hands, no duplicate people. Scene S09 — Map with a Missing Line. WIDE shot, rear closing tableau. Characters in frame: @KOSI_MENSAH (indigo utility jumpsuit with rolled sleeves, sand-coloured work boots and a narrow woven kente belt, small gold Adinkra-disc earrings); @KWAME_AGYEMAN (white linen shirt under a caramel lightweight field jacket, dark tailored trousers and brown loafers, antique bronze lapel pin shaped like a compass rose). Kwame walks along the fence while Kosi remains at the locked gate. Mood: charged old friendship. Lighting: bleached afternoon heat and hard fence shadows. Environment = Location Registry id 'RESORT_FENCE': The unfinished resort perimeter at Afenyo's lagoon shore: pale concrete columns, tall corrugated-metal fence panels, orange survey flags, a locked chain gate, scraped sand and mangroves pressed tightly behind it.",</w:t>
+        <w:t xml:space="preserve">  "prompt": "Grounded cinematic West African magical realism; contemporary Ghanaian coastal life; human-scale performances; saturated indigo, lagoon teal, clay red and warm amber palette; natural skin texture; tactile fabric and weathered wood; 16:9 landscape widescreen composition; subtle film grain; expressive realistic lighting. No written words, no logos, no watermark, no distorted hands, no duplicate people. Scene S09 — Map with a Missing Line. WIDE shot, rear closing tableau. Characters in frame: @KOSI_MENSAH (indigo utility jumpsuit with rolled sleeves, sand-coloured work boots and a narrow woven kente belt, small gold Adinkra-disc earrings); @KWAME_AGYEMAN (white linen shirt under a caramel lightweight field jacket, dark tailored trousers and brown loafers, antique bronze lapel pin shaped like a compass rose). Kwame walks along the fence while Kosi remains at the locked gate. Mood: charged old friendship. Lighting: bleached afternoon heat and hard fence shadows. Environment = Location Registry id 'RESORT_FENCE': The unfinished resort perimeter at Afenyo's lagoon shore: pale concrete columns, tall corrugated-metal fence panels, orange survey flags, a locked chain gate, scraped sand and mangroves pressed tightly behind it.",</w:t>
         <w:br/>
         <w:t xml:space="preserve">  "status": "⬜",</w:t>
         <w:br/>
@@ -6581,7 +6581,7 @@
         <w:br/>
         <w:t xml:space="preserve">  ],</w:t>
         <w:br/>
-        <w:t xml:space="preserve">  "prompt": "Grounded cinematic West African magical realism; contemporary Ghanaian coastal life; human-scale performances; saturated indigo, lagoon teal, clay red and warm amber palette; natural skin texture; tactile fabric and weathered wood; 2.39:1 widescreen composition; subtle film grain; expressive realistic lighting. No written words, no logos, no watermark, no distorted hands, no duplicate people. Scene S10 — Under the Roots. WIDE shot, high establishing angle. Characters in frame: @KOJO_DANSO (faded forest-green canvas jacket over a blue-and-cream striped shirt, charcoal trousers and rubber deck boots, weathered brass compass on a cord); @KOSI_MENSAH (indigo utility jumpsuit with rolled sleeves, sand-coloured work boots and a narrow woven kente belt, small gold Adinkra-disc earrings); @SENA_ADJOVI (mustard oversized hoodie, blue-and-white printed ankle skirt and worn white canvas trainers, turquoise over-ear radio headphones). A slim canoe slips into a shadowed mangrove passage. Mood: tense fieldwork. Lighting: green-gold shafts through dense mangrove canopy. Environment = Location Registry id 'MANGROVE_PASSAGE': A shadowed mangrove passage off Afenyo lagoon: tangled roots in dark water, a slim canoe path, floating leaves, shafts of green-gold light and the distant hum of construction machinery.",</w:t>
+        <w:t xml:space="preserve">  "prompt": "Grounded cinematic West African magical realism; contemporary Ghanaian coastal life; human-scale performances; saturated indigo, lagoon teal, clay red and warm amber palette; natural skin texture; tactile fabric and weathered wood; 16:9 landscape widescreen composition; subtle film grain; expressive realistic lighting. No written words, no logos, no watermark, no distorted hands, no duplicate people. Scene S10 — Under the Roots. WIDE shot, high establishing angle. Characters in frame: @KOJO_DANSO (faded forest-green canvas jacket over a blue-and-cream striped shirt, charcoal trousers and rubber deck boots, weathered brass compass on a cord); @KOSI_MENSAH (indigo utility jumpsuit with rolled sleeves, sand-coloured work boots and a narrow woven kente belt, small gold Adinkra-disc earrings); @SENA_ADJOVI (mustard oversized hoodie, blue-and-white printed ankle skirt and worn white canvas trainers, turquoise over-ear radio headphones). A slim canoe slips into a shadowed mangrove passage. Mood: tense fieldwork. Lighting: green-gold shafts through dense mangrove canopy. Environment = Location Registry id 'MANGROVE_PASSAGE': A shadowed mangrove passage off Afenyo lagoon: tangled roots in dark water, a slim canoe path, floating leaves, shafts of green-gold light and the distant hum of construction machinery.",</w:t>
         <w:br/>
         <w:t xml:space="preserve">  "status": "⬜",</w:t>
         <w:br/>
@@ -6632,7 +6632,7 @@
         <w:br/>
         <w:t xml:space="preserve">  ],</w:t>
         <w:br/>
-        <w:t xml:space="preserve">  "prompt": "Grounded cinematic West African magical realism; contemporary Ghanaian coastal life; human-scale performances; saturated indigo, lagoon teal, clay red and warm amber palette; natural skin texture; tactile fabric and weathered wood; 2.39:1 widescreen composition; subtle film grain; expressive realistic lighting. No written words, no logos, no watermark, no distorted hands, no duplicate people. Scene S10 — Under the Roots. MEDIUM shot, eye-level. Characters in frame: @KOJO_DANSO (faded forest-green canvas jacket over a blue-and-cream striped shirt, charcoal trousers and rubber deck boots, weathered brass compass on a cord). Kojo poles carefully between tangled roots and dark water. Mood: tense fieldwork. Lighting: green-gold shafts through dense mangrove canopy. Environment = Location Registry id 'MANGROVE_PASSAGE': A shadowed mangrove passage off Afenyo lagoon: tangled roots in dark water, a slim canoe path, floating leaves, shafts of green-gold light and the distant hum of construction machinery.",</w:t>
+        <w:t xml:space="preserve">  "prompt": "Grounded cinematic West African magical realism; contemporary Ghanaian coastal life; human-scale performances; saturated indigo, lagoon teal, clay red and warm amber palette; natural skin texture; tactile fabric and weathered wood; 16:9 landscape widescreen composition; subtle film grain; expressive realistic lighting. No written words, no logos, no watermark, no distorted hands, no duplicate people. Scene S10 — Under the Roots. MEDIUM shot, eye-level. Characters in frame: @KOJO_DANSO (faded forest-green canvas jacket over a blue-and-cream striped shirt, charcoal trousers and rubber deck boots, weathered brass compass on a cord). Kojo poles carefully between tangled roots and dark water. Mood: tense fieldwork. Lighting: green-gold shafts through dense mangrove canopy. Environment = Location Registry id 'MANGROVE_PASSAGE': A shadowed mangrove passage off Afenyo lagoon: tangled roots in dark water, a slim canoe path, floating leaves, shafts of green-gold light and the distant hum of construction machinery.",</w:t>
         <w:br/>
         <w:t xml:space="preserve">  "status": "⬜",</w:t>
         <w:br/>
@@ -6683,7 +6683,7 @@
         <w:br/>
         <w:t xml:space="preserve">  ],</w:t>
         <w:br/>
-        <w:t xml:space="preserve">  "prompt": "Grounded cinematic West African magical realism; contemporary Ghanaian coastal life; human-scale performances; saturated indigo, lagoon teal, clay red and warm amber palette; natural skin texture; tactile fabric and weathered wood; 2.39:1 widescreen composition; subtle film grain; expressive realistic lighting. No written words, no logos, no watermark, no distorted hands, no duplicate people. Scene S10 — Under the Roots. CLOSE shot, three-quarter profile. Characters in frame: @KOSI_MENSAH (indigo utility jumpsuit with rolled sleeves, sand-coloured work boots and a narrow woven kente belt, small gold Adinkra-disc earrings). Kosi lowers a water sensor on a wire over the canoe's side. Mood: tense fieldwork. Lighting: green-gold shafts through dense mangrove canopy. Environment = Location Registry id 'MANGROVE_PASSAGE': A shadowed mangrove passage off Afenyo lagoon: tangled roots in dark water, a slim canoe path, floating leaves, shafts of green-gold light and the distant hum of construction machinery.",</w:t>
+        <w:t xml:space="preserve">  "prompt": "Grounded cinematic West African magical realism; contemporary Ghanaian coastal life; human-scale performances; saturated indigo, lagoon teal, clay red and warm amber palette; natural skin texture; tactile fabric and weathered wood; 16:9 landscape widescreen composition; subtle film grain; expressive realistic lighting. No written words, no logos, no watermark, no distorted hands, no duplicate people. Scene S10 — Under the Roots. CLOSE shot, three-quarter profile. Characters in frame: @KOSI_MENSAH (indigo utility jumpsuit with rolled sleeves, sand-coloured work boots and a narrow woven kente belt, small gold Adinkra-disc earrings). Kosi lowers a water sensor on a wire over the canoe's side. Mood: tense fieldwork. Lighting: green-gold shafts through dense mangrove canopy. Environment = Location Registry id 'MANGROVE_PASSAGE': A shadowed mangrove passage off Afenyo lagoon: tangled roots in dark water, a slim canoe path, floating leaves, shafts of green-gold light and the distant hum of construction machinery.",</w:t>
         <w:br/>
         <w:t xml:space="preserve">  "status": "⬜",</w:t>
         <w:br/>
@@ -6734,7 +6734,7 @@
         <w:br/>
         <w:t xml:space="preserve">  ],</w:t>
         <w:br/>
-        <w:t xml:space="preserve">  "prompt": "Grounded cinematic West African magical realism; contemporary Ghanaian coastal life; human-scale performances; saturated indigo, lagoon teal, clay red and warm amber palette; natural skin texture; tactile fabric and weathered wood; 2.39:1 widescreen composition; subtle film grain; expressive realistic lighting. No written words, no logos, no watermark, no distorted hands, no duplicate people. Scene S10 — Under the Roots. INSERT shot, top-down detail. Characters in frame: @KOSI_MENSAH (indigo utility jumpsuit with rolled sleeves, sand-coloured work boots and a narrow woven kente belt, small gold Adinkra-disc earrings). The sensor display spikes sharply against Kosi's gloved hand. Mood: tense fieldwork. Lighting: green-gold shafts through dense mangrove canopy. Environment = Location Registry id 'MANGROVE_PASSAGE': A shadowed mangrove passage off Afenyo lagoon: tangled roots in dark water, a slim canoe path, floating leaves, shafts of green-gold light and the distant hum of construction machinery.",</w:t>
+        <w:t xml:space="preserve">  "prompt": "Grounded cinematic West African magical realism; contemporary Ghanaian coastal life; human-scale performances; saturated indigo, lagoon teal, clay red and warm amber palette; natural skin texture; tactile fabric and weathered wood; 16:9 landscape widescreen composition; subtle film grain; expressive realistic lighting. No written words, no logos, no watermark, no distorted hands, no duplicate people. Scene S10 — Under the Roots. INSERT shot, top-down detail. Characters in frame: @KOSI_MENSAH (indigo utility jumpsuit with rolled sleeves, sand-coloured work boots and a narrow woven kente belt, small gold Adinkra-disc earrings). The sensor display spikes sharply against Kosi's gloved hand. Mood: tense fieldwork. Lighting: green-gold shafts through dense mangrove canopy. Environment = Location Registry id 'MANGROVE_PASSAGE': A shadowed mangrove passage off Afenyo lagoon: tangled roots in dark water, a slim canoe path, floating leaves, shafts of green-gold light and the distant hum of construction machinery.",</w:t>
         <w:br/>
         <w:t xml:space="preserve">  "status": "⬜",</w:t>
         <w:br/>
@@ -6793,7 +6793,7 @@
         <w:br/>
         <w:t xml:space="preserve">  ],</w:t>
         <w:br/>
-        <w:t xml:space="preserve">  "prompt": "Grounded cinematic West African magical realism; contemporary Ghanaian coastal life; human-scale performances; saturated indigo, lagoon teal, clay red and warm amber palette; natural skin texture; tactile fabric and weathered wood; 2.39:1 widescreen composition; subtle film grain; expressive realistic lighting. No written words, no logos, no watermark, no distorted hands, no duplicate people. Scene S10 — Under the Roots. TWO-SHOT shot, eye-level. Characters in frame: @KOSI_MENSAH (indigo utility jumpsuit with rolled sleeves, sand-coloured work boots and a narrow woven kente belt, small gold Adinkra-disc earrings); @KOJO_DANSO (faded forest-green canvas jacket over a blue-and-cream striped shirt, charcoal trousers and rubber deck boots, weathered brass compass on a cord); @SENA_ADJOVI (mustard oversized hoodie, blue-and-white printed ankle skirt and worn white canvas trainers, turquoise over-ear radio headphones). Kosi, Kojo and Sena hold their breath in the narrow canoe. Mood: tense fieldwork. Lighting: green-gold shafts through dense mangrove canopy. Environment = Location Registry id 'MANGROVE_PASSAGE': A shadowed mangrove passage off Afenyo lagoon: tangled roots in dark water, a slim canoe path, floating leaves, shafts of green-gold light and the distant hum of construction machinery.",</w:t>
+        <w:t xml:space="preserve">  "prompt": "Grounded cinematic West African magical realism; contemporary Ghanaian coastal life; human-scale performances; saturated indigo, lagoon teal, clay red and warm amber palette; natural skin texture; tactile fabric and weathered wood; 16:9 landscape widescreen composition; subtle film grain; expressive realistic lighting. No written words, no logos, no watermark, no distorted hands, no duplicate people. Scene S10 — Under the Roots. TWO-SHOT shot, eye-level. Characters in frame: @KOSI_MENSAH (indigo utility jumpsuit with rolled sleeves, sand-coloured work boots and a narrow woven kente belt, small gold Adinkra-disc earrings); @KOJO_DANSO (faded forest-green canvas jacket over a blue-and-cream striped shirt, charcoal trousers and rubber deck boots, weathered brass compass on a cord); @SENA_ADJOVI (mustard oversized hoodie, blue-and-white printed ankle skirt and worn white canvas trainers, turquoise over-ear radio headphones). Kosi, Kojo and Sena hold their breath in the narrow canoe. Mood: tense fieldwork. Lighting: green-gold shafts through dense mangrove canopy. Environment = Location Registry id 'MANGROVE_PASSAGE': A shadowed mangrove passage off Afenyo lagoon: tangled roots in dark water, a slim canoe path, floating leaves, shafts of green-gold light and the distant hum of construction machinery.",</w:t>
         <w:br/>
         <w:t xml:space="preserve">  "status": "⬜",</w:t>
         <w:br/>
@@ -6848,7 +6848,7 @@
         <w:br/>
         <w:t xml:space="preserve">  ],</w:t>
         <w:br/>
-        <w:t xml:space="preserve">  "prompt": "Grounded cinematic West African magical realism; contemporary Ghanaian coastal life; human-scale performances; saturated indigo, lagoon teal, clay red and warm amber palette; natural skin texture; tactile fabric and weathered wood; 2.39:1 widescreen composition; subtle film grain; expressive realistic lighting. No written words, no logos, no watermark, no distorted hands, no duplicate people. Scene S10 — Under the Roots. OVER-SHOULDER shot, over the lead character's shoulder. Characters in frame: @KOSI_MENSAH (indigo utility jumpsuit with rolled sleeves, sand-coloured work boots and a narrow woven kente belt, small gold Adinkra-disc earrings); @SENA_ADJOVI (mustard oversized hoodie, blue-and-white printed ankle skirt and worn white canvas trainers, turquoise over-ear radio headphones). Over Kosi's shoulder, Sena films a concealed pipe pulsing warm grey water. Mood: tense fieldwork. Lighting: green-gold shafts through dense mangrove canopy. Environment = Location Registry id 'MANGROVE_PASSAGE': A shadowed mangrove passage off Afenyo lagoon: tangled roots in dark water, a slim canoe path, floating leaves, shafts of green-gold light and the distant hum of construction machinery.",</w:t>
+        <w:t xml:space="preserve">  "prompt": "Grounded cinematic West African magical realism; contemporary Ghanaian coastal life; human-scale performances; saturated indigo, lagoon teal, clay red and warm amber palette; natural skin texture; tactile fabric and weathered wood; 16:9 landscape widescreen composition; subtle film grain; expressive realistic lighting. No written words, no logos, no watermark, no distorted hands, no duplicate people. Scene S10 — Under the Roots. OVER-SHOULDER shot, over the lead character's shoulder. Characters in frame: @KOSI_MENSAH (indigo utility jumpsuit with rolled sleeves, sand-coloured work boots and a narrow woven kente belt, small gold Adinkra-disc earrings); @SENA_ADJOVI (mustard oversized hoodie, blue-and-white printed ankle skirt and worn white canvas trainers, turquoise over-ear radio headphones). Over Kosi's shoulder, Sena films a concealed pipe pulsing warm grey water. Mood: tense fieldwork. Lighting: green-gold shafts through dense mangrove canopy. Environment = Location Registry id 'MANGROVE_PASSAGE': A shadowed mangrove passage off Afenyo lagoon: tangled roots in dark water, a slim canoe path, floating leaves, shafts of green-gold light and the distant hum of construction machinery.",</w:t>
         <w:br/>
         <w:t xml:space="preserve">  "status": "⬜",</w:t>
         <w:br/>
@@ -6899,7 +6899,7 @@
         <w:br/>
         <w:t xml:space="preserve">  ],</w:t>
         <w:br/>
-        <w:t xml:space="preserve">  "prompt": "Grounded cinematic West African magical realism; contemporary Ghanaian coastal life; human-scale performances; saturated indigo, lagoon teal, clay red and warm amber palette; natural skin texture; tactile fabric and weathered wood; 2.39:1 widescreen composition; subtle film grain; expressive realistic lighting. No written words, no logos, no watermark, no distorted hands, no duplicate people. Scene S10 — Under the Roots. EXTREME CLOSE shot, intimate frontal angle. Characters in frame: @SENA_ADJOVI (mustard oversized hoodie, blue-and-white printed ankle skirt and worn white canvas trainers, turquoise over-ear radio headphones). Sena whispers about being seen but keeps her phone steady. Mood: tense fieldwork. Lighting: green-gold shafts through dense mangrove canopy. Environment = Location Registry id 'MANGROVE_PASSAGE': A shadowed mangrove passage off Afenyo lagoon: tangled roots in dark water, a slim canoe path, floating leaves, shafts of green-gold light and the distant hum of construction machinery.",</w:t>
+        <w:t xml:space="preserve">  "prompt": "Grounded cinematic West African magical realism; contemporary Ghanaian coastal life; human-scale performances; saturated indigo, lagoon teal, clay red and warm amber palette; natural skin texture; tactile fabric and weathered wood; 16:9 landscape widescreen composition; subtle film grain; expressive realistic lighting. No written words, no logos, no watermark, no distorted hands, no duplicate people. Scene S10 — Under the Roots. EXTREME CLOSE shot, intimate frontal angle. Characters in frame: @SENA_ADJOVI (mustard oversized hoodie, blue-and-white printed ankle skirt and worn white canvas trainers, turquoise over-ear radio headphones). Sena whispers about being seen but keeps her phone steady. Mood: tense fieldwork. Lighting: green-gold shafts through dense mangrove canopy. Environment = Location Registry id 'MANGROVE_PASSAGE': A shadowed mangrove passage off Afenyo lagoon: tangled roots in dark water, a slim canoe path, floating leaves, shafts of green-gold light and the distant hum of construction machinery.",</w:t>
         <w:br/>
         <w:t xml:space="preserve">  "status": "⬜",</w:t>
         <w:br/>
@@ -6958,7 +6958,7 @@
         <w:br/>
         <w:t xml:space="preserve">  ],</w:t>
         <w:br/>
-        <w:t xml:space="preserve">  "prompt": "Grounded cinematic West African magical realism; contemporary Ghanaian coastal life; human-scale performances; saturated indigo, lagoon teal, clay red and warm amber palette; natural skin texture; tactile fabric and weathered wood; 2.39:1 widescreen composition; subtle film grain; expressive realistic lighting. No written words, no logos, no watermark, no distorted hands, no duplicate people. Scene S10 — Under the Roots. WIDE shot, low observational angle. Characters in frame: @KOJO_DANSO (faded forest-green canvas jacket over a blue-and-cream striped shirt, charcoal trousers and rubber deck boots, weathered brass compass on a cord); @KOSI_MENSAH (indigo utility jumpsuit with rolled sleeves, sand-coloured work boots and a narrow woven kente belt, small gold Adinkra-disc earrings); @SENA_ADJOVI (mustard oversized hoodie, blue-and-white printed ankle skirt and worn white canvas trainers, turquoise over-ear radio headphones). The trio freezes as a distant construction engine cuts out. Mood: tense fieldwork. Lighting: green-gold shafts through dense mangrove canopy. Environment = Location Registry id 'MANGROVE_PASSAGE': A shadowed mangrove passage off Afenyo lagoon: tangled roots in dark water, a slim canoe path, floating leaves, shafts of green-gold light and the distant hum of construction machinery.",</w:t>
+        <w:t xml:space="preserve">  "prompt": "Grounded cinematic West African magical realism; contemporary Ghanaian coastal life; human-scale performances; saturated indigo, lagoon teal, clay red and warm amber palette; natural skin texture; tactile fabric and weathered wood; 16:9 landscape widescreen composition; subtle film grain; expressive realistic lighting. No written words, no logos, no watermark, no distorted hands, no duplicate people. Scene S10 — Under the Roots. WIDE shot, low observational angle. Characters in frame: @KOJO_DANSO (faded forest-green canvas jacket over a blue-and-cream striped shirt, charcoal trousers and rubber deck boots, weathered brass compass on a cord); @KOSI_MENSAH (indigo utility jumpsuit with rolled sleeves, sand-coloured work boots and a narrow woven kente belt, small gold Adinkra-disc earrings); @SENA_ADJOVI (mustard oversized hoodie, blue-and-white printed ankle skirt and worn white canvas trainers, turquoise over-ear radio headphones). The trio freezes as a distant construction engine cuts out. Mood: tense fieldwork. Lighting: green-gold shafts through dense mangrove canopy. Environment = Location Registry id 'MANGROVE_PASSAGE': A shadowed mangrove passage off Afenyo lagoon: tangled roots in dark water, a slim canoe path, floating leaves, shafts of green-gold light and the distant hum of construction machinery.",</w:t>
         <w:br/>
         <w:t xml:space="preserve">  "status": "⬜",</w:t>
         <w:br/>
@@ -7009,7 +7009,7 @@
         <w:br/>
         <w:t xml:space="preserve">  ],</w:t>
         <w:br/>
-        <w:t xml:space="preserve">  "prompt": "Grounded cinematic West African magical realism; contemporary Ghanaian coastal life; human-scale performances; saturated indigo, lagoon teal, clay red and warm amber palette; natural skin texture; tactile fabric and weathered wood; 2.39:1 widescreen composition; subtle film grain; expressive realistic lighting. No written words, no logos, no watermark, no distorted hands, no duplicate people. Scene S10 — Under the Roots. MEDIUM shot, handheld eye-level. Characters in frame: @KOSI_MENSAH (indigo utility jumpsuit with rolled sleeves, sand-coloured work boots and a narrow woven kente belt, small gold Adinkra-disc earrings). Kosi seals the water sample with practiced precision. Mood: tense fieldwork. Lighting: green-gold shafts through dense mangrove canopy. Environment = Location Registry id 'MANGROVE_PASSAGE': A shadowed mangrove passage off Afenyo lagoon: tangled roots in dark water, a slim canoe path, floating leaves, shafts of green-gold light and the distant hum of construction machinery.",</w:t>
+        <w:t xml:space="preserve">  "prompt": "Grounded cinematic West African magical realism; contemporary Ghanaian coastal life; human-scale performances; saturated indigo, lagoon teal, clay red and warm amber palette; natural skin texture; tactile fabric and weathered wood; 16:9 landscape widescreen composition; subtle film grain; expressive realistic lighting. No written words, no logos, no watermark, no distorted hands, no duplicate people. Scene S10 — Under the Roots. MEDIUM shot, handheld eye-level. Characters in frame: @KOSI_MENSAH (indigo utility jumpsuit with rolled sleeves, sand-coloured work boots and a narrow woven kente belt, small gold Adinkra-disc earrings). Kosi seals the water sample with practiced precision. Mood: tense fieldwork. Lighting: green-gold shafts through dense mangrove canopy. Environment = Location Registry id 'MANGROVE_PASSAGE': A shadowed mangrove passage off Afenyo lagoon: tangled roots in dark water, a slim canoe path, floating leaves, shafts of green-gold light and the distant hum of construction machinery.",</w:t>
         <w:br/>
         <w:t xml:space="preserve">  "status": "⬜",</w:t>
         <w:br/>
@@ -7068,7 +7068,7 @@
         <w:br/>
         <w:t xml:space="preserve">  ],</w:t>
         <w:br/>
-        <w:t xml:space="preserve">  "prompt": "Grounded cinematic West African magical realism; contemporary Ghanaian coastal life; human-scale performances; saturated indigo, lagoon teal, clay red and warm amber palette; natural skin texture; tactile fabric and weathered wood; 2.39:1 widescreen composition; subtle film grain; expressive realistic lighting. No written words, no logos, no watermark, no distorted hands, no duplicate people. Scene S10 — Under the Roots. WIDE shot, rear closing tableau. Characters in frame: @KOJO_DANSO (faded forest-green canvas jacket over a blue-and-cream striped shirt, charcoal trousers and rubber deck boots, weathered brass compass on a cord); @KOSI_MENSAH (indigo utility jumpsuit with rolled sleeves, sand-coloured work boots and a narrow woven kente belt, small gold Adinkra-disc earrings); @SENA_ADJOVI (mustard oversized hoodie, blue-and-white printed ankle skirt and worn white canvas trainers, turquoise over-ear radio headphones). Kojo guides the canoe back through green-gold roots toward daylight. Mood: tense fieldwork. Lighting: green-gold shafts through dense mangrove canopy. Environment = Location Registry id 'MANGROVE_PASSAGE': A shadowed mangrove passage off Afenyo lagoon: tangled roots in dark water, a slim canoe path, floating leaves, shafts of green-gold light and the distant hum of construction machinery.",</w:t>
+        <w:t xml:space="preserve">  "prompt": "Grounded cinematic West African magical realism; contemporary Ghanaian coastal life; human-scale performances; saturated indigo, lagoon teal, clay red and warm amber palette; natural skin texture; tactile fabric and weathered wood; 16:9 landscape widescreen composition; subtle film grain; expressive realistic lighting. No written words, no logos, no watermark, no distorted hands, no duplicate people. Scene S10 — Under the Roots. WIDE shot, rear closing tableau. Characters in frame: @KOJO_DANSO (faded forest-green canvas jacket over a blue-and-cream striped shirt, charcoal trousers and rubber deck boots, weathered brass compass on a cord); @KOSI_MENSAH (indigo utility jumpsuit with rolled sleeves, sand-coloured work boots and a narrow woven kente belt, small gold Adinkra-disc earrings); @SENA_ADJOVI (mustard oversized hoodie, blue-and-white printed ankle skirt and worn white canvas trainers, turquoise over-ear radio headphones). Kojo guides the canoe back through green-gold roots toward daylight. Mood: tense fieldwork. Lighting: green-gold shafts through dense mangrove canopy. Environment = Location Registry id 'MANGROVE_PASSAGE': A shadowed mangrove passage off Afenyo lagoon: tangled roots in dark water, a slim canoe path, floating leaves, shafts of green-gold light and the distant hum of construction machinery.",</w:t>
         <w:br/>
         <w:t xml:space="preserve">  "status": "⬜",</w:t>
         <w:br/>
@@ -7131,7 +7131,7 @@
         <w:br/>
         <w:t xml:space="preserve">  ],</w:t>
         <w:br/>
-        <w:t xml:space="preserve">  "prompt": "Grounded cinematic West African magical realism; contemporary Ghanaian coastal life; human-scale performances; saturated indigo, lagoon teal, clay red and warm amber palette; natural skin texture; tactile fabric and weathered wood; 2.39:1 widescreen composition; subtle film grain; expressive realistic lighting. No written words, no logos, no watermark, no distorted hands, no duplicate people. Scene S11 — King Tide. WIDE shot, high establishing angle. Characters in frame: @KOSI_MENSAH (indigo utility jumpsuit with rolled sleeves, sand-coloured work boots and a narrow woven kente belt, small gold Adinkra-disc earrings); @AMA_ADJOVI (deep navy kaba blouse, hand-dyed indigo wrapper with tiny white wave motifs and flat leather sandals, three-strand amber bead necklace). Storm water fills the compound around the blue door and floating mango leaves. Mood: urgent, tender resilience. Lighting: storm flashes, lantern reflections and dark blue rain. Environment = Location Registry id 'FLOODED_COMPOUND': Ama's family compound courtyard after a king-tide flood: ankle-deep reflective water around ochre walls and woven stools, floating mango leaves, soaked laundry, a blue door and storm-grey sky.",</w:t>
+        <w:t xml:space="preserve">  "prompt": "Grounded cinematic West African magical realism; contemporary Ghanaian coastal life; human-scale performances; saturated indigo, lagoon teal, clay red and warm amber palette; natural skin texture; tactile fabric and weathered wood; 16:9 landscape widescreen composition; subtle film grain; expressive realistic lighting. No written words, no logos, no watermark, no distorted hands, no duplicate people. Scene S11 — King Tide. WIDE shot, high establishing angle. Characters in frame: @KOSI_MENSAH (indigo utility jumpsuit with rolled sleeves, sand-coloured work boots and a narrow woven kente belt, small gold Adinkra-disc earrings); @AMA_ADJOVI (deep navy kaba blouse, hand-dyed indigo wrapper with tiny white wave motifs and flat leather sandals, three-strand amber bead necklace). Storm water fills the compound around the blue door and floating mango leaves. Mood: urgent, tender resilience. Lighting: storm flashes, lantern reflections and dark blue rain. Environment = Location Registry id 'FLOODED_COMPOUND': Ama's family compound courtyard after a king-tide flood: ankle-deep reflective water around ochre walls and woven stools, floating mango leaves, soaked laundry, a blue door and storm-grey sky.",</w:t>
         <w:br/>
         <w:t xml:space="preserve">  "status": "⬜",</w:t>
         <w:br/>
@@ -7182,7 +7182,7 @@
         <w:br/>
         <w:t xml:space="preserve">  ],</w:t>
         <w:br/>
-        <w:t xml:space="preserve">  "prompt": "Grounded cinematic West African magical realism; contemporary Ghanaian coastal life; human-scale performances; saturated indigo, lagoon teal, clay red and warm amber palette; natural skin texture; tactile fabric and weathered wood; 2.39:1 widescreen composition; subtle film grain; expressive realistic lighting. No written words, no logos, no watermark, no distorted hands, no duplicate people. Scene S11 — King Tide. MEDIUM shot, eye-level. Characters in frame: @KOSI_MENSAH (indigo utility jumpsuit with rolled sleeves, sand-coloured work boots and a narrow woven kente belt, small gold Adinkra-disc earrings). Kosi raises electrical leads above ankle-deep flood water. Mood: urgent, tender resilience. Lighting: storm flashes, lantern reflections and dark blue rain. Environment = Location Registry id 'FLOODED_COMPOUND': Ama's family compound courtyard after a king-tide flood: ankle-deep reflective water around ochre walls and woven stools, floating mango leaves, soaked laundry, a blue door and storm-grey sky.",</w:t>
+        <w:t xml:space="preserve">  "prompt": "Grounded cinematic West African magical realism; contemporary Ghanaian coastal life; human-scale performances; saturated indigo, lagoon teal, clay red and warm amber palette; natural skin texture; tactile fabric and weathered wood; 16:9 landscape widescreen composition; subtle film grain; expressive realistic lighting. No written words, no logos, no watermark, no distorted hands, no duplicate people. Scene S11 — King Tide. MEDIUM shot, eye-level. Characters in frame: @KOSI_MENSAH (indigo utility jumpsuit with rolled sleeves, sand-coloured work boots and a narrow woven kente belt, small gold Adinkra-disc earrings). Kosi raises electrical leads above ankle-deep flood water. Mood: urgent, tender resilience. Lighting: storm flashes, lantern reflections and dark blue rain. Environment = Location Registry id 'FLOODED_COMPOUND': Ama's family compound courtyard after a king-tide flood: ankle-deep reflective water around ochre walls and woven stools, floating mango leaves, soaked laundry, a blue door and storm-grey sky.",</w:t>
         <w:br/>
         <w:t xml:space="preserve">  "status": "⬜",</w:t>
         <w:br/>
@@ -7233,7 +7233,7 @@
         <w:br/>
         <w:t xml:space="preserve">  ],</w:t>
         <w:br/>
-        <w:t xml:space="preserve">  "prompt": "Grounded cinematic West African magical realism; contemporary Ghanaian coastal life; human-scale performances; saturated indigo, lagoon teal, clay red and warm amber palette; natural skin texture; tactile fabric and weathered wood; 2.39:1 widescreen composition; subtle film grain; expressive realistic lighting. No written words, no logos, no watermark, no distorted hands, no duplicate people. Scene S11 — King Tide. CLOSE shot, three-quarter profile. Characters in frame: @AMA_ADJOVI (deep navy kaba blouse, hand-dyed indigo wrapper with tiny white wave motifs and flat leather sandals, three-strand amber bead necklace). Ama grips a crate of lanterns and refuses to leave it behind. Mood: urgent, tender resilience. Lighting: storm flashes, lantern reflections and dark blue rain. Environment = Location Registry id 'FLOODED_COMPOUND': Ama's family compound courtyard after a king-tide flood: ankle-deep reflective water around ochre walls and woven stools, floating mango leaves, soaked laundry, a blue door and storm-grey sky.",</w:t>
+        <w:t xml:space="preserve">  "prompt": "Grounded cinematic West African magical realism; contemporary Ghanaian coastal life; human-scale performances; saturated indigo, lagoon teal, clay red and warm amber palette; natural skin texture; tactile fabric and weathered wood; 16:9 landscape widescreen composition; subtle film grain; expressive realistic lighting. No written words, no logos, no watermark, no distorted hands, no duplicate people. Scene S11 — King Tide. CLOSE shot, three-quarter profile. Characters in frame: @AMA_ADJOVI (deep navy kaba blouse, hand-dyed indigo wrapper with tiny white wave motifs and flat leather sandals, three-strand amber bead necklace). Ama grips a crate of lanterns and refuses to leave it behind. Mood: urgent, tender resilience. Lighting: storm flashes, lantern reflections and dark blue rain. Environment = Location Registry id 'FLOODED_COMPOUND': Ama's family compound courtyard after a king-tide flood: ankle-deep reflective water around ochre walls and woven stools, floating mango leaves, soaked laundry, a blue door and storm-grey sky.",</w:t>
         <w:br/>
         <w:t xml:space="preserve">  "status": "⬜",</w:t>
         <w:br/>
@@ -7284,7 +7284,7 @@
         <w:br/>
         <w:t xml:space="preserve">  ],</w:t>
         <w:br/>
-        <w:t xml:space="preserve">  "prompt": "Grounded cinematic West African magical realism; contemporary Ghanaian coastal life; human-scale performances; saturated indigo, lagoon teal, clay red and warm amber palette; natural skin texture; tactile fabric and weathered wood; 2.39:1 widescreen composition; subtle film grain; expressive realistic lighting. No written words, no logos, no watermark, no distorted hands, no duplicate people. Scene S11 — King Tide. INSERT shot, top-down detail. Characters in frame: @AMA_ADJOVI (deep navy kaba blouse, hand-dyed indigo wrapper with tiny white wave motifs and flat leather sandals, three-strand amber bead necklace). A blue lantern reflection trembles in flood water around Ama's sandals. Mood: urgent, tender resilience. Lighting: storm flashes, lantern reflections and dark blue rain. Environment = Location Registry id 'FLOODED_COMPOUND': Ama's family compound courtyard after a king-tide flood: ankle-deep reflective water around ochre walls and woven stools, floating mango leaves, soaked laundry, a blue door and storm-grey sky.",</w:t>
+        <w:t xml:space="preserve">  "prompt": "Grounded cinematic West African magical realism; contemporary Ghanaian coastal life; human-scale performances; saturated indigo, lagoon teal, clay red and warm amber palette; natural skin texture; tactile fabric and weathered wood; 16:9 landscape widescreen composition; subtle film grain; expressive realistic lighting. No written words, no logos, no watermark, no distorted hands, no duplicate people. Scene S11 — King Tide. INSERT shot, top-down detail. Characters in frame: @AMA_ADJOVI (deep navy kaba blouse, hand-dyed indigo wrapper with tiny white wave motifs and flat leather sandals, three-strand amber bead necklace). A blue lantern reflection trembles in flood water around Ama's sandals. Mood: urgent, tender resilience. Lighting: storm flashes, lantern reflections and dark blue rain. Environment = Location Registry id 'FLOODED_COMPOUND': Ama's family compound courtyard after a king-tide flood: ankle-deep reflective water around ochre walls and woven stools, floating mango leaves, soaked laundry, a blue door and storm-grey sky.",</w:t>
         <w:br/>
         <w:t xml:space="preserve">  "status": "⬜",</w:t>
         <w:br/>
@@ -7339,7 +7339,7 @@
         <w:br/>
         <w:t xml:space="preserve">  ],</w:t>
         <w:br/>
-        <w:t xml:space="preserve">  "prompt": "Grounded cinematic West African magical realism; contemporary Ghanaian coastal life; human-scale performances; saturated indigo, lagoon teal, clay red and warm amber palette; natural skin texture; tactile fabric and weathered wood; 2.39:1 widescreen composition; subtle film grain; expressive realistic lighting. No written words, no logos, no watermark, no distorted hands, no duplicate people. Scene S11 — King Tide. TWO-SHOT shot, eye-level. Characters in frame: @KOJO_DANSO (faded forest-green canvas jacket over a blue-and-cream striped shirt, charcoal trousers and rubber deck boots, weathered brass compass on a cord); @SENA_ADJOVI (mustard oversized hoodie, blue-and-white printed ankle skirt and worn white canvas trainers, turquoise over-ear radio headphones). Kojo wades in with a canoe as Sena reaches for the lantern crate. Mood: urgent, tender resilience. Lighting: storm flashes, lantern reflections and dark blue rain. Environment = Location Registry id 'FLOODED_COMPOUND': Ama's family compound courtyard after a king-tide flood: ankle-deep reflective water around ochre walls and woven stools, floating mango leaves, soaked laundry, a blue door and storm-grey sky.",</w:t>
+        <w:t xml:space="preserve">  "prompt": "Grounded cinematic West African magical realism; contemporary Ghanaian coastal life; human-scale performances; saturated indigo, lagoon teal, clay red and warm amber palette; natural skin texture; tactile fabric and weathered wood; 16:9 landscape widescreen composition; subtle film grain; expressive realistic lighting. No written words, no logos, no watermark, no distorted hands, no duplicate people. Scene S11 — King Tide. TWO-SHOT shot, eye-level. Characters in frame: @KOJO_DANSO (faded forest-green canvas jacket over a blue-and-cream striped shirt, charcoal trousers and rubber deck boots, weathered brass compass on a cord); @SENA_ADJOVI (mustard oversized hoodie, blue-and-white printed ankle skirt and worn white canvas trainers, turquoise over-ear radio headphones). Kojo wades in with a canoe as Sena reaches for the lantern crate. Mood: urgent, tender resilience. Lighting: storm flashes, lantern reflections and dark blue rain. Environment = Location Registry id 'FLOODED_COMPOUND': Ama's family compound courtyard after a king-tide flood: ankle-deep reflective water around ochre walls and woven stools, floating mango leaves, soaked laundry, a blue door and storm-grey sky.",</w:t>
         <w:br/>
         <w:t xml:space="preserve">  "status": "⬜",</w:t>
         <w:br/>
@@ -7394,7 +7394,7 @@
         <w:br/>
         <w:t xml:space="preserve">  ],</w:t>
         <w:br/>
-        <w:t xml:space="preserve">  "prompt": "Grounded cinematic West African magical realism; contemporary Ghanaian coastal life; human-scale performances; saturated indigo, lagoon teal, clay red and warm amber palette; natural skin texture; tactile fabric and weathered wood; 2.39:1 widescreen composition; subtle film grain; expressive realistic lighting. No written words, no logos, no watermark, no distorted hands, no duplicate people. Scene S11 — King Tide. OVER-SHOULDER shot, over the lead character's shoulder. Characters in frame: @KOSI_MENSAH (indigo utility jumpsuit with rolled sleeves, sand-coloured work boots and a narrow woven kente belt, small gold Adinkra-disc earrings); @AMA_ADJOVI (deep navy kaba blouse, hand-dyed indigo wrapper with tiny white wave motifs and flat leather sandals, three-strand amber bead necklace). Over Ama's shoulder, Kosi promises to make the water testify. Mood: urgent, tender resilience. Lighting: storm flashes, lantern reflections and dark blue rain. Environment = Location Registry id 'FLOODED_COMPOUND': Ama's family compound courtyard after a king-tide flood: ankle-deep reflective water around ochre walls and woven stools, floating mango leaves, soaked laundry, a blue door and storm-grey sky.",</w:t>
+        <w:t xml:space="preserve">  "prompt": "Grounded cinematic West African magical realism; contemporary Ghanaian coastal life; human-scale performances; saturated indigo, lagoon teal, clay red and warm amber palette; natural skin texture; tactile fabric and weathered wood; 16:9 landscape widescreen composition; subtle film grain; expressive realistic lighting. No written words, no logos, no watermark, no distorted hands, no duplicate people. Scene S11 — King Tide. OVER-SHOULDER shot, over the lead character's shoulder. Characters in frame: @KOSI_MENSAH (indigo utility jumpsuit with rolled sleeves, sand-coloured work boots and a narrow woven kente belt, small gold Adinkra-disc earrings); @AMA_ADJOVI (deep navy kaba blouse, hand-dyed indigo wrapper with tiny white wave motifs and flat leather sandals, three-strand amber bead necklace). Over Ama's shoulder, Kosi promises to make the water testify. Mood: urgent, tender resilience. Lighting: storm flashes, lantern reflections and dark blue rain. Environment = Location Registry id 'FLOODED_COMPOUND': Ama's family compound courtyard after a king-tide flood: ankle-deep reflective water around ochre walls and woven stools, floating mango leaves, soaked laundry, a blue door and storm-grey sky.",</w:t>
         <w:br/>
         <w:t xml:space="preserve">  "status": "⬜",</w:t>
         <w:br/>
@@ -7445,7 +7445,7 @@
         <w:br/>
         <w:t xml:space="preserve">  ],</w:t>
         <w:br/>
-        <w:t xml:space="preserve">  "prompt": "Grounded cinematic West African magical realism; contemporary Ghanaian coastal life; human-scale performances; saturated indigo, lagoon teal, clay red and warm amber palette; natural skin texture; tactile fabric and weathered wood; 2.39:1 widescreen composition; subtle film grain; expressive realistic lighting. No written words, no logos, no watermark, no distorted hands, no duplicate people. Scene S11 — King Tide. EXTREME CLOSE shot, intimate frontal angle. Characters in frame: @AMA_ADJOVI (deep navy kaba blouse, hand-dyed indigo wrapper with tiny white wave motifs and flat leather sandals, three-strand amber bead necklace). Ama speaks of water remembering every blocked path. Mood: urgent, tender resilience. Lighting: storm flashes, lantern reflections and dark blue rain. Environment = Location Registry id 'FLOODED_COMPOUND': Ama's family compound courtyard after a king-tide flood: ankle-deep reflective water around ochre walls and woven stools, floating mango leaves, soaked laundry, a blue door and storm-grey sky.",</w:t>
+        <w:t xml:space="preserve">  "prompt": "Grounded cinematic West African magical realism; contemporary Ghanaian coastal life; human-scale performances; saturated indigo, lagoon teal, clay red and warm amber palette; natural skin texture; tactile fabric and weathered wood; 16:9 landscape widescreen composition; subtle film grain; expressive realistic lighting. No written words, no logos, no watermark, no distorted hands, no duplicate people. Scene S11 — King Tide. EXTREME CLOSE shot, intimate frontal angle. Characters in frame: @AMA_ADJOVI (deep navy kaba blouse, hand-dyed indigo wrapper with tiny white wave motifs and flat leather sandals, three-strand amber bead necklace). Ama speaks of water remembering every blocked path. Mood: urgent, tender resilience. Lighting: storm flashes, lantern reflections and dark blue rain. Environment = Location Registry id 'FLOODED_COMPOUND': Ama's family compound courtyard after a king-tide flood: ankle-deep reflective water around ochre walls and woven stools, floating mango leaves, soaked laundry, a blue door and storm-grey sky.",</w:t>
         <w:br/>
         <w:t xml:space="preserve">  "status": "⬜",</w:t>
         <w:br/>
@@ -7508,7 +7508,7 @@
         <w:br/>
         <w:t xml:space="preserve">  ],</w:t>
         <w:br/>
-        <w:t xml:space="preserve">  "prompt": "Grounded cinematic West African magical realism; contemporary Ghanaian coastal life; human-scale performances; saturated indigo, lagoon teal, clay red and warm amber palette; natural skin texture; tactile fabric and weathered wood; 2.39:1 widescreen composition; subtle film grain; expressive realistic lighting. No written words, no logos, no watermark, no distorted hands, no duplicate people. Scene S11 — King Tide. WIDE shot, low observational angle. Characters in frame: @KOSI_MENSAH (indigo utility jumpsuit with rolled sleeves, sand-coloured work boots and a narrow woven kente belt, small gold Adinkra-disc earrings); @AMA_ADJOVI (deep navy kaba blouse, hand-dyed indigo wrapper with tiny white wave motifs and flat leather sandals, three-strand amber bead necklace); @SENA_ADJOVI (mustard oversized hoodie, blue-and-white printed ankle skirt and worn white canvas trainers, turquoise over-ear radio headphones); @KOJO_DANSO (faded forest-green canvas jacket over a blue-and-cream striped shirt, charcoal trousers and rubber deck boots, weathered brass compass on a cord). The family floats tools and lanterns toward Kojo's waiting canoe. Mood: urgent, tender resilience. Lighting: storm flashes, lantern reflections and dark blue rain. Environment = Location Registry id 'FLOODED_COMPOUND': Ama's family compound courtyard after a king-tide flood: ankle-deep reflective water around ochre walls and woven stools, floating mango leaves, soaked laundry, a blue door and storm-grey sky.",</w:t>
+        <w:t xml:space="preserve">  "prompt": "Grounded cinematic West African magical realism; contemporary Ghanaian coastal life; human-scale performances; saturated indigo, lagoon teal, clay red and warm amber palette; natural skin texture; tactile fabric and weathered wood; 16:9 landscape widescreen composition; subtle film grain; expressive realistic lighting. No written words, no logos, no watermark, no distorted hands, no duplicate people. Scene S11 — King Tide. WIDE shot, low observational angle. Characters in frame: @KOSI_MENSAH (indigo utility jumpsuit with rolled sleeves, sand-coloured work boots and a narrow woven kente belt, small gold Adinkra-disc earrings); @AMA_ADJOVI (deep navy kaba blouse, hand-dyed indigo wrapper with tiny white wave motifs and flat leather sandals, three-strand amber bead necklace); @SENA_ADJOVI (mustard oversized hoodie, blue-and-white printed ankle skirt and worn white canvas trainers, turquoise over-ear radio headphones); @KOJO_DANSO (faded forest-green canvas jacket over a blue-and-cream striped shirt, charcoal trousers and rubber deck boots, weathered brass compass on a cord). The family floats tools and lanterns toward Kojo's waiting canoe. Mood: urgent, tender resilience. Lighting: storm flashes, lantern reflections and dark blue rain. Environment = Location Registry id 'FLOODED_COMPOUND': Ama's family compound courtyard after a king-tide flood: ankle-deep reflective water around ochre walls and woven stools, floating mango leaves, soaked laundry, a blue door and storm-grey sky.",</w:t>
         <w:br/>
         <w:t xml:space="preserve">  "status": "⬜",</w:t>
         <w:br/>
@@ -7563,7 +7563,7 @@
         <w:br/>
         <w:t xml:space="preserve">  ],</w:t>
         <w:br/>
-        <w:t xml:space="preserve">  "prompt": "Grounded cinematic West African magical realism; contemporary Ghanaian coastal life; human-scale performances; saturated indigo, lagoon teal, clay red and warm amber palette; natural skin texture; tactile fabric and weathered wood; 2.39:1 widescreen composition; subtle film grain; expressive realistic lighting. No written words, no logos, no watermark, no distorted hands, no duplicate people. Scene S11 — King Tide. MEDIUM shot, handheld eye-level. Characters in frame: @KOSI_MENSAH (indigo utility jumpsuit with rolled sleeves, sand-coloured work boots and a narrow woven kente belt, small gold Adinkra-disc earrings); @SENA_ADJOVI (mustard oversized hoodie, blue-and-white printed ankle skirt and worn white canvas trainers, turquoise over-ear radio headphones). A blue lantern sputters to life between rain lashes. Mood: urgent, tender resilience. Lighting: storm flashes, lantern reflections and dark blue rain. Environment = Location Registry id 'FLOODED_COMPOUND': Ama's family compound courtyard after a king-tide flood: ankle-deep reflective water around ochre walls and woven stools, floating mango leaves, soaked laundry, a blue door and storm-grey sky.",</w:t>
+        <w:t xml:space="preserve">  "prompt": "Grounded cinematic West African magical realism; contemporary Ghanaian coastal life; human-scale performances; saturated indigo, lagoon teal, clay red and warm amber palette; natural skin texture; tactile fabric and weathered wood; 16:9 landscape widescreen composition; subtle film grain; expressive realistic lighting. No written words, no logos, no watermark, no distorted hands, no duplicate people. Scene S11 — King Tide. MEDIUM shot, handheld eye-level. Characters in frame: @KOSI_MENSAH (indigo utility jumpsuit with rolled sleeves, sand-coloured work boots and a narrow woven kente belt, small gold Adinkra-disc earrings); @SENA_ADJOVI (mustard oversized hoodie, blue-and-white printed ankle skirt and worn white canvas trainers, turquoise over-ear radio headphones). A blue lantern sputters to life between rain lashes. Mood: urgent, tender resilience. Lighting: storm flashes, lantern reflections and dark blue rain. Environment = Location Registry id 'FLOODED_COMPOUND': Ama's family compound courtyard after a king-tide flood: ankle-deep reflective water around ochre walls and woven stools, floating mango leaves, soaked laundry, a blue door and storm-grey sky.",</w:t>
         <w:br/>
         <w:t xml:space="preserve">  "status": "⬜",</w:t>
         <w:br/>
@@ -7626,7 +7626,7 @@
         <w:br/>
         <w:t xml:space="preserve">  ],</w:t>
         <w:br/>
-        <w:t xml:space="preserve">  "prompt": "Grounded cinematic West African magical realism; contemporary Ghanaian coastal life; human-scale performances; saturated indigo, lagoon teal, clay red and warm amber palette; natural skin texture; tactile fabric and weathered wood; 2.39:1 widescreen composition; subtle film grain; expressive realistic lighting. No written words, no logos, no watermark, no distorted hands, no duplicate people. Scene S11 — King Tide. WIDE shot, rear closing tableau. Characters in frame: @KOSI_MENSAH (indigo utility jumpsuit with rolled sleeves, sand-coloured work boots and a narrow woven kente belt, small gold Adinkra-disc earrings); @AMA_ADJOVI (deep navy kaba blouse, hand-dyed indigo wrapper with tiny white wave motifs and flat leather sandals, three-strand amber bead necklace); @SENA_ADJOVI (mustard oversized hoodie, blue-and-white printed ankle skirt and worn white canvas trainers, turquoise over-ear radio headphones); @KOJO_DANSO (faded forest-green canvas jacket over a blue-and-cream striped shirt, charcoal trousers and rubber deck boots, weathered brass compass on a cord). One small lantern burns over the flooded courtyard as the group works together. Mood: urgent, tender resilience. Lighting: storm flashes, lantern reflections and dark blue rain. Environment = Location Registry id 'FLOODED_COMPOUND': Ama's family compound courtyard after a king-tide flood: ankle-deep reflective water around ochre walls and woven stools, floating mango leaves, soaked laundry, a blue door and storm-grey sky.",</w:t>
+        <w:t xml:space="preserve">  "prompt": "Grounded cinematic West African magical realism; contemporary Ghanaian coastal life; human-scale performances; saturated indigo, lagoon teal, clay red and warm amber palette; natural skin texture; tactile fabric and weathered wood; 16:9 landscape widescreen composition; subtle film grain; expressive realistic lighting. No written words, no logos, no watermark, no distorted hands, no duplicate people. Scene S11 — King Tide. WIDE shot, rear closing tableau. Characters in frame: @KOSI_MENSAH (indigo utility jumpsuit with rolled sleeves, sand-coloured work boots and a narrow woven kente belt, small gold Adinkra-disc earrings); @AMA_ADJOVI (deep navy kaba blouse, hand-dyed indigo wrapper with tiny white wave motifs and flat leather sandals, three-strand amber bead necklace); @SENA_ADJOVI (mustard oversized hoodie, blue-and-white printed ankle skirt and worn white canvas trainers, turquoise over-ear radio headphones); @KOJO_DANSO (faded forest-green canvas jacket over a blue-and-cream striped shirt, charcoal trousers and rubber deck boots, weathered brass compass on a cord). One small lantern burns over the flooded courtyard as the group works together. Mood: urgent, tender resilience. Lighting: storm flashes, lantern reflections and dark blue rain. Environment = Location Registry id 'FLOODED_COMPOUND': Ama's family compound courtyard after a king-tide flood: ankle-deep reflective water around ochre walls and woven stools, floating mango leaves, soaked laundry, a blue door and storm-grey sky.",</w:t>
         <w:br/>
         <w:t xml:space="preserve">  "status": "⬜",</w:t>
         <w:br/>
@@ -7697,7 +7697,7 @@
         <w:br/>
         <w:t xml:space="preserve">  ],</w:t>
         <w:br/>
-        <w:t xml:space="preserve">  "prompt": "Grounded cinematic West African magical realism; contemporary Ghanaian coastal life; human-scale performances; saturated indigo, lagoon teal, clay red and warm amber palette; natural skin texture; tactile fabric and weathered wood; 2.39:1 widescreen composition; subtle film grain; expressive realistic lighting. No written words, no logos, no watermark, no distorted hands, no duplicate people. Scene S12 — Night of the Red Moon. WIDE shot, high establishing angle. Characters in frame: @AMA_ADJOVI (deep navy kaba blouse, hand-dyed indigo wrapper with tiny white wave motifs and flat leather sandals, three-strand amber bead necklace); @KOSI_MENSAH (indigo utility jumpsuit with rolled sleeves, sand-coloured work boots and a narrow woven kente belt, small gold Adinkra-disc earrings); @SENA_ADJOVI (mustard oversized hoodie, blue-and-white printed ankle skirt and worn white canvas trainers, turquoise over-ear radio headphones); @KOJO_DANSO (faded forest-green canvas jacket over a blue-and-cream striped shirt, charcoal trousers and rubber deck boots, weathered brass compass on a cord). The group approaches the derelict beacon hut across a lonely predawn sandbar. Mood: revelatory and ancestral. Lighting: thin pre-dawn blue with a red moon fading behind cloud. Environment = Location Registry id 'OLD_BEACON_HUT': A derelict tidal beacon hut on a small lagoon sandbar: cracked whitewash walls, a rusted ladder, broken blue lantern glass, salt-stained timber, reed grass and sweeping water on every side.",</w:t>
+        <w:t xml:space="preserve">  "prompt": "Grounded cinematic West African magical realism; contemporary Ghanaian coastal life; human-scale performances; saturated indigo, lagoon teal, clay red and warm amber palette; natural skin texture; tactile fabric and weathered wood; 16:9 landscape widescreen composition; subtle film grain; expressive realistic lighting. No written words, no logos, no watermark, no distorted hands, no duplicate people. Scene S12 — Night of the Red Moon. WIDE shot, high establishing angle. Characters in frame: @AMA_ADJOVI (deep navy kaba blouse, hand-dyed indigo wrapper with tiny white wave motifs and flat leather sandals, three-strand amber bead necklace); @KOSI_MENSAH (indigo utility jumpsuit with rolled sleeves, sand-coloured work boots and a narrow woven kente belt, small gold Adinkra-disc earrings); @SENA_ADJOVI (mustard oversized hoodie, blue-and-white printed ankle skirt and worn white canvas trainers, turquoise over-ear radio headphones); @KOJO_DANSO (faded forest-green canvas jacket over a blue-and-cream striped shirt, charcoal trousers and rubber deck boots, weathered brass compass on a cord). The group approaches the derelict beacon hut across a lonely predawn sandbar. Mood: revelatory and ancestral. Lighting: thin pre-dawn blue with a red moon fading behind cloud. Environment = Location Registry id 'OLD_BEACON_HUT': A derelict tidal beacon hut on a small lagoon sandbar: cracked whitewash walls, a rusted ladder, broken blue lantern glass, salt-stained timber, reed grass and sweeping water on every side.",</w:t>
         <w:br/>
         <w:t xml:space="preserve">  "status": "⬜",</w:t>
         <w:br/>
@@ -7748,7 +7748,7 @@
         <w:br/>
         <w:t xml:space="preserve">  ],</w:t>
         <w:br/>
-        <w:t xml:space="preserve">  "prompt": "Grounded cinematic West African magical realism; contemporary Ghanaian coastal life; human-scale performances; saturated indigo, lagoon teal, clay red and warm amber palette; natural skin texture; tactile fabric and weathered wood; 2.39:1 widescreen composition; subtle film grain; expressive realistic lighting. No written words, no logos, no watermark, no distorted hands, no duplicate people. Scene S12 — Night of the Red Moon. MEDIUM shot, eye-level. Characters in frame: @AMA_ADJOVI (deep navy kaba blouse, hand-dyed indigo wrapper with tiny white wave motifs and flat leather sandals, three-strand amber bead necklace). Ama steps through the cracked doorway with amber beads catching the blue light. Mood: revelatory and ancestral. Lighting: thin pre-dawn blue with a red moon fading behind cloud. Environment = Location Registry id 'OLD_BEACON_HUT': A derelict tidal beacon hut on a small lagoon sandbar: cracked whitewash walls, a rusted ladder, broken blue lantern glass, salt-stained timber, reed grass and sweeping water on every side.",</w:t>
+        <w:t xml:space="preserve">  "prompt": "Grounded cinematic West African magical realism; contemporary Ghanaian coastal life; human-scale performances; saturated indigo, lagoon teal, clay red and warm amber palette; natural skin texture; tactile fabric and weathered wood; 16:9 landscape widescreen composition; subtle film grain; expressive realistic lighting. No written words, no logos, no watermark, no distorted hands, no duplicate people. Scene S12 — Night of the Red Moon. MEDIUM shot, eye-level. Characters in frame: @AMA_ADJOVI (deep navy kaba blouse, hand-dyed indigo wrapper with tiny white wave motifs and flat leather sandals, three-strand amber bead necklace). Ama steps through the cracked doorway with amber beads catching the blue light. Mood: revelatory and ancestral. Lighting: thin pre-dawn blue with a red moon fading behind cloud. Environment = Location Registry id 'OLD_BEACON_HUT': A derelict tidal beacon hut on a small lagoon sandbar: cracked whitewash walls, a rusted ladder, broken blue lantern glass, salt-stained timber, reed grass and sweeping water on every side.",</w:t>
         <w:br/>
         <w:t xml:space="preserve">  "status": "⬜",</w:t>
         <w:br/>
@@ -7799,7 +7799,7 @@
         <w:br/>
         <w:t xml:space="preserve">  ],</w:t>
         <w:br/>
-        <w:t xml:space="preserve">  "prompt": "Grounded cinematic West African magical realism; contemporary Ghanaian coastal life; human-scale performances; saturated indigo, lagoon teal, clay red and warm amber palette; natural skin texture; tactile fabric and weathered wood; 2.39:1 widescreen composition; subtle film grain; expressive realistic lighting. No written words, no logos, no watermark, no distorted hands, no duplicate people. Scene S12 — Night of the Red Moon. CLOSE shot, three-quarter profile. Characters in frame: @KOSI_MENSAH (indigo utility jumpsuit with rolled sleeves, sand-coloured work boots and a narrow woven kente belt, small gold Adinkra-disc earrings). Kosi listens closely as Ama begins the old story. Mood: revelatory and ancestral. Lighting: thin pre-dawn blue with a red moon fading behind cloud. Environment = Location Registry id 'OLD_BEACON_HUT': A derelict tidal beacon hut on a small lagoon sandbar: cracked whitewash walls, a rusted ladder, broken blue lantern glass, salt-stained timber, reed grass and sweeping water on every side.",</w:t>
+        <w:t xml:space="preserve">  "prompt": "Grounded cinematic West African magical realism; contemporary Ghanaian coastal life; human-scale performances; saturated indigo, lagoon teal, clay red and warm amber palette; natural skin texture; tactile fabric and weathered wood; 16:9 landscape widescreen composition; subtle film grain; expressive realistic lighting. No written words, no logos, no watermark, no distorted hands, no duplicate people. Scene S12 — Night of the Red Moon. CLOSE shot, three-quarter profile. Characters in frame: @KOSI_MENSAH (indigo utility jumpsuit with rolled sleeves, sand-coloured work boots and a narrow woven kente belt, small gold Adinkra-disc earrings). Kosi listens closely as Ama begins the old story. Mood: revelatory and ancestral. Lighting: thin pre-dawn blue with a red moon fading behind cloud. Environment = Location Registry id 'OLD_BEACON_HUT': A derelict tidal beacon hut on a small lagoon sandbar: cracked whitewash walls, a rusted ladder, broken blue lantern glass, salt-stained timber, reed grass and sweeping water on every side.",</w:t>
         <w:br/>
         <w:t xml:space="preserve">  "status": "⬜",</w:t>
         <w:br/>
@@ -7850,7 +7850,7 @@
         <w:br/>
         <w:t xml:space="preserve">  ],</w:t>
         <w:br/>
-        <w:t xml:space="preserve">  "prompt": "Grounded cinematic West African magical realism; contemporary Ghanaian coastal life; human-scale performances; saturated indigo, lagoon teal, clay red and warm amber palette; natural skin texture; tactile fabric and weathered wood; 2.39:1 widescreen composition; subtle film grain; expressive realistic lighting. No written words, no logos, no watermark, no distorted hands, no duplicate people. Scene S12 — Night of the Red Moon. INSERT shot, top-down detail. Characters in frame: @AMA_ADJOVI (deep navy kaba blouse, hand-dyed indigo wrapper with tiny white wave motifs and flat leather sandals, three-strand amber bead necklace). Broken blue beacon glass lies among salt-stained timber and reed grass. Mood: revelatory and ancestral. Lighting: thin pre-dawn blue with a red moon fading behind cloud. Environment = Location Registry id 'OLD_BEACON_HUT': A derelict tidal beacon hut on a small lagoon sandbar: cracked whitewash walls, a rusted ladder, broken blue lantern glass, salt-stained timber, reed grass and sweeping water on every side.",</w:t>
+        <w:t xml:space="preserve">  "prompt": "Grounded cinematic West African magical realism; contemporary Ghanaian coastal life; human-scale performances; saturated indigo, lagoon teal, clay red and warm amber palette; natural skin texture; tactile fabric and weathered wood; 16:9 landscape widescreen composition; subtle film grain; expressive realistic lighting. No written words, no logos, no watermark, no distorted hands, no duplicate people. Scene S12 — Night of the Red Moon. INSERT shot, top-down detail. Characters in frame: @AMA_ADJOVI (deep navy kaba blouse, hand-dyed indigo wrapper with tiny white wave motifs and flat leather sandals, three-strand amber bead necklace). Broken blue beacon glass lies among salt-stained timber and reed grass. Mood: revelatory and ancestral. Lighting: thin pre-dawn blue with a red moon fading behind cloud. Environment = Location Registry id 'OLD_BEACON_HUT': A derelict tidal beacon hut on a small lagoon sandbar: cracked whitewash walls, a rusted ladder, broken blue lantern glass, salt-stained timber, reed grass and sweeping water on every side.",</w:t>
         <w:br/>
         <w:t xml:space="preserve">  "status": "⬜",</w:t>
         <w:br/>
@@ -7905,7 +7905,7 @@
         <w:br/>
         <w:t xml:space="preserve">  ],</w:t>
         <w:br/>
-        <w:t xml:space="preserve">  "prompt": "Grounded cinematic West African magical realism; contemporary Ghanaian coastal life; human-scale performances; saturated indigo, lagoon teal, clay red and warm amber palette; natural skin texture; tactile fabric and weathered wood; 2.39:1 widescreen composition; subtle film grain; expressive realistic lighting. No written words, no logos, no watermark, no distorted hands, no duplicate people. Scene S12 — Night of the Red Moon. TWO-SHOT shot, eye-level. Characters in frame: @AMA_ADJOVI (deep navy kaba blouse, hand-dyed indigo wrapper with tiny white wave motifs and flat leather sandals, three-strand amber bead necklace); @KOSI_MENSAH (indigo utility jumpsuit with rolled sleeves, sand-coloured work boots and a narrow woven kente belt, small gold Adinkra-disc earrings). Ama recounts how elders preserved a public landing deed during a survey. Mood: revelatory and ancestral. Lighting: thin pre-dawn blue with a red moon fading behind cloud. Environment = Location Registry id 'OLD_BEACON_HUT': A derelict tidal beacon hut on a small lagoon sandbar: cracked whitewash walls, a rusted ladder, broken blue lantern glass, salt-stained timber, reed grass and sweeping water on every side.",</w:t>
+        <w:t xml:space="preserve">  "prompt": "Grounded cinematic West African magical realism; contemporary Ghanaian coastal life; human-scale performances; saturated indigo, lagoon teal, clay red and warm amber palette; natural skin texture; tactile fabric and weathered wood; 16:9 landscape widescreen composition; subtle film grain; expressive realistic lighting. No written words, no logos, no watermark, no distorted hands, no duplicate people. Scene S12 — Night of the Red Moon. TWO-SHOT shot, eye-level. Characters in frame: @AMA_ADJOVI (deep navy kaba blouse, hand-dyed indigo wrapper with tiny white wave motifs and flat leather sandals, three-strand amber bead necklace); @KOSI_MENSAH (indigo utility jumpsuit with rolled sleeves, sand-coloured work boots and a narrow woven kente belt, small gold Adinkra-disc earrings). Ama recounts how elders preserved a public landing deed during a survey. Mood: revelatory and ancestral. Lighting: thin pre-dawn blue with a red moon fading behind cloud. Environment = Location Registry id 'OLD_BEACON_HUT': A derelict tidal beacon hut on a small lagoon sandbar: cracked whitewash walls, a rusted ladder, broken blue lantern glass, salt-stained timber, reed grass and sweeping water on every side.",</w:t>
         <w:br/>
         <w:t xml:space="preserve">  "status": "⬜",</w:t>
         <w:br/>
@@ -7960,7 +7960,7 @@
         <w:br/>
         <w:t xml:space="preserve">  ],</w:t>
         <w:br/>
-        <w:t xml:space="preserve">  "prompt": "Grounded cinematic West African magical realism; contemporary Ghanaian coastal life; human-scale performances; saturated indigo, lagoon teal, clay red and warm amber palette; natural skin texture; tactile fabric and weathered wood; 2.39:1 widescreen composition; subtle film grain; expressive realistic lighting. No written words, no logos, no watermark, no distorted hands, no duplicate people. Scene S12 — Night of the Red Moon. OVER-SHOULDER shot, over the lead character's shoulder. Characters in frame: @KOSI_MENSAH (indigo utility jumpsuit with rolled sleeves, sand-coloured work boots and a narrow woven kente belt, small gold Adinkra-disc earrings); @SENA_ADJOVI (mustard oversized hoodie, blue-and-white printed ankle skirt and worn white canvas trainers, turquoise over-ear radio headphones). Over Kosi's shoulder, Sena compares the page's rhythm to the radio frequency. Mood: revelatory and ancestral. Lighting: thin pre-dawn blue with a red moon fading behind cloud. Environment = Location Registry id 'OLD_BEACON_HUT': A derelict tidal beacon hut on a small lagoon sandbar: cracked whitewash walls, a rusted ladder, broken blue lantern glass, salt-stained timber, reed grass and sweeping water on every side.",</w:t>
+        <w:t xml:space="preserve">  "prompt": "Grounded cinematic West African magical realism; contemporary Ghanaian coastal life; human-scale performances; saturated indigo, lagoon teal, clay red and warm amber palette; natural skin texture; tactile fabric and weathered wood; 16:9 landscape widescreen composition; subtle film grain; expressive realistic lighting. No written words, no logos, no watermark, no distorted hands, no duplicate people. Scene S12 — Night of the Red Moon. OVER-SHOULDER shot, over the lead character's shoulder. Characters in frame: @KOSI_MENSAH (indigo utility jumpsuit with rolled sleeves, sand-coloured work boots and a narrow woven kente belt, small gold Adinkra-disc earrings); @SENA_ADJOVI (mustard oversized hoodie, blue-and-white printed ankle skirt and worn white canvas trainers, turquoise over-ear radio headphones). Over Kosi's shoulder, Sena compares the page's rhythm to the radio frequency. Mood: revelatory and ancestral. Lighting: thin pre-dawn blue with a red moon fading behind cloud. Environment = Location Registry id 'OLD_BEACON_HUT': A derelict tidal beacon hut on a small lagoon sandbar: cracked whitewash walls, a rusted ladder, broken blue lantern glass, salt-stained timber, reed grass and sweeping water on every side.",</w:t>
         <w:br/>
         <w:t xml:space="preserve">  "status": "⬜",</w:t>
         <w:br/>
@@ -8011,7 +8011,7 @@
         <w:br/>
         <w:t xml:space="preserve">  ],</w:t>
         <w:br/>
-        <w:t xml:space="preserve">  "prompt": "Grounded cinematic West African magical realism; contemporary Ghanaian coastal life; human-scale performances; saturated indigo, lagoon teal, clay red and warm amber palette; natural skin texture; tactile fabric and weathered wood; 2.39:1 widescreen composition; subtle film grain; expressive realistic lighting. No written words, no logos, no watermark, no distorted hands, no duplicate people. Scene S12 — Night of the Red Moon. EXTREME CLOSE shot, intimate frontal angle. Characters in frame: @AMA_ADJOVI (deep navy kaba blouse, hand-dyed indigo wrapper with tiny white wave motifs and flat leather sandals, three-strand amber bead necklace). Ama says memory is a signal someone must answer. Mood: revelatory and ancestral. Lighting: thin pre-dawn blue with a red moon fading behind cloud. Environment = Location Registry id 'OLD_BEACON_HUT': A derelict tidal beacon hut on a small lagoon sandbar: cracked whitewash walls, a rusted ladder, broken blue lantern glass, salt-stained timber, reed grass and sweeping water on every side.",</w:t>
+        <w:t xml:space="preserve">  "prompt": "Grounded cinematic West African magical realism; contemporary Ghanaian coastal life; human-scale performances; saturated indigo, lagoon teal, clay red and warm amber palette; natural skin texture; tactile fabric and weathered wood; 16:9 landscape widescreen composition; subtle film grain; expressive realistic lighting. No written words, no logos, no watermark, no distorted hands, no duplicate people. Scene S12 — Night of the Red Moon. EXTREME CLOSE shot, intimate frontal angle. Characters in frame: @AMA_ADJOVI (deep navy kaba blouse, hand-dyed indigo wrapper with tiny white wave motifs and flat leather sandals, three-strand amber bead necklace). Ama says memory is a signal someone must answer. Mood: revelatory and ancestral. Lighting: thin pre-dawn blue with a red moon fading behind cloud. Environment = Location Registry id 'OLD_BEACON_HUT': A derelict tidal beacon hut on a small lagoon sandbar: cracked whitewash walls, a rusted ladder, broken blue lantern glass, salt-stained timber, reed grass and sweeping water on every side.",</w:t>
         <w:br/>
         <w:t xml:space="preserve">  "status": "⬜",</w:t>
         <w:br/>
@@ -8074,7 +8074,7 @@
         <w:br/>
         <w:t xml:space="preserve">  ],</w:t>
         <w:br/>
-        <w:t xml:space="preserve">  "prompt": "Grounded cinematic West African magical realism; contemporary Ghanaian coastal life; human-scale performances; saturated indigo, lagoon teal, clay red and warm amber palette; natural skin texture; tactile fabric and weathered wood; 2.39:1 widescreen composition; subtle film grain; expressive realistic lighting. No written words, no logos, no watermark, no distorted hands, no duplicate people. Scene S12 — Night of the Red Moon. WIDE shot, low observational angle. Characters in frame: @AMA_ADJOVI (deep navy kaba blouse, hand-dyed indigo wrapper with tiny white wave motifs and flat leather sandals, three-strand amber bead necklace); @KOSI_MENSAH (indigo utility jumpsuit with rolled sleeves, sand-coloured work boots and a narrow woven kente belt, small gold Adinkra-disc earrings); @SENA_ADJOVI (mustard oversized hoodie, blue-and-white printed ankle skirt and worn white canvas trainers, turquoise over-ear radio headphones); @KOJO_DANSO (faded forest-green canvas jacket over a blue-and-cream striped shirt, charcoal trousers and rubber deck boots, weathered brass compass on a cord). The fading red moon frames the group in the beacon hut doorway. Mood: revelatory and ancestral. Lighting: thin pre-dawn blue with a red moon fading behind cloud. Environment = Location Registry id 'OLD_BEACON_HUT': A derelict tidal beacon hut on a small lagoon sandbar: cracked whitewash walls, a rusted ladder, broken blue lantern glass, salt-stained timber, reed grass and sweeping water on every side.",</w:t>
+        <w:t xml:space="preserve">  "prompt": "Grounded cinematic West African magical realism; contemporary Ghanaian coastal life; human-scale performances; saturated indigo, lagoon teal, clay red and warm amber palette; natural skin texture; tactile fabric and weathered wood; 16:9 landscape widescreen composition; subtle film grain; expressive realistic lighting. No written words, no logos, no watermark, no distorted hands, no duplicate people. Scene S12 — Night of the Red Moon. WIDE shot, low observational angle. Characters in frame: @AMA_ADJOVI (deep navy kaba blouse, hand-dyed indigo wrapper with tiny white wave motifs and flat leather sandals, three-strand amber bead necklace); @KOSI_MENSAH (indigo utility jumpsuit with rolled sleeves, sand-coloured work boots and a narrow woven kente belt, small gold Adinkra-disc earrings); @SENA_ADJOVI (mustard oversized hoodie, blue-and-white printed ankle skirt and worn white canvas trainers, turquoise over-ear radio headphones); @KOJO_DANSO (faded forest-green canvas jacket over a blue-and-cream striped shirt, charcoal trousers and rubber deck boots, weathered brass compass on a cord). The fading red moon frames the group in the beacon hut doorway. Mood: revelatory and ancestral. Lighting: thin pre-dawn blue with a red moon fading behind cloud. Environment = Location Registry id 'OLD_BEACON_HUT': A derelict tidal beacon hut on a small lagoon sandbar: cracked whitewash walls, a rusted ladder, broken blue lantern glass, salt-stained timber, reed grass and sweeping water on every side.",</w:t>
         <w:br/>
         <w:t xml:space="preserve">  "status": "⬜",</w:t>
         <w:br/>
@@ -8125,7 +8125,7 @@
         <w:br/>
         <w:t xml:space="preserve">  ],</w:t>
         <w:br/>
-        <w:t xml:space="preserve">  "prompt": "Grounded cinematic West African magical realism; contemporary Ghanaian coastal life; human-scale performances; saturated indigo, lagoon teal, clay red and warm amber palette; natural skin texture; tactile fabric and weathered wood; 2.39:1 widescreen composition; subtle film grain; expressive realistic lighting. No written words, no logos, no watermark, no distorted hands, no duplicate people. Scene S12 — Night of the Red Moon. MEDIUM shot, handheld eye-level. Characters in frame: @SENA_ADJOVI (mustard oversized hoodie, blue-and-white printed ankle skirt and worn white canvas trainers, turquoise over-ear radio headphones). Sena repeats Ama's words into her pocket recorder, finding a new sign-off. Mood: revelatory and ancestral. Lighting: thin pre-dawn blue with a red moon fading behind cloud. Environment = Location Registry id 'OLD_BEACON_HUT': A derelict tidal beacon hut on a small lagoon sandbar: cracked whitewash walls, a rusted ladder, broken blue lantern glass, salt-stained timber, reed grass and sweeping water on every side.",</w:t>
+        <w:t xml:space="preserve">  "prompt": "Grounded cinematic West African magical realism; contemporary Ghanaian coastal life; human-scale performances; saturated indigo, lagoon teal, clay red and warm amber palette; natural skin texture; tactile fabric and weathered wood; 16:9 landscape widescreen composition; subtle film grain; expressive realistic lighting. No written words, no logos, no watermark, no distorted hands, no duplicate people. Scene S12 — Night of the Red Moon. MEDIUM shot, handheld eye-level. Characters in frame: @SENA_ADJOVI (mustard oversized hoodie, blue-and-white printed ankle skirt and worn white canvas trainers, turquoise over-ear radio headphones). Sena repeats Ama's words into her pocket recorder, finding a new sign-off. Mood: revelatory and ancestral. Lighting: thin pre-dawn blue with a red moon fading behind cloud. Environment = Location Registry id 'OLD_BEACON_HUT': A derelict tidal beacon hut on a small lagoon sandbar: cracked whitewash walls, a rusted ladder, broken blue lantern glass, salt-stained timber, reed grass and sweeping water on every side.",</w:t>
         <w:br/>
         <w:t xml:space="preserve">  "status": "⬜",</w:t>
         <w:br/>
@@ -8188,7 +8188,7 @@
         <w:br/>
         <w:t xml:space="preserve">  ],</w:t>
         <w:br/>
-        <w:t xml:space="preserve">  "prompt": "Grounded cinematic West African magical realism; contemporary Ghanaian coastal life; human-scale performances; saturated indigo, lagoon teal, clay red and warm amber palette; natural skin texture; tactile fabric and weathered wood; 2.39:1 widescreen composition; subtle film grain; expressive realistic lighting. No written words, no logos, no watermark, no distorted hands, no duplicate people. Scene S12 — Night of the Red Moon. WIDE shot, rear closing tableau. Characters in frame: @AMA_ADJOVI (deep navy kaba blouse, hand-dyed indigo wrapper with tiny white wave motifs and flat leather sandals, three-strand amber bead necklace); @KOSI_MENSAH (indigo utility jumpsuit with rolled sleeves, sand-coloured work boots and a narrow woven kente belt, small gold Adinkra-disc earrings); @SENA_ADJOVI (mustard oversized hoodie, blue-and-white printed ankle skirt and worn white canvas trainers, turquoise over-ear radio headphones); @KOJO_DANSO (faded forest-green canvas jacket over a blue-and-cream striped shirt, charcoal trousers and rubber deck boots, weathered brass compass on a cord). They leave the beacon hut carrying an old signal into first light. Mood: revelatory and ancestral. Lighting: thin pre-dawn blue with a red moon fading behind cloud. Environment = Location Registry id 'OLD_BEACON_HUT': A derelict tidal beacon hut on a small lagoon sandbar: cracked whitewash walls, a rusted ladder, broken blue lantern glass, salt-stained timber, reed grass and sweeping water on every side.",</w:t>
+        <w:t xml:space="preserve">  "prompt": "Grounded cinematic West African magical realism; contemporary Ghanaian coastal life; human-scale performances; saturated indigo, lagoon teal, clay red and warm amber palette; natural skin texture; tactile fabric and weathered wood; 16:9 landscape widescreen composition; subtle film grain; expressive realistic lighting. No written words, no logos, no watermark, no distorted hands, no duplicate people. Scene S12 — Night of the Red Moon. WIDE shot, rear closing tableau. Characters in frame: @AMA_ADJOVI (deep navy kaba blouse, hand-dyed indigo wrapper with tiny white wave motifs and flat leather sandals, three-strand amber bead necklace); @KOSI_MENSAH (indigo utility jumpsuit with rolled sleeves, sand-coloured work boots and a narrow woven kente belt, small gold Adinkra-disc earrings); @SENA_ADJOVI (mustard oversized hoodie, blue-and-white printed ankle skirt and worn white canvas trainers, turquoise over-ear radio headphones); @KOJO_DANSO (faded forest-green canvas jacket over a blue-and-cream striped shirt, charcoal trousers and rubber deck boots, weathered brass compass on a cord). They leave the beacon hut carrying an old signal into first light. Mood: revelatory and ancestral. Lighting: thin pre-dawn blue with a red moon fading behind cloud. Environment = Location Registry id 'OLD_BEACON_HUT': A derelict tidal beacon hut on a small lagoon sandbar: cracked whitewash walls, a rusted ladder, broken blue lantern glass, salt-stained timber, reed grass and sweeping water on every side.",</w:t>
         <w:br/>
         <w:t xml:space="preserve">  "status": "⬜",</w:t>
         <w:br/>
@@ -8247,7 +8247,7 @@
         <w:br/>
         <w:t xml:space="preserve">  ],</w:t>
         <w:br/>
-        <w:t xml:space="preserve">  "prompt": "Grounded cinematic West African magical realism; contemporary Ghanaian coastal life; human-scale performances; saturated indigo, lagoon teal, clay red and warm amber palette; natural skin texture; tactile fabric and weathered wood; 2.39:1 widescreen composition; subtle film grain; expressive realistic lighting. No written words, no logos, no watermark, no distorted hands, no duplicate people. Scene S13 — The Yard Stands Still. WIDE shot, high establishing angle. Characters in frame: @ESI_TETTEH (brick-red wax-print dress beneath a soot-black oilskin apron, patterned headwrap and sturdy black sandals, smooth charred-wood smoking paddle). Esi's smoke yard stands still: ovens cold, fish trays stacked, workers watching. Mood: defiant collective action. Lighting: white daylight softened by smoke haze. Environment = Location Registry id 'FISH_SMOKE_YARD': Esi's fish-smoking yard by the Afenyo market: low clay smoking ovens, blackened racks, woven fish trays, stacked firewood, haze of fragrant smoke, red earth and a glimpse of lagoon water.",</w:t>
+        <w:t xml:space="preserve">  "prompt": "Grounded cinematic West African magical realism; contemporary Ghanaian coastal life; human-scale performances; saturated indigo, lagoon teal, clay red and warm amber palette; natural skin texture; tactile fabric and weathered wood; 16:9 landscape widescreen composition; subtle film grain; expressive realistic lighting. No written words, no logos, no watermark, no distorted hands, no duplicate people. Scene S13 — The Yard Stands Still. WIDE shot, high establishing angle. Characters in frame: @ESI_TETTEH (brick-red wax-print dress beneath a soot-black oilskin apron, patterned headwrap and sturdy black sandals, smooth charred-wood smoking paddle). Esi's smoke yard stands still: ovens cold, fish trays stacked, workers watching. Mood: defiant collective action. Lighting: white daylight softened by smoke haze. Environment = Location Registry id 'FISH_SMOKE_YARD': Esi's fish-smoking yard by the Afenyo market: low clay smoking ovens, blackened racks, woven fish trays, stacked firewood, haze of fragrant smoke, red earth and a glimpse of lagoon water.",</w:t>
         <w:br/>
         <w:t xml:space="preserve">  "status": "⬜",</w:t>
         <w:br/>
@@ -8298,7 +8298,7 @@
         <w:br/>
         <w:t xml:space="preserve">  ],</w:t>
         <w:br/>
-        <w:t xml:space="preserve">  "prompt": "Grounded cinematic West African magical realism; contemporary Ghanaian coastal life; human-scale performances; saturated indigo, lagoon teal, clay red and warm amber palette; natural skin texture; tactile fabric and weathered wood; 2.39:1 widescreen composition; subtle film grain; expressive realistic lighting. No written words, no logos, no watermark, no distorted hands, no duplicate people. Scene S13 — The Yard Stands Still. MEDIUM shot, eye-level. Characters in frame: @ESI_TETTEH (brick-red wax-print dress beneath a soot-black oilskin apron, patterned headwrap and sturdy black sandals, smooth charred-wood smoking paddle). Esi raises her charred paddle and calls for a careful work stoppage. Mood: defiant collective action. Lighting: white daylight softened by smoke haze. Environment = Location Registry id 'FISH_SMOKE_YARD': Esi's fish-smoking yard by the Afenyo market: low clay smoking ovens, blackened racks, woven fish trays, stacked firewood, haze of fragrant smoke, red earth and a glimpse of lagoon water.",</w:t>
+        <w:t xml:space="preserve">  "prompt": "Grounded cinematic West African magical realism; contemporary Ghanaian coastal life; human-scale performances; saturated indigo, lagoon teal, clay red and warm amber palette; natural skin texture; tactile fabric and weathered wood; 16:9 landscape widescreen composition; subtle film grain; expressive realistic lighting. No written words, no logos, no watermark, no distorted hands, no duplicate people. Scene S13 — The Yard Stands Still. MEDIUM shot, eye-level. Characters in frame: @ESI_TETTEH (brick-red wax-print dress beneath a soot-black oilskin apron, patterned headwrap and sturdy black sandals, smooth charred-wood smoking paddle). Esi raises her charred paddle and calls for a careful work stoppage. Mood: defiant collective action. Lighting: white daylight softened by smoke haze. Environment = Location Registry id 'FISH_SMOKE_YARD': Esi's fish-smoking yard by the Afenyo market: low clay smoking ovens, blackened racks, woven fish trays, stacked firewood, haze of fragrant smoke, red earth and a glimpse of lagoon water.",</w:t>
         <w:br/>
         <w:t xml:space="preserve">  "status": "⬜",</w:t>
         <w:br/>
@@ -8349,7 +8349,7 @@
         <w:br/>
         <w:t xml:space="preserve">  ],</w:t>
         <w:br/>
-        <w:t xml:space="preserve">  "prompt": "Grounded cinematic West African magical realism; contemporary Ghanaian coastal life; human-scale performances; saturated indigo, lagoon teal, clay red and warm amber palette; natural skin texture; tactile fabric and weathered wood; 2.39:1 widescreen composition; subtle film grain; expressive realistic lighting. No written words, no logos, no watermark, no distorted hands, no duplicate people. Scene S13 — The Yard Stands Still. CLOSE shot, three-quarter profile. Characters in frame: @KOSI_MENSAH (indigo utility jumpsuit with rolled sleeves, sand-coloured work boots and a narrow woven kente belt, small gold Adinkra-disc earrings). Kosi holds water-sample results protected in a clear sleeve. Mood: defiant collective action. Lighting: white daylight softened by smoke haze. Environment = Location Registry id 'FISH_SMOKE_YARD': Esi's fish-smoking yard by the Afenyo market: low clay smoking ovens, blackened racks, woven fish trays, stacked firewood, haze of fragrant smoke, red earth and a glimpse of lagoon water.",</w:t>
+        <w:t xml:space="preserve">  "prompt": "Grounded cinematic West African magical realism; contemporary Ghanaian coastal life; human-scale performances; saturated indigo, lagoon teal, clay red and warm amber palette; natural skin texture; tactile fabric and weathered wood; 16:9 landscape widescreen composition; subtle film grain; expressive realistic lighting. No written words, no logos, no watermark, no distorted hands, no duplicate people. Scene S13 — The Yard Stands Still. CLOSE shot, three-quarter profile. Characters in frame: @KOSI_MENSAH (indigo utility jumpsuit with rolled sleeves, sand-coloured work boots and a narrow woven kente belt, small gold Adinkra-disc earrings). Kosi holds water-sample results protected in a clear sleeve. Mood: defiant collective action. Lighting: white daylight softened by smoke haze. Environment = Location Registry id 'FISH_SMOKE_YARD': Esi's fish-smoking yard by the Afenyo market: low clay smoking ovens, blackened racks, woven fish trays, stacked firewood, haze of fragrant smoke, red earth and a glimpse of lagoon water.",</w:t>
         <w:br/>
         <w:t xml:space="preserve">  "status": "⬜",</w:t>
         <w:br/>
@@ -8400,7 +8400,7 @@
         <w:br/>
         <w:t xml:space="preserve">  ],</w:t>
         <w:br/>
-        <w:t xml:space="preserve">  "prompt": "Grounded cinematic West African magical realism; contemporary Ghanaian coastal life; human-scale performances; saturated indigo, lagoon teal, clay red and warm amber palette; natural skin texture; tactile fabric and weathered wood; 2.39:1 widescreen composition; subtle film grain; expressive realistic lighting. No written words, no logos, no watermark, no distorted hands, no duplicate people. Scene S13 — The Yard Stands Still. INSERT shot, top-down detail. Characters in frame: @ESI_TETTEH (brick-red wax-print dress beneath a soot-black oilskin apron, patterned headwrap and sturdy black sandals, smooth charred-wood smoking paddle). Woven fish trays make a nonviolent barrier across the resort road. Mood: defiant collective action. Lighting: white daylight softened by smoke haze. Environment = Location Registry id 'FISH_SMOKE_YARD': Esi's fish-smoking yard by the Afenyo market: low clay smoking ovens, blackened racks, woven fish trays, stacked firewood, haze of fragrant smoke, red earth and a glimpse of lagoon water.",</w:t>
+        <w:t xml:space="preserve">  "prompt": "Grounded cinematic West African magical realism; contemporary Ghanaian coastal life; human-scale performances; saturated indigo, lagoon teal, clay red and warm amber palette; natural skin texture; tactile fabric and weathered wood; 16:9 landscape widescreen composition; subtle film grain; expressive realistic lighting. No written words, no logos, no watermark, no distorted hands, no duplicate people. Scene S13 — The Yard Stands Still. INSERT shot, top-down detail. Characters in frame: @ESI_TETTEH (brick-red wax-print dress beneath a soot-black oilskin apron, patterned headwrap and sturdy black sandals, smooth charred-wood smoking paddle). Woven fish trays make a nonviolent barrier across the resort road. Mood: defiant collective action. Lighting: white daylight softened by smoke haze. Environment = Location Registry id 'FISH_SMOKE_YARD': Esi's fish-smoking yard by the Afenyo market: low clay smoking ovens, blackened racks, woven fish trays, stacked firewood, haze of fragrant smoke, red earth and a glimpse of lagoon water.",</w:t>
         <w:br/>
         <w:t xml:space="preserve">  "status": "⬜",</w:t>
         <w:br/>
@@ -8455,7 +8455,7 @@
         <w:br/>
         <w:t xml:space="preserve">  ],</w:t>
         <w:br/>
-        <w:t xml:space="preserve">  "prompt": "Grounded cinematic West African magical realism; contemporary Ghanaian coastal life; human-scale performances; saturated indigo, lagoon teal, clay red and warm amber palette; natural skin texture; tactile fabric and weathered wood; 2.39:1 widescreen composition; subtle film grain; expressive realistic lighting. No written words, no logos, no watermark, no distorted hands, no duplicate people. Scene S13 — The Yard Stands Still. TWO-SHOT shot, eye-level. Characters in frame: @NII_LAMPTEY (tailored charcoal caftan with a subtle black geometric weave, polished black shoes and a silver wristwatch, black ebony walking cane with a carved heron handle); @ESI_TETTEH (brick-red wax-print dress beneath a soot-black oilskin apron, patterned headwrap and sturdy black sandals, smooth charred-wood smoking paddle). Nii arrives with his ebony heron cane as Esi meets him in the smoke. Mood: defiant collective action. Lighting: white daylight softened by smoke haze. Environment = Location Registry id 'FISH_SMOKE_YARD': Esi's fish-smoking yard by the Afenyo market: low clay smoking ovens, blackened racks, woven fish trays, stacked firewood, haze of fragrant smoke, red earth and a glimpse of lagoon water.",</w:t>
+        <w:t xml:space="preserve">  "prompt": "Grounded cinematic West African magical realism; contemporary Ghanaian coastal life; human-scale performances; saturated indigo, lagoon teal, clay red and warm amber palette; natural skin texture; tactile fabric and weathered wood; 16:9 landscape widescreen composition; subtle film grain; expressive realistic lighting. No written words, no logos, no watermark, no distorted hands, no duplicate people. Scene S13 — The Yard Stands Still. TWO-SHOT shot, eye-level. Characters in frame: @NII_LAMPTEY (tailored charcoal caftan with a subtle black geometric weave, polished black shoes and a silver wristwatch, black ebony walking cane with a carved heron handle); @ESI_TETTEH (brick-red wax-print dress beneath a soot-black oilskin apron, patterned headwrap and sturdy black sandals, smooth charred-wood smoking paddle). Nii arrives with his ebony heron cane as Esi meets him in the smoke. Mood: defiant collective action. Lighting: white daylight softened by smoke haze. Environment = Location Registry id 'FISH_SMOKE_YARD': Esi's fish-smoking yard by the Afenyo market: low clay smoking ovens, blackened racks, woven fish trays, stacked firewood, haze of fragrant smoke, red earth and a glimpse of lagoon water.",</w:t>
         <w:br/>
         <w:t xml:space="preserve">  "status": "⬜",</w:t>
         <w:br/>
@@ -8510,7 +8510,7 @@
         <w:br/>
         <w:t xml:space="preserve">  ],</w:t>
         <w:br/>
-        <w:t xml:space="preserve">  "prompt": "Grounded cinematic West African magical realism; contemporary Ghanaian coastal life; human-scale performances; saturated indigo, lagoon teal, clay red and warm amber palette; natural skin texture; tactile fabric and weathered wood; 2.39:1 widescreen composition; subtle film grain; expressive realistic lighting. No written words, no logos, no watermark, no distorted hands, no duplicate people. Scene S13 — The Yard Stands Still. OVER-SHOULDER shot, over the lead character's shoulder. Characters in frame: @KOSI_MENSAH (indigo utility jumpsuit with rolled sleeves, sand-coloured work boots and a narrow woven kente belt, small gold Adinkra-disc earrings); @NII_LAMPTEY (tailored charcoal caftan with a subtle black geometric weave, polished black shoes and a silver wristwatch, black ebony walking cane with a carved heron handle). Over Kosi's shoulder, Nii refuses even to read the water results. Mood: defiant collective action. Lighting: white daylight softened by smoke haze. Environment = Location Registry id 'FISH_SMOKE_YARD': Esi's fish-smoking yard by the Afenyo market: low clay smoking ovens, blackened racks, woven fish trays, stacked firewood, haze of fragrant smoke, red earth and a glimpse of lagoon water.",</w:t>
+        <w:t xml:space="preserve">  "prompt": "Grounded cinematic West African magical realism; contemporary Ghanaian coastal life; human-scale performances; saturated indigo, lagoon teal, clay red and warm amber palette; natural skin texture; tactile fabric and weathered wood; 16:9 landscape widescreen composition; subtle film grain; expressive realistic lighting. No written words, no logos, no watermark, no distorted hands, no duplicate people. Scene S13 — The Yard Stands Still. OVER-SHOULDER shot, over the lead character's shoulder. Characters in frame: @KOSI_MENSAH (indigo utility jumpsuit with rolled sleeves, sand-coloured work boots and a narrow woven kente belt, small gold Adinkra-disc earrings); @NII_LAMPTEY (tailored charcoal caftan with a subtle black geometric weave, polished black shoes and a silver wristwatch, black ebony walking cane with a carved heron handle). Over Kosi's shoulder, Nii refuses even to read the water results. Mood: defiant collective action. Lighting: white daylight softened by smoke haze. Environment = Location Registry id 'FISH_SMOKE_YARD': Esi's fish-smoking yard by the Afenyo market: low clay smoking ovens, blackened racks, woven fish trays, stacked firewood, haze of fragrant smoke, red earth and a glimpse of lagoon water.",</w:t>
         <w:br/>
         <w:t xml:space="preserve">  "status": "⬜",</w:t>
         <w:br/>
@@ -8561,7 +8561,7 @@
         <w:br/>
         <w:t xml:space="preserve">  ],</w:t>
         <w:br/>
-        <w:t xml:space="preserve">  "prompt": "Grounded cinematic West African magical realism; contemporary Ghanaian coastal life; human-scale performances; saturated indigo, lagoon teal, clay red and warm amber palette; natural skin texture; tactile fabric and weathered wood; 2.39:1 widescreen composition; subtle film grain; expressive realistic lighting. No written words, no logos, no watermark, no distorted hands, no duplicate people. Scene S13 — The Yard Stands Still. EXTREME CLOSE shot, intimate frontal angle. Characters in frame: @ESI_TETTEH (brick-red wax-print dress beneath a soot-black oilskin apron, patterned headwrap and sturdy black sandals, smooth charred-wood smoking paddle). Esi says theft does not become progress by wearing a hard hat. Mood: defiant collective action. Lighting: white daylight softened by smoke haze. Environment = Location Registry id 'FISH_SMOKE_YARD': Esi's fish-smoking yard by the Afenyo market: low clay smoking ovens, blackened racks, woven fish trays, stacked firewood, haze of fragrant smoke, red earth and a glimpse of lagoon water.",</w:t>
+        <w:t xml:space="preserve">  "prompt": "Grounded cinematic West African magical realism; contemporary Ghanaian coastal life; human-scale performances; saturated indigo, lagoon teal, clay red and warm amber palette; natural skin texture; tactile fabric and weathered wood; 16:9 landscape widescreen composition; subtle film grain; expressive realistic lighting. No written words, no logos, no watermark, no distorted hands, no duplicate people. Scene S13 — The Yard Stands Still. EXTREME CLOSE shot, intimate frontal angle. Characters in frame: @ESI_TETTEH (brick-red wax-print dress beneath a soot-black oilskin apron, patterned headwrap and sturdy black sandals, smooth charred-wood smoking paddle). Esi says theft does not become progress by wearing a hard hat. Mood: defiant collective action. Lighting: white daylight softened by smoke haze. Environment = Location Registry id 'FISH_SMOKE_YARD': Esi's fish-smoking yard by the Afenyo market: low clay smoking ovens, blackened racks, woven fish trays, stacked firewood, haze of fragrant smoke, red earth and a glimpse of lagoon water.",</w:t>
         <w:br/>
         <w:t xml:space="preserve">  "status": "⬜",</w:t>
         <w:br/>
@@ -8624,7 +8624,7 @@
         <w:br/>
         <w:t xml:space="preserve">  ],</w:t>
         <w:br/>
-        <w:t xml:space="preserve">  "prompt": "Grounded cinematic West African magical realism; contemporary Ghanaian coastal life; human-scale performances; saturated indigo, lagoon teal, clay red and warm amber palette; natural skin texture; tactile fabric and weathered wood; 2.39:1 widescreen composition; subtle film grain; expressive realistic lighting. No written words, no logos, no watermark, no distorted hands, no duplicate people. Scene S13 — The Yard Stands Still. WIDE shot, low observational angle. Characters in frame: @ESI_TETTEH (brick-red wax-print dress beneath a soot-black oilskin apron, patterned headwrap and sturdy black sandals, smooth charred-wood smoking paddle); @KOSI_MENSAH (indigo utility jumpsuit with rolled sleeves, sand-coloured work boots and a narrow woven kente belt, small gold Adinkra-disc earrings); @SENA_ADJOVI (mustard oversized hoodie, blue-and-white printed ankle skirt and worn white canvas trainers, turquoise over-ear radio headphones); @NII_LAMPTEY (tailored charcoal caftan with a subtle black geometric weave, polished black shoes and a silver wristwatch, black ebony walking cane with a carved heron handle). Fish smokers stand shoulder to shoulder amid luminous smoke. Mood: defiant collective action. Lighting: white daylight softened by smoke haze. Environment = Location Registry id 'FISH_SMOKE_YARD': Esi's fish-smoking yard by the Afenyo market: low clay smoking ovens, blackened racks, woven fish trays, stacked firewood, haze of fragrant smoke, red earth and a glimpse of lagoon water.",</w:t>
+        <w:t xml:space="preserve">  "prompt": "Grounded cinematic West African magical realism; contemporary Ghanaian coastal life; human-scale performances; saturated indigo, lagoon teal, clay red and warm amber palette; natural skin texture; tactile fabric and weathered wood; 16:9 landscape widescreen composition; subtle film grain; expressive realistic lighting. No written words, no logos, no watermark, no distorted hands, no duplicate people. Scene S13 — The Yard Stands Still. WIDE shot, low observational angle. Characters in frame: @ESI_TETTEH (brick-red wax-print dress beneath a soot-black oilskin apron, patterned headwrap and sturdy black sandals, smooth charred-wood smoking paddle); @KOSI_MENSAH (indigo utility jumpsuit with rolled sleeves, sand-coloured work boots and a narrow woven kente belt, small gold Adinkra-disc earrings); @SENA_ADJOVI (mustard oversized hoodie, blue-and-white printed ankle skirt and worn white canvas trainers, turquoise over-ear radio headphones); @NII_LAMPTEY (tailored charcoal caftan with a subtle black geometric weave, polished black shoes and a silver wristwatch, black ebony walking cane with a carved heron handle). Fish smokers stand shoulder to shoulder amid luminous smoke. Mood: defiant collective action. Lighting: white daylight softened by smoke haze. Environment = Location Registry id 'FISH_SMOKE_YARD': Esi's fish-smoking yard by the Afenyo market: low clay smoking ovens, blackened racks, woven fish trays, stacked firewood, haze of fragrant smoke, red earth and a glimpse of lagoon water.",</w:t>
         <w:br/>
         <w:t xml:space="preserve">  "status": "⬜",</w:t>
         <w:br/>
@@ -8675,7 +8675,7 @@
         <w:br/>
         <w:t xml:space="preserve">  ],</w:t>
         <w:br/>
-        <w:t xml:space="preserve">  "prompt": "Grounded cinematic West African magical realism; contemporary Ghanaian coastal life; human-scale performances; saturated indigo, lagoon teal, clay red and warm amber palette; natural skin texture; tactile fabric and weathered wood; 2.39:1 widescreen composition; subtle film grain; expressive realistic lighting. No written words, no logos, no watermark, no distorted hands, no duplicate people. Scene S13 — The Yard Stands Still. MEDIUM shot, handheld eye-level. Characters in frame: @SENA_ADJOVI (mustard oversized hoodie, blue-and-white printed ankle skirt and worn white canvas trainers, turquoise over-ear radio headphones). Sena broadcasts Esi's words into her small microphone. Mood: defiant collective action. Lighting: white daylight softened by smoke haze. Environment = Location Registry id 'FISH_SMOKE_YARD': Esi's fish-smoking yard by the Afenyo market: low clay smoking ovens, blackened racks, woven fish trays, stacked firewood, haze of fragrant smoke, red earth and a glimpse of lagoon water.",</w:t>
+        <w:t xml:space="preserve">  "prompt": "Grounded cinematic West African magical realism; contemporary Ghanaian coastal life; human-scale performances; saturated indigo, lagoon teal, clay red and warm amber palette; natural skin texture; tactile fabric and weathered wood; 16:9 landscape widescreen composition; subtle film grain; expressive realistic lighting. No written words, no logos, no watermark, no distorted hands, no duplicate people. Scene S13 — The Yard Stands Still. MEDIUM shot, handheld eye-level. Characters in frame: @SENA_ADJOVI (mustard oversized hoodie, blue-and-white printed ankle skirt and worn white canvas trainers, turquoise over-ear radio headphones). Sena broadcasts Esi's words into her small microphone. Mood: defiant collective action. Lighting: white daylight softened by smoke haze. Environment = Location Registry id 'FISH_SMOKE_YARD': Esi's fish-smoking yard by the Afenyo market: low clay smoking ovens, blackened racks, woven fish trays, stacked firewood, haze of fragrant smoke, red earth and a glimpse of lagoon water.",</w:t>
         <w:br/>
         <w:t xml:space="preserve">  "status": "⬜",</w:t>
         <w:br/>
@@ -8730,7 +8730,7 @@
         <w:br/>
         <w:t xml:space="preserve">  ],</w:t>
         <w:br/>
-        <w:t xml:space="preserve">  "prompt": "Grounded cinematic West African magical realism; contemporary Ghanaian coastal life; human-scale performances; saturated indigo, lagoon teal, clay red and warm amber palette; natural skin texture; tactile fabric and weathered wood; 2.39:1 widescreen composition; subtle film grain; expressive realistic lighting. No written words, no logos, no watermark, no distorted hands, no duplicate people. Scene S13 — The Yard Stands Still. WIDE shot, rear closing tableau. Characters in frame: @ESI_TETTEH (brick-red wax-print dress beneath a soot-black oilskin apron, patterned headwrap and sturdy black sandals, smooth charred-wood smoking paddle); @NII_LAMPTEY (tailored charcoal caftan with a subtle black geometric weave, polished black shoes and a silver wristwatch, black ebony walking cane with a carved heron handle). The smoke-yard standoff holds as the whole town watches. Mood: defiant collective action. Lighting: white daylight softened by smoke haze. Environment = Location Registry id 'FISH_SMOKE_YARD': Esi's fish-smoking yard by the Afenyo market: low clay smoking ovens, blackened racks, woven fish trays, stacked firewood, haze of fragrant smoke, red earth and a glimpse of lagoon water.",</w:t>
+        <w:t xml:space="preserve">  "prompt": "Grounded cinematic West African magical realism; contemporary Ghanaian coastal life; human-scale performances; saturated indigo, lagoon teal, clay red and warm amber palette; natural skin texture; tactile fabric and weathered wood; 16:9 landscape widescreen composition; subtle film grain; expressive realistic lighting. No written words, no logos, no watermark, no distorted hands, no duplicate people. Scene S13 — The Yard Stands Still. WIDE shot, rear closing tableau. Characters in frame: @ESI_TETTEH (brick-red wax-print dress beneath a soot-black oilskin apron, patterned headwrap and sturdy black sandals, smooth charred-wood smoking paddle); @NII_LAMPTEY (tailored charcoal caftan with a subtle black geometric weave, polished black shoes and a silver wristwatch, black ebony walking cane with a carved heron handle). The smoke-yard standoff holds as the whole town watches. Mood: defiant collective action. Lighting: white daylight softened by smoke haze. Environment = Location Registry id 'FISH_SMOKE_YARD': Esi's fish-smoking yard by the Afenyo market: low clay smoking ovens, blackened racks, woven fish trays, stacked firewood, haze of fragrant smoke, red earth and a glimpse of lagoon water.",</w:t>
         <w:br/>
         <w:t xml:space="preserve">  "status": "⬜",</w:t>
         <w:br/>
@@ -8789,7 +8789,7 @@
         <w:br/>
         <w:t xml:space="preserve">  ],</w:t>
         <w:br/>
-        <w:t xml:space="preserve">  "prompt": "Grounded cinematic West African magical realism; contemporary Ghanaian coastal life; human-scale performances; saturated indigo, lagoon teal, clay red and warm amber palette; natural skin texture; tactile fabric and weathered wood; 2.39:1 widescreen composition; subtle film grain; expressive realistic lighting. No written words, no logos, no watermark, no distorted hands, no duplicate people. Scene S14 — Archive of the Unheard. WIDE shot, high establishing angle. Characters in frame: @KWAME_AGYEMAN (white linen shirt under a caramel lightweight field jacket, dark tailored trousers and brown loafers, antique bronze lapel pin shaped like a compass rose). Kwame unlocks the dim archive beneath the assembly hall after hours. Mood: quiet betrayal turning toward alliance. Lighting: single green desk lamp, dust and darkness. Environment = Location Registry id 'COUNCIL_ARCHIVE': A dim records room beneath Afenyo's district assembly hall: metal filing shelves, bound land ledgers, dust motes, a scarred wooden table, a green-shaded desk lamp and narrow high windows.",</w:t>
+        <w:t xml:space="preserve">  "prompt": "Grounded cinematic West African magical realism; contemporary Ghanaian coastal life; human-scale performances; saturated indigo, lagoon teal, clay red and warm amber palette; natural skin texture; tactile fabric and weathered wood; 16:9 landscape widescreen composition; subtle film grain; expressive realistic lighting. No written words, no logos, no watermark, no distorted hands, no duplicate people. Scene S14 — Archive of the Unheard. WIDE shot, high establishing angle. Characters in frame: @KWAME_AGYEMAN (white linen shirt under a caramel lightweight field jacket, dark tailored trousers and brown loafers, antique bronze lapel pin shaped like a compass rose). Kwame unlocks the dim archive beneath the assembly hall after hours. Mood: quiet betrayal turning toward alliance. Lighting: single green desk lamp, dust and darkness. Environment = Location Registry id 'COUNCIL_ARCHIVE': A dim records room beneath Afenyo's district assembly hall: metal filing shelves, bound land ledgers, dust motes, a scarred wooden table, a green-shaded desk lamp and narrow high windows.",</w:t>
         <w:br/>
         <w:t xml:space="preserve">  "status": "⬜",</w:t>
         <w:br/>
@@ -8840,7 +8840,7 @@
         <w:br/>
         <w:t xml:space="preserve">  ],</w:t>
         <w:br/>
-        <w:t xml:space="preserve">  "prompt": "Grounded cinematic West African magical realism; contemporary Ghanaian coastal life; human-scale performances; saturated indigo, lagoon teal, clay red and warm amber palette; natural skin texture; tactile fabric and weathered wood; 2.39:1 widescreen composition; subtle film grain; expressive realistic lighting. No written words, no logos, no watermark, no distorted hands, no duplicate people. Scene S14 — Archive of the Unheard. MEDIUM shot, eye-level. Characters in frame: @KOSI_MENSAH (indigo utility jumpsuit with rolled sleeves, sand-coloured work boots and a narrow woven kente belt, small gold Adinkra-disc earrings). Kosi searches rows of bound land ledgers with quick, careful hands. Mood: quiet betrayal turning toward alliance. Lighting: single green desk lamp, dust and darkness. Environment = Location Registry id 'COUNCIL_ARCHIVE': A dim records room beneath Afenyo's district assembly hall: metal filing shelves, bound land ledgers, dust motes, a scarred wooden table, a green-shaded desk lamp and narrow high windows.",</w:t>
+        <w:t xml:space="preserve">  "prompt": "Grounded cinematic West African magical realism; contemporary Ghanaian coastal life; human-scale performances; saturated indigo, lagoon teal, clay red and warm amber palette; natural skin texture; tactile fabric and weathered wood; 16:9 landscape widescreen composition; subtle film grain; expressive realistic lighting. No written words, no logos, no watermark, no distorted hands, no duplicate people. Scene S14 — Archive of the Unheard. MEDIUM shot, eye-level. Characters in frame: @KOSI_MENSAH (indigo utility jumpsuit with rolled sleeves, sand-coloured work boots and a narrow woven kente belt, small gold Adinkra-disc earrings). Kosi searches rows of bound land ledgers with quick, careful hands. Mood: quiet betrayal turning toward alliance. Lighting: single green desk lamp, dust and darkness. Environment = Location Registry id 'COUNCIL_ARCHIVE': A dim records room beneath Afenyo's district assembly hall: metal filing shelves, bound land ledgers, dust motes, a scarred wooden table, a green-shaded desk lamp and narrow high windows.",</w:t>
         <w:br/>
         <w:t xml:space="preserve">  "status": "⬜",</w:t>
         <w:br/>
@@ -8891,7 +8891,7 @@
         <w:br/>
         <w:t xml:space="preserve">  ],</w:t>
         <w:br/>
-        <w:t xml:space="preserve">  "prompt": "Grounded cinematic West African magical realism; contemporary Ghanaian coastal life; human-scale performances; saturated indigo, lagoon teal, clay red and warm amber palette; natural skin texture; tactile fabric and weathered wood; 2.39:1 widescreen composition; subtle film grain; expressive realistic lighting. No written words, no logos, no watermark, no distorted hands, no duplicate people. Scene S14 — Archive of the Unheard. CLOSE shot, three-quarter profile. Characters in frame: @KWAME_AGYEMAN (white linen shirt under a caramel lightweight field jacket, dark tailored trousers and brown loafers, antique bronze lapel pin shaped like a compass rose). Kwame listens toward the stairwell while holding the keycard. Mood: quiet betrayal turning toward alliance. Lighting: single green desk lamp, dust and darkness. Environment = Location Registry id 'COUNCIL_ARCHIVE': A dim records room beneath Afenyo's district assembly hall: metal filing shelves, bound land ledgers, dust motes, a scarred wooden table, a green-shaded desk lamp and narrow high windows.",</w:t>
+        <w:t xml:space="preserve">  "prompt": "Grounded cinematic West African magical realism; contemporary Ghanaian coastal life; human-scale performances; saturated indigo, lagoon teal, clay red and warm amber palette; natural skin texture; tactile fabric and weathered wood; 16:9 landscape widescreen composition; subtle film grain; expressive realistic lighting. No written words, no logos, no watermark, no distorted hands, no duplicate people. Scene S14 — Archive of the Unheard. CLOSE shot, three-quarter profile. Characters in frame: @KWAME_AGYEMAN (white linen shirt under a caramel lightweight field jacket, dark tailored trousers and brown loafers, antique bronze lapel pin shaped like a compass rose). Kwame listens toward the stairwell while holding the keycard. Mood: quiet betrayal turning toward alliance. Lighting: single green desk lamp, dust and darkness. Environment = Location Registry id 'COUNCIL_ARCHIVE': A dim records room beneath Afenyo's district assembly hall: metal filing shelves, bound land ledgers, dust motes, a scarred wooden table, a green-shaded desk lamp and narrow high windows.",</w:t>
         <w:br/>
         <w:t xml:space="preserve">  "status": "⬜",</w:t>
         <w:br/>
@@ -8942,7 +8942,7 @@
         <w:br/>
         <w:t xml:space="preserve">  ],</w:t>
         <w:br/>
-        <w:t xml:space="preserve">  "prompt": "Grounded cinematic West African magical realism; contemporary Ghanaian coastal life; human-scale performances; saturated indigo, lagoon teal, clay red and warm amber palette; natural skin texture; tactile fabric and weathered wood; 2.39:1 widescreen composition; subtle film grain; expressive realistic lighting. No written words, no logos, no watermark, no distorted hands, no duplicate people. Scene S14 — Archive of the Unheard. INSERT shot, top-down detail. Characters in frame: @KOSI_MENSAH (indigo utility jumpsuit with rolled sleeves, sand-coloured work boots and a narrow woven kente belt, small gold Adinkra-disc earrings). An original public-landing record opens beneath the green-shaded desk lamp. Mood: quiet betrayal turning toward alliance. Lighting: single green desk lamp, dust and darkness. Environment = Location Registry id 'COUNCIL_ARCHIVE': A dim records room beneath Afenyo's district assembly hall: metal filing shelves, bound land ledgers, dust motes, a scarred wooden table, a green-shaded desk lamp and narrow high windows.",</w:t>
+        <w:t xml:space="preserve">  "prompt": "Grounded cinematic West African magical realism; contemporary Ghanaian coastal life; human-scale performances; saturated indigo, lagoon teal, clay red and warm amber palette; natural skin texture; tactile fabric and weathered wood; 16:9 landscape widescreen composition; subtle film grain; expressive realistic lighting. No written words, no logos, no watermark, no distorted hands, no duplicate people. Scene S14 — Archive of the Unheard. INSERT shot, top-down detail. Characters in frame: @KOSI_MENSAH (indigo utility jumpsuit with rolled sleeves, sand-coloured work boots and a narrow woven kente belt, small gold Adinkra-disc earrings). An original public-landing record opens beneath the green-shaded desk lamp. Mood: quiet betrayal turning toward alliance. Lighting: single green desk lamp, dust and darkness. Environment = Location Registry id 'COUNCIL_ARCHIVE': A dim records room beneath Afenyo's district assembly hall: metal filing shelves, bound land ledgers, dust motes, a scarred wooden table, a green-shaded desk lamp and narrow high windows.",</w:t>
         <w:br/>
         <w:t xml:space="preserve">  "status": "⬜",</w:t>
         <w:br/>
@@ -8997,7 +8997,7 @@
         <w:br/>
         <w:t xml:space="preserve">  ],</w:t>
         <w:br/>
-        <w:t xml:space="preserve">  "prompt": "Grounded cinematic West African magical realism; contemporary Ghanaian coastal life; human-scale performances; saturated indigo, lagoon teal, clay red and warm amber palette; natural skin texture; tactile fabric and weathered wood; 2.39:1 widescreen composition; subtle film grain; expressive realistic lighting. No written words, no logos, no watermark, no distorted hands, no duplicate people. Scene S14 — Archive of the Unheard. TWO-SHOT shot, eye-level. Characters in frame: @KOSI_MENSAH (indigo utility jumpsuit with rolled sleeves, sand-coloured work boots and a narrow woven kente belt, small gold Adinkra-disc earrings); @KWAME_AGYEMAN (white linen shirt under a caramel lightweight field jacket, dark tailored trousers and brown loafers, antique bronze lapel pin shaped like a compass rose). Kosi and Kwame compare the recent amendment with the record that disproves it. Mood: quiet betrayal turning toward alliance. Lighting: single green desk lamp, dust and darkness. Environment = Location Registry id 'COUNCIL_ARCHIVE': A dim records room beneath Afenyo's district assembly hall: metal filing shelves, bound land ledgers, dust motes, a scarred wooden table, a green-shaded desk lamp and narrow high windows.",</w:t>
+        <w:t xml:space="preserve">  "prompt": "Grounded cinematic West African magical realism; contemporary Ghanaian coastal life; human-scale performances; saturated indigo, lagoon teal, clay red and warm amber palette; natural skin texture; tactile fabric and weathered wood; 16:9 landscape widescreen composition; subtle film grain; expressive realistic lighting. No written words, no logos, no watermark, no distorted hands, no duplicate people. Scene S14 — Archive of the Unheard. TWO-SHOT shot, eye-level. Characters in frame: @KOSI_MENSAH (indigo utility jumpsuit with rolled sleeves, sand-coloured work boots and a narrow woven kente belt, small gold Adinkra-disc earrings); @KWAME_AGYEMAN (white linen shirt under a caramel lightweight field jacket, dark tailored trousers and brown loafers, antique bronze lapel pin shaped like a compass rose). Kosi and Kwame compare the recent amendment with the record that disproves it. Mood: quiet betrayal turning toward alliance. Lighting: single green desk lamp, dust and darkness. Environment = Location Registry id 'COUNCIL_ARCHIVE': A dim records room beneath Afenyo's district assembly hall: metal filing shelves, bound land ledgers, dust motes, a scarred wooden table, a green-shaded desk lamp and narrow high windows.",</w:t>
         <w:br/>
         <w:t xml:space="preserve">  "status": "⬜",</w:t>
         <w:br/>
@@ -9052,7 +9052,7 @@
         <w:br/>
         <w:t xml:space="preserve">  ],</w:t>
         <w:br/>
-        <w:t xml:space="preserve">  "prompt": "Grounded cinematic West African magical realism; contemporary Ghanaian coastal life; human-scale performances; saturated indigo, lagoon teal, clay red and warm amber palette; natural skin texture; tactile fabric and weathered wood; 2.39:1 widescreen composition; subtle film grain; expressive realistic lighting. No written words, no logos, no watermark, no distorted hands, no duplicate people. Scene S14 — Archive of the Unheard. OVER-SHOULDER shot, over the lead character's shoulder. Characters in frame: @SENA_ADJOVI (mustard oversized hoodie, blue-and-white printed ankle skirt and worn white canvas trainers, turquoise over-ear radio headphones); @KOSI_MENSAH (indigo utility jumpsuit with rolled sleeves, sand-coloured work boots and a narrow woven kente belt, small gold Adinkra-disc earrings). Over Sena's shoulder, pages are photographed one after another. Mood: quiet betrayal turning toward alliance. Lighting: single green desk lamp, dust and darkness. Environment = Location Registry id 'COUNCIL_ARCHIVE': A dim records room beneath Afenyo's district assembly hall: metal filing shelves, bound land ledgers, dust motes, a scarred wooden table, a green-shaded desk lamp and narrow high windows.",</w:t>
+        <w:t xml:space="preserve">  "prompt": "Grounded cinematic West African magical realism; contemporary Ghanaian coastal life; human-scale performances; saturated indigo, lagoon teal, clay red and warm amber palette; natural skin texture; tactile fabric and weathered wood; 16:9 landscape widescreen composition; subtle film grain; expressive realistic lighting. No written words, no logos, no watermark, no distorted hands, no duplicate people. Scene S14 — Archive of the Unheard. OVER-SHOULDER shot, over the lead character's shoulder. Characters in frame: @SENA_ADJOVI (mustard oversized hoodie, blue-and-white printed ankle skirt and worn white canvas trainers, turquoise over-ear radio headphones); @KOSI_MENSAH (indigo utility jumpsuit with rolled sleeves, sand-coloured work boots and a narrow woven kente belt, small gold Adinkra-disc earrings). Over Sena's shoulder, pages are photographed one after another. Mood: quiet betrayal turning toward alliance. Lighting: single green desk lamp, dust and darkness. Environment = Location Registry id 'COUNCIL_ARCHIVE': A dim records room beneath Afenyo's district assembly hall: metal filing shelves, bound land ledgers, dust motes, a scarred wooden table, a green-shaded desk lamp and narrow high windows.",</w:t>
         <w:br/>
         <w:t xml:space="preserve">  "status": "⬜",</w:t>
         <w:br/>
@@ -9103,7 +9103,7 @@
         <w:br/>
         <w:t xml:space="preserve">  ],</w:t>
         <w:br/>
-        <w:t xml:space="preserve">  "prompt": "Grounded cinematic West African magical realism; contemporary Ghanaian coastal life; human-scale performances; saturated indigo, lagoon teal, clay red and warm amber palette; natural skin texture; tactile fabric and weathered wood; 2.39:1 widescreen composition; subtle film grain; expressive realistic lighting. No written words, no logos, no watermark, no distorted hands, no duplicate people. Scene S14 — Archive of the Unheard. EXTREME CLOSE shot, intimate frontal angle. Characters in frame: @KWAME_AGYEMAN (white linen shirt under a caramel lightweight field jacket, dark tailored trousers and brown loafers, antique bronze lapel pin shaped like a compass rose). Kwame admits that releasing the files will finish him at the council. Mood: quiet betrayal turning toward alliance. Lighting: single green desk lamp, dust and darkness. Environment = Location Registry id 'COUNCIL_ARCHIVE': A dim records room beneath Afenyo's district assembly hall: metal filing shelves, bound land ledgers, dust motes, a scarred wooden table, a green-shaded desk lamp and narrow high windows.",</w:t>
+        <w:t xml:space="preserve">  "prompt": "Grounded cinematic West African magical realism; contemporary Ghanaian coastal life; human-scale performances; saturated indigo, lagoon teal, clay red and warm amber palette; natural skin texture; tactile fabric and weathered wood; 16:9 landscape widescreen composition; subtle film grain; expressive realistic lighting. No written words, no logos, no watermark, no distorted hands, no duplicate people. Scene S14 — Archive of the Unheard. EXTREME CLOSE shot, intimate frontal angle. Characters in frame: @KWAME_AGYEMAN (white linen shirt under a caramel lightweight field jacket, dark tailored trousers and brown loafers, antique bronze lapel pin shaped like a compass rose). Kwame admits that releasing the files will finish him at the council. Mood: quiet betrayal turning toward alliance. Lighting: single green desk lamp, dust and darkness. Environment = Location Registry id 'COUNCIL_ARCHIVE': A dim records room beneath Afenyo's district assembly hall: metal filing shelves, bound land ledgers, dust motes, a scarred wooden table, a green-shaded desk lamp and narrow high windows.",</w:t>
         <w:br/>
         <w:t xml:space="preserve">  "status": "⬜",</w:t>
         <w:br/>
@@ -9162,7 +9162,7 @@
         <w:br/>
         <w:t xml:space="preserve">  ],</w:t>
         <w:br/>
-        <w:t xml:space="preserve">  "prompt": "Grounded cinematic West African magical realism; contemporary Ghanaian coastal life; human-scale performances; saturated indigo, lagoon teal, clay red and warm amber palette; natural skin texture; tactile fabric and weathered wood; 2.39:1 widescreen composition; subtle film grain; expressive realistic lighting. No written words, no logos, no watermark, no distorted hands, no duplicate people. Scene S14 — Archive of the Unheard. WIDE shot, low observational angle. Characters in frame: @KOSI_MENSAH (indigo utility jumpsuit with rolled sleeves, sand-coloured work boots and a narrow woven kente belt, small gold Adinkra-disc earrings); @KWAME_AGYEMAN (white linen shirt under a caramel lightweight field jacket, dark tailored trousers and brown loafers, antique bronze lapel pin shaped like a compass rose); @SENA_ADJOVI (mustard oversized hoodie, blue-and-white printed ankle skirt and worn white canvas trainers, turquoise over-ear radio headphones). Dusty shelves close around the three as a sound rises in the stairwell. Mood: quiet betrayal turning toward alliance. Lighting: single green desk lamp, dust and darkness. Environment = Location Registry id 'COUNCIL_ARCHIVE': A dim records room beneath Afenyo's district assembly hall: metal filing shelves, bound land ledgers, dust motes, a scarred wooden table, a green-shaded desk lamp and narrow high windows.",</w:t>
+        <w:t xml:space="preserve">  "prompt": "Grounded cinematic West African magical realism; contemporary Ghanaian coastal life; human-scale performances; saturated indigo, lagoon teal, clay red and warm amber palette; natural skin texture; tactile fabric and weathered wood; 16:9 landscape widescreen composition; subtle film grain; expressive realistic lighting. No written words, no logos, no watermark, no distorted hands, no duplicate people. Scene S14 — Archive of the Unheard. WIDE shot, low observational angle. Characters in frame: @KOSI_MENSAH (indigo utility jumpsuit with rolled sleeves, sand-coloured work boots and a narrow woven kente belt, small gold Adinkra-disc earrings); @KWAME_AGYEMAN (white linen shirt under a caramel lightweight field jacket, dark tailored trousers and brown loafers, antique bronze lapel pin shaped like a compass rose); @SENA_ADJOVI (mustard oversized hoodie, blue-and-white printed ankle skirt and worn white canvas trainers, turquoise over-ear radio headphones). Dusty shelves close around the three as a sound rises in the stairwell. Mood: quiet betrayal turning toward alliance. Lighting: single green desk lamp, dust and darkness. Environment = Location Registry id 'COUNCIL_ARCHIVE': A dim records room beneath Afenyo's district assembly hall: metal filing shelves, bound land ledgers, dust motes, a scarred wooden table, a green-shaded desk lamp and narrow high windows.",</w:t>
         <w:br/>
         <w:t xml:space="preserve">  "status": "⬜",</w:t>
         <w:br/>
@@ -9217,7 +9217,7 @@
         <w:br/>
         <w:t xml:space="preserve">  ],</w:t>
         <w:br/>
-        <w:t xml:space="preserve">  "prompt": "Grounded cinematic West African magical realism; contemporary Ghanaian coastal life; human-scale performances; saturated indigo, lagoon teal, clay red and warm amber palette; natural skin texture; tactile fabric and weathered wood; 2.39:1 widescreen composition; subtle film grain; expressive realistic lighting. No written words, no logos, no watermark, no distorted hands, no duplicate people. Scene S14 — Archive of the Unheard. MEDIUM shot, handheld eye-level. Characters in frame: @KOSI_MENSAH (indigo utility jumpsuit with rolled sleeves, sand-coloured work boots and a narrow woven kente belt, small gold Adinkra-disc earrings); @KWAME_AGYEMAN (white linen shirt under a caramel lightweight field jacket, dark tailored trousers and brown loafers, antique bronze lapel pin shaped like a compass rose). Kwame places the archive keycard in Kosi's open palm. Mood: quiet betrayal turning toward alliance. Lighting: single green desk lamp, dust and darkness. Environment = Location Registry id 'COUNCIL_ARCHIVE': A dim records room beneath Afenyo's district assembly hall: metal filing shelves, bound land ledgers, dust motes, a scarred wooden table, a green-shaded desk lamp and narrow high windows.",</w:t>
+        <w:t xml:space="preserve">  "prompt": "Grounded cinematic West African magical realism; contemporary Ghanaian coastal life; human-scale performances; saturated indigo, lagoon teal, clay red and warm amber palette; natural skin texture; tactile fabric and weathered wood; 16:9 landscape widescreen composition; subtle film grain; expressive realistic lighting. No written words, no logos, no watermark, no distorted hands, no duplicate people. Scene S14 — Archive of the Unheard. MEDIUM shot, handheld eye-level. Characters in frame: @KOSI_MENSAH (indigo utility jumpsuit with rolled sleeves, sand-coloured work boots and a narrow woven kente belt, small gold Adinkra-disc earrings); @KWAME_AGYEMAN (white linen shirt under a caramel lightweight field jacket, dark tailored trousers and brown loafers, antique bronze lapel pin shaped like a compass rose). Kwame places the archive keycard in Kosi's open palm. Mood: quiet betrayal turning toward alliance. Lighting: single green desk lamp, dust and darkness. Environment = Location Registry id 'COUNCIL_ARCHIVE': A dim records room beneath Afenyo's district assembly hall: metal filing shelves, bound land ledgers, dust motes, a scarred wooden table, a green-shaded desk lamp and narrow high windows.",</w:t>
         <w:br/>
         <w:t xml:space="preserve">  "status": "⬜",</w:t>
         <w:br/>
@@ -9276,7 +9276,7 @@
         <w:br/>
         <w:t xml:space="preserve">  ],</w:t>
         <w:br/>
-        <w:t xml:space="preserve">  "prompt": "Grounded cinematic West African magical realism; contemporary Ghanaian coastal life; human-scale performances; saturated indigo, lagoon teal, clay red and warm amber palette; natural skin texture; tactile fabric and weathered wood; 2.39:1 widescreen composition; subtle film grain; expressive realistic lighting. No written words, no logos, no watermark, no distorted hands, no duplicate people. Scene S14 — Archive of the Unheard. WIDE shot, rear closing tableau. Characters in frame: @KOSI_MENSAH (indigo utility jumpsuit with rolled sleeves, sand-coloured work boots and a narrow woven kente belt, small gold Adinkra-disc earrings); @KWAME_AGYEMAN (white linen shirt under a caramel lightweight field jacket, dark tailored trousers and brown loafers, antique bronze lapel pin shaped like a compass rose); @SENA_ADJOVI (mustard oversized hoodie, blue-and-white printed ankle skirt and worn white canvas trainers, turquoise over-ear radio headphones). The trio slips from the dark archive carrying copied proof. Mood: quiet betrayal turning toward alliance. Lighting: single green desk lamp, dust and darkness. Environment = Location Registry id 'COUNCIL_ARCHIVE': A dim records room beneath Afenyo's district assembly hall: metal filing shelves, bound land ledgers, dust motes, a scarred wooden table, a green-shaded desk lamp and narrow high windows.",</w:t>
+        <w:t xml:space="preserve">  "prompt": "Grounded cinematic West African magical realism; contemporary Ghanaian coastal life; human-scale performances; saturated indigo, lagoon teal, clay red and warm amber palette; natural skin texture; tactile fabric and weathered wood; 16:9 landscape widescreen composition; subtle film grain; expressive realistic lighting. No written words, no logos, no watermark, no distorted hands, no duplicate people. Scene S14 — Archive of the Unheard. WIDE shot, rear closing tableau. Characters in frame: @KOSI_MENSAH (indigo utility jumpsuit with rolled sleeves, sand-coloured work boots and a narrow woven kente belt, small gold Adinkra-disc earrings); @KWAME_AGYEMAN (white linen shirt under a caramel lightweight field jacket, dark tailored trousers and brown loafers, antique bronze lapel pin shaped like a compass rose); @SENA_ADJOVI (mustard oversized hoodie, blue-and-white printed ankle skirt and worn white canvas trainers, turquoise over-ear radio headphones). The trio slips from the dark archive carrying copied proof. Mood: quiet betrayal turning toward alliance. Lighting: single green desk lamp, dust and darkness. Environment = Location Registry id 'COUNCIL_ARCHIVE': A dim records room beneath Afenyo's district assembly hall: metal filing shelves, bound land ledgers, dust motes, a scarred wooden table, a green-shaded desk lamp and narrow high windows.",</w:t>
         <w:br/>
         <w:t xml:space="preserve">  "status": "⬜",</w:t>
         <w:br/>
@@ -9343,7 +9343,7 @@
         <w:br/>
         <w:t xml:space="preserve">  ],</w:t>
         <w:br/>
-        <w:t xml:space="preserve">  "prompt": "Grounded cinematic West African magical realism; contemporary Ghanaian coastal life; human-scale performances; saturated indigo, lagoon teal, clay red and warm amber palette; natural skin texture; tactile fabric and weathered wood; 2.39:1 widescreen composition; subtle film grain; expressive realistic lighting. No written words, no logos, no watermark, no distorted hands, no duplicate people. Scene S15 — When the Power Fails. WIDE shot, high establishing angle. Characters in frame: @KOSI_MENSAH (indigo utility jumpsuit with rolled sleeves, sand-coloured work boots and a narrow woven kente belt, small gold Adinkra-disc earrings); @ESI_TETTEH (brick-red wax-print dress beneath a soot-black oilskin apron, patterned headwrap and sturdy black sandals, smooth charred-wood smoking paddle); @SENA_ADJOVI (mustard oversized hoodie, blue-and-white printed ankle skirt and worn white canvas trainers, turquoise over-ear radio headphones). The lagoon promenade falls suddenly dark as a meeting gathers at dusk. Mood: loss becoming a plan. Lighting: sudden blackout, last coral sunset and handmade lantern glow. Environment = Location Registry id 'LAGOON_PROMENADE': Afenyo's public lagoon promenade at dusk: a cracked concrete path, low sea wall, fishing boats, flowering bougainvillea, street vendors, fading coral sky and the resort fence in the far distance.",</w:t>
+        <w:t xml:space="preserve">  "prompt": "Grounded cinematic West African magical realism; contemporary Ghanaian coastal life; human-scale performances; saturated indigo, lagoon teal, clay red and warm amber palette; natural skin texture; tactile fabric and weathered wood; 16:9 landscape widescreen composition; subtle film grain; expressive realistic lighting. No written words, no logos, no watermark, no distorted hands, no duplicate people. Scene S15 — When the Power Fails. WIDE shot, high establishing angle. Characters in frame: @KOSI_MENSAH (indigo utility jumpsuit with rolled sleeves, sand-coloured work boots and a narrow woven kente belt, small gold Adinkra-disc earrings); @ESI_TETTEH (brick-red wax-print dress beneath a soot-black oilskin apron, patterned headwrap and sturdy black sandals, smooth charred-wood smoking paddle); @SENA_ADJOVI (mustard oversized hoodie, blue-and-white printed ankle skirt and worn white canvas trainers, turquoise over-ear radio headphones). The lagoon promenade falls suddenly dark as a meeting gathers at dusk. Mood: loss becoming a plan. Lighting: sudden blackout, last coral sunset and handmade lantern glow. Environment = Location Registry id 'LAGOON_PROMENADE': Afenyo's public lagoon promenade at dusk: a cracked concrete path, low sea wall, fishing boats, flowering bougainvillea, street vendors, fading coral sky and the resort fence in the far distance.",</w:t>
         <w:br/>
         <w:t xml:space="preserve">  "status": "⬜",</w:t>
         <w:br/>
@@ -9394,7 +9394,7 @@
         <w:br/>
         <w:t xml:space="preserve">  ],</w:t>
         <w:br/>
-        <w:t xml:space="preserve">  "prompt": "Grounded cinematic West African magical realism; contemporary Ghanaian coastal life; human-scale performances; saturated indigo, lagoon teal, clay red and warm amber palette; natural skin texture; tactile fabric and weathered wood; 2.39:1 widescreen composition; subtle film grain; expressive realistic lighting. No written words, no logos, no watermark, no distorted hands, no duplicate people. Scene S15 — When the Power Fails. MEDIUM shot, eye-level. Characters in frame: @SENA_ADJOVI (mustard oversized hoodie, blue-and-white printed ankle skirt and worn white canvas trainers, turquoise over-ear radio headphones). Phone lights bloom in the crowd beneath a fading coral sky. Mood: loss becoming a plan. Lighting: sudden blackout, last coral sunset and handmade lantern glow. Environment = Location Registry id 'LAGOON_PROMENADE': Afenyo's public lagoon promenade at dusk: a cracked concrete path, low sea wall, fishing boats, flowering bougainvillea, street vendors, fading coral sky and the resort fence in the far distance.",</w:t>
+        <w:t xml:space="preserve">  "prompt": "Grounded cinematic West African magical realism; contemporary Ghanaian coastal life; human-scale performances; saturated indigo, lagoon teal, clay red and warm amber palette; natural skin texture; tactile fabric and weathered wood; 16:9 landscape widescreen composition; subtle film grain; expressive realistic lighting. No written words, no logos, no watermark, no distorted hands, no duplicate people. Scene S15 — When the Power Fails. MEDIUM shot, eye-level. Characters in frame: @SENA_ADJOVI (mustard oversized hoodie, blue-and-white printed ankle skirt and worn white canvas trainers, turquoise over-ear radio headphones). Phone lights bloom in the crowd beneath a fading coral sky. Mood: loss becoming a plan. Lighting: sudden blackout, last coral sunset and handmade lantern glow. Environment = Location Registry id 'LAGOON_PROMENADE': Afenyo's public lagoon promenade at dusk: a cracked concrete path, low sea wall, fishing boats, flowering bougainvillea, street vendors, fading coral sky and the resort fence in the far distance.",</w:t>
         <w:br/>
         <w:t xml:space="preserve">  "status": "⬜",</w:t>
         <w:br/>
@@ -9445,7 +9445,7 @@
         <w:br/>
         <w:t xml:space="preserve">  ],</w:t>
         <w:br/>
-        <w:t xml:space="preserve">  "prompt": "Grounded cinematic West African magical realism; contemporary Ghanaian coastal life; human-scale performances; saturated indigo, lagoon teal, clay red and warm amber palette; natural skin texture; tactile fabric and weathered wood; 2.39:1 widescreen composition; subtle film grain; expressive realistic lighting. No written words, no logos, no watermark, no distorted hands, no duplicate people. Scene S15 — When the Power Fails. CLOSE shot, three-quarter profile. Characters in frame: @AMA_ADJOVI (deep navy kaba blouse, hand-dyed indigo wrapper with tiny white wave motifs and flat leather sandals, three-strand amber bead necklace). Ama briefly loses strength beside the cracked sea wall. Mood: loss becoming a plan. Lighting: sudden blackout, last coral sunset and handmade lantern glow. Environment = Location Registry id 'LAGOON_PROMENADE': Afenyo's public lagoon promenade at dusk: a cracked concrete path, low sea wall, fishing boats, flowering bougainvillea, street vendors, fading coral sky and the resort fence in the far distance.",</w:t>
+        <w:t xml:space="preserve">  "prompt": "Grounded cinematic West African magical realism; contemporary Ghanaian coastal life; human-scale performances; saturated indigo, lagoon teal, clay red and warm amber palette; natural skin texture; tactile fabric and weathered wood; 16:9 landscape widescreen composition; subtle film grain; expressive realistic lighting. No written words, no logos, no watermark, no distorted hands, no duplicate people. Scene S15 — When the Power Fails. CLOSE shot, three-quarter profile. Characters in frame: @AMA_ADJOVI (deep navy kaba blouse, hand-dyed indigo wrapper with tiny white wave motifs and flat leather sandals, three-strand amber bead necklace). Ama briefly loses strength beside the cracked sea wall. Mood: loss becoming a plan. Lighting: sudden blackout, last coral sunset and handmade lantern glow. Environment = Location Registry id 'LAGOON_PROMENADE': Afenyo's public lagoon promenade at dusk: a cracked concrete path, low sea wall, fishing boats, flowering bougainvillea, street vendors, fading coral sky and the resort fence in the far distance.",</w:t>
         <w:br/>
         <w:t xml:space="preserve">  "status": "⬜",</w:t>
         <w:br/>
@@ -9500,7 +9500,7 @@
         <w:br/>
         <w:t xml:space="preserve">  ],</w:t>
         <w:br/>
-        <w:t xml:space="preserve">  "prompt": "Grounded cinematic West African magical realism; contemporary Ghanaian coastal life; human-scale performances; saturated indigo, lagoon teal, clay red and warm amber palette; natural skin texture; tactile fabric and weathered wood; 2.39:1 widescreen composition; subtle film grain; expressive realistic lighting. No written words, no logos, no watermark, no distorted hands, no duplicate people. Scene S15 — When the Power Fails. INSERT shot, top-down detail. Characters in frame: @KOSI_MENSAH (indigo utility jumpsuit with rolled sleeves, sand-coloured work boots and a narrow woven kente belt, small gold Adinkra-disc earrings); @AMA_ADJOVI (deep navy kaba blouse, hand-dyed indigo wrapper with tiny white wave motifs and flat leather sandals, three-strand amber bead necklace). Kosi catches Ama and steadies her with quiet concern. Mood: loss becoming a plan. Lighting: sudden blackout, last coral sunset and handmade lantern glow. Environment = Location Registry id 'LAGOON_PROMENADE': Afenyo's public lagoon promenade at dusk: a cracked concrete path, low sea wall, fishing boats, flowering bougainvillea, street vendors, fading coral sky and the resort fence in the far distance.",</w:t>
+        <w:t xml:space="preserve">  "prompt": "Grounded cinematic West African magical realism; contemporary Ghanaian coastal life; human-scale performances; saturated indigo, lagoon teal, clay red and warm amber palette; natural skin texture; tactile fabric and weathered wood; 16:9 landscape widescreen composition; subtle film grain; expressive realistic lighting. No written words, no logos, no watermark, no distorted hands, no duplicate people. Scene S15 — When the Power Fails. INSERT shot, top-down detail. Characters in frame: @KOSI_MENSAH (indigo utility jumpsuit with rolled sleeves, sand-coloured work boots and a narrow woven kente belt, small gold Adinkra-disc earrings); @AMA_ADJOVI (deep navy kaba blouse, hand-dyed indigo wrapper with tiny white wave motifs and flat leather sandals, three-strand amber bead necklace). Kosi catches Ama and steadies her with quiet concern. Mood: loss becoming a plan. Lighting: sudden blackout, last coral sunset and handmade lantern glow. Environment = Location Registry id 'LAGOON_PROMENADE': Afenyo's public lagoon promenade at dusk: a cracked concrete path, low sea wall, fishing boats, flowering bougainvillea, street vendors, fading coral sky and the resort fence in the far distance.",</w:t>
         <w:br/>
         <w:t xml:space="preserve">  "status": "⬜",</w:t>
         <w:br/>
@@ -9555,7 +9555,7 @@
         <w:br/>
         <w:t xml:space="preserve">  ],</w:t>
         <w:br/>
-        <w:t xml:space="preserve">  "prompt": "Grounded cinematic West African magical realism; contemporary Ghanaian coastal life; human-scale performances; saturated indigo, lagoon teal, clay red and warm amber palette; natural skin texture; tactile fabric and weathered wood; 2.39:1 widescreen composition; subtle film grain; expressive realistic lighting. No written words, no logos, no watermark, no distorted hands, no duplicate people. Scene S15 — When the Power Fails. TWO-SHOT shot, eye-level. Characters in frame: @ESI_TETTEH (brick-red wax-print dress beneath a soot-black oilskin apron, patterned headwrap and sturdy black sandals, smooth charred-wood smoking paddle); @KOSI_MENSAH (indigo utility jumpsuit with rolled sleeves, sand-coloured work boots and a narrow woven kente belt, small gold Adinkra-disc earrings). Esi asks who will light the town's hearing. Mood: loss becoming a plan. Lighting: sudden blackout, last coral sunset and handmade lantern glow. Environment = Location Registry id 'LAGOON_PROMENADE': Afenyo's public lagoon promenade at dusk: a cracked concrete path, low sea wall, fishing boats, flowering bougainvillea, street vendors, fading coral sky and the resort fence in the far distance.",</w:t>
+        <w:t xml:space="preserve">  "prompt": "Grounded cinematic West African magical realism; contemporary Ghanaian coastal life; human-scale performances; saturated indigo, lagoon teal, clay red and warm amber palette; natural skin texture; tactile fabric and weathered wood; 16:9 landscape widescreen composition; subtle film grain; expressive realistic lighting. No written words, no logos, no watermark, no distorted hands, no duplicate people. Scene S15 — When the Power Fails. TWO-SHOT shot, eye-level. Characters in frame: @ESI_TETTEH (brick-red wax-print dress beneath a soot-black oilskin apron, patterned headwrap and sturdy black sandals, smooth charred-wood smoking paddle); @KOSI_MENSAH (indigo utility jumpsuit with rolled sleeves, sand-coloured work boots and a narrow woven kente belt, small gold Adinkra-disc earrings). Esi asks who will light the town's hearing. Mood: loss becoming a plan. Lighting: sudden blackout, last coral sunset and handmade lantern glow. Environment = Location Registry id 'LAGOON_PROMENADE': Afenyo's public lagoon promenade at dusk: a cracked concrete path, low sea wall, fishing boats, flowering bougainvillea, street vendors, fading coral sky and the resort fence in the far distance.",</w:t>
         <w:br/>
         <w:t xml:space="preserve">  "status": "⬜",</w:t>
         <w:br/>
@@ -9610,7 +9610,7 @@
         <w:br/>
         <w:t xml:space="preserve">  ],</w:t>
         <w:br/>
-        <w:t xml:space="preserve">  "prompt": "Grounded cinematic West African magical realism; contemporary Ghanaian coastal life; human-scale performances; saturated indigo, lagoon teal, clay red and warm amber palette; natural skin texture; tactile fabric and weathered wood; 2.39:1 widescreen composition; subtle film grain; expressive realistic lighting. No written words, no logos, no watermark, no distorted hands, no duplicate people. Scene S15 — When the Power Fails. OVER-SHOULDER shot, over the lead character's shoulder. Characters in frame: @KOSI_MENSAH (indigo utility jumpsuit with rolled sleeves, sand-coloured work boots and a narrow woven kente belt, small gold Adinkra-disc earrings); @ESI_TETTEH (brick-red wax-print dress beneath a soot-black oilskin apron, patterned headwrap and sturdy black sandals, smooth charred-wood smoking paddle). Over Kosi's shoulder, Kosi points toward the distant beacon and explains the broadcast plan. Mood: loss becoming a plan. Lighting: sudden blackout, last coral sunset and handmade lantern glow. Environment = Location Registry id 'LAGOON_PROMENADE': Afenyo's public lagoon promenade at dusk: a cracked concrete path, low sea wall, fishing boats, flowering bougainvillea, street vendors, fading coral sky and the resort fence in the far distance.",</w:t>
+        <w:t xml:space="preserve">  "prompt": "Grounded cinematic West African magical realism; contemporary Ghanaian coastal life; human-scale performances; saturated indigo, lagoon teal, clay red and warm amber palette; natural skin texture; tactile fabric and weathered wood; 16:9 landscape widescreen composition; subtle film grain; expressive realistic lighting. No written words, no logos, no watermark, no distorted hands, no duplicate people. Scene S15 — When the Power Fails. OVER-SHOULDER shot, over the lead character's shoulder. Characters in frame: @KOSI_MENSAH (indigo utility jumpsuit with rolled sleeves, sand-coloured work boots and a narrow woven kente belt, small gold Adinkra-disc earrings); @ESI_TETTEH (brick-red wax-print dress beneath a soot-black oilskin apron, patterned headwrap and sturdy black sandals, smooth charred-wood smoking paddle). Over Kosi's shoulder, Kosi points toward the distant beacon and explains the broadcast plan. Mood: loss becoming a plan. Lighting: sudden blackout, last coral sunset and handmade lantern glow. Environment = Location Registry id 'LAGOON_PROMENADE': Afenyo's public lagoon promenade at dusk: a cracked concrete path, low sea wall, fishing boats, flowering bougainvillea, street vendors, fading coral sky and the resort fence in the far distance.",</w:t>
         <w:br/>
         <w:t xml:space="preserve">  "status": "⬜",</w:t>
         <w:br/>
@@ -9661,7 +9661,7 @@
         <w:br/>
         <w:t xml:space="preserve">  ],</w:t>
         <w:br/>
-        <w:t xml:space="preserve">  "prompt": "Grounded cinematic West African magical realism; contemporary Ghanaian coastal life; human-scale performances; saturated indigo, lagoon teal, clay red and warm amber palette; natural skin texture; tactile fabric and weathered wood; 2.39:1 widescreen composition; subtle film grain; expressive realistic lighting. No written words, no logos, no watermark, no distorted hands, no duplicate people. Scene S15 — When the Power Fails. EXTREME CLOSE shot, intimate frontal angle. Characters in frame: @AMA_ADJOVI (deep navy kaba blouse, hand-dyed indigo wrapper with tiny white wave motifs and flat leather sandals, three-strand amber bead necklace). Ama regains her breath and looks toward the handmade lights. Mood: loss becoming a plan. Lighting: sudden blackout, last coral sunset and handmade lantern glow. Environment = Location Registry id 'LAGOON_PROMENADE': Afenyo's public lagoon promenade at dusk: a cracked concrete path, low sea wall, fishing boats, flowering bougainvillea, street vendors, fading coral sky and the resort fence in the far distance.",</w:t>
+        <w:t xml:space="preserve">  "prompt": "Grounded cinematic West African magical realism; contemporary Ghanaian coastal life; human-scale performances; saturated indigo, lagoon teal, clay red and warm amber palette; natural skin texture; tactile fabric and weathered wood; 16:9 landscape widescreen composition; subtle film grain; expressive realistic lighting. No written words, no logos, no watermark, no distorted hands, no duplicate people. Scene S15 — When the Power Fails. EXTREME CLOSE shot, intimate frontal angle. Characters in frame: @AMA_ADJOVI (deep navy kaba blouse, hand-dyed indigo wrapper with tiny white wave motifs and flat leather sandals, three-strand amber bead necklace). Ama regains her breath and looks toward the handmade lights. Mood: loss becoming a plan. Lighting: sudden blackout, last coral sunset and handmade lantern glow. Environment = Location Registry id 'LAGOON_PROMENADE': Afenyo's public lagoon promenade at dusk: a cracked concrete path, low sea wall, fishing boats, flowering bougainvillea, street vendors, fading coral sky and the resort fence in the far distance.",</w:t>
         <w:br/>
         <w:t xml:space="preserve">  "status": "⬜",</w:t>
         <w:br/>
@@ -9728,7 +9728,7 @@
         <w:br/>
         <w:t xml:space="preserve">  ],</w:t>
         <w:br/>
-        <w:t xml:space="preserve">  "prompt": "Grounded cinematic West African magical realism; contemporary Ghanaian coastal life; human-scale performances; saturated indigo, lagoon teal, clay red and warm amber palette; natural skin texture; tactile fabric and weathered wood; 2.39:1 widescreen composition; subtle film grain; expressive realistic lighting. No written words, no logos, no watermark, no distorted hands, no duplicate people. Scene S15 — When the Power Fails. WIDE shot, low observational angle. Characters in frame: @KOSI_MENSAH (indigo utility jumpsuit with rolled sleeves, sand-coloured work boots and a narrow woven kente belt, small gold Adinkra-disc earrings); @AMA_ADJOVI (deep navy kaba blouse, hand-dyed indigo wrapper with tiny white wave motifs and flat leather sandals, three-strand amber bead necklace); @ESI_TETTEH (brick-red wax-print dress beneath a soot-black oilskin apron, patterned headwrap and sturdy black sandals, smooth charred-wood smoking paddle); @SENA_ADJOVI (mustard oversized hoodie, blue-and-white printed ankle skirt and worn white canvas trainers, turquoise over-ear radio headphones); @KOJO_DANSO (faded forest-green canvas jacket over a blue-and-cream striped shirt, charcoal trousers and rubber deck boots, weathered brass compass on a cord). Residents raise lanterns along the dark promenade. Mood: loss becoming a plan. Lighting: sudden blackout, last coral sunset and handmade lantern glow. Environment = Location Registry id 'LAGOON_PROMENADE': Afenyo's public lagoon promenade at dusk: a cracked concrete path, low sea wall, fishing boats, flowering bougainvillea, street vendors, fading coral sky and the resort fence in the far distance.",</w:t>
+        <w:t xml:space="preserve">  "prompt": "Grounded cinematic West African magical realism; contemporary Ghanaian coastal life; human-scale performances; saturated indigo, lagoon teal, clay red and warm amber palette; natural skin texture; tactile fabric and weathered wood; 16:9 landscape widescreen composition; subtle film grain; expressive realistic lighting. No written words, no logos, no watermark, no distorted hands, no duplicate people. Scene S15 — When the Power Fails. WIDE shot, low observational angle. Characters in frame: @KOSI_MENSAH (indigo utility jumpsuit with rolled sleeves, sand-coloured work boots and a narrow woven kente belt, small gold Adinkra-disc earrings); @AMA_ADJOVI (deep navy kaba blouse, hand-dyed indigo wrapper with tiny white wave motifs and flat leather sandals, three-strand amber bead necklace); @ESI_TETTEH (brick-red wax-print dress beneath a soot-black oilskin apron, patterned headwrap and sturdy black sandals, smooth charred-wood smoking paddle); @SENA_ADJOVI (mustard oversized hoodie, blue-and-white printed ankle skirt and worn white canvas trainers, turquoise over-ear radio headphones); @KOJO_DANSO (faded forest-green canvas jacket over a blue-and-cream striped shirt, charcoal trousers and rubber deck boots, weathered brass compass on a cord). Residents raise lanterns along the dark promenade. Mood: loss becoming a plan. Lighting: sudden blackout, last coral sunset and handmade lantern glow. Environment = Location Registry id 'LAGOON_PROMENADE': Afenyo's public lagoon promenade at dusk: a cracked concrete path, low sea wall, fishing boats, flowering bougainvillea, street vendors, fading coral sky and the resort fence in the far distance.",</w:t>
         <w:br/>
         <w:t xml:space="preserve">  "status": "⬜",</w:t>
         <w:br/>
@@ -9779,7 +9779,7 @@
         <w:br/>
         <w:t xml:space="preserve">  ],</w:t>
         <w:br/>
-        <w:t xml:space="preserve">  "prompt": "Grounded cinematic West African magical realism; contemporary Ghanaian coastal life; human-scale performances; saturated indigo, lagoon teal, clay red and warm amber palette; natural skin texture; tactile fabric and weathered wood; 2.39:1 widescreen composition; subtle film grain; expressive realistic lighting. No written words, no logos, no watermark, no distorted hands, no duplicate people. Scene S15 — When the Power Fails. MEDIUM shot, handheld eye-level. Characters in frame: @KOSI_MENSAH (indigo utility jumpsuit with rolled sleeves, sand-coloured work boots and a narrow woven kente belt, small gold Adinkra-disc earrings). Kosi says the town will light itself, resolve clear in her face. Mood: loss becoming a plan. Lighting: sudden blackout, last coral sunset and handmade lantern glow. Environment = Location Registry id 'LAGOON_PROMENADE': Afenyo's public lagoon promenade at dusk: a cracked concrete path, low sea wall, fishing boats, flowering bougainvillea, street vendors, fading coral sky and the resort fence in the far distance.",</w:t>
+        <w:t xml:space="preserve">  "prompt": "Grounded cinematic West African magical realism; contemporary Ghanaian coastal life; human-scale performances; saturated indigo, lagoon teal, clay red and warm amber palette; natural skin texture; tactile fabric and weathered wood; 16:9 landscape widescreen composition; subtle film grain; expressive realistic lighting. No written words, no logos, no watermark, no distorted hands, no duplicate people. Scene S15 — When the Power Fails. MEDIUM shot, handheld eye-level. Characters in frame: @KOSI_MENSAH (indigo utility jumpsuit with rolled sleeves, sand-coloured work boots and a narrow woven kente belt, small gold Adinkra-disc earrings). Kosi says the town will light itself, resolve clear in her face. Mood: loss becoming a plan. Lighting: sudden blackout, last coral sunset and handmade lantern glow. Environment = Location Registry id 'LAGOON_PROMENADE': Afenyo's public lagoon promenade at dusk: a cracked concrete path, low sea wall, fishing boats, flowering bougainvillea, street vendors, fading coral sky and the resort fence in the far distance.",</w:t>
         <w:br/>
         <w:t xml:space="preserve">  "status": "⬜",</w:t>
         <w:br/>
@@ -9846,7 +9846,7 @@
         <w:br/>
         <w:t xml:space="preserve">  ],</w:t>
         <w:br/>
-        <w:t xml:space="preserve">  "prompt": "Grounded cinematic West African magical realism; contemporary Ghanaian coastal life; human-scale performances; saturated indigo, lagoon teal, clay red and warm amber palette; natural skin texture; tactile fabric and weathered wood; 2.39:1 widescreen composition; subtle film grain; expressive realistic lighting. No written words, no logos, no watermark, no distorted hands, no duplicate people. Scene S15 — When the Power Fails. WIDE shot, rear closing tableau. Characters in frame: @KOSI_MENSAH (indigo utility jumpsuit with rolled sleeves, sand-coloured work boots and a narrow woven kente belt, small gold Adinkra-disc earrings); @AMA_ADJOVI (deep navy kaba blouse, hand-dyed indigo wrapper with tiny white wave motifs and flat leather sandals, three-strand amber bead necklace); @ESI_TETTEH (brick-red wax-print dress beneath a soot-black oilskin apron, patterned headwrap and sturdy black sandals, smooth charred-wood smoking paddle); @SENA_ADJOVI (mustard oversized hoodie, blue-and-white printed ankle skirt and worn white canvas trainers, turquoise over-ear radio headphones); @KOJO_DANSO (faded forest-green canvas jacket over a blue-and-cream striped shirt, charcoal trousers and rubber deck boots, weathered brass compass on a cord). Lantern light draws a communal line along the lagoon at dusk. Mood: loss becoming a plan. Lighting: sudden blackout, last coral sunset and handmade lantern glow. Environment = Location Registry id 'LAGOON_PROMENADE': Afenyo's public lagoon promenade at dusk: a cracked concrete path, low sea wall, fishing boats, flowering bougainvillea, street vendors, fading coral sky and the resort fence in the far distance.",</w:t>
+        <w:t xml:space="preserve">  "prompt": "Grounded cinematic West African magical realism; contemporary Ghanaian coastal life; human-scale performances; saturated indigo, lagoon teal, clay red and warm amber palette; natural skin texture; tactile fabric and weathered wood; 16:9 landscape widescreen composition; subtle film grain; expressive realistic lighting. No written words, no logos, no watermark, no distorted hands, no duplicate people. Scene S15 — When the Power Fails. WIDE shot, rear closing tableau. Characters in frame: @KOSI_MENSAH (indigo utility jumpsuit with rolled sleeves, sand-coloured work boots and a narrow woven kente belt, small gold Adinkra-disc earrings); @AMA_ADJOVI (deep navy kaba blouse, hand-dyed indigo wrapper with tiny white wave motifs and flat leather sandals, three-strand amber bead necklace); @ESI_TETTEH (brick-red wax-print dress beneath a soot-black oilskin apron, patterned headwrap and sturdy black sandals, smooth charred-wood smoking paddle); @SENA_ADJOVI (mustard oversized hoodie, blue-and-white printed ankle skirt and worn white canvas trainers, turquoise over-ear radio headphones); @KOJO_DANSO (faded forest-green canvas jacket over a blue-and-cream striped shirt, charcoal trousers and rubber deck boots, weathered brass compass on a cord). Lantern light draws a communal line along the lagoon at dusk. Mood: loss becoming a plan. Lighting: sudden blackout, last coral sunset and handmade lantern glow. Environment = Location Registry id 'LAGOON_PROMENADE': Afenyo's public lagoon promenade at dusk: a cracked concrete path, low sea wall, fishing boats, flowering bougainvillea, street vendors, fading coral sky and the resort fence in the far distance.",</w:t>
         <w:br/>
         <w:t xml:space="preserve">  "status": "⬜",</w:t>
         <w:br/>
@@ -9921,7 +9921,7 @@
         <w:br/>
         <w:t xml:space="preserve">  ],</w:t>
         <w:br/>
-        <w:t xml:space="preserve">  "prompt": "Grounded cinematic West African magical realism; contemporary Ghanaian coastal life; human-scale performances; saturated indigo, lagoon teal, clay red and warm amber palette; natural skin texture; tactile fabric and weathered wood; 2.39:1 widescreen composition; subtle film grain; expressive realistic lighting. No written words, no logos, no watermark, no distorted hands, no duplicate people. Scene S16 — A Thousand Small Lights. WIDE shot, high establishing angle. Characters in frame: @KOSI_MENSAH (indigo utility jumpsuit with rolled sleeves, sand-coloured work boots and a narrow woven kente belt, small gold Adinkra-disc earrings); @AMA_ADJOVI (deep navy kaba blouse, hand-dyed indigo wrapper with tiny white wave motifs and flat leather sandals, three-strand amber bead necklace); @SENA_ADJOVI (mustard oversized hoodie, blue-and-white printed ankle skirt and worn white canvas trainers, turquoise over-ear radio headphones); @KOJO_DANSO (faded forest-green canvas jacket over a blue-and-cream striped shirt, charcoal trousers and rubber deck boots, weathered brass compass on a cord); @ESI_TETTEH (brick-red wax-print dress beneath a soot-black oilskin apron, patterned headwrap and sturdy black sandals, smooth charred-wood smoking paddle). Festival Square fills with people building lanterns beneath the silk-cotton tree. Mood: communal preparation. Lighting: fresh sun, bright fabrics and building anticipation. Environment = Location Registry id 'FESTIVAL_SQUARE': Afenyo's central festival square at blue hour: packed red-earth ground, a large silk-cotton tree, simple wooden platform, strings of unlit handmade lanterns, market stalls and the compound roofs beyond.",</w:t>
+        <w:t xml:space="preserve">  "prompt": "Grounded cinematic West African magical realism; contemporary Ghanaian coastal life; human-scale performances; saturated indigo, lagoon teal, clay red and warm amber palette; natural skin texture; tactile fabric and weathered wood; 16:9 landscape widescreen composition; subtle film grain; expressive realistic lighting. No written words, no logos, no watermark, no distorted hands, no duplicate people. Scene S16 — A Thousand Small Lights. WIDE shot, high establishing angle. Characters in frame: @KOSI_MENSAH (indigo utility jumpsuit with rolled sleeves, sand-coloured work boots and a narrow woven kente belt, small gold Adinkra-disc earrings); @AMA_ADJOVI (deep navy kaba blouse, hand-dyed indigo wrapper with tiny white wave motifs and flat leather sandals, three-strand amber bead necklace); @SENA_ADJOVI (mustard oversized hoodie, blue-and-white printed ankle skirt and worn white canvas trainers, turquoise over-ear radio headphones); @KOJO_DANSO (faded forest-green canvas jacket over a blue-and-cream striped shirt, charcoal trousers and rubber deck boots, weathered brass compass on a cord); @ESI_TETTEH (brick-red wax-print dress beneath a soot-black oilskin apron, patterned headwrap and sturdy black sandals, smooth charred-wood smoking paddle). Festival Square fills with people building lanterns beneath the silk-cotton tree. Mood: communal preparation. Lighting: fresh sun, bright fabrics and building anticipation. Environment = Location Registry id 'FESTIVAL_SQUARE': Afenyo's central festival square at blue hour: packed red-earth ground, a large silk-cotton tree, simple wooden platform, strings of unlit handmade lanterns, market stalls and the compound roofs beyond.",</w:t>
         <w:br/>
         <w:t xml:space="preserve">  "status": "⬜",</w:t>
         <w:br/>
@@ -9972,7 +9972,7 @@
         <w:br/>
         <w:t xml:space="preserve">  ],</w:t>
         <w:br/>
-        <w:t xml:space="preserve">  "prompt": "Grounded cinematic West African magical realism; contemporary Ghanaian coastal life; human-scale performances; saturated indigo, lagoon teal, clay red and warm amber palette; natural skin texture; tactile fabric and weathered wood; 2.39:1 widescreen composition; subtle film grain; expressive realistic lighting. No written words, no logos, no watermark, no distorted hands, no duplicate people. Scene S16 — A Thousand Small Lights. MEDIUM shot, eye-level. Characters in frame: @KOSI_MENSAH (indigo utility jumpsuit with rolled sleeves, sand-coloured work boots and a narrow woven kente belt, small gold Adinkra-disc earrings). Kosi teaches children to connect safe low-voltage solar cells. Mood: communal preparation. Lighting: fresh sun, bright fabrics and building anticipation. Environment = Location Registry id 'FESTIVAL_SQUARE': Afenyo's central festival square at blue hour: packed red-earth ground, a large silk-cotton tree, simple wooden platform, strings of unlit handmade lanterns, market stalls and the compound roofs beyond.",</w:t>
+        <w:t xml:space="preserve">  "prompt": "Grounded cinematic West African magical realism; contemporary Ghanaian coastal life; human-scale performances; saturated indigo, lagoon teal, clay red and warm amber palette; natural skin texture; tactile fabric and weathered wood; 16:9 landscape widescreen composition; subtle film grain; expressive realistic lighting. No written words, no logos, no watermark, no distorted hands, no duplicate people. Scene S16 — A Thousand Small Lights. MEDIUM shot, eye-level. Characters in frame: @KOSI_MENSAH (indigo utility jumpsuit with rolled sleeves, sand-coloured work boots and a narrow woven kente belt, small gold Adinkra-disc earrings). Kosi teaches children to connect safe low-voltage solar cells. Mood: communal preparation. Lighting: fresh sun, bright fabrics and building anticipation. Environment = Location Registry id 'FESTIVAL_SQUARE': Afenyo's central festival square at blue hour: packed red-earth ground, a large silk-cotton tree, simple wooden platform, strings of unlit handmade lanterns, market stalls and the compound roofs beyond.",</w:t>
         <w:br/>
         <w:t xml:space="preserve">  "status": "⬜",</w:t>
         <w:br/>
@@ -10023,7 +10023,7 @@
         <w:br/>
         <w:t xml:space="preserve">  ],</w:t>
         <w:br/>
-        <w:t xml:space="preserve">  "prompt": "Grounded cinematic West African magical realism; contemporary Ghanaian coastal life; human-scale performances; saturated indigo, lagoon teal, clay red and warm amber palette; natural skin texture; tactile fabric and weathered wood; 2.39:1 widescreen composition; subtle film grain; expressive realistic lighting. No written words, no logos, no watermark, no distorted hands, no duplicate people. Scene S16 — A Thousand Small Lights. CLOSE shot, three-quarter profile. Characters in frame: @AMA_ADJOVI (deep navy kaba blouse, hand-dyed indigo wrapper with tiny white wave motifs and flat leather sandals, three-strand amber bead necklace). Ama sorts blue glass panes with her amber beads catching the morning sun. Mood: communal preparation. Lighting: fresh sun, bright fabrics and building anticipation. Environment = Location Registry id 'FESTIVAL_SQUARE': Afenyo's central festival square at blue hour: packed red-earth ground, a large silk-cotton tree, simple wooden platform, strings of unlit handmade lanterns, market stalls and the compound roofs beyond.",</w:t>
+        <w:t xml:space="preserve">  "prompt": "Grounded cinematic West African magical realism; contemporary Ghanaian coastal life; human-scale performances; saturated indigo, lagoon teal, clay red and warm amber palette; natural skin texture; tactile fabric and weathered wood; 16:9 landscape widescreen composition; subtle film grain; expressive realistic lighting. No written words, no logos, no watermark, no distorted hands, no duplicate people. Scene S16 — A Thousand Small Lights. CLOSE shot, three-quarter profile. Characters in frame: @AMA_ADJOVI (deep navy kaba blouse, hand-dyed indigo wrapper with tiny white wave motifs and flat leather sandals, three-strand amber bead necklace). Ama sorts blue glass panes with her amber beads catching the morning sun. Mood: communal preparation. Lighting: fresh sun, bright fabrics and building anticipation. Environment = Location Registry id 'FESTIVAL_SQUARE': Afenyo's central festival square at blue hour: packed red-earth ground, a large silk-cotton tree, simple wooden platform, strings of unlit handmade lanterns, market stalls and the compound roofs beyond.",</w:t>
         <w:br/>
         <w:t xml:space="preserve">  "status": "⬜",</w:t>
         <w:br/>
@@ -10074,7 +10074,7 @@
         <w:br/>
         <w:t xml:space="preserve">  ],</w:t>
         <w:br/>
-        <w:t xml:space="preserve">  "prompt": "Grounded cinematic West African magical realism; contemporary Ghanaian coastal life; human-scale performances; saturated indigo, lagoon teal, clay red and warm amber palette; natural skin texture; tactile fabric and weathered wood; 2.39:1 widescreen composition; subtle film grain; expressive realistic lighting. No written words, no logos, no watermark, no distorted hands, no duplicate people. Scene S16 — A Thousand Small Lights. INSERT shot, top-down detail. Characters in frame: @KOSI_MENSAH (indigo utility jumpsuit with rolled sleeves, sand-coloured work boots and a narrow woven kente belt, small gold Adinkra-disc earrings). Hands arrange recycled solar cells, blue glass and copper wire on red earth. Mood: communal preparation. Lighting: fresh sun, bright fabrics and building anticipation. Environment = Location Registry id 'FESTIVAL_SQUARE': Afenyo's central festival square at blue hour: packed red-earth ground, a large silk-cotton tree, simple wooden platform, strings of unlit handmade lanterns, market stalls and the compound roofs beyond.",</w:t>
+        <w:t xml:space="preserve">  "prompt": "Grounded cinematic West African magical realism; contemporary Ghanaian coastal life; human-scale performances; saturated indigo, lagoon teal, clay red and warm amber palette; natural skin texture; tactile fabric and weathered wood; 16:9 landscape widescreen composition; subtle film grain; expressive realistic lighting. No written words, no logos, no watermark, no distorted hands, no duplicate people. Scene S16 — A Thousand Small Lights. INSERT shot, top-down detail. Characters in frame: @KOSI_MENSAH (indigo utility jumpsuit with rolled sleeves, sand-coloured work boots and a narrow woven kente belt, small gold Adinkra-disc earrings). Hands arrange recycled solar cells, blue glass and copper wire on red earth. Mood: communal preparation. Lighting: fresh sun, bright fabrics and building anticipation. Environment = Location Registry id 'FESTIVAL_SQUARE': Afenyo's central festival square at blue hour: packed red-earth ground, a large silk-cotton tree, simple wooden platform, strings of unlit handmade lanterns, market stalls and the compound roofs beyond.",</w:t>
         <w:br/>
         <w:t xml:space="preserve">  "status": "⬜",</w:t>
         <w:br/>
@@ -10125,7 +10125,7 @@
         <w:br/>
         <w:t xml:space="preserve">  ],</w:t>
         <w:br/>
-        <w:t xml:space="preserve">  "prompt": "Grounded cinematic West African magical realism; contemporary Ghanaian coastal life; human-scale performances; saturated indigo, lagoon teal, clay red and warm amber palette; natural skin texture; tactile fabric and weathered wood; 2.39:1 widescreen composition; subtle film grain; expressive realistic lighting. No written words, no logos, no watermark, no distorted hands, no duplicate people. Scene S16 — A Thousand Small Lights. TWO-SHOT shot, eye-level. Characters in frame: @ESI_TETTEH (brick-red wax-print dress beneath a soot-black oilskin apron, patterned headwrap and sturdy black sandals, smooth charred-wood smoking paddle). Esi directs food, work tables and volunteers with her smoking paddle. Mood: communal preparation. Lighting: fresh sun, bright fabrics and building anticipation. Environment = Location Registry id 'FESTIVAL_SQUARE': Afenyo's central festival square at blue hour: packed red-earth ground, a large silk-cotton tree, simple wooden platform, strings of unlit handmade lanterns, market stalls and the compound roofs beyond.",</w:t>
+        <w:t xml:space="preserve">  "prompt": "Grounded cinematic West African magical realism; contemporary Ghanaian coastal life; human-scale performances; saturated indigo, lagoon teal, clay red and warm amber palette; natural skin texture; tactile fabric and weathered wood; 16:9 landscape widescreen composition; subtle film grain; expressive realistic lighting. No written words, no logos, no watermark, no distorted hands, no duplicate people. Scene S16 — A Thousand Small Lights. TWO-SHOT shot, eye-level. Characters in frame: @ESI_TETTEH (brick-red wax-print dress beneath a soot-black oilskin apron, patterned headwrap and sturdy black sandals, smooth charred-wood smoking paddle). Esi directs food, work tables and volunteers with her smoking paddle. Mood: communal preparation. Lighting: fresh sun, bright fabrics and building anticipation. Environment = Location Registry id 'FESTIVAL_SQUARE': Afenyo's central festival square at blue hour: packed red-earth ground, a large silk-cotton tree, simple wooden platform, strings of unlit handmade lanterns, market stalls and the compound roofs beyond.",</w:t>
         <w:br/>
         <w:t xml:space="preserve">  "status": "⬜",</w:t>
         <w:br/>
@@ -10180,7 +10180,7 @@
         <w:br/>
         <w:t xml:space="preserve">  ],</w:t>
         <w:br/>
-        <w:t xml:space="preserve">  "prompt": "Grounded cinematic West African magical realism; contemporary Ghanaian coastal life; human-scale performances; saturated indigo, lagoon teal, clay red and warm amber palette; natural skin texture; tactile fabric and weathered wood; 2.39:1 widescreen composition; subtle film grain; expressive realistic lighting. No written words, no logos, no watermark, no distorted hands, no duplicate people. Scene S16 — A Thousand Small Lights. OVER-SHOULDER shot, over the lead character's shoulder. Characters in frame: @KWAME_AGYEMAN (white linen shirt under a caramel lightweight field jacket, dark tailored trousers and brown loafers, antique bronze lapel pin shaped like a compass rose); @KOSI_MENSAH (indigo utility jumpsuit with rolled sleeves, sand-coloured work boots and a narrow woven kente belt, small gold Adinkra-disc earrings). Over Kosi's shoulder, Kwame arrives without his bronze lapel pin and offers the master code. Mood: communal preparation. Lighting: fresh sun, bright fabrics and building anticipation. Environment = Location Registry id 'FESTIVAL_SQUARE': Afenyo's central festival square at blue hour: packed red-earth ground, a large silk-cotton tree, simple wooden platform, strings of unlit handmade lanterns, market stalls and the compound roofs beyond.",</w:t>
+        <w:t xml:space="preserve">  "prompt": "Grounded cinematic West African magical realism; contemporary Ghanaian coastal life; human-scale performances; saturated indigo, lagoon teal, clay red and warm amber palette; natural skin texture; tactile fabric and weathered wood; 16:9 landscape widescreen composition; subtle film grain; expressive realistic lighting. No written words, no logos, no watermark, no distorted hands, no duplicate people. Scene S16 — A Thousand Small Lights. OVER-SHOULDER shot, over the lead character's shoulder. Characters in frame: @KWAME_AGYEMAN (white linen shirt under a caramel lightweight field jacket, dark tailored trousers and brown loafers, antique bronze lapel pin shaped like a compass rose); @KOSI_MENSAH (indigo utility jumpsuit with rolled sleeves, sand-coloured work boots and a narrow woven kente belt, small gold Adinkra-disc earrings). Over Kosi's shoulder, Kwame arrives without his bronze lapel pin and offers the master code. Mood: communal preparation. Lighting: fresh sun, bright fabrics and building anticipation. Environment = Location Registry id 'FESTIVAL_SQUARE': Afenyo's central festival square at blue hour: packed red-earth ground, a large silk-cotton tree, simple wooden platform, strings of unlit handmade lanterns, market stalls and the compound roofs beyond.",</w:t>
         <w:br/>
         <w:t xml:space="preserve">  "status": "⬜",</w:t>
         <w:br/>
@@ -10235,7 +10235,7 @@
         <w:br/>
         <w:t xml:space="preserve">  ],</w:t>
         <w:br/>
-        <w:t xml:space="preserve">  "prompt": "Grounded cinematic West African magical realism; contemporary Ghanaian coastal life; human-scale performances; saturated indigo, lagoon teal, clay red and warm amber palette; natural skin texture; tactile fabric and weathered wood; 2.39:1 widescreen composition; subtle film grain; expressive realistic lighting. No written words, no logos, no watermark, no distorted hands, no duplicate people. Scene S16 — A Thousand Small Lights. EXTREME CLOSE shot, intimate frontal angle. Characters in frame: @SENA_ADJOVI (mustard oversized hoodie, blue-and-white printed ankle skirt and worn white canvas trainers, turquoise over-ear radio headphones); @AMA_ADJOVI (deep navy kaba blouse, hand-dyed indigo wrapper with tiny white wave motifs and flat leather sandals, three-strand amber bead necklace). Ama hands Sena the oldest blue-glass lantern in the square. Mood: communal preparation. Lighting: fresh sun, bright fabrics and building anticipation. Environment = Location Registry id 'FESTIVAL_SQUARE': Afenyo's central festival square at blue hour: packed red-earth ground, a large silk-cotton tree, simple wooden platform, strings of unlit handmade lanterns, market stalls and the compound roofs beyond.",</w:t>
+        <w:t xml:space="preserve">  "prompt": "Grounded cinematic West African magical realism; contemporary Ghanaian coastal life; human-scale performances; saturated indigo, lagoon teal, clay red and warm amber palette; natural skin texture; tactile fabric and weathered wood; 16:9 landscape widescreen composition; subtle film grain; expressive realistic lighting. No written words, no logos, no watermark, no distorted hands, no duplicate people. Scene S16 — A Thousand Small Lights. EXTREME CLOSE shot, intimate frontal angle. Characters in frame: @SENA_ADJOVI (mustard oversized hoodie, blue-and-white printed ankle skirt and worn white canvas trainers, turquoise over-ear radio headphones); @AMA_ADJOVI (deep navy kaba blouse, hand-dyed indigo wrapper with tiny white wave motifs and flat leather sandals, three-strand amber bead necklace). Ama hands Sena the oldest blue-glass lantern in the square. Mood: communal preparation. Lighting: fresh sun, bright fabrics and building anticipation. Environment = Location Registry id 'FESTIVAL_SQUARE': Afenyo's central festival square at blue hour: packed red-earth ground, a large silk-cotton tree, simple wooden platform, strings of unlit handmade lanterns, market stalls and the compound roofs beyond.",</w:t>
         <w:br/>
         <w:t xml:space="preserve">  "status": "⬜",</w:t>
         <w:br/>
@@ -10306,7 +10306,7 @@
         <w:br/>
         <w:t xml:space="preserve">  ],</w:t>
         <w:br/>
-        <w:t xml:space="preserve">  "prompt": "Grounded cinematic West African magical realism; contemporary Ghanaian coastal life; human-scale performances; saturated indigo, lagoon teal, clay red and warm amber palette; natural skin texture; tactile fabric and weathered wood; 2.39:1 widescreen composition; subtle film grain; expressive realistic lighting. No written words, no logos, no watermark, no distorted hands, no duplicate people. Scene S16 — A Thousand Small Lights. WIDE shot, low observational angle. Characters in frame: @KOSI_MENSAH (indigo utility jumpsuit with rolled sleeves, sand-coloured work boots and a narrow woven kente belt, small gold Adinkra-disc earrings); @AMA_ADJOVI (deep navy kaba blouse, hand-dyed indigo wrapper with tiny white wave motifs and flat leather sandals, three-strand amber bead necklace); @SENA_ADJOVI (mustard oversized hoodie, blue-and-white printed ankle skirt and worn white canvas trainers, turquoise over-ear radio headphones); @KOJO_DANSO (faded forest-green canvas jacket over a blue-and-cream striped shirt, charcoal trousers and rubber deck boots, weathered brass compass on a cord); @ESI_TETTEH (brick-red wax-print dress beneath a soot-black oilskin apron, patterned headwrap and sturdy black sandals, smooth charred-wood smoking paddle); @KWAME_AGYEMAN (white linen shirt under a caramel lightweight field jacket, dark tailored trousers and brown loafers, antique bronze lapel pin shaped like a compass rose). Six allies work amid strings of lanterns that slowly begin to glow. Mood: communal preparation. Lighting: fresh sun, bright fabrics and building anticipation. Environment = Location Registry id 'FESTIVAL_SQUARE': Afenyo's central festival square at blue hour: packed red-earth ground, a large silk-cotton tree, simple wooden platform, strings of unlit handmade lanterns, market stalls and the compound roofs beyond.",</w:t>
+        <w:t xml:space="preserve">  "prompt": "Grounded cinematic West African magical realism; contemporary Ghanaian coastal life; human-scale performances; saturated indigo, lagoon teal, clay red and warm amber palette; natural skin texture; tactile fabric and weathered wood; 16:9 landscape widescreen composition; subtle film grain; expressive realistic lighting. No written words, no logos, no watermark, no distorted hands, no duplicate people. Scene S16 — A Thousand Small Lights. WIDE shot, low observational angle. Characters in frame: @KOSI_MENSAH (indigo utility jumpsuit with rolled sleeves, sand-coloured work boots and a narrow woven kente belt, small gold Adinkra-disc earrings); @AMA_ADJOVI (deep navy kaba blouse, hand-dyed indigo wrapper with tiny white wave motifs and flat leather sandals, three-strand amber bead necklace); @SENA_ADJOVI (mustard oversized hoodie, blue-and-white printed ankle skirt and worn white canvas trainers, turquoise over-ear radio headphones); @KOJO_DANSO (faded forest-green canvas jacket over a blue-and-cream striped shirt, charcoal trousers and rubber deck boots, weathered brass compass on a cord); @ESI_TETTEH (brick-red wax-print dress beneath a soot-black oilskin apron, patterned headwrap and sturdy black sandals, smooth charred-wood smoking paddle); @KWAME_AGYEMAN (white linen shirt under a caramel lightweight field jacket, dark tailored trousers and brown loafers, antique bronze lapel pin shaped like a compass rose). Six allies work amid strings of lanterns that slowly begin to glow. Mood: communal preparation. Lighting: fresh sun, bright fabrics and building anticipation. Environment = Location Registry id 'FESTIVAL_SQUARE': Afenyo's central festival square at blue hour: packed red-earth ground, a large silk-cotton tree, simple wooden platform, strings of unlit handmade lanterns, market stalls and the compound roofs beyond.",</w:t>
         <w:br/>
         <w:t xml:space="preserve">  "status": "⬜",</w:t>
         <w:br/>
@@ -10357,7 +10357,7 @@
         <w:br/>
         <w:t xml:space="preserve">  ],</w:t>
         <w:br/>
-        <w:t xml:space="preserve">  "prompt": "Grounded cinematic West African magical realism; contemporary Ghanaian coastal life; human-scale performances; saturated indigo, lagoon teal, clay red and warm amber palette; natural skin texture; tactile fabric and weathered wood; 2.39:1 widescreen composition; subtle film grain; expressive realistic lighting. No written words, no logos, no watermark, no distorted hands, no duplicate people. Scene S16 — A Thousand Small Lights. MEDIUM shot, handheld eye-level. Characters in frame: @SENA_ADJOVI (mustard oversized hoodie, blue-and-white printed ankle skirt and worn white canvas trainers, turquoise over-ear radio headphones). Sena says her light points at everybody, smiling beneath turquoise headphones. Mood: communal preparation. Lighting: fresh sun, bright fabrics and building anticipation. Environment = Location Registry id 'FESTIVAL_SQUARE': Afenyo's central festival square at blue hour: packed red-earth ground, a large silk-cotton tree, simple wooden platform, strings of unlit handmade lanterns, market stalls and the compound roofs beyond.",</w:t>
+        <w:t xml:space="preserve">  "prompt": "Grounded cinematic West African magical realism; contemporary Ghanaian coastal life; human-scale performances; saturated indigo, lagoon teal, clay red and warm amber palette; natural skin texture; tactile fabric and weathered wood; 16:9 landscape widescreen composition; subtle film grain; expressive realistic lighting. No written words, no logos, no watermark, no distorted hands, no duplicate people. Scene S16 — A Thousand Small Lights. MEDIUM shot, handheld eye-level. Characters in frame: @SENA_ADJOVI (mustard oversized hoodie, blue-and-white printed ankle skirt and worn white canvas trainers, turquoise over-ear radio headphones). Sena says her light points at everybody, smiling beneath turquoise headphones. Mood: communal preparation. Lighting: fresh sun, bright fabrics and building anticipation. Environment = Location Registry id 'FESTIVAL_SQUARE': Afenyo's central festival square at blue hour: packed red-earth ground, a large silk-cotton tree, simple wooden platform, strings of unlit handmade lanterns, market stalls and the compound roofs beyond.",</w:t>
         <w:br/>
         <w:t xml:space="preserve">  "status": "⬜",</w:t>
         <w:br/>
@@ -10428,7 +10428,7 @@
         <w:br/>
         <w:t xml:space="preserve">  ],</w:t>
         <w:br/>
-        <w:t xml:space="preserve">  "prompt": "Grounded cinematic West African magical realism; contemporary Ghanaian coastal life; human-scale performances; saturated indigo, lagoon teal, clay red and warm amber palette; natural skin texture; tactile fabric and weathered wood; 2.39:1 widescreen composition; subtle film grain; expressive realistic lighting. No written words, no logos, no watermark, no distorted hands, no duplicate people. Scene S16 — A Thousand Small Lights. WIDE shot, rear closing tableau. Characters in frame: @KOSI_MENSAH (indigo utility jumpsuit with rolled sleeves, sand-coloured work boots and a narrow woven kente belt, small gold Adinkra-disc earrings); @AMA_ADJOVI (deep navy kaba blouse, hand-dyed indigo wrapper with tiny white wave motifs and flat leather sandals, three-strand amber bead necklace); @SENA_ADJOVI (mustard oversized hoodie, blue-and-white printed ankle skirt and worn white canvas trainers, turquoise over-ear radio headphones); @KOJO_DANSO (faded forest-green canvas jacket over a blue-and-cream striped shirt, charcoal trousers and rubber deck boots, weathered brass compass on a cord); @ESI_TETTEH (brick-red wax-print dress beneath a soot-black oilskin apron, patterned headwrap and sturdy black sandals, smooth charred-wood smoking paddle); @KWAME_AGYEMAN (white linen shirt under a caramel lightweight field jacket, dark tailored trousers and brown loafers, antique bronze lapel pin shaped like a compass rose). The prepared square gleams with a thousand small, unlit promises. Mood: communal preparation. Lighting: fresh sun, bright fabrics and building anticipation. Environment = Location Registry id 'FESTIVAL_SQUARE': Afenyo's central festival square at blue hour: packed red-earth ground, a large silk-cotton tree, simple wooden platform, strings of unlit handmade lanterns, market stalls and the compound roofs beyond.",</w:t>
+        <w:t xml:space="preserve">  "prompt": "Grounded cinematic West African magical realism; contemporary Ghanaian coastal life; human-scale performances; saturated indigo, lagoon teal, clay red and warm amber palette; natural skin texture; tactile fabric and weathered wood; 16:9 landscape widescreen composition; subtle film grain; expressive realistic lighting. No written words, no logos, no watermark, no distorted hands, no duplicate people. Scene S16 — A Thousand Small Lights. WIDE shot, rear closing tableau. Characters in frame: @KOSI_MENSAH (indigo utility jumpsuit with rolled sleeves, sand-coloured work boots and a narrow woven kente belt, small gold Adinkra-disc earrings); @AMA_ADJOVI (deep navy kaba blouse, hand-dyed indigo wrapper with tiny white wave motifs and flat leather sandals, three-strand amber bead necklace); @SENA_ADJOVI (mustard oversized hoodie, blue-and-white printed ankle skirt and worn white canvas trainers, turquoise over-ear radio headphones); @KOJO_DANSO (faded forest-green canvas jacket over a blue-and-cream striped shirt, charcoal trousers and rubber deck boots, weathered brass compass on a cord); @ESI_TETTEH (brick-red wax-print dress beneath a soot-black oilskin apron, patterned headwrap and sturdy black sandals, smooth charred-wood smoking paddle); @KWAME_AGYEMAN (white linen shirt under a caramel lightweight field jacket, dark tailored trousers and brown loafers, antique bronze lapel pin shaped like a compass rose). The prepared square gleams with a thousand small, unlit promises. Mood: communal preparation. Lighting: fresh sun, bright fabrics and building anticipation. Environment = Location Registry id 'FESTIVAL_SQUARE': Afenyo's central festival square at blue hour: packed red-earth ground, a large silk-cotton tree, simple wooden platform, strings of unlit handmade lanterns, market stalls and the compound roofs beyond.",</w:t>
         <w:br/>
         <w:t xml:space="preserve">  "status": "⬜",</w:t>
         <w:br/>
@@ -10499,7 +10499,7 @@
         <w:br/>
         <w:t xml:space="preserve">  ],</w:t>
         <w:br/>
-        <w:t xml:space="preserve">  "prompt": "Grounded cinematic West African magical realism; contemporary Ghanaian coastal life; human-scale performances; saturated indigo, lagoon teal, clay red and warm amber palette; natural skin texture; tactile fabric and weathered wood; 2.39:1 widescreen composition; subtle film grain; expressive realistic lighting. No written words, no logos, no watermark, no distorted hands, no duplicate people. Scene S17 — Signal on the Water. WIDE shot, high establishing angle. Characters in frame: @KOSI_MENSAH (indigo utility jumpsuit with rolled sleeves, sand-coloured work boots and a narrow woven kente belt, small gold Adinkra-disc earrings); @KOJO_DANSO (faded forest-green canvas jacket over a blue-and-cream striped shirt, charcoal trousers and rubber deck boots, weathered brass compass on a cord); @SENA_ADJOVI (mustard oversized hoodie, blue-and-white printed ankle skirt and worn white canvas trainers, turquoise over-ear radio headphones); @KWAME_AGYEMAN (white linen shirt under a caramel lightweight field jacket, dark tailored trousers and brown loafers, antique bronze lapel pin shaped like a compass rose). Kojo's canoe reaches the restored beacon as lantern canoes gather in the distance. Mood: breath-held suspense. Lighting: blue-hour sky, beacon amber and reflected lantern trail. Environment = Location Registry id 'LAGOON_BEACON': The restored solar beacon on the open Afenyo lagoon: a weathered metal buoy with a blue-glass lantern crown, tether chain, rippling teal water, mangrove horizon and vast cloud-streaked sky.",</w:t>
+        <w:t xml:space="preserve">  "prompt": "Grounded cinematic West African magical realism; contemporary Ghanaian coastal life; human-scale performances; saturated indigo, lagoon teal, clay red and warm amber palette; natural skin texture; tactile fabric and weathered wood; 16:9 landscape widescreen composition; subtle film grain; expressive realistic lighting. No written words, no logos, no watermark, no distorted hands, no duplicate people. Scene S17 — Signal on the Water. WIDE shot, high establishing angle. Characters in frame: @KOSI_MENSAH (indigo utility jumpsuit with rolled sleeves, sand-coloured work boots and a narrow woven kente belt, small gold Adinkra-disc earrings); @KOJO_DANSO (faded forest-green canvas jacket over a blue-and-cream striped shirt, charcoal trousers and rubber deck boots, weathered brass compass on a cord); @SENA_ADJOVI (mustard oversized hoodie, blue-and-white printed ankle skirt and worn white canvas trainers, turquoise over-ear radio headphones); @KWAME_AGYEMAN (white linen shirt under a caramel lightweight field jacket, dark tailored trousers and brown loafers, antique bronze lapel pin shaped like a compass rose). Kojo's canoe reaches the restored beacon as lantern canoes gather in the distance. Mood: breath-held suspense. Lighting: blue-hour sky, beacon amber and reflected lantern trail. Environment = Location Registry id 'LAGOON_BEACON': The restored solar beacon on the open Afenyo lagoon: a weathered metal buoy with a blue-glass lantern crown, tether chain, rippling teal water, mangrove horizon and vast cloud-streaked sky.",</w:t>
         <w:br/>
         <w:t xml:space="preserve">  "status": "⬜",</w:t>
         <w:br/>
@@ -10550,7 +10550,7 @@
         <w:br/>
         <w:t xml:space="preserve">  ],</w:t>
         <w:br/>
-        <w:t xml:space="preserve">  "prompt": "Grounded cinematic West African magical realism; contemporary Ghanaian coastal life; human-scale performances; saturated indigo, lagoon teal, clay red and warm amber palette; natural skin texture; tactile fabric and weathered wood; 2.39:1 widescreen composition; subtle film grain; expressive realistic lighting. No written words, no logos, no watermark, no distorted hands, no duplicate people. Scene S17 — Signal on the Water. MEDIUM shot, eye-level. Characters in frame: @KOJO_DANSO (faded forest-green canvas jacket over a blue-and-cream striped shirt, charcoal trousers and rubber deck boots, weathered brass compass on a cord). Kojo secures the canoe to the buoy with practiced hands. Mood: breath-held suspense. Lighting: blue-hour sky, beacon amber and reflected lantern trail. Environment = Location Registry id 'LAGOON_BEACON': The restored solar beacon on the open Afenyo lagoon: a weathered metal buoy with a blue-glass lantern crown, tether chain, rippling teal water, mangrove horizon and vast cloud-streaked sky.",</w:t>
+        <w:t xml:space="preserve">  "prompt": "Grounded cinematic West African magical realism; contemporary Ghanaian coastal life; human-scale performances; saturated indigo, lagoon teal, clay red and warm amber palette; natural skin texture; tactile fabric and weathered wood; 16:9 landscape widescreen composition; subtle film grain; expressive realistic lighting. No written words, no logos, no watermark, no distorted hands, no duplicate people. Scene S17 — Signal on the Water. MEDIUM shot, eye-level. Characters in frame: @KOJO_DANSO (faded forest-green canvas jacket over a blue-and-cream striped shirt, charcoal trousers and rubber deck boots, weathered brass compass on a cord). Kojo secures the canoe to the buoy with practiced hands. Mood: breath-held suspense. Lighting: blue-hour sky, beacon amber and reflected lantern trail. Environment = Location Registry id 'LAGOON_BEACON': The restored solar beacon on the open Afenyo lagoon: a weathered metal buoy with a blue-glass lantern crown, tether chain, rippling teal water, mangrove horizon and vast cloud-streaked sky.",</w:t>
         <w:br/>
         <w:t xml:space="preserve">  "status": "⬜",</w:t>
         <w:br/>
@@ -10601,7 +10601,7 @@
         <w:br/>
         <w:t xml:space="preserve">  ],</w:t>
         <w:br/>
-        <w:t xml:space="preserve">  "prompt": "Grounded cinematic West African magical realism; contemporary Ghanaian coastal life; human-scale performances; saturated indigo, lagoon teal, clay red and warm amber palette; natural skin texture; tactile fabric and weathered wood; 2.39:1 widescreen composition; subtle film grain; expressive realistic lighting. No written words, no logos, no watermark, no distorted hands, no duplicate people. Scene S17 — Signal on the Water. CLOSE shot, three-quarter profile. Characters in frame: @KOSI_MENSAH (indigo utility jumpsuit with rolled sleeves, sand-coloured work boots and a narrow woven kente belt, small gold Adinkra-disc earrings). Kosi connects a repaired solar cell inside the blue-glass lantern crown. Mood: breath-held suspense. Lighting: blue-hour sky, beacon amber and reflected lantern trail. Environment = Location Registry id 'LAGOON_BEACON': The restored solar beacon on the open Afenyo lagoon: a weathered metal buoy with a blue-glass lantern crown, tether chain, rippling teal water, mangrove horizon and vast cloud-streaked sky.",</w:t>
+        <w:t xml:space="preserve">  "prompt": "Grounded cinematic West African magical realism; contemporary Ghanaian coastal life; human-scale performances; saturated indigo, lagoon teal, clay red and warm amber palette; natural skin texture; tactile fabric and weathered wood; 16:9 landscape widescreen composition; subtle film grain; expressive realistic lighting. No written words, no logos, no watermark, no distorted hands, no duplicate people. Scene S17 — Signal on the Water. CLOSE shot, three-quarter profile. Characters in frame: @KOSI_MENSAH (indigo utility jumpsuit with rolled sleeves, sand-coloured work boots and a narrow woven kente belt, small gold Adinkra-disc earrings). Kosi connects a repaired solar cell inside the blue-glass lantern crown. Mood: breath-held suspense. Lighting: blue-hour sky, beacon amber and reflected lantern trail. Environment = Location Registry id 'LAGOON_BEACON': The restored solar beacon on the open Afenyo lagoon: a weathered metal buoy with a blue-glass lantern crown, tether chain, rippling teal water, mangrove horizon and vast cloud-streaked sky.",</w:t>
         <w:br/>
         <w:t xml:space="preserve">  "status": "⬜",</w:t>
         <w:br/>
@@ -10652,7 +10652,7 @@
         <w:br/>
         <w:t xml:space="preserve">  ],</w:t>
         <w:br/>
-        <w:t xml:space="preserve">  "prompt": "Grounded cinematic West African magical realism; contemporary Ghanaian coastal life; human-scale performances; saturated indigo, lagoon teal, clay red and warm amber palette; natural skin texture; tactile fabric and weathered wood; 2.39:1 widescreen composition; subtle film grain; expressive realistic lighting. No written words, no logos, no watermark, no distorted hands, no duplicate people. Scene S17 — Signal on the Water. INSERT shot, top-down detail. Characters in frame: @SENA_ADJOVI (mustard oversized hoodie, blue-and-white printed ankle skirt and worn white canvas trainers, turquoise over-ear radio headphones). Sena's broadcast equipment displays the transmitted archive pages and water readings. Mood: breath-held suspense. Lighting: blue-hour sky, beacon amber and reflected lantern trail. Environment = Location Registry id 'LAGOON_BEACON': The restored solar beacon on the open Afenyo lagoon: a weathered metal buoy with a blue-glass lantern crown, tether chain, rippling teal water, mangrove horizon and vast cloud-streaked sky.",</w:t>
+        <w:t xml:space="preserve">  "prompt": "Grounded cinematic West African magical realism; contemporary Ghanaian coastal life; human-scale performances; saturated indigo, lagoon teal, clay red and warm amber palette; natural skin texture; tactile fabric and weathered wood; 16:9 landscape widescreen composition; subtle film grain; expressive realistic lighting. No written words, no logos, no watermark, no distorted hands, no duplicate people. Scene S17 — Signal on the Water. INSERT shot, top-down detail. Characters in frame: @SENA_ADJOVI (mustard oversized hoodie, blue-and-white printed ankle skirt and worn white canvas trainers, turquoise over-ear radio headphones). Sena's broadcast equipment displays the transmitted archive pages and water readings. Mood: breath-held suspense. Lighting: blue-hour sky, beacon amber and reflected lantern trail. Environment = Location Registry id 'LAGOON_BEACON': The restored solar beacon on the open Afenyo lagoon: a weathered metal buoy with a blue-glass lantern crown, tether chain, rippling teal water, mangrove horizon and vast cloud-streaked sky.",</w:t>
         <w:br/>
         <w:t xml:space="preserve">  "status": "⬜",</w:t>
         <w:br/>
@@ -10715,7 +10715,7 @@
         <w:br/>
         <w:t xml:space="preserve">  ],</w:t>
         <w:br/>
-        <w:t xml:space="preserve">  "prompt": "Grounded cinematic West African magical realism; contemporary Ghanaian coastal life; human-scale performances; saturated indigo, lagoon teal, clay red and warm amber palette; natural skin texture; tactile fabric and weathered wood; 2.39:1 widescreen composition; subtle film grain; expressive realistic lighting. No written words, no logos, no watermark, no distorted hands, no duplicate people. Scene S17 — Signal on the Water. TWO-SHOT shot, eye-level. Characters in frame: @KOSI_MENSAH (indigo utility jumpsuit with rolled sleeves, sand-coloured work boots and a narrow woven kente belt, small gold Adinkra-disc earrings); @KOJO_DANSO (faded forest-green canvas jacket over a blue-and-cream striped shirt, charcoal trousers and rubber deck boots, weathered brass compass on a cord); @SENA_ADJOVI (mustard oversized hoodie, blue-and-white printed ankle skirt and worn white canvas trainers, turquoise over-ear radio headphones); @KWAME_AGYEMAN (white linen shirt under a caramel lightweight field jacket, dark tailored trousers and brown loafers, antique bronze lapel pin shaped like a compass rose). The four balance at the beacon as a flotilla of lights forms behind them. Mood: breath-held suspense. Lighting: blue-hour sky, beacon amber and reflected lantern trail. Environment = Location Registry id 'LAGOON_BEACON': The restored solar beacon on the open Afenyo lagoon: a weathered metal buoy with a blue-glass lantern crown, tether chain, rippling teal water, mangrove horizon and vast cloud-streaked sky.",</w:t>
+        <w:t xml:space="preserve">  "prompt": "Grounded cinematic West African magical realism; contemporary Ghanaian coastal life; human-scale performances; saturated indigo, lagoon teal, clay red and warm amber palette; natural skin texture; tactile fabric and weathered wood; 16:9 landscape widescreen composition; subtle film grain; expressive realistic lighting. No written words, no logos, no watermark, no distorted hands, no duplicate people. Scene S17 — Signal on the Water. TWO-SHOT shot, eye-level. Characters in frame: @KOSI_MENSAH (indigo utility jumpsuit with rolled sleeves, sand-coloured work boots and a narrow woven kente belt, small gold Adinkra-disc earrings); @KOJO_DANSO (faded forest-green canvas jacket over a blue-and-cream striped shirt, charcoal trousers and rubber deck boots, weathered brass compass on a cord); @SENA_ADJOVI (mustard oversized hoodie, blue-and-white printed ankle skirt and worn white canvas trainers, turquoise over-ear radio headphones); @KWAME_AGYEMAN (white linen shirt under a caramel lightweight field jacket, dark tailored trousers and brown loafers, antique bronze lapel pin shaped like a compass rose). The four balance at the beacon as a flotilla of lights forms behind them. Mood: breath-held suspense. Lighting: blue-hour sky, beacon amber and reflected lantern trail. Environment = Location Registry id 'LAGOON_BEACON': The restored solar beacon on the open Afenyo lagoon: a weathered metal buoy with a blue-glass lantern crown, tether chain, rippling teal water, mangrove horizon and vast cloud-streaked sky.",</w:t>
         <w:br/>
         <w:t xml:space="preserve">  "status": "⬜",</w:t>
         <w:br/>
@@ -10766,7 +10766,7 @@
         <w:br/>
         <w:t xml:space="preserve">  ],</w:t>
         <w:br/>
-        <w:t xml:space="preserve">  "prompt": "Grounded cinematic West African magical realism; contemporary Ghanaian coastal life; human-scale performances; saturated indigo, lagoon teal, clay red and warm amber palette; natural skin texture; tactile fabric and weathered wood; 2.39:1 widescreen composition; subtle film grain; expressive realistic lighting. No written words, no logos, no watermark, no distorted hands, no duplicate people. Scene S17 — Signal on the Water. OVER-SHOULDER shot, over the lead character's shoulder. Characters in frame: @KWAME_AGYEMAN (white linen shirt under a caramel lightweight field jacket, dark tailored trousers and brown loafers, antique bronze lapel pin shaped like a compass rose). Over Kwame's shoulder, he sends the unredacted map to regional reporters. Mood: breath-held suspense. Lighting: blue-hour sky, beacon amber and reflected lantern trail. Environment = Location Registry id 'LAGOON_BEACON': The restored solar beacon on the open Afenyo lagoon: a weathered metal buoy with a blue-glass lantern crown, tether chain, rippling teal water, mangrove horizon and vast cloud-streaked sky.",</w:t>
+        <w:t xml:space="preserve">  "prompt": "Grounded cinematic West African magical realism; contemporary Ghanaian coastal life; human-scale performances; saturated indigo, lagoon teal, clay red and warm amber palette; natural skin texture; tactile fabric and weathered wood; 16:9 landscape widescreen composition; subtle film grain; expressive realistic lighting. No written words, no logos, no watermark, no distorted hands, no duplicate people. Scene S17 — Signal on the Water. OVER-SHOULDER shot, over the lead character's shoulder. Characters in frame: @KWAME_AGYEMAN (white linen shirt under a caramel lightweight field jacket, dark tailored trousers and brown loafers, antique bronze lapel pin shaped like a compass rose). Over Kwame's shoulder, he sends the unredacted map to regional reporters. Mood: breath-held suspense. Lighting: blue-hour sky, beacon amber and reflected lantern trail. Environment = Location Registry id 'LAGOON_BEACON': The restored solar beacon on the open Afenyo lagoon: a weathered metal buoy with a blue-glass lantern crown, tether chain, rippling teal water, mangrove horizon and vast cloud-streaked sky.",</w:t>
         <w:br/>
         <w:t xml:space="preserve">  "status": "⬜",</w:t>
         <w:br/>
@@ -10817,7 +10817,7 @@
         <w:br/>
         <w:t xml:space="preserve">  ],</w:t>
         <w:br/>
-        <w:t xml:space="preserve">  "prompt": "Grounded cinematic West African magical realism; contemporary Ghanaian coastal life; human-scale performances; saturated indigo, lagoon teal, clay red and warm amber palette; natural skin texture; tactile fabric and weathered wood; 2.39:1 widescreen composition; subtle film grain; expressive realistic lighting. No written words, no logos, no watermark, no distorted hands, no duplicate people. Scene S17 — Signal on the Water. EXTREME CLOSE shot, intimate frontal angle. Characters in frame: @SENA_ADJOVI (mustard oversized hoodie, blue-and-white printed ankle skirt and worn white canvas trainers, turquoise over-ear radio headphones). Sena announces that Afenyo is speaking and asks listeners not to call it noise. Mood: breath-held suspense. Lighting: blue-hour sky, beacon amber and reflected lantern trail. Environment = Location Registry id 'LAGOON_BEACON': The restored solar beacon on the open Afenyo lagoon: a weathered metal buoy with a blue-glass lantern crown, tether chain, rippling teal water, mangrove horizon and vast cloud-streaked sky.",</w:t>
+        <w:t xml:space="preserve">  "prompt": "Grounded cinematic West African magical realism; contemporary Ghanaian coastal life; human-scale performances; saturated indigo, lagoon teal, clay red and warm amber palette; natural skin texture; tactile fabric and weathered wood; 16:9 landscape widescreen composition; subtle film grain; expressive realistic lighting. No written words, no logos, no watermark, no distorted hands, no duplicate people. Scene S17 — Signal on the Water. EXTREME CLOSE shot, intimate frontal angle. Characters in frame: @SENA_ADJOVI (mustard oversized hoodie, blue-and-white printed ankle skirt and worn white canvas trainers, turquoise over-ear radio headphones). Sena announces that Afenyo is speaking and asks listeners not to call it noise. Mood: breath-held suspense. Lighting: blue-hour sky, beacon amber and reflected lantern trail. Environment = Location Registry id 'LAGOON_BEACON': The restored solar beacon on the open Afenyo lagoon: a weathered metal buoy with a blue-glass lantern crown, tether chain, rippling teal water, mangrove horizon and vast cloud-streaked sky.",</w:t>
         <w:br/>
         <w:t xml:space="preserve">  "status": "⬜",</w:t>
         <w:br/>
@@ -10880,7 +10880,7 @@
         <w:br/>
         <w:t xml:space="preserve">  ],</w:t>
         <w:br/>
-        <w:t xml:space="preserve">  "prompt": "Grounded cinematic West African magical realism; contemporary Ghanaian coastal life; human-scale performances; saturated indigo, lagoon teal, clay red and warm amber palette; natural skin texture; tactile fabric and weathered wood; 2.39:1 widescreen composition; subtle film grain; expressive realistic lighting. No written words, no logos, no watermark, no distorted hands, no duplicate people. Scene S17 — Signal on the Water. WIDE shot, low observational angle. Characters in frame: @KOSI_MENSAH (indigo utility jumpsuit with rolled sleeves, sand-coloured work boots and a narrow woven kente belt, small gold Adinkra-disc earrings); @KOJO_DANSO (faded forest-green canvas jacket over a blue-and-cream striped shirt, charcoal trousers and rubber deck boots, weathered brass compass on a cord); @SENA_ADJOVI (mustard oversized hoodie, blue-and-white printed ankle skirt and worn white canvas trainers, turquoise over-ear radio headphones); @KWAME_AGYEMAN (white linen shirt under a caramel lightweight field jacket, dark tailored trousers and brown loafers, antique bronze lapel pin shaped like a compass rose). Lantern canoes glow in a broad arc across the blue lagoon. Mood: breath-held suspense. Lighting: blue-hour sky, beacon amber and reflected lantern trail. Environment = Location Registry id 'LAGOON_BEACON': The restored solar beacon on the open Afenyo lagoon: a weathered metal buoy with a blue-glass lantern crown, tether chain, rippling teal water, mangrove horizon and vast cloud-streaked sky.",</w:t>
+        <w:t xml:space="preserve">  "prompt": "Grounded cinematic West African magical realism; contemporary Ghanaian coastal life; human-scale performances; saturated indigo, lagoon teal, clay red and warm amber palette; natural skin texture; tactile fabric and weathered wood; 16:9 landscape widescreen composition; subtle film grain; expressive realistic lighting. No written words, no logos, no watermark, no distorted hands, no duplicate people. Scene S17 — Signal on the Water. WIDE shot, low observational angle. Characters in frame: @KOSI_MENSAH (indigo utility jumpsuit with rolled sleeves, sand-coloured work boots and a narrow woven kente belt, small gold Adinkra-disc earrings); @KOJO_DANSO (faded forest-green canvas jacket over a blue-and-cream striped shirt, charcoal trousers and rubber deck boots, weathered brass compass on a cord); @SENA_ADJOVI (mustard oversized hoodie, blue-and-white printed ankle skirt and worn white canvas trainers, turquoise over-ear radio headphones); @KWAME_AGYEMAN (white linen shirt under a caramel lightweight field jacket, dark tailored trousers and brown loafers, antique bronze lapel pin shaped like a compass rose). Lantern canoes glow in a broad arc across the blue lagoon. Mood: breath-held suspense. Lighting: blue-hour sky, beacon amber and reflected lantern trail. Environment = Location Registry id 'LAGOON_BEACON': The restored solar beacon on the open Afenyo lagoon: a weathered metal buoy with a blue-glass lantern crown, tether chain, rippling teal water, mangrove horizon and vast cloud-streaked sky.",</w:t>
         <w:br/>
         <w:t xml:space="preserve">  "status": "⬜",</w:t>
         <w:br/>
@@ -10931,7 +10931,7 @@
         <w:br/>
         <w:t xml:space="preserve">  ],</w:t>
         <w:br/>
-        <w:t xml:space="preserve">  "prompt": "Grounded cinematic West African magical realism; contemporary Ghanaian coastal life; human-scale performances; saturated indigo, lagoon teal, clay red and warm amber palette; natural skin texture; tactile fabric and weathered wood; 2.39:1 widescreen composition; subtle film grain; expressive realistic lighting. No written words, no logos, no watermark, no distorted hands, no duplicate people. Scene S17 — Signal on the Water. MEDIUM shot, handheld eye-level. Characters in frame: @KOSI_MENSAH (indigo utility jumpsuit with rolled sleeves, sand-coloured work boots and a narrow woven kente belt, small gold Adinkra-disc earrings). The blue-glass beacon gives its first steady pulse. Mood: breath-held suspense. Lighting: blue-hour sky, beacon amber and reflected lantern trail. Environment = Location Registry id 'LAGOON_BEACON': The restored solar beacon on the open Afenyo lagoon: a weathered metal buoy with a blue-glass lantern crown, tether chain, rippling teal water, mangrove horizon and vast cloud-streaked sky.",</w:t>
+        <w:t xml:space="preserve">  "prompt": "Grounded cinematic West African magical realism; contemporary Ghanaian coastal life; human-scale performances; saturated indigo, lagoon teal, clay red and warm amber palette; natural skin texture; tactile fabric and weathered wood; 16:9 landscape widescreen composition; subtle film grain; expressive realistic lighting. No written words, no logos, no watermark, no distorted hands, no duplicate people. Scene S17 — Signal on the Water. MEDIUM shot, handheld eye-level. Characters in frame: @KOSI_MENSAH (indigo utility jumpsuit with rolled sleeves, sand-coloured work boots and a narrow woven kente belt, small gold Adinkra-disc earrings). The blue-glass beacon gives its first steady pulse. Mood: breath-held suspense. Lighting: blue-hour sky, beacon amber and reflected lantern trail. Environment = Location Registry id 'LAGOON_BEACON': The restored solar beacon on the open Afenyo lagoon: a weathered metal buoy with a blue-glass lantern crown, tether chain, rippling teal water, mangrove horizon and vast cloud-streaked sky.",</w:t>
         <w:br/>
         <w:t xml:space="preserve">  "status": "⬜",</w:t>
         <w:br/>
@@ -10994,7 +10994,7 @@
         <w:br/>
         <w:t xml:space="preserve">  ],</w:t>
         <w:br/>
-        <w:t xml:space="preserve">  "prompt": "Grounded cinematic West African magical realism; contemporary Ghanaian coastal life; human-scale performances; saturated indigo, lagoon teal, clay red and warm amber palette; natural skin texture; tactile fabric and weathered wood; 2.39:1 widescreen composition; subtle film grain; expressive realistic lighting. No written words, no logos, no watermark, no distorted hands, no duplicate people. Scene S17 — Signal on the Water. WIDE shot, rear closing tableau. Characters in frame: @KOSI_MENSAH (indigo utility jumpsuit with rolled sleeves, sand-coloured work boots and a narrow woven kente belt, small gold Adinkra-disc earrings); @KOJO_DANSO (faded forest-green canvas jacket over a blue-and-cream striped shirt, charcoal trousers and rubber deck boots, weathered brass compass on a cord); @SENA_ADJOVI (mustard oversized hoodie, blue-and-white printed ankle skirt and worn white canvas trainers, turquoise over-ear radio headphones); @KWAME_AGYEMAN (white linen shirt under a caramel lightweight field jacket, dark tailored trousers and brown loafers, antique bronze lapel pin shaped like a compass rose). The beacon and flotilla burn together beneath a vast cloud-streaked sky. Mood: breath-held suspense. Lighting: blue-hour sky, beacon amber and reflected lantern trail. Environment = Location Registry id 'LAGOON_BEACON': The restored solar beacon on the open Afenyo lagoon: a weathered metal buoy with a blue-glass lantern crown, tether chain, rippling teal water, mangrove horizon and vast cloud-streaked sky.",</w:t>
+        <w:t xml:space="preserve">  "prompt": "Grounded cinematic West African magical realism; contemporary Ghanaian coastal life; human-scale performances; saturated indigo, lagoon teal, clay red and warm amber palette; natural skin texture; tactile fabric and weathered wood; 16:9 landscape widescreen composition; subtle film grain; expressive realistic lighting. No written words, no logos, no watermark, no distorted hands, no duplicate people. Scene S17 — Signal on the Water. WIDE shot, rear closing tableau. Characters in frame: @KOSI_MENSAH (indigo utility jumpsuit with rolled sleeves, sand-coloured work boots and a narrow woven kente belt, small gold Adinkra-disc earrings); @KOJO_DANSO (faded forest-green canvas jacket over a blue-and-cream striped shirt, charcoal trousers and rubber deck boots, weathered brass compass on a cord); @SENA_ADJOVI (mustard oversized hoodie, blue-and-white printed ankle skirt and worn white canvas trainers, turquoise over-ear radio headphones); @KWAME_AGYEMAN (white linen shirt under a caramel lightweight field jacket, dark tailored trousers and brown loafers, antique bronze lapel pin shaped like a compass rose). The beacon and flotilla burn together beneath a vast cloud-streaked sky. Mood: breath-held suspense. Lighting: blue-hour sky, beacon amber and reflected lantern trail. Environment = Location Registry id 'LAGOON_BEACON': The restored solar beacon on the open Afenyo lagoon: a weathered metal buoy with a blue-glass lantern crown, tether chain, rippling teal water, mangrove horizon and vast cloud-streaked sky.",</w:t>
         <w:br/>
         <w:t xml:space="preserve">  "status": "⬜",</w:t>
         <w:br/>
@@ -11061,7 +11061,7 @@
         <w:br/>
         <w:t xml:space="preserve">  ],</w:t>
         <w:br/>
-        <w:t xml:space="preserve">  "prompt": "Grounded cinematic West African magical realism; contemporary Ghanaian coastal life; human-scale performances; saturated indigo, lagoon teal, clay red and warm amber palette; natural skin texture; tactile fabric and weathered wood; 2.39:1 widescreen composition; subtle film grain; expressive realistic lighting. No written words, no logos, no watermark, no distorted hands, no duplicate people. Scene S18 — The Chair Answers. WIDE shot, high establishing angle. Characters in frame: @ESI_TETTEH (brick-red wax-print dress beneath a soot-black oilskin apron, patterned headwrap and sturdy black sandals, smooth charred-wood smoking paddle); @SENA_ADJOVI (mustard oversized hoodie, blue-and-white printed ankle skirt and worn white canvas trainers, turquoise over-ear radio headphones); @AMA_ADJOVI (deep navy kaba blouse, hand-dyed indigo wrapper with tiny white wave motifs and flat leather sandals, three-strand amber bead necklace). Afenyo packs the community hall under amber lantern light and rain-darkened night. Mood: public reckoning. Lighting: amber lanterns, projection glow and rain-muted night. Environment = Location Registry id 'COMMUNITY_HALL': Afenyo's community hall at night: open concrete walls, a corrugated roof, rows of plastic chairs, a hand-painted blank projection sheet, standing fans, amber lantern light and rain-darkened red earth outside.",</w:t>
+        <w:t xml:space="preserve">  "prompt": "Grounded cinematic West African magical realism; contemporary Ghanaian coastal life; human-scale performances; saturated indigo, lagoon teal, clay red and warm amber palette; natural skin texture; tactile fabric and weathered wood; 16:9 landscape widescreen composition; subtle film grain; expressive realistic lighting. No written words, no logos, no watermark, no distorted hands, no duplicate people. Scene S18 — The Chair Answers. WIDE shot, high establishing angle. Characters in frame: @ESI_TETTEH (brick-red wax-print dress beneath a soot-black oilskin apron, patterned headwrap and sturdy black sandals, smooth charred-wood smoking paddle); @SENA_ADJOVI (mustard oversized hoodie, blue-and-white printed ankle skirt and worn white canvas trainers, turquoise over-ear radio headphones); @AMA_ADJOVI (deep navy kaba blouse, hand-dyed indigo wrapper with tiny white wave motifs and flat leather sandals, three-strand amber bead necklace). Afenyo packs the community hall under amber lantern light and rain-darkened night. Mood: public reckoning. Lighting: amber lanterns, projection glow and rain-muted night. Environment = Location Registry id 'COMMUNITY_HALL': Afenyo's community hall at night: open concrete walls, a corrugated roof, rows of plastic chairs, a hand-painted blank projection sheet, standing fans, amber lantern light and rain-darkened red earth outside.",</w:t>
         <w:br/>
         <w:t xml:space="preserve">  "status": "⬜",</w:t>
         <w:br/>
@@ -11112,7 +11112,7 @@
         <w:br/>
         <w:t xml:space="preserve">  ],</w:t>
         <w:br/>
-        <w:t xml:space="preserve">  "prompt": "Grounded cinematic West African magical realism; contemporary Ghanaian coastal life; human-scale performances; saturated indigo, lagoon teal, clay red and warm amber palette; natural skin texture; tactile fabric and weathered wood; 2.39:1 widescreen composition; subtle film grain; expressive realistic lighting. No written words, no logos, no watermark, no distorted hands, no duplicate people. Scene S18 — The Chair Answers. MEDIUM shot, eye-level. Characters in frame: @SENA_ADJOVI (mustard oversized hoodie, blue-and-white printed ankle skirt and worn white canvas trainers, turquoise over-ear radio headphones). The landing deed and water data shine clearly on a blank projection sheet. Mood: public reckoning. Lighting: amber lanterns, projection glow and rain-muted night. Environment = Location Registry id 'COMMUNITY_HALL': Afenyo's community hall at night: open concrete walls, a corrugated roof, rows of plastic chairs, a hand-painted blank projection sheet, standing fans, amber lantern light and rain-darkened red earth outside.",</w:t>
+        <w:t xml:space="preserve">  "prompt": "Grounded cinematic West African magical realism; contemporary Ghanaian coastal life; human-scale performances; saturated indigo, lagoon teal, clay red and warm amber palette; natural skin texture; tactile fabric and weathered wood; 16:9 landscape widescreen composition; subtle film grain; expressive realistic lighting. No written words, no logos, no watermark, no distorted hands, no duplicate people. Scene S18 — The Chair Answers. MEDIUM shot, eye-level. Characters in frame: @SENA_ADJOVI (mustard oversized hoodie, blue-and-white printed ankle skirt and worn white canvas trainers, turquoise over-ear radio headphones). The landing deed and water data shine clearly on a blank projection sheet. Mood: public reckoning. Lighting: amber lanterns, projection glow and rain-muted night. Environment = Location Registry id 'COMMUNITY_HALL': Afenyo's community hall at night: open concrete walls, a corrugated roof, rows of plastic chairs, a hand-painted blank projection sheet, standing fans, amber lantern light and rain-darkened red earth outside.",</w:t>
         <w:br/>
         <w:t xml:space="preserve">  "status": "⬜",</w:t>
         <w:br/>
@@ -11163,7 +11163,7 @@
         <w:br/>
         <w:t xml:space="preserve">  ],</w:t>
         <w:br/>
-        <w:t xml:space="preserve">  "prompt": "Grounded cinematic West African magical realism; contemporary Ghanaian coastal life; human-scale performances; saturated indigo, lagoon teal, clay red and warm amber palette; natural skin texture; tactile fabric and weathered wood; 2.39:1 widescreen composition; subtle film grain; expressive realistic lighting. No written words, no logos, no watermark, no distorted hands, no duplicate people. Scene S18 — The Chair Answers. CLOSE shot, three-quarter profile. Characters in frame: @NII_LAMPTEY (tailored charcoal caftan with a subtle black geometric weave, polished black shoes and a silver wristwatch, black ebony walking cane with a carved heron handle). Nii enters the open hall with his ebony heron cane and confronts the crowd. Mood: public reckoning. Lighting: amber lanterns, projection glow and rain-muted night. Environment = Location Registry id 'COMMUNITY_HALL': Afenyo's community hall at night: open concrete walls, a corrugated roof, rows of plastic chairs, a hand-painted blank projection sheet, standing fans, amber lantern light and rain-darkened red earth outside.",</w:t>
+        <w:t xml:space="preserve">  "prompt": "Grounded cinematic West African magical realism; contemporary Ghanaian coastal life; human-scale performances; saturated indigo, lagoon teal, clay red and warm amber palette; natural skin texture; tactile fabric and weathered wood; 16:9 landscape widescreen composition; subtle film grain; expressive realistic lighting. No written words, no logos, no watermark, no distorted hands, no duplicate people. Scene S18 — The Chair Answers. CLOSE shot, three-quarter profile. Characters in frame: @NII_LAMPTEY (tailored charcoal caftan with a subtle black geometric weave, polished black shoes and a silver wristwatch, black ebony walking cane with a carved heron handle). Nii enters the open hall with his ebony heron cane and confronts the crowd. Mood: public reckoning. Lighting: amber lanterns, projection glow and rain-muted night. Environment = Location Registry id 'COMMUNITY_HALL': Afenyo's community hall at night: open concrete walls, a corrugated roof, rows of plastic chairs, a hand-painted blank projection sheet, standing fans, amber lantern light and rain-darkened red earth outside.",</w:t>
         <w:br/>
         <w:t xml:space="preserve">  "status": "⬜",</w:t>
         <w:br/>
@@ -11214,7 +11214,7 @@
         <w:br/>
         <w:t xml:space="preserve">  ],</w:t>
         <w:br/>
-        <w:t xml:space="preserve">  "prompt": "Grounded cinematic West African magical realism; contemporary Ghanaian coastal life; human-scale performances; saturated indigo, lagoon teal, clay red and warm amber palette; natural skin texture; tactile fabric and weathered wood; 2.39:1 widescreen composition; subtle film grain; expressive realistic lighting. No written words, no logos, no watermark, no distorted hands, no duplicate people. Scene S18 — The Chair Answers. INSERT shot, top-down detail. Characters in frame: @AMA_ADJOVI (deep navy kaba blouse, hand-dyed indigo wrapper with tiny white wave motifs and flat leather sandals, three-strand amber bead necklace). Ama's calm face reflects the projection glow as neighbours begin to speak. Mood: public reckoning. Lighting: amber lanterns, projection glow and rain-muted night. Environment = Location Registry id 'COMMUNITY_HALL': Afenyo's community hall at night: open concrete walls, a corrugated roof, rows of plastic chairs, a hand-painted blank projection sheet, standing fans, amber lantern light and rain-darkened red earth outside.",</w:t>
+        <w:t xml:space="preserve">  "prompt": "Grounded cinematic West African magical realism; contemporary Ghanaian coastal life; human-scale performances; saturated indigo, lagoon teal, clay red and warm amber palette; natural skin texture; tactile fabric and weathered wood; 16:9 landscape widescreen composition; subtle film grain; expressive realistic lighting. No written words, no logos, no watermark, no distorted hands, no duplicate people. Scene S18 — The Chair Answers. INSERT shot, top-down detail. Characters in frame: @AMA_ADJOVI (deep navy kaba blouse, hand-dyed indigo wrapper with tiny white wave motifs and flat leather sandals, three-strand amber bead necklace). Ama's calm face reflects the projection glow as neighbours begin to speak. Mood: public reckoning. Lighting: amber lanterns, projection glow and rain-muted night. Environment = Location Registry id 'COMMUNITY_HALL': Afenyo's community hall at night: open concrete walls, a corrugated roof, rows of plastic chairs, a hand-painted blank projection sheet, standing fans, amber lantern light and rain-darkened red earth outside.",</w:t>
         <w:br/>
         <w:t xml:space="preserve">  "status": "⬜",</w:t>
         <w:br/>
@@ -11285,7 +11285,7 @@
         <w:br/>
         <w:t xml:space="preserve">  ],</w:t>
         <w:br/>
-        <w:t xml:space="preserve">  "prompt": "Grounded cinematic West African magical realism; contemporary Ghanaian coastal life; human-scale performances; saturated indigo, lagoon teal, clay red and warm amber palette; natural skin texture; tactile fabric and weathered wood; 2.39:1 widescreen composition; subtle film grain; expressive realistic lighting. No written words, no logos, no watermark, no distorted hands, no duplicate people. Scene S18 — The Chair Answers. TWO-SHOT shot, eye-level. Characters in frame: @NII_LAMPTEY (tailored charcoal caftan with a subtle black geometric weave, polished black shoes and a silver wristwatch, black ebony walking cane with a carved heron handle); @KOSI_MENSAH (indigo utility jumpsuit with rolled sleeves, sand-coloured work boots and a narrow woven kente belt, small gold Adinkra-disc earrings); @ESI_TETTEH (brick-red wax-print dress beneath a soot-black oilskin apron, patterned headwrap and sturdy black sandals, smooth charred-wood smoking paddle); @SENA_ADJOVI (mustard oversized hoodie, blue-and-white printed ankle skirt and worn white canvas trainers, turquoise over-ear radio headphones); @KWAME_AGYEMAN (white linen shirt under a caramel lightweight field jacket, dark tailored trousers and brown loafers, antique bronze lapel pin shaped like a compass rose); @AMA_ADJOVI (deep navy kaba blouse, hand-dyed indigo wrapper with tiny white wave motifs and flat leather sandals, three-strand amber bead necklace). The principals face each other while the public owns the room around them. Mood: public reckoning. Lighting: amber lanterns, projection glow and rain-muted night. Environment = Location Registry id 'COMMUNITY_HALL': Afenyo's community hall at night: open concrete walls, a corrugated roof, rows of plastic chairs, a hand-painted blank projection sheet, standing fans, amber lantern light and rain-darkened red earth outside.",</w:t>
+        <w:t xml:space="preserve">  "prompt": "Grounded cinematic West African magical realism; contemporary Ghanaian coastal life; human-scale performances; saturated indigo, lagoon teal, clay red and warm amber palette; natural skin texture; tactile fabric and weathered wood; 16:9 landscape widescreen composition; subtle film grain; expressive realistic lighting. No written words, no logos, no watermark, no distorted hands, no duplicate people. Scene S18 — The Chair Answers. TWO-SHOT shot, eye-level. Characters in frame: @NII_LAMPTEY (tailored charcoal caftan with a subtle black geometric weave, polished black shoes and a silver wristwatch, black ebony walking cane with a carved heron handle); @KOSI_MENSAH (indigo utility jumpsuit with rolled sleeves, sand-coloured work boots and a narrow woven kente belt, small gold Adinkra-disc earrings); @ESI_TETTEH (brick-red wax-print dress beneath a soot-black oilskin apron, patterned headwrap and sturdy black sandals, smooth charred-wood smoking paddle); @SENA_ADJOVI (mustard oversized hoodie, blue-and-white printed ankle skirt and worn white canvas trainers, turquoise over-ear radio headphones); @KWAME_AGYEMAN (white linen shirt under a caramel lightweight field jacket, dark tailored trousers and brown loafers, antique bronze lapel pin shaped like a compass rose); @AMA_ADJOVI (deep navy kaba blouse, hand-dyed indigo wrapper with tiny white wave motifs and flat leather sandals, three-strand amber bead necklace). The principals face each other while the public owns the room around them. Mood: public reckoning. Lighting: amber lanterns, projection glow and rain-muted night. Environment = Location Registry id 'COMMUNITY_HALL': Afenyo's community hall at night: open concrete walls, a corrugated roof, rows of plastic chairs, a hand-painted blank projection sheet, standing fans, amber lantern light and rain-darkened red earth outside.",</w:t>
         <w:br/>
         <w:t xml:space="preserve">  "status": "⬜",</w:t>
         <w:br/>
@@ -11340,7 +11340,7 @@
         <w:br/>
         <w:t xml:space="preserve">  ],</w:t>
         <w:br/>
-        <w:t xml:space="preserve">  "prompt": "Grounded cinematic West African magical realism; contemporary Ghanaian coastal life; human-scale performances; saturated indigo, lagoon teal, clay red and warm amber palette; natural skin texture; tactile fabric and weathered wood; 2.39:1 widescreen composition; subtle film grain; expressive realistic lighting. No written words, no logos, no watermark, no distorted hands, no duplicate people. Scene S18 — The Chair Answers. OVER-SHOULDER shot, over the lead character's shoulder. Characters in frame: @KOSI_MENSAH (indigo utility jumpsuit with rolled sleeves, sand-coloured work boots and a narrow woven kente belt, small gold Adinkra-disc earrings); @NII_LAMPTEY (tailored charcoal caftan with a subtle black geometric weave, polished black shoes and a silver wristwatch, black ebony walking cane with a carved heron handle). Over Kosi's shoulder, live water readings refute the project safeguards. Mood: public reckoning. Lighting: amber lanterns, projection glow and rain-muted night. Environment = Location Registry id 'COMMUNITY_HALL': Afenyo's community hall at night: open concrete walls, a corrugated roof, rows of plastic chairs, a hand-painted blank projection sheet, standing fans, amber lantern light and rain-darkened red earth outside.",</w:t>
+        <w:t xml:space="preserve">  "prompt": "Grounded cinematic West African magical realism; contemporary Ghanaian coastal life; human-scale performances; saturated indigo, lagoon teal, clay red and warm amber palette; natural skin texture; tactile fabric and weathered wood; 16:9 landscape widescreen composition; subtle film grain; expressive realistic lighting. No written words, no logos, no watermark, no distorted hands, no duplicate people. Scene S18 — The Chair Answers. OVER-SHOULDER shot, over the lead character's shoulder. Characters in frame: @KOSI_MENSAH (indigo utility jumpsuit with rolled sleeves, sand-coloured work boots and a narrow woven kente belt, small gold Adinkra-disc earrings); @NII_LAMPTEY (tailored charcoal caftan with a subtle black geometric weave, polished black shoes and a silver wristwatch, black ebony walking cane with a carved heron handle). Over Kosi's shoulder, live water readings refute the project safeguards. Mood: public reckoning. Lighting: amber lanterns, projection glow and rain-muted night. Environment = Location Registry id 'COMMUNITY_HALL': Afenyo's community hall at night: open concrete walls, a corrugated roof, rows of plastic chairs, a hand-painted blank projection sheet, standing fans, amber lantern light and rain-darkened red earth outside.",</w:t>
         <w:br/>
         <w:t xml:space="preserve">  "status": "⬜",</w:t>
         <w:br/>
@@ -11391,7 +11391,7 @@
         <w:br/>
         <w:t xml:space="preserve">  ],</w:t>
         <w:br/>
-        <w:t xml:space="preserve">  "prompt": "Grounded cinematic West African magical realism; contemporary Ghanaian coastal life; human-scale performances; saturated indigo, lagoon teal, clay red and warm amber palette; natural skin texture; tactile fabric and weathered wood; 2.39:1 widescreen composition; subtle film grain; expressive realistic lighting. No written words, no logos, no watermark, no distorted hands, no duplicate people. Scene S18 — The Chair Answers. EXTREME CLOSE shot, intimate frontal angle. Characters in frame: @AMA_ADJOVI (deep navy kaba blouse, hand-dyed indigo wrapper with tiny white wave motifs and flat leather sandals, three-strand amber bead necklace). Ama tells Nii that people carrying the difficulty must make the decision. Mood: public reckoning. Lighting: amber lanterns, projection glow and rain-muted night. Environment = Location Registry id 'COMMUNITY_HALL': Afenyo's community hall at night: open concrete walls, a corrugated roof, rows of plastic chairs, a hand-painted blank projection sheet, standing fans, amber lantern light and rain-darkened red earth outside.",</w:t>
+        <w:t xml:space="preserve">  "prompt": "Grounded cinematic West African magical realism; contemporary Ghanaian coastal life; human-scale performances; saturated indigo, lagoon teal, clay red and warm amber palette; natural skin texture; tactile fabric and weathered wood; 16:9 landscape widescreen composition; subtle film grain; expressive realistic lighting. No written words, no logos, no watermark, no distorted hands, no duplicate people. Scene S18 — The Chair Answers. EXTREME CLOSE shot, intimate frontal angle. Characters in frame: @AMA_ADJOVI (deep navy kaba blouse, hand-dyed indigo wrapper with tiny white wave motifs and flat leather sandals, three-strand amber bead necklace). Ama tells Nii that people carrying the difficulty must make the decision. Mood: public reckoning. Lighting: amber lanterns, projection glow and rain-muted night. Environment = Location Registry id 'COMMUNITY_HALL': Afenyo's community hall at night: open concrete walls, a corrugated roof, rows of plastic chairs, a hand-painted blank projection sheet, standing fans, amber lantern light and rain-darkened red earth outside.",</w:t>
         <w:br/>
         <w:t xml:space="preserve">  "status": "⬜",</w:t>
         <w:br/>
@@ -11450,7 +11450,7 @@
         <w:br/>
         <w:t xml:space="preserve">  ],</w:t>
         <w:br/>
-        <w:t xml:space="preserve">  "prompt": "Grounded cinematic West African magical realism; contemporary Ghanaian coastal life; human-scale performances; saturated indigo, lagoon teal, clay red and warm amber palette; natural skin texture; tactile fabric and weathered wood; 2.39:1 widescreen composition; subtle film grain; expressive realistic lighting. No written words, no logos, no watermark, no distorted hands, no duplicate people. Scene S18 — The Chair Answers. WIDE shot, low observational angle. Characters in frame: @ESI_TETTEH (brick-red wax-print dress beneath a soot-black oilskin apron, patterned headwrap and sturdy black sandals, smooth charred-wood smoking paddle); @SENA_ADJOVI (mustard oversized hoodie, blue-and-white printed ankle skirt and worn white canvas trainers, turquoise over-ear radio headphones); @AMA_ADJOVI (deep navy kaba blouse, hand-dyed indigo wrapper with tiny white wave motifs and flat leather sandals, three-strand amber bead necklace). Many residents raise their voices beneath rain-muted darkness. Mood: public reckoning. Lighting: amber lanterns, projection glow and rain-muted night. Environment = Location Registry id 'COMMUNITY_HALL': Afenyo's community hall at night: open concrete walls, a corrugated roof, rows of plastic chairs, a hand-painted blank projection sheet, standing fans, amber lantern light and rain-darkened red earth outside.",</w:t>
+        <w:t xml:space="preserve">  "prompt": "Grounded cinematic West African magical realism; contemporary Ghanaian coastal life; human-scale performances; saturated indigo, lagoon teal, clay red and warm amber palette; natural skin texture; tactile fabric and weathered wood; 16:9 landscape widescreen composition; subtle film grain; expressive realistic lighting. No written words, no logos, no watermark, no distorted hands, no duplicate people. Scene S18 — The Chair Answers. WIDE shot, low observational angle. Characters in frame: @ESI_TETTEH (brick-red wax-print dress beneath a soot-black oilskin apron, patterned headwrap and sturdy black sandals, smooth charred-wood smoking paddle); @SENA_ADJOVI (mustard oversized hoodie, blue-and-white printed ankle skirt and worn white canvas trainers, turquoise over-ear radio headphones); @AMA_ADJOVI (deep navy kaba blouse, hand-dyed indigo wrapper with tiny white wave motifs and flat leather sandals, three-strand amber bead necklace). Many residents raise their voices beneath rain-muted darkness. Mood: public reckoning. Lighting: amber lanterns, projection glow and rain-muted night. Environment = Location Registry id 'COMMUNITY_HALL': Afenyo's community hall at night: open concrete walls, a corrugated roof, rows of plastic chairs, a hand-painted blank projection sheet, standing fans, amber lantern light and rain-darkened red earth outside.",</w:t>
         <w:br/>
         <w:t xml:space="preserve">  "status": "⬜",</w:t>
         <w:br/>
@@ -11501,7 +11501,7 @@
         <w:br/>
         <w:t xml:space="preserve">  ],</w:t>
         <w:br/>
-        <w:t xml:space="preserve">  "prompt": "Grounded cinematic West African magical realism; contemporary Ghanaian coastal life; human-scale performances; saturated indigo, lagoon teal, clay red and warm amber palette; natural skin texture; tactile fabric and weathered wood; 2.39:1 widescreen composition; subtle film grain; expressive realistic lighting. No written words, no logos, no watermark, no distorted hands, no duplicate people. Scene S18 — The Chair Answers. MEDIUM shot, handheld eye-level. Characters in frame: @NII_LAMPTEY (tailored charcoal caftan with a subtle black geometric weave, polished black shoes and a silver wristwatch, black ebony walking cane with a carved heron handle). Nii lowers his cane as the truth becomes impossible to re-bury. Mood: public reckoning. Lighting: amber lanterns, projection glow and rain-muted night. Environment = Location Registry id 'COMMUNITY_HALL': Afenyo's community hall at night: open concrete walls, a corrugated roof, rows of plastic chairs, a hand-painted blank projection sheet, standing fans, amber lantern light and rain-darkened red earth outside.",</w:t>
+        <w:t xml:space="preserve">  "prompt": "Grounded cinematic West African magical realism; contemporary Ghanaian coastal life; human-scale performances; saturated indigo, lagoon teal, clay red and warm amber palette; natural skin texture; tactile fabric and weathered wood; 16:9 landscape widescreen composition; subtle film grain; expressive realistic lighting. No written words, no logos, no watermark, no distorted hands, no duplicate people. Scene S18 — The Chair Answers. MEDIUM shot, handheld eye-level. Characters in frame: @NII_LAMPTEY (tailored charcoal caftan with a subtle black geometric weave, polished black shoes and a silver wristwatch, black ebony walking cane with a carved heron handle). Nii lowers his cane as the truth becomes impossible to re-bury. Mood: public reckoning. Lighting: amber lanterns, projection glow and rain-muted night. Environment = Location Registry id 'COMMUNITY_HALL': Afenyo's community hall at night: open concrete walls, a corrugated roof, rows of plastic chairs, a hand-painted blank projection sheet, standing fans, amber lantern light and rain-darkened red earth outside.",</w:t>
         <w:br/>
         <w:t xml:space="preserve">  "status": "⬜",</w:t>
         <w:br/>
@@ -11572,7 +11572,7 @@
         <w:br/>
         <w:t xml:space="preserve">  ],</w:t>
         <w:br/>
-        <w:t xml:space="preserve">  "prompt": "Grounded cinematic West African magical realism; contemporary Ghanaian coastal life; human-scale performances; saturated indigo, lagoon teal, clay red and warm amber palette; natural skin texture; tactile fabric and weathered wood; 2.39:1 widescreen composition; subtle film grain; expressive realistic lighting. No written words, no logos, no watermark, no distorted hands, no duplicate people. Scene S18 — The Chair Answers. WIDE shot, rear closing tableau. Characters in frame: @NII_LAMPTEY (tailored charcoal caftan with a subtle black geometric weave, polished black shoes and a silver wristwatch, black ebony walking cane with a carved heron handle); @KOSI_MENSAH (indigo utility jumpsuit with rolled sleeves, sand-coloured work boots and a narrow woven kente belt, small gold Adinkra-disc earrings); @ESI_TETTEH (brick-red wax-print dress beneath a soot-black oilskin apron, patterned headwrap and sturdy black sandals, smooth charred-wood smoking paddle); @SENA_ADJOVI (mustard oversized hoodie, blue-and-white printed ankle skirt and worn white canvas trainers, turquoise over-ear radio headphones); @KWAME_AGYEMAN (white linen shirt under a caramel lightweight field jacket, dark tailored trousers and brown loafers, antique bronze lapel pin shaped like a compass rose); @AMA_ADJOVI (deep navy kaba blouse, hand-dyed indigo wrapper with tiny white wave motifs and flat leather sandals, three-strand amber bead necklace). Lanterns and projection light hold every face in the reclaimed hall. Mood: public reckoning. Lighting: amber lanterns, projection glow and rain-muted night. Environment = Location Registry id 'COMMUNITY_HALL': Afenyo's community hall at night: open concrete walls, a corrugated roof, rows of plastic chairs, a hand-painted blank projection sheet, standing fans, amber lantern light and rain-darkened red earth outside.",</w:t>
+        <w:t xml:space="preserve">  "prompt": "Grounded cinematic West African magical realism; contemporary Ghanaian coastal life; human-scale performances; saturated indigo, lagoon teal, clay red and warm amber palette; natural skin texture; tactile fabric and weathered wood; 16:9 landscape widescreen composition; subtle film grain; expressive realistic lighting. No written words, no logos, no watermark, no distorted hands, no duplicate people. Scene S18 — The Chair Answers. WIDE shot, rear closing tableau. Characters in frame: @NII_LAMPTEY (tailored charcoal caftan with a subtle black geometric weave, polished black shoes and a silver wristwatch, black ebony walking cane with a carved heron handle); @KOSI_MENSAH (indigo utility jumpsuit with rolled sleeves, sand-coloured work boots and a narrow woven kente belt, small gold Adinkra-disc earrings); @ESI_TETTEH (brick-red wax-print dress beneath a soot-black oilskin apron, patterned headwrap and sturdy black sandals, smooth charred-wood smoking paddle); @SENA_ADJOVI (mustard oversized hoodie, blue-and-white printed ankle skirt and worn white canvas trainers, turquoise over-ear radio headphones); @KWAME_AGYEMAN (white linen shirt under a caramel lightweight field jacket, dark tailored trousers and brown loafers, antique bronze lapel pin shaped like a compass rose); @AMA_ADJOVI (deep navy kaba blouse, hand-dyed indigo wrapper with tiny white wave motifs and flat leather sandals, three-strand amber bead necklace). Lanterns and projection light hold every face in the reclaimed hall. Mood: public reckoning. Lighting: amber lanterns, projection glow and rain-muted night. Environment = Location Registry id 'COMMUNITY_HALL': Afenyo's community hall at night: open concrete walls, a corrugated roof, rows of plastic chairs, a hand-painted blank projection sheet, standing fans, amber lantern light and rain-darkened red earth outside.",</w:t>
         <w:br/>
         <w:t xml:space="preserve">  "status": "⬜",</w:t>
         <w:br/>
@@ -11635,7 +11635,7 @@
         <w:br/>
         <w:t xml:space="preserve">  ],</w:t>
         <w:br/>
-        <w:t xml:space="preserve">  "prompt": "Grounded cinematic West African magical realism; contemporary Ghanaian coastal life; human-scale performances; saturated indigo, lagoon teal, clay red and warm amber palette; natural skin texture; tactile fabric and weathered wood; 2.39:1 widescreen composition; subtle film grain; expressive realistic lighting. No written words, no logos, no watermark, no distorted hands, no duplicate people. Scene S19 — The Water Is Public. WIDE shot, high establishing angle. Characters in frame: @NII_LAMPTEY (tailored charcoal caftan with a subtle black geometric weave, polished black shoes and a silver wristwatch, black ebony walking cane with a carved heron handle); @KWAME_AGYEMAN (white linen shirt under a caramel lightweight field jacket, dark tailored trousers and brown loafers, antique bronze lapel pin shaped like a compass rose). Post-rain daylight fills the assembly hall before the public decision. Mood: earned clarity. Lighting: clean post-rain daylight through open louvre windows. Environment = Location Registry id 'DISTRICT_ASSEMBLY_HALL': A modest district assembly hall in Afenyo: cream concrete walls, tall louvre windows, stacked plastic chairs, a raised wood dais, ceiling fans and late-afternoon lagoon light.",</w:t>
+        <w:t xml:space="preserve">  "prompt": "Grounded cinematic West African magical realism; contemporary Ghanaian coastal life; human-scale performances; saturated indigo, lagoon teal, clay red and warm amber palette; natural skin texture; tactile fabric and weathered wood; 16:9 landscape widescreen composition; subtle film grain; expressive realistic lighting. No written words, no logos, no watermark, no distorted hands, no duplicate people. Scene S19 — The Water Is Public. WIDE shot, high establishing angle. Characters in frame: @NII_LAMPTEY (tailored charcoal caftan with a subtle black geometric weave, polished black shoes and a silver wristwatch, black ebony walking cane with a carved heron handle); @KWAME_AGYEMAN (white linen shirt under a caramel lightweight field jacket, dark tailored trousers and brown loafers, antique bronze lapel pin shaped like a compass rose). Post-rain daylight fills the assembly hall before the public decision. Mood: earned clarity. Lighting: clean post-rain daylight through open louvre windows. Environment = Location Registry id 'DISTRICT_ASSEMBLY_HALL': A modest district assembly hall in Afenyo: cream concrete walls, tall louvre windows, stacked plastic chairs, a raised wood dais, ceiling fans and late-afternoon lagoon light.",</w:t>
         <w:br/>
         <w:t xml:space="preserve">  "status": "⬜",</w:t>
         <w:br/>
@@ -11686,7 +11686,7 @@
         <w:br/>
         <w:t xml:space="preserve">  ],</w:t>
         <w:br/>
-        <w:t xml:space="preserve">  "prompt": "Grounded cinematic West African magical realism; contemporary Ghanaian coastal life; human-scale performances; saturated indigo, lagoon teal, clay red and warm amber palette; natural skin texture; tactile fabric and weathered wood; 2.39:1 widescreen composition; subtle film grain; expressive realistic lighting. No written words, no logos, no watermark, no distorted hands, no duplicate people. Scene S19 — The Water Is Public. MEDIUM shot, eye-level. Characters in frame: @SENA_ADJOVI (mustard oversized hoodie, blue-and-white printed ankle skirt and worn white canvas trainers, turquoise over-ear radio headphones). Sena records rows of residents watching the dais in silence. Mood: earned clarity. Lighting: clean post-rain daylight through open louvre windows. Environment = Location Registry id 'DISTRICT_ASSEMBLY_HALL': A modest district assembly hall in Afenyo: cream concrete walls, tall louvre windows, stacked plastic chairs, a raised wood dais, ceiling fans and late-afternoon lagoon light.",</w:t>
+        <w:t xml:space="preserve">  "prompt": "Grounded cinematic West African magical realism; contemporary Ghanaian coastal life; human-scale performances; saturated indigo, lagoon teal, clay red and warm amber palette; natural skin texture; tactile fabric and weathered wood; 16:9 landscape widescreen composition; subtle film grain; expressive realistic lighting. No written words, no logos, no watermark, no distorted hands, no duplicate people. Scene S19 — The Water Is Public. MEDIUM shot, eye-level. Characters in frame: @SENA_ADJOVI (mustard oversized hoodie, blue-and-white printed ankle skirt and worn white canvas trainers, turquoise over-ear radio headphones). Sena records rows of residents watching the dais in silence. Mood: earned clarity. Lighting: clean post-rain daylight through open louvre windows. Environment = Location Registry id 'DISTRICT_ASSEMBLY_HALL': A modest district assembly hall in Afenyo: cream concrete walls, tall louvre windows, stacked plastic chairs, a raised wood dais, ceiling fans and late-afternoon lagoon light.",</w:t>
         <w:br/>
         <w:t xml:space="preserve">  "status": "⬜",</w:t>
         <w:br/>
@@ -11737,7 +11737,7 @@
         <w:br/>
         <w:t xml:space="preserve">  ],</w:t>
         <w:br/>
-        <w:t xml:space="preserve">  "prompt": "Grounded cinematic West African magical realism; contemporary Ghanaian coastal life; human-scale performances; saturated indigo, lagoon teal, clay red and warm amber palette; natural skin texture; tactile fabric and weathered wood; 2.39:1 widescreen composition; subtle film grain; expressive realistic lighting. No written words, no logos, no watermark, no distorted hands, no duplicate people. Scene S19 — The Water Is Public. CLOSE shot, three-quarter profile. Characters in frame: @NII_LAMPTEY (tailored charcoal caftan with a subtle black geometric weave, polished black shoes and a silver wristwatch, black ebony walking cane with a carved heron handle). Nii reads the order suspending the resort permit pending inquiry. Mood: earned clarity. Lighting: clean post-rain daylight through open louvre windows. Environment = Location Registry id 'DISTRICT_ASSEMBLY_HALL': A modest district assembly hall in Afenyo: cream concrete walls, tall louvre windows, stacked plastic chairs, a raised wood dais, ceiling fans and late-afternoon lagoon light.",</w:t>
+        <w:t xml:space="preserve">  "prompt": "Grounded cinematic West African magical realism; contemporary Ghanaian coastal life; human-scale performances; saturated indigo, lagoon teal, clay red and warm amber palette; natural skin texture; tactile fabric and weathered wood; 16:9 landscape widescreen composition; subtle film grain; expressive realistic lighting. No written words, no logos, no watermark, no distorted hands, no duplicate people. Scene S19 — The Water Is Public. CLOSE shot, three-quarter profile. Characters in frame: @NII_LAMPTEY (tailored charcoal caftan with a subtle black geometric weave, polished black shoes and a silver wristwatch, black ebony walking cane with a carved heron handle). Nii reads the order suspending the resort permit pending inquiry. Mood: earned clarity. Lighting: clean post-rain daylight through open louvre windows. Environment = Location Registry id 'DISTRICT_ASSEMBLY_HALL': A modest district assembly hall in Afenyo: cream concrete walls, tall louvre windows, stacked plastic chairs, a raised wood dais, ceiling fans and late-afternoon lagoon light.",</w:t>
         <w:br/>
         <w:t xml:space="preserve">  "status": "⬜",</w:t>
         <w:br/>
@@ -11788,7 +11788,7 @@
         <w:br/>
         <w:t xml:space="preserve">  ],</w:t>
         <w:br/>
-        <w:t xml:space="preserve">  "prompt": "Grounded cinematic West African magical realism; contemporary Ghanaian coastal life; human-scale performances; saturated indigo, lagoon teal, clay red and warm amber palette; natural skin texture; tactile fabric and weathered wood; 2.39:1 widescreen composition; subtle film grain; expressive realistic lighting. No written words, no logos, no watermark, no distorted hands, no duplicate people. Scene S19 — The Water Is Public. INSERT shot, top-down detail. Characters in frame: @NII_LAMPTEY (tailored charcoal caftan with a subtle black geometric weave, polished black shoes and a silver wristwatch, black ebony walking cane with a carved heron handle). The signed suspension order rests beside Nii's silver wristwatch. Mood: earned clarity. Lighting: clean post-rain daylight through open louvre windows. Environment = Location Registry id 'DISTRICT_ASSEMBLY_HALL': A modest district assembly hall in Afenyo: cream concrete walls, tall louvre windows, stacked plastic chairs, a raised wood dais, ceiling fans and late-afternoon lagoon light.",</w:t>
+        <w:t xml:space="preserve">  "prompt": "Grounded cinematic West African magical realism; contemporary Ghanaian coastal life; human-scale performances; saturated indigo, lagoon teal, clay red and warm amber palette; natural skin texture; tactile fabric and weathered wood; 16:9 landscape widescreen composition; subtle film grain; expressive realistic lighting. No written words, no logos, no watermark, no distorted hands, no duplicate people. Scene S19 — The Water Is Public. INSERT shot, top-down detail. Characters in frame: @NII_LAMPTEY (tailored charcoal caftan with a subtle black geometric weave, polished black shoes and a silver wristwatch, black ebony walking cane with a carved heron handle). The signed suspension order rests beside Nii's silver wristwatch. Mood: earned clarity. Lighting: clean post-rain daylight through open louvre windows. Environment = Location Registry id 'DISTRICT_ASSEMBLY_HALL': A modest district assembly hall in Afenyo: cream concrete walls, tall louvre windows, stacked plastic chairs, a raised wood dais, ceiling fans and late-afternoon lagoon light.",</w:t>
         <w:br/>
         <w:t xml:space="preserve">  "status": "⬜",</w:t>
         <w:br/>
@@ -11843,7 +11843,7 @@
         <w:br/>
         <w:t xml:space="preserve">  ],</w:t>
         <w:br/>
-        <w:t xml:space="preserve">  "prompt": "Grounded cinematic West African magical realism; contemporary Ghanaian coastal life; human-scale performances; saturated indigo, lagoon teal, clay red and warm amber palette; natural skin texture; tactile fabric and weathered wood; 2.39:1 widescreen composition; subtle film grain; expressive realistic lighting. No written words, no logos, no watermark, no distorted hands, no duplicate people. Scene S19 — The Water Is Public. TWO-SHOT shot, eye-level. Characters in frame: @KWAME_AGYEMAN (white linen shirt under a caramel lightweight field jacket, dark tailored trousers and brown loafers, antique bronze lapel pin shaped like a compass rose); @KOSI_MENSAH (indigo utility jumpsuit with rolled sleeves, sand-coloured work boots and a narrow woven kente belt, small gold Adinkra-disc earrings). Kwame submits his resignation and complete project files to the assembly. Mood: earned clarity. Lighting: clean post-rain daylight through open louvre windows. Environment = Location Registry id 'DISTRICT_ASSEMBLY_HALL': A modest district assembly hall in Afenyo: cream concrete walls, tall louvre windows, stacked plastic chairs, a raised wood dais, ceiling fans and late-afternoon lagoon light.",</w:t>
+        <w:t xml:space="preserve">  "prompt": "Grounded cinematic West African magical realism; contemporary Ghanaian coastal life; human-scale performances; saturated indigo, lagoon teal, clay red and warm amber palette; natural skin texture; tactile fabric and weathered wood; 16:9 landscape widescreen composition; subtle film grain; expressive realistic lighting. No written words, no logos, no watermark, no distorted hands, no duplicate people. Scene S19 — The Water Is Public. TWO-SHOT shot, eye-level. Characters in frame: @KWAME_AGYEMAN (white linen shirt under a caramel lightweight field jacket, dark tailored trousers and brown loafers, antique bronze lapel pin shaped like a compass rose); @KOSI_MENSAH (indigo utility jumpsuit with rolled sleeves, sand-coloured work boots and a narrow woven kente belt, small gold Adinkra-disc earrings). Kwame submits his resignation and complete project files to the assembly. Mood: earned clarity. Lighting: clean post-rain daylight through open louvre windows. Environment = Location Registry id 'DISTRICT_ASSEMBLY_HALL': A modest district assembly hall in Afenyo: cream concrete walls, tall louvre windows, stacked plastic chairs, a raised wood dais, ceiling fans and late-afternoon lagoon light.",</w:t>
         <w:br/>
         <w:t xml:space="preserve">  "status": "⬜",</w:t>
         <w:br/>
@@ -11898,7 +11898,7 @@
         <w:br/>
         <w:t xml:space="preserve">  ],</w:t>
         <w:br/>
-        <w:t xml:space="preserve">  "prompt": "Grounded cinematic West African magical realism; contemporary Ghanaian coastal life; human-scale performances; saturated indigo, lagoon teal, clay red and warm amber palette; natural skin texture; tactile fabric and weathered wood; 2.39:1 widescreen composition; subtle film grain; expressive realistic lighting. No written words, no logos, no watermark, no distorted hands, no duplicate people. Scene S19 — The Water Is Public. OVER-SHOULDER shot, over the lead character's shoulder. Characters in frame: @ESI_TETTEH (brick-red wax-print dress beneath a soot-black oilskin apron, patterned headwrap and sturdy black sandals, smooth charred-wood smoking paddle); @NII_LAMPTEY (tailored charcoal caftan with a subtle black geometric weave, polished black shoes and a silver wristwatch, black ebony walking cane with a carved heron handle). Over Esi's shoulder, she insists that victory include a cooperative water board. Mood: earned clarity. Lighting: clean post-rain daylight through open louvre windows. Environment = Location Registry id 'DISTRICT_ASSEMBLY_HALL': A modest district assembly hall in Afenyo: cream concrete walls, tall louvre windows, stacked plastic chairs, a raised wood dais, ceiling fans and late-afternoon lagoon light.",</w:t>
+        <w:t xml:space="preserve">  "prompt": "Grounded cinematic West African magical realism; contemporary Ghanaian coastal life; human-scale performances; saturated indigo, lagoon teal, clay red and warm amber palette; natural skin texture; tactile fabric and weathered wood; 16:9 landscape widescreen composition; subtle film grain; expressive realistic lighting. No written words, no logos, no watermark, no distorted hands, no duplicate people. Scene S19 — The Water Is Public. OVER-SHOULDER shot, over the lead character's shoulder. Characters in frame: @ESI_TETTEH (brick-red wax-print dress beneath a soot-black oilskin apron, patterned headwrap and sturdy black sandals, smooth charred-wood smoking paddle); @NII_LAMPTEY (tailored charcoal caftan with a subtle black geometric weave, polished black shoes and a silver wristwatch, black ebony walking cane with a carved heron handle). Over Esi's shoulder, she insists that victory include a cooperative water board. Mood: earned clarity. Lighting: clean post-rain daylight through open louvre windows. Environment = Location Registry id 'DISTRICT_ASSEMBLY_HALL': A modest district assembly hall in Afenyo: cream concrete walls, tall louvre windows, stacked plastic chairs, a raised wood dais, ceiling fans and late-afternoon lagoon light.",</w:t>
         <w:br/>
         <w:t xml:space="preserve">  "status": "⬜",</w:t>
         <w:br/>
@@ -11949,7 +11949,7 @@
         <w:br/>
         <w:t xml:space="preserve">  ],</w:t>
         <w:br/>
-        <w:t xml:space="preserve">  "prompt": "Grounded cinematic West African magical realism; contemporary Ghanaian coastal life; human-scale performances; saturated indigo, lagoon teal, clay red and warm amber palette; natural skin texture; tactile fabric and weathered wood; 2.39:1 widescreen composition; subtle film grain; expressive realistic lighting. No written words, no logos, no watermark, no distorted hands, no duplicate people. Scene S19 — The Water Is Public. EXTREME CLOSE shot, intimate frontal angle. Characters in frame: @KOSI_MENSAH (indigo utility jumpsuit with rolled sleeves, sand-coloured work boots and a narrow woven kente belt, small gold Adinkra-disc earrings). Kosi says a pause is only a door if the town decides what walks through it. Mood: earned clarity. Lighting: clean post-rain daylight through open louvre windows. Environment = Location Registry id 'DISTRICT_ASSEMBLY_HALL': A modest district assembly hall in Afenyo: cream concrete walls, tall louvre windows, stacked plastic chairs, a raised wood dais, ceiling fans and late-afternoon lagoon light.",</w:t>
+        <w:t xml:space="preserve">  "prompt": "Grounded cinematic West African magical realism; contemporary Ghanaian coastal life; human-scale performances; saturated indigo, lagoon teal, clay red and warm amber palette; natural skin texture; tactile fabric and weathered wood; 16:9 landscape widescreen composition; subtle film grain; expressive realistic lighting. No written words, no logos, no watermark, no distorted hands, no duplicate people. Scene S19 — The Water Is Public. EXTREME CLOSE shot, intimate frontal angle. Characters in frame: @KOSI_MENSAH (indigo utility jumpsuit with rolled sleeves, sand-coloured work boots and a narrow woven kente belt, small gold Adinkra-disc earrings). Kosi says a pause is only a door if the town decides what walks through it. Mood: earned clarity. Lighting: clean post-rain daylight through open louvre windows. Environment = Location Registry id 'DISTRICT_ASSEMBLY_HALL': A modest district assembly hall in Afenyo: cream concrete walls, tall louvre windows, stacked plastic chairs, a raised wood dais, ceiling fans and late-afternoon lagoon light.",</w:t>
         <w:br/>
         <w:t xml:space="preserve">  "status": "⬜",</w:t>
         <w:br/>
@@ -12016,7 +12016,7 @@
         <w:br/>
         <w:t xml:space="preserve">  ],</w:t>
         <w:br/>
-        <w:t xml:space="preserve">  "prompt": "Grounded cinematic West African magical realism; contemporary Ghanaian coastal life; human-scale performances; saturated indigo, lagoon teal, clay red and warm amber palette; natural skin texture; tactile fabric and weathered wood; 2.39:1 widescreen composition; subtle film grain; expressive realistic lighting. No written words, no logos, no watermark, no distorted hands, no duplicate people. Scene S19 — The Water Is Public. WIDE shot, low observational angle. Characters in frame: @KOSI_MENSAH (indigo utility jumpsuit with rolled sleeves, sand-coloured work boots and a narrow woven kente belt, small gold Adinkra-disc earrings); @ESI_TETTEH (brick-red wax-print dress beneath a soot-black oilskin apron, patterned headwrap and sturdy black sandals, smooth charred-wood smoking paddle); @SENA_ADJOVI (mustard oversized hoodie, blue-and-white printed ankle skirt and worn white canvas trainers, turquoise over-ear radio headphones); @KWAME_AGYEMAN (white linen shirt under a caramel lightweight field jacket, dark tailored trousers and brown loafers, antique bronze lapel pin shaped like a compass rose); @NII_LAMPTEY (tailored charcoal caftan with a subtle black geometric weave, polished black shoes and a silver wristwatch, black ebony walking cane with a carved heron handle). Hands rise around the hall in support of the community water board. Mood: earned clarity. Lighting: clean post-rain daylight through open louvre windows. Environment = Location Registry id 'DISTRICT_ASSEMBLY_HALL': A modest district assembly hall in Afenyo: cream concrete walls, tall louvre windows, stacked plastic chairs, a raised wood dais, ceiling fans and late-afternoon lagoon light.",</w:t>
+        <w:t xml:space="preserve">  "prompt": "Grounded cinematic West African magical realism; contemporary Ghanaian coastal life; human-scale performances; saturated indigo, lagoon teal, clay red and warm amber palette; natural skin texture; tactile fabric and weathered wood; 16:9 landscape widescreen composition; subtle film grain; expressive realistic lighting. No written words, no logos, no watermark, no distorted hands, no duplicate people. Scene S19 — The Water Is Public. WIDE shot, low observational angle. Characters in frame: @KOSI_MENSAH (indigo utility jumpsuit with rolled sleeves, sand-coloured work boots and a narrow woven kente belt, small gold Adinkra-disc earrings); @ESI_TETTEH (brick-red wax-print dress beneath a soot-black oilskin apron, patterned headwrap and sturdy black sandals, smooth charred-wood smoking paddle); @SENA_ADJOVI (mustard oversized hoodie, blue-and-white printed ankle skirt and worn white canvas trainers, turquoise over-ear radio headphones); @KWAME_AGYEMAN (white linen shirt under a caramel lightweight field jacket, dark tailored trousers and brown loafers, antique bronze lapel pin shaped like a compass rose); @NII_LAMPTEY (tailored charcoal caftan with a subtle black geometric weave, polished black shoes and a silver wristwatch, black ebony walking cane with a carved heron handle). Hands rise around the hall in support of the community water board. Mood: earned clarity. Lighting: clean post-rain daylight through open louvre windows. Environment = Location Registry id 'DISTRICT_ASSEMBLY_HALL': A modest district assembly hall in Afenyo: cream concrete walls, tall louvre windows, stacked plastic chairs, a raised wood dais, ceiling fans and late-afternoon lagoon light.",</w:t>
         <w:br/>
         <w:t xml:space="preserve">  "status": "⬜",</w:t>
         <w:br/>
@@ -12067,7 +12067,7 @@
         <w:br/>
         <w:t xml:space="preserve">  ],</w:t>
         <w:br/>
-        <w:t xml:space="preserve">  "prompt": "Grounded cinematic West African magical realism; contemporary Ghanaian coastal life; human-scale performances; saturated indigo, lagoon teal, clay red and warm amber palette; natural skin texture; tactile fabric and weathered wood; 2.39:1 widescreen composition; subtle film grain; expressive realistic lighting. No written words, no logos, no watermark, no distorted hands, no duplicate people. Scene S19 — The Water Is Public. MEDIUM shot, handheld eye-level. Characters in frame: @SENA_ADJOVI (mustard oversized hoodie, blue-and-white printed ankle skirt and worn white canvas trainers, turquoise over-ear radio headphones). Sena captures the sound of the vote with a bright, astonished smile. Mood: earned clarity. Lighting: clean post-rain daylight through open louvre windows. Environment = Location Registry id 'DISTRICT_ASSEMBLY_HALL': A modest district assembly hall in Afenyo: cream concrete walls, tall louvre windows, stacked plastic chairs, a raised wood dais, ceiling fans and late-afternoon lagoon light.",</w:t>
+        <w:t xml:space="preserve">  "prompt": "Grounded cinematic West African magical realism; contemporary Ghanaian coastal life; human-scale performances; saturated indigo, lagoon teal, clay red and warm amber palette; natural skin texture; tactile fabric and weathered wood; 16:9 landscape widescreen composition; subtle film grain; expressive realistic lighting. No written words, no logos, no watermark, no distorted hands, no duplicate people. Scene S19 — The Water Is Public. MEDIUM shot, handheld eye-level. Characters in frame: @SENA_ADJOVI (mustard oversized hoodie, blue-and-white printed ankle skirt and worn white canvas trainers, turquoise over-ear radio headphones). Sena captures the sound of the vote with a bright, astonished smile. Mood: earned clarity. Lighting: clean post-rain daylight through open louvre windows. Environment = Location Registry id 'DISTRICT_ASSEMBLY_HALL': A modest district assembly hall in Afenyo: cream concrete walls, tall louvre windows, stacked plastic chairs, a raised wood dais, ceiling fans and late-afternoon lagoon light.",</w:t>
         <w:br/>
         <w:t xml:space="preserve">  "status": "⬜",</w:t>
         <w:br/>
@@ -12130,7 +12130,7 @@
         <w:br/>
         <w:t xml:space="preserve">  ],</w:t>
         <w:br/>
-        <w:t xml:space="preserve">  "prompt": "Grounded cinematic West African magical realism; contemporary Ghanaian coastal life; human-scale performances; saturated indigo, lagoon teal, clay red and warm amber palette; natural skin texture; tactile fabric and weathered wood; 2.39:1 widescreen composition; subtle film grain; expressive realistic lighting. No written words, no logos, no watermark, no distorted hands, no duplicate people. Scene S19 — The Water Is Public. WIDE shot, rear closing tableau. Characters in frame: @KOSI_MENSAH (indigo utility jumpsuit with rolled sleeves, sand-coloured work boots and a narrow woven kente belt, small gold Adinkra-disc earrings); @ESI_TETTEH (brick-red wax-print dress beneath a soot-black oilskin apron, patterned headwrap and sturdy black sandals, smooth charred-wood smoking paddle); @SENA_ADJOVI (mustard oversized hoodie, blue-and-white printed ankle skirt and worn white canvas trainers, turquoise over-ear radio headphones); @KWAME_AGYEMAN (white linen shirt under a caramel lightweight field jacket, dark tailored trousers and brown loafers, antique bronze lapel pin shaped like a compass rose). The allies leave through open louvre-lit doors into clean post-rain morning. Mood: earned clarity. Lighting: clean post-rain daylight through open louvre windows. Environment = Location Registry id 'DISTRICT_ASSEMBLY_HALL': A modest district assembly hall in Afenyo: cream concrete walls, tall louvre windows, stacked plastic chairs, a raised wood dais, ceiling fans and late-afternoon lagoon light.",</w:t>
+        <w:t xml:space="preserve">  "prompt": "Grounded cinematic West African magical realism; contemporary Ghanaian coastal life; human-scale performances; saturated indigo, lagoon teal, clay red and warm amber palette; natural skin texture; tactile fabric and weathered wood; 16:9 landscape widescreen composition; subtle film grain; expressive realistic lighting. No written words, no logos, no watermark, no distorted hands, no duplicate people. Scene S19 — The Water Is Public. WIDE shot, rear closing tableau. Characters in frame: @KOSI_MENSAH (indigo utility jumpsuit with rolled sleeves, sand-coloured work boots and a narrow woven kente belt, small gold Adinkra-disc earrings); @ESI_TETTEH (brick-red wax-print dress beneath a soot-black oilskin apron, patterned headwrap and sturdy black sandals, smooth charred-wood smoking paddle); @SENA_ADJOVI (mustard oversized hoodie, blue-and-white printed ankle skirt and worn white canvas trainers, turquoise over-ear radio headphones); @KWAME_AGYEMAN (white linen shirt under a caramel lightweight field jacket, dark tailored trousers and brown loafers, antique bronze lapel pin shaped like a compass rose). The allies leave through open louvre-lit doors into clean post-rain morning. Mood: earned clarity. Lighting: clean post-rain daylight through open louvre windows. Environment = Location Registry id 'DISTRICT_ASSEMBLY_HALL': A modest district assembly hall in Afenyo: cream concrete walls, tall louvre windows, stacked plastic chairs, a raised wood dais, ceiling fans and late-afternoon lagoon light.",</w:t>
         <w:br/>
         <w:t xml:space="preserve">  "status": "⬜",</w:t>
         <w:br/>
@@ -12209,7 +12209,7 @@
         <w:br/>
         <w:t xml:space="preserve">  ],</w:t>
         <w:br/>
-        <w:t xml:space="preserve">  "prompt": "Grounded cinematic West African magical realism; contemporary Ghanaian coastal life; human-scale performances; saturated indigo, lagoon teal, clay red and warm amber palette; natural skin texture; tactile fabric and weathered wood; 2.39:1 widescreen composition; subtle film grain; expressive realistic lighting. No written words, no logos, no watermark, no distorted hands, no duplicate people. Scene S20 — First Light, Shared. WIDE shot, high establishing angle. Characters in frame: @KOSI_MENSAH (indigo utility jumpsuit with rolled sleeves, sand-coloured work boots and a narrow woven kente belt, small gold Adinkra-disc earrings); @KOJO_DANSO (faded forest-green canvas jacket over a blue-and-cream striped shirt, charcoal trousers and rubber deck boots, weathered brass compass on a cord); @AMA_ADJOVI (deep navy kaba blouse, hand-dyed indigo wrapper with tiny white wave motifs and flat leather sandals, three-strand amber bead necklace); @SENA_ADJOVI (mustard oversized hoodie, blue-and-white printed ankle skirt and worn white canvas trainers, turquoise over-ear radio headphones); @ESI_TETTEH (brick-red wax-print dress beneath a soot-black oilskin apron, patterned headwrap and sturdy black sandals, smooth charred-wood smoking paddle); @KWAME_AGYEMAN (white linen shirt under a caramel lightweight field jacket, dark tailored trousers and brown loafers, antique bronze lapel pin shaped like a compass rose). Sunrise opens across the fishing pier, repaired nets and calm gold-and-teal water. Mood: hopeful, lived-in renewal. Lighting: soft gold sunrise over calm teal water. Environment = Location Registry id 'SUNRISE_PIER': Afenyo's wooden fishing pier at sunrise: worn planks, moored painted canoes, repaired fishing nets, calm gold-and-teal lagoon water, distant mangroves and a low orange sun.",</w:t>
+        <w:t xml:space="preserve">  "prompt": "Grounded cinematic West African magical realism; contemporary Ghanaian coastal life; human-scale performances; saturated indigo, lagoon teal, clay red and warm amber palette; natural skin texture; tactile fabric and weathered wood; 16:9 landscape widescreen composition; subtle film grain; expressive realistic lighting. No written words, no logos, no watermark, no distorted hands, no duplicate people. Scene S20 — First Light, Shared. WIDE shot, high establishing angle. Characters in frame: @KOSI_MENSAH (indigo utility jumpsuit with rolled sleeves, sand-coloured work boots and a narrow woven kente belt, small gold Adinkra-disc earrings); @KOJO_DANSO (faded forest-green canvas jacket over a blue-and-cream striped shirt, charcoal trousers and rubber deck boots, weathered brass compass on a cord); @AMA_ADJOVI (deep navy kaba blouse, hand-dyed indigo wrapper with tiny white wave motifs and flat leather sandals, three-strand amber bead necklace); @SENA_ADJOVI (mustard oversized hoodie, blue-and-white printed ankle skirt and worn white canvas trainers, turquoise over-ear radio headphones); @ESI_TETTEH (brick-red wax-print dress beneath a soot-black oilskin apron, patterned headwrap and sturdy black sandals, smooth charred-wood smoking paddle); @KWAME_AGYEMAN (white linen shirt under a caramel lightweight field jacket, dark tailored trousers and brown loafers, antique bronze lapel pin shaped like a compass rose). Sunrise opens across the fishing pier, repaired nets and calm gold-and-teal water. Mood: hopeful, lived-in renewal. Lighting: soft gold sunrise over calm teal water. Environment = Location Registry id 'SUNRISE_PIER': Afenyo's wooden fishing pier at sunrise: worn planks, moored painted canoes, repaired fishing nets, calm gold-and-teal lagoon water, distant mangroves and a low orange sun.",</w:t>
         <w:br/>
         <w:t xml:space="preserve">  "status": "⬜",</w:t>
         <w:br/>
@@ -12260,7 +12260,7 @@
         <w:br/>
         <w:t xml:space="preserve">  ],</w:t>
         <w:br/>
-        <w:t xml:space="preserve">  "prompt": "Grounded cinematic West African magical realism; contemporary Ghanaian coastal life; human-scale performances; saturated indigo, lagoon teal, clay red and warm amber palette; natural skin texture; tactile fabric and weathered wood; 2.39:1 widescreen composition; subtle film grain; expressive realistic lighting. No written words, no logos, no watermark, no distorted hands, no duplicate people. Scene S20 — First Light, Shared. MEDIUM shot, eye-level. Characters in frame: @KOSI_MENSAH (indigo utility jumpsuit with rolled sleeves, sand-coloured work boots and a narrow woven kente belt, small gold Adinkra-disc earrings). Kosi secures the community-owned solar battery at the pier. Mood: hopeful, lived-in renewal. Lighting: soft gold sunrise over calm teal water. Environment = Location Registry id 'SUNRISE_PIER': Afenyo's wooden fishing pier at sunrise: worn planks, moored painted canoes, repaired fishing nets, calm gold-and-teal lagoon water, distant mangroves and a low orange sun.",</w:t>
+        <w:t xml:space="preserve">  "prompt": "Grounded cinematic West African magical realism; contemporary Ghanaian coastal life; human-scale performances; saturated indigo, lagoon teal, clay red and warm amber palette; natural skin texture; tactile fabric and weathered wood; 16:9 landscape widescreen composition; subtle film grain; expressive realistic lighting. No written words, no logos, no watermark, no distorted hands, no duplicate people. Scene S20 — First Light, Shared. MEDIUM shot, eye-level. Characters in frame: @KOSI_MENSAH (indigo utility jumpsuit with rolled sleeves, sand-coloured work boots and a narrow woven kente belt, small gold Adinkra-disc earrings). Kosi secures the community-owned solar battery at the pier. Mood: hopeful, lived-in renewal. Lighting: soft gold sunrise over calm teal water. Environment = Location Registry id 'SUNRISE_PIER': Afenyo's wooden fishing pier at sunrise: worn planks, moored painted canoes, repaired fishing nets, calm gold-and-teal lagoon water, distant mangroves and a low orange sun.",</w:t>
         <w:br/>
         <w:t xml:space="preserve">  "status": "⬜",</w:t>
         <w:br/>
@@ -12311,7 +12311,7 @@
         <w:br/>
         <w:t xml:space="preserve">  ],</w:t>
         <w:br/>
-        <w:t xml:space="preserve">  "prompt": "Grounded cinematic West African magical realism; contemporary Ghanaian coastal life; human-scale performances; saturated indigo, lagoon teal, clay red and warm amber palette; natural skin texture; tactile fabric and weathered wood; 2.39:1 widescreen composition; subtle film grain; expressive realistic lighting. No written words, no logos, no watermark, no distorted hands, no duplicate people. Scene S20 — First Light, Shared. CLOSE shot, three-quarter profile. Characters in frame: @KOJO_DANSO (faded forest-green canvas jacket over a blue-and-cream striped shirt, charcoal trousers and rubber deck boots, weathered brass compass on a cord). Kojo lifts repaired fishing nets beneath the distant beacon pulse. Mood: hopeful, lived-in renewal. Lighting: soft gold sunrise over calm teal water. Environment = Location Registry id 'SUNRISE_PIER': Afenyo's wooden fishing pier at sunrise: worn planks, moored painted canoes, repaired fishing nets, calm gold-and-teal lagoon water, distant mangroves and a low orange sun.",</w:t>
+        <w:t xml:space="preserve">  "prompt": "Grounded cinematic West African magical realism; contemporary Ghanaian coastal life; human-scale performances; saturated indigo, lagoon teal, clay red and warm amber palette; natural skin texture; tactile fabric and weathered wood; 16:9 landscape widescreen composition; subtle film grain; expressive realistic lighting. No written words, no logos, no watermark, no distorted hands, no duplicate people. Scene S20 — First Light, Shared. CLOSE shot, three-quarter profile. Characters in frame: @KOJO_DANSO (faded forest-green canvas jacket over a blue-and-cream striped shirt, charcoal trousers and rubber deck boots, weathered brass compass on a cord). Kojo lifts repaired fishing nets beneath the distant beacon pulse. Mood: hopeful, lived-in renewal. Lighting: soft gold sunrise over calm teal water. Environment = Location Registry id 'SUNRISE_PIER': Afenyo's wooden fishing pier at sunrise: worn planks, moored painted canoes, repaired fishing nets, calm gold-and-teal lagoon water, distant mangroves and a low orange sun.",</w:t>
         <w:br/>
         <w:t xml:space="preserve">  "status": "⬜",</w:t>
         <w:br/>
@@ -12362,7 +12362,7 @@
         <w:br/>
         <w:t xml:space="preserve">  ],</w:t>
         <w:br/>
-        <w:t xml:space="preserve">  "prompt": "Grounded cinematic West African magical realism; contemporary Ghanaian coastal life; human-scale performances; saturated indigo, lagoon teal, clay red and warm amber palette; natural skin texture; tactile fabric and weathered wood; 2.39:1 widescreen composition; subtle film grain; expressive realistic lighting. No written words, no logos, no watermark, no distorted hands, no duplicate people. Scene S20 — First Light, Shared. INSERT shot, top-down detail. Characters in frame: @KOSI_MENSAH (indigo utility jumpsuit with rolled sleeves, sand-coloured work boots and a narrow woven kente belt, small gold Adinkra-disc earrings). The blue beacon flashes across calm water beyond painted canoes. Mood: hopeful, lived-in renewal. Lighting: soft gold sunrise over calm teal water. Environment = Location Registry id 'SUNRISE_PIER': Afenyo's wooden fishing pier at sunrise: worn planks, moored painted canoes, repaired fishing nets, calm gold-and-teal lagoon water, distant mangroves and a low orange sun.",</w:t>
+        <w:t xml:space="preserve">  "prompt": "Grounded cinematic West African magical realism; contemporary Ghanaian coastal life; human-scale performances; saturated indigo, lagoon teal, clay red and warm amber palette; natural skin texture; tactile fabric and weathered wood; 16:9 landscape widescreen composition; subtle film grain; expressive realistic lighting. No written words, no logos, no watermark, no distorted hands, no duplicate people. Scene S20 — First Light, Shared. INSERT shot, top-down detail. Characters in frame: @KOSI_MENSAH (indigo utility jumpsuit with rolled sleeves, sand-coloured work boots and a narrow woven kente belt, small gold Adinkra-disc earrings). The blue beacon flashes across calm water beyond painted canoes. Mood: hopeful, lived-in renewal. Lighting: soft gold sunrise over calm teal water. Environment = Location Registry id 'SUNRISE_PIER': Afenyo's wooden fishing pier at sunrise: worn planks, moored painted canoes, repaired fishing nets, calm gold-and-teal lagoon water, distant mangroves and a low orange sun.",</w:t>
         <w:br/>
         <w:t xml:space="preserve">  "status": "⬜",</w:t>
         <w:br/>
@@ -12417,7 +12417,7 @@
         <w:br/>
         <w:t xml:space="preserve">  ],</w:t>
         <w:br/>
-        <w:t xml:space="preserve">  "prompt": "Grounded cinematic West African magical realism; contemporary Ghanaian coastal life; human-scale performances; saturated indigo, lagoon teal, clay red and warm amber palette; natural skin texture; tactile fabric and weathered wood; 2.39:1 widescreen composition; subtle film grain; expressive realistic lighting. No written words, no logos, no watermark, no distorted hands, no duplicate people. Scene S20 — First Light, Shared. TWO-SHOT shot, eye-level. Characters in frame: @AMA_ADJOVI (deep navy kaba blouse, hand-dyed indigo wrapper with tiny white wave motifs and flat leather sandals, three-strand amber bead necklace); @SENA_ADJOVI (mustard oversized hoodie, blue-and-white printed ankle skirt and worn white canvas trainers, turquoise over-ear radio headphones). Ama watches Sena prepare the first episode of her new radio programme. Mood: hopeful, lived-in renewal. Lighting: soft gold sunrise over calm teal water. Environment = Location Registry id 'SUNRISE_PIER': Afenyo's wooden fishing pier at sunrise: worn planks, moored painted canoes, repaired fishing nets, calm gold-and-teal lagoon water, distant mangroves and a low orange sun.",</w:t>
+        <w:t xml:space="preserve">  "prompt": "Grounded cinematic West African magical realism; contemporary Ghanaian coastal life; human-scale performances; saturated indigo, lagoon teal, clay red and warm amber palette; natural skin texture; tactile fabric and weathered wood; 16:9 landscape widescreen composition; subtle film grain; expressive realistic lighting. No written words, no logos, no watermark, no distorted hands, no duplicate people. Scene S20 — First Light, Shared. TWO-SHOT shot, eye-level. Characters in frame: @AMA_ADJOVI (deep navy kaba blouse, hand-dyed indigo wrapper with tiny white wave motifs and flat leather sandals, three-strand amber bead necklace); @SENA_ADJOVI (mustard oversized hoodie, blue-and-white printed ankle skirt and worn white canvas trainers, turquoise over-ear radio headphones). Ama watches Sena prepare the first episode of her new radio programme. Mood: hopeful, lived-in renewal. Lighting: soft gold sunrise over calm teal water. Environment = Location Registry id 'SUNRISE_PIER': Afenyo's wooden fishing pier at sunrise: worn planks, moored painted canoes, repaired fishing nets, calm gold-and-teal lagoon water, distant mangroves and a low orange sun.",</w:t>
         <w:br/>
         <w:t xml:space="preserve">  "status": "⬜",</w:t>
         <w:br/>
@@ -12468,7 +12468,7 @@
         <w:br/>
         <w:t xml:space="preserve">  ],</w:t>
         <w:br/>
-        <w:t xml:space="preserve">  "prompt": "Grounded cinematic West African magical realism; contemporary Ghanaian coastal life; human-scale performances; saturated indigo, lagoon teal, clay red and warm amber palette; natural skin texture; tactile fabric and weathered wood; 2.39:1 widescreen composition; subtle film grain; expressive realistic lighting. No written words, no logos, no watermark, no distorted hands, no duplicate people. Scene S20 — First Light, Shared. OVER-SHOULDER shot, over the lead character's shoulder. Characters in frame: @SENA_ADJOVI (mustard oversized hoodie, blue-and-white printed ankle skirt and worn white canvas trainers, turquoise over-ear radio headphones). Over Sena's shoulder, she broadcasts that the light and water are public. Mood: hopeful, lived-in renewal. Lighting: soft gold sunrise over calm teal water. Environment = Location Registry id 'SUNRISE_PIER': Afenyo's wooden fishing pier at sunrise: worn planks, moored painted canoes, repaired fishing nets, calm gold-and-teal lagoon water, distant mangroves and a low orange sun.",</w:t>
+        <w:t xml:space="preserve">  "prompt": "Grounded cinematic West African magical realism; contemporary Ghanaian coastal life; human-scale performances; saturated indigo, lagoon teal, clay red and warm amber palette; natural skin texture; tactile fabric and weathered wood; 16:9 landscape widescreen composition; subtle film grain; expressive realistic lighting. No written words, no logos, no watermark, no distorted hands, no duplicate people. Scene S20 — First Light, Shared. OVER-SHOULDER shot, over the lead character's shoulder. Characters in frame: @SENA_ADJOVI (mustard oversized hoodie, blue-and-white printed ankle skirt and worn white canvas trainers, turquoise over-ear radio headphones). Over Sena's shoulder, she broadcasts that the light and water are public. Mood: hopeful, lived-in renewal. Lighting: soft gold sunrise over calm teal water. Environment = Location Registry id 'SUNRISE_PIER': Afenyo's wooden fishing pier at sunrise: worn planks, moored painted canoes, repaired fishing nets, calm gold-and-teal lagoon water, distant mangroves and a low orange sun.",</w:t>
         <w:br/>
         <w:t xml:space="preserve">  "status": "⬜",</w:t>
         <w:br/>
@@ -12519,7 +12519,7 @@
         <w:br/>
         <w:t xml:space="preserve">  ],</w:t>
         <w:br/>
-        <w:t xml:space="preserve">  "prompt": "Grounded cinematic West African magical realism; contemporary Ghanaian coastal life; human-scale performances; saturated indigo, lagoon teal, clay red and warm amber palette; natural skin texture; tactile fabric and weathered wood; 2.39:1 widescreen composition; subtle film grain; expressive realistic lighting. No written words, no logos, no watermark, no distorted hands, no duplicate people. Scene S20 — First Light, Shared. EXTREME CLOSE shot, intimate frontal angle. Characters in frame: @AMA_ADJOVI (deep navy kaba blouse, hand-dyed indigo wrapper with tiny white wave motifs and flat leather sandals, three-strand amber bead necklace). Ama's knowing smile softens as she nods to Kosi. Mood: hopeful, lived-in renewal. Lighting: soft gold sunrise over calm teal water. Environment = Location Registry id 'SUNRISE_PIER': Afenyo's wooden fishing pier at sunrise: worn planks, moored painted canoes, repaired fishing nets, calm gold-and-teal lagoon water, distant mangroves and a low orange sun.",</w:t>
+        <w:t xml:space="preserve">  "prompt": "Grounded cinematic West African magical realism; contemporary Ghanaian coastal life; human-scale performances; saturated indigo, lagoon teal, clay red and warm amber palette; natural skin texture; tactile fabric and weathered wood; 16:9 landscape widescreen composition; subtle film grain; expressive realistic lighting. No written words, no logos, no watermark, no distorted hands, no duplicate people. Scene S20 — First Light, Shared. EXTREME CLOSE shot, intimate frontal angle. Characters in frame: @AMA_ADJOVI (deep navy kaba blouse, hand-dyed indigo wrapper with tiny white wave motifs and flat leather sandals, three-strand amber bead necklace). Ama's knowing smile softens as she nods to Kosi. Mood: hopeful, lived-in renewal. Lighting: soft gold sunrise over calm teal water. Environment = Location Registry id 'SUNRISE_PIER': Afenyo's wooden fishing pier at sunrise: worn planks, moored painted canoes, repaired fishing nets, calm gold-and-teal lagoon water, distant mangroves and a low orange sun.",</w:t>
         <w:br/>
         <w:t xml:space="preserve">  "status": "⬜",</w:t>
         <w:br/>
@@ -12574,7 +12574,7 @@
         <w:br/>
         <w:t xml:space="preserve">  ],</w:t>
         <w:br/>
-        <w:t xml:space="preserve">  "prompt": "Grounded cinematic West African magical realism; contemporary Ghanaian coastal life; human-scale performances; saturated indigo, lagoon teal, clay red and warm amber palette; natural skin texture; tactile fabric and weathered wood; 2.39:1 widescreen composition; subtle film grain; expressive realistic lighting. No written words, no logos, no watermark, no distorted hands, no duplicate people. Scene S20 — First Light, Shared. WIDE shot, low observational angle. Characters in frame: @KWAME_AGYEMAN (white linen shirt under a caramel lightweight field jacket, dark tailored trousers and brown loafers, antique bronze lapel pin shaped like a compass rose); @ESI_TETTEH (brick-red wax-print dress beneath a soot-black oilskin apron, patterned headwrap and sturdy black sandals, smooth charred-wood smoking paddle). Kwame in work gloves joins Esi's line carrying fishing nets, no longer standing apart. Mood: hopeful, lived-in renewal. Lighting: soft gold sunrise over calm teal water. Environment = Location Registry id 'SUNRISE_PIER': Afenyo's wooden fishing pier at sunrise: worn planks, moored painted canoes, repaired fishing nets, calm gold-and-teal lagoon water, distant mangroves and a low orange sun.",</w:t>
+        <w:t xml:space="preserve">  "prompt": "Grounded cinematic West African magical realism; contemporary Ghanaian coastal life; human-scale performances; saturated indigo, lagoon teal, clay red and warm amber palette; natural skin texture; tactile fabric and weathered wood; 16:9 landscape widescreen composition; subtle film grain; expressive realistic lighting. No written words, no logos, no watermark, no distorted hands, no duplicate people. Scene S20 — First Light, Shared. WIDE shot, low observational angle. Characters in frame: @KWAME_AGYEMAN (white linen shirt under a caramel lightweight field jacket, dark tailored trousers and brown loafers, antique bronze lapel pin shaped like a compass rose); @ESI_TETTEH (brick-red wax-print dress beneath a soot-black oilskin apron, patterned headwrap and sturdy black sandals, smooth charred-wood smoking paddle). Kwame in work gloves joins Esi's line carrying fishing nets, no longer standing apart. Mood: hopeful, lived-in renewal. Lighting: soft gold sunrise over calm teal water. Environment = Location Registry id 'SUNRISE_PIER': Afenyo's wooden fishing pier at sunrise: worn planks, moored painted canoes, repaired fishing nets, calm gold-and-teal lagoon water, distant mangroves and a low orange sun.",</w:t>
         <w:br/>
         <w:t xml:space="preserve">  "status": "⬜",</w:t>
         <w:br/>
@@ -12629,7 +12629,7 @@
         <w:br/>
         <w:t xml:space="preserve">  ],</w:t>
         <w:br/>
-        <w:t xml:space="preserve">  "prompt": "Grounded cinematic West African magical realism; contemporary Ghanaian coastal life; human-scale performances; saturated indigo, lagoon teal, clay red and warm amber palette; natural skin texture; tactile fabric and weathered wood; 2.39:1 widescreen composition; subtle film grain; expressive realistic lighting. No written words, no logos, no watermark, no distorted hands, no duplicate people. Scene S20 — First Light, Shared. MEDIUM shot, handheld eye-level. Characters in frame: @KOSI_MENSAH (indigo utility jumpsuit with rolled sleeves, sand-coloured work boots and a narrow woven kente belt, small gold Adinkra-disc earrings); @AMA_ADJOVI (deep navy kaba blouse, hand-dyed indigo wrapper with tiny white wave motifs and flat leather sandals, three-strand amber bead necklace). Kosi and Ama share a quiet look over the brightening lagoon. Mood: hopeful, lived-in renewal. Lighting: soft gold sunrise over calm teal water. Environment = Location Registry id 'SUNRISE_PIER': Afenyo's wooden fishing pier at sunrise: worn planks, moored painted canoes, repaired fishing nets, calm gold-and-teal lagoon water, distant mangroves and a low orange sun.",</w:t>
+        <w:t xml:space="preserve">  "prompt": "Grounded cinematic West African magical realism; contemporary Ghanaian coastal life; human-scale performances; saturated indigo, lagoon teal, clay red and warm amber palette; natural skin texture; tactile fabric and weathered wood; 16:9 landscape widescreen composition; subtle film grain; expressive realistic lighting. No written words, no logos, no watermark, no distorted hands, no duplicate people. Scene S20 — First Light, Shared. MEDIUM shot, handheld eye-level. Characters in frame: @KOSI_MENSAH (indigo utility jumpsuit with rolled sleeves, sand-coloured work boots and a narrow woven kente belt, small gold Adinkra-disc earrings); @AMA_ADJOVI (deep navy kaba blouse, hand-dyed indigo wrapper with tiny white wave motifs and flat leather sandals, three-strand amber bead necklace). Kosi and Ama share a quiet look over the brightening lagoon. Mood: hopeful, lived-in renewal. Lighting: soft gold sunrise over calm teal water. Environment = Location Registry id 'SUNRISE_PIER': Afenyo's wooden fishing pier at sunrise: worn planks, moored painted canoes, repaired fishing nets, calm gold-and-teal lagoon water, distant mangroves and a low orange sun.",</w:t>
         <w:br/>
         <w:t xml:space="preserve">  "status": "⬜",</w:t>
         <w:br/>
@@ -12700,7 +12700,7 @@
         <w:br/>
         <w:t xml:space="preserve">  ],</w:t>
         <w:br/>
-        <w:t xml:space="preserve">  "prompt": "Grounded cinematic West African magical realism; contemporary Ghanaian coastal life; human-scale performances; saturated indigo, lagoon teal, clay red and warm amber palette; natural skin texture; tactile fabric and weathered wood; 2.39:1 widescreen composition; subtle film grain; expressive realistic lighting. No written words, no logos, no watermark, no distorted hands, no duplicate people. Scene S20 — First Light, Shared. WIDE shot, rear closing tableau. Characters in frame: @KOSI_MENSAH (indigo utility jumpsuit with rolled sleeves, sand-coloured work boots and a narrow woven kente belt, small gold Adinkra-disc earrings); @AMA_ADJOVI (deep navy kaba blouse, hand-dyed indigo wrapper with tiny white wave motifs and flat leather sandals, three-strand amber bead necklace); @SENA_ADJOVI (mustard oversized hoodie, blue-and-white printed ankle skirt and worn white canvas trainers, turquoise over-ear radio headphones); @KOJO_DANSO (faded forest-green canvas jacket over a blue-and-cream striped shirt, charcoal trousers and rubber deck boots, weathered brass compass on a cord); @ESI_TETTEH (brick-red wax-print dress beneath a soot-black oilskin apron, patterned headwrap and sturdy black sandals, smooth charred-wood smoking paddle); @KWAME_AGYEMAN (white linen shirt under a caramel lightweight field jacket, dark tailored trousers and brown loafers, antique bronze lapel pin shaped like a compass rose). The whole pier works together beneath the first fully shared light. Mood: hopeful, lived-in renewal. Lighting: soft gold sunrise over calm teal water. Environment = Location Registry id 'SUNRISE_PIER': Afenyo's wooden fishing pier at sunrise: worn planks, moored painted canoes, repaired fishing nets, calm gold-and-teal lagoon water, distant mangroves and a low orange sun.",</w:t>
+        <w:t xml:space="preserve">  "prompt": "Grounded cinematic West African magical realism; contemporary Ghanaian coastal life; human-scale performances; saturated indigo, lagoon teal, clay red and warm amber palette; natural skin texture; tactile fabric and weathered wood; 16:9 landscape widescreen composition; subtle film grain; expressive realistic lighting. No written words, no logos, no watermark, no distorted hands, no duplicate people. Scene S20 — First Light, Shared. WIDE shot, rear closing tableau. Characters in frame: @KOSI_MENSAH (indigo utility jumpsuit with rolled sleeves, sand-coloured work boots and a narrow woven kente belt, small gold Adinkra-disc earrings); @AMA_ADJOVI (deep navy kaba blouse, hand-dyed indigo wrapper with tiny white wave motifs and flat leather sandals, three-strand amber bead necklace); @SENA_ADJOVI (mustard oversized hoodie, blue-and-white printed ankle skirt and worn white canvas trainers, turquoise over-ear radio headphones); @KOJO_DANSO (faded forest-green canvas jacket over a blue-and-cream striped shirt, charcoal trousers and rubber deck boots, weathered brass compass on a cord); @ESI_TETTEH (brick-red wax-print dress beneath a soot-black oilskin apron, patterned headwrap and sturdy black sandals, smooth charred-wood smoking paddle); @KWAME_AGYEMAN (white linen shirt under a caramel lightweight field jacket, dark tailored trousers and brown loafers, antique bronze lapel pin shaped like a compass rose). The whole pier works together beneath the first fully shared light. Mood: hopeful, lived-in renewal. Lighting: soft gold sunrise over calm teal water. Environment = Location Registry id 'SUNRISE_PIER': Afenyo's wooden fishing pier at sunrise: worn planks, moored painted canoes, repaired fishing nets, calm gold-and-teal lagoon water, distant mangroves and a low orange sun.",</w:t>
         <w:br/>
         <w:t xml:space="preserve">  "status": "⬜",</w:t>
         <w:br/>

</xml_diff>

<commit_message>
Generate second River Remembers scene batch
Co-authored-by: arena-agent <297053741+arena-agent@users.noreply.github.com>
</commit_message>
<xml_diff>
--- a/the_river_remembers/MASTER_DOCUMENT.docx
+++ b/the_river_remembers/MASTER_DOCUMENT.docx
@@ -2239,7 +2239,7 @@
         <w:br/>
         <w:t xml:space="preserve">  "prompt": "Grounded cinematic West African magical realism; contemporary Ghanaian coastal life; human-scale performances; saturated indigo, lagoon teal, clay red and warm amber palette; natural skin texture; tactile fabric and weathered wood; 16:9 landscape widescreen composition; subtle film grain; expressive realistic lighting. No written words, no logos, no watermark, no distorted hands, no duplicate people. Scene S02 — Road to Afenyo. WIDE shot, high establishing angle. Characters in frame: @KOSI_MENSAH (indigo utility jumpsuit with rolled sleeves, sand-coloured work boots and a narrow woven kente belt, small gold Adinkra-disc earrings). A tro-tro pulls away from the red-earth stop, leaving Kosi in the sea wind. Mood: uneasy homecoming. Lighting: late gold filtering through bus dust. Environment = Location Registry id 'AFENYO_BUS_STOP': Afenyo's small red-earth bus stop at the lagoon edge: a faded blue shelter, cassava vendors under striped umbrellas, old tro-tro vans, palm trees bent by sea wind and distant silver water.",</w:t>
         <w:br/>
-        <w:t xml:space="preserve">  "status": "⬜",</w:t>
+        <w:t xml:space="preserve">  "status": "✅",</w:t>
         <w:br/>
         <w:t xml:space="preserve">  "file": "images/act1/S02_Step01_bus_stop_establish.png"</w:t>
         <w:br/>
@@ -2290,7 +2290,7 @@
         <w:br/>
         <w:t xml:space="preserve">  "prompt": "Grounded cinematic West African magical realism; contemporary Ghanaian coastal life; human-scale performances; saturated indigo, lagoon teal, clay red and warm amber palette; natural skin texture; tactile fabric and weathered wood; 16:9 landscape widescreen composition; subtle film grain; expressive realistic lighting. No written words, no logos, no watermark, no distorted hands, no duplicate people. Scene S02 — Road to Afenyo. MEDIUM shot, eye-level. Characters in frame: @KOSI_MENSAH (indigo utility jumpsuit with rolled sleeves, sand-coloured work boots and a narrow woven kente belt, small gold Adinkra-disc earrings). Kosi steadies her tool case beside cassava baskets and looks toward the lagoon. Mood: uneasy homecoming. Lighting: late gold filtering through bus dust. Environment = Location Registry id 'AFENYO_BUS_STOP': Afenyo's small red-earth bus stop at the lagoon edge: a faded blue shelter, cassava vendors under striped umbrellas, old tro-tro vans, palm trees bent by sea wind and distant silver water.",</w:t>
         <w:br/>
-        <w:t xml:space="preserve">  "status": "⬜",</w:t>
+        <w:t xml:space="preserve">  "status": "✅",</w:t>
         <w:br/>
         <w:t xml:space="preserve">  "file": "images/act1/S02_Step02_arrival_with_case.png"</w:t>
         <w:br/>
@@ -2341,7 +2341,7 @@
         <w:br/>
         <w:t xml:space="preserve">  "prompt": "Grounded cinematic West African magical realism; contemporary Ghanaian coastal life; human-scale performances; saturated indigo, lagoon teal, clay red and warm amber palette; natural skin texture; tactile fabric and weathered wood; 16:9 landscape widescreen composition; subtle film grain; expressive realistic lighting. No written words, no logos, no watermark, no distorted hands, no duplicate people. Scene S02 — Road to Afenyo. CLOSE shot, three-quarter profile. Characters in frame: @SENA_ADJOVI (mustard oversized hoodie, blue-and-white printed ankle skirt and worn white canvas trainers, turquoise over-ear radio headphones). Sena grins beneath turquoise headphones as she spots Kosi. Mood: uneasy homecoming. Lighting: late gold filtering through bus dust. Environment = Location Registry id 'AFENYO_BUS_STOP': Afenyo's small red-earth bus stop at the lagoon edge: a faded blue shelter, cassava vendors under striped umbrellas, old tro-tro vans, palm trees bent by sea wind and distant silver water.",</w:t>
         <w:br/>
-        <w:t xml:space="preserve">  "status": "⬜",</w:t>
+        <w:t xml:space="preserve">  "status": "✅",</w:t>
         <w:br/>
         <w:t xml:space="preserve">  "file": "images/act1/S02_Step03_sena_spots_kosi.png"</w:t>
         <w:br/>
@@ -2392,7 +2392,7 @@
         <w:br/>
         <w:t xml:space="preserve">  "prompt": "Grounded cinematic West African magical realism; contemporary Ghanaian coastal life; human-scale performances; saturated indigo, lagoon teal, clay red and warm amber palette; natural skin texture; tactile fabric and weathered wood; 16:9 landscape widescreen composition; subtle film grain; expressive realistic lighting. No written words, no logos, no watermark, no distorted hands, no duplicate people. Scene S02 — Road to Afenyo. INSERT shot, top-down detail. Characters in frame: @SENA_ADJOVI (mustard oversized hoodie, blue-and-white printed ankle skirt and worn white canvas trainers, turquoise over-ear radio headphones). Sena's small microphone and turquoise headphone cable rest against her mustard hoodie. Mood: uneasy homecoming. Lighting: late gold filtering through bus dust. Environment = Location Registry id 'AFENYO_BUS_STOP': Afenyo's small red-earth bus stop at the lagoon edge: a faded blue shelter, cassava vendors under striped umbrellas, old tro-tro vans, palm trees bent by sea wind and distant silver water.",</w:t>
         <w:br/>
-        <w:t xml:space="preserve">  "status": "⬜",</w:t>
+        <w:t xml:space="preserve">  "status": "✅",</w:t>
         <w:br/>
         <w:t xml:space="preserve">  "file": "images/act1/S02_Step04_radio_mic.png"</w:t>
         <w:br/>
@@ -2447,7 +2447,7 @@
         <w:br/>
         <w:t xml:space="preserve">  "prompt": "Grounded cinematic West African magical realism; contemporary Ghanaian coastal life; human-scale performances; saturated indigo, lagoon teal, clay red and warm amber palette; natural skin texture; tactile fabric and weathered wood; 16:9 landscape widescreen composition; subtle film grain; expressive realistic lighting. No written words, no logos, no watermark, no distorted hands, no duplicate people. Scene S02 — Road to Afenyo. TWO-SHOT shot, eye-level. Characters in frame: @KOSI_MENSAH (indigo utility jumpsuit with rolled sleeves, sand-coloured work boots and a narrow woven kente belt, small gold Adinkra-disc earrings); @SENA_ADJOVI (mustard oversized hoodie, blue-and-white printed ankle skirt and worn white canvas trainers, turquoise over-ear radio headphones). Sena reaches for Kosi's case rather than a hug; Kosi laughs despite herself. Mood: uneasy homecoming. Lighting: late gold filtering through bus dust. Environment = Location Registry id 'AFENYO_BUS_STOP': Afenyo's small red-earth bus stop at the lagoon edge: a faded blue shelter, cassava vendors under striped umbrellas, old tro-tro vans, palm trees bent by sea wind and distant silver water.",</w:t>
         <w:br/>
-        <w:t xml:space="preserve">  "status": "⬜",</w:t>
+        <w:t xml:space="preserve">  "status": "✅",</w:t>
         <w:br/>
         <w:t xml:space="preserve">  "file": "images/act1/S02_Step05_cousins_reunite.png"</w:t>
         <w:br/>
@@ -2502,7 +2502,7 @@
         <w:br/>
         <w:t xml:space="preserve">  "prompt": "Grounded cinematic West African magical realism; contemporary Ghanaian coastal life; human-scale performances; saturated indigo, lagoon teal, clay red and warm amber palette; natural skin texture; tactile fabric and weathered wood; 16:9 landscape widescreen composition; subtle film grain; expressive realistic lighting. No written words, no logos, no watermark, no distorted hands, no duplicate people. Scene S02 — Road to Afenyo. OVER-SHOULDER shot, over the lead character's shoulder. Characters in frame: @KOSI_MENSAH (indigo utility jumpsuit with rolled sleeves, sand-coloured work boots and a narrow woven kente belt, small gold Adinkra-disc earrings); @SENA_ADJOVI (mustard oversized hoodie, blue-and-white printed ankle skirt and worn white canvas trainers, turquoise over-ear radio headphones). Over Sena's shoulder, Kosi hears that Ama is afraid. Mood: uneasy homecoming. Lighting: late gold filtering through bus dust. Environment = Location Registry id 'AFENYO_BUS_STOP': Afenyo's small red-earth bus stop at the lagoon edge: a faded blue shelter, cassava vendors under striped umbrellas, old tro-tro vans, palm trees bent by sea wind and distant silver water.",</w:t>
         <w:br/>
-        <w:t xml:space="preserve">  "status": "⬜",</w:t>
+        <w:t xml:space="preserve">  "status": "✅",</w:t>
         <w:br/>
         <w:t xml:space="preserve">  "file": "images/act1/S02_Step06_fear_confession.png"</w:t>
         <w:br/>
@@ -2553,7 +2553,7 @@
         <w:br/>
         <w:t xml:space="preserve">  "prompt": "Grounded cinematic West African magical realism; contemporary Ghanaian coastal life; human-scale performances; saturated indigo, lagoon teal, clay red and warm amber palette; natural skin texture; tactile fabric and weathered wood; 16:9 landscape widescreen composition; subtle film grain; expressive realistic lighting. No written words, no logos, no watermark, no distorted hands, no duplicate people. Scene S02 — Road to Afenyo. EXTREME CLOSE shot, intimate frontal angle. Characters in frame: @SENA_ADJOVI (mustard oversized hoodie, blue-and-white printed ankle skirt and worn white canvas trainers, turquoise over-ear radio headphones). Sena's brave face falters for one honest second. Mood: uneasy homecoming. Lighting: late gold filtering through bus dust. Environment = Location Registry id 'AFENYO_BUS_STOP': Afenyo's small red-earth bus stop at the lagoon edge: a faded blue shelter, cassava vendors under striped umbrellas, old tro-tro vans, palm trees bent by sea wind and distant silver water.",</w:t>
         <w:br/>
-        <w:t xml:space="preserve">  "status": "⬜",</w:t>
+        <w:t xml:space="preserve">  "status": "✅",</w:t>
         <w:br/>
         <w:t xml:space="preserve">  "file": "images/act1/S02_Step07_sena_truthful.png"</w:t>
         <w:br/>
@@ -2608,7 +2608,7 @@
         <w:br/>
         <w:t xml:space="preserve">  "prompt": "Grounded cinematic West African magical realism; contemporary Ghanaian coastal life; human-scale performances; saturated indigo, lagoon teal, clay red and warm amber palette; natural skin texture; tactile fabric and weathered wood; 16:9 landscape widescreen composition; subtle film grain; expressive realistic lighting. No written words, no logos, no watermark, no distorted hands, no duplicate people. Scene S02 — Road to Afenyo. WIDE shot, low observational angle. Characters in frame: @KOSI_MENSAH (indigo utility jumpsuit with rolled sleeves, sand-coloured work boots and a narrow woven kente belt, small gold Adinkra-disc earrings); @SENA_ADJOVI (mustard oversized hoodie, blue-and-white printed ankle skirt and worn white canvas trainers, turquoise over-ear radio headphones). Wind lifts striped umbrellas around the two cousins amid the busy stop. Mood: uneasy homecoming. Lighting: late gold filtering through bus dust. Environment = Location Registry id 'AFENYO_BUS_STOP': Afenyo's small red-earth bus stop at the lagoon edge: a faded blue shelter, cassava vendors under striped umbrellas, old tro-tro vans, palm trees bent by sea wind and distant silver water.",</w:t>
         <w:br/>
-        <w:t xml:space="preserve">  "status": "⬜",</w:t>
+        <w:t xml:space="preserve">  "status": "✅",</w:t>
         <w:br/>
         <w:t xml:space="preserve">  "file": "images/act1/S02_Step08_wind_and_vendors.png"</w:t>
         <w:br/>
@@ -2663,7 +2663,7 @@
         <w:br/>
         <w:t xml:space="preserve">  "prompt": "Grounded cinematic West African magical realism; contemporary Ghanaian coastal life; human-scale performances; saturated indigo, lagoon teal, clay red and warm amber palette; natural skin texture; tactile fabric and weathered wood; 16:9 landscape widescreen composition; subtle film grain; expressive realistic lighting. No written words, no logos, no watermark, no distorted hands, no duplicate people. Scene S02 — Road to Afenyo. MEDIUM shot, handheld eye-level. Characters in frame: @KOSI_MENSAH (indigo utility jumpsuit with rolled sleeves, sand-coloured work boots and a narrow woven kente belt, small gold Adinkra-disc earrings); @SENA_ADJOVI (mustard oversized hoodie, blue-and-white printed ankle skirt and worn white canvas trainers, turquoise over-ear radio headphones). Kosi and Sena walk along the lagoon road, one carrying tools and one recording sound. Mood: uneasy homecoming. Lighting: late gold filtering through bus dust. Environment = Location Registry id 'AFENYO_BUS_STOP': Afenyo's small red-earth bus stop at the lagoon edge: a faded blue shelter, cassava vendors under striped umbrellas, old tro-tro vans, palm trees bent by sea wind and distant silver water.",</w:t>
         <w:br/>
-        <w:t xml:space="preserve">  "status": "⬜",</w:t>
+        <w:t xml:space="preserve">  "status": "✅",</w:t>
         <w:br/>
         <w:t xml:space="preserve">  "file": "images/act1/S02_Step09_walk_home.png"</w:t>
         <w:br/>
@@ -2718,7 +2718,7 @@
         <w:br/>
         <w:t xml:space="preserve">  "prompt": "Grounded cinematic West African magical realism; contemporary Ghanaian coastal life; human-scale performances; saturated indigo, lagoon teal, clay red and warm amber palette; natural skin texture; tactile fabric and weathered wood; 16:9 landscape widescreen composition; subtle film grain; expressive realistic lighting. No written words, no logos, no watermark, no distorted hands, no duplicate people. Scene S02 — Road to Afenyo. WIDE shot, rear closing tableau. Characters in frame: @KOSI_MENSAH (indigo utility jumpsuit with rolled sleeves, sand-coloured work boots and a narrow woven kente belt, small gold Adinkra-disc earrings); @SENA_ADJOVI (mustard oversized hoodie, blue-and-white printed ankle skirt and worn white canvas trainers, turquoise over-ear radio headphones). Their small figures head toward Afenyo's palms and blue water. Mood: uneasy homecoming. Lighting: late gold filtering through bus dust. Environment = Location Registry id 'AFENYO_BUS_STOP': Afenyo's small red-earth bus stop at the lagoon edge: a faded blue shelter, cassava vendors under striped umbrellas, old tro-tro vans, palm trees bent by sea wind and distant silver water.",</w:t>
         <w:br/>
-        <w:t xml:space="preserve">  "status": "⬜",</w:t>
+        <w:t xml:space="preserve">  "status": "✅",</w:t>
         <w:br/>
         <w:t xml:space="preserve">  "file": "images/act1/S02_Step10_road_to_compound.png"</w:t>
         <w:br/>

</xml_diff>

<commit_message>
Generate third River Remembers scene batch
Co-authored-by: arena-agent <297053741+arena-agent@users.noreply.github.com>
</commit_message>
<xml_diff>
--- a/the_river_remembers/MASTER_DOCUMENT.docx
+++ b/the_river_remembers/MASTER_DOCUMENT.docx
@@ -2777,7 +2777,7 @@
         <w:br/>
         <w:t xml:space="preserve">  "prompt": "Grounded cinematic West African magical realism; contemporary Ghanaian coastal life; human-scale performances; saturated indigo, lagoon teal, clay red and warm amber palette; natural skin texture; tactile fabric and weathered wood; 16:9 landscape widescreen composition; subtle film grain; expressive realistic lighting. No written words, no logos, no watermark, no distorted hands, no duplicate people. Scene S03 — A Lantern Left Dark. WIDE shot, high establishing angle. Characters in frame: @AMA_ADJOVI (deep navy kaba blouse, hand-dyed indigo wrapper with tiny white wave motifs and flat leather sandals, three-strand amber bead necklace). Ama waits beneath the mango tree in the courtyard beside an unlit blue-glass lantern. Mood: warm reunion with a hidden wound. Lighting: low amber sunset and first cool blue shadows. Environment = Location Registry id 'COMPOUND_COURTYARD': Ama's lived-in family compound courtyard in Afenyo: ochre plaster walls, a weathered blue wooden door, clay pots of basil, woven stools, a mango tree, laundry lines and a low view toward the lagoon.",</w:t>
         <w:br/>
-        <w:t xml:space="preserve">  "status": "⬜",</w:t>
+        <w:t xml:space="preserve">  "status": "✅",</w:t>
         <w:br/>
         <w:t xml:space="preserve">  "file": "images/act1/S03_Step01_compound_reveal.png"</w:t>
         <w:br/>
@@ -2828,7 +2828,7 @@
         <w:br/>
         <w:t xml:space="preserve">  "prompt": "Grounded cinematic West African magical realism; contemporary Ghanaian coastal life; human-scale performances; saturated indigo, lagoon teal, clay red and warm amber palette; natural skin texture; tactile fabric and weathered wood; 16:9 landscape widescreen composition; subtle film grain; expressive realistic lighting. No written words, no logos, no watermark, no distorted hands, no duplicate people. Scene S03 — A Lantern Left Dark. MEDIUM shot, eye-level. Characters in frame: @KOSI_MENSAH (indigo utility jumpsuit with rolled sleeves, sand-coloured work boots and a narrow woven kente belt, small gold Adinkra-disc earrings). Kosi steps through the weathered blue door and scans her childhood courtyard. Mood: warm reunion with a hidden wound. Lighting: low amber sunset and first cool blue shadows. Environment = Location Registry id 'COMPOUND_COURTYARD': Ama's lived-in family compound courtyard in Afenyo: ochre plaster walls, a weathered blue wooden door, clay pots of basil, woven stools, a mango tree, laundry lines and a low view toward the lagoon.",</w:t>
         <w:br/>
-        <w:t xml:space="preserve">  "status": "⬜",</w:t>
+        <w:t xml:space="preserve">  "status": "✅",</w:t>
         <w:br/>
         <w:t xml:space="preserve">  "file": "images/act1/S03_Step02_kosi_enters.png"</w:t>
         <w:br/>
@@ -2879,7 +2879,7 @@
         <w:br/>
         <w:t xml:space="preserve">  "prompt": "Grounded cinematic West African magical realism; contemporary Ghanaian coastal life; human-scale performances; saturated indigo, lagoon teal, clay red and warm amber palette; natural skin texture; tactile fabric and weathered wood; 16:9 landscape widescreen composition; subtle film grain; expressive realistic lighting. No written words, no logos, no watermark, no distorted hands, no duplicate people. Scene S03 — A Lantern Left Dark. CLOSE shot, three-quarter profile. Characters in frame: @AMA_ADJOVI (deep navy kaba blouse, hand-dyed indigo wrapper with tiny white wave motifs and flat leather sandals, three-strand amber bead necklace). Ama hides a tremor with a warm, teasing smile. Mood: warm reunion with a hidden wound. Lighting: low amber sunset and first cool blue shadows. Environment = Location Registry id 'COMPOUND_COURTYARD': Ama's lived-in family compound courtyard in Afenyo: ochre plaster walls, a weathered blue wooden door, clay pots of basil, woven stools, a mango tree, laundry lines and a low view toward the lagoon.",</w:t>
         <w:br/>
-        <w:t xml:space="preserve">  "status": "⬜",</w:t>
+        <w:t xml:space="preserve">  "status": "✅",</w:t>
         <w:br/>
         <w:t xml:space="preserve">  "file": "images/act1/S03_Step03_ama_welcome.png"</w:t>
         <w:br/>
@@ -2930,7 +2930,7 @@
         <w:br/>
         <w:t xml:space="preserve">  "prompt": "Grounded cinematic West African magical realism; contemporary Ghanaian coastal life; human-scale performances; saturated indigo, lagoon teal, clay red and warm amber palette; natural skin texture; tactile fabric and weathered wood; 16:9 landscape widescreen composition; subtle film grain; expressive realistic lighting. No written words, no logos, no watermark, no distorted hands, no duplicate people. Scene S03 — A Lantern Left Dark. INSERT shot, top-down detail. Characters in frame: @AMA_ADJOVI (deep navy kaba blouse, hand-dyed indigo wrapper with tiny white wave motifs and flat leather sandals, three-strand amber bead necklace). The dusty blue-glass courtyard lantern hangs dark against sunset. Mood: warm reunion with a hidden wound. Lighting: low amber sunset and first cool blue shadows. Environment = Location Registry id 'COMPOUND_COURTYARD': Ama's lived-in family compound courtyard in Afenyo: ochre plaster walls, a weathered blue wooden door, clay pots of basil, woven stools, a mango tree, laundry lines and a low view toward the lagoon.",</w:t>
         <w:br/>
-        <w:t xml:space="preserve">  "status": "⬜",</w:t>
+        <w:t xml:space="preserve">  "status": "✅",</w:t>
         <w:br/>
         <w:t xml:space="preserve">  "file": "images/act1/S03_Step04_unlit_lantern.png"</w:t>
         <w:br/>
@@ -2985,7 +2985,7 @@
         <w:br/>
         <w:t xml:space="preserve">  "prompt": "Grounded cinematic West African magical realism; contemporary Ghanaian coastal life; human-scale performances; saturated indigo, lagoon teal, clay red and warm amber palette; natural skin texture; tactile fabric and weathered wood; 16:9 landscape widescreen composition; subtle film grain; expressive realistic lighting. No written words, no logos, no watermark, no distorted hands, no duplicate people. Scene S03 — A Lantern Left Dark. TWO-SHOT shot, eye-level. Characters in frame: @KOSI_MENSAH (indigo utility jumpsuit with rolled sleeves, sand-coloured work boots and a narrow woven kente belt, small gold Adinkra-disc earrings); @AMA_ADJOVI (deep navy kaba blouse, hand-dyed indigo wrapper with tiny white wave motifs and flat leather sandals, three-strand amber bead necklace). Kosi hugs Ama tightly while Sena watches from a woven stool. Mood: warm reunion with a hidden wound. Lighting: low amber sunset and first cool blue shadows. Environment = Location Registry id 'COMPOUND_COURTYARD': Ama's lived-in family compound courtyard in Afenyo: ochre plaster walls, a weathered blue wooden door, clay pots of basil, woven stools, a mango tree, laundry lines and a low view toward the lagoon.",</w:t>
         <w:br/>
-        <w:t xml:space="preserve">  "status": "⬜",</w:t>
+        <w:t xml:space="preserve">  "status": "✅",</w:t>
         <w:br/>
         <w:t xml:space="preserve">  "file": "images/act1/S03_Step05_family_embrace.png"</w:t>
         <w:br/>
@@ -3040,7 +3040,7 @@
         <w:br/>
         <w:t xml:space="preserve">  "prompt": "Grounded cinematic West African magical realism; contemporary Ghanaian coastal life; human-scale performances; saturated indigo, lagoon teal, clay red and warm amber palette; natural skin texture; tactile fabric and weathered wood; 16:9 landscape widescreen composition; subtle film grain; expressive realistic lighting. No written words, no logos, no watermark, no distorted hands, no duplicate people. Scene S03 — A Lantern Left Dark. OVER-SHOULDER shot, over the lead character's shoulder. Characters in frame: @KOSI_MENSAH (indigo utility jumpsuit with rolled sleeves, sand-coloured work boots and a narrow woven kente belt, small gold Adinkra-disc earrings); @AMA_ADJOVI (deep navy kaba blouse, hand-dyed indigo wrapper with tiny white wave motifs and flat leather sandals, three-strand amber bead necklace). Over Kosi's shoulder, Ama's hand trembles against the indigo jumpsuit. Mood: warm reunion with a hidden wound. Lighting: low amber sunset and first cool blue shadows. Environment = Location Registry id 'COMPOUND_COURTYARD': Ama's lived-in family compound courtyard in Afenyo: ochre plaster walls, a weathered blue wooden door, clay pots of basil, woven stools, a mango tree, laundry lines and a low view toward the lagoon.",</w:t>
         <w:br/>
-        <w:t xml:space="preserve">  "status": "⬜",</w:t>
+        <w:t xml:space="preserve">  "status": "✅",</w:t>
         <w:br/>
         <w:t xml:space="preserve">  "file": "images/act1/S03_Step06_noticed_tremor.png"</w:t>
         <w:br/>
@@ -3091,7 +3091,7 @@
         <w:br/>
         <w:t xml:space="preserve">  "prompt": "Grounded cinematic West African magical realism; contemporary Ghanaian coastal life; human-scale performances; saturated indigo, lagoon teal, clay red and warm amber palette; natural skin texture; tactile fabric and weathered wood; 16:9 landscape widescreen composition; subtle film grain; expressive realistic lighting. No written words, no logos, no watermark, no distorted hands, no duplicate people. Scene S03 — A Lantern Left Dark. EXTREME CLOSE shot, intimate frontal angle. Characters in frame: @AMA_ADJOVI (deep navy kaba blouse, hand-dyed indigo wrapper with tiny white wave motifs and flat leather sandals, three-strand amber bead necklace). Ama explains the meaning of a dark lantern with quiet gravity. Mood: warm reunion with a hidden wound. Lighting: low amber sunset and first cool blue shadows. Environment = Location Registry id 'COMPOUND_COURTYARD': Ama's lived-in family compound courtyard in Afenyo: ochre plaster walls, a weathered blue wooden door, clay pots of basil, woven stools, a mango tree, laundry lines and a low view toward the lagoon.",</w:t>
         <w:br/>
-        <w:t xml:space="preserve">  "status": "⬜",</w:t>
+        <w:t xml:space="preserve">  "status": "✅",</w:t>
         <w:br/>
         <w:t xml:space="preserve">  "file": "images/act1/S03_Step07_ama_warning.png"</w:t>
         <w:br/>
@@ -3142,7 +3142,7 @@
         <w:br/>
         <w:t xml:space="preserve">  "prompt": "Grounded cinematic West African magical realism; contemporary Ghanaian coastal life; human-scale performances; saturated indigo, lagoon teal, clay red and warm amber palette; natural skin texture; tactile fabric and weathered wood; 16:9 landscape widescreen composition; subtle film grain; expressive realistic lighting. No written words, no logos, no watermark, no distorted hands, no duplicate people. Scene S03 — A Lantern Left Dark. WIDE shot, low observational angle. Characters in frame: @SENA_ADJOVI (mustard oversized hoodie, blue-and-white printed ankle skirt and worn white canvas trainers, turquoise over-ear radio headphones). Sena strings blue glass scraps into the mango branches. Mood: warm reunion with a hidden wound. Lighting: low amber sunset and first cool blue shadows. Environment = Location Registry id 'COMPOUND_COURTYARD': Ama's lived-in family compound courtyard in Afenyo: ochre plaster walls, a weathered blue wooden door, clay pots of basil, woven stools, a mango tree, laundry lines and a low view toward the lagoon.",</w:t>
         <w:br/>
-        <w:t xml:space="preserve">  "status": "⬜",</w:t>
+        <w:t xml:space="preserve">  "status": "✅",</w:t>
         <w:br/>
         <w:t xml:space="preserve">  "file": "images/act1/S03_Step08_glass_garland.png"</w:t>
         <w:br/>
@@ -3201,7 +3201,7 @@
         <w:br/>
         <w:t xml:space="preserve">  "prompt": "Grounded cinematic West African magical realism; contemporary Ghanaian coastal life; human-scale performances; saturated indigo, lagoon teal, clay red and warm amber palette; natural skin texture; tactile fabric and weathered wood; 16:9 landscape widescreen composition; subtle film grain; expressive realistic lighting. No written words, no logos, no watermark, no distorted hands, no duplicate people. Scene S03 — A Lantern Left Dark. MEDIUM shot, handheld eye-level. Characters in frame: @KOSI_MENSAH (indigo utility jumpsuit with rolled sleeves, sand-coloured work boots and a narrow woven kente belt, small gold Adinkra-disc earrings); @AMA_ADJOVI (deep navy kaba blouse, hand-dyed indigo wrapper with tiny white wave motifs and flat leather sandals, three-strand amber bead necklace); @SENA_ADJOVI (mustard oversized hoodie, blue-and-white printed ankle skirt and worn white canvas trainers, turquoise over-ear radio headphones). The three sit near untouched pepper soup as sunset turns the courtyard amber. Mood: warm reunion with a hidden wound. Lighting: low amber sunset and first cool blue shadows. Environment = Location Registry id 'COMPOUND_COURTYARD': Ama's lived-in family compound courtyard in Afenyo: ochre plaster walls, a weathered blue wooden door, clay pots of basil, woven stools, a mango tree, laundry lines and a low view toward the lagoon.",</w:t>
         <w:br/>
-        <w:t xml:space="preserve">  "status": "⬜",</w:t>
+        <w:t xml:space="preserve">  "status": "✅",</w:t>
         <w:br/>
         <w:t xml:space="preserve">  "file": "images/act1/S03_Step09_shared_supper.png"</w:t>
         <w:br/>
@@ -3256,7 +3256,7 @@
         <w:br/>
         <w:t xml:space="preserve">  "prompt": "Grounded cinematic West African magical realism; contemporary Ghanaian coastal life; human-scale performances; saturated indigo, lagoon teal, clay red and warm amber palette; natural skin texture; tactile fabric and weathered wood; 16:9 landscape widescreen composition; subtle film grain; expressive realistic lighting. No written words, no logos, no watermark, no distorted hands, no duplicate people. Scene S03 — A Lantern Left Dark. WIDE shot, rear closing tableau. Characters in frame: @KOSI_MENSAH (indigo utility jumpsuit with rolled sleeves, sand-coloured work boots and a narrow woven kente belt, small gold Adinkra-disc earrings); @AMA_ADJOVI (deep navy kaba blouse, hand-dyed indigo wrapper with tiny white wave motifs and flat leather sandals, three-strand amber bead necklace). Kosi faces the dark lantern while Ama watches her understand. Mood: warm reunion with a hidden wound. Lighting: low amber sunset and first cool blue shadows. Environment = Location Registry id 'COMPOUND_COURTYARD': Ama's lived-in family compound courtyard in Afenyo: ochre plaster walls, a weathered blue wooden door, clay pots of basil, woven stools, a mango tree, laundry lines and a low view toward the lagoon.",</w:t>
         <w:br/>
-        <w:t xml:space="preserve">  "status": "⬜",</w:t>
+        <w:t xml:space="preserve">  "status": "✅",</w:t>
         <w:br/>
         <w:t xml:space="preserve">  "file": "images/act1/S03_Step10_lantern_between_them.png"</w:t>
         <w:br/>

</xml_diff>

<commit_message>
Generate fourth River Remembers scene batch
Co-authored-by: arena-agent <297053741+arena-agent@users.noreply.github.com>
</commit_message>
<xml_diff>
--- a/the_river_remembers/MASTER_DOCUMENT.docx
+++ b/the_river_remembers/MASTER_DOCUMENT.docx
@@ -3319,7 +3319,7 @@
         <w:br/>
         <w:t xml:space="preserve">  "prompt": "Grounded cinematic West African magical realism; contemporary Ghanaian coastal life; human-scale performances; saturated indigo, lagoon teal, clay red and warm amber palette; natural skin texture; tactile fabric and weathered wood; 16:9 landscape widescreen composition; subtle film grain; expressive realistic lighting. No written words, no logos, no watermark, no distorted hands, no duplicate people. Scene S04 — Price of the Water. WIDE shot, high establishing angle. Characters in frame: @ESI_TETTEH (brick-red wax-print dress beneath a soot-black oilskin apron, patterned headwrap and sturdy black sandals, smooth charred-wood smoking paddle); @SENA_ADJOVI (mustard oversized hoodie, blue-and-white printed ankle skirt and worn white canvas trainers, turquoise over-ear radio headphones). The market wakes around fish baskets, bright canopies and a restless lagoon. Mood: busy, simmering anger. Lighting: bright tropical morning broken by striped canopies. Environment = Location Registry id 'AFENYO_MARKET': Afenyo's open lagoon market: timber stalls, bright wax-print canopies, baskets of smoked fish and tomatoes, colourful basins, sandy paths, bicycles and the blue-green lagoon visible beyond mangroves.",</w:t>
         <w:br/>
-        <w:t xml:space="preserve">  "status": "⬜",</w:t>
+        <w:t xml:space="preserve">  "status": "✅",</w:t>
         <w:br/>
         <w:t xml:space="preserve">  "file": "images/act1/S04_Step01_market_morning.png"</w:t>
         <w:br/>
@@ -3370,7 +3370,7 @@
         <w:br/>
         <w:t xml:space="preserve">  "prompt": "Grounded cinematic West African magical realism; contemporary Ghanaian coastal life; human-scale performances; saturated indigo, lagoon teal, clay red and warm amber palette; natural skin texture; tactile fabric and weathered wood; 16:9 landscape widescreen composition; subtle film grain; expressive realistic lighting. No written words, no logos, no watermark, no distorted hands, no duplicate people. Scene S04 — Price of the Water. MEDIUM shot, eye-level. Characters in frame: @ESI_TETTEH (brick-red wax-print dress beneath a soot-black oilskin apron, patterned headwrap and sturdy black sandals, smooth charred-wood smoking paddle). Esi slaps a wet survey notice onto a fish tray with her charred paddle. Mood: busy, simmering anger. Lighting: bright tropical morning broken by striped canopies. Environment = Location Registry id 'AFENYO_MARKET': Afenyo's open lagoon market: timber stalls, bright wax-print canopies, baskets of smoked fish and tomatoes, colourful basins, sandy paths, bicycles and the blue-green lagoon visible beyond mangroves.",</w:t>
         <w:br/>
-        <w:t xml:space="preserve">  "status": "⬜",</w:t>
+        <w:t xml:space="preserve">  "status": "✅",</w:t>
         <w:br/>
         <w:t xml:space="preserve">  "file": "images/act1/S04_Step02_esi_notice.png"</w:t>
         <w:br/>
@@ -3421,7 +3421,7 @@
         <w:br/>
         <w:t xml:space="preserve">  "prompt": "Grounded cinematic West African magical realism; contemporary Ghanaian coastal life; human-scale performances; saturated indigo, lagoon teal, clay red and warm amber palette; natural skin texture; tactile fabric and weathered wood; 16:9 landscape widescreen composition; subtle film grain; expressive realistic lighting. No written words, no logos, no watermark, no distorted hands, no duplicate people. Scene S04 — Price of the Water. CLOSE shot, three-quarter profile. Characters in frame: @KOJO_DANSO (faded forest-green canvas jacket over a blue-and-cream striped shirt, charcoal trousers and rubber deck boots, weathered brass compass on a cord). Kojo looks toward the water, naming the metallic smell in the current. Mood: busy, simmering anger. Lighting: bright tropical morning broken by striped canopies. Environment = Location Registry id 'AFENYO_MARKET': Afenyo's open lagoon market: timber stalls, bright wax-print canopies, baskets of smoked fish and tomatoes, colourful basins, sandy paths, bicycles and the blue-green lagoon visible beyond mangroves.",</w:t>
         <w:br/>
-        <w:t xml:space="preserve">  "status": "⬜",</w:t>
+        <w:t xml:space="preserve">  "status": "✅",</w:t>
         <w:br/>
         <w:t xml:space="preserve">  "file": "images/act1/S04_Step03_kojo_smell.png"</w:t>
         <w:br/>
@@ -3472,7 +3472,7 @@
         <w:br/>
         <w:t xml:space="preserve">  "prompt": "Grounded cinematic West African magical realism; contemporary Ghanaian coastal life; human-scale performances; saturated indigo, lagoon teal, clay red and warm amber palette; natural skin texture; tactile fabric and weathered wood; 16:9 landscape widescreen composition; subtle film grain; expressive realistic lighting. No written words, no logos, no watermark, no distorted hands, no duplicate people. Scene S04 — Price of the Water. INSERT shot, top-down detail. Characters in frame: @KOSI_MENSAH (indigo utility jumpsuit with rolled sleeves, sand-coloured work boots and a narrow woven kente belt, small gold Adinkra-disc earrings). Kosi's finger tracks an unfamiliar utility line on the crumpled notice. Mood: busy, simmering anger. Lighting: bright tropical morning broken by striped canopies. Environment = Location Registry id 'AFENYO_MARKET': Afenyo's open lagoon market: timber stalls, bright wax-print canopies, baskets of smoked fish and tomatoes, colourful basins, sandy paths, bicycles and the blue-green lagoon visible beyond mangroves.",</w:t>
         <w:br/>
-        <w:t xml:space="preserve">  "status": "⬜",</w:t>
+        <w:t xml:space="preserve">  "status": "✅",</w:t>
         <w:br/>
         <w:t xml:space="preserve">  "file": "images/act1/S04_Step04_survey_map.png"</w:t>
         <w:br/>
@@ -3535,7 +3535,7 @@
         <w:br/>
         <w:t xml:space="preserve">  "prompt": "Grounded cinematic West African magical realism; contemporary Ghanaian coastal life; human-scale performances; saturated indigo, lagoon teal, clay red and warm amber palette; natural skin texture; tactile fabric and weathered wood; 16:9 landscape widescreen composition; subtle film grain; expressive realistic lighting. No written words, no logos, no watermark, no distorted hands, no duplicate people. Scene S04 — Price of the Water. TWO-SHOT shot, eye-level. Characters in frame: @KOSI_MENSAH (indigo utility jumpsuit with rolled sleeves, sand-coloured work boots and a narrow woven kente belt, small gold Adinkra-disc earrings); @SENA_ADJOVI (mustard oversized hoodie, blue-and-white printed ankle skirt and worn white canvas trainers, turquoise over-ear radio headphones); @ESI_TETTEH (brick-red wax-print dress beneath a soot-black oilskin apron, patterned headwrap and sturdy black sandals, smooth charred-wood smoking paddle); @KOJO_DANSO (faded forest-green canvas jacket over a blue-and-cream striped shirt, charcoal trousers and rubber deck boots, weathered brass compass on a cord). Esi, Kojo, Kosi and Sena circle the notice amid the crowded market. Mood: busy, simmering anger. Lighting: bright tropical morning broken by striped canopies. Environment = Location Registry id 'AFENYO_MARKET': Afenyo's open lagoon market: timber stalls, bright wax-print canopies, baskets of smoked fish and tomatoes, colourful basins, sandy paths, bicycles and the blue-green lagoon visible beyond mangroves.",</w:t>
         <w:br/>
-        <w:t xml:space="preserve">  "status": "⬜",</w:t>
+        <w:t xml:space="preserve">  "status": "✅",</w:t>
         <w:br/>
         <w:t xml:space="preserve">  "file": "images/act1/S04_Step05_four_way_debate.png"</w:t>
         <w:br/>
@@ -3590,7 +3590,7 @@
         <w:br/>
         <w:t xml:space="preserve">  "prompt": "Grounded cinematic West African magical realism; contemporary Ghanaian coastal life; human-scale performances; saturated indigo, lagoon teal, clay red and warm amber palette; natural skin texture; tactile fabric and weathered wood; 16:9 landscape widescreen composition; subtle film grain; expressive realistic lighting. No written words, no logos, no watermark, no distorted hands, no duplicate people. Scene S04 — Price of the Water. OVER-SHOULDER shot, over the lead character's shoulder. Characters in frame: @KOSI_MENSAH (indigo utility jumpsuit with rolled sleeves, sand-coloured work boots and a narrow woven kente belt, small gold Adinkra-disc earrings); @ESI_TETTEH (brick-red wax-print dress beneath a soot-black oilskin apron, patterned headwrap and sturdy black sandals, smooth charred-wood smoking paddle). Over Kosi's shoulder, the diagram points toward the navigation buoy. Mood: busy, simmering anger. Lighting: bright tropical morning broken by striped canopies. Environment = Location Registry id 'AFENYO_MARKET': Afenyo's open lagoon market: timber stalls, bright wax-print canopies, baskets of smoked fish and tomatoes, colourful basins, sandy paths, bicycles and the blue-green lagoon visible beyond mangroves.",</w:t>
         <w:br/>
-        <w:t xml:space="preserve">  "status": "⬜",</w:t>
+        <w:t xml:space="preserve">  "status": "✅",</w:t>
         <w:br/>
         <w:t xml:space="preserve">  "file": "images/act1/S04_Step06_line_to_buoy.png"</w:t>
         <w:br/>
@@ -3641,7 +3641,7 @@
         <w:br/>
         <w:t xml:space="preserve">  "prompt": "Grounded cinematic West African magical realism; contemporary Ghanaian coastal life; human-scale performances; saturated indigo, lagoon teal, clay red and warm amber palette; natural skin texture; tactile fabric and weathered wood; 16:9 landscape widescreen composition; subtle film grain; expressive realistic lighting. No written words, no logos, no watermark, no distorted hands, no duplicate people. Scene S04 — Price of the Water. EXTREME CLOSE shot, intimate frontal angle. Characters in frame: @ESI_TETTEH (brick-red wax-print dress beneath a soot-black oilskin apron, patterned headwrap and sturdy black sandals, smooth charred-wood smoking paddle). Esi refuses the promise of access behind a locked gate. Mood: busy, simmering anger. Lighting: bright tropical morning broken by striped canopies. Environment = Location Registry id 'AFENYO_MARKET': Afenyo's open lagoon market: timber stalls, bright wax-print canopies, baskets of smoked fish and tomatoes, colourful basins, sandy paths, bicycles and the blue-green lagoon visible beyond mangroves.",</w:t>
         <w:br/>
-        <w:t xml:space="preserve">  "status": "⬜",</w:t>
+        <w:t xml:space="preserve">  "status": "✅",</w:t>
         <w:br/>
         <w:t xml:space="preserve">  "file": "images/act1/S04_Step07_esi_anger.png"</w:t>
         <w:br/>
@@ -3700,7 +3700,7 @@
         <w:br/>
         <w:t xml:space="preserve">  "prompt": "Grounded cinematic West African magical realism; contemporary Ghanaian coastal life; human-scale performances; saturated indigo, lagoon teal, clay red and warm amber palette; natural skin texture; tactile fabric and weathered wood; 16:9 landscape widescreen composition; subtle film grain; expressive realistic lighting. No written words, no logos, no watermark, no distorted hands, no duplicate people. Scene S04 — Price of the Water. WIDE shot, low observational angle. Characters in frame: @ESI_TETTEH (brick-red wax-print dress beneath a soot-black oilskin apron, patterned headwrap and sturdy black sandals, smooth charred-wood smoking paddle); @KOSI_MENSAH (indigo utility jumpsuit with rolled sleeves, sand-coloured work boots and a narrow woven kente belt, small gold Adinkra-disc earrings); @SENA_ADJOVI (mustard oversized hoodie, blue-and-white printed ankle skirt and worn white canvas trainers, turquoise over-ear radio headphones). Nearby sellers pause to listen as Sena records voices. Mood: busy, simmering anger. Lighting: bright tropical morning broken by striped canopies. Environment = Location Registry id 'AFENYO_MARKET': Afenyo's open lagoon market: timber stalls, bright wax-print canopies, baskets of smoked fish and tomatoes, colourful basins, sandy paths, bicycles and the blue-green lagoon visible beyond mangroves.",</w:t>
         <w:br/>
-        <w:t xml:space="preserve">  "status": "⬜",</w:t>
+        <w:t xml:space="preserve">  "status": "✅",</w:t>
         <w:br/>
         <w:t xml:space="preserve">  "file": "images/act1/S04_Step08_market_listens.png"</w:t>
         <w:br/>
@@ -3755,7 +3755,7 @@
         <w:br/>
         <w:t xml:space="preserve">  "prompt": "Grounded cinematic West African magical realism; contemporary Ghanaian coastal life; human-scale performances; saturated indigo, lagoon teal, clay red and warm amber palette; natural skin texture; tactile fabric and weathered wood; 16:9 landscape widescreen composition; subtle film grain; expressive realistic lighting. No written words, no logos, no watermark, no distorted hands, no duplicate people. Scene S04 — Price of the Water. MEDIUM shot, handheld eye-level. Characters in frame: @KOSI_MENSAH (indigo utility jumpsuit with rolled sleeves, sand-coloured work boots and a narrow woven kente belt, small gold Adinkra-disc earrings); @KOJO_DANSO (faded forest-green canvas jacket over a blue-and-cream striped shirt, charcoal trousers and rubber deck boots, weathered brass compass on a cord). Kosi asks Kojo to show her where the cables entered the shore. Mood: busy, simmering anger. Lighting: bright tropical morning broken by striped canopies. Environment = Location Registry id 'AFENYO_MARKET': Afenyo's open lagoon market: timber stalls, bright wax-print canopies, baskets of smoked fish and tomatoes, colourful basins, sandy paths, bicycles and the blue-green lagoon visible beyond mangroves.",</w:t>
         <w:br/>
-        <w:t xml:space="preserve">  "status": "⬜",</w:t>
+        <w:t xml:space="preserve">  "status": "✅",</w:t>
         <w:br/>
         <w:t xml:space="preserve">  "file": "images/act1/S04_Step09_kosi_sets_plan.png"</w:t>
         <w:br/>
@@ -3814,7 +3814,7 @@
         <w:br/>
         <w:t xml:space="preserve">  "prompt": "Grounded cinematic West African magical realism; contemporary Ghanaian coastal life; human-scale performances; saturated indigo, lagoon teal, clay red and warm amber palette; natural skin texture; tactile fabric and weathered wood; 16:9 landscape widescreen composition; subtle film grain; expressive realistic lighting. No written words, no logos, no watermark, no distorted hands, no duplicate people. Scene S04 — Price of the Water. WIDE shot, rear closing tableau. Characters in frame: @KOSI_MENSAH (indigo utility jumpsuit with rolled sleeves, sand-coloured work boots and a narrow woven kente belt, small gold Adinkra-disc earrings); @KOJO_DANSO (faded forest-green canvas jacket over a blue-and-cream striped shirt, charcoal trousers and rubber deck boots, weathered brass compass on a cord); @SENA_ADJOVI (mustard oversized hoodie, blue-and-white printed ankle skirt and worn white canvas trainers, turquoise over-ear radio headphones). Kosi, Kojo and Sena leave the market toward the blue-green lagoon. Mood: busy, simmering anger. Lighting: bright tropical morning broken by striped canopies. Environment = Location Registry id 'AFENYO_MARKET': Afenyo's open lagoon market: timber stalls, bright wax-print canopies, baskets of smoked fish and tomatoes, colourful basins, sandy paths, bicycles and the blue-green lagoon visible beyond mangroves.",</w:t>
         <w:br/>
-        <w:t xml:space="preserve">  "status": "⬜",</w:t>
+        <w:t xml:space="preserve">  "status": "✅",</w:t>
         <w:br/>
         <w:t xml:space="preserve">  "file": "images/act1/S04_Step10_toward_lagoon.png"</w:t>
         <w:br/>

</xml_diff>

<commit_message>
Generate fifth River Remembers scene batch
Co-authored-by: arena-agent <297053741+arena-agent@users.noreply.github.com>
</commit_message>
<xml_diff>
--- a/the_river_remembers/MASTER_DOCUMENT.docx
+++ b/the_river_remembers/MASTER_DOCUMENT.docx
@@ -3877,7 +3877,7 @@
         <w:br/>
         <w:t xml:space="preserve">  "prompt": "Grounded cinematic West African magical realism; contemporary Ghanaian coastal life; human-scale performances; saturated indigo, lagoon teal, clay red and warm amber palette; natural skin texture; tactile fabric and weathered wood; 16:9 landscape widescreen composition; subtle film grain; expressive realistic lighting. No written words, no logos, no watermark, no distorted hands, no duplicate people. Scene S05 — The Polite Hearing. WIDE shot, high establishing angle. Characters in frame: @NII_LAMPTEY (tailored charcoal caftan with a subtle black geometric weave, polished black shoes and a silver wristwatch, black ebony walking cane with a carved heron handle); @KWAME_AGYEMAN (white linen shirt under a caramel lightweight field jacket, dark tailored trousers and brown loafers, antique bronze lapel pin shaped like a compass rose). The assembly hall fills slowly beneath ceiling fans while Nii and Kwame wait at the dais. Mood: civil language hiding violence. Lighting: stale fan-cooled daylight through louvre windows. Environment = Location Registry id 'DISTRICT_ASSEMBLY_HALL': A modest district assembly hall in Afenyo: cream concrete walls, tall louvre windows, stacked plastic chairs, a raised wood dais, ceiling fans and late-afternoon lagoon light.",</w:t>
         <w:br/>
-        <w:t xml:space="preserve">  "status": "⬜",</w:t>
+        <w:t xml:space="preserve">  "status": "✅",</w:t>
         <w:br/>
         <w:t xml:space="preserve">  "file": "images/act1/S05_Step01_hall_establish.png"</w:t>
         <w:br/>
@@ -3928,7 +3928,7 @@
         <w:br/>
         <w:t xml:space="preserve">  "prompt": "Grounded cinematic West African magical realism; contemporary Ghanaian coastal life; human-scale performances; saturated indigo, lagoon teal, clay red and warm amber palette; natural skin texture; tactile fabric and weathered wood; 16:9 landscape widescreen composition; subtle film grain; expressive realistic lighting. No written words, no logos, no watermark, no distorted hands, no duplicate people. Scene S05 — The Polite Hearing. MEDIUM shot, eye-level. Characters in frame: @NII_LAMPTEY (tailored charcoal caftan with a subtle black geometric weave, polished black shoes and a silver wristwatch, black ebony walking cane with a carved heron handle). Nii presents the resort as a polished future of jobs and clean power. Mood: civil language hiding violence. Lighting: stale fan-cooled daylight through louvre windows. Environment = Location Registry id 'DISTRICT_ASSEMBLY_HALL': A modest district assembly hall in Afenyo: cream concrete walls, tall louvre windows, stacked plastic chairs, a raised wood dais, ceiling fans and late-afternoon lagoon light.",</w:t>
         <w:br/>
-        <w:t xml:space="preserve">  "status": "⬜",</w:t>
+        <w:t xml:space="preserve">  "status": "✅",</w:t>
         <w:br/>
         <w:t xml:space="preserve">  "file": "images/act1/S05_Step02_nii_presentation.png"</w:t>
         <w:br/>
@@ -3979,7 +3979,7 @@
         <w:br/>
         <w:t xml:space="preserve">  "prompt": "Grounded cinematic West African magical realism; contemporary Ghanaian coastal life; human-scale performances; saturated indigo, lagoon teal, clay red and warm amber palette; natural skin texture; tactile fabric and weathered wood; 16:9 landscape widescreen composition; subtle film grain; expressive realistic lighting. No written words, no logos, no watermark, no distorted hands, no duplicate people. Scene S05 — The Polite Hearing. CLOSE shot, three-quarter profile. Characters in frame: @KWAME_AGYEMAN (white linen shirt under a caramel lightweight field jacket, dark tailored trousers and brown loafers, antique bronze lapel pin shaped like a compass rose). Kwame catches sight of Kosi among the public and his rehearsed smile slips. Mood: civil language hiding violence. Lighting: stale fan-cooled daylight through louvre windows. Environment = Location Registry id 'DISTRICT_ASSEMBLY_HALL': A modest district assembly hall in Afenyo: cream concrete walls, tall louvre windows, stacked plastic chairs, a raised wood dais, ceiling fans and late-afternoon lagoon light.",</w:t>
         <w:br/>
-        <w:t xml:space="preserve">  "status": "⬜",</w:t>
+        <w:t xml:space="preserve">  "status": "✅",</w:t>
         <w:br/>
         <w:t xml:space="preserve">  "file": "images/act1/S05_Step03_kwame_recognizes.png"</w:t>
         <w:br/>
@@ -4030,7 +4030,7 @@
         <w:br/>
         <w:t xml:space="preserve">  "prompt": "Grounded cinematic West African magical realism; contemporary Ghanaian coastal life; human-scale performances; saturated indigo, lagoon teal, clay red and warm amber palette; natural skin texture; tactile fabric and weathered wood; 16:9 landscape widescreen composition; subtle film grain; expressive realistic lighting. No written words, no logos, no watermark, no distorted hands, no duplicate people. Scene S05 — The Polite Hearing. INSERT shot, top-down detail. Characters in frame: @NII_LAMPTEY (tailored charcoal caftan with a subtle black geometric weave, polished black shoes and a silver wristwatch, black ebony walking cane with a carved heron handle). An empty wall beside the dais makes the missing public map conspicuous. Mood: civil language hiding violence. Lighting: stale fan-cooled daylight through louvre windows. Environment = Location Registry id 'DISTRICT_ASSEMBLY_HALL': A modest district assembly hall in Afenyo: cream concrete walls, tall louvre windows, stacked plastic chairs, a raised wood dais, ceiling fans and late-afternoon lagoon light.",</w:t>
         <w:br/>
-        <w:t xml:space="preserve">  "status": "⬜",</w:t>
+        <w:t xml:space="preserve">  "status": "✅",</w:t>
         <w:br/>
         <w:t xml:space="preserve">  "file": "images/act1/S05_Step04_blank_map_wall.png"</w:t>
         <w:br/>
@@ -4085,7 +4085,7 @@
         <w:br/>
         <w:t xml:space="preserve">  "prompt": "Grounded cinematic West African magical realism; contemporary Ghanaian coastal life; human-scale performances; saturated indigo, lagoon teal, clay red and warm amber palette; natural skin texture; tactile fabric and weathered wood; 16:9 landscape widescreen composition; subtle film grain; expressive realistic lighting. No written words, no logos, no watermark, no distorted hands, no duplicate people. Scene S05 — The Polite Hearing. TWO-SHOT shot, eye-level. Characters in frame: @ESI_TETTEH (brick-red wax-print dress beneath a soot-black oilskin apron, patterned headwrap and sturdy black sandals, smooth charred-wood smoking paddle); @NII_LAMPTEY (tailored charcoal caftan with a subtle black geometric weave, polished black shoes and a silver wristwatch, black ebony walking cane with a carved heron handle). Esi stands to demand a public copy of the lagoon agreement. Mood: civil language hiding violence. Lighting: stale fan-cooled daylight through louvre windows. Environment = Location Registry id 'DISTRICT_ASSEMBLY_HALL': A modest district assembly hall in Afenyo: cream concrete walls, tall louvre windows, stacked plastic chairs, a raised wood dais, ceiling fans and late-afternoon lagoon light.",</w:t>
         <w:br/>
-        <w:t xml:space="preserve">  "status": "⬜",</w:t>
+        <w:t xml:space="preserve">  "status": "✅",</w:t>
         <w:br/>
         <w:t xml:space="preserve">  "file": "images/act1/S05_Step05_esi_demands_copy.png"</w:t>
         <w:br/>
@@ -4140,7 +4140,7 @@
         <w:br/>
         <w:t xml:space="preserve">  "prompt": "Grounded cinematic West African magical realism; contemporary Ghanaian coastal life; human-scale performances; saturated indigo, lagoon teal, clay red and warm amber palette; natural skin texture; tactile fabric and weathered wood; 16:9 landscape widescreen composition; subtle film grain; expressive realistic lighting. No written words, no logos, no watermark, no distorted hands, no duplicate people. Scene S05 — The Polite Hearing. OVER-SHOULDER shot, over the lead character's shoulder. Characters in frame: @KOSI_MENSAH (indigo utility jumpsuit with rolled sleeves, sand-coloured work boots and a narrow woven kente belt, small gold Adinkra-disc earrings); @NII_LAMPTEY (tailored charcoal caftan with a subtle black geometric weave, polished black shoes and a silver wristwatch, black ebony walking cane with a carved heron handle). Over Kosi's shoulder, Nii answers her question about why no map is displayed. Mood: civil language hiding violence. Lighting: stale fan-cooled daylight through louvre windows. Environment = Location Registry id 'DISTRICT_ASSEMBLY_HALL': A modest district assembly hall in Afenyo: cream concrete walls, tall louvre windows, stacked plastic chairs, a raised wood dais, ceiling fans and late-afternoon lagoon light.",</w:t>
         <w:br/>
-        <w:t xml:space="preserve">  "status": "⬜",</w:t>
+        <w:t xml:space="preserve">  "status": "✅",</w:t>
         <w:br/>
         <w:t xml:space="preserve">  "file": "images/act1/S05_Step06_kosi_challenges.png"</w:t>
         <w:br/>
@@ -4191,7 +4191,7 @@
         <w:br/>
         <w:t xml:space="preserve">  "prompt": "Grounded cinematic West African magical realism; contemporary Ghanaian coastal life; human-scale performances; saturated indigo, lagoon teal, clay red and warm amber palette; natural skin texture; tactile fabric and weathered wood; 16:9 landscape widescreen composition; subtle film grain; expressive realistic lighting. No written words, no logos, no watermark, no distorted hands, no duplicate people. Scene S05 — The Polite Hearing. EXTREME CLOSE shot, intimate frontal angle. Characters in frame: @SENA_ADJOVI (mustard oversized hoodie, blue-and-white printed ankle skirt and worn white canvas trainers, turquoise over-ear radio headphones). Sena silently presses record beneath turquoise headphones. Mood: civil language hiding violence. Lighting: stale fan-cooled daylight through louvre windows. Environment = Location Registry id 'DISTRICT_ASSEMBLY_HALL': A modest district assembly hall in Afenyo: cream concrete walls, tall louvre windows, stacked plastic chairs, a raised wood dais, ceiling fans and late-afternoon lagoon light.",</w:t>
         <w:br/>
-        <w:t xml:space="preserve">  "status": "⬜",</w:t>
+        <w:t xml:space="preserve">  "status": "✅",</w:t>
         <w:br/>
         <w:t xml:space="preserve">  "file": "images/act1/S05_Step07_sena_records.png"</w:t>
         <w:br/>
@@ -4254,7 +4254,7 @@
         <w:br/>
         <w:t xml:space="preserve">  "prompt": "Grounded cinematic West African magical realism; contemporary Ghanaian coastal life; human-scale performances; saturated indigo, lagoon teal, clay red and warm amber palette; natural skin texture; tactile fabric and weathered wood; 16:9 landscape widescreen composition; subtle film grain; expressive realistic lighting. No written words, no logos, no watermark, no distorted hands, no duplicate people. Scene S05 — The Polite Hearing. WIDE shot, low observational angle. Characters in frame: @KOSI_MENSAH (indigo utility jumpsuit with rolled sleeves, sand-coloured work boots and a narrow woven kente belt, small gold Adinkra-disc earrings); @ESI_TETTEH (brick-red wax-print dress beneath a soot-black oilskin apron, patterned headwrap and sturdy black sandals, smooth charred-wood smoking paddle); @KWAME_AGYEMAN (white linen shirt under a caramel lightweight field jacket, dark tailored trousers and brown loafers, antique bronze lapel pin shaped like a compass rose); @NII_LAMPTEY (tailored charcoal caftan with a subtle black geometric weave, polished black shoes and a silver wristwatch, black ebony walking cane with a carved heron handle). The public hall divides between concerned residents and officials at the dais. Mood: civil language hiding violence. Lighting: stale fan-cooled daylight through louvre windows. Environment = Location Registry id 'DISTRICT_ASSEMBLY_HALL': A modest district assembly hall in Afenyo: cream concrete walls, tall louvre windows, stacked plastic chairs, a raised wood dais, ceiling fans and late-afternoon lagoon light.",</w:t>
         <w:br/>
-        <w:t xml:space="preserve">  "status": "⬜",</w:t>
+        <w:t xml:space="preserve">  "status": "✅",</w:t>
         <w:br/>
         <w:t xml:space="preserve">  "file": "images/act1/S05_Step08_room_divides.png"</w:t>
         <w:br/>
@@ -4305,7 +4305,7 @@
         <w:br/>
         <w:t xml:space="preserve">  "prompt": "Grounded cinematic West African magical realism; contemporary Ghanaian coastal life; human-scale performances; saturated indigo, lagoon teal, clay red and warm amber palette; natural skin texture; tactile fabric and weathered wood; 16:9 landscape widescreen composition; subtle film grain; expressive realistic lighting. No written words, no logos, no watermark, no distorted hands, no duplicate people. Scene S05 — The Polite Hearing. MEDIUM shot, handheld eye-level. Characters in frame: @KWAME_AGYEMAN (white linen shirt under a caramel lightweight field jacket, dark tailored trousers and brown loafers, antique bronze lapel pin shaped like a compass rose). Kwame adjusts his bronze compass pin, visibly uneasy. Mood: civil language hiding violence. Lighting: stale fan-cooled daylight through louvre windows. Environment = Location Registry id 'DISTRICT_ASSEMBLY_HALL': A modest district assembly hall in Afenyo: cream concrete walls, tall louvre windows, stacked plastic chairs, a raised wood dais, ceiling fans and late-afternoon lagoon light.",</w:t>
         <w:br/>
-        <w:t xml:space="preserve">  "status": "⬜",</w:t>
+        <w:t xml:space="preserve">  "status": "✅",</w:t>
         <w:br/>
         <w:t xml:space="preserve">  "file": "images/act1/S05_Step09_kwame_discomfort.png"</w:t>
         <w:br/>
@@ -4364,7 +4364,7 @@
         <w:br/>
         <w:t xml:space="preserve">  "prompt": "Grounded cinematic West African magical realism; contemporary Ghanaian coastal life; human-scale performances; saturated indigo, lagoon teal, clay red and warm amber palette; natural skin texture; tactile fabric and weathered wood; 16:9 landscape widescreen composition; subtle film grain; expressive realistic lighting. No written words, no logos, no watermark, no distorted hands, no duplicate people. Scene S05 — The Polite Hearing. WIDE shot, rear closing tableau. Characters in frame: @KOSI_MENSAH (indigo utility jumpsuit with rolled sleeves, sand-coloured work boots and a narrow woven kente belt, small gold Adinkra-disc earrings); @SENA_ADJOVI (mustard oversized hoodie, blue-and-white printed ankle skirt and worn white canvas trainers, turquoise over-ear radio headphones); @ESI_TETTEH (brick-red wax-print dress beneath a soot-black oilskin apron, patterned headwrap and sturdy black sandals, smooth charred-wood smoking paddle). Kosi leaves with Sena and Esi as the polite hearing closes behind them. Mood: civil language hiding violence. Lighting: stale fan-cooled daylight through louvre windows. Environment = Location Registry id 'DISTRICT_ASSEMBLY_HALL': A modest district assembly hall in Afenyo: cream concrete walls, tall louvre windows, stacked plastic chairs, a raised wood dais, ceiling fans and late-afternoon lagoon light.",</w:t>
         <w:br/>
-        <w:t xml:space="preserve">  "status": "⬜",</w:t>
+        <w:t xml:space="preserve">  "status": "✅",</w:t>
         <w:br/>
         <w:t xml:space="preserve">  "file": "images/act1/S05_Step10_hearing_ends.png"</w:t>
         <w:br/>

</xml_diff>

<commit_message>
Complete River Remembers first act storyboard
Co-authored-by: arena-agent <297053741+arena-agent@users.noreply.github.com>
</commit_message>
<xml_diff>
--- a/the_river_remembers/MASTER_DOCUMENT.docx
+++ b/the_river_remembers/MASTER_DOCUMENT.docx
@@ -4423,7 +4423,7 @@
         <w:br/>
         <w:t xml:space="preserve">  "prompt": "Grounded cinematic West African magical realism; contemporary Ghanaian coastal life; human-scale performances; saturated indigo, lagoon teal, clay red and warm amber palette; natural skin texture; tactile fabric and weathered wood; 16:9 landscape widescreen composition; subtle film grain; expressive realistic lighting. No written words, no logos, no watermark, no distorted hands, no duplicate people. Scene S06 — The Black Buoy. WIDE shot, high establishing angle. Characters in frame: @KOJO_DANSO (faded forest-green canvas jacket over a blue-and-cream striped shirt, charcoal trousers and rubber deck boots, weathered brass compass on a cord). Kojo's narrow canoe glides into the violet channel toward the dark navigation buoy. Mood: intimate investigation. Lighting: violet dusk, reflected teal water and a dead lantern silhouette. Environment = Location Registry id 'LAGOON_CHANNEL': A narrow Afenyo lagoon channel: glassy teal water, low mangrove roots, weathered fishing canoes, stilted homes, a rusted solar navigation buoy and a wide pale sky.",</w:t>
         <w:br/>
-        <w:t xml:space="preserve">  "status": "⬜",</w:t>
+        <w:t xml:space="preserve">  "status": "✅",</w:t>
         <w:br/>
         <w:t xml:space="preserve">  "file": "images/act1/S06_Step01_channel_dusk.png"</w:t>
         <w:br/>
@@ -4474,7 +4474,7 @@
         <w:br/>
         <w:t xml:space="preserve">  "prompt": "Grounded cinematic West African magical realism; contemporary Ghanaian coastal life; human-scale performances; saturated indigo, lagoon teal, clay red and warm amber palette; natural skin texture; tactile fabric and weathered wood; 16:9 landscape widescreen composition; subtle film grain; expressive realistic lighting. No written words, no logos, no watermark, no distorted hands, no duplicate people. Scene S06 — The Black Buoy. MEDIUM shot, eye-level. Characters in frame: @KOJO_DANSO (faded forest-green canvas jacket over a blue-and-cream striped shirt, charcoal trousers and rubber deck boots, weathered brass compass on a cord). Kojo rows steadily, brass compass moving against his striped shirt. Mood: intimate investigation. Lighting: violet dusk, reflected teal water and a dead lantern silhouette. Environment = Location Registry id 'LAGOON_CHANNEL': A narrow Afenyo lagoon channel: glassy teal water, low mangrove roots, weathered fishing canoes, stilted homes, a rusted solar navigation buoy and a wide pale sky.",</w:t>
         <w:br/>
-        <w:t xml:space="preserve">  "status": "⬜",</w:t>
+        <w:t xml:space="preserve">  "status": "✅",</w:t>
         <w:br/>
         <w:t xml:space="preserve">  "file": "images/act1/S06_Step02_kojo_paddles.png"</w:t>
         <w:br/>
@@ -4525,7 +4525,7 @@
         <w:br/>
         <w:t xml:space="preserve">  "prompt": "Grounded cinematic West African magical realism; contemporary Ghanaian coastal life; human-scale performances; saturated indigo, lagoon teal, clay red and warm amber palette; natural skin texture; tactile fabric and weathered wood; 16:9 landscape widescreen composition; subtle film grain; expressive realistic lighting. No written words, no logos, no watermark, no distorted hands, no duplicate people. Scene S06 — The Black Buoy. CLOSE shot, three-quarter profile. Characters in frame: @KOSI_MENSAH (indigo utility jumpsuit with rolled sleeves, sand-coloured work boots and a narrow woven kente belt, small gold Adinkra-disc earrings). Kosi kneels in the canoe and tests the buoy's dead solar housing. Mood: intimate investigation. Lighting: violet dusk, reflected teal water and a dead lantern silhouette. Environment = Location Registry id 'LAGOON_CHANNEL': A narrow Afenyo lagoon channel: glassy teal water, low mangrove roots, weathered fishing canoes, stilted homes, a rusted solar navigation buoy and a wide pale sky.",</w:t>
         <w:br/>
-        <w:t xml:space="preserve">  "status": "⬜",</w:t>
+        <w:t xml:space="preserve">  "status": "✅",</w:t>
         <w:br/>
         <w:t xml:space="preserve">  "file": "images/act1/S06_Step03_kosi_tests.png"</w:t>
         <w:br/>
@@ -4576,7 +4576,7 @@
         <w:br/>
         <w:t xml:space="preserve">  "prompt": "Grounded cinematic West African magical realism; contemporary Ghanaian coastal life; human-scale performances; saturated indigo, lagoon teal, clay red and warm amber palette; natural skin texture; tactile fabric and weathered wood; 16:9 landscape widescreen composition; subtle film grain; expressive realistic lighting. No written words, no logos, no watermark, no distorted hands, no duplicate people. Scene S06 — The Black Buoy. INSERT shot, top-down detail. Characters in frame: @KOSI_MENSAH (indigo utility jumpsuit with rolled sleeves, sand-coloured work boots and a narrow woven kente belt, small gold Adinkra-disc earrings). A severed solar connection and newer buried cable meet beneath the buoy casing. Mood: intimate investigation. Lighting: violet dusk, reflected teal water and a dead lantern silhouette. Environment = Location Registry id 'LAGOON_CHANNEL': A narrow Afenyo lagoon channel: glassy teal water, low mangrove roots, weathered fishing canoes, stilted homes, a rusted solar navigation buoy and a wide pale sky.",</w:t>
         <w:br/>
-        <w:t xml:space="preserve">  "status": "⬜",</w:t>
+        <w:t xml:space="preserve">  "status": "✅",</w:t>
         <w:br/>
         <w:t xml:space="preserve">  "file": "images/act1/S06_Step04_bypassed_cable.png"</w:t>
         <w:br/>
@@ -4631,7 +4631,7 @@
         <w:br/>
         <w:t xml:space="preserve">  "prompt": "Grounded cinematic West African magical realism; contemporary Ghanaian coastal life; human-scale performances; saturated indigo, lagoon teal, clay red and warm amber palette; natural skin texture; tactile fabric and weathered wood; 16:9 landscape widescreen composition; subtle film grain; expressive realistic lighting. No written words, no logos, no watermark, no distorted hands, no duplicate people. Scene S06 — The Black Buoy. TWO-SHOT shot, eye-level. Characters in frame: @KOSI_MENSAH (indigo utility jumpsuit with rolled sleeves, sand-coloured work boots and a narrow woven kente belt, small gold Adinkra-disc earrings); @KOJO_DANSO (faded forest-green canvas jacket over a blue-and-cream striped shirt, charcoal trousers and rubber deck boots, weathered brass compass on a cord). Kosi and Kojo balance beside the rusted buoy as resort lights glow far away. Mood: intimate investigation. Lighting: violet dusk, reflected teal water and a dead lantern silhouette. Environment = Location Registry id 'LAGOON_CHANNEL': A narrow Afenyo lagoon channel: glassy teal water, low mangrove roots, weathered fishing canoes, stilted homes, a rusted solar navigation buoy and a wide pale sky.",</w:t>
         <w:br/>
-        <w:t xml:space="preserve">  "status": "⬜",</w:t>
+        <w:t xml:space="preserve">  "status": "✅",</w:t>
         <w:br/>
         <w:t xml:space="preserve">  "file": "images/act1/S06_Step05_two_at_buoy.png"</w:t>
         <w:br/>
@@ -4682,7 +4682,7 @@
         <w:br/>
         <w:t xml:space="preserve">  "prompt": "Grounded cinematic West African magical realism; contemporary Ghanaian coastal life; human-scale performances; saturated indigo, lagoon teal, clay red and warm amber palette; natural skin texture; tactile fabric and weathered wood; 16:9 landscape widescreen composition; subtle film grain; expressive realistic lighting. No written words, no logos, no watermark, no distorted hands, no duplicate people. Scene S06 — The Black Buoy. OVER-SHOULDER shot, over the lead character's shoulder. Characters in frame: @KOSI_MENSAH (indigo utility jumpsuit with rolled sleeves, sand-coloured work boots and a narrow woven kente belt, small gold Adinkra-disc earrings). Over Kosi's shoulder, a thin oily slick shivers across teal water. Mood: intimate investigation. Lighting: violet dusk, reflected teal water and a dead lantern silhouette. Environment = Location Registry id 'LAGOON_CHANNEL': A narrow Afenyo lagoon channel: glassy teal water, low mangrove roots, weathered fishing canoes, stilted homes, a rusted solar navigation buoy and a wide pale sky.",</w:t>
         <w:br/>
-        <w:t xml:space="preserve">  "status": "⬜",</w:t>
+        <w:t xml:space="preserve">  "status": "✅",</w:t>
         <w:br/>
         <w:t xml:space="preserve">  "file": "images/act1/S06_Step06_slick_in_water.png"</w:t>
         <w:br/>
@@ -4733,7 +4733,7 @@
         <w:br/>
         <w:t xml:space="preserve">  "prompt": "Grounded cinematic West African magical realism; contemporary Ghanaian coastal life; human-scale performances; saturated indigo, lagoon teal, clay red and warm amber palette; natural skin texture; tactile fabric and weathered wood; 16:9 landscape widescreen composition; subtle film grain; expressive realistic lighting. No written words, no logos, no watermark, no distorted hands, no duplicate people. Scene S06 — The Black Buoy. EXTREME CLOSE shot, intimate frontal angle. Characters in frame: @KOJO_DANSO (faded forest-green canvas jacket over a blue-and-cream striped shirt, charcoal trousers and rubber deck boots, weathered brass compass on a cord). Kojo speaks of the channel that has always carried the town outward. Mood: intimate investigation. Lighting: violet dusk, reflected teal water and a dead lantern silhouette. Environment = Location Registry id 'LAGOON_CHANNEL': A narrow Afenyo lagoon channel: glassy teal water, low mangrove roots, weathered fishing canoes, stilted homes, a rusted solar navigation buoy and a wide pale sky.",</w:t>
         <w:br/>
-        <w:t xml:space="preserve">  "status": "⬜",</w:t>
+        <w:t xml:space="preserve">  "status": "✅",</w:t>
         <w:br/>
         <w:t xml:space="preserve">  "file": "images/act1/S06_Step07_kojo_warning.png"</w:t>
         <w:br/>
@@ -4788,7 +4788,7 @@
         <w:br/>
         <w:t xml:space="preserve">  "prompt": "Grounded cinematic West African magical realism; contemporary Ghanaian coastal life; human-scale performances; saturated indigo, lagoon teal, clay red and warm amber palette; natural skin texture; tactile fabric and weathered wood; 16:9 landscape widescreen composition; subtle film grain; expressive realistic lighting. No written words, no logos, no watermark, no distorted hands, no duplicate people. Scene S06 — The Black Buoy. WIDE shot, low observational angle. Characters in frame: @KOSI_MENSAH (indigo utility jumpsuit with rolled sleeves, sand-coloured work boots and a narrow woven kente belt, small gold Adinkra-disc earrings); @KOJO_DANSO (faded forest-green canvas jacket over a blue-and-cream striped shirt, charcoal trousers and rubber deck boots, weathered brass compass on a cord). The unlit lantern crown silhouettes against the dusk sky. Mood: intimate investigation. Lighting: violet dusk, reflected teal water and a dead lantern silhouette. Environment = Location Registry id 'LAGOON_CHANNEL': A narrow Afenyo lagoon channel: glassy teal water, low mangrove roots, weathered fishing canoes, stilted homes, a rusted solar navigation buoy and a wide pale sky.",</w:t>
         <w:br/>
-        <w:t xml:space="preserve">  "status": "⬜",</w:t>
+        <w:t xml:space="preserve">  "status": "✅",</w:t>
         <w:br/>
         <w:t xml:space="preserve">  "file": "images/act1/S06_Step08_dead_lantern.png"</w:t>
         <w:br/>
@@ -4839,7 +4839,7 @@
         <w:br/>
         <w:t xml:space="preserve">  "prompt": "Grounded cinematic West African magical realism; contemporary Ghanaian coastal life; human-scale performances; saturated indigo, lagoon teal, clay red and warm amber palette; natural skin texture; tactile fabric and weathered wood; 16:9 landscape widescreen composition; subtle film grain; expressive realistic lighting. No written words, no logos, no watermark, no distorted hands, no duplicate people. Scene S06 — The Black Buoy. MEDIUM shot, handheld eye-level. Characters in frame: @KOSI_MENSAH (indigo utility jumpsuit with rolled sleeves, sand-coloured work boots and a narrow woven kente belt, small gold Adinkra-disc earrings). Kosi photographs the severed connection with steady hands. Mood: intimate investigation. Lighting: violet dusk, reflected teal water and a dead lantern silhouette. Environment = Location Registry id 'LAGOON_CHANNEL': A narrow Afenyo lagoon channel: glassy teal water, low mangrove roots, weathered fishing canoes, stilted homes, a rusted solar navigation buoy and a wide pale sky.",</w:t>
         <w:br/>
-        <w:t xml:space="preserve">  "status": "⬜",</w:t>
+        <w:t xml:space="preserve">  "status": "✅",</w:t>
         <w:br/>
         <w:t xml:space="preserve">  "file": "images/act1/S06_Step09_photo_evidence.png"</w:t>
         <w:br/>
@@ -4894,7 +4894,7 @@
         <w:br/>
         <w:t xml:space="preserve">  "prompt": "Grounded cinematic West African magical realism; contemporary Ghanaian coastal life; human-scale performances; saturated indigo, lagoon teal, clay red and warm amber palette; natural skin texture; tactile fabric and weathered wood; 16:9 landscape widescreen composition; subtle film grain; expressive realistic lighting. No written words, no logos, no watermark, no distorted hands, no duplicate people. Scene S06 — The Black Buoy. WIDE shot, rear closing tableau. Characters in frame: @KOSI_MENSAH (indigo utility jumpsuit with rolled sleeves, sand-coloured work boots and a narrow woven kente belt, small gold Adinkra-disc earrings); @KOJO_DANSO (faded forest-green canvas jacket over a blue-and-cream striped shirt, charcoal trousers and rubber deck boots, weathered brass compass on a cord). The canoe turns home as Kosi's decision settles over the dark water. Mood: intimate investigation. Lighting: violet dusk, reflected teal water and a dead lantern silhouette. Environment = Location Registry id 'LAGOON_CHANNEL': A narrow Afenyo lagoon channel: glassy teal water, low mangrove roots, weathered fishing canoes, stilted homes, a rusted solar navigation buoy and a wide pale sky.",</w:t>
         <w:br/>
-        <w:t xml:space="preserve">  "status": "⬜",</w:t>
+        <w:t xml:space="preserve">  "status": "✅",</w:t>
         <w:br/>
         <w:t xml:space="preserve">  "file": "images/act1/S06_Step10_returning_decision.png"</w:t>
         <w:br/>

</xml_diff>

<commit_message>
Generate first River Remembers second act batch
Co-authored-by: arena-agent <297053741+arena-agent@users.noreply.github.com>
</commit_message>
<xml_diff>
--- a/the_river_remembers/MASTER_DOCUMENT.docx
+++ b/the_river_remembers/MASTER_DOCUMENT.docx
@@ -4957,7 +4957,7 @@
         <w:br/>
         <w:t xml:space="preserve">  "prompt": "Grounded cinematic West African magical realism; contemporary Ghanaian coastal life; human-scale performances; saturated indigo, lagoon teal, clay red and warm amber palette; natural skin texture; tactile fabric and weathered wood; 16:9 landscape widescreen composition; subtle film grain; expressive realistic lighting. No written words, no logos, no watermark, no distorted hands, no duplicate people. Scene S07 — The Ledger in the Lantern. WIDE shot, high establishing angle. Characters in frame: @AMA_ADJOVI (deep navy kaba blouse, hand-dyed indigo wrapper with tiny white wave motifs and flat leather sandals, three-strand amber bead necklace); @KOSI_MENSAH (indigo utility jumpsuit with rolled sleeves, sand-coloured work boots and a narrow woven kente belt, small gold Adinkra-disc earrings). Ama's workshop glows with brass lanterns while Kosi opens a damaged frame. Mood: discovery and inheritance. Lighting: warm brass lantern light against deep blue night. Environment = Location Registry id 'AMA_LANTERN_WORKSHOP': Ama's lantern workshop off the compound courtyard: clay-red floor, crowded wooden workbench, brass lantern frames, blue glass panes, hand tools, coils of copper wire, indigo cloth and shafts of warm window light.",</w:t>
         <w:br/>
-        <w:t xml:space="preserve">  "status": "⬜",</w:t>
+        <w:t xml:space="preserve">  "status": "✅",</w:t>
         <w:br/>
         <w:t xml:space="preserve">  "file": "images/act2/S07_Step01_workshop_night.png"</w:t>
         <w:br/>
@@ -5008,7 +5008,7 @@
         <w:br/>
         <w:t xml:space="preserve">  "prompt": "Grounded cinematic West African magical realism; contemporary Ghanaian coastal life; human-scale performances; saturated indigo, lagoon teal, clay red and warm amber palette; natural skin texture; tactile fabric and weathered wood; 16:9 landscape widescreen composition; subtle film grain; expressive realistic lighting. No written words, no logos, no watermark, no distorted hands, no duplicate people. Scene S07 — The Ledger in the Lantern. MEDIUM shot, eye-level. Characters in frame: @KOSI_MENSAH (indigo utility jumpsuit with rolled sleeves, sand-coloured work boots and a narrow woven kente belt, small gold Adinkra-disc earrings). Kosi uses a small tool to reconnect a lantern wire at the workbench. Mood: discovery and inheritance. Lighting: warm brass lantern light against deep blue night. Environment = Location Registry id 'AMA_LANTERN_WORKSHOP': Ama's lantern workshop off the compound courtyard: clay-red floor, crowded wooden workbench, brass lantern frames, blue glass panes, hand tools, coils of copper wire, indigo cloth and shafts of warm window light.",</w:t>
         <w:br/>
-        <w:t xml:space="preserve">  "status": "⬜",</w:t>
+        <w:t xml:space="preserve">  "status": "✅",</w:t>
         <w:br/>
         <w:t xml:space="preserve">  "file": "images/act2/S07_Step02_kosi_repairs.png"</w:t>
         <w:br/>
@@ -5059,7 +5059,7 @@
         <w:br/>
         <w:t xml:space="preserve">  "prompt": "Grounded cinematic West African magical realism; contemporary Ghanaian coastal life; human-scale performances; saturated indigo, lagoon teal, clay red and warm amber palette; natural skin texture; tactile fabric and weathered wood; 16:9 landscape widescreen composition; subtle film grain; expressive realistic lighting. No written words, no logos, no watermark, no distorted hands, no duplicate people. Scene S07 — The Ledger in the Lantern. CLOSE shot, three-quarter profile. Characters in frame: @AMA_ADJOVI (deep navy kaba blouse, hand-dyed indigo wrapper with tiny white wave motifs and flat leather sandals, three-strand amber bead necklace). Ama watches Kosi work with pride and guarded concern. Mood: discovery and inheritance. Lighting: warm brass lantern light against deep blue night. Environment = Location Registry id 'AMA_LANTERN_WORKSHOP': Ama's lantern workshop off the compound courtyard: clay-red floor, crowded wooden workbench, brass lantern frames, blue glass panes, hand tools, coils of copper wire, indigo cloth and shafts of warm window light.",</w:t>
         <w:br/>
-        <w:t xml:space="preserve">  "status": "⬜",</w:t>
+        <w:t xml:space="preserve">  "status": "✅",</w:t>
         <w:br/>
         <w:t xml:space="preserve">  "file": "images/act2/S07_Step03_ama_watches.png"</w:t>
         <w:br/>
@@ -5110,7 +5110,7 @@
         <w:br/>
         <w:t xml:space="preserve">  "prompt": "Grounded cinematic West African magical realism; contemporary Ghanaian coastal life; human-scale performances; saturated indigo, lagoon teal, clay red and warm amber palette; natural skin texture; tactile fabric and weathered wood; 16:9 landscape widescreen composition; subtle film grain; expressive realistic lighting. No written words, no logos, no watermark, no distorted hands, no duplicate people. Scene S07 — The Ledger in the Lantern. INSERT shot, top-down detail. Characters in frame: @KOSI_MENSAH (indigo utility jumpsuit with rolled sleeves, sand-coloured work boots and a narrow woven kente belt, small gold Adinkra-disc earrings). A rolled water-stained ledger page slides from behind a loose blue glass pane. Mood: discovery and inheritance. Lighting: warm brass lantern light against deep blue night. Environment = Location Registry id 'AMA_LANTERN_WORKSHOP': Ama's lantern workshop off the compound courtyard: clay-red floor, crowded wooden workbench, brass lantern frames, blue glass panes, hand tools, coils of copper wire, indigo cloth and shafts of warm window light.",</w:t>
         <w:br/>
-        <w:t xml:space="preserve">  "status": "⬜",</w:t>
+        <w:t xml:space="preserve">  "status": "✅",</w:t>
         <w:br/>
         <w:t xml:space="preserve">  "file": "images/act2/S07_Step04_hidden_page.png"</w:t>
         <w:br/>
@@ -5161,7 +5161,7 @@
         <w:br/>
         <w:t xml:space="preserve">  "prompt": "Grounded cinematic West African magical realism; contemporary Ghanaian coastal life; human-scale performances; saturated indigo, lagoon teal, clay red and warm amber palette; natural skin texture; tactile fabric and weathered wood; 16:9 landscape widescreen composition; subtle film grain; expressive realistic lighting. No written words, no logos, no watermark, no distorted hands, no duplicate people. Scene S07 — The Ledger in the Lantern. TWO-SHOT shot, eye-level. Characters in frame: @SENA_ADJOVI (mustard oversized hoodie, blue-and-white printed ankle skirt and worn white canvas trainers, turquoise over-ear radio headphones). Sena recognizes a repeating code in the page's hand-drawn wave marks. Mood: discovery and inheritance. Lighting: warm brass lantern light against deep blue night. Environment = Location Registry id 'AMA_LANTERN_WORKSHOP': Ama's lantern workshop off the compound courtyard: clay-red floor, crowded wooden workbench, brass lantern frames, blue glass panes, hand tools, coils of copper wire, indigo cloth and shafts of warm window light.",</w:t>
         <w:br/>
-        <w:t xml:space="preserve">  "status": "⬜",</w:t>
+        <w:t xml:space="preserve">  "status": "✅",</w:t>
         <w:br/>
         <w:t xml:space="preserve">  "file": "images/act2/S07_Step05_sena_decodes.png"</w:t>
         <w:br/>
@@ -5216,7 +5216,7 @@
         <w:br/>
         <w:t xml:space="preserve">  "prompt": "Grounded cinematic West African magical realism; contemporary Ghanaian coastal life; human-scale performances; saturated indigo, lagoon teal, clay red and warm amber palette; natural skin texture; tactile fabric and weathered wood; 16:9 landscape widescreen composition; subtle film grain; expressive realistic lighting. No written words, no logos, no watermark, no distorted hands, no duplicate people. Scene S07 — The Ledger in the Lantern. OVER-SHOULDER shot, over the lead character's shoulder. Characters in frame: @KOSI_MENSAH (indigo utility jumpsuit with rolled sleeves, sand-coloured work boots and a narrow woven kente belt, small gold Adinkra-disc earrings); @AMA_ADJOVI (deep navy kaba blouse, hand-dyed indigo wrapper with tiny white wave motifs and flat leather sandals, three-strand amber bead necklace). Over Kosi's shoulder, Ama closes Kosi's hand around the recovered page. Mood: discovery and inheritance. Lighting: warm brass lantern light against deep blue night. Environment = Location Registry id 'AMA_LANTERN_WORKSHOP': Ama's lantern workshop off the compound courtyard: clay-red floor, crowded wooden workbench, brass lantern frames, blue glass panes, hand tools, coils of copper wire, indigo cloth and shafts of warm window light.",</w:t>
         <w:br/>
-        <w:t xml:space="preserve">  "status": "⬜",</w:t>
+        <w:t xml:space="preserve">  "status": "✅",</w:t>
         <w:br/>
         <w:t xml:space="preserve">  "file": "images/act2/S07_Step06_legacy_handoff.png"</w:t>
         <w:br/>
@@ -5267,7 +5267,7 @@
         <w:br/>
         <w:t xml:space="preserve">  "prompt": "Grounded cinematic West African magical realism; contemporary Ghanaian coastal life; human-scale performances; saturated indigo, lagoon teal, clay red and warm amber palette; natural skin texture; tactile fabric and weathered wood; 16:9 landscape widescreen composition; subtle film grain; expressive realistic lighting. No written words, no logos, no watermark, no distorted hands, no duplicate people. Scene S07 — The Ledger in the Lantern. EXTREME CLOSE shot, intimate frontal angle. Characters in frame: @AMA_ADJOVI (deep navy kaba blouse, hand-dyed indigo wrapper with tiny white wave motifs and flat leather sandals, three-strand amber bead necklace). Ama explains that elders hid papers inside what kept people safe. Mood: discovery and inheritance. Lighting: warm brass lantern light against deep blue night. Environment = Location Registry id 'AMA_LANTERN_WORKSHOP': Ama's lantern workshop off the compound courtyard: clay-red floor, crowded wooden workbench, brass lantern frames, blue glass panes, hand tools, coils of copper wire, indigo cloth and shafts of warm window light.",</w:t>
         <w:br/>
-        <w:t xml:space="preserve">  "status": "⬜",</w:t>
+        <w:t xml:space="preserve">  "status": "✅",</w:t>
         <w:br/>
         <w:t xml:space="preserve">  "file": "images/act2/S07_Step07_ama_memory.png"</w:t>
         <w:br/>
@@ -5326,7 +5326,7 @@
         <w:br/>
         <w:t xml:space="preserve">  "prompt": "Grounded cinematic West African magical realism; contemporary Ghanaian coastal life; human-scale performances; saturated indigo, lagoon teal, clay red and warm amber palette; natural skin texture; tactile fabric and weathered wood; 16:9 landscape widescreen composition; subtle film grain; expressive realistic lighting. No written words, no logos, no watermark, no distorted hands, no duplicate people. Scene S07 — The Ledger in the Lantern. WIDE shot, low observational angle. Characters in frame: @KOSI_MENSAH (indigo utility jumpsuit with rolled sleeves, sand-coloured work boots and a narrow woven kente belt, small gold Adinkra-disc earrings); @AMA_ADJOVI (deep navy kaba blouse, hand-dyed indigo wrapper with tiny white wave motifs and flat leather sandals, three-strand amber bead necklace); @SENA_ADJOVI (mustard oversized hoodie, blue-and-white printed ankle skirt and worn white canvas trainers, turquoise over-ear radio headphones). Three generations stand among crowded lantern frames and copper wire. Mood: discovery and inheritance. Lighting: warm brass lantern light against deep blue night. Environment = Location Registry id 'AMA_LANTERN_WORKSHOP': Ama's lantern workshop off the compound courtyard: clay-red floor, crowded wooden workbench, brass lantern frames, blue glass panes, hand tools, coils of copper wire, indigo cloth and shafts of warm window light.",</w:t>
         <w:br/>
-        <w:t xml:space="preserve">  "status": "⬜",</w:t>
+        <w:t xml:space="preserve">  "status": "✅",</w:t>
         <w:br/>
         <w:t xml:space="preserve">  "file": "images/act2/S07_Step08_lanterns_crowd.png"</w:t>
         <w:br/>
@@ -5381,7 +5381,7 @@
         <w:br/>
         <w:t xml:space="preserve">  "prompt": "Grounded cinematic West African magical realism; contemporary Ghanaian coastal life; human-scale performances; saturated indigo, lagoon teal, clay red and warm amber palette; natural skin texture; tactile fabric and weathered wood; 16:9 landscape widescreen composition; subtle film grain; expressive realistic lighting. No written words, no logos, no watermark, no distorted hands, no duplicate people. Scene S07 — The Ledger in the Lantern. MEDIUM shot, handheld eye-level. Characters in frame: @SENA_ADJOVI (mustard oversized hoodie, blue-and-white printed ankle skirt and worn white canvas trainers, turquoise over-ear radio headphones); @KOSI_MENSAH (indigo utility jumpsuit with rolled sleeves, sand-coloured work boots and a narrow woven kente belt, small gold Adinkra-disc earrings). Sena points from the coded waves to an old radio frequency in the ledger. Mood: discovery and inheritance. Lighting: warm brass lantern light against deep blue night. Environment = Location Registry id 'AMA_LANTERN_WORKSHOP': Ama's lantern workshop off the compound courtyard: clay-red floor, crowded wooden workbench, brass lantern frames, blue glass panes, hand tools, coils of copper wire, indigo cloth and shafts of warm window light.",</w:t>
         <w:br/>
-        <w:t xml:space="preserve">  "status": "⬜",</w:t>
+        <w:t xml:space="preserve">  "status": "✅",</w:t>
         <w:br/>
         <w:t xml:space="preserve">  "file": "images/act2/S07_Step09_frequency_found.png"</w:t>
         <w:br/>
@@ -5440,7 +5440,7 @@
         <w:br/>
         <w:t xml:space="preserve">  "prompt": "Grounded cinematic West African magical realism; contemporary Ghanaian coastal life; human-scale performances; saturated indigo, lagoon teal, clay red and warm amber palette; natural skin texture; tactile fabric and weathered wood; 16:9 landscape widescreen composition; subtle film grain; expressive realistic lighting. No written words, no logos, no watermark, no distorted hands, no duplicate people. Scene S07 — The Ledger in the Lantern. WIDE shot, rear closing tableau. Characters in frame: @KOSI_MENSAH (indigo utility jumpsuit with rolled sleeves, sand-coloured work boots and a narrow woven kente belt, small gold Adinkra-disc earrings); @AMA_ADJOVI (deep navy kaba blouse, hand-dyed indigo wrapper with tiny white wave motifs and flat leather sandals, three-strand amber bead necklace); @SENA_ADJOVI (mustard oversized hoodie, blue-and-white printed ankle skirt and worn white canvas trainers, turquoise over-ear radio headphones). The group makes a quiet pact beneath warm lantern light. Mood: discovery and inheritance. Lighting: warm brass lantern light against deep blue night. Environment = Location Registry id 'AMA_LANTERN_WORKSHOP': Ama's lantern workshop off the compound courtyard: clay-red floor, crowded wooden workbench, brass lantern frames, blue glass panes, hand tools, coils of copper wire, indigo cloth and shafts of warm window light.",</w:t>
         <w:br/>
-        <w:t xml:space="preserve">  "status": "⬜",</w:t>
+        <w:t xml:space="preserve">  "status": "✅",</w:t>
         <w:br/>
         <w:t xml:space="preserve">  "file": "images/act2/S07_Step10_workshop_pact.png"</w:t>
         <w:br/>

</xml_diff>

<commit_message>
Generate River Remembers radio shack batch
Co-authored-by: arena-agent <297053741+arena-agent@users.noreply.github.com>
</commit_message>
<xml_diff>
--- a/the_river_remembers/MASTER_DOCUMENT.docx
+++ b/the_river_remembers/MASTER_DOCUMENT.docx
@@ -5499,7 +5499,7 @@
         <w:br/>
         <w:t xml:space="preserve">  "prompt": "Grounded cinematic West African magical realism; contemporary Ghanaian coastal life; human-scale performances; saturated indigo, lagoon teal, clay red and warm amber palette; natural skin texture; tactile fabric and weathered wood; 16:9 landscape widescreen composition; subtle film grain; expressive realistic lighting. No written words, no logos, no watermark, no distorted hands, no duplicate people. Scene S08 — Open Frequency. WIDE shot, high establishing angle. Characters in frame: @SENA_ADJOVI (mustard oversized hoodie, blue-and-white printed ankle skirt and worn white canvas trainers, turquoise over-ear radio headphones). Sena unlocks the tiny radio shack while morning brightens the market outside. Mood: improvised courage. Lighting: clean morning sun and small red recording lights. Environment = Location Registry id 'SENA_RADIO_SHACK': Sena's tiny community-radio shack beside the market: a patched corrugated roof, foam-lined timber walls, a second-hand mixing board, a battered microphone, tangled cables, a solar battery and one open window to the lagoon.",</w:t>
         <w:br/>
-        <w:t xml:space="preserve">  "status": "⬜",</w:t>
+        <w:t xml:space="preserve">  "status": "✅",</w:t>
         <w:br/>
         <w:t xml:space="preserve">  "file": "images/act2/S08_Step01_radio_shack_morning.png"</w:t>
         <w:br/>
@@ -5550,7 +5550,7 @@
         <w:br/>
         <w:t xml:space="preserve">  "prompt": "Grounded cinematic West African magical realism; contemporary Ghanaian coastal life; human-scale performances; saturated indigo, lagoon teal, clay red and warm amber palette; natural skin texture; tactile fabric and weathered wood; 16:9 landscape widescreen composition; subtle film grain; expressive realistic lighting. No written words, no logos, no watermark, no distorted hands, no duplicate people. Scene S08 — Open Frequency. MEDIUM shot, eye-level. Characters in frame: @KOSI_MENSAH (indigo utility jumpsuit with rolled sleeves, sand-coloured work boots and a narrow woven kente belt, small gold Adinkra-disc earrings). Kosi connects a temporary solar battery to the old mixing board. Mood: improvised courage. Lighting: clean morning sun and small red recording lights. Environment = Location Registry id 'SENA_RADIO_SHACK': Sena's tiny community-radio shack beside the market: a patched corrugated roof, foam-lined timber walls, a second-hand mixing board, a battered microphone, tangled cables, a solar battery and one open window to the lagoon.",</w:t>
         <w:br/>
-        <w:t xml:space="preserve">  "status": "⬜",</w:t>
+        <w:t xml:space="preserve">  "status": "✅",</w:t>
         <w:br/>
         <w:t xml:space="preserve">  "file": "images/act2/S08_Step02_battery_connection.png"</w:t>
         <w:br/>
@@ -5601,7 +5601,7 @@
         <w:br/>
         <w:t xml:space="preserve">  "prompt": "Grounded cinematic West African magical realism; contemporary Ghanaian coastal life; human-scale performances; saturated indigo, lagoon teal, clay red and warm amber palette; natural skin texture; tactile fabric and weathered wood; 16:9 landscape widescreen composition; subtle film grain; expressive realistic lighting. No written words, no logos, no watermark, no distorted hands, no duplicate people. Scene S08 — Open Frequency. CLOSE shot, three-quarter profile. Characters in frame: @SENA_ADJOVI (mustard oversized hoodie, blue-and-white printed ankle skirt and worn white canvas trainers, turquoise over-ear radio headphones). Sena leans into the battered microphone for the station's first clear broadcast. Mood: improvised courage. Lighting: clean morning sun and small red recording lights. Environment = Location Registry id 'SENA_RADIO_SHACK': Sena's tiny community-radio shack beside the market: a patched corrugated roof, foam-lined timber walls, a second-hand mixing board, a battered microphone, tangled cables, a solar battery and one open window to the lagoon.",</w:t>
         <w:br/>
-        <w:t xml:space="preserve">  "status": "⬜",</w:t>
+        <w:t xml:space="preserve">  "status": "✅",</w:t>
         <w:br/>
         <w:t xml:space="preserve">  "file": "images/act2/S08_Step03_sena_on_air.png"</w:t>
         <w:br/>
@@ -5652,7 +5652,7 @@
         <w:br/>
         <w:t xml:space="preserve">  "prompt": "Grounded cinematic West African magical realism; contemporary Ghanaian coastal life; human-scale performances; saturated indigo, lagoon teal, clay red and warm amber palette; natural skin texture; tactile fabric and weathered wood; 16:9 landscape widescreen composition; subtle film grain; expressive realistic lighting. No written words, no logos, no watermark, no distorted hands, no duplicate people. Scene S08 — Open Frequency. INSERT shot, top-down detail. Characters in frame: @SENA_ADJOVI (mustard oversized hoodie, blue-and-white printed ankle skirt and worn white canvas trainers, turquoise over-ear radio headphones). Tiny red recording lights and moving level meters glow on the mixing board. Mood: improvised courage. Lighting: clean morning sun and small red recording lights. Environment = Location Registry id 'SENA_RADIO_SHACK': Sena's tiny community-radio shack beside the market: a patched corrugated roof, foam-lined timber walls, a second-hand mixing board, a battered microphone, tangled cables, a solar battery and one open window to the lagoon.",</w:t>
         <w:br/>
-        <w:t xml:space="preserve">  "status": "⬜",</w:t>
+        <w:t xml:space="preserve">  "status": "✅",</w:t>
         <w:br/>
         <w:t xml:space="preserve">  "file": "images/act2/S08_Step04_level_meters.png"</w:t>
         <w:br/>
@@ -5707,7 +5707,7 @@
         <w:br/>
         <w:t xml:space="preserve">  "prompt": "Grounded cinematic West African magical realism; contemporary Ghanaian coastal life; human-scale performances; saturated indigo, lagoon teal, clay red and warm amber palette; natural skin texture; tactile fabric and weathered wood; 16:9 landscape widescreen composition; subtle film grain; expressive realistic lighting. No written words, no logos, no watermark, no distorted hands, no duplicate people. Scene S08 — Open Frequency. TWO-SHOT shot, eye-level. Characters in frame: @ESI_TETTEH (brick-red wax-print dress beneath a soot-black oilskin apron, patterned headwrap and sturdy black sandals, smooth charred-wood smoking paddle); @SENA_ADJOVI (mustard oversized hoodie, blue-and-white printed ankle skirt and worn white canvas trainers, turquoise over-ear radio headphones). Esi gives a fierce testimony into the microphone as Sena listens. Mood: improvised courage. Lighting: clean morning sun and small red recording lights. Environment = Location Registry id 'SENA_RADIO_SHACK': Sena's tiny community-radio shack beside the market: a patched corrugated roof, foam-lined timber walls, a second-hand mixing board, a battered microphone, tangled cables, a solar battery and one open window to the lagoon.",</w:t>
         <w:br/>
-        <w:t xml:space="preserve">  "status": "⬜",</w:t>
+        <w:t xml:space="preserve">  "status": "✅",</w:t>
         <w:br/>
         <w:t xml:space="preserve">  "file": "images/act2/S08_Step05_esi_testimony.png"</w:t>
         <w:br/>
@@ -5762,7 +5762,7 @@
         <w:br/>
         <w:t xml:space="preserve">  "prompt": "Grounded cinematic West African magical realism; contemporary Ghanaian coastal life; human-scale performances; saturated indigo, lagoon teal, clay red and warm amber palette; natural skin texture; tactile fabric and weathered wood; 16:9 landscape widescreen composition; subtle film grain; expressive realistic lighting. No written words, no logos, no watermark, no distorted hands, no duplicate people. Scene S08 — Open Frequency. OVER-SHOULDER shot, over the lead character's shoulder. Characters in frame: @KOSI_MENSAH (indigo utility jumpsuit with rolled sleeves, sand-coloured work boots and a narrow woven kente belt, small gold Adinkra-disc earrings); @SENA_ADJOVI (mustard oversized hoodie, blue-and-white printed ankle skirt and worn white canvas trainers, turquoise over-ear radio headphones). Over Sena's shoulder, Kosi urges caution until they have proof. Mood: improvised courage. Lighting: clean morning sun and small red recording lights. Environment = Location Registry id 'SENA_RADIO_SHACK': Sena's tiny community-radio shack beside the market: a patched corrugated roof, foam-lined timber walls, a second-hand mixing board, a battered microphone, tangled cables, a solar battery and one open window to the lagoon.",</w:t>
         <w:br/>
-        <w:t xml:space="preserve">  "status": "⬜",</w:t>
+        <w:t xml:space="preserve">  "status": "✅",</w:t>
         <w:br/>
         <w:t xml:space="preserve">  "file": "images/act2/S08_Step06_kosi_caution.png"</w:t>
         <w:br/>
@@ -5813,7 +5813,7 @@
         <w:br/>
         <w:t xml:space="preserve">  "prompt": "Grounded cinematic West African magical realism; contemporary Ghanaian coastal life; human-scale performances; saturated indigo, lagoon teal, clay red and warm amber palette; natural skin texture; tactile fabric and weathered wood; 16:9 landscape widescreen composition; subtle film grain; expressive realistic lighting. No written words, no logos, no watermark, no distorted hands, no duplicate people. Scene S08 — Open Frequency. EXTREME CLOSE shot, intimate frontal angle. Characters in frame: @SENA_ADJOVI (mustard oversized hoodie, blue-and-white printed ankle skirt and worn white canvas trainers, turquoise over-ear radio headphones). Sena answers that fear itself has a voice that deserves air. Mood: improvised courage. Lighting: clean morning sun and small red recording lights. Environment = Location Registry id 'SENA_RADIO_SHACK': Sena's tiny community-radio shack beside the market: a patched corrugated roof, foam-lined timber walls, a second-hand mixing board, a battered microphone, tangled cables, a solar battery and one open window to the lagoon.",</w:t>
         <w:br/>
-        <w:t xml:space="preserve">  "status": "⬜",</w:t>
+        <w:t xml:space="preserve">  "status": "✅",</w:t>
         <w:br/>
         <w:t xml:space="preserve">  "file": "images/act2/S08_Step07_sena_counter.png"</w:t>
         <w:br/>
@@ -5872,7 +5872,7 @@
         <w:br/>
         <w:t xml:space="preserve">  "prompt": "Grounded cinematic West African magical realism; contemporary Ghanaian coastal life; human-scale performances; saturated indigo, lagoon teal, clay red and warm amber palette; natural skin texture; tactile fabric and weathered wood; 16:9 landscape widescreen composition; subtle film grain; expressive realistic lighting. No written words, no logos, no watermark, no distorted hands, no duplicate people. Scene S08 — Open Frequency. WIDE shot, low observational angle. Characters in frame: @SENA_ADJOVI (mustard oversized hoodie, blue-and-white printed ankle skirt and worn white canvas trainers, turquoise over-ear radio headphones); @KOSI_MENSAH (indigo utility jumpsuit with rolled sleeves, sand-coloured work boots and a narrow woven kente belt, small gold Adinkra-disc earrings); @ESI_TETTEH (brick-red wax-print dress beneath a soot-black oilskin apron, patterned headwrap and sturdy black sandals, smooth charred-wood smoking paddle). The cramped shack fills with ringing phones and a growing sense of listeners. Mood: improvised courage. Lighting: clean morning sun and small red recording lights. Environment = Location Registry id 'SENA_RADIO_SHACK': Sena's tiny community-radio shack beside the market: a patched corrugated roof, foam-lined timber walls, a second-hand mixing board, a battered microphone, tangled cables, a solar battery and one open window to the lagoon.",</w:t>
         <w:br/>
-        <w:t xml:space="preserve">  "status": "⬜",</w:t>
+        <w:t xml:space="preserve">  "status": "✅",</w:t>
         <w:br/>
         <w:t xml:space="preserve">  "file": "images/act2/S08_Step08_calls_arrive.png"</w:t>
         <w:br/>
@@ -5927,7 +5927,7 @@
         <w:br/>
         <w:t xml:space="preserve">  "prompt": "Grounded cinematic West African magical realism; contemporary Ghanaian coastal life; human-scale performances; saturated indigo, lagoon teal, clay red and warm amber palette; natural skin texture; tactile fabric and weathered wood; 16:9 landscape widescreen composition; subtle film grain; expressive realistic lighting. No written words, no logos, no watermark, no distorted hands, no duplicate people. Scene S08 — Open Frequency. MEDIUM shot, handheld eye-level. Characters in frame: @KOSI_MENSAH (indigo utility jumpsuit with rolled sleeves, sand-coloured work boots and a narrow woven kente belt, small gold Adinkra-disc earrings); @SENA_ADJOVI (mustard oversized hoodie, blue-and-white printed ankle skirt and worn white canvas trainers, turquoise over-ear radio headphones). Sena places the microphone between herself and Kosi. Mood: improvised courage. Lighting: clean morning sun and small red recording lights. Environment = Location Registry id 'SENA_RADIO_SHACK': Sena's tiny community-radio shack beside the market: a patched corrugated roof, foam-lined timber walls, a second-hand mixing board, a battered microphone, tangled cables, a solar battery and one open window to the lagoon.",</w:t>
         <w:br/>
-        <w:t xml:space="preserve">  "status": "⬜",</w:t>
+        <w:t xml:space="preserve">  "status": "✅",</w:t>
         <w:br/>
         <w:t xml:space="preserve">  "file": "images/act2/S08_Step09_shared_microphone.png"</w:t>
         <w:br/>
@@ -5978,7 +5978,7 @@
         <w:br/>
         <w:t xml:space="preserve">  "prompt": "Grounded cinematic West African magical realism; contemporary Ghanaian coastal life; human-scale performances; saturated indigo, lagoon teal, clay red and warm amber palette; natural skin texture; tactile fabric and weathered wood; 16:9 landscape widescreen composition; subtle film grain; expressive realistic lighting. No written words, no logos, no watermark, no distorted hands, no duplicate people. Scene S08 — Open Frequency. WIDE shot, rear closing tableau. Characters in frame: @SENA_ADJOVI (mustard oversized hoodie, blue-and-white printed ankle skirt and worn white canvas trainers, turquoise over-ear radio headphones). The radio antenna points through the open window toward bright lagoon water. Mood: improvised courage. Lighting: clean morning sun and small red recording lights. Environment = Location Registry id 'SENA_RADIO_SHACK': Sena's tiny community-radio shack beside the market: a patched corrugated roof, foam-lined timber walls, a second-hand mixing board, a battered microphone, tangled cables, a solar battery and one open window to the lagoon.",</w:t>
         <w:br/>
-        <w:t xml:space="preserve">  "status": "⬜",</w:t>
+        <w:t xml:space="preserve">  "status": "✅",</w:t>
         <w:br/>
         <w:t xml:space="preserve">  "file": "images/act2/S08_Step10_signal_to_lagoon.png"</w:t>
         <w:br/>

</xml_diff>

<commit_message>
Generate River Remembers resort fence batch
Co-authored-by: arena-agent <297053741+arena-agent@users.noreply.github.com>
</commit_message>
<xml_diff>
--- a/the_river_remembers/MASTER_DOCUMENT.docx
+++ b/the_river_remembers/MASTER_DOCUMENT.docx
@@ -6037,7 +6037,7 @@
         <w:br/>
         <w:t xml:space="preserve">  "prompt": "Grounded cinematic West African magical realism; contemporary Ghanaian coastal life; human-scale performances; saturated indigo, lagoon teal, clay red and warm amber palette; natural skin texture; tactile fabric and weathered wood; 16:9 landscape widescreen composition; subtle film grain; expressive realistic lighting. No written words, no logos, no watermark, no distorted hands, no duplicate people. Scene S09 — Map with a Missing Line. WIDE shot, high establishing angle. Characters in frame: @KWAME_AGYEMAN (white linen shirt under a caramel lightweight field jacket, dark tailored trousers and brown loafers, antique bronze lapel pin shaped like a compass rose). Kwame waits alone at the chained resort gate in punishing afternoon heat. Mood: charged old friendship. Lighting: bleached afternoon heat and hard fence shadows. Environment = Location Registry id 'RESORT_FENCE': The unfinished resort perimeter at Afenyo's lagoon shore: pale concrete columns, tall corrugated-metal fence panels, orange survey flags, a locked chain gate, scraped sand and mangroves pressed tightly behind it.",</w:t>
         <w:br/>
-        <w:t xml:space="preserve">  "status": "⬜",</w:t>
+        <w:t xml:space="preserve">  "status": "✅",</w:t>
         <w:br/>
         <w:t xml:space="preserve">  "file": "images/act2/S09_Step01_fence_heat.png"</w:t>
         <w:br/>
@@ -6088,7 +6088,7 @@
         <w:br/>
         <w:t xml:space="preserve">  "prompt": "Grounded cinematic West African magical realism; contemporary Ghanaian coastal life; human-scale performances; saturated indigo, lagoon teal, clay red and warm amber palette; natural skin texture; tactile fabric and weathered wood; 16:9 landscape widescreen composition; subtle film grain; expressive realistic lighting. No written words, no logos, no watermark, no distorted hands, no duplicate people. Scene S09 — Map with a Missing Line. MEDIUM shot, eye-level. Characters in frame: @KOSI_MENSAH (indigo utility jumpsuit with rolled sleeves, sand-coloured work boots and a narrow woven kente belt, small gold Adinkra-disc earrings). Kosi approaches the fence with her tool case and an unblinking stare. Mood: charged old friendship. Lighting: bleached afternoon heat and hard fence shadows. Environment = Location Registry id 'RESORT_FENCE': The unfinished resort perimeter at Afenyo's lagoon shore: pale concrete columns, tall corrugated-metal fence panels, orange survey flags, a locked chain gate, scraped sand and mangroves pressed tightly behind it.",</w:t>
         <w:br/>
-        <w:t xml:space="preserve">  "status": "⬜",</w:t>
+        <w:t xml:space="preserve">  "status": "✅",</w:t>
         <w:br/>
         <w:t xml:space="preserve">  "file": "images/act2/S09_Step02_kosi_arrives.png"</w:t>
         <w:br/>
@@ -6139,7 +6139,7 @@
         <w:br/>
         <w:t xml:space="preserve">  "prompt": "Grounded cinematic West African magical realism; contemporary Ghanaian coastal life; human-scale performances; saturated indigo, lagoon teal, clay red and warm amber palette; natural skin texture; tactile fabric and weathered wood; 16:9 landscape widescreen composition; subtle film grain; expressive realistic lighting. No written words, no logos, no watermark, no distorted hands, no duplicate people. Scene S09 — Map with a Missing Line. CLOSE shot, three-quarter profile. Characters in frame: @KWAME_AGYEMAN (white linen shirt under a caramel lightweight field jacket, dark tailored trousers and brown loafers, antique bronze lapel pin shaped like a compass rose). Kwame unfolds an approved site plan against a corrugated fence panel. Mood: charged old friendship. Lighting: bleached afternoon heat and hard fence shadows. Environment = Location Registry id 'RESORT_FENCE': The unfinished resort perimeter at Afenyo's lagoon shore: pale concrete columns, tall corrugated-metal fence panels, orange survey flags, a locked chain gate, scraped sand and mangroves pressed tightly behind it.",</w:t>
         <w:br/>
-        <w:t xml:space="preserve">  "status": "⬜",</w:t>
+        <w:t xml:space="preserve">  "status": "✅",</w:t>
         <w:br/>
         <w:t xml:space="preserve">  "file": "images/act2/S09_Step03_kwame_plan.png"</w:t>
         <w:br/>
@@ -6190,7 +6190,7 @@
         <w:br/>
         <w:t xml:space="preserve">  "prompt": "Grounded cinematic West African magical realism; contemporary Ghanaian coastal life; human-scale performances; saturated indigo, lagoon teal, clay red and warm amber palette; natural skin texture; tactile fabric and weathered wood; 16:9 landscape widescreen composition; subtle film grain; expressive realistic lighting. No written words, no logos, no watermark, no distorted hands, no duplicate people. Scene S09 — Map with a Missing Line. INSERT shot, top-down detail. Characters in frame: @KWAME_AGYEMAN (white linen shirt under a caramel lightweight field jacket, dark tailored trousers and brown loafers, antique bronze lapel pin shaped like a compass rose). A utility route disappears under a stark black redaction on the plan. Mood: charged old friendship. Lighting: bleached afternoon heat and hard fence shadows. Environment = Location Registry id 'RESORT_FENCE': The unfinished resort perimeter at Afenyo's lagoon shore: pale concrete columns, tall corrugated-metal fence panels, orange survey flags, a locked chain gate, scraped sand and mangroves pressed tightly behind it.",</w:t>
         <w:br/>
-        <w:t xml:space="preserve">  "status": "⬜",</w:t>
+        <w:t xml:space="preserve">  "status": "✅",</w:t>
         <w:br/>
         <w:t xml:space="preserve">  "file": "images/act2/S09_Step04_redacted_route.png"</w:t>
         <w:br/>
@@ -6245,7 +6245,7 @@
         <w:br/>
         <w:t xml:space="preserve">  "prompt": "Grounded cinematic West African magical realism; contemporary Ghanaian coastal life; human-scale performances; saturated indigo, lagoon teal, clay red and warm amber palette; natural skin texture; tactile fabric and weathered wood; 16:9 landscape widescreen composition; subtle film grain; expressive realistic lighting. No written words, no logos, no watermark, no distorted hands, no duplicate people. Scene S09 — Map with a Missing Line. TWO-SHOT shot, eye-level. Characters in frame: @KOSI_MENSAH (indigo utility jumpsuit with rolled sleeves, sand-coloured work boots and a narrow woven kente belt, small gold Adinkra-disc earrings); @KWAME_AGYEMAN (white linen shirt under a caramel lightweight field jacket, dark tailored trousers and brown loafers, antique bronze lapel pin shaped like a compass rose). Kosi and Kwame face each other with the locked gate between them. Mood: charged old friendship. Lighting: bleached afternoon heat and hard fence shadows. Environment = Location Registry id 'RESORT_FENCE': The unfinished resort perimeter at Afenyo's lagoon shore: pale concrete columns, tall corrugated-metal fence panels, orange survey flags, a locked chain gate, scraped sand and mangroves pressed tightly behind it.",</w:t>
         <w:br/>
-        <w:t xml:space="preserve">  "status": "⬜",</w:t>
+        <w:t xml:space="preserve">  "status": "✅",</w:t>
         <w:br/>
         <w:t xml:space="preserve">  "file": "images/act2/S09_Step05_old_friends_distance.png"</w:t>
         <w:br/>
@@ -6300,7 +6300,7 @@
         <w:br/>
         <w:t xml:space="preserve">  "prompt": "Grounded cinematic West African magical realism; contemporary Ghanaian coastal life; human-scale performances; saturated indigo, lagoon teal, clay red and warm amber palette; natural skin texture; tactile fabric and weathered wood; 16:9 landscape widescreen composition; subtle film grain; expressive realistic lighting. No written words, no logos, no watermark, no distorted hands, no duplicate people. Scene S09 — Map with a Missing Line. OVER-SHOULDER shot, over the lead character's shoulder. Characters in frame: @KOSI_MENSAH (indigo utility jumpsuit with rolled sleeves, sand-coloured work boots and a narrow woven kente belt, small gold Adinkra-disc earrings); @KWAME_AGYEMAN (white linen shirt under a caramel lightweight field jacket, dark tailored trousers and brown loafers, antique bronze lapel pin shaped like a compass rose). Over Kosi's shoulder, Kwame admits he is excluded from the discharge route. Mood: charged old friendship. Lighting: bleached afternoon heat and hard fence shadows. Environment = Location Registry id 'RESORT_FENCE': The unfinished resort perimeter at Afenyo's lagoon shore: pale concrete columns, tall corrugated-metal fence panels, orange survey flags, a locked chain gate, scraped sand and mangroves pressed tightly behind it.",</w:t>
         <w:br/>
-        <w:t xml:space="preserve">  "status": "⬜",</w:t>
+        <w:t xml:space="preserve">  "status": "✅",</w:t>
         <w:br/>
         <w:t xml:space="preserve">  "file": "images/act2/S09_Step06_kosi_accuses.png"</w:t>
         <w:br/>
@@ -6351,7 +6351,7 @@
         <w:br/>
         <w:t xml:space="preserve">  "prompt": "Grounded cinematic West African magical realism; contemporary Ghanaian coastal life; human-scale performances; saturated indigo, lagoon teal, clay red and warm amber palette; natural skin texture; tactile fabric and weathered wood; 16:9 landscape widescreen composition; subtle film grain; expressive realistic lighting. No written words, no logos, no watermark, no distorted hands, no duplicate people. Scene S09 — Map with a Missing Line. EXTREME CLOSE shot, intimate frontal angle. Characters in frame: @KWAME_AGYEMAN (white linen shirt under a caramel lightweight field jacket, dark tailored trousers and brown loafers, antique bronze lapel pin shaped like a compass rose). Kwame's eyes drop behind rimless spectacles as Kosi names his compromise. Mood: charged old friendship. Lighting: bleached afternoon heat and hard fence shadows. Environment = Location Registry id 'RESORT_FENCE': The unfinished resort perimeter at Afenyo's lagoon shore: pale concrete columns, tall corrugated-metal fence panels, orange survey flags, a locked chain gate, scraped sand and mangroves pressed tightly behind it.",</w:t>
         <w:br/>
-        <w:t xml:space="preserve">  "status": "⬜",</w:t>
+        <w:t xml:space="preserve">  "status": "✅",</w:t>
         <w:br/>
         <w:t xml:space="preserve">  "file": "images/act2/S09_Step07_kwame_shame.png"</w:t>
         <w:br/>
@@ -6406,7 +6406,7 @@
         <w:br/>
         <w:t xml:space="preserve">  "prompt": "Grounded cinematic West African magical realism; contemporary Ghanaian coastal life; human-scale performances; saturated indigo, lagoon teal, clay red and warm amber palette; natural skin texture; tactile fabric and weathered wood; 16:9 landscape widescreen composition; subtle film grain; expressive realistic lighting. No written words, no logos, no watermark, no distorted hands, no duplicate people. Scene S09 — Map with a Missing Line. WIDE shot, low observational angle. Characters in frame: @KOSI_MENSAH (indigo utility jumpsuit with rolled sleeves, sand-coloured work boots and a narrow woven kente belt, small gold Adinkra-disc earrings); @KWAME_AGYEMAN (white linen shirt under a caramel lightweight field jacket, dark tailored trousers and brown loafers, antique bronze lapel pin shaped like a compass rose). Hard shadows of the fence divide the two former friends. Mood: charged old friendship. Lighting: bleached afternoon heat and hard fence shadows. Environment = Location Registry id 'RESORT_FENCE': The unfinished resort perimeter at Afenyo's lagoon shore: pale concrete columns, tall corrugated-metal fence panels, orange survey flags, a locked chain gate, scraped sand and mangroves pressed tightly behind it.",</w:t>
         <w:br/>
-        <w:t xml:space="preserve">  "status": "⬜",</w:t>
+        <w:t xml:space="preserve">  "status": "✅",</w:t>
         <w:br/>
         <w:t xml:space="preserve">  "file": "images/act2/S09_Step08_fence_imprisons.png"</w:t>
         <w:br/>
@@ -6461,7 +6461,7 @@
         <w:br/>
         <w:t xml:space="preserve">  "prompt": "Grounded cinematic West African magical realism; contemporary Ghanaian coastal life; human-scale performances; saturated indigo, lagoon teal, clay red and warm amber palette; natural skin texture; tactile fabric and weathered wood; 16:9 landscape widescreen composition; subtle film grain; expressive realistic lighting. No written words, no logos, no watermark, no distorted hands, no duplicate people. Scene S09 — Map with a Missing Line. MEDIUM shot, handheld eye-level. Characters in frame: @KOSI_MENSAH (indigo utility jumpsuit with rolled sleeves, sand-coloured work boots and a narrow woven kente belt, small gold Adinkra-disc earrings); @KWAME_AGYEMAN (white linen shirt under a caramel lightweight field jacket, dark tailored trousers and brown loafers, antique bronze lapel pin shaped like a compass rose). Kosi photographs the survey number Kwame leaves visible on the plan. Mood: charged old friendship. Lighting: bleached afternoon heat and hard fence shadows. Environment = Location Registry id 'RESORT_FENCE': The unfinished resort perimeter at Afenyo's lagoon shore: pale concrete columns, tall corrugated-metal fence panels, orange survey flags, a locked chain gate, scraped sand and mangroves pressed tightly behind it.",</w:t>
         <w:br/>
-        <w:t xml:space="preserve">  "status": "⬜",</w:t>
+        <w:t xml:space="preserve">  "status": "✅",</w:t>
         <w:br/>
         <w:t xml:space="preserve">  "file": "images/act2/S09_Step09_survey_number.png"</w:t>
         <w:br/>
@@ -6516,7 +6516,7 @@
         <w:br/>
         <w:t xml:space="preserve">  "prompt": "Grounded cinematic West African magical realism; contemporary Ghanaian coastal life; human-scale performances; saturated indigo, lagoon teal, clay red and warm amber palette; natural skin texture; tactile fabric and weathered wood; 16:9 landscape widescreen composition; subtle film grain; expressive realistic lighting. No written words, no logos, no watermark, no distorted hands, no duplicate people. Scene S09 — Map with a Missing Line. WIDE shot, rear closing tableau. Characters in frame: @KOSI_MENSAH (indigo utility jumpsuit with rolled sleeves, sand-coloured work boots and a narrow woven kente belt, small gold Adinkra-disc earrings); @KWAME_AGYEMAN (white linen shirt under a caramel lightweight field jacket, dark tailored trousers and brown loafers, antique bronze lapel pin shaped like a compass rose). Kwame walks along the fence while Kosi remains at the locked gate. Mood: charged old friendship. Lighting: bleached afternoon heat and hard fence shadows. Environment = Location Registry id 'RESORT_FENCE': The unfinished resort perimeter at Afenyo's lagoon shore: pale concrete columns, tall corrugated-metal fence panels, orange survey flags, a locked chain gate, scraped sand and mangroves pressed tightly behind it.",</w:t>
         <w:br/>
-        <w:t xml:space="preserve">  "status": "⬜",</w:t>
+        <w:t xml:space="preserve">  "status": "✅",</w:t>
         <w:br/>
         <w:t xml:space="preserve">  "file": "images/act2/S09_Step10_kwame_leaves.png"</w:t>
         <w:br/>

</xml_diff>

<commit_message>
Generate River Remembers mangrove batch
Co-authored-by: arena-agent <297053741+arena-agent@users.noreply.github.com>
</commit_message>
<xml_diff>
--- a/the_river_remembers/MASTER_DOCUMENT.docx
+++ b/the_river_remembers/MASTER_DOCUMENT.docx
@@ -6583,7 +6583,7 @@
         <w:br/>
         <w:t xml:space="preserve">  "prompt": "Grounded cinematic West African magical realism; contemporary Ghanaian coastal life; human-scale performances; saturated indigo, lagoon teal, clay red and warm amber palette; natural skin texture; tactile fabric and weathered wood; 16:9 landscape widescreen composition; subtle film grain; expressive realistic lighting. No written words, no logos, no watermark, no distorted hands, no duplicate people. Scene S10 — Under the Roots. WIDE shot, high establishing angle. Characters in frame: @KOJO_DANSO (faded forest-green canvas jacket over a blue-and-cream striped shirt, charcoal trousers and rubber deck boots, weathered brass compass on a cord); @KOSI_MENSAH (indigo utility jumpsuit with rolled sleeves, sand-coloured work boots and a narrow woven kente belt, small gold Adinkra-disc earrings); @SENA_ADJOVI (mustard oversized hoodie, blue-and-white printed ankle skirt and worn white canvas trainers, turquoise over-ear radio headphones). A slim canoe slips into a shadowed mangrove passage. Mood: tense fieldwork. Lighting: green-gold shafts through dense mangrove canopy. Environment = Location Registry id 'MANGROVE_PASSAGE': A shadowed mangrove passage off Afenyo lagoon: tangled roots in dark water, a slim canoe path, floating leaves, shafts of green-gold light and the distant hum of construction machinery.",</w:t>
         <w:br/>
-        <w:t xml:space="preserve">  "status": "⬜",</w:t>
+        <w:t xml:space="preserve">  "status": "✅",</w:t>
         <w:br/>
         <w:t xml:space="preserve">  "file": "images/act2/S10_Step01_mangrove_entry.png"</w:t>
         <w:br/>
@@ -6634,7 +6634,7 @@
         <w:br/>
         <w:t xml:space="preserve">  "prompt": "Grounded cinematic West African magical realism; contemporary Ghanaian coastal life; human-scale performances; saturated indigo, lagoon teal, clay red and warm amber palette; natural skin texture; tactile fabric and weathered wood; 16:9 landscape widescreen composition; subtle film grain; expressive realistic lighting. No written words, no logos, no watermark, no distorted hands, no duplicate people. Scene S10 — Under the Roots. MEDIUM shot, eye-level. Characters in frame: @KOJO_DANSO (faded forest-green canvas jacket over a blue-and-cream striped shirt, charcoal trousers and rubber deck boots, weathered brass compass on a cord). Kojo poles carefully between tangled roots and dark water. Mood: tense fieldwork. Lighting: green-gold shafts through dense mangrove canopy. Environment = Location Registry id 'MANGROVE_PASSAGE': A shadowed mangrove passage off Afenyo lagoon: tangled roots in dark water, a slim canoe path, floating leaves, shafts of green-gold light and the distant hum of construction machinery.",</w:t>
         <w:br/>
-        <w:t xml:space="preserve">  "status": "⬜",</w:t>
+        <w:t xml:space="preserve">  "status": "✅",</w:t>
         <w:br/>
         <w:t xml:space="preserve">  "file": "images/act2/S10_Step02_kojo_poles.png"</w:t>
         <w:br/>
@@ -6685,7 +6685,7 @@
         <w:br/>
         <w:t xml:space="preserve">  "prompt": "Grounded cinematic West African magical realism; contemporary Ghanaian coastal life; human-scale performances; saturated indigo, lagoon teal, clay red and warm amber palette; natural skin texture; tactile fabric and weathered wood; 16:9 landscape widescreen composition; subtle film grain; expressive realistic lighting. No written words, no logos, no watermark, no distorted hands, no duplicate people. Scene S10 — Under the Roots. CLOSE shot, three-quarter profile. Characters in frame: @KOSI_MENSAH (indigo utility jumpsuit with rolled sleeves, sand-coloured work boots and a narrow woven kente belt, small gold Adinkra-disc earrings). Kosi lowers a water sensor on a wire over the canoe's side. Mood: tense fieldwork. Lighting: green-gold shafts through dense mangrove canopy. Environment = Location Registry id 'MANGROVE_PASSAGE': A shadowed mangrove passage off Afenyo lagoon: tangled roots in dark water, a slim canoe path, floating leaves, shafts of green-gold light and the distant hum of construction machinery.",</w:t>
         <w:br/>
-        <w:t xml:space="preserve">  "status": "⬜",</w:t>
+        <w:t xml:space="preserve">  "status": "✅",</w:t>
         <w:br/>
         <w:t xml:space="preserve">  "file": "images/act2/S10_Step03_kosi_sensor.png"</w:t>
         <w:br/>
@@ -6736,7 +6736,7 @@
         <w:br/>
         <w:t xml:space="preserve">  "prompt": "Grounded cinematic West African magical realism; contemporary Ghanaian coastal life; human-scale performances; saturated indigo, lagoon teal, clay red and warm amber palette; natural skin texture; tactile fabric and weathered wood; 16:9 landscape widescreen composition; subtle film grain; expressive realistic lighting. No written words, no logos, no watermark, no distorted hands, no duplicate people. Scene S10 — Under the Roots. INSERT shot, top-down detail. Characters in frame: @KOSI_MENSAH (indigo utility jumpsuit with rolled sleeves, sand-coloured work boots and a narrow woven kente belt, small gold Adinkra-disc earrings). The sensor display spikes sharply against Kosi's gloved hand. Mood: tense fieldwork. Lighting: green-gold shafts through dense mangrove canopy. Environment = Location Registry id 'MANGROVE_PASSAGE': A shadowed mangrove passage off Afenyo lagoon: tangled roots in dark water, a slim canoe path, floating leaves, shafts of green-gold light and the distant hum of construction machinery.",</w:t>
         <w:br/>
-        <w:t xml:space="preserve">  "status": "⬜",</w:t>
+        <w:t xml:space="preserve">  "status": "✅",</w:t>
         <w:br/>
         <w:t xml:space="preserve">  "file": "images/act2/S10_Step04_meter_spike.png"</w:t>
         <w:br/>
@@ -6795,7 +6795,7 @@
         <w:br/>
         <w:t xml:space="preserve">  "prompt": "Grounded cinematic West African magical realism; contemporary Ghanaian coastal life; human-scale performances; saturated indigo, lagoon teal, clay red and warm amber palette; natural skin texture; tactile fabric and weathered wood; 16:9 landscape widescreen composition; subtle film grain; expressive realistic lighting. No written words, no logos, no watermark, no distorted hands, no duplicate people. Scene S10 — Under the Roots. TWO-SHOT shot, eye-level. Characters in frame: @KOSI_MENSAH (indigo utility jumpsuit with rolled sleeves, sand-coloured work boots and a narrow woven kente belt, small gold Adinkra-disc earrings); @KOJO_DANSO (faded forest-green canvas jacket over a blue-and-cream striped shirt, charcoal trousers and rubber deck boots, weathered brass compass on a cord); @SENA_ADJOVI (mustard oversized hoodie, blue-and-white printed ankle skirt and worn white canvas trainers, turquoise over-ear radio headphones). Kosi, Kojo and Sena hold their breath in the narrow canoe. Mood: tense fieldwork. Lighting: green-gold shafts through dense mangrove canopy. Environment = Location Registry id 'MANGROVE_PASSAGE': A shadowed mangrove passage off Afenyo lagoon: tangled roots in dark water, a slim canoe path, floating leaves, shafts of green-gold light and the distant hum of construction machinery.",</w:t>
         <w:br/>
-        <w:t xml:space="preserve">  "status": "⬜",</w:t>
+        <w:t xml:space="preserve">  "status": "✅",</w:t>
         <w:br/>
         <w:t xml:space="preserve">  "file": "images/act2/S10_Step05_three_in_canoe.png"</w:t>
         <w:br/>
@@ -6850,7 +6850,7 @@
         <w:br/>
         <w:t xml:space="preserve">  "prompt": "Grounded cinematic West African magical realism; contemporary Ghanaian coastal life; human-scale performances; saturated indigo, lagoon teal, clay red and warm amber palette; natural skin texture; tactile fabric and weathered wood; 16:9 landscape widescreen composition; subtle film grain; expressive realistic lighting. No written words, no logos, no watermark, no distorted hands, no duplicate people. Scene S10 — Under the Roots. OVER-SHOULDER shot, over the lead character's shoulder. Characters in frame: @KOSI_MENSAH (indigo utility jumpsuit with rolled sleeves, sand-coloured work boots and a narrow woven kente belt, small gold Adinkra-disc earrings); @SENA_ADJOVI (mustard oversized hoodie, blue-and-white printed ankle skirt and worn white canvas trainers, turquoise over-ear radio headphones). Over Kosi's shoulder, Sena films a concealed pipe pulsing warm grey water. Mood: tense fieldwork. Lighting: green-gold shafts through dense mangrove canopy. Environment = Location Registry id 'MANGROVE_PASSAGE': A shadowed mangrove passage off Afenyo lagoon: tangled roots in dark water, a slim canoe path, floating leaves, shafts of green-gold light and the distant hum of construction machinery.",</w:t>
         <w:br/>
-        <w:t xml:space="preserve">  "status": "⬜",</w:t>
+        <w:t xml:space="preserve">  "status": "✅",</w:t>
         <w:br/>
         <w:t xml:space="preserve">  "file": "images/act2/S10_Step06_hidden_pipe.png"</w:t>
         <w:br/>
@@ -6901,7 +6901,7 @@
         <w:br/>
         <w:t xml:space="preserve">  "prompt": "Grounded cinematic West African magical realism; contemporary Ghanaian coastal life; human-scale performances; saturated indigo, lagoon teal, clay red and warm amber palette; natural skin texture; tactile fabric and weathered wood; 16:9 landscape widescreen composition; subtle film grain; expressive realistic lighting. No written words, no logos, no watermark, no distorted hands, no duplicate people. Scene S10 — Under the Roots. EXTREME CLOSE shot, intimate frontal angle. Characters in frame: @SENA_ADJOVI (mustard oversized hoodie, blue-and-white printed ankle skirt and worn white canvas trainers, turquoise over-ear radio headphones). Sena whispers about being seen but keeps her phone steady. Mood: tense fieldwork. Lighting: green-gold shafts through dense mangrove canopy. Environment = Location Registry id 'MANGROVE_PASSAGE': A shadowed mangrove passage off Afenyo lagoon: tangled roots in dark water, a slim canoe path, floating leaves, shafts of green-gold light and the distant hum of construction machinery.",</w:t>
         <w:br/>
-        <w:t xml:space="preserve">  "status": "⬜",</w:t>
+        <w:t xml:space="preserve">  "status": "✅",</w:t>
         <w:br/>
         <w:t xml:space="preserve">  "file": "images/act2/S10_Step07_sena_fear.png"</w:t>
         <w:br/>
@@ -6960,7 +6960,7 @@
         <w:br/>
         <w:t xml:space="preserve">  "prompt": "Grounded cinematic West African magical realism; contemporary Ghanaian coastal life; human-scale performances; saturated indigo, lagoon teal, clay red and warm amber palette; natural skin texture; tactile fabric and weathered wood; 16:9 landscape widescreen composition; subtle film grain; expressive realistic lighting. No written words, no logos, no watermark, no distorted hands, no duplicate people. Scene S10 — Under the Roots. WIDE shot, low observational angle. Characters in frame: @KOJO_DANSO (faded forest-green canvas jacket over a blue-and-cream striped shirt, charcoal trousers and rubber deck boots, weathered brass compass on a cord); @KOSI_MENSAH (indigo utility jumpsuit with rolled sleeves, sand-coloured work boots and a narrow woven kente belt, small gold Adinkra-disc earrings); @SENA_ADJOVI (mustard oversized hoodie, blue-and-white printed ankle skirt and worn white canvas trainers, turquoise over-ear radio headphones). The trio freezes as a distant construction engine cuts out. Mood: tense fieldwork. Lighting: green-gold shafts through dense mangrove canopy. Environment = Location Registry id 'MANGROVE_PASSAGE': A shadowed mangrove passage off Afenyo lagoon: tangled roots in dark water, a slim canoe path, floating leaves, shafts of green-gold light and the distant hum of construction machinery.",</w:t>
         <w:br/>
-        <w:t xml:space="preserve">  "status": "⬜",</w:t>
+        <w:t xml:space="preserve">  "status": "✅",</w:t>
         <w:br/>
         <w:t xml:space="preserve">  "file": "images/act2/S10_Step08_engine_hush.png"</w:t>
         <w:br/>
@@ -7011,7 +7011,7 @@
         <w:br/>
         <w:t xml:space="preserve">  "prompt": "Grounded cinematic West African magical realism; contemporary Ghanaian coastal life; human-scale performances; saturated indigo, lagoon teal, clay red and warm amber palette; natural skin texture; tactile fabric and weathered wood; 16:9 landscape widescreen composition; subtle film grain; expressive realistic lighting. No written words, no logos, no watermark, no distorted hands, no duplicate people. Scene S10 — Under the Roots. MEDIUM shot, handheld eye-level. Characters in frame: @KOSI_MENSAH (indigo utility jumpsuit with rolled sleeves, sand-coloured work boots and a narrow woven kente belt, small gold Adinkra-disc earrings). Kosi seals the water sample with practiced precision. Mood: tense fieldwork. Lighting: green-gold shafts through dense mangrove canopy. Environment = Location Registry id 'MANGROVE_PASSAGE': A shadowed mangrove passage off Afenyo lagoon: tangled roots in dark water, a slim canoe path, floating leaves, shafts of green-gold light and the distant hum of construction machinery.",</w:t>
         <w:br/>
-        <w:t xml:space="preserve">  "status": "⬜",</w:t>
+        <w:t xml:space="preserve">  "status": "✅",</w:t>
         <w:br/>
         <w:t xml:space="preserve">  "file": "images/act2/S10_Step09_sample_sealed.png"</w:t>
         <w:br/>
@@ -7070,7 +7070,7 @@
         <w:br/>
         <w:t xml:space="preserve">  "prompt": "Grounded cinematic West African magical realism; contemporary Ghanaian coastal life; human-scale performances; saturated indigo, lagoon teal, clay red and warm amber palette; natural skin texture; tactile fabric and weathered wood; 16:9 landscape widescreen composition; subtle film grain; expressive realistic lighting. No written words, no logos, no watermark, no distorted hands, no duplicate people. Scene S10 — Under the Roots. WIDE shot, rear closing tableau. Characters in frame: @KOJO_DANSO (faded forest-green canvas jacket over a blue-and-cream striped shirt, charcoal trousers and rubber deck boots, weathered brass compass on a cord); @KOSI_MENSAH (indigo utility jumpsuit with rolled sleeves, sand-coloured work boots and a narrow woven kente belt, small gold Adinkra-disc earrings); @SENA_ADJOVI (mustard oversized hoodie, blue-and-white printed ankle skirt and worn white canvas trainers, turquoise over-ear radio headphones). Kojo guides the canoe back through green-gold roots toward daylight. Mood: tense fieldwork. Lighting: green-gold shafts through dense mangrove canopy. Environment = Location Registry id 'MANGROVE_PASSAGE': A shadowed mangrove passage off Afenyo lagoon: tangled roots in dark water, a slim canoe path, floating leaves, shafts of green-gold light and the distant hum of construction machinery.",</w:t>
         <w:br/>
-        <w:t xml:space="preserve">  "status": "⬜",</w:t>
+        <w:t xml:space="preserve">  "status": "✅",</w:t>
         <w:br/>
         <w:t xml:space="preserve">  "file": "images/act2/S10_Step10_escape_passage.png"</w:t>
         <w:br/>

</xml_diff>

<commit_message>
Generate River Remembers flooded compound batch
Co-authored-by: arena-agent <297053741+arena-agent@users.noreply.github.com>
</commit_message>
<xml_diff>
--- a/the_river_remembers/MASTER_DOCUMENT.docx
+++ b/the_river_remembers/MASTER_DOCUMENT.docx
@@ -7133,7 +7133,7 @@
         <w:br/>
         <w:t xml:space="preserve">  "prompt": "Grounded cinematic West African magical realism; contemporary Ghanaian coastal life; human-scale performances; saturated indigo, lagoon teal, clay red and warm amber palette; natural skin texture; tactile fabric and weathered wood; 16:9 landscape widescreen composition; subtle film grain; expressive realistic lighting. No written words, no logos, no watermark, no distorted hands, no duplicate people. Scene S11 — King Tide. WIDE shot, high establishing angle. Characters in frame: @KOSI_MENSAH (indigo utility jumpsuit with rolled sleeves, sand-coloured work boots and a narrow woven kente belt, small gold Adinkra-disc earrings); @AMA_ADJOVI (deep navy kaba blouse, hand-dyed indigo wrapper with tiny white wave motifs and flat leather sandals, three-strand amber bead necklace). Storm water fills the compound around the blue door and floating mango leaves. Mood: urgent, tender resilience. Lighting: storm flashes, lantern reflections and dark blue rain. Environment = Location Registry id 'FLOODED_COMPOUND': Ama's family compound courtyard after a king-tide flood: ankle-deep reflective water around ochre walls and woven stools, floating mango leaves, soaked laundry, a blue door and storm-grey sky.",</w:t>
         <w:br/>
-        <w:t xml:space="preserve">  "status": "⬜",</w:t>
+        <w:t xml:space="preserve">  "status": "✅",</w:t>
         <w:br/>
         <w:t xml:space="preserve">  "file": "images/act2/S11_Step01_flooded_home.png"</w:t>
         <w:br/>
@@ -7184,7 +7184,7 @@
         <w:br/>
         <w:t xml:space="preserve">  "prompt": "Grounded cinematic West African magical realism; contemporary Ghanaian coastal life; human-scale performances; saturated indigo, lagoon teal, clay red and warm amber palette; natural skin texture; tactile fabric and weathered wood; 16:9 landscape widescreen composition; subtle film grain; expressive realistic lighting. No written words, no logos, no watermark, no distorted hands, no duplicate people. Scene S11 — King Tide. MEDIUM shot, eye-level. Characters in frame: @KOSI_MENSAH (indigo utility jumpsuit with rolled sleeves, sand-coloured work boots and a narrow woven kente belt, small gold Adinkra-disc earrings). Kosi raises electrical leads above ankle-deep flood water. Mood: urgent, tender resilience. Lighting: storm flashes, lantern reflections and dark blue rain. Environment = Location Registry id 'FLOODED_COMPOUND': Ama's family compound courtyard after a king-tide flood: ankle-deep reflective water around ochre walls and woven stools, floating mango leaves, soaked laundry, a blue door and storm-grey sky.",</w:t>
         <w:br/>
-        <w:t xml:space="preserve">  "status": "⬜",</w:t>
+        <w:t xml:space="preserve">  "status": "✅",</w:t>
         <w:br/>
         <w:t xml:space="preserve">  "file": "images/act2/S11_Step02_kosi_lifts_leads.png"</w:t>
         <w:br/>
@@ -7235,7 +7235,7 @@
         <w:br/>
         <w:t xml:space="preserve">  "prompt": "Grounded cinematic West African magical realism; contemporary Ghanaian coastal life; human-scale performances; saturated indigo, lagoon teal, clay red and warm amber palette; natural skin texture; tactile fabric and weathered wood; 16:9 landscape widescreen composition; subtle film grain; expressive realistic lighting. No written words, no logos, no watermark, no distorted hands, no duplicate people. Scene S11 — King Tide. CLOSE shot, three-quarter profile. Characters in frame: @AMA_ADJOVI (deep navy kaba blouse, hand-dyed indigo wrapper with tiny white wave motifs and flat leather sandals, three-strand amber bead necklace). Ama grips a crate of lanterns and refuses to leave it behind. Mood: urgent, tender resilience. Lighting: storm flashes, lantern reflections and dark blue rain. Environment = Location Registry id 'FLOODED_COMPOUND': Ama's family compound courtyard after a king-tide flood: ankle-deep reflective water around ochre walls and woven stools, floating mango leaves, soaked laundry, a blue door and storm-grey sky.",</w:t>
         <w:br/>
-        <w:t xml:space="preserve">  "status": "⬜",</w:t>
+        <w:t xml:space="preserve">  "status": "✅",</w:t>
         <w:br/>
         <w:t xml:space="preserve">  "file": "images/act2/S11_Step03_ama_crate.png"</w:t>
         <w:br/>
@@ -7286,7 +7286,7 @@
         <w:br/>
         <w:t xml:space="preserve">  "prompt": "Grounded cinematic West African magical realism; contemporary Ghanaian coastal life; human-scale performances; saturated indigo, lagoon teal, clay red and warm amber palette; natural skin texture; tactile fabric and weathered wood; 16:9 landscape widescreen composition; subtle film grain; expressive realistic lighting. No written words, no logos, no watermark, no distorted hands, no duplicate people. Scene S11 — King Tide. INSERT shot, top-down detail. Characters in frame: @AMA_ADJOVI (deep navy kaba blouse, hand-dyed indigo wrapper with tiny white wave motifs and flat leather sandals, three-strand amber bead necklace). A blue lantern reflection trembles in flood water around Ama's sandals. Mood: urgent, tender resilience. Lighting: storm flashes, lantern reflections and dark blue rain. Environment = Location Registry id 'FLOODED_COMPOUND': Ama's family compound courtyard after a king-tide flood: ankle-deep reflective water around ochre walls and woven stools, floating mango leaves, soaked laundry, a blue door and storm-grey sky.",</w:t>
         <w:br/>
-        <w:t xml:space="preserve">  "status": "⬜",</w:t>
+        <w:t xml:space="preserve">  "status": "✅",</w:t>
         <w:br/>
         <w:t xml:space="preserve">  "file": "images/act2/S11_Step04_water_reflection.png"</w:t>
         <w:br/>
@@ -7341,7 +7341,7 @@
         <w:br/>
         <w:t xml:space="preserve">  "prompt": "Grounded cinematic West African magical realism; contemporary Ghanaian coastal life; human-scale performances; saturated indigo, lagoon teal, clay red and warm amber palette; natural skin texture; tactile fabric and weathered wood; 16:9 landscape widescreen composition; subtle film grain; expressive realistic lighting. No written words, no logos, no watermark, no distorted hands, no duplicate people. Scene S11 — King Tide. TWO-SHOT shot, eye-level. Characters in frame: @KOJO_DANSO (faded forest-green canvas jacket over a blue-and-cream striped shirt, charcoal trousers and rubber deck boots, weathered brass compass on a cord); @SENA_ADJOVI (mustard oversized hoodie, blue-and-white printed ankle skirt and worn white canvas trainers, turquoise over-ear radio headphones). Kojo wades in with a canoe as Sena reaches for the lantern crate. Mood: urgent, tender resilience. Lighting: storm flashes, lantern reflections and dark blue rain. Environment = Location Registry id 'FLOODED_COMPOUND': Ama's family compound courtyard after a king-tide flood: ankle-deep reflective water around ochre walls and woven stools, floating mango leaves, soaked laundry, a blue door and storm-grey sky.",</w:t>
         <w:br/>
-        <w:t xml:space="preserve">  "status": "⬜",</w:t>
+        <w:t xml:space="preserve">  "status": "✅",</w:t>
         <w:br/>
         <w:t xml:space="preserve">  "file": "images/act2/S11_Step05_kojo_arrives.png"</w:t>
         <w:br/>
@@ -7396,7 +7396,7 @@
         <w:br/>
         <w:t xml:space="preserve">  "prompt": "Grounded cinematic West African magical realism; contemporary Ghanaian coastal life; human-scale performances; saturated indigo, lagoon teal, clay red and warm amber palette; natural skin texture; tactile fabric and weathered wood; 16:9 landscape widescreen composition; subtle film grain; expressive realistic lighting. No written words, no logos, no watermark, no distorted hands, no duplicate people. Scene S11 — King Tide. OVER-SHOULDER shot, over the lead character's shoulder. Characters in frame: @KOSI_MENSAH (indigo utility jumpsuit with rolled sleeves, sand-coloured work boots and a narrow woven kente belt, small gold Adinkra-disc earrings); @AMA_ADJOVI (deep navy kaba blouse, hand-dyed indigo wrapper with tiny white wave motifs and flat leather sandals, three-strand amber bead necklace). Over Ama's shoulder, Kosi promises to make the water testify. Mood: urgent, tender resilience. Lighting: storm flashes, lantern reflections and dark blue rain. Environment = Location Registry id 'FLOODED_COMPOUND': Ama's family compound courtyard after a king-tide flood: ankle-deep reflective water around ochre walls and woven stools, floating mango leaves, soaked laundry, a blue door and storm-grey sky.",</w:t>
         <w:br/>
-        <w:t xml:space="preserve">  "status": "⬜",</w:t>
+        <w:t xml:space="preserve">  "status": "✅",</w:t>
         <w:br/>
         <w:t xml:space="preserve">  "file": "images/act2/S11_Step06_kosi_reassures.png"</w:t>
         <w:br/>
@@ -7447,7 +7447,7 @@
         <w:br/>
         <w:t xml:space="preserve">  "prompt": "Grounded cinematic West African magical realism; contemporary Ghanaian coastal life; human-scale performances; saturated indigo, lagoon teal, clay red and warm amber palette; natural skin texture; tactile fabric and weathered wood; 16:9 landscape widescreen composition; subtle film grain; expressive realistic lighting. No written words, no logos, no watermark, no distorted hands, no duplicate people. Scene S11 — King Tide. EXTREME CLOSE shot, intimate frontal angle. Characters in frame: @AMA_ADJOVI (deep navy kaba blouse, hand-dyed indigo wrapper with tiny white wave motifs and flat leather sandals, three-strand amber bead necklace). Ama speaks of water remembering every blocked path. Mood: urgent, tender resilience. Lighting: storm flashes, lantern reflections and dark blue rain. Environment = Location Registry id 'FLOODED_COMPOUND': Ama's family compound courtyard after a king-tide flood: ankle-deep reflective water around ochre walls and woven stools, floating mango leaves, soaked laundry, a blue door and storm-grey sky.",</w:t>
         <w:br/>
-        <w:t xml:space="preserve">  "status": "⬜",</w:t>
+        <w:t xml:space="preserve">  "status": "✅",</w:t>
         <w:br/>
         <w:t xml:space="preserve">  "file": "images/act2/S11_Step07_ama_remembers.png"</w:t>
         <w:br/>
@@ -7510,7 +7510,7 @@
         <w:br/>
         <w:t xml:space="preserve">  "prompt": "Grounded cinematic West African magical realism; contemporary Ghanaian coastal life; human-scale performances; saturated indigo, lagoon teal, clay red and warm amber palette; natural skin texture; tactile fabric and weathered wood; 16:9 landscape widescreen composition; subtle film grain; expressive realistic lighting. No written words, no logos, no watermark, no distorted hands, no duplicate people. Scene S11 — King Tide. WIDE shot, low observational angle. Characters in frame: @KOSI_MENSAH (indigo utility jumpsuit with rolled sleeves, sand-coloured work boots and a narrow woven kente belt, small gold Adinkra-disc earrings); @AMA_ADJOVI (deep navy kaba blouse, hand-dyed indigo wrapper with tiny white wave motifs and flat leather sandals, three-strand amber bead necklace); @SENA_ADJOVI (mustard oversized hoodie, blue-and-white printed ankle skirt and worn white canvas trainers, turquoise over-ear radio headphones); @KOJO_DANSO (faded forest-green canvas jacket over a blue-and-cream striped shirt, charcoal trousers and rubber deck boots, weathered brass compass on a cord). The family floats tools and lanterns toward Kojo's waiting canoe. Mood: urgent, tender resilience. Lighting: storm flashes, lantern reflections and dark blue rain. Environment = Location Registry id 'FLOODED_COMPOUND': Ama's family compound courtyard after a king-tide flood: ankle-deep reflective water around ochre walls and woven stools, floating mango leaves, soaked laundry, a blue door and storm-grey sky.",</w:t>
         <w:br/>
-        <w:t xml:space="preserve">  "status": "⬜",</w:t>
+        <w:t xml:space="preserve">  "status": "✅",</w:t>
         <w:br/>
         <w:t xml:space="preserve">  "file": "images/act2/S11_Step08_rescue_team.png"</w:t>
         <w:br/>
@@ -7565,7 +7565,7 @@
         <w:br/>
         <w:t xml:space="preserve">  "prompt": "Grounded cinematic West African magical realism; contemporary Ghanaian coastal life; human-scale performances; saturated indigo, lagoon teal, clay red and warm amber palette; natural skin texture; tactile fabric and weathered wood; 16:9 landscape widescreen composition; subtle film grain; expressive realistic lighting. No written words, no logos, no watermark, no distorted hands, no duplicate people. Scene S11 — King Tide. MEDIUM shot, handheld eye-level. Characters in frame: @KOSI_MENSAH (indigo utility jumpsuit with rolled sleeves, sand-coloured work boots and a narrow woven kente belt, small gold Adinkra-disc earrings); @SENA_ADJOVI (mustard oversized hoodie, blue-and-white printed ankle skirt and worn white canvas trainers, turquoise over-ear radio headphones). A blue lantern sputters to life between rain lashes. Mood: urgent, tender resilience. Lighting: storm flashes, lantern reflections and dark blue rain. Environment = Location Registry id 'FLOODED_COMPOUND': Ama's family compound courtyard after a king-tide flood: ankle-deep reflective water around ochre walls and woven stools, floating mango leaves, soaked laundry, a blue door and storm-grey sky.",</w:t>
         <w:br/>
-        <w:t xml:space="preserve">  "status": "⬜",</w:t>
+        <w:t xml:space="preserve">  "status": "✅",</w:t>
         <w:br/>
         <w:t xml:space="preserve">  "file": "images/act2/S11_Step09_first_flicker.png"</w:t>
         <w:br/>
@@ -7628,7 +7628,7 @@
         <w:br/>
         <w:t xml:space="preserve">  "prompt": "Grounded cinematic West African magical realism; contemporary Ghanaian coastal life; human-scale performances; saturated indigo, lagoon teal, clay red and warm amber palette; natural skin texture; tactile fabric and weathered wood; 16:9 landscape widescreen composition; subtle film grain; expressive realistic lighting. No written words, no logos, no watermark, no distorted hands, no duplicate people. Scene S11 — King Tide. WIDE shot, rear closing tableau. Characters in frame: @KOSI_MENSAH (indigo utility jumpsuit with rolled sleeves, sand-coloured work boots and a narrow woven kente belt, small gold Adinkra-disc earrings); @AMA_ADJOVI (deep navy kaba blouse, hand-dyed indigo wrapper with tiny white wave motifs and flat leather sandals, three-strand amber bead necklace); @SENA_ADJOVI (mustard oversized hoodie, blue-and-white printed ankle skirt and worn white canvas trainers, turquoise over-ear radio headphones); @KOJO_DANSO (faded forest-green canvas jacket over a blue-and-cream striped shirt, charcoal trousers and rubber deck boots, weathered brass compass on a cord). One small lantern burns over the flooded courtyard as the group works together. Mood: urgent, tender resilience. Lighting: storm flashes, lantern reflections and dark blue rain. Environment = Location Registry id 'FLOODED_COMPOUND': Ama's family compound courtyard after a king-tide flood: ankle-deep reflective water around ochre walls and woven stools, floating mango leaves, soaked laundry, a blue door and storm-grey sky.",</w:t>
         <w:br/>
-        <w:t xml:space="preserve">  "status": "⬜",</w:t>
+        <w:t xml:space="preserve">  "status": "✅",</w:t>
         <w:br/>
         <w:t xml:space="preserve">  "file": "images/act2/S11_Step10_storm_lantern.png"</w:t>
         <w:br/>

</xml_diff>

<commit_message>
Generate River Remembers beacon hut batch
Co-authored-by: arena-agent <297053741+arena-agent@users.noreply.github.com>
</commit_message>
<xml_diff>
--- a/the_river_remembers/MASTER_DOCUMENT.docx
+++ b/the_river_remembers/MASTER_DOCUMENT.docx
@@ -7699,7 +7699,7 @@
         <w:br/>
         <w:t xml:space="preserve">  "prompt": "Grounded cinematic West African magical realism; contemporary Ghanaian coastal life; human-scale performances; saturated indigo, lagoon teal, clay red and warm amber palette; natural skin texture; tactile fabric and weathered wood; 16:9 landscape widescreen composition; subtle film grain; expressive realistic lighting. No written words, no logos, no watermark, no distorted hands, no duplicate people. Scene S12 — Night of the Red Moon. WIDE shot, high establishing angle. Characters in frame: @AMA_ADJOVI (deep navy kaba blouse, hand-dyed indigo wrapper with tiny white wave motifs and flat leather sandals, three-strand amber bead necklace); @KOSI_MENSAH (indigo utility jumpsuit with rolled sleeves, sand-coloured work boots and a narrow woven kente belt, small gold Adinkra-disc earrings); @SENA_ADJOVI (mustard oversized hoodie, blue-and-white printed ankle skirt and worn white canvas trainers, turquoise over-ear radio headphones); @KOJO_DANSO (faded forest-green canvas jacket over a blue-and-cream striped shirt, charcoal trousers and rubber deck boots, weathered brass compass on a cord). The group approaches the derelict beacon hut across a lonely predawn sandbar. Mood: revelatory and ancestral. Lighting: thin pre-dawn blue with a red moon fading behind cloud. Environment = Location Registry id 'OLD_BEACON_HUT': A derelict tidal beacon hut on a small lagoon sandbar: cracked whitewash walls, a rusted ladder, broken blue lantern glass, salt-stained timber, reed grass and sweeping water on every side.",</w:t>
         <w:br/>
-        <w:t xml:space="preserve">  "status": "⬜",</w:t>
+        <w:t xml:space="preserve">  "status": "✅",</w:t>
         <w:br/>
         <w:t xml:space="preserve">  "file": "images/act2/S12_Step01_sandbar_hut.png"</w:t>
         <w:br/>
@@ -7750,7 +7750,7 @@
         <w:br/>
         <w:t xml:space="preserve">  "prompt": "Grounded cinematic West African magical realism; contemporary Ghanaian coastal life; human-scale performances; saturated indigo, lagoon teal, clay red and warm amber palette; natural skin texture; tactile fabric and weathered wood; 16:9 landscape widescreen composition; subtle film grain; expressive realistic lighting. No written words, no logos, no watermark, no distorted hands, no duplicate people. Scene S12 — Night of the Red Moon. MEDIUM shot, eye-level. Characters in frame: @AMA_ADJOVI (deep navy kaba blouse, hand-dyed indigo wrapper with tiny white wave motifs and flat leather sandals, three-strand amber bead necklace). Ama steps through the cracked doorway with amber beads catching the blue light. Mood: revelatory and ancestral. Lighting: thin pre-dawn blue with a red moon fading behind cloud. Environment = Location Registry id 'OLD_BEACON_HUT': A derelict tidal beacon hut on a small lagoon sandbar: cracked whitewash walls, a rusted ladder, broken blue lantern glass, salt-stained timber, reed grass and sweeping water on every side.",</w:t>
         <w:br/>
-        <w:t xml:space="preserve">  "status": "⬜",</w:t>
+        <w:t xml:space="preserve">  "status": "✅",</w:t>
         <w:br/>
         <w:t xml:space="preserve">  "file": "images/act2/S12_Step02_ama_leads.png"</w:t>
         <w:br/>
@@ -7801,7 +7801,7 @@
         <w:br/>
         <w:t xml:space="preserve">  "prompt": "Grounded cinematic West African magical realism; contemporary Ghanaian coastal life; human-scale performances; saturated indigo, lagoon teal, clay red and warm amber palette; natural skin texture; tactile fabric and weathered wood; 16:9 landscape widescreen composition; subtle film grain; expressive realistic lighting. No written words, no logos, no watermark, no distorted hands, no duplicate people. Scene S12 — Night of the Red Moon. CLOSE shot, three-quarter profile. Characters in frame: @KOSI_MENSAH (indigo utility jumpsuit with rolled sleeves, sand-coloured work boots and a narrow woven kente belt, small gold Adinkra-disc earrings). Kosi listens closely as Ama begins the old story. Mood: revelatory and ancestral. Lighting: thin pre-dawn blue with a red moon fading behind cloud. Environment = Location Registry id 'OLD_BEACON_HUT': A derelict tidal beacon hut on a small lagoon sandbar: cracked whitewash walls, a rusted ladder, broken blue lantern glass, salt-stained timber, reed grass and sweeping water on every side.",</w:t>
         <w:br/>
-        <w:t xml:space="preserve">  "status": "⬜",</w:t>
+        <w:t xml:space="preserve">  "status": "✅",</w:t>
         <w:br/>
         <w:t xml:space="preserve">  "file": "images/act2/S12_Step03_kosi_listens.png"</w:t>
         <w:br/>
@@ -7852,7 +7852,7 @@
         <w:br/>
         <w:t xml:space="preserve">  "prompt": "Grounded cinematic West African magical realism; contemporary Ghanaian coastal life; human-scale performances; saturated indigo, lagoon teal, clay red and warm amber palette; natural skin texture; tactile fabric and weathered wood; 16:9 landscape widescreen composition; subtle film grain; expressive realistic lighting. No written words, no logos, no watermark, no distorted hands, no duplicate people. Scene S12 — Night of the Red Moon. INSERT shot, top-down detail. Characters in frame: @AMA_ADJOVI (deep navy kaba blouse, hand-dyed indigo wrapper with tiny white wave motifs and flat leather sandals, three-strand amber bead necklace). Broken blue beacon glass lies among salt-stained timber and reed grass. Mood: revelatory and ancestral. Lighting: thin pre-dawn blue with a red moon fading behind cloud. Environment = Location Registry id 'OLD_BEACON_HUT': A derelict tidal beacon hut on a small lagoon sandbar: cracked whitewash walls, a rusted ladder, broken blue lantern glass, salt-stained timber, reed grass and sweeping water on every side.",</w:t>
         <w:br/>
-        <w:t xml:space="preserve">  "status": "⬜",</w:t>
+        <w:t xml:space="preserve">  "status": "✅",</w:t>
         <w:br/>
         <w:t xml:space="preserve">  "file": "images/act2/S12_Step04_broken_glass.png"</w:t>
         <w:br/>
@@ -7907,7 +7907,7 @@
         <w:br/>
         <w:t xml:space="preserve">  "prompt": "Grounded cinematic West African magical realism; contemporary Ghanaian coastal life; human-scale performances; saturated indigo, lagoon teal, clay red and warm amber palette; natural skin texture; tactile fabric and weathered wood; 16:9 landscape widescreen composition; subtle film grain; expressive realistic lighting. No written words, no logos, no watermark, no distorted hands, no duplicate people. Scene S12 — Night of the Red Moon. TWO-SHOT shot, eye-level. Characters in frame: @AMA_ADJOVI (deep navy kaba blouse, hand-dyed indigo wrapper with tiny white wave motifs and flat leather sandals, three-strand amber bead necklace); @KOSI_MENSAH (indigo utility jumpsuit with rolled sleeves, sand-coloured work boots and a narrow woven kente belt, small gold Adinkra-disc earrings). Ama recounts how elders preserved a public landing deed during a survey. Mood: revelatory and ancestral. Lighting: thin pre-dawn blue with a red moon fading behind cloud. Environment = Location Registry id 'OLD_BEACON_HUT': A derelict tidal beacon hut on a small lagoon sandbar: cracked whitewash walls, a rusted ladder, broken blue lantern glass, salt-stained timber, reed grass and sweeping water on every side.",</w:t>
         <w:br/>
-        <w:t xml:space="preserve">  "status": "⬜",</w:t>
+        <w:t xml:space="preserve">  "status": "✅",</w:t>
         <w:br/>
         <w:t xml:space="preserve">  "file": "images/act2/S12_Step05_told_history.png"</w:t>
         <w:br/>
@@ -7962,7 +7962,7 @@
         <w:br/>
         <w:t xml:space="preserve">  "prompt": "Grounded cinematic West African magical realism; contemporary Ghanaian coastal life; human-scale performances; saturated indigo, lagoon teal, clay red and warm amber palette; natural skin texture; tactile fabric and weathered wood; 16:9 landscape widescreen composition; subtle film grain; expressive realistic lighting. No written words, no logos, no watermark, no distorted hands, no duplicate people. Scene S12 — Night of the Red Moon. OVER-SHOULDER shot, over the lead character's shoulder. Characters in frame: @KOSI_MENSAH (indigo utility jumpsuit with rolled sleeves, sand-coloured work boots and a narrow woven kente belt, small gold Adinkra-disc earrings); @SENA_ADJOVI (mustard oversized hoodie, blue-and-white printed ankle skirt and worn white canvas trainers, turquoise over-ear radio headphones). Over Kosi's shoulder, Sena compares the page's rhythm to the radio frequency. Mood: revelatory and ancestral. Lighting: thin pre-dawn blue with a red moon fading behind cloud. Environment = Location Registry id 'OLD_BEACON_HUT': A derelict tidal beacon hut on a small lagoon sandbar: cracked whitewash walls, a rusted ladder, broken blue lantern glass, salt-stained timber, reed grass and sweeping water on every side.",</w:t>
         <w:br/>
-        <w:t xml:space="preserve">  "status": "⬜",</w:t>
+        <w:t xml:space="preserve">  "status": "✅",</w:t>
         <w:br/>
         <w:t xml:space="preserve">  "file": "images/act2/S12_Step06_frequency_realization.png"</w:t>
         <w:br/>
@@ -8013,7 +8013,7 @@
         <w:br/>
         <w:t xml:space="preserve">  "prompt": "Grounded cinematic West African magical realism; contemporary Ghanaian coastal life; human-scale performances; saturated indigo, lagoon teal, clay red and warm amber palette; natural skin texture; tactile fabric and weathered wood; 16:9 landscape widescreen composition; subtle film grain; expressive realistic lighting. No written words, no logos, no watermark, no distorted hands, no duplicate people. Scene S12 — Night of the Red Moon. EXTREME CLOSE shot, intimate frontal angle. Characters in frame: @AMA_ADJOVI (deep navy kaba blouse, hand-dyed indigo wrapper with tiny white wave motifs and flat leather sandals, three-strand amber bead necklace). Ama says memory is a signal someone must answer. Mood: revelatory and ancestral. Lighting: thin pre-dawn blue with a red moon fading behind cloud. Environment = Location Registry id 'OLD_BEACON_HUT': A derelict tidal beacon hut on a small lagoon sandbar: cracked whitewash walls, a rusted ladder, broken blue lantern glass, salt-stained timber, reed grass and sweeping water on every side.",</w:t>
         <w:br/>
-        <w:t xml:space="preserve">  "status": "⬜",</w:t>
+        <w:t xml:space="preserve">  "status": "✅",</w:t>
         <w:br/>
         <w:t xml:space="preserve">  "file": "images/act2/S12_Step07_ama_signal.png"</w:t>
         <w:br/>
@@ -8076,7 +8076,7 @@
         <w:br/>
         <w:t xml:space="preserve">  "prompt": "Grounded cinematic West African magical realism; contemporary Ghanaian coastal life; human-scale performances; saturated indigo, lagoon teal, clay red and warm amber palette; natural skin texture; tactile fabric and weathered wood; 16:9 landscape widescreen composition; subtle film grain; expressive realistic lighting. No written words, no logos, no watermark, no distorted hands, no duplicate people. Scene S12 — Night of the Red Moon. WIDE shot, low observational angle. Characters in frame: @AMA_ADJOVI (deep navy kaba blouse, hand-dyed indigo wrapper with tiny white wave motifs and flat leather sandals, three-strand amber bead necklace); @KOSI_MENSAH (indigo utility jumpsuit with rolled sleeves, sand-coloured work boots and a narrow woven kente belt, small gold Adinkra-disc earrings); @SENA_ADJOVI (mustard oversized hoodie, blue-and-white printed ankle skirt and worn white canvas trainers, turquoise over-ear radio headphones); @KOJO_DANSO (faded forest-green canvas jacket over a blue-and-cream striped shirt, charcoal trousers and rubber deck boots, weathered brass compass on a cord). The fading red moon frames the group in the beacon hut doorway. Mood: revelatory and ancestral. Lighting: thin pre-dawn blue with a red moon fading behind cloud. Environment = Location Registry id 'OLD_BEACON_HUT': A derelict tidal beacon hut on a small lagoon sandbar: cracked whitewash walls, a rusted ladder, broken blue lantern glass, salt-stained timber, reed grass and sweeping water on every side.",</w:t>
         <w:br/>
-        <w:t xml:space="preserve">  "status": "⬜",</w:t>
+        <w:t xml:space="preserve">  "status": "✅",</w:t>
         <w:br/>
         <w:t xml:space="preserve">  "file": "images/act2/S12_Step08_red_moon.png"</w:t>
         <w:br/>
@@ -8127,7 +8127,7 @@
         <w:br/>
         <w:t xml:space="preserve">  "prompt": "Grounded cinematic West African magical realism; contemporary Ghanaian coastal life; human-scale performances; saturated indigo, lagoon teal, clay red and warm amber palette; natural skin texture; tactile fabric and weathered wood; 16:9 landscape widescreen composition; subtle film grain; expressive realistic lighting. No written words, no logos, no watermark, no distorted hands, no duplicate people. Scene S12 — Night of the Red Moon. MEDIUM shot, handheld eye-level. Characters in frame: @SENA_ADJOVI (mustard oversized hoodie, blue-and-white printed ankle skirt and worn white canvas trainers, turquoise over-ear radio headphones). Sena repeats Ama's words into her pocket recorder, finding a new sign-off. Mood: revelatory and ancestral. Lighting: thin pre-dawn blue with a red moon fading behind cloud. Environment = Location Registry id 'OLD_BEACON_HUT': A derelict tidal beacon hut on a small lagoon sandbar: cracked whitewash walls, a rusted ladder, broken blue lantern glass, salt-stained timber, reed grass and sweeping water on every side.",</w:t>
         <w:br/>
-        <w:t xml:space="preserve">  "status": "⬜",</w:t>
+        <w:t xml:space="preserve">  "status": "✅",</w:t>
         <w:br/>
         <w:t xml:space="preserve">  "file": "images/act2/S12_Step09_sena_signoff.png"</w:t>
         <w:br/>
@@ -8190,7 +8190,7 @@
         <w:br/>
         <w:t xml:space="preserve">  "prompt": "Grounded cinematic West African magical realism; contemporary Ghanaian coastal life; human-scale performances; saturated indigo, lagoon teal, clay red and warm amber palette; natural skin texture; tactile fabric and weathered wood; 16:9 landscape widescreen composition; subtle film grain; expressive realistic lighting. No written words, no logos, no watermark, no distorted hands, no duplicate people. Scene S12 — Night of the Red Moon. WIDE shot, rear closing tableau. Characters in frame: @AMA_ADJOVI (deep navy kaba blouse, hand-dyed indigo wrapper with tiny white wave motifs and flat leather sandals, three-strand amber bead necklace); @KOSI_MENSAH (indigo utility jumpsuit with rolled sleeves, sand-coloured work boots and a narrow woven kente belt, small gold Adinkra-disc earrings); @SENA_ADJOVI (mustard oversized hoodie, blue-and-white printed ankle skirt and worn white canvas trainers, turquoise over-ear radio headphones); @KOJO_DANSO (faded forest-green canvas jacket over a blue-and-cream striped shirt, charcoal trousers and rubber deck boots, weathered brass compass on a cord). They leave the beacon hut carrying an old signal into first light. Mood: revelatory and ancestral. Lighting: thin pre-dawn blue with a red moon fading behind cloud. Environment = Location Registry id 'OLD_BEACON_HUT': A derelict tidal beacon hut on a small lagoon sandbar: cracked whitewash walls, a rusted ladder, broken blue lantern glass, salt-stained timber, reed grass and sweeping water on every side.",</w:t>
         <w:br/>
-        <w:t xml:space="preserve">  "status": "⬜",</w:t>
+        <w:t xml:space="preserve">  "status": "✅",</w:t>
         <w:br/>
         <w:t xml:space="preserve">  "file": "images/act2/S12_Step10_leaving_hut.png"</w:t>
         <w:br/>

</xml_diff>

<commit_message>
Generate River Remembers fish smoke yard batch
Co-authored-by: arena-agent <297053741+arena-agent@users.noreply.github.com>
</commit_message>
<xml_diff>
--- a/the_river_remembers/MASTER_DOCUMENT.docx
+++ b/the_river_remembers/MASTER_DOCUMENT.docx
@@ -8249,7 +8249,7 @@
         <w:br/>
         <w:t xml:space="preserve">  "prompt": "Grounded cinematic West African magical realism; contemporary Ghanaian coastal life; human-scale performances; saturated indigo, lagoon teal, clay red and warm amber palette; natural skin texture; tactile fabric and weathered wood; 16:9 landscape widescreen composition; subtle film grain; expressive realistic lighting. No written words, no logos, no watermark, no distorted hands, no duplicate people. Scene S13 — The Yard Stands Still. WIDE shot, high establishing angle. Characters in frame: @ESI_TETTEH (brick-red wax-print dress beneath a soot-black oilskin apron, patterned headwrap and sturdy black sandals, smooth charred-wood smoking paddle). Esi's smoke yard stands still: ovens cold, fish trays stacked, workers watching. Mood: defiant collective action. Lighting: white daylight softened by smoke haze. Environment = Location Registry id 'FISH_SMOKE_YARD': Esi's fish-smoking yard by the Afenyo market: low clay smoking ovens, blackened racks, woven fish trays, stacked firewood, haze of fragrant smoke, red earth and a glimpse of lagoon water.",</w:t>
         <w:br/>
-        <w:t xml:space="preserve">  "status": "⬜",</w:t>
+        <w:t xml:space="preserve">  "status": "✅",</w:t>
         <w:br/>
         <w:t xml:space="preserve">  "file": "images/act2/S13_Step01_smoke_yard.png"</w:t>
         <w:br/>
@@ -8300,7 +8300,7 @@
         <w:br/>
         <w:t xml:space="preserve">  "prompt": "Grounded cinematic West African magical realism; contemporary Ghanaian coastal life; human-scale performances; saturated indigo, lagoon teal, clay red and warm amber palette; natural skin texture; tactile fabric and weathered wood; 16:9 landscape widescreen composition; subtle film grain; expressive realistic lighting. No written words, no logos, no watermark, no distorted hands, no duplicate people. Scene S13 — The Yard Stands Still. MEDIUM shot, eye-level. Characters in frame: @ESI_TETTEH (brick-red wax-print dress beneath a soot-black oilskin apron, patterned headwrap and sturdy black sandals, smooth charred-wood smoking paddle). Esi raises her charred paddle and calls for a careful work stoppage. Mood: defiant collective action. Lighting: white daylight softened by smoke haze. Environment = Location Registry id 'FISH_SMOKE_YARD': Esi's fish-smoking yard by the Afenyo market: low clay smoking ovens, blackened racks, woven fish trays, stacked firewood, haze of fragrant smoke, red earth and a glimpse of lagoon water.",</w:t>
         <w:br/>
-        <w:t xml:space="preserve">  "status": "⬜",</w:t>
+        <w:t xml:space="preserve">  "status": "✅",</w:t>
         <w:br/>
         <w:t xml:space="preserve">  "file": "images/act2/S13_Step02_esi_calls_stop.png"</w:t>
         <w:br/>
@@ -8351,7 +8351,7 @@
         <w:br/>
         <w:t xml:space="preserve">  "prompt": "Grounded cinematic West African magical realism; contemporary Ghanaian coastal life; human-scale performances; saturated indigo, lagoon teal, clay red and warm amber palette; natural skin texture; tactile fabric and weathered wood; 16:9 landscape widescreen composition; subtle film grain; expressive realistic lighting. No written words, no logos, no watermark, no distorted hands, no duplicate people. Scene S13 — The Yard Stands Still. CLOSE shot, three-quarter profile. Characters in frame: @KOSI_MENSAH (indigo utility jumpsuit with rolled sleeves, sand-coloured work boots and a narrow woven kente belt, small gold Adinkra-disc earrings). Kosi holds water-sample results protected in a clear sleeve. Mood: defiant collective action. Lighting: white daylight softened by smoke haze. Environment = Location Registry id 'FISH_SMOKE_YARD': Esi's fish-smoking yard by the Afenyo market: low clay smoking ovens, blackened racks, woven fish trays, stacked firewood, haze of fragrant smoke, red earth and a glimpse of lagoon water.",</w:t>
         <w:br/>
-        <w:t xml:space="preserve">  "status": "⬜",</w:t>
+        <w:t xml:space="preserve">  "status": "✅",</w:t>
         <w:br/>
         <w:t xml:space="preserve">  "file": "images/act2/S13_Step03_kosi_results.png"</w:t>
         <w:br/>
@@ -8402,7 +8402,7 @@
         <w:br/>
         <w:t xml:space="preserve">  "prompt": "Grounded cinematic West African magical realism; contemporary Ghanaian coastal life; human-scale performances; saturated indigo, lagoon teal, clay red and warm amber palette; natural skin texture; tactile fabric and weathered wood; 16:9 landscape widescreen composition; subtle film grain; expressive realistic lighting. No written words, no logos, no watermark, no distorted hands, no duplicate people. Scene S13 — The Yard Stands Still. INSERT shot, top-down detail. Characters in frame: @ESI_TETTEH (brick-red wax-print dress beneath a soot-black oilskin apron, patterned headwrap and sturdy black sandals, smooth charred-wood smoking paddle). Woven fish trays make a nonviolent barrier across the resort road. Mood: defiant collective action. Lighting: white daylight softened by smoke haze. Environment = Location Registry id 'FISH_SMOKE_YARD': Esi's fish-smoking yard by the Afenyo market: low clay smoking ovens, blackened racks, woven fish trays, stacked firewood, haze of fragrant smoke, red earth and a glimpse of lagoon water.",</w:t>
         <w:br/>
-        <w:t xml:space="preserve">  "status": "⬜",</w:t>
+        <w:t xml:space="preserve">  "status": "✅",</w:t>
         <w:br/>
         <w:t xml:space="preserve">  "file": "images/act2/S13_Step04_fish_tray_barrier.png"</w:t>
         <w:br/>
@@ -8457,7 +8457,7 @@
         <w:br/>
         <w:t xml:space="preserve">  "prompt": "Grounded cinematic West African magical realism; contemporary Ghanaian coastal life; human-scale performances; saturated indigo, lagoon teal, clay red and warm amber palette; natural skin texture; tactile fabric and weathered wood; 16:9 landscape widescreen composition; subtle film grain; expressive realistic lighting. No written words, no logos, no watermark, no distorted hands, no duplicate people. Scene S13 — The Yard Stands Still. TWO-SHOT shot, eye-level. Characters in frame: @NII_LAMPTEY (tailored charcoal caftan with a subtle black geometric weave, polished black shoes and a silver wristwatch, black ebony walking cane with a carved heron handle); @ESI_TETTEH (brick-red wax-print dress beneath a soot-black oilskin apron, patterned headwrap and sturdy black sandals, smooth charred-wood smoking paddle). Nii arrives with his ebony heron cane as Esi meets him in the smoke. Mood: defiant collective action. Lighting: white daylight softened by smoke haze. Environment = Location Registry id 'FISH_SMOKE_YARD': Esi's fish-smoking yard by the Afenyo market: low clay smoking ovens, blackened racks, woven fish trays, stacked firewood, haze of fragrant smoke, red earth and a glimpse of lagoon water.",</w:t>
         <w:br/>
-        <w:t xml:space="preserve">  "status": "⬜",</w:t>
+        <w:t xml:space="preserve">  "status": "✅",</w:t>
         <w:br/>
         <w:t xml:space="preserve">  "file": "images/act2/S13_Step05_nii_arrives.png"</w:t>
         <w:br/>
@@ -8512,7 +8512,7 @@
         <w:br/>
         <w:t xml:space="preserve">  "prompt": "Grounded cinematic West African magical realism; contemporary Ghanaian coastal life; human-scale performances; saturated indigo, lagoon teal, clay red and warm amber palette; natural skin texture; tactile fabric and weathered wood; 16:9 landscape widescreen composition; subtle film grain; expressive realistic lighting. No written words, no logos, no watermark, no distorted hands, no duplicate people. Scene S13 — The Yard Stands Still. OVER-SHOULDER shot, over the lead character's shoulder. Characters in frame: @KOSI_MENSAH (indigo utility jumpsuit with rolled sleeves, sand-coloured work boots and a narrow woven kente belt, small gold Adinkra-disc earrings); @NII_LAMPTEY (tailored charcoal caftan with a subtle black geometric weave, polished black shoes and a silver wristwatch, black ebony walking cane with a carved heron handle). Over Kosi's shoulder, Nii refuses even to read the water results. Mood: defiant collective action. Lighting: white daylight softened by smoke haze. Environment = Location Registry id 'FISH_SMOKE_YARD': Esi's fish-smoking yard by the Afenyo market: low clay smoking ovens, blackened racks, woven fish trays, stacked firewood, haze of fragrant smoke, red earth and a glimpse of lagoon water.",</w:t>
         <w:br/>
-        <w:t xml:space="preserve">  "status": "⬜",</w:t>
+        <w:t xml:space="preserve">  "status": "✅",</w:t>
         <w:br/>
         <w:t xml:space="preserve">  "file": "images/act2/S13_Step06_proof_refused.png"</w:t>
         <w:br/>
@@ -8563,7 +8563,7 @@
         <w:br/>
         <w:t xml:space="preserve">  "prompt": "Grounded cinematic West African magical realism; contemporary Ghanaian coastal life; human-scale performances; saturated indigo, lagoon teal, clay red and warm amber palette; natural skin texture; tactile fabric and weathered wood; 16:9 landscape widescreen composition; subtle film grain; expressive realistic lighting. No written words, no logos, no watermark, no distorted hands, no duplicate people. Scene S13 — The Yard Stands Still. EXTREME CLOSE shot, intimate frontal angle. Characters in frame: @ESI_TETTEH (brick-red wax-print dress beneath a soot-black oilskin apron, patterned headwrap and sturdy black sandals, smooth charred-wood smoking paddle). Esi says theft does not become progress by wearing a hard hat. Mood: defiant collective action. Lighting: white daylight softened by smoke haze. Environment = Location Registry id 'FISH_SMOKE_YARD': Esi's fish-smoking yard by the Afenyo market: low clay smoking ovens, blackened racks, woven fish trays, stacked firewood, haze of fragrant smoke, red earth and a glimpse of lagoon water.",</w:t>
         <w:br/>
-        <w:t xml:space="preserve">  "status": "⬜",</w:t>
+        <w:t xml:space="preserve">  "status": "✅",</w:t>
         <w:br/>
         <w:t xml:space="preserve">  "file": "images/act2/S13_Step07_esi_defiance.png"</w:t>
         <w:br/>
@@ -8626,7 +8626,7 @@
         <w:br/>
         <w:t xml:space="preserve">  "prompt": "Grounded cinematic West African magical realism; contemporary Ghanaian coastal life; human-scale performances; saturated indigo, lagoon teal, clay red and warm amber palette; natural skin texture; tactile fabric and weathered wood; 16:9 landscape widescreen composition; subtle film grain; expressive realistic lighting. No written words, no logos, no watermark, no distorted hands, no duplicate people. Scene S13 — The Yard Stands Still. WIDE shot, low observational angle. Characters in frame: @ESI_TETTEH (brick-red wax-print dress beneath a soot-black oilskin apron, patterned headwrap and sturdy black sandals, smooth charred-wood smoking paddle); @KOSI_MENSAH (indigo utility jumpsuit with rolled sleeves, sand-coloured work boots and a narrow woven kente belt, small gold Adinkra-disc earrings); @SENA_ADJOVI (mustard oversized hoodie, blue-and-white printed ankle skirt and worn white canvas trainers, turquoise over-ear radio headphones); @NII_LAMPTEY (tailored charcoal caftan with a subtle black geometric weave, polished black shoes and a silver wristwatch, black ebony walking cane with a carved heron handle). Fish smokers stand shoulder to shoulder amid luminous smoke. Mood: defiant collective action. Lighting: white daylight softened by smoke haze. Environment = Location Registry id 'FISH_SMOKE_YARD': Esi's fish-smoking yard by the Afenyo market: low clay smoking ovens, blackened racks, woven fish trays, stacked firewood, haze of fragrant smoke, red earth and a glimpse of lagoon water.",</w:t>
         <w:br/>
-        <w:t xml:space="preserve">  "status": "⬜",</w:t>
+        <w:t xml:space="preserve">  "status": "✅",</w:t>
         <w:br/>
         <w:t xml:space="preserve">  "file": "images/act2/S13_Step08_yard_united.png"</w:t>
         <w:br/>
@@ -8677,7 +8677,7 @@
         <w:br/>
         <w:t xml:space="preserve">  "prompt": "Grounded cinematic West African magical realism; contemporary Ghanaian coastal life; human-scale performances; saturated indigo, lagoon teal, clay red and warm amber palette; natural skin texture; tactile fabric and weathered wood; 16:9 landscape widescreen composition; subtle film grain; expressive realistic lighting. No written words, no logos, no watermark, no distorted hands, no duplicate people. Scene S13 — The Yard Stands Still. MEDIUM shot, handheld eye-level. Characters in frame: @SENA_ADJOVI (mustard oversized hoodie, blue-and-white printed ankle skirt and worn white canvas trainers, turquoise over-ear radio headphones). Sena broadcasts Esi's words into her small microphone. Mood: defiant collective action. Lighting: white daylight softened by smoke haze. Environment = Location Registry id 'FISH_SMOKE_YARD': Esi's fish-smoking yard by the Afenyo market: low clay smoking ovens, blackened racks, woven fish trays, stacked firewood, haze of fragrant smoke, red earth and a glimpse of lagoon water.",</w:t>
         <w:br/>
-        <w:t xml:space="preserve">  "status": "⬜",</w:t>
+        <w:t xml:space="preserve">  "status": "✅",</w:t>
         <w:br/>
         <w:t xml:space="preserve">  "file": "images/act2/S13_Step09_sena_broadcasts.png"</w:t>
         <w:br/>
@@ -8732,7 +8732,7 @@
         <w:br/>
         <w:t xml:space="preserve">  "prompt": "Grounded cinematic West African magical realism; contemporary Ghanaian coastal life; human-scale performances; saturated indigo, lagoon teal, clay red and warm amber palette; natural skin texture; tactile fabric and weathered wood; 16:9 landscape widescreen composition; subtle film grain; expressive realistic lighting. No written words, no logos, no watermark, no distorted hands, no duplicate people. Scene S13 — The Yard Stands Still. WIDE shot, rear closing tableau. Characters in frame: @ESI_TETTEH (brick-red wax-print dress beneath a soot-black oilskin apron, patterned headwrap and sturdy black sandals, smooth charred-wood smoking paddle); @NII_LAMPTEY (tailored charcoal caftan with a subtle black geometric weave, polished black shoes and a silver wristwatch, black ebony walking cane with a carved heron handle). The smoke-yard standoff holds as the whole town watches. Mood: defiant collective action. Lighting: white daylight softened by smoke haze. Environment = Location Registry id 'FISH_SMOKE_YARD': Esi's fish-smoking yard by the Afenyo market: low clay smoking ovens, blackened racks, woven fish trays, stacked firewood, haze of fragrant smoke, red earth and a glimpse of lagoon water.",</w:t>
         <w:br/>
-        <w:t xml:space="preserve">  "status": "⬜",</w:t>
+        <w:t xml:space="preserve">  "status": "✅",</w:t>
         <w:br/>
         <w:t xml:space="preserve">  "file": "images/act2/S13_Step10_silent_standoff.png"</w:t>
         <w:br/>

</xml_diff>

<commit_message>
Generate River Remembers council archive batch
Co-authored-by: arena-agent <297053741+arena-agent@users.noreply.github.com>
</commit_message>
<xml_diff>
--- a/the_river_remembers/MASTER_DOCUMENT.docx
+++ b/the_river_remembers/MASTER_DOCUMENT.docx
@@ -8791,7 +8791,7 @@
         <w:br/>
         <w:t xml:space="preserve">  "prompt": "Grounded cinematic West African magical realism; contemporary Ghanaian coastal life; human-scale performances; saturated indigo, lagoon teal, clay red and warm amber palette; natural skin texture; tactile fabric and weathered wood; 16:9 landscape widescreen composition; subtle film grain; expressive realistic lighting. No written words, no logos, no watermark, no distorted hands, no duplicate people. Scene S14 — Archive of the Unheard. WIDE shot, high establishing angle. Characters in frame: @KWAME_AGYEMAN (white linen shirt under a caramel lightweight field jacket, dark tailored trousers and brown loafers, antique bronze lapel pin shaped like a compass rose). Kwame unlocks the dim archive beneath the assembly hall after hours. Mood: quiet betrayal turning toward alliance. Lighting: single green desk lamp, dust and darkness. Environment = Location Registry id 'COUNCIL_ARCHIVE': A dim records room beneath Afenyo's district assembly hall: metal filing shelves, bound land ledgers, dust motes, a scarred wooden table, a green-shaded desk lamp and narrow high windows.",</w:t>
         <w:br/>
-        <w:t xml:space="preserve">  "status": "⬜",</w:t>
+        <w:t xml:space="preserve">  "status": "✅",</w:t>
         <w:br/>
         <w:t xml:space="preserve">  "file": "images/act2/S14_Step01_archive_dark.png"</w:t>
         <w:br/>
@@ -8842,7 +8842,7 @@
         <w:br/>
         <w:t xml:space="preserve">  "prompt": "Grounded cinematic West African magical realism; contemporary Ghanaian coastal life; human-scale performances; saturated indigo, lagoon teal, clay red and warm amber palette; natural skin texture; tactile fabric and weathered wood; 16:9 landscape widescreen composition; subtle film grain; expressive realistic lighting. No written words, no logos, no watermark, no distorted hands, no duplicate people. Scene S14 — Archive of the Unheard. MEDIUM shot, eye-level. Characters in frame: @KOSI_MENSAH (indigo utility jumpsuit with rolled sleeves, sand-coloured work boots and a narrow woven kente belt, small gold Adinkra-disc earrings). Kosi searches rows of bound land ledgers with quick, careful hands. Mood: quiet betrayal turning toward alliance. Lighting: single green desk lamp, dust and darkness. Environment = Location Registry id 'COUNCIL_ARCHIVE': A dim records room beneath Afenyo's district assembly hall: metal filing shelves, bound land ledgers, dust motes, a scarred wooden table, a green-shaded desk lamp and narrow high windows.",</w:t>
         <w:br/>
-        <w:t xml:space="preserve">  "status": "⬜",</w:t>
+        <w:t xml:space="preserve">  "status": "✅",</w:t>
         <w:br/>
         <w:t xml:space="preserve">  "file": "images/act2/S14_Step02_kosi_files.png"</w:t>
         <w:br/>
@@ -8893,7 +8893,7 @@
         <w:br/>
         <w:t xml:space="preserve">  "prompt": "Grounded cinematic West African magical realism; contemporary Ghanaian coastal life; human-scale performances; saturated indigo, lagoon teal, clay red and warm amber palette; natural skin texture; tactile fabric and weathered wood; 16:9 landscape widescreen composition; subtle film grain; expressive realistic lighting. No written words, no logos, no watermark, no distorted hands, no duplicate people. Scene S14 — Archive of the Unheard. CLOSE shot, three-quarter profile. Characters in frame: @KWAME_AGYEMAN (white linen shirt under a caramel lightweight field jacket, dark tailored trousers and brown loafers, antique bronze lapel pin shaped like a compass rose). Kwame listens toward the stairwell while holding the keycard. Mood: quiet betrayal turning toward alliance. Lighting: single green desk lamp, dust and darkness. Environment = Location Registry id 'COUNCIL_ARCHIVE': A dim records room beneath Afenyo's district assembly hall: metal filing shelves, bound land ledgers, dust motes, a scarred wooden table, a green-shaded desk lamp and narrow high windows.",</w:t>
         <w:br/>
-        <w:t xml:space="preserve">  "status": "⬜",</w:t>
+        <w:t xml:space="preserve">  "status": "✅",</w:t>
         <w:br/>
         <w:t xml:space="preserve">  "file": "images/act2/S14_Step03_kwame_guard.png"</w:t>
         <w:br/>
@@ -8944,7 +8944,7 @@
         <w:br/>
         <w:t xml:space="preserve">  "prompt": "Grounded cinematic West African magical realism; contemporary Ghanaian coastal life; human-scale performances; saturated indigo, lagoon teal, clay red and warm amber palette; natural skin texture; tactile fabric and weathered wood; 16:9 landscape widescreen composition; subtle film grain; expressive realistic lighting. No written words, no logos, no watermark, no distorted hands, no duplicate people. Scene S14 — Archive of the Unheard. INSERT shot, top-down detail. Characters in frame: @KOSI_MENSAH (indigo utility jumpsuit with rolled sleeves, sand-coloured work boots and a narrow woven kente belt, small gold Adinkra-disc earrings). An original public-landing record opens beneath the green-shaded desk lamp. Mood: quiet betrayal turning toward alliance. Lighting: single green desk lamp, dust and darkness. Environment = Location Registry id 'COUNCIL_ARCHIVE': A dim records room beneath Afenyo's district assembly hall: metal filing shelves, bound land ledgers, dust motes, a scarred wooden table, a green-shaded desk lamp and narrow high windows.",</w:t>
         <w:br/>
-        <w:t xml:space="preserve">  "status": "⬜",</w:t>
+        <w:t xml:space="preserve">  "status": "✅",</w:t>
         <w:br/>
         <w:t xml:space="preserve">  "file": "images/act2/S14_Step04_original_deed.png"</w:t>
         <w:br/>
@@ -8999,7 +8999,7 @@
         <w:br/>
         <w:t xml:space="preserve">  "prompt": "Grounded cinematic West African magical realism; contemporary Ghanaian coastal life; human-scale performances; saturated indigo, lagoon teal, clay red and warm amber palette; natural skin texture; tactile fabric and weathered wood; 16:9 landscape widescreen composition; subtle film grain; expressive realistic lighting. No written words, no logos, no watermark, no distorted hands, no duplicate people. Scene S14 — Archive of the Unheard. TWO-SHOT shot, eye-level. Characters in frame: @KOSI_MENSAH (indigo utility jumpsuit with rolled sleeves, sand-coloured work boots and a narrow woven kente belt, small gold Adinkra-disc earrings); @KWAME_AGYEMAN (white linen shirt under a caramel lightweight field jacket, dark tailored trousers and brown loafers, antique bronze lapel pin shaped like a compass rose). Kosi and Kwame compare the recent amendment with the record that disproves it. Mood: quiet betrayal turning toward alliance. Lighting: single green desk lamp, dust and darkness. Environment = Location Registry id 'COUNCIL_ARCHIVE': A dim records room beneath Afenyo's district assembly hall: metal filing shelves, bound land ledgers, dust motes, a scarred wooden table, a green-shaded desk lamp and narrow high windows.",</w:t>
         <w:br/>
-        <w:t xml:space="preserve">  "status": "⬜",</w:t>
+        <w:t xml:space="preserve">  "status": "✅",</w:t>
         <w:br/>
         <w:t xml:space="preserve">  "file": "images/act2/S14_Step05_forged_amendment.png"</w:t>
         <w:br/>
@@ -9054,7 +9054,7 @@
         <w:br/>
         <w:t xml:space="preserve">  "prompt": "Grounded cinematic West African magical realism; contemporary Ghanaian coastal life; human-scale performances; saturated indigo, lagoon teal, clay red and warm amber palette; natural skin texture; tactile fabric and weathered wood; 16:9 landscape widescreen composition; subtle film grain; expressive realistic lighting. No written words, no logos, no watermark, no distorted hands, no duplicate people. Scene S14 — Archive of the Unheard. OVER-SHOULDER shot, over the lead character's shoulder. Characters in frame: @SENA_ADJOVI (mustard oversized hoodie, blue-and-white printed ankle skirt and worn white canvas trainers, turquoise over-ear radio headphones); @KOSI_MENSAH (indigo utility jumpsuit with rolled sleeves, sand-coloured work boots and a narrow woven kente belt, small gold Adinkra-disc earrings). Over Sena's shoulder, pages are photographed one after another. Mood: quiet betrayal turning toward alliance. Lighting: single green desk lamp, dust and darkness. Environment = Location Registry id 'COUNCIL_ARCHIVE': A dim records room beneath Afenyo's district assembly hall: metal filing shelves, bound land ledgers, dust motes, a scarred wooden table, a green-shaded desk lamp and narrow high windows.",</w:t>
         <w:br/>
-        <w:t xml:space="preserve">  "status": "⬜",</w:t>
+        <w:t xml:space="preserve">  "status": "✅",</w:t>
         <w:br/>
         <w:t xml:space="preserve">  "file": "images/act2/S14_Step06_sena_photographs.png"</w:t>
         <w:br/>
@@ -9105,7 +9105,7 @@
         <w:br/>
         <w:t xml:space="preserve">  "prompt": "Grounded cinematic West African magical realism; contemporary Ghanaian coastal life; human-scale performances; saturated indigo, lagoon teal, clay red and warm amber palette; natural skin texture; tactile fabric and weathered wood; 16:9 landscape widescreen composition; subtle film grain; expressive realistic lighting. No written words, no logos, no watermark, no distorted hands, no duplicate people. Scene S14 — Archive of the Unheard. EXTREME CLOSE shot, intimate frontal angle. Characters in frame: @KWAME_AGYEMAN (white linen shirt under a caramel lightweight field jacket, dark tailored trousers and brown loafers, antique bronze lapel pin shaped like a compass rose). Kwame admits that releasing the files will finish him at the council. Mood: quiet betrayal turning toward alliance. Lighting: single green desk lamp, dust and darkness. Environment = Location Registry id 'COUNCIL_ARCHIVE': A dim records room beneath Afenyo's district assembly hall: metal filing shelves, bound land ledgers, dust motes, a scarred wooden table, a green-shaded desk lamp and narrow high windows.",</w:t>
         <w:br/>
-        <w:t xml:space="preserve">  "status": "⬜",</w:t>
+        <w:t xml:space="preserve">  "status": "✅",</w:t>
         <w:br/>
         <w:t xml:space="preserve">  "file": "images/act2/S14_Step07_kwame_confesses.png"</w:t>
         <w:br/>
@@ -9164,7 +9164,7 @@
         <w:br/>
         <w:t xml:space="preserve">  "prompt": "Grounded cinematic West African magical realism; contemporary Ghanaian coastal life; human-scale performances; saturated indigo, lagoon teal, clay red and warm amber palette; natural skin texture; tactile fabric and weathered wood; 16:9 landscape widescreen composition; subtle film grain; expressive realistic lighting. No written words, no logos, no watermark, no distorted hands, no duplicate people. Scene S14 — Archive of the Unheard. WIDE shot, low observational angle. Characters in frame: @KOSI_MENSAH (indigo utility jumpsuit with rolled sleeves, sand-coloured work boots and a narrow woven kente belt, small gold Adinkra-disc earrings); @KWAME_AGYEMAN (white linen shirt under a caramel lightweight field jacket, dark tailored trousers and brown loafers, antique bronze lapel pin shaped like a compass rose); @SENA_ADJOVI (mustard oversized hoodie, blue-and-white printed ankle skirt and worn white canvas trainers, turquoise over-ear radio headphones). Dusty shelves close around the three as a sound rises in the stairwell. Mood: quiet betrayal turning toward alliance. Lighting: single green desk lamp, dust and darkness. Environment = Location Registry id 'COUNCIL_ARCHIVE': A dim records room beneath Afenyo's district assembly hall: metal filing shelves, bound land ledgers, dust motes, a scarred wooden table, a green-shaded desk lamp and narrow high windows.",</w:t>
         <w:br/>
-        <w:t xml:space="preserve">  "status": "⬜",</w:t>
+        <w:t xml:space="preserve">  "status": "✅",</w:t>
         <w:br/>
         <w:t xml:space="preserve">  "file": "images/act2/S14_Step08_three_in_dust.png"</w:t>
         <w:br/>
@@ -9219,7 +9219,7 @@
         <w:br/>
         <w:t xml:space="preserve">  "prompt": "Grounded cinematic West African magical realism; contemporary Ghanaian coastal life; human-scale performances; saturated indigo, lagoon teal, clay red and warm amber palette; natural skin texture; tactile fabric and weathered wood; 16:9 landscape widescreen composition; subtle film grain; expressive realistic lighting. No written words, no logos, no watermark, no distorted hands, no duplicate people. Scene S14 — Archive of the Unheard. MEDIUM shot, handheld eye-level. Characters in frame: @KOSI_MENSAH (indigo utility jumpsuit with rolled sleeves, sand-coloured work boots and a narrow woven kente belt, small gold Adinkra-disc earrings); @KWAME_AGYEMAN (white linen shirt under a caramel lightweight field jacket, dark tailored trousers and brown loafers, antique bronze lapel pin shaped like a compass rose). Kwame places the archive keycard in Kosi's open palm. Mood: quiet betrayal turning toward alliance. Lighting: single green desk lamp, dust and darkness. Environment = Location Registry id 'COUNCIL_ARCHIVE': A dim records room beneath Afenyo's district assembly hall: metal filing shelves, bound land ledgers, dust motes, a scarred wooden table, a green-shaded desk lamp and narrow high windows.",</w:t>
         <w:br/>
-        <w:t xml:space="preserve">  "status": "⬜",</w:t>
+        <w:t xml:space="preserve">  "status": "✅",</w:t>
         <w:br/>
         <w:t xml:space="preserve">  "file": "images/act2/S14_Step09_keycard_handoff.png"</w:t>
         <w:br/>
@@ -9278,7 +9278,7 @@
         <w:br/>
         <w:t xml:space="preserve">  "prompt": "Grounded cinematic West African magical realism; contemporary Ghanaian coastal life; human-scale performances; saturated indigo, lagoon teal, clay red and warm amber palette; natural skin texture; tactile fabric and weathered wood; 16:9 landscape widescreen composition; subtle film grain; expressive realistic lighting. No written words, no logos, no watermark, no distorted hands, no duplicate people. Scene S14 — Archive of the Unheard. WIDE shot, rear closing tableau. Characters in frame: @KOSI_MENSAH (indigo utility jumpsuit with rolled sleeves, sand-coloured work boots and a narrow woven kente belt, small gold Adinkra-disc earrings); @KWAME_AGYEMAN (white linen shirt under a caramel lightweight field jacket, dark tailored trousers and brown loafers, antique bronze lapel pin shaped like a compass rose); @SENA_ADJOVI (mustard oversized hoodie, blue-and-white printed ankle skirt and worn white canvas trainers, turquoise over-ear radio headphones). The trio slips from the dark archive carrying copied proof. Mood: quiet betrayal turning toward alliance. Lighting: single green desk lamp, dust and darkness. Environment = Location Registry id 'COUNCIL_ARCHIVE': A dim records room beneath Afenyo's district assembly hall: metal filing shelves, bound land ledgers, dust motes, a scarred wooden table, a green-shaded desk lamp and narrow high windows.",</w:t>
         <w:br/>
-        <w:t xml:space="preserve">  "status": "⬜",</w:t>
+        <w:t xml:space="preserve">  "status": "✅",</w:t>
         <w:br/>
         <w:t xml:space="preserve">  "file": "images/act2/S14_Step10_escape_archive.png"</w:t>
         <w:br/>

</xml_diff>

<commit_message>
Complete River Remembers second act storyboard
Co-authored-by: arena-agent <297053741+arena-agent@users.noreply.github.com>
</commit_message>
<xml_diff>
--- a/the_river_remembers/MASTER_DOCUMENT.docx
+++ b/the_river_remembers/MASTER_DOCUMENT.docx
@@ -9345,7 +9345,7 @@
         <w:br/>
         <w:t xml:space="preserve">  "prompt": "Grounded cinematic West African magical realism; contemporary Ghanaian coastal life; human-scale performances; saturated indigo, lagoon teal, clay red and warm amber palette; natural skin texture; tactile fabric and weathered wood; 16:9 landscape widescreen composition; subtle film grain; expressive realistic lighting. No written words, no logos, no watermark, no distorted hands, no duplicate people. Scene S15 — When the Power Fails. WIDE shot, high establishing angle. Characters in frame: @KOSI_MENSAH (indigo utility jumpsuit with rolled sleeves, sand-coloured work boots and a narrow woven kente belt, small gold Adinkra-disc earrings); @ESI_TETTEH (brick-red wax-print dress beneath a soot-black oilskin apron, patterned headwrap and sturdy black sandals, smooth charred-wood smoking paddle); @SENA_ADJOVI (mustard oversized hoodie, blue-and-white printed ankle skirt and worn white canvas trainers, turquoise over-ear radio headphones). The lagoon promenade falls suddenly dark as a meeting gathers at dusk. Mood: loss becoming a plan. Lighting: sudden blackout, last coral sunset and handmade lantern glow. Environment = Location Registry id 'LAGOON_PROMENADE': Afenyo's public lagoon promenade at dusk: a cracked concrete path, low sea wall, fishing boats, flowering bougainvillea, street vendors, fading coral sky and the resort fence in the far distance.",</w:t>
         <w:br/>
-        <w:t xml:space="preserve">  "status": "⬜",</w:t>
+        <w:t xml:space="preserve">  "status": "✅",</w:t>
         <w:br/>
         <w:t xml:space="preserve">  "file": "images/act2/S15_Step01_promenade_blackout.png"</w:t>
         <w:br/>
@@ -9396,7 +9396,7 @@
         <w:br/>
         <w:t xml:space="preserve">  "prompt": "Grounded cinematic West African magical realism; contemporary Ghanaian coastal life; human-scale performances; saturated indigo, lagoon teal, clay red and warm amber palette; natural skin texture; tactile fabric and weathered wood; 16:9 landscape widescreen composition; subtle film grain; expressive realistic lighting. No written words, no logos, no watermark, no distorted hands, no duplicate people. Scene S15 — When the Power Fails. MEDIUM shot, eye-level. Characters in frame: @SENA_ADJOVI (mustard oversized hoodie, blue-and-white printed ankle skirt and worn white canvas trainers, turquoise over-ear radio headphones). Phone lights bloom in the crowd beneath a fading coral sky. Mood: loss becoming a plan. Lighting: sudden blackout, last coral sunset and handmade lantern glow. Environment = Location Registry id 'LAGOON_PROMENADE': Afenyo's public lagoon promenade at dusk: a cracked concrete path, low sea wall, fishing boats, flowering bougainvillea, street vendors, fading coral sky and the resort fence in the far distance.",</w:t>
         <w:br/>
-        <w:t xml:space="preserve">  "status": "⬜",</w:t>
+        <w:t xml:space="preserve">  "status": "✅",</w:t>
         <w:br/>
         <w:t xml:space="preserve">  "file": "images/act2/S15_Step02_phone_lights.png"</w:t>
         <w:br/>
@@ -9447,7 +9447,7 @@
         <w:br/>
         <w:t xml:space="preserve">  "prompt": "Grounded cinematic West African magical realism; contemporary Ghanaian coastal life; human-scale performances; saturated indigo, lagoon teal, clay red and warm amber palette; natural skin texture; tactile fabric and weathered wood; 16:9 landscape widescreen composition; subtle film grain; expressive realistic lighting. No written words, no logos, no watermark, no distorted hands, no duplicate people. Scene S15 — When the Power Fails. CLOSE shot, three-quarter profile. Characters in frame: @AMA_ADJOVI (deep navy kaba blouse, hand-dyed indigo wrapper with tiny white wave motifs and flat leather sandals, three-strand amber bead necklace). Ama briefly loses strength beside the cracked sea wall. Mood: loss becoming a plan. Lighting: sudden blackout, last coral sunset and handmade lantern glow. Environment = Location Registry id 'LAGOON_PROMENADE': Afenyo's public lagoon promenade at dusk: a cracked concrete path, low sea wall, fishing boats, flowering bougainvillea, street vendors, fading coral sky and the resort fence in the far distance.",</w:t>
         <w:br/>
-        <w:t xml:space="preserve">  "status": "⬜",</w:t>
+        <w:t xml:space="preserve">  "status": "✅",</w:t>
         <w:br/>
         <w:t xml:space="preserve">  "file": "images/act2/S15_Step03_ama_falters.png"</w:t>
         <w:br/>
@@ -9502,7 +9502,7 @@
         <w:br/>
         <w:t xml:space="preserve">  "prompt": "Grounded cinematic West African magical realism; contemporary Ghanaian coastal life; human-scale performances; saturated indigo, lagoon teal, clay red and warm amber palette; natural skin texture; tactile fabric and weathered wood; 16:9 landscape widescreen composition; subtle film grain; expressive realistic lighting. No written words, no logos, no watermark, no distorted hands, no duplicate people. Scene S15 — When the Power Fails. INSERT shot, top-down detail. Characters in frame: @KOSI_MENSAH (indigo utility jumpsuit with rolled sleeves, sand-coloured work boots and a narrow woven kente belt, small gold Adinkra-disc earrings); @AMA_ADJOVI (deep navy kaba blouse, hand-dyed indigo wrapper with tiny white wave motifs and flat leather sandals, three-strand amber bead necklace). Kosi catches Ama and steadies her with quiet concern. Mood: loss becoming a plan. Lighting: sudden blackout, last coral sunset and handmade lantern glow. Environment = Location Registry id 'LAGOON_PROMENADE': Afenyo's public lagoon promenade at dusk: a cracked concrete path, low sea wall, fishing boats, flowering bougainvillea, street vendors, fading coral sky and the resort fence in the far distance.",</w:t>
         <w:br/>
-        <w:t xml:space="preserve">  "status": "⬜",</w:t>
+        <w:t xml:space="preserve">  "status": "✅",</w:t>
         <w:br/>
         <w:t xml:space="preserve">  "file": "images/act2/S15_Step04_kosi_supports_ama.png"</w:t>
         <w:br/>
@@ -9557,7 +9557,7 @@
         <w:br/>
         <w:t xml:space="preserve">  "prompt": "Grounded cinematic West African magical realism; contemporary Ghanaian coastal life; human-scale performances; saturated indigo, lagoon teal, clay red and warm amber palette; natural skin texture; tactile fabric and weathered wood; 16:9 landscape widescreen composition; subtle film grain; expressive realistic lighting. No written words, no logos, no watermark, no distorted hands, no duplicate people. Scene S15 — When the Power Fails. TWO-SHOT shot, eye-level. Characters in frame: @ESI_TETTEH (brick-red wax-print dress beneath a soot-black oilskin apron, patterned headwrap and sturdy black sandals, smooth charred-wood smoking paddle); @KOSI_MENSAH (indigo utility jumpsuit with rolled sleeves, sand-coloured work boots and a narrow woven kente belt, small gold Adinkra-disc earrings). Esi asks who will light the town's hearing. Mood: loss becoming a plan. Lighting: sudden blackout, last coral sunset and handmade lantern glow. Environment = Location Registry id 'LAGOON_PROMENADE': Afenyo's public lagoon promenade at dusk: a cracked concrete path, low sea wall, fishing boats, flowering bougainvillea, street vendors, fading coral sky and the resort fence in the far distance.",</w:t>
         <w:br/>
-        <w:t xml:space="preserve">  "status": "⬜",</w:t>
+        <w:t xml:space="preserve">  "status": "✅",</w:t>
         <w:br/>
         <w:t xml:space="preserve">  "file": "images/act2/S15_Step05_esi_asks_who.png"</w:t>
         <w:br/>
@@ -9612,7 +9612,7 @@
         <w:br/>
         <w:t xml:space="preserve">  "prompt": "Grounded cinematic West African magical realism; contemporary Ghanaian coastal life; human-scale performances; saturated indigo, lagoon teal, clay red and warm amber palette; natural skin texture; tactile fabric and weathered wood; 16:9 landscape widescreen composition; subtle film grain; expressive realistic lighting. No written words, no logos, no watermark, no distorted hands, no duplicate people. Scene S15 — When the Power Fails. OVER-SHOULDER shot, over the lead character's shoulder. Characters in frame: @KOSI_MENSAH (indigo utility jumpsuit with rolled sleeves, sand-coloured work boots and a narrow woven kente belt, small gold Adinkra-disc earrings); @ESI_TETTEH (brick-red wax-print dress beneath a soot-black oilskin apron, patterned headwrap and sturdy black sandals, smooth charred-wood smoking paddle). Over Kosi's shoulder, Kosi points toward the distant beacon and explains the broadcast plan. Mood: loss becoming a plan. Lighting: sudden blackout, last coral sunset and handmade lantern glow. Environment = Location Registry id 'LAGOON_PROMENADE': Afenyo's public lagoon promenade at dusk: a cracked concrete path, low sea wall, fishing boats, flowering bougainvillea, street vendors, fading coral sky and the resort fence in the far distance.",</w:t>
         <w:br/>
-        <w:t xml:space="preserve">  "status": "⬜",</w:t>
+        <w:t xml:space="preserve">  "status": "✅",</w:t>
         <w:br/>
         <w:t xml:space="preserve">  "file": "images/act2/S15_Step06_kosi_beacon_plan.png"</w:t>
         <w:br/>
@@ -9663,7 +9663,7 @@
         <w:br/>
         <w:t xml:space="preserve">  "prompt": "Grounded cinematic West African magical realism; contemporary Ghanaian coastal life; human-scale performances; saturated indigo, lagoon teal, clay red and warm amber palette; natural skin texture; tactile fabric and weathered wood; 16:9 landscape widescreen composition; subtle film grain; expressive realistic lighting. No written words, no logos, no watermark, no distorted hands, no duplicate people. Scene S15 — When the Power Fails. EXTREME CLOSE shot, intimate frontal angle. Characters in frame: @AMA_ADJOVI (deep navy kaba blouse, hand-dyed indigo wrapper with tiny white wave motifs and flat leather sandals, three-strand amber bead necklace). Ama regains her breath and looks toward the handmade lights. Mood: loss becoming a plan. Lighting: sudden blackout, last coral sunset and handmade lantern glow. Environment = Location Registry id 'LAGOON_PROMENADE': Afenyo's public lagoon promenade at dusk: a cracked concrete path, low sea wall, fishing boats, flowering bougainvillea, street vendors, fading coral sky and the resort fence in the far distance.",</w:t>
         <w:br/>
-        <w:t xml:space="preserve">  "status": "⬜",</w:t>
+        <w:t xml:space="preserve">  "status": "✅",</w:t>
         <w:br/>
         <w:t xml:space="preserve">  "file": "images/act2/S15_Step07_ama_recovers.png"</w:t>
         <w:br/>
@@ -9730,7 +9730,7 @@
         <w:br/>
         <w:t xml:space="preserve">  "prompt": "Grounded cinematic West African magical realism; contemporary Ghanaian coastal life; human-scale performances; saturated indigo, lagoon teal, clay red and warm amber palette; natural skin texture; tactile fabric and weathered wood; 16:9 landscape widescreen composition; subtle film grain; expressive realistic lighting. No written words, no logos, no watermark, no distorted hands, no duplicate people. Scene S15 — When the Power Fails. WIDE shot, low observational angle. Characters in frame: @KOSI_MENSAH (indigo utility jumpsuit with rolled sleeves, sand-coloured work boots and a narrow woven kente belt, small gold Adinkra-disc earrings); @AMA_ADJOVI (deep navy kaba blouse, hand-dyed indigo wrapper with tiny white wave motifs and flat leather sandals, three-strand amber bead necklace); @ESI_TETTEH (brick-red wax-print dress beneath a soot-black oilskin apron, patterned headwrap and sturdy black sandals, smooth charred-wood smoking paddle); @SENA_ADJOVI (mustard oversized hoodie, blue-and-white printed ankle skirt and worn white canvas trainers, turquoise over-ear radio headphones); @KOJO_DANSO (faded forest-green canvas jacket over a blue-and-cream striped shirt, charcoal trousers and rubber deck boots, weathered brass compass on a cord). Residents raise lanterns along the dark promenade. Mood: loss becoming a plan. Lighting: sudden blackout, last coral sunset and handmade lantern glow. Environment = Location Registry id 'LAGOON_PROMENADE': Afenyo's public lagoon promenade at dusk: a cracked concrete path, low sea wall, fishing boats, flowering bougainvillea, street vendors, fading coral sky and the resort fence in the far distance.",</w:t>
         <w:br/>
-        <w:t xml:space="preserve">  "status": "⬜",</w:t>
+        <w:t xml:space="preserve">  "status": "✅",</w:t>
         <w:br/>
         <w:t xml:space="preserve">  "file": "images/act2/S15_Step08_people_lanterns.png"</w:t>
         <w:br/>
@@ -9781,7 +9781,7 @@
         <w:br/>
         <w:t xml:space="preserve">  "prompt": "Grounded cinematic West African magical realism; contemporary Ghanaian coastal life; human-scale performances; saturated indigo, lagoon teal, clay red and warm amber palette; natural skin texture; tactile fabric and weathered wood; 16:9 landscape widescreen composition; subtle film grain; expressive realistic lighting. No written words, no logos, no watermark, no distorted hands, no duplicate people. Scene S15 — When the Power Fails. MEDIUM shot, handheld eye-level. Characters in frame: @KOSI_MENSAH (indigo utility jumpsuit with rolled sleeves, sand-coloured work boots and a narrow woven kente belt, small gold Adinkra-disc earrings). Kosi says the town will light itself, resolve clear in her face. Mood: loss becoming a plan. Lighting: sudden blackout, last coral sunset and handmade lantern glow. Environment = Location Registry id 'LAGOON_PROMENADE': Afenyo's public lagoon promenade at dusk: a cracked concrete path, low sea wall, fishing boats, flowering bougainvillea, street vendors, fading coral sky and the resort fence in the far distance.",</w:t>
         <w:br/>
-        <w:t xml:space="preserve">  "status": "⬜",</w:t>
+        <w:t xml:space="preserve">  "status": "✅",</w:t>
         <w:br/>
         <w:t xml:space="preserve">  "file": "images/act2/S15_Step09_all_of_us.png"</w:t>
         <w:br/>
@@ -9848,7 +9848,7 @@
         <w:br/>
         <w:t xml:space="preserve">  "prompt": "Grounded cinematic West African magical realism; contemporary Ghanaian coastal life; human-scale performances; saturated indigo, lagoon teal, clay red and warm amber palette; natural skin texture; tactile fabric and weathered wood; 16:9 landscape widescreen composition; subtle film grain; expressive realistic lighting. No written words, no logos, no watermark, no distorted hands, no duplicate people. Scene S15 — When the Power Fails. WIDE shot, rear closing tableau. Characters in frame: @KOSI_MENSAH (indigo utility jumpsuit with rolled sleeves, sand-coloured work boots and a narrow woven kente belt, small gold Adinkra-disc earrings); @AMA_ADJOVI (deep navy kaba blouse, hand-dyed indigo wrapper with tiny white wave motifs and flat leather sandals, three-strand amber bead necklace); @ESI_TETTEH (brick-red wax-print dress beneath a soot-black oilskin apron, patterned headwrap and sturdy black sandals, smooth charred-wood smoking paddle); @SENA_ADJOVI (mustard oversized hoodie, blue-and-white printed ankle skirt and worn white canvas trainers, turquoise over-ear radio headphones); @KOJO_DANSO (faded forest-green canvas jacket over a blue-and-cream striped shirt, charcoal trousers and rubber deck boots, weathered brass compass on a cord). Lantern light draws a communal line along the lagoon at dusk. Mood: loss becoming a plan. Lighting: sudden blackout, last coral sunset and handmade lantern glow. Environment = Location Registry id 'LAGOON_PROMENADE': Afenyo's public lagoon promenade at dusk: a cracked concrete path, low sea wall, fishing boats, flowering bougainvillea, street vendors, fading coral sky and the resort fence in the far distance.",</w:t>
         <w:br/>
-        <w:t xml:space="preserve">  "status": "⬜",</w:t>
+        <w:t xml:space="preserve">  "status": "✅",</w:t>
         <w:br/>
         <w:t xml:space="preserve">  "file": "images/act2/S15_Step10_dusk_commitment.png"</w:t>
         <w:br/>

</xml_diff>

<commit_message>
Generate first River Remembers final act batch
Co-authored-by: arena-agent <297053741+arena-agent@users.noreply.github.com>
</commit_message>
<xml_diff>
--- a/the_river_remembers/MASTER_DOCUMENT.docx
+++ b/the_river_remembers/MASTER_DOCUMENT.docx
@@ -9923,7 +9923,7 @@
         <w:br/>
         <w:t xml:space="preserve">  "prompt": "Grounded cinematic West African magical realism; contemporary Ghanaian coastal life; human-scale performances; saturated indigo, lagoon teal, clay red and warm amber palette; natural skin texture; tactile fabric and weathered wood; 16:9 landscape widescreen composition; subtle film grain; expressive realistic lighting. No written words, no logos, no watermark, no distorted hands, no duplicate people. Scene S16 — A Thousand Small Lights. WIDE shot, high establishing angle. Characters in frame: @KOSI_MENSAH (indigo utility jumpsuit with rolled sleeves, sand-coloured work boots and a narrow woven kente belt, small gold Adinkra-disc earrings); @AMA_ADJOVI (deep navy kaba blouse, hand-dyed indigo wrapper with tiny white wave motifs and flat leather sandals, three-strand amber bead necklace); @SENA_ADJOVI (mustard oversized hoodie, blue-and-white printed ankle skirt and worn white canvas trainers, turquoise over-ear radio headphones); @KOJO_DANSO (faded forest-green canvas jacket over a blue-and-cream striped shirt, charcoal trousers and rubber deck boots, weathered brass compass on a cord); @ESI_TETTEH (brick-red wax-print dress beneath a soot-black oilskin apron, patterned headwrap and sturdy black sandals, smooth charred-wood smoking paddle). Festival Square fills with people building lanterns beneath the silk-cotton tree. Mood: communal preparation. Lighting: fresh sun, bright fabrics and building anticipation. Environment = Location Registry id 'FESTIVAL_SQUARE': Afenyo's central festival square at blue hour: packed red-earth ground, a large silk-cotton tree, simple wooden platform, strings of unlit handmade lanterns, market stalls and the compound roofs beyond.",</w:t>
         <w:br/>
-        <w:t xml:space="preserve">  "status": "⬜",</w:t>
+        <w:t xml:space="preserve">  "status": "✅",</w:t>
         <w:br/>
         <w:t xml:space="preserve">  "file": "images/act3/S16_Step01_square_preparation.png"</w:t>
         <w:br/>
@@ -9974,7 +9974,7 @@
         <w:br/>
         <w:t xml:space="preserve">  "prompt": "Grounded cinematic West African magical realism; contemporary Ghanaian coastal life; human-scale performances; saturated indigo, lagoon teal, clay red and warm amber palette; natural skin texture; tactile fabric and weathered wood; 16:9 landscape widescreen composition; subtle film grain; expressive realistic lighting. No written words, no logos, no watermark, no distorted hands, no duplicate people. Scene S16 — A Thousand Small Lights. MEDIUM shot, eye-level. Characters in frame: @KOSI_MENSAH (indigo utility jumpsuit with rolled sleeves, sand-coloured work boots and a narrow woven kente belt, small gold Adinkra-disc earrings). Kosi teaches children to connect safe low-voltage solar cells. Mood: communal preparation. Lighting: fresh sun, bright fabrics and building anticipation. Environment = Location Registry id 'FESTIVAL_SQUARE': Afenyo's central festival square at blue hour: packed red-earth ground, a large silk-cotton tree, simple wooden platform, strings of unlit handmade lanterns, market stalls and the compound roofs beyond.",</w:t>
         <w:br/>
-        <w:t xml:space="preserve">  "status": "⬜",</w:t>
+        <w:t xml:space="preserve">  "status": "✅",</w:t>
         <w:br/>
         <w:t xml:space="preserve">  "file": "images/act3/S16_Step02_kosi_teaches.png"</w:t>
         <w:br/>
@@ -10025,7 +10025,7 @@
         <w:br/>
         <w:t xml:space="preserve">  "prompt": "Grounded cinematic West African magical realism; contemporary Ghanaian coastal life; human-scale performances; saturated indigo, lagoon teal, clay red and warm amber palette; natural skin texture; tactile fabric and weathered wood; 16:9 landscape widescreen composition; subtle film grain; expressive realistic lighting. No written words, no logos, no watermark, no distorted hands, no duplicate people. Scene S16 — A Thousand Small Lights. CLOSE shot, three-quarter profile. Characters in frame: @AMA_ADJOVI (deep navy kaba blouse, hand-dyed indigo wrapper with tiny white wave motifs and flat leather sandals, three-strand amber bead necklace). Ama sorts blue glass panes with her amber beads catching the morning sun. Mood: communal preparation. Lighting: fresh sun, bright fabrics and building anticipation. Environment = Location Registry id 'FESTIVAL_SQUARE': Afenyo's central festival square at blue hour: packed red-earth ground, a large silk-cotton tree, simple wooden platform, strings of unlit handmade lanterns, market stalls and the compound roofs beyond.",</w:t>
         <w:br/>
-        <w:t xml:space="preserve">  "status": "⬜",</w:t>
+        <w:t xml:space="preserve">  "status": "✅",</w:t>
         <w:br/>
         <w:t xml:space="preserve">  "file": "images/act3/S16_Step03_ama_glass.png"</w:t>
         <w:br/>
@@ -10076,7 +10076,7 @@
         <w:br/>
         <w:t xml:space="preserve">  "prompt": "Grounded cinematic West African magical realism; contemporary Ghanaian coastal life; human-scale performances; saturated indigo, lagoon teal, clay red and warm amber palette; natural skin texture; tactile fabric and weathered wood; 16:9 landscape widescreen composition; subtle film grain; expressive realistic lighting. No written words, no logos, no watermark, no distorted hands, no duplicate people. Scene S16 — A Thousand Small Lights. INSERT shot, top-down detail. Characters in frame: @KOSI_MENSAH (indigo utility jumpsuit with rolled sleeves, sand-coloured work boots and a narrow woven kente belt, small gold Adinkra-disc earrings). Hands arrange recycled solar cells, blue glass and copper wire on red earth. Mood: communal preparation. Lighting: fresh sun, bright fabrics and building anticipation. Environment = Location Registry id 'FESTIVAL_SQUARE': Afenyo's central festival square at blue hour: packed red-earth ground, a large silk-cotton tree, simple wooden platform, strings of unlit handmade lanterns, market stalls and the compound roofs beyond.",</w:t>
         <w:br/>
-        <w:t xml:space="preserve">  "status": "⬜",</w:t>
+        <w:t xml:space="preserve">  "status": "✅",</w:t>
         <w:br/>
         <w:t xml:space="preserve">  "file": "images/act3/S16_Step04_lantern_parts.png"</w:t>
         <w:br/>
@@ -10127,7 +10127,7 @@
         <w:br/>
         <w:t xml:space="preserve">  "prompt": "Grounded cinematic West African magical realism; contemporary Ghanaian coastal life; human-scale performances; saturated indigo, lagoon teal, clay red and warm amber palette; natural skin texture; tactile fabric and weathered wood; 16:9 landscape widescreen composition; subtle film grain; expressive realistic lighting. No written words, no logos, no watermark, no distorted hands, no duplicate people. Scene S16 — A Thousand Small Lights. TWO-SHOT shot, eye-level. Characters in frame: @ESI_TETTEH (brick-red wax-print dress beneath a soot-black oilskin apron, patterned headwrap and sturdy black sandals, smooth charred-wood smoking paddle). Esi directs food, work tables and volunteers with her smoking paddle. Mood: communal preparation. Lighting: fresh sun, bright fabrics and building anticipation. Environment = Location Registry id 'FESTIVAL_SQUARE': Afenyo's central festival square at blue hour: packed red-earth ground, a large silk-cotton tree, simple wooden platform, strings of unlit handmade lanterns, market stalls and the compound roofs beyond.",</w:t>
         <w:br/>
-        <w:t xml:space="preserve">  "status": "⬜",</w:t>
+        <w:t xml:space="preserve">  "status": "✅",</w:t>
         <w:br/>
         <w:t xml:space="preserve">  "file": "images/act3/S16_Step05_esi_coordinates.png"</w:t>
         <w:br/>
@@ -10182,7 +10182,7 @@
         <w:br/>
         <w:t xml:space="preserve">  "prompt": "Grounded cinematic West African magical realism; contemporary Ghanaian coastal life; human-scale performances; saturated indigo, lagoon teal, clay red and warm amber palette; natural skin texture; tactile fabric and weathered wood; 16:9 landscape widescreen composition; subtle film grain; expressive realistic lighting. No written words, no logos, no watermark, no distorted hands, no duplicate people. Scene S16 — A Thousand Small Lights. OVER-SHOULDER shot, over the lead character's shoulder. Characters in frame: @KWAME_AGYEMAN (white linen shirt under a caramel lightweight field jacket, dark tailored trousers and brown loafers, antique bronze lapel pin shaped like a compass rose); @KOSI_MENSAH (indigo utility jumpsuit with rolled sleeves, sand-coloured work boots and a narrow woven kente belt, small gold Adinkra-disc earrings). Over Kosi's shoulder, Kwame arrives without his bronze lapel pin and offers the master code. Mood: communal preparation. Lighting: fresh sun, bright fabrics and building anticipation. Environment = Location Registry id 'FESTIVAL_SQUARE': Afenyo's central festival square at blue hour: packed red-earth ground, a large silk-cotton tree, simple wooden platform, strings of unlit handmade lanterns, market stalls and the compound roofs beyond.",</w:t>
         <w:br/>
-        <w:t xml:space="preserve">  "status": "⬜",</w:t>
+        <w:t xml:space="preserve">  "status": "✅",</w:t>
         <w:br/>
         <w:t xml:space="preserve">  "file": "images/act3/S16_Step06_kwame_arrives.png"</w:t>
         <w:br/>
@@ -10237,7 +10237,7 @@
         <w:br/>
         <w:t xml:space="preserve">  "prompt": "Grounded cinematic West African magical realism; contemporary Ghanaian coastal life; human-scale performances; saturated indigo, lagoon teal, clay red and warm amber palette; natural skin texture; tactile fabric and weathered wood; 16:9 landscape widescreen composition; subtle film grain; expressive realistic lighting. No written words, no logos, no watermark, no distorted hands, no duplicate people. Scene S16 — A Thousand Small Lights. EXTREME CLOSE shot, intimate frontal angle. Characters in frame: @SENA_ADJOVI (mustard oversized hoodie, blue-and-white printed ankle skirt and worn white canvas trainers, turquoise over-ear radio headphones); @AMA_ADJOVI (deep navy kaba blouse, hand-dyed indigo wrapper with tiny white wave motifs and flat leather sandals, three-strand amber bead necklace). Ama hands Sena the oldest blue-glass lantern in the square. Mood: communal preparation. Lighting: fresh sun, bright fabrics and building anticipation. Environment = Location Registry id 'FESTIVAL_SQUARE': Afenyo's central festival square at blue hour: packed red-earth ground, a large silk-cotton tree, simple wooden platform, strings of unlit handmade lanterns, market stalls and the compound roofs beyond.",</w:t>
         <w:br/>
-        <w:t xml:space="preserve">  "status": "⬜",</w:t>
+        <w:t xml:space="preserve">  "status": "✅",</w:t>
         <w:br/>
         <w:t xml:space="preserve">  "file": "images/act3/S16_Step07_sena_oldest_lantern.png"</w:t>
         <w:br/>
@@ -10308,7 +10308,7 @@
         <w:br/>
         <w:t xml:space="preserve">  "prompt": "Grounded cinematic West African magical realism; contemporary Ghanaian coastal life; human-scale performances; saturated indigo, lagoon teal, clay red and warm amber palette; natural skin texture; tactile fabric and weathered wood; 16:9 landscape widescreen composition; subtle film grain; expressive realistic lighting. No written words, no logos, no watermark, no distorted hands, no duplicate people. Scene S16 — A Thousand Small Lights. WIDE shot, low observational angle. Characters in frame: @KOSI_MENSAH (indigo utility jumpsuit with rolled sleeves, sand-coloured work boots and a narrow woven kente belt, small gold Adinkra-disc earrings); @AMA_ADJOVI (deep navy kaba blouse, hand-dyed indigo wrapper with tiny white wave motifs and flat leather sandals, three-strand amber bead necklace); @SENA_ADJOVI (mustard oversized hoodie, blue-and-white printed ankle skirt and worn white canvas trainers, turquoise over-ear radio headphones); @KOJO_DANSO (faded forest-green canvas jacket over a blue-and-cream striped shirt, charcoal trousers and rubber deck boots, weathered brass compass on a cord); @ESI_TETTEH (brick-red wax-print dress beneath a soot-black oilskin apron, patterned headwrap and sturdy black sandals, smooth charred-wood smoking paddle); @KWAME_AGYEMAN (white linen shirt under a caramel lightweight field jacket, dark tailored trousers and brown loafers, antique bronze lapel pin shaped like a compass rose). Six allies work amid strings of lanterns that slowly begin to glow. Mood: communal preparation. Lighting: fresh sun, bright fabrics and building anticipation. Environment = Location Registry id 'FESTIVAL_SQUARE': Afenyo's central festival square at blue hour: packed red-earth ground, a large silk-cotton tree, simple wooden platform, strings of unlit handmade lanterns, market stalls and the compound roofs beyond.",</w:t>
         <w:br/>
-        <w:t xml:space="preserve">  "status": "⬜",</w:t>
+        <w:t xml:space="preserve">  "status": "✅",</w:t>
         <w:br/>
         <w:t xml:space="preserve">  "file": "images/act3/S16_Step08_growing_lights.png"</w:t>
         <w:br/>
@@ -10359,7 +10359,7 @@
         <w:br/>
         <w:t xml:space="preserve">  "prompt": "Grounded cinematic West African magical realism; contemporary Ghanaian coastal life; human-scale performances; saturated indigo, lagoon teal, clay red and warm amber palette; natural skin texture; tactile fabric and weathered wood; 16:9 landscape widescreen composition; subtle film grain; expressive realistic lighting. No written words, no logos, no watermark, no distorted hands, no duplicate people. Scene S16 — A Thousand Small Lights. MEDIUM shot, handheld eye-level. Characters in frame: @SENA_ADJOVI (mustard oversized hoodie, blue-and-white printed ankle skirt and worn white canvas trainers, turquoise over-ear radio headphones). Sena says her light points at everybody, smiling beneath turquoise headphones. Mood: communal preparation. Lighting: fresh sun, bright fabrics and building anticipation. Environment = Location Registry id 'FESTIVAL_SQUARE': Afenyo's central festival square at blue hour: packed red-earth ground, a large silk-cotton tree, simple wooden platform, strings of unlit handmade lanterns, market stalls and the compound roofs beyond.",</w:t>
         <w:br/>
-        <w:t xml:space="preserve">  "status": "⬜",</w:t>
+        <w:t xml:space="preserve">  "status": "✅",</w:t>
         <w:br/>
         <w:t xml:space="preserve">  "file": "images/act3/S16_Step09_sena_points_outward.png"</w:t>
         <w:br/>
@@ -10430,7 +10430,7 @@
         <w:br/>
         <w:t xml:space="preserve">  "prompt": "Grounded cinematic West African magical realism; contemporary Ghanaian coastal life; human-scale performances; saturated indigo, lagoon teal, clay red and warm amber palette; natural skin texture; tactile fabric and weathered wood; 16:9 landscape widescreen composition; subtle film grain; expressive realistic lighting. No written words, no logos, no watermark, no distorted hands, no duplicate people. Scene S16 — A Thousand Small Lights. WIDE shot, rear closing tableau. Characters in frame: @KOSI_MENSAH (indigo utility jumpsuit with rolled sleeves, sand-coloured work boots and a narrow woven kente belt, small gold Adinkra-disc earrings); @AMA_ADJOVI (deep navy kaba blouse, hand-dyed indigo wrapper with tiny white wave motifs and flat leather sandals, three-strand amber bead necklace); @SENA_ADJOVI (mustard oversized hoodie, blue-and-white printed ankle skirt and worn white canvas trainers, turquoise over-ear radio headphones); @KOJO_DANSO (faded forest-green canvas jacket over a blue-and-cream striped shirt, charcoal trousers and rubber deck boots, weathered brass compass on a cord); @ESI_TETTEH (brick-red wax-print dress beneath a soot-black oilskin apron, patterned headwrap and sturdy black sandals, smooth charred-wood smoking paddle); @KWAME_AGYEMAN (white linen shirt under a caramel lightweight field jacket, dark tailored trousers and brown loafers, antique bronze lapel pin shaped like a compass rose). The prepared square gleams with a thousand small, unlit promises. Mood: communal preparation. Lighting: fresh sun, bright fabrics and building anticipation. Environment = Location Registry id 'FESTIVAL_SQUARE': Afenyo's central festival square at blue hour: packed red-earth ground, a large silk-cotton tree, simple wooden platform, strings of unlit handmade lanterns, market stalls and the compound roofs beyond.",</w:t>
         <w:br/>
-        <w:t xml:space="preserve">  "status": "⬜",</w:t>
+        <w:t xml:space="preserve">  "status": "✅",</w:t>
         <w:br/>
         <w:t xml:space="preserve">  "file": "images/act3/S16_Step10_square_ready.png"</w:t>
         <w:br/>

</xml_diff>

<commit_message>
Generate River Remembers lagoon beacon batch
Co-authored-by: arena-agent <297053741+arena-agent@users.noreply.github.com>
</commit_message>
<xml_diff>
--- a/the_river_remembers/MASTER_DOCUMENT.docx
+++ b/the_river_remembers/MASTER_DOCUMENT.docx
@@ -10501,7 +10501,7 @@
         <w:br/>
         <w:t xml:space="preserve">  "prompt": "Grounded cinematic West African magical realism; contemporary Ghanaian coastal life; human-scale performances; saturated indigo, lagoon teal, clay red and warm amber palette; natural skin texture; tactile fabric and weathered wood; 16:9 landscape widescreen composition; subtle film grain; expressive realistic lighting. No written words, no logos, no watermark, no distorted hands, no duplicate people. Scene S17 — Signal on the Water. WIDE shot, high establishing angle. Characters in frame: @KOSI_MENSAH (indigo utility jumpsuit with rolled sleeves, sand-coloured work boots and a narrow woven kente belt, small gold Adinkra-disc earrings); @KOJO_DANSO (faded forest-green canvas jacket over a blue-and-cream striped shirt, charcoal trousers and rubber deck boots, weathered brass compass on a cord); @SENA_ADJOVI (mustard oversized hoodie, blue-and-white printed ankle skirt and worn white canvas trainers, turquoise over-ear radio headphones); @KWAME_AGYEMAN (white linen shirt under a caramel lightweight field jacket, dark tailored trousers and brown loafers, antique bronze lapel pin shaped like a compass rose). Kojo's canoe reaches the restored beacon as lantern canoes gather in the distance. Mood: breath-held suspense. Lighting: blue-hour sky, beacon amber and reflected lantern trail. Environment = Location Registry id 'LAGOON_BEACON': The restored solar beacon on the open Afenyo lagoon: a weathered metal buoy with a blue-glass lantern crown, tether chain, rippling teal water, mangrove horizon and vast cloud-streaked sky.",</w:t>
         <w:br/>
-        <w:t xml:space="preserve">  "status": "⬜",</w:t>
+        <w:t xml:space="preserve">  "status": "✅",</w:t>
         <w:br/>
         <w:t xml:space="preserve">  "file": "images/act3/S17_Step01_beacon_blue_hour.png"</w:t>
         <w:br/>
@@ -10552,7 +10552,7 @@
         <w:br/>
         <w:t xml:space="preserve">  "prompt": "Grounded cinematic West African magical realism; contemporary Ghanaian coastal life; human-scale performances; saturated indigo, lagoon teal, clay red and warm amber palette; natural skin texture; tactile fabric and weathered wood; 16:9 landscape widescreen composition; subtle film grain; expressive realistic lighting. No written words, no logos, no watermark, no distorted hands, no duplicate people. Scene S17 — Signal on the Water. MEDIUM shot, eye-level. Characters in frame: @KOJO_DANSO (faded forest-green canvas jacket over a blue-and-cream striped shirt, charcoal trousers and rubber deck boots, weathered brass compass on a cord). Kojo secures the canoe to the buoy with practiced hands. Mood: breath-held suspense. Lighting: blue-hour sky, beacon amber and reflected lantern trail. Environment = Location Registry id 'LAGOON_BEACON': The restored solar beacon on the open Afenyo lagoon: a weathered metal buoy with a blue-glass lantern crown, tether chain, rippling teal water, mangrove horizon and vast cloud-streaked sky.",</w:t>
         <w:br/>
-        <w:t xml:space="preserve">  "status": "⬜",</w:t>
+        <w:t xml:space="preserve">  "status": "✅",</w:t>
         <w:br/>
         <w:t xml:space="preserve">  "file": "images/act3/S17_Step02_kojo_moors.png"</w:t>
         <w:br/>
@@ -10603,7 +10603,7 @@
         <w:br/>
         <w:t xml:space="preserve">  "prompt": "Grounded cinematic West African magical realism; contemporary Ghanaian coastal life; human-scale performances; saturated indigo, lagoon teal, clay red and warm amber palette; natural skin texture; tactile fabric and weathered wood; 16:9 landscape widescreen composition; subtle film grain; expressive realistic lighting. No written words, no logos, no watermark, no distorted hands, no duplicate people. Scene S17 — Signal on the Water. CLOSE shot, three-quarter profile. Characters in frame: @KOSI_MENSAH (indigo utility jumpsuit with rolled sleeves, sand-coloured work boots and a narrow woven kente belt, small gold Adinkra-disc earrings). Kosi connects a repaired solar cell inside the blue-glass lantern crown. Mood: breath-held suspense. Lighting: blue-hour sky, beacon amber and reflected lantern trail. Environment = Location Registry id 'LAGOON_BEACON': The restored solar beacon on the open Afenyo lagoon: a weathered metal buoy with a blue-glass lantern crown, tether chain, rippling teal water, mangrove horizon and vast cloud-streaked sky.",</w:t>
         <w:br/>
-        <w:t xml:space="preserve">  "status": "⬜",</w:t>
+        <w:t xml:space="preserve">  "status": "✅",</w:t>
         <w:br/>
         <w:t xml:space="preserve">  "file": "images/act3/S17_Step03_kosi_connects.png"</w:t>
         <w:br/>
@@ -10654,7 +10654,7 @@
         <w:br/>
         <w:t xml:space="preserve">  "prompt": "Grounded cinematic West African magical realism; contemporary Ghanaian coastal life; human-scale performances; saturated indigo, lagoon teal, clay red and warm amber palette; natural skin texture; tactile fabric and weathered wood; 16:9 landscape widescreen composition; subtle film grain; expressive realistic lighting. No written words, no logos, no watermark, no distorted hands, no duplicate people. Scene S17 — Signal on the Water. INSERT shot, top-down detail. Characters in frame: @SENA_ADJOVI (mustard oversized hoodie, blue-and-white printed ankle skirt and worn white canvas trainers, turquoise over-ear radio headphones). Sena's broadcast equipment displays the transmitted archive pages and water readings. Mood: breath-held suspense. Lighting: blue-hour sky, beacon amber and reflected lantern trail. Environment = Location Registry id 'LAGOON_BEACON': The restored solar beacon on the open Afenyo lagoon: a weathered metal buoy with a blue-glass lantern crown, tether chain, rippling teal water, mangrove horizon and vast cloud-streaked sky.",</w:t>
         <w:br/>
-        <w:t xml:space="preserve">  "status": "⬜",</w:t>
+        <w:t xml:space="preserve">  "status": "✅",</w:t>
         <w:br/>
         <w:t xml:space="preserve">  "file": "images/act3/S17_Step04_archive_signal.png"</w:t>
         <w:br/>
@@ -10717,7 +10717,7 @@
         <w:br/>
         <w:t xml:space="preserve">  "prompt": "Grounded cinematic West African magical realism; contemporary Ghanaian coastal life; human-scale performances; saturated indigo, lagoon teal, clay red and warm amber palette; natural skin texture; tactile fabric and weathered wood; 16:9 landscape widescreen composition; subtle film grain; expressive realistic lighting. No written words, no logos, no watermark, no distorted hands, no duplicate people. Scene S17 — Signal on the Water. TWO-SHOT shot, eye-level. Characters in frame: @KOSI_MENSAH (indigo utility jumpsuit with rolled sleeves, sand-coloured work boots and a narrow woven kente belt, small gold Adinkra-disc earrings); @KOJO_DANSO (faded forest-green canvas jacket over a blue-and-cream striped shirt, charcoal trousers and rubber deck boots, weathered brass compass on a cord); @SENA_ADJOVI (mustard oversized hoodie, blue-and-white printed ankle skirt and worn white canvas trainers, turquoise over-ear radio headphones); @KWAME_AGYEMAN (white linen shirt under a caramel lightweight field jacket, dark tailored trousers and brown loafers, antique bronze lapel pin shaped like a compass rose). The four balance at the beacon as a flotilla of lights forms behind them. Mood: breath-held suspense. Lighting: blue-hour sky, beacon amber and reflected lantern trail. Environment = Location Registry id 'LAGOON_BEACON': The restored solar beacon on the open Afenyo lagoon: a weathered metal buoy with a blue-glass lantern crown, tether chain, rippling teal water, mangrove horizon and vast cloud-streaked sky.",</w:t>
         <w:br/>
-        <w:t xml:space="preserve">  "status": "⬜",</w:t>
+        <w:t xml:space="preserve">  "status": "✅",</w:t>
         <w:br/>
         <w:t xml:space="preserve">  "file": "images/act3/S17_Step05_four_at_beacon.png"</w:t>
         <w:br/>
@@ -10768,7 +10768,7 @@
         <w:br/>
         <w:t xml:space="preserve">  "prompt": "Grounded cinematic West African magical realism; contemporary Ghanaian coastal life; human-scale performances; saturated indigo, lagoon teal, clay red and warm amber palette; natural skin texture; tactile fabric and weathered wood; 16:9 landscape widescreen composition; subtle film grain; expressive realistic lighting. No written words, no logos, no watermark, no distorted hands, no duplicate people. Scene S17 — Signal on the Water. OVER-SHOULDER shot, over the lead character's shoulder. Characters in frame: @KWAME_AGYEMAN (white linen shirt under a caramel lightweight field jacket, dark tailored trousers and brown loafers, antique bronze lapel pin shaped like a compass rose). Over Kwame's shoulder, he sends the unredacted map to regional reporters. Mood: breath-held suspense. Lighting: blue-hour sky, beacon amber and reflected lantern trail. Environment = Location Registry id 'LAGOON_BEACON': The restored solar beacon on the open Afenyo lagoon: a weathered metal buoy with a blue-glass lantern crown, tether chain, rippling teal water, mangrove horizon and vast cloud-streaked sky.",</w:t>
         <w:br/>
-        <w:t xml:space="preserve">  "status": "⬜",</w:t>
+        <w:t xml:space="preserve">  "status": "✅",</w:t>
         <w:br/>
         <w:t xml:space="preserve">  "file": "images/act3/S17_Step06_kwame_sends_files.png"</w:t>
         <w:br/>
@@ -10819,7 +10819,7 @@
         <w:br/>
         <w:t xml:space="preserve">  "prompt": "Grounded cinematic West African magical realism; contemporary Ghanaian coastal life; human-scale performances; saturated indigo, lagoon teal, clay red and warm amber palette; natural skin texture; tactile fabric and weathered wood; 16:9 landscape widescreen composition; subtle film grain; expressive realistic lighting. No written words, no logos, no watermark, no distorted hands, no duplicate people. Scene S17 — Signal on the Water. EXTREME CLOSE shot, intimate frontal angle. Characters in frame: @SENA_ADJOVI (mustard oversized hoodie, blue-and-white printed ankle skirt and worn white canvas trainers, turquoise over-ear radio headphones). Sena announces that Afenyo is speaking and asks listeners not to call it noise. Mood: breath-held suspense. Lighting: blue-hour sky, beacon amber and reflected lantern trail. Environment = Location Registry id 'LAGOON_BEACON': The restored solar beacon on the open Afenyo lagoon: a weathered metal buoy with a blue-glass lantern crown, tether chain, rippling teal water, mangrove horizon and vast cloud-streaked sky.",</w:t>
         <w:br/>
-        <w:t xml:space="preserve">  "status": "⬜",</w:t>
+        <w:t xml:space="preserve">  "status": "✅",</w:t>
         <w:br/>
         <w:t xml:space="preserve">  "file": "images/act3/S17_Step07_sena_on_air.png"</w:t>
         <w:br/>
@@ -10882,7 +10882,7 @@
         <w:br/>
         <w:t xml:space="preserve">  "prompt": "Grounded cinematic West African magical realism; contemporary Ghanaian coastal life; human-scale performances; saturated indigo, lagoon teal, clay red and warm amber palette; natural skin texture; tactile fabric and weathered wood; 16:9 landscape widescreen composition; subtle film grain; expressive realistic lighting. No written words, no logos, no watermark, no distorted hands, no duplicate people. Scene S17 — Signal on the Water. WIDE shot, low observational angle. Characters in frame: @KOSI_MENSAH (indigo utility jumpsuit with rolled sleeves, sand-coloured work boots and a narrow woven kente belt, small gold Adinkra-disc earrings); @KOJO_DANSO (faded forest-green canvas jacket over a blue-and-cream striped shirt, charcoal trousers and rubber deck boots, weathered brass compass on a cord); @SENA_ADJOVI (mustard oversized hoodie, blue-and-white printed ankle skirt and worn white canvas trainers, turquoise over-ear radio headphones); @KWAME_AGYEMAN (white linen shirt under a caramel lightweight field jacket, dark tailored trousers and brown loafers, antique bronze lapel pin shaped like a compass rose). Lantern canoes glow in a broad arc across the blue lagoon. Mood: breath-held suspense. Lighting: blue-hour sky, beacon amber and reflected lantern trail. Environment = Location Registry id 'LAGOON_BEACON': The restored solar beacon on the open Afenyo lagoon: a weathered metal buoy with a blue-glass lantern crown, tether chain, rippling teal water, mangrove horizon and vast cloud-streaked sky.",</w:t>
         <w:br/>
-        <w:t xml:space="preserve">  "status": "⬜",</w:t>
+        <w:t xml:space="preserve">  "status": "✅",</w:t>
         <w:br/>
         <w:t xml:space="preserve">  "file": "images/act3/S17_Step08_flotilla_glow.png"</w:t>
         <w:br/>
@@ -10933,7 +10933,7 @@
         <w:br/>
         <w:t xml:space="preserve">  "prompt": "Grounded cinematic West African magical realism; contemporary Ghanaian coastal life; human-scale performances; saturated indigo, lagoon teal, clay red and warm amber palette; natural skin texture; tactile fabric and weathered wood; 16:9 landscape widescreen composition; subtle film grain; expressive realistic lighting. No written words, no logos, no watermark, no distorted hands, no duplicate people. Scene S17 — Signal on the Water. MEDIUM shot, handheld eye-level. Characters in frame: @KOSI_MENSAH (indigo utility jumpsuit with rolled sleeves, sand-coloured work boots and a narrow woven kente belt, small gold Adinkra-disc earrings). The blue-glass beacon gives its first steady pulse. Mood: breath-held suspense. Lighting: blue-hour sky, beacon amber and reflected lantern trail. Environment = Location Registry id 'LAGOON_BEACON': The restored solar beacon on the open Afenyo lagoon: a weathered metal buoy with a blue-glass lantern crown, tether chain, rippling teal water, mangrove horizon and vast cloud-streaked sky.",</w:t>
         <w:br/>
-        <w:t xml:space="preserve">  "status": "⬜",</w:t>
+        <w:t xml:space="preserve">  "status": "✅",</w:t>
         <w:br/>
         <w:t xml:space="preserve">  "file": "images/act3/S17_Step09_beacon_pulse.png"</w:t>
         <w:br/>
@@ -10996,7 +10996,7 @@
         <w:br/>
         <w:t xml:space="preserve">  "prompt": "Grounded cinematic West African magical realism; contemporary Ghanaian coastal life; human-scale performances; saturated indigo, lagoon teal, clay red and warm amber palette; natural skin texture; tactile fabric and weathered wood; 16:9 landscape widescreen composition; subtle film grain; expressive realistic lighting. No written words, no logos, no watermark, no distorted hands, no duplicate people. Scene S17 — Signal on the Water. WIDE shot, rear closing tableau. Characters in frame: @KOSI_MENSAH (indigo utility jumpsuit with rolled sleeves, sand-coloured work boots and a narrow woven kente belt, small gold Adinkra-disc earrings); @KOJO_DANSO (faded forest-green canvas jacket over a blue-and-cream striped shirt, charcoal trousers and rubber deck boots, weathered brass compass on a cord); @SENA_ADJOVI (mustard oversized hoodie, blue-and-white printed ankle skirt and worn white canvas trainers, turquoise over-ear radio headphones); @KWAME_AGYEMAN (white linen shirt under a caramel lightweight field jacket, dark tailored trousers and brown loafers, antique bronze lapel pin shaped like a compass rose). The beacon and flotilla burn together beneath a vast cloud-streaked sky. Mood: breath-held suspense. Lighting: blue-hour sky, beacon amber and reflected lantern trail. Environment = Location Registry id 'LAGOON_BEACON': The restored solar beacon on the open Afenyo lagoon: a weathered metal buoy with a blue-glass lantern crown, tether chain, rippling teal water, mangrove horizon and vast cloud-streaked sky.",</w:t>
         <w:br/>
-        <w:t xml:space="preserve">  "status": "⬜",</w:t>
+        <w:t xml:space="preserve">  "status": "✅",</w:t>
         <w:br/>
         <w:t xml:space="preserve">  "file": "images/act3/S17_Step10_lagoon_hears.png"</w:t>
         <w:br/>

</xml_diff>

<commit_message>
Generate River Remembers community hall batch
Co-authored-by: arena-agent <297053741+arena-agent@users.noreply.github.com>
</commit_message>
<xml_diff>
--- a/the_river_remembers/MASTER_DOCUMENT.docx
+++ b/the_river_remembers/MASTER_DOCUMENT.docx
@@ -11063,7 +11063,7 @@
         <w:br/>
         <w:t xml:space="preserve">  "prompt": "Grounded cinematic West African magical realism; contemporary Ghanaian coastal life; human-scale performances; saturated indigo, lagoon teal, clay red and warm amber palette; natural skin texture; tactile fabric and weathered wood; 16:9 landscape widescreen composition; subtle film grain; expressive realistic lighting. No written words, no logos, no watermark, no distorted hands, no duplicate people. Scene S18 — The Chair Answers. WIDE shot, high establishing angle. Characters in frame: @ESI_TETTEH (brick-red wax-print dress beneath a soot-black oilskin apron, patterned headwrap and sturdy black sandals, smooth charred-wood smoking paddle); @SENA_ADJOVI (mustard oversized hoodie, blue-and-white printed ankle skirt and worn white canvas trainers, turquoise over-ear radio headphones); @AMA_ADJOVI (deep navy kaba blouse, hand-dyed indigo wrapper with tiny white wave motifs and flat leather sandals, three-strand amber bead necklace). Afenyo packs the community hall under amber lantern light and rain-darkened night. Mood: public reckoning. Lighting: amber lanterns, projection glow and rain-muted night. Environment = Location Registry id 'COMMUNITY_HALL': Afenyo's community hall at night: open concrete walls, a corrugated roof, rows of plastic chairs, a hand-painted blank projection sheet, standing fans, amber lantern light and rain-darkened red earth outside.",</w:t>
         <w:br/>
-        <w:t xml:space="preserve">  "status": "⬜",</w:t>
+        <w:t xml:space="preserve">  "status": "✅",</w:t>
         <w:br/>
         <w:t xml:space="preserve">  "file": "images/act3/S18_Step01_hall_lanterns.png"</w:t>
         <w:br/>
@@ -11114,7 +11114,7 @@
         <w:br/>
         <w:t xml:space="preserve">  "prompt": "Grounded cinematic West African magical realism; contemporary Ghanaian coastal life; human-scale performances; saturated indigo, lagoon teal, clay red and warm amber palette; natural skin texture; tactile fabric and weathered wood; 16:9 landscape widescreen composition; subtle film grain; expressive realistic lighting. No written words, no logos, no watermark, no distorted hands, no duplicate people. Scene S18 — The Chair Answers. MEDIUM shot, eye-level. Characters in frame: @SENA_ADJOVI (mustard oversized hoodie, blue-and-white printed ankle skirt and worn white canvas trainers, turquoise over-ear radio headphones). The landing deed and water data shine clearly on a blank projection sheet. Mood: public reckoning. Lighting: amber lanterns, projection glow and rain-muted night. Environment = Location Registry id 'COMMUNITY_HALL': Afenyo's community hall at night: open concrete walls, a corrugated roof, rows of plastic chairs, a hand-painted blank projection sheet, standing fans, amber lantern light and rain-darkened red earth outside.",</w:t>
         <w:br/>
-        <w:t xml:space="preserve">  "status": "⬜",</w:t>
+        <w:t xml:space="preserve">  "status": "✅",</w:t>
         <w:br/>
         <w:t xml:space="preserve">  "file": "images/act3/S18_Step02_projected_deed.png"</w:t>
         <w:br/>
@@ -11165,7 +11165,7 @@
         <w:br/>
         <w:t xml:space="preserve">  "prompt": "Grounded cinematic West African magical realism; contemporary Ghanaian coastal life; human-scale performances; saturated indigo, lagoon teal, clay red and warm amber palette; natural skin texture; tactile fabric and weathered wood; 16:9 landscape widescreen composition; subtle film grain; expressive realistic lighting. No written words, no logos, no watermark, no distorted hands, no duplicate people. Scene S18 — The Chair Answers. CLOSE shot, three-quarter profile. Characters in frame: @NII_LAMPTEY (tailored charcoal caftan with a subtle black geometric weave, polished black shoes and a silver wristwatch, black ebony walking cane with a carved heron handle). Nii enters the open hall with his ebony heron cane and confronts the crowd. Mood: public reckoning. Lighting: amber lanterns, projection glow and rain-muted night. Environment = Location Registry id 'COMMUNITY_HALL': Afenyo's community hall at night: open concrete walls, a corrugated roof, rows of plastic chairs, a hand-painted blank projection sheet, standing fans, amber lantern light and rain-darkened red earth outside.",</w:t>
         <w:br/>
-        <w:t xml:space="preserve">  "status": "⬜",</w:t>
+        <w:t xml:space="preserve">  "status": "✅",</w:t>
         <w:br/>
         <w:t xml:space="preserve">  "file": "images/act3/S18_Step03_nii_enters.png"</w:t>
         <w:br/>
@@ -11216,7 +11216,7 @@
         <w:br/>
         <w:t xml:space="preserve">  "prompt": "Grounded cinematic West African magical realism; contemporary Ghanaian coastal life; human-scale performances; saturated indigo, lagoon teal, clay red and warm amber palette; natural skin texture; tactile fabric and weathered wood; 16:9 landscape widescreen composition; subtle film grain; expressive realistic lighting. No written words, no logos, no watermark, no distorted hands, no duplicate people. Scene S18 — The Chair Answers. INSERT shot, top-down detail. Characters in frame: @AMA_ADJOVI (deep navy kaba blouse, hand-dyed indigo wrapper with tiny white wave motifs and flat leather sandals, three-strand amber bead necklace). Ama's calm face reflects the projection glow as neighbours begin to speak. Mood: public reckoning. Lighting: amber lanterns, projection glow and rain-muted night. Environment = Location Registry id 'COMMUNITY_HALL': Afenyo's community hall at night: open concrete walls, a corrugated roof, rows of plastic chairs, a hand-painted blank projection sheet, standing fans, amber lantern light and rain-darkened red earth outside.",</w:t>
         <w:br/>
-        <w:t xml:space="preserve">  "status": "⬜",</w:t>
+        <w:t xml:space="preserve">  "status": "✅",</w:t>
         <w:br/>
         <w:t xml:space="preserve">  "file": "images/act3/S18_Step04_watching_faces.png"</w:t>
         <w:br/>
@@ -11287,7 +11287,7 @@
         <w:br/>
         <w:t xml:space="preserve">  "prompt": "Grounded cinematic West African magical realism; contemporary Ghanaian coastal life; human-scale performances; saturated indigo, lagoon teal, clay red and warm amber palette; natural skin texture; tactile fabric and weathered wood; 16:9 landscape widescreen composition; subtle film grain; expressive realistic lighting. No written words, no logos, no watermark, no distorted hands, no duplicate people. Scene S18 — The Chair Answers. TWO-SHOT shot, eye-level. Characters in frame: @NII_LAMPTEY (tailored charcoal caftan with a subtle black geometric weave, polished black shoes and a silver wristwatch, black ebony walking cane with a carved heron handle); @KOSI_MENSAH (indigo utility jumpsuit with rolled sleeves, sand-coloured work boots and a narrow woven kente belt, small gold Adinkra-disc earrings); @ESI_TETTEH (brick-red wax-print dress beneath a soot-black oilskin apron, patterned headwrap and sturdy black sandals, smooth charred-wood smoking paddle); @SENA_ADJOVI (mustard oversized hoodie, blue-and-white printed ankle skirt and worn white canvas trainers, turquoise over-ear radio headphones); @KWAME_AGYEMAN (white linen shirt under a caramel lightweight field jacket, dark tailored trousers and brown loafers, antique bronze lapel pin shaped like a compass rose); @AMA_ADJOVI (deep navy kaba blouse, hand-dyed indigo wrapper with tiny white wave motifs and flat leather sandals, three-strand amber bead necklace). The principals face each other while the public owns the room around them. Mood: public reckoning. Lighting: amber lanterns, projection glow and rain-muted night. Environment = Location Registry id 'COMMUNITY_HALL': Afenyo's community hall at night: open concrete walls, a corrugated roof, rows of plastic chairs, a hand-painted blank projection sheet, standing fans, amber lantern light and rain-darkened red earth outside.",</w:t>
         <w:br/>
-        <w:t xml:space="preserve">  "status": "⬜",</w:t>
+        <w:t xml:space="preserve">  "status": "✅",</w:t>
         <w:br/>
         <w:t xml:space="preserve">  "file": "images/act3/S18_Step05_public_reckoning.png"</w:t>
         <w:br/>
@@ -11342,7 +11342,7 @@
         <w:br/>
         <w:t xml:space="preserve">  "prompt": "Grounded cinematic West African magical realism; contemporary Ghanaian coastal life; human-scale performances; saturated indigo, lagoon teal, clay red and warm amber palette; natural skin texture; tactile fabric and weathered wood; 16:9 landscape widescreen composition; subtle film grain; expressive realistic lighting. No written words, no logos, no watermark, no distorted hands, no duplicate people. Scene S18 — The Chair Answers. OVER-SHOULDER shot, over the lead character's shoulder. Characters in frame: @KOSI_MENSAH (indigo utility jumpsuit with rolled sleeves, sand-coloured work boots and a narrow woven kente belt, small gold Adinkra-disc earrings); @NII_LAMPTEY (tailored charcoal caftan with a subtle black geometric weave, polished black shoes and a silver wristwatch, black ebony walking cane with a carved heron handle). Over Kosi's shoulder, live water readings refute the project safeguards. Mood: public reckoning. Lighting: amber lanterns, projection glow and rain-muted night. Environment = Location Registry id 'COMMUNITY_HALL': Afenyo's community hall at night: open concrete walls, a corrugated roof, rows of plastic chairs, a hand-painted blank projection sheet, standing fans, amber lantern light and rain-darkened red earth outside.",</w:t>
         <w:br/>
-        <w:t xml:space="preserve">  "status": "⬜",</w:t>
+        <w:t xml:space="preserve">  "status": "✅",</w:t>
         <w:br/>
         <w:t xml:space="preserve">  "file": "images/act3/S18_Step06_kosi_evidence.png"</w:t>
         <w:br/>
@@ -11393,7 +11393,7 @@
         <w:br/>
         <w:t xml:space="preserve">  "prompt": "Grounded cinematic West African magical realism; contemporary Ghanaian coastal life; human-scale performances; saturated indigo, lagoon teal, clay red and warm amber palette; natural skin texture; tactile fabric and weathered wood; 16:9 landscape widescreen composition; subtle film grain; expressive realistic lighting. No written words, no logos, no watermark, no distorted hands, no duplicate people. Scene S18 — The Chair Answers. EXTREME CLOSE shot, intimate frontal angle. Characters in frame: @AMA_ADJOVI (deep navy kaba blouse, hand-dyed indigo wrapper with tiny white wave motifs and flat leather sandals, three-strand amber bead necklace). Ama tells Nii that people carrying the difficulty must make the decision. Mood: public reckoning. Lighting: amber lanterns, projection glow and rain-muted night. Environment = Location Registry id 'COMMUNITY_HALL': Afenyo's community hall at night: open concrete walls, a corrugated roof, rows of plastic chairs, a hand-painted blank projection sheet, standing fans, amber lantern light and rain-darkened red earth outside.",</w:t>
         <w:br/>
-        <w:t xml:space="preserve">  "status": "⬜",</w:t>
+        <w:t xml:space="preserve">  "status": "✅",</w:t>
         <w:br/>
         <w:t xml:space="preserve">  "file": "images/act3/S18_Step07_ama_reply.png"</w:t>
         <w:br/>
@@ -11452,7 +11452,7 @@
         <w:br/>
         <w:t xml:space="preserve">  "prompt": "Grounded cinematic West African magical realism; contemporary Ghanaian coastal life; human-scale performances; saturated indigo, lagoon teal, clay red and warm amber palette; natural skin texture; tactile fabric and weathered wood; 16:9 landscape widescreen composition; subtle film grain; expressive realistic lighting. No written words, no logos, no watermark, no distorted hands, no duplicate people. Scene S18 — The Chair Answers. WIDE shot, low observational angle. Characters in frame: @ESI_TETTEH (brick-red wax-print dress beneath a soot-black oilskin apron, patterned headwrap and sturdy black sandals, smooth charred-wood smoking paddle); @SENA_ADJOVI (mustard oversized hoodie, blue-and-white printed ankle skirt and worn white canvas trainers, turquoise over-ear radio headphones); @AMA_ADJOVI (deep navy kaba blouse, hand-dyed indigo wrapper with tiny white wave motifs and flat leather sandals, three-strand amber bead necklace). Many residents raise their voices beneath rain-muted darkness. Mood: public reckoning. Lighting: amber lanterns, projection glow and rain-muted night. Environment = Location Registry id 'COMMUNITY_HALL': Afenyo's community hall at night: open concrete walls, a corrugated roof, rows of plastic chairs, a hand-painted blank projection sheet, standing fans, amber lantern light and rain-darkened red earth outside.",</w:t>
         <w:br/>
-        <w:t xml:space="preserve">  "status": "⬜",</w:t>
+        <w:t xml:space="preserve">  "status": "✅",</w:t>
         <w:br/>
         <w:t xml:space="preserve">  "file": "images/act3/S18_Step08_hall_answers.png"</w:t>
         <w:br/>
@@ -11503,7 +11503,7 @@
         <w:br/>
         <w:t xml:space="preserve">  "prompt": "Grounded cinematic West African magical realism; contemporary Ghanaian coastal life; human-scale performances; saturated indigo, lagoon teal, clay red and warm amber palette; natural skin texture; tactile fabric and weathered wood; 16:9 landscape widescreen composition; subtle film grain; expressive realistic lighting. No written words, no logos, no watermark, no distorted hands, no duplicate people. Scene S18 — The Chair Answers. MEDIUM shot, handheld eye-level. Characters in frame: @NII_LAMPTEY (tailored charcoal caftan with a subtle black geometric weave, polished black shoes and a silver wristwatch, black ebony walking cane with a carved heron handle). Nii lowers his cane as the truth becomes impossible to re-bury. Mood: public reckoning. Lighting: amber lanterns, projection glow and rain-muted night. Environment = Location Registry id 'COMMUNITY_HALL': Afenyo's community hall at night: open concrete walls, a corrugated roof, rows of plastic chairs, a hand-painted blank projection sheet, standing fans, amber lantern light and rain-darkened red earth outside.",</w:t>
         <w:br/>
-        <w:t xml:space="preserve">  "status": "⬜",</w:t>
+        <w:t xml:space="preserve">  "status": "✅",</w:t>
         <w:br/>
         <w:t xml:space="preserve">  "file": "images/act3/S18_Step09_nii_lowers_cane.png"</w:t>
         <w:br/>
@@ -11574,7 +11574,7 @@
         <w:br/>
         <w:t xml:space="preserve">  "prompt": "Grounded cinematic West African magical realism; contemporary Ghanaian coastal life; human-scale performances; saturated indigo, lagoon teal, clay red and warm amber palette; natural skin texture; tactile fabric and weathered wood; 16:9 landscape widescreen composition; subtle film grain; expressive realistic lighting. No written words, no logos, no watermark, no distorted hands, no duplicate people. Scene S18 — The Chair Answers. WIDE shot, rear closing tableau. Characters in frame: @NII_LAMPTEY (tailored charcoal caftan with a subtle black geometric weave, polished black shoes and a silver wristwatch, black ebony walking cane with a carved heron handle); @KOSI_MENSAH (indigo utility jumpsuit with rolled sleeves, sand-coloured work boots and a narrow woven kente belt, small gold Adinkra-disc earrings); @ESI_TETTEH (brick-red wax-print dress beneath a soot-black oilskin apron, patterned headwrap and sturdy black sandals, smooth charred-wood smoking paddle); @SENA_ADJOVI (mustard oversized hoodie, blue-and-white printed ankle skirt and worn white canvas trainers, turquoise over-ear radio headphones); @KWAME_AGYEMAN (white linen shirt under a caramel lightweight field jacket, dark tailored trousers and brown loafers, antique bronze lapel pin shaped like a compass rose); @AMA_ADJOVI (deep navy kaba blouse, hand-dyed indigo wrapper with tiny white wave motifs and flat leather sandals, three-strand amber bead necklace). Lanterns and projection light hold every face in the reclaimed hall. Mood: public reckoning. Lighting: amber lanterns, projection glow and rain-muted night. Environment = Location Registry id 'COMMUNITY_HALL': Afenyo's community hall at night: open concrete walls, a corrugated roof, rows of plastic chairs, a hand-painted blank projection sheet, standing fans, amber lantern light and rain-darkened red earth outside.",</w:t>
         <w:br/>
-        <w:t xml:space="preserve">  "status": "⬜",</w:t>
+        <w:t xml:space="preserve">  "status": "✅",</w:t>
         <w:br/>
         <w:t xml:space="preserve">  "file": "images/act3/S18_Step10_shared_room.png"</w:t>
         <w:br/>

</xml_diff>

<commit_message>
Generate River Remembers assembly vote batch
Co-authored-by: arena-agent <297053741+arena-agent@users.noreply.github.com>
</commit_message>
<xml_diff>
--- a/the_river_remembers/MASTER_DOCUMENT.docx
+++ b/the_river_remembers/MASTER_DOCUMENT.docx
@@ -11637,7 +11637,7 @@
         <w:br/>
         <w:t xml:space="preserve">  "prompt": "Grounded cinematic West African magical realism; contemporary Ghanaian coastal life; human-scale performances; saturated indigo, lagoon teal, clay red and warm amber palette; natural skin texture; tactile fabric and weathered wood; 16:9 landscape widescreen composition; subtle film grain; expressive realistic lighting. No written words, no logos, no watermark, no distorted hands, no duplicate people. Scene S19 — The Water Is Public. WIDE shot, high establishing angle. Characters in frame: @NII_LAMPTEY (tailored charcoal caftan with a subtle black geometric weave, polished black shoes and a silver wristwatch, black ebony walking cane with a carved heron handle); @KWAME_AGYEMAN (white linen shirt under a caramel lightweight field jacket, dark tailored trousers and brown loafers, antique bronze lapel pin shaped like a compass rose). Post-rain daylight fills the assembly hall before the public decision. Mood: earned clarity. Lighting: clean post-rain daylight through open louvre windows. Environment = Location Registry id 'DISTRICT_ASSEMBLY_HALL': A modest district assembly hall in Afenyo: cream concrete walls, tall louvre windows, stacked plastic chairs, a raised wood dais, ceiling fans and late-afternoon lagoon light.",</w:t>
         <w:br/>
-        <w:t xml:space="preserve">  "status": "⬜",</w:t>
+        <w:t xml:space="preserve">  "status": "✅",</w:t>
         <w:br/>
         <w:t xml:space="preserve">  "file": "images/act3/S19_Step01_morning_hall.png"</w:t>
         <w:br/>
@@ -11688,7 +11688,7 @@
         <w:br/>
         <w:t xml:space="preserve">  "prompt": "Grounded cinematic West African magical realism; contemporary Ghanaian coastal life; human-scale performances; saturated indigo, lagoon teal, clay red and warm amber palette; natural skin texture; tactile fabric and weathered wood; 16:9 landscape widescreen composition; subtle film grain; expressive realistic lighting. No written words, no logos, no watermark, no distorted hands, no duplicate people. Scene S19 — The Water Is Public. MEDIUM shot, eye-level. Characters in frame: @SENA_ADJOVI (mustard oversized hoodie, blue-and-white printed ankle skirt and worn white canvas trainers, turquoise over-ear radio headphones). Sena records rows of residents watching the dais in silence. Mood: earned clarity. Lighting: clean post-rain daylight through open louvre windows. Environment = Location Registry id 'DISTRICT_ASSEMBLY_HALL': A modest district assembly hall in Afenyo: cream concrete walls, tall louvre windows, stacked plastic chairs, a raised wood dais, ceiling fans and late-afternoon lagoon light.",</w:t>
         <w:br/>
-        <w:t xml:space="preserve">  "status": "⬜",</w:t>
+        <w:t xml:space="preserve">  "status": "✅",</w:t>
         <w:br/>
         <w:t xml:space="preserve">  "file": "images/act3/S19_Step02_public_observers.png"</w:t>
         <w:br/>
@@ -11739,7 +11739,7 @@
         <w:br/>
         <w:t xml:space="preserve">  "prompt": "Grounded cinematic West African magical realism; contemporary Ghanaian coastal life; human-scale performances; saturated indigo, lagoon teal, clay red and warm amber palette; natural skin texture; tactile fabric and weathered wood; 16:9 landscape widescreen composition; subtle film grain; expressive realistic lighting. No written words, no logos, no watermark, no distorted hands, no duplicate people. Scene S19 — The Water Is Public. CLOSE shot, three-quarter profile. Characters in frame: @NII_LAMPTEY (tailored charcoal caftan with a subtle black geometric weave, polished black shoes and a silver wristwatch, black ebony walking cane with a carved heron handle). Nii reads the order suspending the resort permit pending inquiry. Mood: earned clarity. Lighting: clean post-rain daylight through open louvre windows. Environment = Location Registry id 'DISTRICT_ASSEMBLY_HALL': A modest district assembly hall in Afenyo: cream concrete walls, tall louvre windows, stacked plastic chairs, a raised wood dais, ceiling fans and late-afternoon lagoon light.",</w:t>
         <w:br/>
-        <w:t xml:space="preserve">  "status": "⬜",</w:t>
+        <w:t xml:space="preserve">  "status": "✅",</w:t>
         <w:br/>
         <w:t xml:space="preserve">  "file": "images/act3/S19_Step03_nii_reads_order.png"</w:t>
         <w:br/>
@@ -11790,7 +11790,7 @@
         <w:br/>
         <w:t xml:space="preserve">  "prompt": "Grounded cinematic West African magical realism; contemporary Ghanaian coastal life; human-scale performances; saturated indigo, lagoon teal, clay red and warm amber palette; natural skin texture; tactile fabric and weathered wood; 16:9 landscape widescreen composition; subtle film grain; expressive realistic lighting. No written words, no logos, no watermark, no distorted hands, no duplicate people. Scene S19 — The Water Is Public. INSERT shot, top-down detail. Characters in frame: @NII_LAMPTEY (tailored charcoal caftan with a subtle black geometric weave, polished black shoes and a silver wristwatch, black ebony walking cane with a carved heron handle). The signed suspension order rests beside Nii's silver wristwatch. Mood: earned clarity. Lighting: clean post-rain daylight through open louvre windows. Environment = Location Registry id 'DISTRICT_ASSEMBLY_HALL': A modest district assembly hall in Afenyo: cream concrete walls, tall louvre windows, stacked plastic chairs, a raised wood dais, ceiling fans and late-afternoon lagoon light.",</w:t>
         <w:br/>
-        <w:t xml:space="preserve">  "status": "⬜",</w:t>
+        <w:t xml:space="preserve">  "status": "✅",</w:t>
         <w:br/>
         <w:t xml:space="preserve">  "file": "images/act3/S19_Step04_suspension_paper.png"</w:t>
         <w:br/>
@@ -11845,7 +11845,7 @@
         <w:br/>
         <w:t xml:space="preserve">  "prompt": "Grounded cinematic West African magical realism; contemporary Ghanaian coastal life; human-scale performances; saturated indigo, lagoon teal, clay red and warm amber palette; natural skin texture; tactile fabric and weathered wood; 16:9 landscape widescreen composition; subtle film grain; expressive realistic lighting. No written words, no logos, no watermark, no distorted hands, no duplicate people. Scene S19 — The Water Is Public. TWO-SHOT shot, eye-level. Characters in frame: @KWAME_AGYEMAN (white linen shirt under a caramel lightweight field jacket, dark tailored trousers and brown loafers, antique bronze lapel pin shaped like a compass rose); @KOSI_MENSAH (indigo utility jumpsuit with rolled sleeves, sand-coloured work boots and a narrow woven kente belt, small gold Adinkra-disc earrings). Kwame submits his resignation and complete project files to the assembly. Mood: earned clarity. Lighting: clean post-rain daylight through open louvre windows. Environment = Location Registry id 'DISTRICT_ASSEMBLY_HALL': A modest district assembly hall in Afenyo: cream concrete walls, tall louvre windows, stacked plastic chairs, a raised wood dais, ceiling fans and late-afternoon lagoon light.",</w:t>
         <w:br/>
-        <w:t xml:space="preserve">  "status": "⬜",</w:t>
+        <w:t xml:space="preserve">  "status": "✅",</w:t>
         <w:br/>
         <w:t xml:space="preserve">  "file": "images/act3/S19_Step05_kwame_resigns.png"</w:t>
         <w:br/>
@@ -11900,7 +11900,7 @@
         <w:br/>
         <w:t xml:space="preserve">  "prompt": "Grounded cinematic West African magical realism; contemporary Ghanaian coastal life; human-scale performances; saturated indigo, lagoon teal, clay red and warm amber palette; natural skin texture; tactile fabric and weathered wood; 16:9 landscape widescreen composition; subtle film grain; expressive realistic lighting. No written words, no logos, no watermark, no distorted hands, no duplicate people. Scene S19 — The Water Is Public. OVER-SHOULDER shot, over the lead character's shoulder. Characters in frame: @ESI_TETTEH (brick-red wax-print dress beneath a soot-black oilskin apron, patterned headwrap and sturdy black sandals, smooth charred-wood smoking paddle); @NII_LAMPTEY (tailored charcoal caftan with a subtle black geometric weave, polished black shoes and a silver wristwatch, black ebony walking cane with a carved heron handle). Over Esi's shoulder, she insists that victory include a cooperative water board. Mood: earned clarity. Lighting: clean post-rain daylight through open louvre windows. Environment = Location Registry id 'DISTRICT_ASSEMBLY_HALL': A modest district assembly hall in Afenyo: cream concrete walls, tall louvre windows, stacked plastic chairs, a raised wood dais, ceiling fans and late-afternoon lagoon light.",</w:t>
         <w:br/>
-        <w:t xml:space="preserve">  "status": "⬜",</w:t>
+        <w:t xml:space="preserve">  "status": "✅",</w:t>
         <w:br/>
         <w:t xml:space="preserve">  "file": "images/act3/S19_Step06_esi_demands_board.png"</w:t>
         <w:br/>
@@ -11951,7 +11951,7 @@
         <w:br/>
         <w:t xml:space="preserve">  "prompt": "Grounded cinematic West African magical realism; contemporary Ghanaian coastal life; human-scale performances; saturated indigo, lagoon teal, clay red and warm amber palette; natural skin texture; tactile fabric and weathered wood; 16:9 landscape widescreen composition; subtle film grain; expressive realistic lighting. No written words, no logos, no watermark, no distorted hands, no duplicate people. Scene S19 — The Water Is Public. EXTREME CLOSE shot, intimate frontal angle. Characters in frame: @KOSI_MENSAH (indigo utility jumpsuit with rolled sleeves, sand-coloured work boots and a narrow woven kente belt, small gold Adinkra-disc earrings). Kosi says a pause is only a door if the town decides what walks through it. Mood: earned clarity. Lighting: clean post-rain daylight through open louvre windows. Environment = Location Registry id 'DISTRICT_ASSEMBLY_HALL': A modest district assembly hall in Afenyo: cream concrete walls, tall louvre windows, stacked plastic chairs, a raised wood dais, ceiling fans and late-afternoon lagoon light.",</w:t>
         <w:br/>
-        <w:t xml:space="preserve">  "status": "⬜",</w:t>
+        <w:t xml:space="preserve">  "status": "✅",</w:t>
         <w:br/>
         <w:t xml:space="preserve">  "file": "images/act3/S19_Step07_kosi_door.png"</w:t>
         <w:br/>
@@ -12018,7 +12018,7 @@
         <w:br/>
         <w:t xml:space="preserve">  "prompt": "Grounded cinematic West African magical realism; contemporary Ghanaian coastal life; human-scale performances; saturated indigo, lagoon teal, clay red and warm amber palette; natural skin texture; tactile fabric and weathered wood; 16:9 landscape widescreen composition; subtle film grain; expressive realistic lighting. No written words, no logos, no watermark, no distorted hands, no duplicate people. Scene S19 — The Water Is Public. WIDE shot, low observational angle. Characters in frame: @KOSI_MENSAH (indigo utility jumpsuit with rolled sleeves, sand-coloured work boots and a narrow woven kente belt, small gold Adinkra-disc earrings); @ESI_TETTEH (brick-red wax-print dress beneath a soot-black oilskin apron, patterned headwrap and sturdy black sandals, smooth charred-wood smoking paddle); @SENA_ADJOVI (mustard oversized hoodie, blue-and-white printed ankle skirt and worn white canvas trainers, turquoise over-ear radio headphones); @KWAME_AGYEMAN (white linen shirt under a caramel lightweight field jacket, dark tailored trousers and brown loafers, antique bronze lapel pin shaped like a compass rose); @NII_LAMPTEY (tailored charcoal caftan with a subtle black geometric weave, polished black shoes and a silver wristwatch, black ebony walking cane with a carved heron handle). Hands rise around the hall in support of the community water board. Mood: earned clarity. Lighting: clean post-rain daylight through open louvre windows. Environment = Location Registry id 'DISTRICT_ASSEMBLY_HALL': A modest district assembly hall in Afenyo: cream concrete walls, tall louvre windows, stacked plastic chairs, a raised wood dais, ceiling fans and late-afternoon lagoon light.",</w:t>
         <w:br/>
-        <w:t xml:space="preserve">  "status": "⬜",</w:t>
+        <w:t xml:space="preserve">  "status": "✅",</w:t>
         <w:br/>
         <w:t xml:space="preserve">  "file": "images/act3/S19_Step08_vote_rises.png"</w:t>
         <w:br/>
@@ -12069,7 +12069,7 @@
         <w:br/>
         <w:t xml:space="preserve">  "prompt": "Grounded cinematic West African magical realism; contemporary Ghanaian coastal life; human-scale performances; saturated indigo, lagoon teal, clay red and warm amber palette; natural skin texture; tactile fabric and weathered wood; 16:9 landscape widescreen composition; subtle film grain; expressive realistic lighting. No written words, no logos, no watermark, no distorted hands, no duplicate people. Scene S19 — The Water Is Public. MEDIUM shot, handheld eye-level. Characters in frame: @SENA_ADJOVI (mustard oversized hoodie, blue-and-white printed ankle skirt and worn white canvas trainers, turquoise over-ear radio headphones). Sena captures the sound of the vote with a bright, astonished smile. Mood: earned clarity. Lighting: clean post-rain daylight through open louvre windows. Environment = Location Registry id 'DISTRICT_ASSEMBLY_HALL': A modest district assembly hall in Afenyo: cream concrete walls, tall louvre windows, stacked plastic chairs, a raised wood dais, ceiling fans and late-afternoon lagoon light.",</w:t>
         <w:br/>
-        <w:t xml:space="preserve">  "status": "⬜",</w:t>
+        <w:t xml:space="preserve">  "status": "✅",</w:t>
         <w:br/>
         <w:t xml:space="preserve">  "file": "images/act3/S19_Step09_sena_catches_sound.png"</w:t>
         <w:br/>
@@ -12132,7 +12132,7 @@
         <w:br/>
         <w:t xml:space="preserve">  "prompt": "Grounded cinematic West African magical realism; contemporary Ghanaian coastal life; human-scale performances; saturated indigo, lagoon teal, clay red and warm amber palette; natural skin texture; tactile fabric and weathered wood; 16:9 landscape widescreen composition; subtle film grain; expressive realistic lighting. No written words, no logos, no watermark, no distorted hands, no duplicate people. Scene S19 — The Water Is Public. WIDE shot, rear closing tableau. Characters in frame: @KOSI_MENSAH (indigo utility jumpsuit with rolled sleeves, sand-coloured work boots and a narrow woven kente belt, small gold Adinkra-disc earrings); @ESI_TETTEH (brick-red wax-print dress beneath a soot-black oilskin apron, patterned headwrap and sturdy black sandals, smooth charred-wood smoking paddle); @SENA_ADJOVI (mustard oversized hoodie, blue-and-white printed ankle skirt and worn white canvas trainers, turquoise over-ear radio headphones); @KWAME_AGYEMAN (white linen shirt under a caramel lightweight field jacket, dark tailored trousers and brown loafers, antique bronze lapel pin shaped like a compass rose). The allies leave through open louvre-lit doors into clean post-rain morning. Mood: earned clarity. Lighting: clean post-rain daylight through open louvre windows. Environment = Location Registry id 'DISTRICT_ASSEMBLY_HALL': A modest district assembly hall in Afenyo: cream concrete walls, tall louvre windows, stacked plastic chairs, a raised wood dais, ceiling fans and late-afternoon lagoon light.",</w:t>
         <w:br/>
-        <w:t xml:space="preserve">  "status": "⬜",</w:t>
+        <w:t xml:space="preserve">  "status": "✅",</w:t>
         <w:br/>
         <w:t xml:space="preserve">  "file": "images/act3/S19_Step10_open_windows.png"</w:t>
         <w:br/>

</xml_diff>

<commit_message>
Complete River Remembers 200 shot storyboard
Co-authored-by: arena-agent <297053741+arena-agent@users.noreply.github.com>
</commit_message>
<xml_diff>
--- a/the_river_remembers/MASTER_DOCUMENT.docx
+++ b/the_river_remembers/MASTER_DOCUMENT.docx
@@ -12211,7 +12211,7 @@
         <w:br/>
         <w:t xml:space="preserve">  "prompt": "Grounded cinematic West African magical realism; contemporary Ghanaian coastal life; human-scale performances; saturated indigo, lagoon teal, clay red and warm amber palette; natural skin texture; tactile fabric and weathered wood; 16:9 landscape widescreen composition; subtle film grain; expressive realistic lighting. No written words, no logos, no watermark, no distorted hands, no duplicate people. Scene S20 — First Light, Shared. WIDE shot, high establishing angle. Characters in frame: @KOSI_MENSAH (indigo utility jumpsuit with rolled sleeves, sand-coloured work boots and a narrow woven kente belt, small gold Adinkra-disc earrings); @KOJO_DANSO (faded forest-green canvas jacket over a blue-and-cream striped shirt, charcoal trousers and rubber deck boots, weathered brass compass on a cord); @AMA_ADJOVI (deep navy kaba blouse, hand-dyed indigo wrapper with tiny white wave motifs and flat leather sandals, three-strand amber bead necklace); @SENA_ADJOVI (mustard oversized hoodie, blue-and-white printed ankle skirt and worn white canvas trainers, turquoise over-ear radio headphones); @ESI_TETTEH (brick-red wax-print dress beneath a soot-black oilskin apron, patterned headwrap and sturdy black sandals, smooth charred-wood smoking paddle); @KWAME_AGYEMAN (white linen shirt under a caramel lightweight field jacket, dark tailored trousers and brown loafers, antique bronze lapel pin shaped like a compass rose). Sunrise opens across the fishing pier, repaired nets and calm gold-and-teal water. Mood: hopeful, lived-in renewal. Lighting: soft gold sunrise over calm teal water. Environment = Location Registry id 'SUNRISE_PIER': Afenyo's wooden fishing pier at sunrise: worn planks, moored painted canoes, repaired fishing nets, calm gold-and-teal lagoon water, distant mangroves and a low orange sun.",</w:t>
         <w:br/>
-        <w:t xml:space="preserve">  "status": "⬜",</w:t>
+        <w:t xml:space="preserve">  "status": "✅",</w:t>
         <w:br/>
         <w:t xml:space="preserve">  "file": "images/act3/S20_Step01_pier_sunrise.png"</w:t>
         <w:br/>
@@ -12262,7 +12262,7 @@
         <w:br/>
         <w:t xml:space="preserve">  "prompt": "Grounded cinematic West African magical realism; contemporary Ghanaian coastal life; human-scale performances; saturated indigo, lagoon teal, clay red and warm amber palette; natural skin texture; tactile fabric and weathered wood; 16:9 landscape widescreen composition; subtle film grain; expressive realistic lighting. No written words, no logos, no watermark, no distorted hands, no duplicate people. Scene S20 — First Light, Shared. MEDIUM shot, eye-level. Characters in frame: @KOSI_MENSAH (indigo utility jumpsuit with rolled sleeves, sand-coloured work boots and a narrow woven kente belt, small gold Adinkra-disc earrings). Kosi secures the community-owned solar battery at the pier. Mood: hopeful, lived-in renewal. Lighting: soft gold sunrise over calm teal water. Environment = Location Registry id 'SUNRISE_PIER': Afenyo's wooden fishing pier at sunrise: worn planks, moored painted canoes, repaired fishing nets, calm gold-and-teal lagoon water, distant mangroves and a low orange sun.",</w:t>
         <w:br/>
-        <w:t xml:space="preserve">  "status": "⬜",</w:t>
+        <w:t xml:space="preserve">  "status": "✅",</w:t>
         <w:br/>
         <w:t xml:space="preserve">  "file": "images/act3/S20_Step02_kosi_battery.png"</w:t>
         <w:br/>
@@ -12313,7 +12313,7 @@
         <w:br/>
         <w:t xml:space="preserve">  "prompt": "Grounded cinematic West African magical realism; contemporary Ghanaian coastal life; human-scale performances; saturated indigo, lagoon teal, clay red and warm amber palette; natural skin texture; tactile fabric and weathered wood; 16:9 landscape widescreen composition; subtle film grain; expressive realistic lighting. No written words, no logos, no watermark, no distorted hands, no duplicate people. Scene S20 — First Light, Shared. CLOSE shot, three-quarter profile. Characters in frame: @KOJO_DANSO (faded forest-green canvas jacket over a blue-and-cream striped shirt, charcoal trousers and rubber deck boots, weathered brass compass on a cord). Kojo lifts repaired fishing nets beneath the distant beacon pulse. Mood: hopeful, lived-in renewal. Lighting: soft gold sunrise over calm teal water. Environment = Location Registry id 'SUNRISE_PIER': Afenyo's wooden fishing pier at sunrise: worn planks, moored painted canoes, repaired fishing nets, calm gold-and-teal lagoon water, distant mangroves and a low orange sun.",</w:t>
         <w:br/>
-        <w:t xml:space="preserve">  "status": "⬜",</w:t>
+        <w:t xml:space="preserve">  "status": "✅",</w:t>
         <w:br/>
         <w:t xml:space="preserve">  "file": "images/act3/S20_Step03_kojo_nets.png"</w:t>
         <w:br/>
@@ -12364,7 +12364,7 @@
         <w:br/>
         <w:t xml:space="preserve">  "prompt": "Grounded cinematic West African magical realism; contemporary Ghanaian coastal life; human-scale performances; saturated indigo, lagoon teal, clay red and warm amber palette; natural skin texture; tactile fabric and weathered wood; 16:9 landscape widescreen composition; subtle film grain; expressive realistic lighting. No written words, no logos, no watermark, no distorted hands, no duplicate people. Scene S20 — First Light, Shared. INSERT shot, top-down detail. Characters in frame: @KOSI_MENSAH (indigo utility jumpsuit with rolled sleeves, sand-coloured work boots and a narrow woven kente belt, small gold Adinkra-disc earrings). The blue beacon flashes across calm water beyond painted canoes. Mood: hopeful, lived-in renewal. Lighting: soft gold sunrise over calm teal water. Environment = Location Registry id 'SUNRISE_PIER': Afenyo's wooden fishing pier at sunrise: worn planks, moored painted canoes, repaired fishing nets, calm gold-and-teal lagoon water, distant mangroves and a low orange sun.",</w:t>
         <w:br/>
-        <w:t xml:space="preserve">  "status": "⬜",</w:t>
+        <w:t xml:space="preserve">  "status": "✅",</w:t>
         <w:br/>
         <w:t xml:space="preserve">  "file": "images/act3/S20_Step04_beacon_in_distance.png"</w:t>
         <w:br/>
@@ -12419,7 +12419,7 @@
         <w:br/>
         <w:t xml:space="preserve">  "prompt": "Grounded cinematic West African magical realism; contemporary Ghanaian coastal life; human-scale performances; saturated indigo, lagoon teal, clay red and warm amber palette; natural skin texture; tactile fabric and weathered wood; 16:9 landscape widescreen composition; subtle film grain; expressive realistic lighting. No written words, no logos, no watermark, no distorted hands, no duplicate people. Scene S20 — First Light, Shared. TWO-SHOT shot, eye-level. Characters in frame: @AMA_ADJOVI (deep navy kaba blouse, hand-dyed indigo wrapper with tiny white wave motifs and flat leather sandals, three-strand amber bead necklace); @SENA_ADJOVI (mustard oversized hoodie, blue-and-white printed ankle skirt and worn white canvas trainers, turquoise over-ear radio headphones). Ama watches Sena prepare the first episode of her new radio programme. Mood: hopeful, lived-in renewal. Lighting: soft gold sunrise over calm teal water. Environment = Location Registry id 'SUNRISE_PIER': Afenyo's wooden fishing pier at sunrise: worn planks, moored painted canoes, repaired fishing nets, calm gold-and-teal lagoon water, distant mangroves and a low orange sun.",</w:t>
         <w:br/>
-        <w:t xml:space="preserve">  "status": "⬜",</w:t>
+        <w:t xml:space="preserve">  "status": "✅",</w:t>
         <w:br/>
         <w:t xml:space="preserve">  "file": "images/act3/S20_Step05_ama_and_sena.png"</w:t>
         <w:br/>
@@ -12470,7 +12470,7 @@
         <w:br/>
         <w:t xml:space="preserve">  "prompt": "Grounded cinematic West African magical realism; contemporary Ghanaian coastal life; human-scale performances; saturated indigo, lagoon teal, clay red and warm amber palette; natural skin texture; tactile fabric and weathered wood; 16:9 landscape widescreen composition; subtle film grain; expressive realistic lighting. No written words, no logos, no watermark, no distorted hands, no duplicate people. Scene S20 — First Light, Shared. OVER-SHOULDER shot, over the lead character's shoulder. Characters in frame: @SENA_ADJOVI (mustard oversized hoodie, blue-and-white printed ankle skirt and worn white canvas trainers, turquoise over-ear radio headphones). Over Sena's shoulder, she broadcasts that the light and water are public. Mood: hopeful, lived-in renewal. Lighting: soft gold sunrise over calm teal water. Environment = Location Registry id 'SUNRISE_PIER': Afenyo's wooden fishing pier at sunrise: worn planks, moored painted canoes, repaired fishing nets, calm gold-and-teal lagoon water, distant mangroves and a low orange sun.",</w:t>
         <w:br/>
-        <w:t xml:space="preserve">  "status": "⬜",</w:t>
+        <w:t xml:space="preserve">  "status": "✅",</w:t>
         <w:br/>
         <w:t xml:space="preserve">  "file": "images/act3/S20_Step06_sena_good_morning.png"</w:t>
         <w:br/>
@@ -12521,7 +12521,7 @@
         <w:br/>
         <w:t xml:space="preserve">  "prompt": "Grounded cinematic West African magical realism; contemporary Ghanaian coastal life; human-scale performances; saturated indigo, lagoon teal, clay red and warm amber palette; natural skin texture; tactile fabric and weathered wood; 16:9 landscape widescreen composition; subtle film grain; expressive realistic lighting. No written words, no logos, no watermark, no distorted hands, no duplicate people. Scene S20 — First Light, Shared. EXTREME CLOSE shot, intimate frontal angle. Characters in frame: @AMA_ADJOVI (deep navy kaba blouse, hand-dyed indigo wrapper with tiny white wave motifs and flat leather sandals, three-strand amber bead necklace). Ama's knowing smile softens as she nods to Kosi. Mood: hopeful, lived-in renewal. Lighting: soft gold sunrise over calm teal water. Environment = Location Registry id 'SUNRISE_PIER': Afenyo's wooden fishing pier at sunrise: worn planks, moored painted canoes, repaired fishing nets, calm gold-and-teal lagoon water, distant mangroves and a low orange sun.",</w:t>
         <w:br/>
-        <w:t xml:space="preserve">  "status": "⬜",</w:t>
+        <w:t xml:space="preserve">  "status": "✅",</w:t>
         <w:br/>
         <w:t xml:space="preserve">  "file": "images/act3/S20_Step07_ama_nods.png"</w:t>
         <w:br/>
@@ -12576,7 +12576,7 @@
         <w:br/>
         <w:t xml:space="preserve">  "prompt": "Grounded cinematic West African magical realism; contemporary Ghanaian coastal life; human-scale performances; saturated indigo, lagoon teal, clay red and warm amber palette; natural skin texture; tactile fabric and weathered wood; 16:9 landscape widescreen composition; subtle film grain; expressive realistic lighting. No written words, no logos, no watermark, no distorted hands, no duplicate people. Scene S20 — First Light, Shared. WIDE shot, low observational angle. Characters in frame: @KWAME_AGYEMAN (white linen shirt under a caramel lightweight field jacket, dark tailored trousers and brown loafers, antique bronze lapel pin shaped like a compass rose); @ESI_TETTEH (brick-red wax-print dress beneath a soot-black oilskin apron, patterned headwrap and sturdy black sandals, smooth charred-wood smoking paddle). Kwame in work gloves joins Esi's line carrying fishing nets, no longer standing apart. Mood: hopeful, lived-in renewal. Lighting: soft gold sunrise over calm teal water. Environment = Location Registry id 'SUNRISE_PIER': Afenyo's wooden fishing pier at sunrise: worn planks, moored painted canoes, repaired fishing nets, calm gold-and-teal lagoon water, distant mangroves and a low orange sun.",</w:t>
         <w:br/>
-        <w:t xml:space="preserve">  "status": "⬜",</w:t>
+        <w:t xml:space="preserve">  "status": "✅",</w:t>
         <w:br/>
         <w:t xml:space="preserve">  "file": "images/act3/S20_Step08_kwame_helps.png"</w:t>
         <w:br/>
@@ -12631,7 +12631,7 @@
         <w:br/>
         <w:t xml:space="preserve">  "prompt": "Grounded cinematic West African magical realism; contemporary Ghanaian coastal life; human-scale performances; saturated indigo, lagoon teal, clay red and warm amber palette; natural skin texture; tactile fabric and weathered wood; 16:9 landscape widescreen composition; subtle film grain; expressive realistic lighting. No written words, no logos, no watermark, no distorted hands, no duplicate people. Scene S20 — First Light, Shared. MEDIUM shot, handheld eye-level. Characters in frame: @KOSI_MENSAH (indigo utility jumpsuit with rolled sleeves, sand-coloured work boots and a narrow woven kente belt, small gold Adinkra-disc earrings); @AMA_ADJOVI (deep navy kaba blouse, hand-dyed indigo wrapper with tiny white wave motifs and flat leather sandals, three-strand amber bead necklace). Kosi and Ama share a quiet look over the brightening lagoon. Mood: hopeful, lived-in renewal. Lighting: soft gold sunrise over calm teal water. Environment = Location Registry id 'SUNRISE_PIER': Afenyo's wooden fishing pier at sunrise: worn planks, moored painted canoes, repaired fishing nets, calm gold-and-teal lagoon water, distant mangroves and a low orange sun.",</w:t>
         <w:br/>
-        <w:t xml:space="preserve">  "status": "⬜",</w:t>
+        <w:t xml:space="preserve">  "status": "✅",</w:t>
         <w:br/>
         <w:t xml:space="preserve">  "file": "images/act3/S20_Step09_kosi_at_home.png"</w:t>
         <w:br/>
@@ -12702,7 +12702,7 @@
         <w:br/>
         <w:t xml:space="preserve">  "prompt": "Grounded cinematic West African magical realism; contemporary Ghanaian coastal life; human-scale performances; saturated indigo, lagoon teal, clay red and warm amber palette; natural skin texture; tactile fabric and weathered wood; 16:9 landscape widescreen composition; subtle film grain; expressive realistic lighting. No written words, no logos, no watermark, no distorted hands, no duplicate people. Scene S20 — First Light, Shared. WIDE shot, rear closing tableau. Characters in frame: @KOSI_MENSAH (indigo utility jumpsuit with rolled sleeves, sand-coloured work boots and a narrow woven kente belt, small gold Adinkra-disc earrings); @AMA_ADJOVI (deep navy kaba blouse, hand-dyed indigo wrapper with tiny white wave motifs and flat leather sandals, three-strand amber bead necklace); @SENA_ADJOVI (mustard oversized hoodie, blue-and-white printed ankle skirt and worn white canvas trainers, turquoise over-ear radio headphones); @KOJO_DANSO (faded forest-green canvas jacket over a blue-and-cream striped shirt, charcoal trousers and rubber deck boots, weathered brass compass on a cord); @ESI_TETTEH (brick-red wax-print dress beneath a soot-black oilskin apron, patterned headwrap and sturdy black sandals, smooth charred-wood smoking paddle); @KWAME_AGYEMAN (white linen shirt under a caramel lightweight field jacket, dark tailored trousers and brown loafers, antique bronze lapel pin shaped like a compass rose). The whole pier works together beneath the first fully shared light. Mood: hopeful, lived-in renewal. Lighting: soft gold sunrise over calm teal water. Environment = Location Registry id 'SUNRISE_PIER': Afenyo's wooden fishing pier at sunrise: worn planks, moored painted canoes, repaired fishing nets, calm gold-and-teal lagoon water, distant mangroves and a low orange sun.",</w:t>
         <w:br/>
-        <w:t xml:space="preserve">  "status": "⬜",</w:t>
+        <w:t xml:space="preserve">  "status": "✅",</w:t>
         <w:br/>
         <w:t xml:space="preserve">  "file": "images/act3/S20_Step10_first_light_shared.png"</w:t>
         <w:br/>

</xml_diff>